<commit_message>
Harden security per whole-code review
Marketplace providers need platform verification before engagement (admin
allowlist via PAPER_PLATFORM_ADMIN_EMAILS; engagement also now validates
the provider exists). Bounds on money/percentage inputs (negative
principals/prices, carry >= 100% etc. now 422); fee charging clamped to
fees accrued to date; signup rate-limited per IP; CSV exports neutralise
spreadsheet formulas; import capped at 2 MB / 10k rows. Untrack
tsconfig.tsbuildinfo build artifact.

Co-Authored-By: Claude Fable 5 <noreply@anthropic.com>
</commit_message>
<xml_diff>
--- a/REQUIREMENTS.docx
+++ b/REQUIREMENTS.docx
@@ -2481,7 +2481,33 @@
         <w:t xml:space="preserve">CSV export</w:t>
       </w:r>
       <w:r>
-        <w:t xml:space="preserve">.</w:t>
+        <w:t xml:space="preserve">, and</w:t>
+      </w:r>
+      <w:r>
+        <w:t xml:space="preserve"> </w:t>
+      </w:r>
+      <w:r>
+        <w:rPr>
+          <w:i/>
+          <w:iCs/>
+        </w:rPr>
+        <w:t xml:space="preserve">(v1.3)</w:t>
+      </w:r>
+      <w:r>
+        <w:t xml:space="preserve"> </w:t>
+      </w:r>
+      <w:r>
+        <w:rPr>
+          <w:b/>
+          <w:bCs/>
+        </w:rPr>
+        <w:t xml:space="preserve">CSV import</w:t>
+      </w:r>
+      <w:r>
+        <w:t xml:space="preserve"> </w:t>
+      </w:r>
+      <w:r>
+        <w:t xml:space="preserve">for onboarding an existing cap table: downloadable template, row-by-row validation as a dry run (nothing written), then an atomic apply that creates missing share classes and stakeholders and appends the issuances to the ledger; warns when the ledger already has entries.</w:t>
       </w:r>
     </w:p>
     <w:bookmarkEnd w:id="21"/>
@@ -3321,7 +3347,23 @@
         <w:t xml:space="preserve"> </w:t>
       </w:r>
       <w:r>
-        <w:t xml:space="preserve">entity/round/grant data merged into templates; append-only versions; regenerate blocked after signing.</w:t>
+        <w:t xml:space="preserve">entity/round/grant data merged into templates; append-only versions; regenerate blocked after signing;</w:t>
+      </w:r>
+      <w:r>
+        <w:t xml:space="preserve"> </w:t>
+      </w:r>
+      <w:r>
+        <w:rPr>
+          <w:b/>
+          <w:bCs/>
+        </w:rPr>
+        <w:t xml:space="preserve">PDF download for every generated document</w:t>
+      </w:r>
+      <w:r>
+        <w:t xml:space="preserve"> </w:t>
+      </w:r>
+      <w:r>
+        <w:t xml:space="preserve">(members via Documents; LPs download their own statements/Form 64C from the portal).</w:t>
       </w:r>
       <w:r>
         <w:t xml:space="preserve"> </w:t>
@@ -3337,7 +3379,7 @@
         <w:t xml:space="preserve"> </w:t>
       </w:r>
       <w:r>
-        <w:t xml:space="preserve">redline comparison.</w:t>
+        <w:t xml:space="preserve">redline comparison; richer PDF layouts.</w:t>
       </w:r>
     </w:p>
     <w:p>
@@ -5954,7 +5996,35 @@
         <w:t xml:space="preserve"> </w:t>
       </w:r>
       <w:r>
-        <w:t xml:space="preserve">✅ Provider directory: CS / CA / lawyer / registered valuer / RTA / fund admin, category-filterable.</w:t>
+        <w:t xml:space="preserve">✅ Provider directory: CS / CA / lawyer / registered valuer / RTA / fund admin, category-filterable, with</w:t>
+      </w:r>
+      <w:r>
+        <w:t xml:space="preserve"> </w:t>
+      </w:r>
+      <w:r>
+        <w:rPr>
+          <w:b/>
+          <w:bCs/>
+        </w:rPr>
+        <w:t xml:space="preserve">platform verification</w:t>
+      </w:r>
+      <w:r>
+        <w:t xml:space="preserve"> </w:t>
+      </w:r>
+      <w:r>
+        <w:t xml:space="preserve">— anyone may register a listing but only platform-verified providers can be engaged (admin allowlist via</w:t>
+      </w:r>
+      <w:r>
+        <w:t xml:space="preserve"> </w:t>
+      </w:r>
+      <w:r>
+        <w:rPr>
+          <w:rStyle w:val="VerbatimChar"/>
+        </w:rPr>
+        <w:t xml:space="preserve">PAPER_PLATFORM_ADMIN_EMAILS</w:t>
+      </w:r>
+      <w:r>
+        <w:t xml:space="preserve">).</w:t>
       </w:r>
     </w:p>
     <w:p>
@@ -13469,7 +13539,79 @@
         <w:t xml:space="preserve">c1f3b5d7e9a1</w:t>
       </w:r>
       <w:r>
-        <w:t xml:space="preserve">. 174 backend tests.</w:t>
+        <w:t xml:space="preserve">.</w:t>
+      </w:r>
+    </w:p>
+    <w:p>
+      <w:pPr>
+        <w:pStyle w:val="Compact"/>
+        <w:numPr>
+          <w:ilvl w:val="0"/>
+          <w:numId w:val="1030"/>
+        </w:numPr>
+      </w:pPr>
+      <w:r>
+        <w:rPr>
+          <w:b/>
+          <w:bCs/>
+        </w:rPr>
+        <w:t xml:space="preserve">PDF rendering</w:t>
+      </w:r>
+      <w:r>
+        <w:t xml:space="preserve"> </w:t>
+      </w:r>
+      <w:r>
+        <w:t xml:space="preserve">for all generated documents incl. portal downloads (FR-F-2) and</w:t>
+      </w:r>
+      <w:r>
+        <w:t xml:space="preserve"> </w:t>
+      </w:r>
+      <w:r>
+        <w:rPr>
+          <w:b/>
+          <w:bCs/>
+        </w:rPr>
+        <w:t xml:space="preserve">cap-table CSV import</w:t>
+      </w:r>
+      <w:r>
+        <w:t xml:space="preserve"> </w:t>
+      </w:r>
+      <w:r>
+        <w:t xml:space="preserve">with dry-run validation (FR-C-12).</w:t>
+      </w:r>
+    </w:p>
+    <w:p>
+      <w:pPr>
+        <w:pStyle w:val="Compact"/>
+        <w:numPr>
+          <w:ilvl w:val="0"/>
+          <w:numId w:val="1030"/>
+        </w:numPr>
+      </w:pPr>
+      <w:r>
+        <w:rPr>
+          <w:b/>
+          <w:bCs/>
+        </w:rPr>
+        <w:t xml:space="preserve">Security hardening batch</w:t>
+      </w:r>
+      <w:r>
+        <w:t xml:space="preserve"> </w:t>
+      </w:r>
+      <w:r>
+        <w:t xml:space="preserve">(whole-code review): provider verification gate (FR-O-1, Alembic</w:t>
+      </w:r>
+      <w:r>
+        <w:t xml:space="preserve"> </w:t>
+      </w:r>
+      <w:r>
+        <w:rPr>
+          <w:rStyle w:val="VerbatimChar"/>
+        </w:rPr>
+        <w:t xml:space="preserve">d3a5c7e9f1b3</w:t>
+      </w:r>
+      <w:r>
+        <w:t xml:space="preserve">), bounds on money/percentage inputs (negative principals, carry ≥ 100% etc. now 422), fee charging clamped to accrued-to-date, signup rate limiting, spreadsheet-formula neutralisation on CSV exports, import size/row caps. 185 backend tests.</w:t>
       </w:r>
     </w:p>
     <w:p>

</xml_diff>

<commit_message>
Add diligence engine, public funnel, financing docs (Savvi gaps)
Diligence readiness engine: 11 rules-as-data checks over the entity's
own records produce a severity-weighted score with deep-linked findings
and a report-as-document. Public fundraising funnel: one shareable link
per round where prospects register interest (unauthenticated, rate-
limited) landing in the CRM with optional automatic data-room access.
Financing doc automation: SPV subscription agreements generated on
commitment (portal PDF download) and PAS-4 offer letters per round
commitment. Small fills: charter amendments as one step (special
resolution + document + MGT-14 on pass) and offboarding that lapses
unvested options back to the pool.

Also carries the shared plumbing (schemas, API client, routes wiring,
navigation) for the four gap batches, and the REQUIREMENTS v1.3 updates.

Co-Authored-By: Claude Fable 5 <noreply@anthropic.com>
</commit_message>
<xml_diff>
--- a/REQUIREMENTS.docx
+++ b/REQUIREMENTS.docx
@@ -86,7 +86,7 @@
         <w:t xml:space="preserve"> </w:t>
       </w:r>
       <w:r>
-        <w:t xml:space="preserve">· Date: 2026-07-14 · Supersedes: v1.2 (2026-07-08), v1.1 (2026-07-03), v1.0 (2026-06-28), Draft v0.1 (2026-06-25)</w:t>
+        <w:t xml:space="preserve">· Date: 2026-07-15 · Supersedes: v1.2 (2026-07-08), v1.1 (2026-07-03), v1.0 (2026-06-28), Draft v0.1 (2026-06-25)</w:t>
       </w:r>
     </w:p>
     <w:p>
@@ -1633,6 +1633,44 @@
         <w:t xml:space="preserve"> </w:t>
       </w:r>
       <w:r>
+        <w:t xml:space="preserve">the</w:t>
+      </w:r>
+      <w:r>
+        <w:t xml:space="preserve"> </w:t>
+      </w:r>
+      <w:r>
+        <w:rPr>
+          <w:b/>
+          <w:bCs/>
+        </w:rPr>
+        <w:t xml:space="preserve">incorporation wizard</w:t>
+      </w:r>
+      <w:r>
+        <w:t xml:space="preserve"> </w:t>
+      </w:r>
+      <w:r>
+        <w:t xml:space="preserve">(Atlas-style, v1.3) — one intake (name options for RUN, capital, registered office, founders with DIN/shares/director flags, validated: ≥2 directors, subscription within authorised capital) generates the SPICe+/eMoA/eAoA filing pack</w:t>
+      </w:r>
+      <w:r>
+        <w:t xml:space="preserve"> </w:t>
+      </w:r>
+      <w:r>
+        <w:rPr>
+          <w:b/>
+          <w:bCs/>
+        </w:rPr>
+        <w:t xml:space="preserve">plus a founder IP assignment per founder</w:t>
+      </w:r>
+      <w:r>
+        <w:t xml:space="preserve"> </w:t>
+      </w:r>
+      <w:r>
+        <w:t xml:space="preserve">(v1.3) against a pre-registration entity; record the SRN, then the CIN — at which point founder shares are allotted at par, first directors registered and the compliance calendar generated, handing straight into the stage guide. Also the original</w:t>
+      </w:r>
+      <w:r>
+        <w:t xml:space="preserve"> </w:t>
+      </w:r>
+      <w:r>
         <w:rPr>
           <w:rStyle w:val="VerbatimChar"/>
         </w:rPr>
@@ -1642,7 +1680,7 @@
         <w:t xml:space="preserve"> </w:t>
       </w:r>
       <w:r>
-        <w:t xml:space="preserve">workflow (collect promoters → KYC step → generate docs → e-sign → file), entity types PvtLtd/LLP/OPC/Fund/SPV.</w:t>
+        <w:t xml:space="preserve">workflow.</w:t>
       </w:r>
       <w:r>
         <w:t xml:space="preserve"> </w:t>
@@ -1658,7 +1696,7 @@
         <w:t xml:space="preserve"> </w:t>
       </w:r>
       <w:r>
-        <w:t xml:space="preserve">richer guided data capture; LLP/OPC-specific branches.</w:t>
+        <w:t xml:space="preserve">KYC/e-sign integration in the pack (⛔ credentials); LLP/OPC-specific branches.</w:t>
       </w:r>
     </w:p>
     <w:p>
@@ -2093,7 +2131,23 @@
         <w:t xml:space="preserve"> </w:t>
       </w:r>
       <w:r>
-        <w:t xml:space="preserve">◐ Round modelling.</w:t>
+        <w:t xml:space="preserve">✅ Round modelling: pre/post-money, committed vs target, new-share and dilution computation per round;</w:t>
+      </w:r>
+      <w:r>
+        <w:t xml:space="preserve"> </w:t>
+      </w:r>
+      <w:r>
+        <w:rPr>
+          <w:b/>
+          <w:bCs/>
+        </w:rPr>
+        <w:t xml:space="preserve">scenario modeling</w:t>
+      </w:r>
+      <w:r>
+        <w:t xml:space="preserve"> </w:t>
+      </w:r>
+      <w:r>
+        <w:t xml:space="preserve">(v1.3) — pro-forma cap table for a</w:t>
       </w:r>
       <w:r>
         <w:t xml:space="preserve"> </w:t>
@@ -2103,13 +2157,35 @@
           <w:i/>
           <w:iCs/>
         </w:rPr>
-        <w:t xml:space="preserve">Built:</w:t>
-      </w:r>
-      <w:r>
-        <w:t xml:space="preserve"> </w:t>
-      </w:r>
-      <w:r>
-        <w:t xml:space="preserve">pre/post-money, committed vs target, new-share and dilution computation per round.</w:t>
+        <w:t xml:space="preserve">hypothetical</w:t>
+      </w:r>
+      <w:r>
+        <w:t xml:space="preserve"> </w:t>
+      </w:r>
+      <w:r>
+        <w:t xml:space="preserve">round (new money, pre-money or price, pool top-up created pre-money, SAFEs converting at the scenario price) with per-holder before/after/dilution, side-by-side comparison in the UI, nothing written to the ledger.</w:t>
+      </w:r>
+    </w:p>
+    <w:p>
+      <w:pPr>
+        <w:pStyle w:val="Compact"/>
+        <w:numPr>
+          <w:ilvl w:val="0"/>
+          <w:numId w:val="1006"/>
+        </w:numPr>
+      </w:pPr>
+      <w:r>
+        <w:rPr>
+          <w:b/>
+          <w:bCs/>
+        </w:rPr>
+        <w:t xml:space="preserve">FR-C-5 (M)</w:t>
+      </w:r>
+      <w:r>
+        <w:t xml:space="preserve"> </w:t>
+      </w:r>
+      <w:r>
+        <w:t xml:space="preserve">◐ Liquidation waterfall.</w:t>
       </w:r>
       <w:r>
         <w:t xml:space="preserve"> </w:t>
@@ -2119,35 +2195,29 @@
           <w:i/>
           <w:iCs/>
         </w:rPr>
-        <w:t xml:space="preserve">Remaining:</w:t>
-      </w:r>
-      <w:r>
-        <w:t xml:space="preserve"> </w:t>
-      </w:r>
-      <w:r>
-        <w:t xml:space="preserve">pool top-up modelling, multi-scenario what-ifs.</w:t>
-      </w:r>
-    </w:p>
-    <w:p>
-      <w:pPr>
-        <w:pStyle w:val="Compact"/>
-        <w:numPr>
-          <w:ilvl w:val="0"/>
-          <w:numId w:val="1006"/>
-        </w:numPr>
-      </w:pPr>
-      <w:r>
-        <w:rPr>
-          <w:b/>
-          <w:bCs/>
-        </w:rPr>
-        <w:t xml:space="preserve">FR-C-5 (M)</w:t>
-      </w:r>
-      <w:r>
-        <w:t xml:space="preserve"> </w:t>
-      </w:r>
-      <w:r>
-        <w:t xml:space="preserve">◐ Liquidation waterfall.</w:t>
+        <w:t xml:space="preserve">Built:</w:t>
+      </w:r>
+      <w:r>
+        <w:t xml:space="preserve"> </w:t>
+      </w:r>
+      <w:r>
+        <w:t xml:space="preserve">preference stacks by seniority (pro-rated within a tier when short), participating and non-participating preferred, remainder pro-rata;</w:t>
+      </w:r>
+      <w:r>
+        <w:t xml:space="preserve"> </w:t>
+      </w:r>
+      <w:r>
+        <w:rPr>
+          <w:b/>
+          <w:bCs/>
+        </w:rPr>
+        <w:t xml:space="preserve">exit comparison</w:t>
+      </w:r>
+      <w:r>
+        <w:t xml:space="preserve"> </w:t>
+      </w:r>
+      <w:r>
+        <w:t xml:space="preserve">(v1.3) — per-holder proceeds across several exit values, showing where the preference stack flips to pro-rata.</w:t>
       </w:r>
       <w:r>
         <w:t xml:space="preserve"> </w:t>
@@ -2157,13 +2227,35 @@
           <w:i/>
           <w:iCs/>
         </w:rPr>
-        <w:t xml:space="preserve">Built:</w:t>
-      </w:r>
-      <w:r>
-        <w:t xml:space="preserve"> </w:t>
-      </w:r>
-      <w:r>
-        <w:t xml:space="preserve">preference stacks by seniority (pro-rated within a tier when short), participating and non-participating preferred, remainder pro-rata.</w:t>
+        <w:t xml:space="preserve">Remaining:</w:t>
+      </w:r>
+      <w:r>
+        <w:t xml:space="preserve"> </w:t>
+      </w:r>
+      <w:r>
+        <w:t xml:space="preserve">the as-converted election for non-participating preferred (take-preference vs convert optimisation).</w:t>
+      </w:r>
+    </w:p>
+    <w:p>
+      <w:pPr>
+        <w:pStyle w:val="Compact"/>
+        <w:numPr>
+          <w:ilvl w:val="0"/>
+          <w:numId w:val="1006"/>
+        </w:numPr>
+      </w:pPr>
+      <w:r>
+        <w:rPr>
+          <w:b/>
+          <w:bCs/>
+        </w:rPr>
+        <w:t xml:space="preserve">FR-C-6 (M)</w:t>
+      </w:r>
+      <w:r>
+        <w:t xml:space="preserve"> </w:t>
+      </w:r>
+      <w:r>
+        <w:t xml:space="preserve">◐ Issuance lifecycle.</w:t>
       </w:r>
       <w:r>
         <w:t xml:space="preserve"> </w:t>
@@ -2173,35 +2265,13 @@
           <w:i/>
           <w:iCs/>
         </w:rPr>
-        <w:t xml:space="preserve">Remaining:</w:t>
-      </w:r>
-      <w:r>
-        <w:t xml:space="preserve"> </w:t>
-      </w:r>
-      <w:r>
-        <w:t xml:space="preserve">the as-converted election for non-participating preferred (take-preference vs convert optimisation).</w:t>
-      </w:r>
-    </w:p>
-    <w:p>
-      <w:pPr>
-        <w:pStyle w:val="Compact"/>
-        <w:numPr>
-          <w:ilvl w:val="0"/>
-          <w:numId w:val="1006"/>
-        </w:numPr>
-      </w:pPr>
-      <w:r>
-        <w:rPr>
-          <w:b/>
-          <w:bCs/>
-        </w:rPr>
-        <w:t xml:space="preserve">FR-C-6 (M)</w:t>
-      </w:r>
-      <w:r>
-        <w:t xml:space="preserve"> </w:t>
-      </w:r>
-      <w:r>
-        <w:t xml:space="preserve">◐ Issuance lifecycle.</w:t>
+        <w:t xml:space="preserve">Built:</w:t>
+      </w:r>
+      <w:r>
+        <w:t xml:space="preserve"> </w:t>
+      </w:r>
+      <w:r>
+        <w:t xml:space="preserve">issuance → ledger → Register of Members; share-certificate template; certificate-number field.</w:t>
       </w:r>
       <w:r>
         <w:t xml:space="preserve"> </w:t>
@@ -2211,13 +2281,99 @@
           <w:i/>
           <w:iCs/>
         </w:rPr>
-        <w:t xml:space="preserve">Built:</w:t>
-      </w:r>
-      <w:r>
-        <w:t xml:space="preserve"> </w:t>
-      </w:r>
-      <w:r>
-        <w:t xml:space="preserve">issuance → ledger → Register of Members; share-certificate template; certificate-number field.</w:t>
+        <w:t xml:space="preserve">Remaining:</w:t>
+      </w:r>
+      <w:r>
+        <w:t xml:space="preserve"> </w:t>
+      </w:r>
+      <w:r>
+        <w:t xml:space="preserve">board-approval gating on allotment; auto certificate generation per issuance.</w:t>
+      </w:r>
+    </w:p>
+    <w:p>
+      <w:pPr>
+        <w:pStyle w:val="Compact"/>
+        <w:numPr>
+          <w:ilvl w:val="0"/>
+          <w:numId w:val="1006"/>
+        </w:numPr>
+      </w:pPr>
+      <w:r>
+        <w:rPr>
+          <w:b/>
+          <w:bCs/>
+        </w:rPr>
+        <w:t xml:space="preserve">FR-C-7 (M)</w:t>
+      </w:r>
+      <w:r>
+        <w:t xml:space="preserve"> </w:t>
+      </w:r>
+      <w:r>
+        <w:t xml:space="preserve">✅ Corporate actions: transfers (SH-4) with holding validation, buy-backs,</w:t>
+      </w:r>
+      <w:r>
+        <w:t xml:space="preserve"> </w:t>
+      </w:r>
+      <w:r>
+        <w:rPr>
+          <w:b/>
+          <w:bCs/>
+        </w:rPr>
+        <w:t xml:space="preserve">stock splits</w:t>
+      </w:r>
+      <w:r>
+        <w:t xml:space="preserve">,</w:t>
+      </w:r>
+      <w:r>
+        <w:t xml:space="preserve"> </w:t>
+      </w:r>
+      <w:r>
+        <w:rPr>
+          <w:b/>
+          <w:bCs/>
+        </w:rPr>
+        <w:t xml:space="preserve">bonus issues</w:t>
+      </w:r>
+      <w:r>
+        <w:t xml:space="preserve">, and</w:t>
+      </w:r>
+      <w:r>
+        <w:t xml:space="preserve"> </w:t>
+      </w:r>
+      <w:r>
+        <w:rPr>
+          <w:b/>
+          <w:bCs/>
+        </w:rPr>
+        <w:t xml:space="preserve">rights issues</w:t>
+      </w:r>
+      <w:r>
+        <w:t xml:space="preserve"> </w:t>
+      </w:r>
+      <w:r>
+        <w:t xml:space="preserve">(pro-rata entitlements → subscriptions → close-and-issue), all effective-dated on the ledger with deterministic ordering.</w:t>
+      </w:r>
+    </w:p>
+    <w:p>
+      <w:pPr>
+        <w:pStyle w:val="Compact"/>
+        <w:numPr>
+          <w:ilvl w:val="0"/>
+          <w:numId w:val="1006"/>
+        </w:numPr>
+      </w:pPr>
+      <w:r>
+        <w:rPr>
+          <w:b/>
+          <w:bCs/>
+        </w:rPr>
+        <w:t xml:space="preserve">FR-C-8 (M)</w:t>
+      </w:r>
+      <w:r>
+        <w:t xml:space="preserve"> </w:t>
+      </w:r>
+      <w:r>
+        <w:t xml:space="preserve">◐ Stamp duty.</w:t>
       </w:r>
       <w:r>
         <w:t xml:space="preserve"> </w:t>
@@ -2227,99 +2383,13 @@
           <w:i/>
           <w:iCs/>
         </w:rPr>
-        <w:t xml:space="preserve">Remaining:</w:t>
-      </w:r>
-      <w:r>
-        <w:t xml:space="preserve"> </w:t>
-      </w:r>
-      <w:r>
-        <w:t xml:space="preserve">board-approval gating on allotment; auto certificate generation per issuance.</w:t>
-      </w:r>
-    </w:p>
-    <w:p>
-      <w:pPr>
-        <w:pStyle w:val="Compact"/>
-        <w:numPr>
-          <w:ilvl w:val="0"/>
-          <w:numId w:val="1006"/>
-        </w:numPr>
-      </w:pPr>
-      <w:r>
-        <w:rPr>
-          <w:b/>
-          <w:bCs/>
-        </w:rPr>
-        <w:t xml:space="preserve">FR-C-7 (M)</w:t>
-      </w:r>
-      <w:r>
-        <w:t xml:space="preserve"> </w:t>
-      </w:r>
-      <w:r>
-        <w:t xml:space="preserve">✅ Corporate actions: transfers (SH-4) with holding validation, buy-backs,</w:t>
-      </w:r>
-      <w:r>
-        <w:t xml:space="preserve"> </w:t>
-      </w:r>
-      <w:r>
-        <w:rPr>
-          <w:b/>
-          <w:bCs/>
-        </w:rPr>
-        <w:t xml:space="preserve">stock splits</w:t>
-      </w:r>
-      <w:r>
-        <w:t xml:space="preserve">,</w:t>
-      </w:r>
-      <w:r>
-        <w:t xml:space="preserve"> </w:t>
-      </w:r>
-      <w:r>
-        <w:rPr>
-          <w:b/>
-          <w:bCs/>
-        </w:rPr>
-        <w:t xml:space="preserve">bonus issues</w:t>
-      </w:r>
-      <w:r>
-        <w:t xml:space="preserve">, and</w:t>
-      </w:r>
-      <w:r>
-        <w:t xml:space="preserve"> </w:t>
-      </w:r>
-      <w:r>
-        <w:rPr>
-          <w:b/>
-          <w:bCs/>
-        </w:rPr>
-        <w:t xml:space="preserve">rights issues</w:t>
-      </w:r>
-      <w:r>
-        <w:t xml:space="preserve"> </w:t>
-      </w:r>
-      <w:r>
-        <w:t xml:space="preserve">(pro-rata entitlements → subscriptions → close-and-issue), all effective-dated on the ledger with deterministic ordering.</w:t>
-      </w:r>
-    </w:p>
-    <w:p>
-      <w:pPr>
-        <w:pStyle w:val="Compact"/>
-        <w:numPr>
-          <w:ilvl w:val="0"/>
-          <w:numId w:val="1006"/>
-        </w:numPr>
-      </w:pPr>
-      <w:r>
-        <w:rPr>
-          <w:b/>
-          <w:bCs/>
-        </w:rPr>
-        <w:t xml:space="preserve">FR-C-8 (M)</w:t>
-      </w:r>
-      <w:r>
-        <w:t xml:space="preserve"> </w:t>
-      </w:r>
-      <w:r>
-        <w:t xml:space="preserve">◐ Stamp duty.</w:t>
+        <w:t xml:space="preserve">Built:</w:t>
+      </w:r>
+      <w:r>
+        <w:t xml:space="preserve"> </w:t>
+      </w:r>
+      <w:r>
+        <w:t xml:space="preserve">transfer stamp duty at the uniform 0.015% of consideration, computed per transfer.</w:t>
       </w:r>
       <w:r>
         <w:t xml:space="preserve"> </w:t>
@@ -2329,13 +2399,35 @@
           <w:i/>
           <w:iCs/>
         </w:rPr>
-        <w:t xml:space="preserve">Built:</w:t>
-      </w:r>
-      <w:r>
-        <w:t xml:space="preserve"> </w:t>
-      </w:r>
-      <w:r>
-        <w:t xml:space="preserve">transfer stamp duty at the uniform 0.015% of consideration, computed per transfer.</w:t>
+        <w:t xml:space="preserve">Remaining:</w:t>
+      </w:r>
+      <w:r>
+        <w:t xml:space="preserve"> </w:t>
+      </w:r>
+      <w:r>
+        <w:t xml:space="preserve">issue-side duty, state-wise rates table, e-stamp reference. ⛔ e-stamp integration.</w:t>
+      </w:r>
+    </w:p>
+    <w:p>
+      <w:pPr>
+        <w:pStyle w:val="Compact"/>
+        <w:numPr>
+          <w:ilvl w:val="0"/>
+          <w:numId w:val="1006"/>
+        </w:numPr>
+      </w:pPr>
+      <w:r>
+        <w:rPr>
+          <w:b/>
+          <w:bCs/>
+        </w:rPr>
+        <w:t xml:space="preserve">FR-C-9 (P2)</w:t>
+      </w:r>
+      <w:r>
+        <w:t xml:space="preserve"> </w:t>
+      </w:r>
+      <w:r>
+        <w:t xml:space="preserve">◐ Demat: ISIN + depository (NSDL/CDSL) + status tracked per security class.</w:t>
       </w:r>
       <w:r>
         <w:t xml:space="preserve"> </w:t>
@@ -2351,7 +2443,7 @@
         <w:t xml:space="preserve"> </w:t>
       </w:r>
       <w:r>
-        <w:t xml:space="preserve">issue-side duty, state-wise rates table, e-stamp reference. ⛔ e-stamp integration.</w:t>
+        <w:t xml:space="preserve">RTA hand-off. ⛔</w:t>
       </w:r>
     </w:p>
     <w:p>
@@ -2367,13 +2459,83 @@
           <w:b/>
           <w:bCs/>
         </w:rPr>
-        <w:t xml:space="preserve">FR-C-9 (P2)</w:t>
-      </w:r>
-      <w:r>
-        <w:t xml:space="preserve"> </w:t>
-      </w:r>
-      <w:r>
-        <w:t xml:space="preserve">◐ Demat: ISIN + depository (NSDL/CDSL) + status tracked per security class.</w:t>
+        <w:t xml:space="preserve">FR-C-10 (M)</w:t>
+      </w:r>
+      <w:r>
+        <w:t xml:space="preserve"> </w:t>
+      </w:r>
+      <w:r>
+        <w:t xml:space="preserve">✅ Effective-dated, append-only ledger; positions recomputable as of any date; microsecond-ordered events.</w:t>
+      </w:r>
+    </w:p>
+    <w:p>
+      <w:pPr>
+        <w:pStyle w:val="Compact"/>
+        <w:numPr>
+          <w:ilvl w:val="0"/>
+          <w:numId w:val="1006"/>
+        </w:numPr>
+      </w:pPr>
+      <w:r>
+        <w:rPr>
+          <w:b/>
+          <w:bCs/>
+        </w:rPr>
+        <w:t xml:space="preserve">FR-C-11 (M — added v1.0)</w:t>
+      </w:r>
+      <w:r>
+        <w:t xml:space="preserve"> </w:t>
+      </w:r>
+      <w:r>
+        <w:t xml:space="preserve">✅</w:t>
+      </w:r>
+      <w:r>
+        <w:t xml:space="preserve"> </w:t>
+      </w:r>
+      <w:r>
+        <w:rPr>
+          <w:b/>
+          <w:bCs/>
+        </w:rPr>
+        <w:t xml:space="preserve">Founder reverse-vesting / restricted stock</w:t>
+      </w:r>
+      <w:r>
+        <w:t xml:space="preserve">: cliff-then-monthly schedule over issued founder shares; unvested shares repurchasable (buy-back at nil) on early exit.</w:t>
+      </w:r>
+    </w:p>
+    <w:p>
+      <w:pPr>
+        <w:pStyle w:val="Compact"/>
+        <w:numPr>
+          <w:ilvl w:val="0"/>
+          <w:numId w:val="1006"/>
+        </w:numPr>
+      </w:pPr>
+      <w:r>
+        <w:rPr>
+          <w:b/>
+          <w:bCs/>
+        </w:rPr>
+        <w:t xml:space="preserve">FR-C-12 (M — added v1.0)</w:t>
+      </w:r>
+      <w:r>
+        <w:t xml:space="preserve"> </w:t>
+      </w:r>
+      <w:r>
+        <w:t xml:space="preserve">✅ Cap-table</w:t>
+      </w:r>
+      <w:r>
+        <w:t xml:space="preserve"> </w:t>
+      </w:r>
+      <w:r>
+        <w:rPr>
+          <w:b/>
+          <w:bCs/>
+        </w:rPr>
+        <w:t xml:space="preserve">CSV export</w:t>
+      </w:r>
+      <w:r>
+        <w:t xml:space="preserve">, and</w:t>
       </w:r>
       <w:r>
         <w:t xml:space="preserve"> </w:t>
@@ -2383,105 +2545,55 @@
           <w:i/>
           <w:iCs/>
         </w:rPr>
-        <w:t xml:space="preserve">Remaining:</w:t>
-      </w:r>
-      <w:r>
-        <w:t xml:space="preserve"> </w:t>
-      </w:r>
-      <w:r>
-        <w:t xml:space="preserve">RTA hand-off. ⛔</w:t>
-      </w:r>
-    </w:p>
-    <w:p>
-      <w:pPr>
-        <w:pStyle w:val="Compact"/>
-        <w:numPr>
-          <w:ilvl w:val="0"/>
-          <w:numId w:val="1006"/>
-        </w:numPr>
-      </w:pPr>
-      <w:r>
-        <w:rPr>
-          <w:b/>
-          <w:bCs/>
-        </w:rPr>
-        <w:t xml:space="preserve">FR-C-10 (M)</w:t>
-      </w:r>
-      <w:r>
-        <w:t xml:space="preserve"> </w:t>
-      </w:r>
-      <w:r>
-        <w:t xml:space="preserve">✅ Effective-dated, append-only ledger; positions recomputable as of any date; microsecond-ordered events.</w:t>
-      </w:r>
-    </w:p>
-    <w:p>
-      <w:pPr>
-        <w:pStyle w:val="Compact"/>
-        <w:numPr>
-          <w:ilvl w:val="0"/>
-          <w:numId w:val="1006"/>
-        </w:numPr>
-      </w:pPr>
-      <w:r>
-        <w:rPr>
-          <w:b/>
-          <w:bCs/>
-        </w:rPr>
-        <w:t xml:space="preserve">FR-C-11 (M — added v1.0)</w:t>
-      </w:r>
-      <w:r>
-        <w:t xml:space="preserve"> </w:t>
-      </w:r>
-      <w:r>
-        <w:t xml:space="preserve">✅</w:t>
-      </w:r>
-      <w:r>
-        <w:t xml:space="preserve"> </w:t>
-      </w:r>
-      <w:r>
-        <w:rPr>
-          <w:b/>
-          <w:bCs/>
-        </w:rPr>
-        <w:t xml:space="preserve">Founder reverse-vesting / restricted stock</w:t>
-      </w:r>
-      <w:r>
-        <w:t xml:space="preserve">: cliff-then-monthly schedule over issued founder shares; unvested shares repurchasable (buy-back at nil) on early exit.</w:t>
-      </w:r>
-    </w:p>
-    <w:p>
-      <w:pPr>
-        <w:pStyle w:val="Compact"/>
-        <w:numPr>
-          <w:ilvl w:val="0"/>
-          <w:numId w:val="1006"/>
-        </w:numPr>
-      </w:pPr>
-      <w:r>
-        <w:rPr>
-          <w:b/>
-          <w:bCs/>
-        </w:rPr>
-        <w:t xml:space="preserve">FR-C-12 (M — added v1.0)</w:t>
-      </w:r>
-      <w:r>
-        <w:t xml:space="preserve"> </w:t>
-      </w:r>
-      <w:r>
-        <w:t xml:space="preserve">✅ Cap-table</w:t>
-      </w:r>
-      <w:r>
-        <w:t xml:space="preserve"> </w:t>
-      </w:r>
-      <w:r>
-        <w:rPr>
-          <w:b/>
-          <w:bCs/>
-        </w:rPr>
-        <w:t xml:space="preserve">CSV export</w:t>
-      </w:r>
-      <w:r>
-        <w:t xml:space="preserve">, and</w:t>
+        <w:t xml:space="preserve">(v1.3)</w:t>
+      </w:r>
+      <w:r>
+        <w:t xml:space="preserve"> </w:t>
+      </w:r>
+      <w:r>
+        <w:rPr>
+          <w:b/>
+          <w:bCs/>
+        </w:rPr>
+        <w:t xml:space="preserve">CSV import</w:t>
+      </w:r>
+      <w:r>
+        <w:t xml:space="preserve"> </w:t>
+      </w:r>
+      <w:r>
+        <w:t xml:space="preserve">for onboarding an existing cap table: downloadable template, row-by-row validation as a dry run (nothing written), then an atomic apply that creates missing share classes and stakeholders and appends the issuances to the ledger; warns when the ledger already has entries.</w:t>
+      </w:r>
+    </w:p>
+    <w:bookmarkEnd w:id="21"/>
+    <w:bookmarkStart w:id="22" w:name="d-esop--equity-incentive-administration"/>
+    <w:p>
+      <w:pPr>
+        <w:pStyle w:val="Heading3"/>
+      </w:pPr>
+      <w:r>
+        <w:t xml:space="preserve">D. ESOP / Equity Incentive Administration</w:t>
+      </w:r>
+    </w:p>
+    <w:p>
+      <w:pPr>
+        <w:pStyle w:val="Compact"/>
+        <w:numPr>
+          <w:ilvl w:val="0"/>
+          <w:numId w:val="1007"/>
+        </w:numPr>
+      </w:pPr>
+      <w:r>
+        <w:rPr>
+          <w:b/>
+          <w:bCs/>
+        </w:rPr>
+        <w:t xml:space="preserve">FR-D-1 (M)</w:t>
+      </w:r>
+      <w:r>
+        <w:t xml:space="preserve"> </w:t>
+      </w:r>
+      <w:r>
+        <w:t xml:space="preserve">◐ Schemes.</w:t>
       </w:r>
       <w:r>
         <w:t xml:space="preserve"> </w:t>
@@ -2491,55 +2603,13 @@
           <w:i/>
           <w:iCs/>
         </w:rPr>
-        <w:t xml:space="preserve">(v1.3)</w:t>
-      </w:r>
-      <w:r>
-        <w:t xml:space="preserve"> </w:t>
-      </w:r>
-      <w:r>
-        <w:rPr>
-          <w:b/>
-          <w:bCs/>
-        </w:rPr>
-        <w:t xml:space="preserve">CSV import</w:t>
-      </w:r>
-      <w:r>
-        <w:t xml:space="preserve"> </w:t>
-      </w:r>
-      <w:r>
-        <w:t xml:space="preserve">for onboarding an existing cap table: downloadable template, row-by-row validation as a dry run (nothing written), then an atomic apply that creates missing share classes and stakeholders and appends the issuances to the ledger; warns when the ledger already has entries.</w:t>
-      </w:r>
-    </w:p>
-    <w:bookmarkEnd w:id="21"/>
-    <w:bookmarkStart w:id="22" w:name="d-esop--equity-incentive-administration"/>
-    <w:p>
-      <w:pPr>
-        <w:pStyle w:val="Heading3"/>
-      </w:pPr>
-      <w:r>
-        <w:t xml:space="preserve">D. ESOP / Equity Incentive Administration</w:t>
-      </w:r>
-    </w:p>
-    <w:p>
-      <w:pPr>
-        <w:pStyle w:val="Compact"/>
-        <w:numPr>
-          <w:ilvl w:val="0"/>
-          <w:numId w:val="1007"/>
-        </w:numPr>
-      </w:pPr>
-      <w:r>
-        <w:rPr>
-          <w:b/>
-          <w:bCs/>
-        </w:rPr>
-        <w:t xml:space="preserve">FR-D-1 (M)</w:t>
-      </w:r>
-      <w:r>
-        <w:t xml:space="preserve"> </w:t>
-      </w:r>
-      <w:r>
-        <w:t xml:space="preserve">◐ Schemes.</w:t>
+        <w:t xml:space="preserve">Built:</w:t>
+      </w:r>
+      <w:r>
+        <w:t xml:space="preserve"> </w:t>
+      </w:r>
+      <w:r>
+        <w:t xml:space="preserve">scheme with pool size and pool-limit enforcement on grants.</w:t>
       </w:r>
       <w:r>
         <w:t xml:space="preserve"> </w:t>
@@ -2549,13 +2619,35 @@
           <w:i/>
           <w:iCs/>
         </w:rPr>
-        <w:t xml:space="preserve">Built:</w:t>
-      </w:r>
-      <w:r>
-        <w:t xml:space="preserve"> </w:t>
-      </w:r>
-      <w:r>
-        <w:t xml:space="preserve">scheme with pool size and pool-limit enforcement on grants.</w:t>
+        <w:t xml:space="preserve">Remaining:</w:t>
+      </w:r>
+      <w:r>
+        <w:t xml:space="preserve"> </w:t>
+      </w:r>
+      <w:r>
+        <w:t xml:space="preserve">scheme versioning, exercise-window rules, SEBI SBEB variants.</w:t>
+      </w:r>
+    </w:p>
+    <w:p>
+      <w:pPr>
+        <w:pStyle w:val="Compact"/>
+        <w:numPr>
+          <w:ilvl w:val="0"/>
+          <w:numId w:val="1007"/>
+        </w:numPr>
+      </w:pPr>
+      <w:r>
+        <w:rPr>
+          <w:b/>
+          <w:bCs/>
+        </w:rPr>
+        <w:t xml:space="preserve">FR-D-2 (M)</w:t>
+      </w:r>
+      <w:r>
+        <w:t xml:space="preserve"> </w:t>
+      </w:r>
+      <w:r>
+        <w:t xml:space="preserve">◐ Grants.</w:t>
       </w:r>
       <w:r>
         <w:t xml:space="preserve"> </w:t>
@@ -2565,35 +2657,13 @@
           <w:i/>
           <w:iCs/>
         </w:rPr>
-        <w:t xml:space="preserve">Remaining:</w:t>
-      </w:r>
-      <w:r>
-        <w:t xml:space="preserve"> </w:t>
-      </w:r>
-      <w:r>
-        <w:t xml:space="preserve">scheme versioning, exercise-window rules, SEBI SBEB variants.</w:t>
-      </w:r>
-    </w:p>
-    <w:p>
-      <w:pPr>
-        <w:pStyle w:val="Compact"/>
-        <w:numPr>
-          <w:ilvl w:val="0"/>
-          <w:numId w:val="1007"/>
-        </w:numPr>
-      </w:pPr>
-      <w:r>
-        <w:rPr>
-          <w:b/>
-          <w:bCs/>
-        </w:rPr>
-        <w:t xml:space="preserve">FR-D-2 (M)</w:t>
-      </w:r>
-      <w:r>
-        <w:t xml:space="preserve"> </w:t>
-      </w:r>
-      <w:r>
-        <w:t xml:space="preserve">◐ Grants.</w:t>
+        <w:t xml:space="preserve">Built:</w:t>
+      </w:r>
+      <w:r>
+        <w:t xml:space="preserve"> </w:t>
+      </w:r>
+      <w:r>
+        <w:t xml:space="preserve">per-employee grants, cliff + linear monthly vesting, time-based tracking.</w:t>
       </w:r>
       <w:r>
         <w:t xml:space="preserve"> </w:t>
@@ -2603,13 +2673,73 @@
           <w:i/>
           <w:iCs/>
         </w:rPr>
-        <w:t xml:space="preserve">Built:</w:t>
-      </w:r>
-      <w:r>
-        <w:t xml:space="preserve"> </w:t>
-      </w:r>
-      <w:r>
-        <w:t xml:space="preserve">per-employee grants, cliff + linear monthly vesting, time-based tracking.</w:t>
+        <w:t xml:space="preserve">Remaining:</w:t>
+      </w:r>
+      <w:r>
+        <w:t xml:space="preserve"> </w:t>
+      </w:r>
+      <w:r>
+        <w:t xml:space="preserve">grant letters, milestone vesting, acceleration on exit.</w:t>
+      </w:r>
+    </w:p>
+    <w:p>
+      <w:pPr>
+        <w:pStyle w:val="Compact"/>
+        <w:numPr>
+          <w:ilvl w:val="0"/>
+          <w:numId w:val="1007"/>
+        </w:numPr>
+      </w:pPr>
+      <w:r>
+        <w:rPr>
+          <w:b/>
+          <w:bCs/>
+        </w:rPr>
+        <w:t xml:space="preserve">FR-D-3 (M)</w:t>
+      </w:r>
+      <w:r>
+        <w:t xml:space="preserve"> </w:t>
+      </w:r>
+      <w:r>
+        <w:t xml:space="preserve">✅ Employee self-service: portal shows granted/vested/exercised/exercisable, strike, current FMV and unrealised gain;</w:t>
+      </w:r>
+      <w:r>
+        <w:t xml:space="preserve"> </w:t>
+      </w:r>
+      <w:r>
+        <w:rPr>
+          <w:b/>
+          <w:bCs/>
+        </w:rPr>
+        <w:t xml:space="preserve">self-serve exercise requests</w:t>
+      </w:r>
+      <w:r>
+        <w:t xml:space="preserve"> </w:t>
+      </w:r>
+      <w:r>
+        <w:t xml:space="preserve">(v1.3) — employees request exercise in the portal (validated against vested-minus-exercised-minus-pending), the company approves into a chosen class (the real exercise lands on the ledger, perquisite computed) or rejects; perquisite (FMV − strike) computed on exercise.</w:t>
+      </w:r>
+    </w:p>
+    <w:p>
+      <w:pPr>
+        <w:pStyle w:val="Compact"/>
+        <w:numPr>
+          <w:ilvl w:val="0"/>
+          <w:numId w:val="1007"/>
+        </w:numPr>
+      </w:pPr>
+      <w:r>
+        <w:rPr>
+          <w:b/>
+          <w:bCs/>
+        </w:rPr>
+        <w:t xml:space="preserve">FR-D-4 (P2)</w:t>
+      </w:r>
+      <w:r>
+        <w:t xml:space="preserve"> </w:t>
+      </w:r>
+      <w:r>
+        <w:t xml:space="preserve">◐</w:t>
       </w:r>
       <w:r>
         <w:t xml:space="preserve"> </w:t>
@@ -2619,57 +2749,13 @@
           <w:i/>
           <w:iCs/>
         </w:rPr>
-        <w:t xml:space="preserve">Remaining:</w:t>
-      </w:r>
-      <w:r>
-        <w:t xml:space="preserve"> </w:t>
-      </w:r>
-      <w:r>
-        <w:t xml:space="preserve">grant letters, milestone vesting, acceleration on exit.</w:t>
-      </w:r>
-    </w:p>
-    <w:p>
-      <w:pPr>
-        <w:pStyle w:val="Compact"/>
-        <w:numPr>
-          <w:ilvl w:val="0"/>
-          <w:numId w:val="1007"/>
-        </w:numPr>
-      </w:pPr>
-      <w:r>
-        <w:rPr>
-          <w:b/>
-          <w:bCs/>
-        </w:rPr>
-        <w:t xml:space="preserve">FR-D-3 (M)</w:t>
-      </w:r>
-      <w:r>
-        <w:t xml:space="preserve"> </w:t>
-      </w:r>
-      <w:r>
-        <w:t xml:space="preserve">✅ Employee self-service: portal shows granted/vested/exercised/exercisable, strike, current FMV and unrealised gain; perquisite (FMV − strike) computed on exercise.</w:t>
-      </w:r>
-    </w:p>
-    <w:p>
-      <w:pPr>
-        <w:pStyle w:val="Compact"/>
-        <w:numPr>
-          <w:ilvl w:val="0"/>
-          <w:numId w:val="1007"/>
-        </w:numPr>
-      </w:pPr>
-      <w:r>
-        <w:rPr>
-          <w:b/>
-          <w:bCs/>
-        </w:rPr>
-        <w:t xml:space="preserve">FR-D-4 (P2)</w:t>
-      </w:r>
-      <w:r>
-        <w:t xml:space="preserve"> </w:t>
-      </w:r>
-      <w:r>
-        <w:t xml:space="preserve">◐</w:t>
+        <w:t xml:space="preserve">(largely promoted)</w:t>
+      </w:r>
+      <w:r>
+        <w:t xml:space="preserve"> </w:t>
+      </w:r>
+      <w:r>
+        <w:t xml:space="preserve">Exercise.</w:t>
       </w:r>
       <w:r>
         <w:t xml:space="preserve"> </w:t>
@@ -2679,13 +2765,29 @@
           <w:i/>
           <w:iCs/>
         </w:rPr>
-        <w:t xml:space="preserve">(largely promoted)</w:t>
-      </w:r>
-      <w:r>
-        <w:t xml:space="preserve"> </w:t>
-      </w:r>
-      <w:r>
-        <w:t xml:space="preserve">Exercise.</w:t>
+        <w:t xml:space="preserve">Built:</w:t>
+      </w:r>
+      <w:r>
+        <w:t xml:space="preserve"> </w:t>
+      </w:r>
+      <w:r>
+        <w:t xml:space="preserve">exercise → cap-table issuance;</w:t>
+      </w:r>
+      <w:r>
+        <w:t xml:space="preserve"> </w:t>
+      </w:r>
+      <w:r>
+        <w:rPr>
+          <w:b/>
+          <w:bCs/>
+        </w:rPr>
+        <w:t xml:space="preserve">cashless exercise</w:t>
+      </w:r>
+      <w:r>
+        <w:t xml:space="preserve"> </w:t>
+      </w:r>
+      <w:r>
+        <w:t xml:space="preserve">(net shares after withholding to cover strike; gross consumed from grant).</w:t>
       </w:r>
       <w:r>
         <w:t xml:space="preserve"> </w:t>
@@ -2695,29 +2797,35 @@
           <w:i/>
           <w:iCs/>
         </w:rPr>
-        <w:t xml:space="preserve">Built:</w:t>
-      </w:r>
-      <w:r>
-        <w:t xml:space="preserve"> </w:t>
-      </w:r>
-      <w:r>
-        <w:t xml:space="preserve">exercise → cap-table issuance;</w:t>
-      </w:r>
-      <w:r>
-        <w:t xml:space="preserve"> </w:t>
-      </w:r>
-      <w:r>
-        <w:rPr>
-          <w:b/>
-          <w:bCs/>
-        </w:rPr>
-        <w:t xml:space="preserve">cashless exercise</w:t>
-      </w:r>
-      <w:r>
-        <w:t xml:space="preserve"> </w:t>
-      </w:r>
-      <w:r>
-        <w:t xml:space="preserve">(net shares after withholding to cover strike; gross consumed from grant).</w:t>
+        <w:t xml:space="preserve">Remaining:</w:t>
+      </w:r>
+      <w:r>
+        <w:t xml:space="preserve"> </w:t>
+      </w:r>
+      <w:r>
+        <w:t xml:space="preserve">loan-funded and leaver scenarios.</w:t>
+      </w:r>
+    </w:p>
+    <w:p>
+      <w:pPr>
+        <w:pStyle w:val="Compact"/>
+        <w:numPr>
+          <w:ilvl w:val="0"/>
+          <w:numId w:val="1007"/>
+        </w:numPr>
+      </w:pPr>
+      <w:r>
+        <w:rPr>
+          <w:b/>
+          <w:bCs/>
+        </w:rPr>
+        <w:t xml:space="preserve">FR-D-5 (P2)</w:t>
+      </w:r>
+      <w:r>
+        <w:t xml:space="preserve"> </w:t>
+      </w:r>
+      <w:r>
+        <w:t xml:space="preserve">✅</w:t>
       </w:r>
       <w:r>
         <w:t xml:space="preserve"> </w:t>
@@ -2727,13 +2835,13 @@
           <w:i/>
           <w:iCs/>
         </w:rPr>
-        <w:t xml:space="preserve">Remaining:</w:t>
-      </w:r>
-      <w:r>
-        <w:t xml:space="preserve"> </w:t>
-      </w:r>
-      <w:r>
-        <w:t xml:space="preserve">loan-funded and leaver scenarios.</w:t>
+        <w:t xml:space="preserve">(promoted — implemented)</w:t>
+      </w:r>
+      <w:r>
+        <w:t xml:space="preserve"> </w:t>
+      </w:r>
+      <w:r>
+        <w:t xml:space="preserve">Valuation linkage: exercise falls back to the entity's current effective valuation when FMV isn't supplied; UI prefills current FMV.</w:t>
       </w:r>
     </w:p>
     <w:p>
@@ -2749,13 +2857,67 @@
           <w:b/>
           <w:bCs/>
         </w:rPr>
-        <w:t xml:space="preserve">FR-D-5 (P2)</w:t>
-      </w:r>
-      <w:r>
-        <w:t xml:space="preserve"> </w:t>
-      </w:r>
-      <w:r>
-        <w:t xml:space="preserve">✅</w:t>
+        <w:t xml:space="preserve">FR-D-6 (P2)</w:t>
+      </w:r>
+      <w:r>
+        <w:t xml:space="preserve"> </w:t>
+      </w:r>
+      <w:r>
+        <w:t xml:space="preserve">○ Option-holder buyback / liquidity events.</w:t>
+      </w:r>
+    </w:p>
+    <w:bookmarkEnd w:id="22"/>
+    <w:bookmarkStart w:id="23" w:name="e-fundraising-deal-room--investor-crm"/>
+    <w:p>
+      <w:pPr>
+        <w:pStyle w:val="Heading3"/>
+      </w:pPr>
+      <w:r>
+        <w:t xml:space="preserve">E. Fundraising, Deal Room &amp; Investor CRM</w:t>
+      </w:r>
+    </w:p>
+    <w:p>
+      <w:pPr>
+        <w:pStyle w:val="Compact"/>
+        <w:numPr>
+          <w:ilvl w:val="0"/>
+          <w:numId w:val="1008"/>
+        </w:numPr>
+      </w:pPr>
+      <w:r>
+        <w:rPr>
+          <w:b/>
+          <w:bCs/>
+        </w:rPr>
+        <w:t xml:space="preserve">FR-E-1 (M)</w:t>
+      </w:r>
+      <w:r>
+        <w:t xml:space="preserve"> </w:t>
+      </w:r>
+      <w:r>
+        <w:t xml:space="preserve">✅ Round workspace: define round (instrument, pre-money, target, price, class), add commitments (soft → signed → funded), close.</w:t>
+      </w:r>
+    </w:p>
+    <w:p>
+      <w:pPr>
+        <w:pStyle w:val="Compact"/>
+        <w:numPr>
+          <w:ilvl w:val="0"/>
+          <w:numId w:val="1008"/>
+        </w:numPr>
+      </w:pPr>
+      <w:r>
+        <w:rPr>
+          <w:b/>
+          <w:bCs/>
+        </w:rPr>
+        <w:t xml:space="preserve">FR-E-2 (M)</w:t>
+      </w:r>
+      <w:r>
+        <w:t xml:space="preserve"> </w:t>
+      </w:r>
+      <w:r>
+        <w:t xml:space="preserve">◐ Term sheets.</w:t>
       </w:r>
       <w:r>
         <w:t xml:space="preserve"> </w:t>
@@ -2765,89 +2927,13 @@
           <w:i/>
           <w:iCs/>
         </w:rPr>
-        <w:t xml:space="preserve">(promoted — implemented)</w:t>
-      </w:r>
-      <w:r>
-        <w:t xml:space="preserve"> </w:t>
-      </w:r>
-      <w:r>
-        <w:t xml:space="preserve">Valuation linkage: exercise falls back to the entity's current effective valuation when FMV isn't supplied; UI prefills current FMV.</w:t>
-      </w:r>
-    </w:p>
-    <w:p>
-      <w:pPr>
-        <w:pStyle w:val="Compact"/>
-        <w:numPr>
-          <w:ilvl w:val="0"/>
-          <w:numId w:val="1007"/>
-        </w:numPr>
-      </w:pPr>
-      <w:r>
-        <w:rPr>
-          <w:b/>
-          <w:bCs/>
-        </w:rPr>
-        <w:t xml:space="preserve">FR-D-6 (P2)</w:t>
-      </w:r>
-      <w:r>
-        <w:t xml:space="preserve"> </w:t>
-      </w:r>
-      <w:r>
-        <w:t xml:space="preserve">○ Option-holder buyback / liquidity events.</w:t>
-      </w:r>
-    </w:p>
-    <w:bookmarkEnd w:id="22"/>
-    <w:bookmarkStart w:id="23" w:name="e-fundraising-deal-room--investor-crm"/>
-    <w:p>
-      <w:pPr>
-        <w:pStyle w:val="Heading3"/>
-      </w:pPr>
-      <w:r>
-        <w:t xml:space="preserve">E. Fundraising, Deal Room &amp; Investor CRM</w:t>
-      </w:r>
-    </w:p>
-    <w:p>
-      <w:pPr>
-        <w:pStyle w:val="Compact"/>
-        <w:numPr>
-          <w:ilvl w:val="0"/>
-          <w:numId w:val="1008"/>
-        </w:numPr>
-      </w:pPr>
-      <w:r>
-        <w:rPr>
-          <w:b/>
-          <w:bCs/>
-        </w:rPr>
-        <w:t xml:space="preserve">FR-E-1 (M)</w:t>
-      </w:r>
-      <w:r>
-        <w:t xml:space="preserve"> </w:t>
-      </w:r>
-      <w:r>
-        <w:t xml:space="preserve">✅ Round workspace: define round (instrument, pre-money, target, price, class), add commitments (soft → signed → funded), close.</w:t>
-      </w:r>
-    </w:p>
-    <w:p>
-      <w:pPr>
-        <w:pStyle w:val="Compact"/>
-        <w:numPr>
-          <w:ilvl w:val="0"/>
-          <w:numId w:val="1008"/>
-        </w:numPr>
-      </w:pPr>
-      <w:r>
-        <w:rPr>
-          <w:b/>
-          <w:bCs/>
-        </w:rPr>
-        <w:t xml:space="preserve">FR-E-2 (M)</w:t>
-      </w:r>
-      <w:r>
-        <w:t xml:space="preserve"> </w:t>
-      </w:r>
-      <w:r>
-        <w:t xml:space="preserve">◐ Term sheets.</w:t>
+        <w:t xml:space="preserve">Built:</w:t>
+      </w:r>
+      <w:r>
+        <w:t xml:space="preserve"> </w:t>
+      </w:r>
+      <w:r>
+        <w:t xml:space="preserve">term-sheet generation from round data, document versioning.</w:t>
       </w:r>
       <w:r>
         <w:t xml:space="preserve"> </w:t>
@@ -2857,13 +2943,35 @@
           <w:i/>
           <w:iCs/>
         </w:rPr>
-        <w:t xml:space="preserve">Built:</w:t>
-      </w:r>
-      <w:r>
-        <w:t xml:space="preserve"> </w:t>
-      </w:r>
-      <w:r>
-        <w:t xml:space="preserve">term-sheet generation from round data, document versioning.</w:t>
+        <w:t xml:space="preserve">Remaining:</w:t>
+      </w:r>
+      <w:r>
+        <w:t xml:space="preserve"> </w:t>
+      </w:r>
+      <w:r>
+        <w:t xml:space="preserve">negotiated-term tracking/redlines.</w:t>
+      </w:r>
+    </w:p>
+    <w:p>
+      <w:pPr>
+        <w:pStyle w:val="Compact"/>
+        <w:numPr>
+          <w:ilvl w:val="0"/>
+          <w:numId w:val="1008"/>
+        </w:numPr>
+      </w:pPr>
+      <w:r>
+        <w:rPr>
+          <w:b/>
+          <w:bCs/>
+        </w:rPr>
+        <w:t xml:space="preserve">FR-E-3 (M)</w:t>
+      </w:r>
+      <w:r>
+        <w:t xml:space="preserve"> </w:t>
+      </w:r>
+      <w:r>
+        <w:t xml:space="preserve">◐ Round document set.</w:t>
       </w:r>
       <w:r>
         <w:t xml:space="preserve"> </w:t>
@@ -2873,35 +2981,13 @@
           <w:i/>
           <w:iCs/>
         </w:rPr>
-        <w:t xml:space="preserve">Remaining:</w:t>
-      </w:r>
-      <w:r>
-        <w:t xml:space="preserve"> </w:t>
-      </w:r>
-      <w:r>
-        <w:t xml:space="preserve">negotiated-term tracking/redlines.</w:t>
-      </w:r>
-    </w:p>
-    <w:p>
-      <w:pPr>
-        <w:pStyle w:val="Compact"/>
-        <w:numPr>
-          <w:ilvl w:val="0"/>
-          <w:numId w:val="1008"/>
-        </w:numPr>
-      </w:pPr>
-      <w:r>
-        <w:rPr>
-          <w:b/>
-          <w:bCs/>
-        </w:rPr>
-        <w:t xml:space="preserve">FR-E-3 (M)</w:t>
-      </w:r>
-      <w:r>
-        <w:t xml:space="preserve"> </w:t>
-      </w:r>
-      <w:r>
-        <w:t xml:space="preserve">◐ Round document set.</w:t>
+        <w:t xml:space="preserve">Built:</w:t>
+      </w:r>
+      <w:r>
+        <w:t xml:space="preserve"> </w:t>
+      </w:r>
+      <w:r>
+        <w:t xml:space="preserve">SHA (summary), PAS-4, board-resolution templates generated and linked.</w:t>
       </w:r>
       <w:r>
         <w:t xml:space="preserve"> </w:t>
@@ -2911,13 +2997,57 @@
           <w:i/>
           <w:iCs/>
         </w:rPr>
-        <w:t xml:space="preserve">Built:</w:t>
-      </w:r>
-      <w:r>
-        <w:t xml:space="preserve"> </w:t>
-      </w:r>
-      <w:r>
-        <w:t xml:space="preserve">SHA (summary), PAS-4, board-resolution templates generated and linked.</w:t>
+        <w:t xml:space="preserve">Remaining:</w:t>
+      </w:r>
+      <w:r>
+        <w:t xml:space="preserve"> </w:t>
+      </w:r>
+      <w:r>
+        <w:t xml:space="preserve">SSA; full India-grade legal drafts.</w:t>
+      </w:r>
+    </w:p>
+    <w:p>
+      <w:pPr>
+        <w:pStyle w:val="Compact"/>
+        <w:numPr>
+          <w:ilvl w:val="0"/>
+          <w:numId w:val="1008"/>
+        </w:numPr>
+      </w:pPr>
+      <w:r>
+        <w:rPr>
+          <w:b/>
+          <w:bCs/>
+        </w:rPr>
+        <w:t xml:space="preserve">FR-E-4 (M)</w:t>
+      </w:r>
+      <w:r>
+        <w:t xml:space="preserve"> </w:t>
+      </w:r>
+      <w:r>
+        <w:t xml:space="preserve">◐ Round data room: rooms exist with grants/analytics; per-round auto-scoping remains manual.</w:t>
+      </w:r>
+    </w:p>
+    <w:p>
+      <w:pPr>
+        <w:pStyle w:val="Compact"/>
+        <w:numPr>
+          <w:ilvl w:val="0"/>
+          <w:numId w:val="1008"/>
+        </w:numPr>
+      </w:pPr>
+      <w:r>
+        <w:rPr>
+          <w:b/>
+          <w:bCs/>
+        </w:rPr>
+        <w:t xml:space="preserve">FR-E-5 (P2)</w:t>
+      </w:r>
+      <w:r>
+        <w:t xml:space="preserve"> </w:t>
+      </w:r>
+      <w:r>
+        <w:t xml:space="preserve">◐ Private placement.</w:t>
       </w:r>
       <w:r>
         <w:t xml:space="preserve"> </w:t>
@@ -2927,57 +3057,45 @@
           <w:i/>
           <w:iCs/>
         </w:rPr>
-        <w:t xml:space="preserve">Remaining:</w:t>
-      </w:r>
-      <w:r>
-        <w:t xml:space="preserve"> </w:t>
-      </w:r>
-      <w:r>
-        <w:t xml:space="preserve">SSA; full India-grade legal drafts.</w:t>
-      </w:r>
-    </w:p>
-    <w:p>
-      <w:pPr>
-        <w:pStyle w:val="Compact"/>
-        <w:numPr>
-          <w:ilvl w:val="0"/>
-          <w:numId w:val="1008"/>
-        </w:numPr>
-      </w:pPr>
-      <w:r>
-        <w:rPr>
-          <w:b/>
-          <w:bCs/>
-        </w:rPr>
-        <w:t xml:space="preserve">FR-E-4 (M)</w:t>
-      </w:r>
-      <w:r>
-        <w:t xml:space="preserve"> </w:t>
-      </w:r>
-      <w:r>
-        <w:t xml:space="preserve">◐ Round data room: rooms exist with grants/analytics; per-round auto-scoping remains manual.</w:t>
-      </w:r>
-    </w:p>
-    <w:p>
-      <w:pPr>
-        <w:pStyle w:val="Compact"/>
-        <w:numPr>
-          <w:ilvl w:val="0"/>
-          <w:numId w:val="1008"/>
-        </w:numPr>
-      </w:pPr>
-      <w:r>
-        <w:rPr>
-          <w:b/>
-          <w:bCs/>
-        </w:rPr>
-        <w:t xml:space="preserve">FR-E-5 (P2)</w:t>
-      </w:r>
-      <w:r>
-        <w:t xml:space="preserve"> </w:t>
-      </w:r>
-      <w:r>
-        <w:t xml:space="preserve">◐ Private placement.</w:t>
+        <w:t xml:space="preserve">Built:</w:t>
+      </w:r>
+      <w:r>
+        <w:t xml:space="preserve"> </w:t>
+      </w:r>
+      <w:r>
+        <w:t xml:space="preserve">PAS-4 template;</w:t>
+      </w:r>
+      <w:r>
+        <w:t xml:space="preserve"> </w:t>
+      </w:r>
+      <w:r>
+        <w:rPr>
+          <w:b/>
+          <w:bCs/>
+        </w:rPr>
+        <w:t xml:space="preserve">PAS-3 filing obligation auto-created on close</w:t>
+      </w:r>
+      <w:r>
+        <w:t xml:space="preserve"> </w:t>
+      </w:r>
+      <w:r>
+        <w:t xml:space="preserve">(30-day due date);</w:t>
+      </w:r>
+      <w:r>
+        <w:t xml:space="preserve"> </w:t>
+      </w:r>
+      <w:r>
+        <w:rPr>
+          <w:b/>
+          <w:bCs/>
+        </w:rPr>
+        <w:t xml:space="preserve">Sec 42 offeree guardrail</w:t>
+      </w:r>
+      <w:r>
+        <w:t xml:space="preserve"> </w:t>
+      </w:r>
+      <w:r>
+        <w:t xml:space="preserve">— offers (SAFEs + commitments) capped at 200 distinct persons per FY, enforced at entry.</w:t>
       </w:r>
       <w:r>
         <w:t xml:space="preserve"> </w:t>
@@ -2987,45 +3105,35 @@
           <w:i/>
           <w:iCs/>
         </w:rPr>
-        <w:t xml:space="preserve">Built:</w:t>
-      </w:r>
-      <w:r>
-        <w:t xml:space="preserve"> </w:t>
-      </w:r>
-      <w:r>
-        <w:t xml:space="preserve">PAS-4 template;</w:t>
-      </w:r>
-      <w:r>
-        <w:t xml:space="preserve"> </w:t>
-      </w:r>
-      <w:r>
-        <w:rPr>
-          <w:b/>
-          <w:bCs/>
-        </w:rPr>
-        <w:t xml:space="preserve">PAS-3 filing obligation auto-created on close</w:t>
-      </w:r>
-      <w:r>
-        <w:t xml:space="preserve"> </w:t>
-      </w:r>
-      <w:r>
-        <w:t xml:space="preserve">(30-day due date);</w:t>
-      </w:r>
-      <w:r>
-        <w:t xml:space="preserve"> </w:t>
-      </w:r>
-      <w:r>
-        <w:rPr>
-          <w:b/>
-          <w:bCs/>
-        </w:rPr>
-        <w:t xml:space="preserve">Sec 42 offeree guardrail</w:t>
-      </w:r>
-      <w:r>
-        <w:t xml:space="preserve"> </w:t>
-      </w:r>
-      <w:r>
-        <w:t xml:space="preserve">— offers (SAFEs + commitments) capped at 200 distinct persons per FY, enforced at entry.</w:t>
+        <w:t xml:space="preserve">Remaining:</w:t>
+      </w:r>
+      <w:r>
+        <w:t xml:space="preserve"> </w:t>
+      </w:r>
+      <w:r>
+        <w:t xml:space="preserve">separate-bank-account tracking, QIB/ESOP offeree exclusions, full Section 42 pack.</w:t>
+      </w:r>
+    </w:p>
+    <w:p>
+      <w:pPr>
+        <w:pStyle w:val="Compact"/>
+        <w:numPr>
+          <w:ilvl w:val="0"/>
+          <w:numId w:val="1008"/>
+        </w:numPr>
+      </w:pPr>
+      <w:r>
+        <w:rPr>
+          <w:b/>
+          <w:bCs/>
+        </w:rPr>
+        <w:t xml:space="preserve">FR-E-6 (P2)</w:t>
+      </w:r>
+      <w:r>
+        <w:t xml:space="preserve"> </w:t>
+      </w:r>
+      <w:r>
+        <w:t xml:space="preserve">✅</w:t>
       </w:r>
       <w:r>
         <w:t xml:space="preserve"> </w:t>
@@ -3035,13 +3143,42 @@
           <w:i/>
           <w:iCs/>
         </w:rPr>
-        <w:t xml:space="preserve">Remaining:</w:t>
-      </w:r>
-      <w:r>
-        <w:t xml:space="preserve"> </w:t>
-      </w:r>
-      <w:r>
-        <w:t xml:space="preserve">separate-bank-account tracking, QIB/ESOP offeree exclusions, full Section 42 pack.</w:t>
+        <w:t xml:space="preserve">(promoted — implemented)</w:t>
+      </w:r>
+      <w:r>
+        <w:t xml:space="preserve"> </w:t>
+      </w:r>
+      <w:r>
+        <w:t xml:space="preserve">Closing mechanics: on close,</w:t>
+      </w:r>
+      <w:r>
+        <w:t xml:space="preserve"> </w:t>
+      </w:r>
+      <w:r>
+        <w:rPr>
+          <w:b/>
+          <w:bCs/>
+        </w:rPr>
+        <w:t xml:space="preserve">outstanding SAFEs/notes convert automatically</w:t>
+      </w:r>
+      <w:r>
+        <w:t xml:space="preserve"> </w:t>
+      </w:r>
+      <w:r>
+        <w:t xml:space="preserve">at the round price into the round's class (valuation caps priced off the pre-financing cap table; an instrument that can't convert is left outstanding rather than blocking the close), then funded commitments are issued into the cap-table ledger;</w:t>
+      </w:r>
+      <w:r>
+        <w:t xml:space="preserve"> </w:t>
+      </w:r>
+      <w:r>
+        <w:rPr>
+          <w:b/>
+          <w:bCs/>
+        </w:rPr>
+        <w:t xml:space="preserve">FC-GPR FEMA obligation auto-created when any investor is foreign</w:t>
+      </w:r>
+      <w:r>
+        <w:t xml:space="preserve">; investor portal reflects holdings.</w:t>
       </w:r>
     </w:p>
     <w:p>
@@ -3057,13 +3194,13 @@
           <w:b/>
           <w:bCs/>
         </w:rPr>
-        <w:t xml:space="preserve">FR-E-6 (P2)</w:t>
-      </w:r>
-      <w:r>
-        <w:t xml:space="preserve"> </w:t>
-      </w:r>
-      <w:r>
-        <w:t xml:space="preserve">✅</w:t>
+        <w:t xml:space="preserve">FR-E-7 (P3)</w:t>
+      </w:r>
+      <w:r>
+        <w:t xml:space="preserve"> </w:t>
+      </w:r>
+      <w:r>
+        <w:t xml:space="preserve">◐</w:t>
       </w:r>
       <w:r>
         <w:t xml:space="preserve"> </w:t>
@@ -3073,64 +3210,13 @@
           <w:i/>
           <w:iCs/>
         </w:rPr>
-        <w:t xml:space="preserve">(promoted — implemented)</w:t>
-      </w:r>
-      <w:r>
-        <w:t xml:space="preserve"> </w:t>
-      </w:r>
-      <w:r>
-        <w:t xml:space="preserve">Closing mechanics: on close,</w:t>
-      </w:r>
-      <w:r>
-        <w:t xml:space="preserve"> </w:t>
-      </w:r>
-      <w:r>
-        <w:rPr>
-          <w:b/>
-          <w:bCs/>
-        </w:rPr>
-        <w:t xml:space="preserve">outstanding SAFEs/notes convert automatically</w:t>
-      </w:r>
-      <w:r>
-        <w:t xml:space="preserve"> </w:t>
-      </w:r>
-      <w:r>
-        <w:t xml:space="preserve">at the round price into the round's class (valuation caps priced off the pre-financing cap table; an instrument that can't convert is left outstanding rather than blocking the close), then funded commitments are issued into the cap-table ledger;</w:t>
-      </w:r>
-      <w:r>
-        <w:t xml:space="preserve"> </w:t>
-      </w:r>
-      <w:r>
-        <w:rPr>
-          <w:b/>
-          <w:bCs/>
-        </w:rPr>
-        <w:t xml:space="preserve">FC-GPR FEMA obligation auto-created when any investor is foreign</w:t>
-      </w:r>
-      <w:r>
-        <w:t xml:space="preserve">; investor portal reflects holdings.</w:t>
-      </w:r>
-    </w:p>
-    <w:p>
-      <w:pPr>
-        <w:pStyle w:val="Compact"/>
-        <w:numPr>
-          <w:ilvl w:val="0"/>
-          <w:numId w:val="1008"/>
-        </w:numPr>
-      </w:pPr>
-      <w:r>
-        <w:rPr>
-          <w:b/>
-          <w:bCs/>
-        </w:rPr>
-        <w:t xml:space="preserve">FR-E-7 (P3)</w:t>
-      </w:r>
-      <w:r>
-        <w:t xml:space="preserve"> </w:t>
-      </w:r>
-      <w:r>
-        <w:t xml:space="preserve">◐</w:t>
+        <w:t xml:space="preserve">(promoted v1.3)</w:t>
+      </w:r>
+      <w:r>
+        <w:t xml:space="preserve"> </w:t>
+      </w:r>
+      <w:r>
+        <w:t xml:space="preserve">Secondary sales with ROFR.</w:t>
       </w:r>
       <w:r>
         <w:t xml:space="preserve"> </w:t>
@@ -3140,13 +3226,13 @@
           <w:i/>
           <w:iCs/>
         </w:rPr>
-        <w:t xml:space="preserve">(promoted v1.3)</w:t>
-      </w:r>
-      <w:r>
-        <w:t xml:space="preserve"> </w:t>
-      </w:r>
-      <w:r>
-        <w:t xml:space="preserve">Secondary sales with ROFR.</w:t>
+        <w:t xml:space="preserve">Built:</w:t>
+      </w:r>
+      <w:r>
+        <w:t xml:space="preserve"> </w:t>
+      </w:r>
+      <w:r>
+        <w:t xml:space="preserve">an investor requests a sale from their portal (holding-validated); the company exercises its right of first refusal by choosing the buyer — approval executes a stamp-dutied transfer on the cap-table ledger; reject path; status visible to the seller.</w:t>
       </w:r>
       <w:r>
         <w:t xml:space="preserve"> </w:t>
@@ -3156,13 +3242,182 @@
           <w:i/>
           <w:iCs/>
         </w:rPr>
-        <w:t xml:space="preserve">Built:</w:t>
-      </w:r>
-      <w:r>
-        <w:t xml:space="preserve"> </w:t>
-      </w:r>
-      <w:r>
-        <w:t xml:space="preserve">an investor requests a sale from their portal (holding-validated); the company exercises its right of first refusal by choosing the buyer — approval executes a stamp-dutied transfer on the cap-table ledger; reject path; status visible to the seller.</w:t>
+        <w:t xml:space="preserve">Remaining:</w:t>
+      </w:r>
+      <w:r>
+        <w:t xml:space="preserve"> </w:t>
+      </w:r>
+      <w:r>
+        <w:t xml:space="preserve">open marketplace / multi-bidder allocation.</w:t>
+      </w:r>
+    </w:p>
+    <w:p>
+      <w:pPr>
+        <w:pStyle w:val="Compact"/>
+        <w:numPr>
+          <w:ilvl w:val="0"/>
+          <w:numId w:val="1008"/>
+        </w:numPr>
+      </w:pPr>
+      <w:r>
+        <w:rPr>
+          <w:b/>
+          <w:bCs/>
+        </w:rPr>
+        <w:t xml:space="preserve">FR-E-8 (M — added v1.0)</w:t>
+      </w:r>
+      <w:r>
+        <w:t xml:space="preserve"> </w:t>
+      </w:r>
+      <w:r>
+        <w:t xml:space="preserve">✅</w:t>
+      </w:r>
+      <w:r>
+        <w:t xml:space="preserve"> </w:t>
+      </w:r>
+      <w:r>
+        <w:rPr>
+          <w:b/>
+          <w:bCs/>
+        </w:rPr>
+        <w:t xml:space="preserve">Investor CRM / fundraising pipeline</w:t>
+      </w:r>
+      <w:r>
+        <w:t xml:space="preserve">: prospects with stages (contacted → meeting → diligence → term-sheet → committed/passed), firm, check size, notes; pipeline summary (open vs committed value by stage);</w:t>
+      </w:r>
+      <w:r>
+        <w:t xml:space="preserve"> </w:t>
+      </w:r>
+      <w:r>
+        <w:rPr>
+          <w:b/>
+          <w:bCs/>
+        </w:rPr>
+        <w:t xml:space="preserve">one-click conversion of a prospect into a round commitment</w:t>
+      </w:r>
+      <w:r>
+        <w:t xml:space="preserve">;</w:t>
+      </w:r>
+      <w:r>
+        <w:t xml:space="preserve"> </w:t>
+      </w:r>
+      <w:r>
+        <w:rPr>
+          <w:b/>
+          <w:bCs/>
+        </w:rPr>
+        <w:t xml:space="preserve">public funnel link</w:t>
+      </w:r>
+      <w:r>
+        <w:t xml:space="preserve"> </w:t>
+      </w:r>
+      <w:r>
+        <w:t xml:space="preserve">(v1.3) — one shareable URL per round where prospective investors register interest (rate-limited, unauthenticated) landing directly in the CRM, optionally auto-granting data-room access; admin funnel view joins prospects × data-room engagement × commitments.</w:t>
+      </w:r>
+    </w:p>
+    <w:p>
+      <w:pPr>
+        <w:pStyle w:val="Compact"/>
+        <w:numPr>
+          <w:ilvl w:val="0"/>
+          <w:numId w:val="1008"/>
+        </w:numPr>
+      </w:pPr>
+      <w:r>
+        <w:rPr>
+          <w:b/>
+          <w:bCs/>
+        </w:rPr>
+        <w:t xml:space="preserve">FR-E-10 (M — added v1.3)</w:t>
+      </w:r>
+      <w:r>
+        <w:t xml:space="preserve"> </w:t>
+      </w:r>
+      <w:r>
+        <w:t xml:space="preserve">✅</w:t>
+      </w:r>
+      <w:r>
+        <w:t xml:space="preserve"> </w:t>
+      </w:r>
+      <w:r>
+        <w:rPr>
+          <w:b/>
+          <w:bCs/>
+        </w:rPr>
+        <w:t xml:space="preserve">PAS-4 private placement offer letter</w:t>
+      </w:r>
+      <w:r>
+        <w:t xml:space="preserve"> </w:t>
+      </w:r>
+      <w:r>
+        <w:t xml:space="preserve">per commitment (Sec 42 / rule 14(3)): named offeree, shares derived from the round price, generated into Documents.</w:t>
+      </w:r>
+    </w:p>
+    <w:p>
+      <w:pPr>
+        <w:pStyle w:val="Compact"/>
+        <w:numPr>
+          <w:ilvl w:val="0"/>
+          <w:numId w:val="1008"/>
+        </w:numPr>
+      </w:pPr>
+      <w:r>
+        <w:rPr>
+          <w:b/>
+          <w:bCs/>
+        </w:rPr>
+        <w:t xml:space="preserve">FR-E-9 (M — added v1.2)</w:t>
+      </w:r>
+      <w:r>
+        <w:t xml:space="preserve"> </w:t>
+      </w:r>
+      <w:r>
+        <w:t xml:space="preserve">✅</w:t>
+      </w:r>
+      <w:r>
+        <w:t xml:space="preserve"> </w:t>
+      </w:r>
+      <w:r>
+        <w:rPr>
+          <w:b/>
+          <w:bCs/>
+        </w:rPr>
+        <w:t xml:space="preserve">Family &amp; friends investing</w:t>
+      </w:r>
+      <w:r>
+        <w:t xml:space="preserve">: every SAFE/note and round commitment carries an investor kind (friends &amp; family / angel / institutional) shown across fundraising views; F&amp;F investors given an email see their instruments in the investor portal automatically (no explicit grant needed); the Pre-seed stage guide walks founders through it with the Sec 42 guardrail (FR-E-5) enforcing the 200-offeree/FY limit.</w:t>
+      </w:r>
+    </w:p>
+    <w:bookmarkEnd w:id="23"/>
+    <w:bookmarkStart w:id="24" w:name="f-document-automation--e-signature"/>
+    <w:p>
+      <w:pPr>
+        <w:pStyle w:val="Heading3"/>
+      </w:pPr>
+      <w:r>
+        <w:t xml:space="preserve">F. Document Automation &amp; e-Signature</w:t>
+      </w:r>
+    </w:p>
+    <w:p>
+      <w:pPr>
+        <w:pStyle w:val="Compact"/>
+        <w:numPr>
+          <w:ilvl w:val="0"/>
+          <w:numId w:val="1009"/>
+        </w:numPr>
+      </w:pPr>
+      <w:r>
+        <w:rPr>
+          <w:b/>
+          <w:bCs/>
+        </w:rPr>
+        <w:t xml:space="preserve">FR-F-1 (M)</w:t>
+      </w:r>
+      <w:r>
+        <w:t xml:space="preserve"> </w:t>
+      </w:r>
+      <w:r>
+        <w:t xml:space="preserve">✅ Template library (~20 India-specific templates): incorporation (SPICe+/eMoA/eAoA), board resolution, share certificate, SHA, PAS-4, term sheet, meeting notice, D&amp;O indemnification, offer letter, IP assignment, NDA, MSA, SOW, fund/SPV docs.</w:t>
       </w:r>
       <w:r>
         <w:t xml:space="preserve"> </w:t>
@@ -3172,106 +3427,13 @@
           <w:i/>
           <w:iCs/>
         </w:rPr>
-        <w:t xml:space="preserve">Remaining:</w:t>
-      </w:r>
-      <w:r>
-        <w:t xml:space="preserve"> </w:t>
-      </w:r>
-      <w:r>
-        <w:t xml:space="preserve">open marketplace / multi-bidder allocation.</w:t>
-      </w:r>
-    </w:p>
-    <w:p>
-      <w:pPr>
-        <w:pStyle w:val="Compact"/>
-        <w:numPr>
-          <w:ilvl w:val="0"/>
-          <w:numId w:val="1008"/>
-        </w:numPr>
-      </w:pPr>
-      <w:r>
-        <w:rPr>
-          <w:b/>
-          <w:bCs/>
-        </w:rPr>
-        <w:t xml:space="preserve">FR-E-8 (M — added v1.0)</w:t>
-      </w:r>
-      <w:r>
-        <w:t xml:space="preserve"> </w:t>
-      </w:r>
-      <w:r>
-        <w:t xml:space="preserve">✅</w:t>
-      </w:r>
-      <w:r>
-        <w:t xml:space="preserve"> </w:t>
-      </w:r>
-      <w:r>
-        <w:rPr>
-          <w:b/>
-          <w:bCs/>
-        </w:rPr>
-        <w:t xml:space="preserve">Investor CRM / fundraising pipeline</w:t>
-      </w:r>
-      <w:r>
-        <w:t xml:space="preserve">: prospects with stages (contacted → meeting → diligence → term-sheet → committed/passed), firm, check size, notes; pipeline summary (open vs committed value by stage);</w:t>
-      </w:r>
-      <w:r>
-        <w:t xml:space="preserve"> </w:t>
-      </w:r>
-      <w:r>
-        <w:rPr>
-          <w:b/>
-          <w:bCs/>
-        </w:rPr>
-        <w:t xml:space="preserve">one-click conversion of a prospect into a round commitment</w:t>
-      </w:r>
-      <w:r>
-        <w:t xml:space="preserve">.</w:t>
-      </w:r>
-    </w:p>
-    <w:p>
-      <w:pPr>
-        <w:pStyle w:val="Compact"/>
-        <w:numPr>
-          <w:ilvl w:val="0"/>
-          <w:numId w:val="1008"/>
-        </w:numPr>
-      </w:pPr>
-      <w:r>
-        <w:rPr>
-          <w:b/>
-          <w:bCs/>
-        </w:rPr>
-        <w:t xml:space="preserve">FR-E-9 (M — added v1.2)</w:t>
-      </w:r>
-      <w:r>
-        <w:t xml:space="preserve"> </w:t>
-      </w:r>
-      <w:r>
-        <w:t xml:space="preserve">✅</w:t>
-      </w:r>
-      <w:r>
-        <w:t xml:space="preserve"> </w:t>
-      </w:r>
-      <w:r>
-        <w:rPr>
-          <w:b/>
-          <w:bCs/>
-        </w:rPr>
-        <w:t xml:space="preserve">Family &amp; friends investing</w:t>
-      </w:r>
-      <w:r>
-        <w:t xml:space="preserve">: every SAFE/note and round commitment carries an investor kind (friends &amp; family / angel / institutional) shown across fundraising views; F&amp;F investors given an email see their instruments in the investor portal automatically (no explicit grant needed); the Pre-seed stage guide walks founders through it with the Sec 42 guardrail (FR-E-5) enforcing the 200-offeree/FY limit.</w:t>
-      </w:r>
-    </w:p>
-    <w:bookmarkEnd w:id="23"/>
-    <w:bookmarkStart w:id="24" w:name="f-document-automation--e-signature"/>
-    <w:p>
-      <w:pPr>
-        <w:pStyle w:val="Heading3"/>
-      </w:pPr>
-      <w:r>
-        <w:t xml:space="preserve">F. Document Automation &amp; e-Signature</w:t>
+        <w:t xml:space="preserve">Note:</w:t>
+      </w:r>
+      <w:r>
+        <w:t xml:space="preserve"> </w:t>
+      </w:r>
+      <w:r>
+        <w:t xml:space="preserve">parameterised merge; clause-level composition remains open.</w:t>
       </w:r>
     </w:p>
     <w:p>
@@ -3287,13 +3449,13 @@
           <w:b/>
           <w:bCs/>
         </w:rPr>
-        <w:t xml:space="preserve">FR-F-1 (M)</w:t>
-      </w:r>
-      <w:r>
-        <w:t xml:space="preserve"> </w:t>
-      </w:r>
-      <w:r>
-        <w:t xml:space="preserve">✅ Template library (~20 India-specific templates): incorporation (SPICe+/eMoA/eAoA), board resolution, share certificate, SHA, PAS-4, term sheet, meeting notice, D&amp;O indemnification, offer letter, IP assignment, NDA, MSA, SOW, fund/SPV docs.</w:t>
+        <w:t xml:space="preserve">FR-F-2 (M)</w:t>
+      </w:r>
+      <w:r>
+        <w:t xml:space="preserve"> </w:t>
+      </w:r>
+      <w:r>
+        <w:t xml:space="preserve">◐ Data merge + versioning.</w:t>
       </w:r>
       <w:r>
         <w:t xml:space="preserve"> </w:t>
@@ -3303,35 +3465,29 @@
           <w:i/>
           <w:iCs/>
         </w:rPr>
-        <w:t xml:space="preserve">Note:</w:t>
-      </w:r>
-      <w:r>
-        <w:t xml:space="preserve"> </w:t>
-      </w:r>
-      <w:r>
-        <w:t xml:space="preserve">parameterised merge; clause-level composition remains open.</w:t>
-      </w:r>
-    </w:p>
-    <w:p>
-      <w:pPr>
-        <w:pStyle w:val="Compact"/>
-        <w:numPr>
-          <w:ilvl w:val="0"/>
-          <w:numId w:val="1009"/>
-        </w:numPr>
-      </w:pPr>
-      <w:r>
-        <w:rPr>
-          <w:b/>
-          <w:bCs/>
-        </w:rPr>
-        <w:t xml:space="preserve">FR-F-2 (M)</w:t>
-      </w:r>
-      <w:r>
-        <w:t xml:space="preserve"> </w:t>
-      </w:r>
-      <w:r>
-        <w:t xml:space="preserve">◐ Data merge + versioning.</w:t>
+        <w:t xml:space="preserve">Built:</w:t>
+      </w:r>
+      <w:r>
+        <w:t xml:space="preserve"> </w:t>
+      </w:r>
+      <w:r>
+        <w:t xml:space="preserve">entity/round/grant data merged into templates; append-only versions; regenerate blocked after signing;</w:t>
+      </w:r>
+      <w:r>
+        <w:t xml:space="preserve"> </w:t>
+      </w:r>
+      <w:r>
+        <w:rPr>
+          <w:b/>
+          <w:bCs/>
+        </w:rPr>
+        <w:t xml:space="preserve">PDF download for every generated document</w:t>
+      </w:r>
+      <w:r>
+        <w:t xml:space="preserve"> </w:t>
+      </w:r>
+      <w:r>
+        <w:t xml:space="preserve">(members via Documents; LPs download their own statements/Form 64C from the portal).</w:t>
       </w:r>
       <w:r>
         <w:t xml:space="preserve"> </w:t>
@@ -3341,29 +3497,35 @@
           <w:i/>
           <w:iCs/>
         </w:rPr>
-        <w:t xml:space="preserve">Built:</w:t>
-      </w:r>
-      <w:r>
-        <w:t xml:space="preserve"> </w:t>
-      </w:r>
-      <w:r>
-        <w:t xml:space="preserve">entity/round/grant data merged into templates; append-only versions; regenerate blocked after signing;</w:t>
-      </w:r>
-      <w:r>
-        <w:t xml:space="preserve"> </w:t>
-      </w:r>
-      <w:r>
-        <w:rPr>
-          <w:b/>
-          <w:bCs/>
-        </w:rPr>
-        <w:t xml:space="preserve">PDF download for every generated document</w:t>
-      </w:r>
-      <w:r>
-        <w:t xml:space="preserve"> </w:t>
-      </w:r>
-      <w:r>
-        <w:t xml:space="preserve">(members via Documents; LPs download their own statements/Form 64C from the portal).</w:t>
+        <w:t xml:space="preserve">Remaining:</w:t>
+      </w:r>
+      <w:r>
+        <w:t xml:space="preserve"> </w:t>
+      </w:r>
+      <w:r>
+        <w:t xml:space="preserve">redline comparison; richer PDF layouts.</w:t>
+      </w:r>
+    </w:p>
+    <w:p>
+      <w:pPr>
+        <w:pStyle w:val="Compact"/>
+        <w:numPr>
+          <w:ilvl w:val="0"/>
+          <w:numId w:val="1009"/>
+        </w:numPr>
+      </w:pPr>
+      <w:r>
+        <w:rPr>
+          <w:b/>
+          <w:bCs/>
+        </w:rPr>
+        <w:t xml:space="preserve">FR-F-3 (M)</w:t>
+      </w:r>
+      <w:r>
+        <w:t xml:space="preserve"> </w:t>
+      </w:r>
+      <w:r>
+        <w:t xml:space="preserve">◐ e-Signature.</w:t>
       </w:r>
       <w:r>
         <w:t xml:space="preserve"> </w:t>
@@ -3373,35 +3535,13 @@
           <w:i/>
           <w:iCs/>
         </w:rPr>
-        <w:t xml:space="preserve">Remaining:</w:t>
-      </w:r>
-      <w:r>
-        <w:t xml:space="preserve"> </w:t>
-      </w:r>
-      <w:r>
-        <w:t xml:space="preserve">redline comparison; richer PDF layouts.</w:t>
-      </w:r>
-    </w:p>
-    <w:p>
-      <w:pPr>
-        <w:pStyle w:val="Compact"/>
-        <w:numPr>
-          <w:ilvl w:val="0"/>
-          <w:numId w:val="1009"/>
-        </w:numPr>
-      </w:pPr>
-      <w:r>
-        <w:rPr>
-          <w:b/>
-          <w:bCs/>
-        </w:rPr>
-        <w:t xml:space="preserve">FR-F-3 (M)</w:t>
-      </w:r>
-      <w:r>
-        <w:t xml:space="preserve"> </w:t>
-      </w:r>
-      <w:r>
-        <w:t xml:space="preserve">◐ e-Signature.</w:t>
+        <w:t xml:space="preserve">Built:</w:t>
+      </w:r>
+      <w:r>
+        <w:t xml:space="preserve"> </w:t>
+      </w:r>
+      <w:r>
+        <w:t xml:space="preserve">full signing lifecycle (request → signatories → provider-callback → signed, tamper-lock) with a simulated provider.</w:t>
       </w:r>
       <w:r>
         <w:t xml:space="preserve"> </w:t>
@@ -3411,13 +3551,213 @@
           <w:i/>
           <w:iCs/>
         </w:rPr>
-        <w:t xml:space="preserve">Built:</w:t>
-      </w:r>
-      <w:r>
-        <w:t xml:space="preserve"> </w:t>
-      </w:r>
-      <w:r>
-        <w:t xml:space="preserve">full signing lifecycle (request → signatories → provider-callback → signed, tamper-lock) with a simulated provider.</w:t>
+        <w:t xml:space="preserve">Remaining:</w:t>
+      </w:r>
+      <w:r>
+        <w:t xml:space="preserve"> </w:t>
+      </w:r>
+      <w:r>
+        <w:t xml:space="preserve">⛔ real Aadhaar eSign (eMudhra/NSDL) / Leegality / DocuSign adapters.</w:t>
+      </w:r>
+    </w:p>
+    <w:p>
+      <w:pPr>
+        <w:pStyle w:val="Compact"/>
+        <w:numPr>
+          <w:ilvl w:val="0"/>
+          <w:numId w:val="1009"/>
+        </w:numPr>
+      </w:pPr>
+      <w:r>
+        <w:rPr>
+          <w:b/>
+          <w:bCs/>
+        </w:rPr>
+        <w:t xml:space="preserve">FR-F-4 (M)</w:t>
+      </w:r>
+      <w:r>
+        <w:t xml:space="preserve"> </w:t>
+      </w:r>
+      <w:r>
+        <w:t xml:space="preserve">✅ Document as first-class object with polymorphic links (round, resolution, meeting, contract, team member, workflow run, director…).</w:t>
+      </w:r>
+    </w:p>
+    <w:p>
+      <w:pPr>
+        <w:pStyle w:val="Compact"/>
+        <w:numPr>
+          <w:ilvl w:val="0"/>
+          <w:numId w:val="1009"/>
+        </w:numPr>
+      </w:pPr>
+      <w:r>
+        <w:rPr>
+          <w:b/>
+          <w:bCs/>
+        </w:rPr>
+        <w:t xml:space="preserve">FR-F-5 (P2)</w:t>
+      </w:r>
+      <w:r>
+        <w:t xml:space="preserve"> </w:t>
+      </w:r>
+      <w:r>
+        <w:t xml:space="preserve">○ Clause library + AI-assisted drafting/review.</w:t>
+      </w:r>
+    </w:p>
+    <w:p>
+      <w:pPr>
+        <w:pStyle w:val="Compact"/>
+        <w:numPr>
+          <w:ilvl w:val="0"/>
+          <w:numId w:val="1009"/>
+        </w:numPr>
+      </w:pPr>
+      <w:r>
+        <w:rPr>
+          <w:b/>
+          <w:bCs/>
+        </w:rPr>
+        <w:t xml:space="preserve">FR-F-6 (P2)</w:t>
+      </w:r>
+      <w:r>
+        <w:t xml:space="preserve"> </w:t>
+      </w:r>
+      <w:r>
+        <w:t xml:space="preserve">○ ⛔ e-stamp/SHCIL and notarisation hand-off.</w:t>
+      </w:r>
+    </w:p>
+    <w:bookmarkEnd w:id="24"/>
+    <w:bookmarkStart w:id="25" w:name="Xbeea2f57b1b60c38ee240abe92ab280ab33633d"/>
+    <w:p>
+      <w:pPr>
+        <w:pStyle w:val="Heading3"/>
+      </w:pPr>
+      <w:r>
+        <w:t xml:space="preserve">G. Governance (Board, Shareholders, Directors)</w:t>
+      </w:r>
+    </w:p>
+    <w:p>
+      <w:pPr>
+        <w:pStyle w:val="Compact"/>
+        <w:numPr>
+          <w:ilvl w:val="0"/>
+          <w:numId w:val="1010"/>
+        </w:numPr>
+      </w:pPr>
+      <w:r>
+        <w:rPr>
+          <w:b/>
+          <w:bCs/>
+        </w:rPr>
+        <w:t xml:space="preserve">FR-G-1 (M)</w:t>
+      </w:r>
+      <w:r>
+        <w:t xml:space="preserve"> </w:t>
+      </w:r>
+      <w:r>
+        <w:t xml:space="preserve">✅ Meetings: board/AGM/EGM with date, venue, quorum;</w:t>
+      </w:r>
+      <w:r>
+        <w:t xml:space="preserve"> </w:t>
+      </w:r>
+      <w:r>
+        <w:rPr>
+          <w:b/>
+          <w:bCs/>
+        </w:rPr>
+        <w:t xml:space="preserve">agenda items</w:t>
+      </w:r>
+      <w:r>
+        <w:t xml:space="preserve">;</w:t>
+      </w:r>
+      <w:r>
+        <w:t xml:space="preserve"> </w:t>
+      </w:r>
+      <w:r>
+        <w:rPr>
+          <w:b/>
+          <w:bCs/>
+        </w:rPr>
+        <w:t xml:space="preserve">notice generation</w:t>
+      </w:r>
+      <w:r>
+        <w:t xml:space="preserve"> </w:t>
+      </w:r>
+      <w:r>
+        <w:t xml:space="preserve">(agenda + quorum merged into a linked notice document); minutes + held/cancelled status.</w:t>
+      </w:r>
+    </w:p>
+    <w:p>
+      <w:pPr>
+        <w:pStyle w:val="Compact"/>
+        <w:numPr>
+          <w:ilvl w:val="0"/>
+          <w:numId w:val="1010"/>
+        </w:numPr>
+      </w:pPr>
+      <w:r>
+        <w:rPr>
+          <w:b/>
+          <w:bCs/>
+        </w:rPr>
+        <w:t xml:space="preserve">FR-G-2 (M)</w:t>
+      </w:r>
+      <w:r>
+        <w:t xml:space="preserve"> </w:t>
+      </w:r>
+      <w:r>
+        <w:t xml:space="preserve">✅ Resolutions: board/ordinary/special/circular; pass/fail with dates; board-resolution document generation;</w:t>
+      </w:r>
+      <w:r>
+        <w:t xml:space="preserve"> </w:t>
+      </w:r>
+      <w:r>
+        <w:rPr>
+          <w:b/>
+          <w:bCs/>
+        </w:rPr>
+        <w:t xml:space="preserve">MGT-14 filing obligation auto-created when a special/circular resolution passes</w:t>
+      </w:r>
+      <w:r>
+        <w:t xml:space="preserve">;</w:t>
+      </w:r>
+      <w:r>
+        <w:t xml:space="preserve"> </w:t>
+      </w:r>
+      <w:r>
+        <w:rPr>
+          <w:b/>
+          <w:bCs/>
+        </w:rPr>
+        <w:t xml:space="preserve">charter amendment</w:t>
+      </w:r>
+      <w:r>
+        <w:t xml:space="preserve"> </w:t>
+      </w:r>
+      <w:r>
+        <w:t xml:space="preserve">(v1.3) — one step drafts the MoA/AoA alteration as a special resolution plus a linked document, feeding the same MGT-14 hook on passing.</w:t>
+      </w:r>
+    </w:p>
+    <w:p>
+      <w:pPr>
+        <w:pStyle w:val="Compact"/>
+        <w:numPr>
+          <w:ilvl w:val="0"/>
+          <w:numId w:val="1010"/>
+        </w:numPr>
+      </w:pPr>
+      <w:r>
+        <w:rPr>
+          <w:b/>
+          <w:bCs/>
+        </w:rPr>
+        <w:t xml:space="preserve">FR-G-3 (M)</w:t>
+      </w:r>
+      <w:r>
+        <w:t xml:space="preserve"> </w:t>
+      </w:r>
+      <w:r>
+        <w:t xml:space="preserve">◐ Consents: circular resolutions serve the written-consent path.</w:t>
       </w:r>
       <w:r>
         <w:t xml:space="preserve"> </w:t>
@@ -3433,83 +3773,7 @@
         <w:t xml:space="preserve"> </w:t>
       </w:r>
       <w:r>
-        <w:t xml:space="preserve">⛔ real Aadhaar eSign (eMudhra/NSDL) / Leegality / DocuSign adapters.</w:t>
-      </w:r>
-    </w:p>
-    <w:p>
-      <w:pPr>
-        <w:pStyle w:val="Compact"/>
-        <w:numPr>
-          <w:ilvl w:val="0"/>
-          <w:numId w:val="1009"/>
-        </w:numPr>
-      </w:pPr>
-      <w:r>
-        <w:rPr>
-          <w:b/>
-          <w:bCs/>
-        </w:rPr>
-        <w:t xml:space="preserve">FR-F-4 (M)</w:t>
-      </w:r>
-      <w:r>
-        <w:t xml:space="preserve"> </w:t>
-      </w:r>
-      <w:r>
-        <w:t xml:space="preserve">✅ Document as first-class object with polymorphic links (round, resolution, meeting, contract, team member, workflow run, director…).</w:t>
-      </w:r>
-    </w:p>
-    <w:p>
-      <w:pPr>
-        <w:pStyle w:val="Compact"/>
-        <w:numPr>
-          <w:ilvl w:val="0"/>
-          <w:numId w:val="1009"/>
-        </w:numPr>
-      </w:pPr>
-      <w:r>
-        <w:rPr>
-          <w:b/>
-          <w:bCs/>
-        </w:rPr>
-        <w:t xml:space="preserve">FR-F-5 (P2)</w:t>
-      </w:r>
-      <w:r>
-        <w:t xml:space="preserve"> </w:t>
-      </w:r>
-      <w:r>
-        <w:t xml:space="preserve">○ Clause library + AI-assisted drafting/review.</w:t>
-      </w:r>
-    </w:p>
-    <w:p>
-      <w:pPr>
-        <w:pStyle w:val="Compact"/>
-        <w:numPr>
-          <w:ilvl w:val="0"/>
-          <w:numId w:val="1009"/>
-        </w:numPr>
-      </w:pPr>
-      <w:r>
-        <w:rPr>
-          <w:b/>
-          <w:bCs/>
-        </w:rPr>
-        <w:t xml:space="preserve">FR-F-6 (P2)</w:t>
-      </w:r>
-      <w:r>
-        <w:t xml:space="preserve"> </w:t>
-      </w:r>
-      <w:r>
-        <w:t xml:space="preserve">○ ⛔ e-stamp/SHCIL and notarisation hand-off.</w:t>
-      </w:r>
-    </w:p>
-    <w:bookmarkEnd w:id="24"/>
-    <w:bookmarkStart w:id="25" w:name="Xbeea2f57b1b60c38ee240abe92ab280ab33633d"/>
-    <w:p>
-      <w:pPr>
-        <w:pStyle w:val="Heading3"/>
-      </w:pPr>
-      <w:r>
-        <w:t xml:space="preserve">G. Governance (Board, Shareholders, Directors)</w:t>
+        <w:t xml:space="preserve">formal consent object with per-party sign-off and statutory-validity checks.</w:t>
       </w:r>
     </w:p>
     <w:p>
@@ -3525,99 +3789,13 @@
           <w:b/>
           <w:bCs/>
         </w:rPr>
-        <w:t xml:space="preserve">FR-G-1 (M)</w:t>
-      </w:r>
-      <w:r>
-        <w:t xml:space="preserve"> </w:t>
-      </w:r>
-      <w:r>
-        <w:t xml:space="preserve">✅ Meetings: board/AGM/EGM with date, venue, quorum;</w:t>
-      </w:r>
-      <w:r>
-        <w:t xml:space="preserve"> </w:t>
-      </w:r>
-      <w:r>
-        <w:rPr>
-          <w:b/>
-          <w:bCs/>
-        </w:rPr>
-        <w:t xml:space="preserve">agenda items</w:t>
-      </w:r>
-      <w:r>
-        <w:t xml:space="preserve">;</w:t>
-      </w:r>
-      <w:r>
-        <w:t xml:space="preserve"> </w:t>
-      </w:r>
-      <w:r>
-        <w:rPr>
-          <w:b/>
-          <w:bCs/>
-        </w:rPr>
-        <w:t xml:space="preserve">notice generation</w:t>
-      </w:r>
-      <w:r>
-        <w:t xml:space="preserve"> </w:t>
-      </w:r>
-      <w:r>
-        <w:t xml:space="preserve">(agenda + quorum merged into a linked notice document); minutes + held/cancelled status.</w:t>
-      </w:r>
-    </w:p>
-    <w:p>
-      <w:pPr>
-        <w:pStyle w:val="Compact"/>
-        <w:numPr>
-          <w:ilvl w:val="0"/>
-          <w:numId w:val="1010"/>
-        </w:numPr>
-      </w:pPr>
-      <w:r>
-        <w:rPr>
-          <w:b/>
-          <w:bCs/>
-        </w:rPr>
-        <w:t xml:space="preserve">FR-G-2 (M)</w:t>
-      </w:r>
-      <w:r>
-        <w:t xml:space="preserve"> </w:t>
-      </w:r>
-      <w:r>
-        <w:t xml:space="preserve">✅ Resolutions: board/ordinary/special/circular; pass/fail with dates; board-resolution document generation;</w:t>
-      </w:r>
-      <w:r>
-        <w:t xml:space="preserve"> </w:t>
-      </w:r>
-      <w:r>
-        <w:rPr>
-          <w:b/>
-          <w:bCs/>
-        </w:rPr>
-        <w:t xml:space="preserve">MGT-14 filing obligation auto-created when a special/circular resolution passes</w:t>
-      </w:r>
-      <w:r>
-        <w:t xml:space="preserve">.</w:t>
-      </w:r>
-    </w:p>
-    <w:p>
-      <w:pPr>
-        <w:pStyle w:val="Compact"/>
-        <w:numPr>
-          <w:ilvl w:val="0"/>
-          <w:numId w:val="1010"/>
-        </w:numPr>
-      </w:pPr>
-      <w:r>
-        <w:rPr>
-          <w:b/>
-          <w:bCs/>
-        </w:rPr>
-        <w:t xml:space="preserve">FR-G-3 (M)</w:t>
-      </w:r>
-      <w:r>
-        <w:t xml:space="preserve"> </w:t>
-      </w:r>
-      <w:r>
-        <w:t xml:space="preserve">◐ Consents: circular resolutions serve the written-consent path.</w:t>
+        <w:t xml:space="preserve">FR-G-4 (P2)</w:t>
+      </w:r>
+      <w:r>
+        <w:t xml:space="preserve"> </w:t>
+      </w:r>
+      <w:r>
+        <w:t xml:space="preserve">✅</w:t>
       </w:r>
       <w:r>
         <w:t xml:space="preserve"> </w:t>
@@ -3627,35 +3805,29 @@
           <w:i/>
           <w:iCs/>
         </w:rPr>
-        <w:t xml:space="preserve">Remaining:</w:t>
-      </w:r>
-      <w:r>
-        <w:t xml:space="preserve"> </w:t>
-      </w:r>
-      <w:r>
-        <w:t xml:space="preserve">formal consent object with per-party sign-off and statutory-validity checks.</w:t>
-      </w:r>
-    </w:p>
-    <w:p>
-      <w:pPr>
-        <w:pStyle w:val="Compact"/>
-        <w:numPr>
-          <w:ilvl w:val="0"/>
-          <w:numId w:val="1010"/>
-        </w:numPr>
-      </w:pPr>
-      <w:r>
-        <w:rPr>
-          <w:b/>
-          <w:bCs/>
-        </w:rPr>
-        <w:t xml:space="preserve">FR-G-4 (P2)</w:t>
-      </w:r>
-      <w:r>
-        <w:t xml:space="preserve"> </w:t>
-      </w:r>
-      <w:r>
-        <w:t xml:space="preserve">✅</w:t>
+        <w:t xml:space="preserve">(promoted — implemented)</w:t>
+      </w:r>
+      <w:r>
+        <w:t xml:space="preserve"> </w:t>
+      </w:r>
+      <w:r>
+        <w:t xml:space="preserve">Director/KMP register: designations (MD/WTD/independent/nominee/CS/CFO), DIN, appointment/resignation with</w:t>
+      </w:r>
+      <w:r>
+        <w:t xml:space="preserve"> </w:t>
+      </w:r>
+      <w:r>
+        <w:rPr>
+          <w:b/>
+          <w:bCs/>
+        </w:rPr>
+        <w:t xml:space="preserve">DIR-12 obligations auto-created</w:t>
+      </w:r>
+      <w:r>
+        <w:t xml:space="preserve"> </w:t>
+      </w:r>
+      <w:r>
+        <w:t xml:space="preserve">on both events.</w:t>
       </w:r>
       <w:r>
         <w:t xml:space="preserve"> </w:t>
@@ -3665,29 +3837,57 @@
           <w:i/>
           <w:iCs/>
         </w:rPr>
-        <w:t xml:space="preserve">(promoted — implemented)</w:t>
-      </w:r>
-      <w:r>
-        <w:t xml:space="preserve"> </w:t>
-      </w:r>
-      <w:r>
-        <w:t xml:space="preserve">Director/KMP register: designations (MD/WTD/independent/nominee/CS/CFO), DIN, appointment/resignation with</w:t>
-      </w:r>
-      <w:r>
-        <w:t xml:space="preserve"> </w:t>
-      </w:r>
-      <w:r>
-        <w:rPr>
-          <w:b/>
-          <w:bCs/>
-        </w:rPr>
-        <w:t xml:space="preserve">DIR-12 obligations auto-created</w:t>
-      </w:r>
-      <w:r>
-        <w:t xml:space="preserve"> </w:t>
-      </w:r>
-      <w:r>
-        <w:t xml:space="preserve">on both events.</w:t>
+        <w:t xml:space="preserve">Remaining:</w:t>
+      </w:r>
+      <w:r>
+        <w:t xml:space="preserve"> </w:t>
+      </w:r>
+      <w:r>
+        <w:t xml:space="preserve">disqualification checks.</w:t>
+      </w:r>
+    </w:p>
+    <w:p>
+      <w:pPr>
+        <w:pStyle w:val="Compact"/>
+        <w:numPr>
+          <w:ilvl w:val="0"/>
+          <w:numId w:val="1010"/>
+        </w:numPr>
+      </w:pPr>
+      <w:r>
+        <w:rPr>
+          <w:b/>
+          <w:bCs/>
+        </w:rPr>
+        <w:t xml:space="preserve">FR-G-5 (P2)</w:t>
+      </w:r>
+      <w:r>
+        <w:t xml:space="preserve"> </w:t>
+      </w:r>
+      <w:r>
+        <w:t xml:space="preserve">○ Board portal (pre-reads, voting, action items).</w:t>
+      </w:r>
+    </w:p>
+    <w:p>
+      <w:pPr>
+        <w:pStyle w:val="Compact"/>
+        <w:numPr>
+          <w:ilvl w:val="0"/>
+          <w:numId w:val="1010"/>
+        </w:numPr>
+      </w:pPr>
+      <w:r>
+        <w:rPr>
+          <w:b/>
+          <w:bCs/>
+        </w:rPr>
+        <w:t xml:space="preserve">FR-G-6 (P2)</w:t>
+      </w:r>
+      <w:r>
+        <w:t xml:space="preserve"> </w:t>
+      </w:r>
+      <w:r>
+        <w:t xml:space="preserve">✅</w:t>
       </w:r>
       <w:r>
         <w:t xml:space="preserve"> </w:t>
@@ -3697,57 +3897,115 @@
           <w:i/>
           <w:iCs/>
         </w:rPr>
-        <w:t xml:space="preserve">Remaining:</w:t>
-      </w:r>
-      <w:r>
-        <w:t xml:space="preserve"> </w:t>
-      </w:r>
-      <w:r>
-        <w:t xml:space="preserve">disqualification checks.</w:t>
-      </w:r>
-    </w:p>
-    <w:p>
-      <w:pPr>
-        <w:pStyle w:val="Compact"/>
-        <w:numPr>
-          <w:ilvl w:val="0"/>
-          <w:numId w:val="1010"/>
-        </w:numPr>
-      </w:pPr>
-      <w:r>
-        <w:rPr>
-          <w:b/>
-          <w:bCs/>
-        </w:rPr>
-        <w:t xml:space="preserve">FR-G-5 (P2)</w:t>
-      </w:r>
-      <w:r>
-        <w:t xml:space="preserve"> </w:t>
-      </w:r>
-      <w:r>
-        <w:t xml:space="preserve">○ Board portal (pre-reads, voting, action items).</w:t>
-      </w:r>
-    </w:p>
-    <w:p>
-      <w:pPr>
-        <w:pStyle w:val="Compact"/>
-        <w:numPr>
-          <w:ilvl w:val="0"/>
-          <w:numId w:val="1010"/>
-        </w:numPr>
-      </w:pPr>
-      <w:r>
-        <w:rPr>
-          <w:b/>
-          <w:bCs/>
-        </w:rPr>
-        <w:t xml:space="preserve">FR-G-6 (P2)</w:t>
-      </w:r>
-      <w:r>
-        <w:t xml:space="preserve"> </w:t>
-      </w:r>
-      <w:r>
-        <w:t xml:space="preserve">✅</w:t>
+        <w:t xml:space="preserve">(promoted — implemented)</w:t>
+      </w:r>
+      <w:r>
+        <w:t xml:space="preserve"> </w:t>
+      </w:r>
+      <w:r>
+        <w:t xml:space="preserve">D&amp;O indemnification agreement generation per director.</w:t>
+      </w:r>
+    </w:p>
+    <w:bookmarkEnd w:id="25"/>
+    <w:bookmarkStart w:id="26" w:name="Xcbf93e9c8d60f447df98c342401dfe903786502"/>
+    <w:p>
+      <w:pPr>
+        <w:pStyle w:val="Heading3"/>
+      </w:pPr>
+      <w:r>
+        <w:t xml:space="preserve">H. Compliance Engine (MCA/ROC, FEMA/RBI, GST/TDS)</w:t>
+      </w:r>
+    </w:p>
+    <w:p>
+      <w:pPr>
+        <w:pStyle w:val="Compact"/>
+        <w:numPr>
+          <w:ilvl w:val="0"/>
+          <w:numId w:val="1011"/>
+        </w:numPr>
+      </w:pPr>
+      <w:r>
+        <w:rPr>
+          <w:b/>
+          <w:bCs/>
+        </w:rPr>
+        <w:t xml:space="preserve">FR-H-1 (M)</w:t>
+      </w:r>
+      <w:r>
+        <w:t xml:space="preserve"> </w:t>
+      </w:r>
+      <w:r>
+        <w:t xml:space="preserve">✅ Compliance calendar, three generators:</w:t>
+      </w:r>
+      <w:r>
+        <w:t xml:space="preserve"> </w:t>
+      </w:r>
+      <w:r>
+        <w:rPr>
+          <w:b/>
+          <w:bCs/>
+        </w:rPr>
+        <w:t xml:space="preserve">annual ROC</w:t>
+      </w:r>
+      <w:r>
+        <w:t xml:space="preserve"> </w:t>
+      </w:r>
+      <w:r>
+        <w:t xml:space="preserve">(AOC-4, MGT-7, DIR-3 KYC, DPT-3, ADT-1 from FY end, rules-as-data),</w:t>
+      </w:r>
+      <w:r>
+        <w:t xml:space="preserve"> </w:t>
+      </w:r>
+      <w:r>
+        <w:rPr>
+          <w:b/>
+          <w:bCs/>
+        </w:rPr>
+        <w:t xml:space="preserve">event-based</w:t>
+      </w:r>
+      <w:r>
+        <w:t xml:space="preserve"> </w:t>
+      </w:r>
+      <w:r>
+        <w:t xml:space="preserve">(PAS-3 on allotment, MGT-14 on special resolution, DIR-12 on director change, FC-GPR on foreign allotment — auto-created by the triggering action), and</w:t>
+      </w:r>
+      <w:r>
+        <w:t xml:space="preserve"> </w:t>
+      </w:r>
+      <w:r>
+        <w:rPr>
+          <w:b/>
+          <w:bCs/>
+        </w:rPr>
+        <w:t xml:space="preserve">recurring</w:t>
+      </w:r>
+      <w:r>
+        <w:t xml:space="preserve"> </w:t>
+      </w:r>
+      <w:r>
+        <w:t xml:space="preserve">(12× monthly GSTR-3B due the 20th following, 4× quarterly TDS 26Q). All idempotent.</w:t>
+      </w:r>
+    </w:p>
+    <w:p>
+      <w:pPr>
+        <w:pStyle w:val="Compact"/>
+        <w:numPr>
+          <w:ilvl w:val="0"/>
+          <w:numId w:val="1011"/>
+        </w:numPr>
+      </w:pPr>
+      <w:r>
+        <w:rPr>
+          <w:b/>
+          <w:bCs/>
+        </w:rPr>
+        <w:t xml:space="preserve">FR-H-2 (M)</w:t>
+      </w:r>
+      <w:r>
+        <w:t xml:space="preserve"> </w:t>
+      </w:r>
+      <w:r>
+        <w:t xml:space="preserve">◐ Filing prep.</w:t>
       </w:r>
       <w:r>
         <w:t xml:space="preserve"> </w:t>
@@ -3757,115 +4015,13 @@
           <w:i/>
           <w:iCs/>
         </w:rPr>
-        <w:t xml:space="preserve">(promoted — implemented)</w:t>
-      </w:r>
-      <w:r>
-        <w:t xml:space="preserve"> </w:t>
-      </w:r>
-      <w:r>
-        <w:t xml:space="preserve">D&amp;O indemnification agreement generation per director.</w:t>
-      </w:r>
-    </w:p>
-    <w:bookmarkEnd w:id="25"/>
-    <w:bookmarkStart w:id="26" w:name="Xcbf93e9c8d60f447df98c342401dfe903786502"/>
-    <w:p>
-      <w:pPr>
-        <w:pStyle w:val="Heading3"/>
-      </w:pPr>
-      <w:r>
-        <w:t xml:space="preserve">H. Compliance Engine (MCA/ROC, FEMA/RBI, GST/TDS)</w:t>
-      </w:r>
-    </w:p>
-    <w:p>
-      <w:pPr>
-        <w:pStyle w:val="Compact"/>
-        <w:numPr>
-          <w:ilvl w:val="0"/>
-          <w:numId w:val="1011"/>
-        </w:numPr>
-      </w:pPr>
-      <w:r>
-        <w:rPr>
-          <w:b/>
-          <w:bCs/>
-        </w:rPr>
-        <w:t xml:space="preserve">FR-H-1 (M)</w:t>
-      </w:r>
-      <w:r>
-        <w:t xml:space="preserve"> </w:t>
-      </w:r>
-      <w:r>
-        <w:t xml:space="preserve">✅ Compliance calendar, three generators:</w:t>
-      </w:r>
-      <w:r>
-        <w:t xml:space="preserve"> </w:t>
-      </w:r>
-      <w:r>
-        <w:rPr>
-          <w:b/>
-          <w:bCs/>
-        </w:rPr>
-        <w:t xml:space="preserve">annual ROC</w:t>
-      </w:r>
-      <w:r>
-        <w:t xml:space="preserve"> </w:t>
-      </w:r>
-      <w:r>
-        <w:t xml:space="preserve">(AOC-4, MGT-7, DIR-3 KYC, DPT-3, ADT-1 from FY end, rules-as-data),</w:t>
-      </w:r>
-      <w:r>
-        <w:t xml:space="preserve"> </w:t>
-      </w:r>
-      <w:r>
-        <w:rPr>
-          <w:b/>
-          <w:bCs/>
-        </w:rPr>
-        <w:t xml:space="preserve">event-based</w:t>
-      </w:r>
-      <w:r>
-        <w:t xml:space="preserve"> </w:t>
-      </w:r>
-      <w:r>
-        <w:t xml:space="preserve">(PAS-3 on allotment, MGT-14 on special resolution, DIR-12 on director change, FC-GPR on foreign allotment — auto-created by the triggering action), and</w:t>
-      </w:r>
-      <w:r>
-        <w:t xml:space="preserve"> </w:t>
-      </w:r>
-      <w:r>
-        <w:rPr>
-          <w:b/>
-          <w:bCs/>
-        </w:rPr>
-        <w:t xml:space="preserve">recurring</w:t>
-      </w:r>
-      <w:r>
-        <w:t xml:space="preserve"> </w:t>
-      </w:r>
-      <w:r>
-        <w:t xml:space="preserve">(12× monthly GSTR-3B due the 20th following, 4× quarterly TDS 26Q). All idempotent.</w:t>
-      </w:r>
-    </w:p>
-    <w:p>
-      <w:pPr>
-        <w:pStyle w:val="Compact"/>
-        <w:numPr>
-          <w:ilvl w:val="0"/>
-          <w:numId w:val="1011"/>
-        </w:numPr>
-      </w:pPr>
-      <w:r>
-        <w:rPr>
-          <w:b/>
-          <w:bCs/>
-        </w:rPr>
-        <w:t xml:space="preserve">FR-H-2 (M)</w:t>
-      </w:r>
-      <w:r>
-        <w:t xml:space="preserve"> </w:t>
-      </w:r>
-      <w:r>
-        <w:t xml:space="preserve">◐ Filing prep.</w:t>
+        <w:t xml:space="preserve">Built:</w:t>
+      </w:r>
+      <w:r>
+        <w:t xml:space="preserve"> </w:t>
+      </w:r>
+      <w:r>
+        <w:t xml:space="preserve">status lifecycle (due → in-prep → filed → acknowledged) with SRN capture and assignee.</w:t>
       </w:r>
       <w:r>
         <w:t xml:space="preserve"> </w:t>
@@ -3875,13 +4031,35 @@
           <w:i/>
           <w:iCs/>
         </w:rPr>
-        <w:t xml:space="preserve">Built:</w:t>
-      </w:r>
-      <w:r>
-        <w:t xml:space="preserve"> </w:t>
-      </w:r>
-      <w:r>
-        <w:t xml:space="preserve">status lifecycle (due → in-prep → filed → acknowledged) with SRN capture and assignee.</w:t>
+        <w:t xml:space="preserve">Remaining:</w:t>
+      </w:r>
+      <w:r>
+        <w:t xml:space="preserve"> </w:t>
+      </w:r>
+      <w:r>
+        <w:t xml:space="preserve">validated filing packages per form. ⛔ MCA21 submission.</w:t>
+      </w:r>
+    </w:p>
+    <w:p>
+      <w:pPr>
+        <w:pStyle w:val="Compact"/>
+        <w:numPr>
+          <w:ilvl w:val="0"/>
+          <w:numId w:val="1011"/>
+        </w:numPr>
+      </w:pPr>
+      <w:r>
+        <w:rPr>
+          <w:b/>
+          <w:bCs/>
+        </w:rPr>
+        <w:t xml:space="preserve">FR-H-3 (M)</w:t>
+      </w:r>
+      <w:r>
+        <w:t xml:space="preserve"> </w:t>
+      </w:r>
+      <w:r>
+        <w:t xml:space="preserve">◐ FEMA.</w:t>
       </w:r>
       <w:r>
         <w:t xml:space="preserve"> </w:t>
@@ -3891,35 +4069,13 @@
           <w:i/>
           <w:iCs/>
         </w:rPr>
-        <w:t xml:space="preserve">Remaining:</w:t>
-      </w:r>
-      <w:r>
-        <w:t xml:space="preserve"> </w:t>
-      </w:r>
-      <w:r>
-        <w:t xml:space="preserve">validated filing packages per form. ⛔ MCA21 submission.</w:t>
-      </w:r>
-    </w:p>
-    <w:p>
-      <w:pPr>
-        <w:pStyle w:val="Compact"/>
-        <w:numPr>
-          <w:ilvl w:val="0"/>
-          <w:numId w:val="1011"/>
-        </w:numPr>
-      </w:pPr>
-      <w:r>
-        <w:rPr>
-          <w:b/>
-          <w:bCs/>
-        </w:rPr>
-        <w:t xml:space="preserve">FR-H-3 (M)</w:t>
-      </w:r>
-      <w:r>
-        <w:t xml:space="preserve"> </w:t>
-      </w:r>
-      <w:r>
-        <w:t xml:space="preserve">◐ FEMA.</w:t>
+        <w:t xml:space="preserve">Built:</w:t>
+      </w:r>
+      <w:r>
+        <w:t xml:space="preserve"> </w:t>
+      </w:r>
+      <w:r>
+        <w:t xml:space="preserve">FC-GPR obligation auto-created with 30-day due date on foreign allotment.</w:t>
       </w:r>
       <w:r>
         <w:t xml:space="preserve"> </w:t>
@@ -3929,13 +4085,57 @@
           <w:i/>
           <w:iCs/>
         </w:rPr>
-        <w:t xml:space="preserve">Built:</w:t>
-      </w:r>
-      <w:r>
-        <w:t xml:space="preserve"> </w:t>
-      </w:r>
-      <w:r>
-        <w:t xml:space="preserve">FC-GPR obligation auto-created with 30-day due date on foreign allotment.</w:t>
+        <w:t xml:space="preserve">Remaining:</w:t>
+      </w:r>
+      <w:r>
+        <w:t xml:space="preserve"> </w:t>
+      </w:r>
+      <w:r>
+        <w:t xml:space="preserve">FC-TRS on transfers to/from non-residents, FLA annual reminder, filing-pack artifacts (valuation + CS cert + FIRC). ⛔ FIRMS portal.</w:t>
+      </w:r>
+    </w:p>
+    <w:p>
+      <w:pPr>
+        <w:pStyle w:val="Compact"/>
+        <w:numPr>
+          <w:ilvl w:val="0"/>
+          <w:numId w:val="1011"/>
+        </w:numPr>
+      </w:pPr>
+      <w:r>
+        <w:rPr>
+          <w:b/>
+          <w:bCs/>
+        </w:rPr>
+        <w:t xml:space="preserve">FR-H-3a (P2)</w:t>
+      </w:r>
+      <w:r>
+        <w:t xml:space="preserve"> </w:t>
+      </w:r>
+      <w:r>
+        <w:t xml:space="preserve">○ ODI / overseas-investment tracking.</w:t>
+      </w:r>
+    </w:p>
+    <w:p>
+      <w:pPr>
+        <w:pStyle w:val="Compact"/>
+        <w:numPr>
+          <w:ilvl w:val="0"/>
+          <w:numId w:val="1011"/>
+        </w:numPr>
+      </w:pPr>
+      <w:r>
+        <w:rPr>
+          <w:b/>
+          <w:bCs/>
+        </w:rPr>
+        <w:t xml:space="preserve">FR-H-4 (M)</w:t>
+      </w:r>
+      <w:r>
+        <w:t xml:space="preserve"> </w:t>
+      </w:r>
+      <w:r>
+        <w:t xml:space="preserve">◐ Reminders.</w:t>
       </w:r>
       <w:r>
         <w:t xml:space="preserve"> </w:t>
@@ -3945,57 +4145,23 @@
           <w:i/>
           <w:iCs/>
         </w:rPr>
-        <w:t xml:space="preserve">Remaining:</w:t>
-      </w:r>
-      <w:r>
-        <w:t xml:space="preserve"> </w:t>
-      </w:r>
-      <w:r>
-        <w:t xml:space="preserve">FC-TRS on transfers to/from non-residents, FLA annual reminder, filing-pack artifacts (valuation + CS cert + FIRC). ⛔ FIRMS portal.</w:t>
-      </w:r>
-    </w:p>
-    <w:p>
-      <w:pPr>
-        <w:pStyle w:val="Compact"/>
-        <w:numPr>
-          <w:ilvl w:val="0"/>
-          <w:numId w:val="1011"/>
-        </w:numPr>
-      </w:pPr>
-      <w:r>
-        <w:rPr>
-          <w:b/>
-          <w:bCs/>
-        </w:rPr>
-        <w:t xml:space="preserve">FR-H-3a (P2)</w:t>
-      </w:r>
-      <w:r>
-        <w:t xml:space="preserve"> </w:t>
-      </w:r>
-      <w:r>
-        <w:t xml:space="preserve">○ ODI / overseas-investment tracking.</w:t>
-      </w:r>
-    </w:p>
-    <w:p>
-      <w:pPr>
-        <w:pStyle w:val="Compact"/>
-        <w:numPr>
-          <w:ilvl w:val="0"/>
-          <w:numId w:val="1011"/>
-        </w:numPr>
-      </w:pPr>
-      <w:r>
-        <w:rPr>
-          <w:b/>
-          <w:bCs/>
-        </w:rPr>
-        <w:t xml:space="preserve">FR-H-4 (M)</w:t>
-      </w:r>
-      <w:r>
-        <w:t xml:space="preserve"> </w:t>
-      </w:r>
-      <w:r>
-        <w:t xml:space="preserve">◐ Reminders.</w:t>
+        <w:t xml:space="preserve">Built:</w:t>
+      </w:r>
+      <w:r>
+        <w:t xml:space="preserve"> </w:t>
+      </w:r>
+      <w:r>
+        <w:rPr>
+          <w:b/>
+          <w:bCs/>
+        </w:rPr>
+        <w:t xml:space="preserve">alerts engine</w:t>
+      </w:r>
+      <w:r>
+        <w:t xml:space="preserve"> </w:t>
+      </w:r>
+      <w:r>
+        <w:t xml:space="preserve">— due-soon/overdue obligations and contract renewals aggregated across a user's entities; sweep converts alerts to in-app notifications (deduped).</w:t>
       </w:r>
       <w:r>
         <w:t xml:space="preserve"> </w:t>
@@ -4005,23 +4171,35 @@
           <w:i/>
           <w:iCs/>
         </w:rPr>
-        <w:t xml:space="preserve">Built:</w:t>
-      </w:r>
-      <w:r>
-        <w:t xml:space="preserve"> </w:t>
-      </w:r>
-      <w:r>
-        <w:rPr>
-          <w:b/>
-          <w:bCs/>
-        </w:rPr>
-        <w:t xml:space="preserve">alerts engine</w:t>
-      </w:r>
-      <w:r>
-        <w:t xml:space="preserve"> </w:t>
-      </w:r>
-      <w:r>
-        <w:t xml:space="preserve">— due-soon/overdue obligations and contract renewals aggregated across a user's entities; sweep converts alerts to in-app notifications (deduped).</w:t>
+        <w:t xml:space="preserve">Remaining:</w:t>
+      </w:r>
+      <w:r>
+        <w:t xml:space="preserve"> </w:t>
+      </w:r>
+      <w:r>
+        <w:t xml:space="preserve">⛔ email/SMS/WhatsApp delivery; scheduled (cron) sweep.</w:t>
+      </w:r>
+    </w:p>
+    <w:p>
+      <w:pPr>
+        <w:pStyle w:val="Compact"/>
+        <w:numPr>
+          <w:ilvl w:val="0"/>
+          <w:numId w:val="1011"/>
+        </w:numPr>
+      </w:pPr>
+      <w:r>
+        <w:rPr>
+          <w:b/>
+          <w:bCs/>
+        </w:rPr>
+        <w:t xml:space="preserve">FR-H-5 (P2)</w:t>
+      </w:r>
+      <w:r>
+        <w:t xml:space="preserve"> </w:t>
+      </w:r>
+      <w:r>
+        <w:t xml:space="preserve">◐ Tax hooks.</w:t>
       </w:r>
       <w:r>
         <w:t xml:space="preserve"> </w:t>
@@ -4031,35 +4209,13 @@
           <w:i/>
           <w:iCs/>
         </w:rPr>
-        <w:t xml:space="preserve">Remaining:</w:t>
-      </w:r>
-      <w:r>
-        <w:t xml:space="preserve"> </w:t>
-      </w:r>
-      <w:r>
-        <w:t xml:space="preserve">⛔ email/SMS/WhatsApp delivery; scheduled (cron) sweep.</w:t>
-      </w:r>
-    </w:p>
-    <w:p>
-      <w:pPr>
-        <w:pStyle w:val="Compact"/>
-        <w:numPr>
-          <w:ilvl w:val="0"/>
-          <w:numId w:val="1011"/>
-        </w:numPr>
-      </w:pPr>
-      <w:r>
-        <w:rPr>
-          <w:b/>
-          <w:bCs/>
-        </w:rPr>
-        <w:t xml:space="preserve">FR-H-5 (P2)</w:t>
-      </w:r>
-      <w:r>
-        <w:t xml:space="preserve"> </w:t>
-      </w:r>
-      <w:r>
-        <w:t xml:space="preserve">◐ Tax hooks.</w:t>
+        <w:t xml:space="preserve">Built:</w:t>
+      </w:r>
+      <w:r>
+        <w:t xml:space="preserve"> </w:t>
+      </w:r>
+      <w:r>
+        <w:t xml:space="preserve">ESOP perquisite computation; 80-IAC and angel-tax exemption tracked in the Startup India module; GST/TDS return calendar.</w:t>
       </w:r>
       <w:r>
         <w:t xml:space="preserve"> </w:t>
@@ -4069,13 +4225,35 @@
           <w:i/>
           <w:iCs/>
         </w:rPr>
-        <w:t xml:space="preserve">Built:</w:t>
-      </w:r>
-      <w:r>
-        <w:t xml:space="preserve"> </w:t>
-      </w:r>
-      <w:r>
-        <w:t xml:space="preserve">ESOP perquisite computation; 80-IAC and angel-tax exemption tracked in the Startup India module; GST/TDS return calendar.</w:t>
+        <w:t xml:space="preserve">Remaining:</w:t>
+      </w:r>
+      <w:r>
+        <w:t xml:space="preserve"> </w:t>
+      </w:r>
+      <w:r>
+        <w:t xml:space="preserve">TDS-deposit tracking tied to exercises; accounting hand-off.</w:t>
+      </w:r>
+    </w:p>
+    <w:p>
+      <w:pPr>
+        <w:pStyle w:val="Compact"/>
+        <w:numPr>
+          <w:ilvl w:val="0"/>
+          <w:numId w:val="1011"/>
+        </w:numPr>
+      </w:pPr>
+      <w:r>
+        <w:rPr>
+          <w:b/>
+          <w:bCs/>
+        </w:rPr>
+        <w:t xml:space="preserve">FR-H-6 (P2)</w:t>
+      </w:r>
+      <w:r>
+        <w:t xml:space="preserve"> </w:t>
+      </w:r>
+      <w:r>
+        <w:t xml:space="preserve">✅</w:t>
       </w:r>
       <w:r>
         <w:t xml:space="preserve"> </w:t>
@@ -4085,35 +4263,74 @@
           <w:i/>
           <w:iCs/>
         </w:rPr>
-        <w:t xml:space="preserve">Remaining:</w:t>
-      </w:r>
-      <w:r>
-        <w:t xml:space="preserve"> </w:t>
-      </w:r>
-      <w:r>
-        <w:t xml:space="preserve">TDS-deposit tracking tied to exercises; accounting hand-off.</w:t>
-      </w:r>
-    </w:p>
-    <w:p>
-      <w:pPr>
-        <w:pStyle w:val="Compact"/>
-        <w:numPr>
-          <w:ilvl w:val="0"/>
-          <w:numId w:val="1011"/>
-        </w:numPr>
-      </w:pPr>
-      <w:r>
-        <w:rPr>
-          <w:b/>
-          <w:bCs/>
-        </w:rPr>
-        <w:t xml:space="preserve">FR-H-6 (P2)</w:t>
-      </w:r>
-      <w:r>
-        <w:t xml:space="preserve"> </w:t>
-      </w:r>
-      <w:r>
-        <w:t xml:space="preserve">✅</w:t>
+        <w:t xml:space="preserve">(promoted — implemented)</w:t>
+      </w:r>
+      <w:r>
+        <w:t xml:space="preserve"> </w:t>
+      </w:r>
+      <w:r>
+        <w:t xml:space="preserve">Compliance</w:t>
+      </w:r>
+      <w:r>
+        <w:t xml:space="preserve"> </w:t>
+      </w:r>
+      <w:r>
+        <w:rPr>
+          <w:b/>
+          <w:bCs/>
+        </w:rPr>
+        <w:t xml:space="preserve">health score</w:t>
+      </w:r>
+      <w:r>
+        <w:t xml:space="preserve"> </w:t>
+      </w:r>
+      <w:r>
+        <w:t xml:space="preserve">(filed/total %, overdue count) surfaced per entity; compliance</w:t>
+      </w:r>
+      <w:r>
+        <w:t xml:space="preserve"> </w:t>
+      </w:r>
+      <w:r>
+        <w:rPr>
+          <w:b/>
+          <w:bCs/>
+        </w:rPr>
+        <w:t xml:space="preserve">CSV export</w:t>
+      </w:r>
+      <w:r>
+        <w:t xml:space="preserve">.</w:t>
+      </w:r>
+    </w:p>
+    <w:bookmarkEnd w:id="26"/>
+    <w:bookmarkStart w:id="27" w:name="i-data-room--diligence"/>
+    <w:p>
+      <w:pPr>
+        <w:pStyle w:val="Heading3"/>
+      </w:pPr>
+      <w:r>
+        <w:t xml:space="preserve">I. Data Room &amp; Diligence</w:t>
+      </w:r>
+    </w:p>
+    <w:p>
+      <w:pPr>
+        <w:pStyle w:val="Compact"/>
+        <w:numPr>
+          <w:ilvl w:val="0"/>
+          <w:numId w:val="1012"/>
+        </w:numPr>
+      </w:pPr>
+      <w:r>
+        <w:rPr>
+          <w:b/>
+          <w:bCs/>
+        </w:rPr>
+        <w:t xml:space="preserve">FR-I-1 (M)</w:t>
+      </w:r>
+      <w:r>
+        <w:t xml:space="preserve"> </w:t>
+      </w:r>
+      <w:r>
+        <w:t xml:space="preserve">◐ Data rooms.</w:t>
       </w:r>
       <w:r>
         <w:t xml:space="preserve"> </w:t>
@@ -4123,74 +4340,42 @@
           <w:i/>
           <w:iCs/>
         </w:rPr>
-        <w:t xml:space="preserve">(promoted — implemented)</w:t>
-      </w:r>
-      <w:r>
-        <w:t xml:space="preserve"> </w:t>
-      </w:r>
-      <w:r>
-        <w:t xml:space="preserve">Compliance</w:t>
-      </w:r>
-      <w:r>
-        <w:t xml:space="preserve"> </w:t>
-      </w:r>
-      <w:r>
-        <w:rPr>
-          <w:b/>
-          <w:bCs/>
-        </w:rPr>
-        <w:t xml:space="preserve">health score</w:t>
-      </w:r>
-      <w:r>
-        <w:t xml:space="preserve"> </w:t>
-      </w:r>
-      <w:r>
-        <w:t xml:space="preserve">(filed/total %, overdue count) surfaced per entity; compliance</w:t>
-      </w:r>
-      <w:r>
-        <w:t xml:space="preserve"> </w:t>
-      </w:r>
-      <w:r>
-        <w:rPr>
-          <w:b/>
-          <w:bCs/>
-        </w:rPr>
-        <w:t xml:space="preserve">CSV export</w:t>
-      </w:r>
-      <w:r>
-        <w:t xml:space="preserve">.</w:t>
-      </w:r>
-    </w:p>
-    <w:bookmarkEnd w:id="26"/>
-    <w:bookmarkStart w:id="27" w:name="i-data-room--diligence"/>
-    <w:p>
-      <w:pPr>
-        <w:pStyle w:val="Heading3"/>
-      </w:pPr>
-      <w:r>
-        <w:t xml:space="preserve">I. Data Room &amp; Diligence</w:t>
-      </w:r>
-    </w:p>
-    <w:p>
-      <w:pPr>
-        <w:pStyle w:val="Compact"/>
-        <w:numPr>
-          <w:ilvl w:val="0"/>
-          <w:numId w:val="1012"/>
-        </w:numPr>
-      </w:pPr>
-      <w:r>
-        <w:rPr>
-          <w:b/>
-          <w:bCs/>
-        </w:rPr>
-        <w:t xml:space="preserve">FR-I-1 (M)</w:t>
-      </w:r>
-      <w:r>
-        <w:t xml:space="preserve"> </w:t>
-      </w:r>
-      <w:r>
-        <w:t xml:space="preserve">◐ Data rooms.</w:t>
+        <w:t xml:space="preserve">Built:</w:t>
+      </w:r>
+      <w:r>
+        <w:t xml:space="preserve"> </w:t>
+      </w:r>
+      <w:r>
+        <w:t xml:space="preserve">rooms with folders, per-email access grants with</w:t>
+      </w:r>
+      <w:r>
+        <w:t xml:space="preserve"> </w:t>
+      </w:r>
+      <w:r>
+        <w:rPr>
+          <w:b/>
+          <w:bCs/>
+        </w:rPr>
+        <w:t xml:space="preserve">enforced expiry</w:t>
+      </w:r>
+      <w:r>
+        <w:t xml:space="preserve">,</w:t>
+      </w:r>
+      <w:r>
+        <w:t xml:space="preserve"> </w:t>
+      </w:r>
+      <w:r>
+        <w:rPr>
+          <w:b/>
+          <w:bCs/>
+        </w:rPr>
+        <w:t xml:space="preserve">text watermarking</w:t>
+      </w:r>
+      <w:r>
+        <w:t xml:space="preserve"> </w:t>
+      </w:r>
+      <w:r>
+        <w:t xml:space="preserve">on every viewed document (room + viewer stamped).</w:t>
       </w:r>
       <w:r>
         <w:t xml:space="preserve"> </w:t>
@@ -4200,42 +4385,79 @@
           <w:i/>
           <w:iCs/>
         </w:rPr>
-        <w:t xml:space="preserve">Built:</w:t>
-      </w:r>
-      <w:r>
-        <w:t xml:space="preserve"> </w:t>
-      </w:r>
-      <w:r>
-        <w:t xml:space="preserve">rooms with folders, per-email access grants with</w:t>
-      </w:r>
-      <w:r>
-        <w:t xml:space="preserve"> </w:t>
-      </w:r>
-      <w:r>
-        <w:rPr>
-          <w:b/>
-          <w:bCs/>
-        </w:rPr>
-        <w:t xml:space="preserve">enforced expiry</w:t>
-      </w:r>
-      <w:r>
-        <w:t xml:space="preserve">,</w:t>
-      </w:r>
-      <w:r>
-        <w:t xml:space="preserve"> </w:t>
-      </w:r>
-      <w:r>
-        <w:rPr>
-          <w:b/>
-          <w:bCs/>
-        </w:rPr>
-        <w:t xml:space="preserve">text watermarking</w:t>
-      </w:r>
-      <w:r>
-        <w:t xml:space="preserve"> </w:t>
-      </w:r>
-      <w:r>
-        <w:t xml:space="preserve">on every viewed document (room + viewer stamped).</w:t>
+        <w:t xml:space="preserve">Remaining:</w:t>
+      </w:r>
+      <w:r>
+        <w:t xml:space="preserve"> </w:t>
+      </w:r>
+      <w:r>
+        <w:t xml:space="preserve">download controls, PDF watermarking.</w:t>
+      </w:r>
+    </w:p>
+    <w:p>
+      <w:pPr>
+        <w:pStyle w:val="Compact"/>
+        <w:numPr>
+          <w:ilvl w:val="0"/>
+          <w:numId w:val="1012"/>
+        </w:numPr>
+      </w:pPr>
+      <w:r>
+        <w:rPr>
+          <w:b/>
+          <w:bCs/>
+        </w:rPr>
+        <w:t xml:space="preserve">FR-I-2 (M)</w:t>
+      </w:r>
+      <w:r>
+        <w:t xml:space="preserve"> </w:t>
+      </w:r>
+      <w:r>
+        <w:t xml:space="preserve">◐ Population: any entity document can be added; auto-populate from the corporate record remains open.</w:t>
+      </w:r>
+    </w:p>
+    <w:p>
+      <w:pPr>
+        <w:pStyle w:val="Compact"/>
+        <w:numPr>
+          <w:ilvl w:val="0"/>
+          <w:numId w:val="1012"/>
+        </w:numPr>
+      </w:pPr>
+      <w:r>
+        <w:rPr>
+          <w:b/>
+          <w:bCs/>
+        </w:rPr>
+        <w:t xml:space="preserve">FR-I-3 (M)</w:t>
+      </w:r>
+      <w:r>
+        <w:t xml:space="preserve"> </w:t>
+      </w:r>
+      <w:r>
+        <w:t xml:space="preserve">✅ Engagement analytics: per-actor, per-document view counts.</w:t>
+      </w:r>
+    </w:p>
+    <w:p>
+      <w:pPr>
+        <w:pStyle w:val="Compact"/>
+        <w:numPr>
+          <w:ilvl w:val="0"/>
+          <w:numId w:val="1012"/>
+        </w:numPr>
+      </w:pPr>
+      <w:r>
+        <w:rPr>
+          <w:b/>
+          <w:bCs/>
+        </w:rPr>
+        <w:t xml:space="preserve">FR-I-4 (P2)</w:t>
+      </w:r>
+      <w:r>
+        <w:t xml:space="preserve"> </w:t>
+      </w:r>
+      <w:r>
+        <w:t xml:space="preserve">◐</w:t>
       </w:r>
       <w:r>
         <w:t xml:space="preserve"> </w:t>
@@ -4245,79 +4467,20 @@
           <w:i/>
           <w:iCs/>
         </w:rPr>
-        <w:t xml:space="preserve">Remaining:</w:t>
-      </w:r>
-      <w:r>
-        <w:t xml:space="preserve"> </w:t>
-      </w:r>
-      <w:r>
-        <w:t xml:space="preserve">download controls, PDF watermarking.</w:t>
-      </w:r>
-    </w:p>
-    <w:p>
-      <w:pPr>
-        <w:pStyle w:val="Compact"/>
-        <w:numPr>
-          <w:ilvl w:val="0"/>
-          <w:numId w:val="1012"/>
-        </w:numPr>
-      </w:pPr>
-      <w:r>
-        <w:rPr>
-          <w:b/>
-          <w:bCs/>
-        </w:rPr>
-        <w:t xml:space="preserve">FR-I-2 (M)</w:t>
-      </w:r>
-      <w:r>
-        <w:t xml:space="preserve"> </w:t>
-      </w:r>
-      <w:r>
-        <w:t xml:space="preserve">◐ Population: any entity document can be added; auto-populate from the corporate record remains open.</w:t>
-      </w:r>
-    </w:p>
-    <w:p>
-      <w:pPr>
-        <w:pStyle w:val="Compact"/>
-        <w:numPr>
-          <w:ilvl w:val="0"/>
-          <w:numId w:val="1012"/>
-        </w:numPr>
-      </w:pPr>
-      <w:r>
-        <w:rPr>
-          <w:b/>
-          <w:bCs/>
-        </w:rPr>
-        <w:t xml:space="preserve">FR-I-3 (M)</w:t>
-      </w:r>
-      <w:r>
-        <w:t xml:space="preserve"> </w:t>
-      </w:r>
-      <w:r>
-        <w:t xml:space="preserve">✅ Engagement analytics: per-actor, per-document view counts.</w:t>
-      </w:r>
-    </w:p>
-    <w:p>
-      <w:pPr>
-        <w:pStyle w:val="Compact"/>
-        <w:numPr>
-          <w:ilvl w:val="0"/>
-          <w:numId w:val="1012"/>
-        </w:numPr>
-      </w:pPr>
-      <w:r>
-        <w:rPr>
-          <w:b/>
-          <w:bCs/>
-        </w:rPr>
-        <w:t xml:space="preserve">FR-I-4 (P2)</w:t>
-      </w:r>
-      <w:r>
-        <w:t xml:space="preserve"> </w:t>
-      </w:r>
-      <w:r>
-        <w:t xml:space="preserve">◐</w:t>
+        <w:t xml:space="preserve">(largely promoted)</w:t>
+      </w:r>
+      <w:r>
+        <w:t xml:space="preserve"> </w:t>
+      </w:r>
+      <w:r>
+        <w:rPr>
+          <w:b/>
+          <w:bCs/>
+        </w:rPr>
+        <w:t xml:space="preserve">Diligence Q&amp;A</w:t>
+      </w:r>
+      <w:r>
+        <w:t xml:space="preserve">: ask/answer threads per room.</w:t>
       </w:r>
       <w:r>
         <w:t xml:space="preserve"> </w:t>
@@ -4327,20 +4490,51 @@
           <w:i/>
           <w:iCs/>
         </w:rPr>
-        <w:t xml:space="preserve">(largely promoted)</w:t>
-      </w:r>
-      <w:r>
-        <w:t xml:space="preserve"> </w:t>
-      </w:r>
-      <w:r>
-        <w:rPr>
-          <w:b/>
-          <w:bCs/>
-        </w:rPr>
-        <w:t xml:space="preserve">Diligence Q&amp;A</w:t>
-      </w:r>
-      <w:r>
-        <w:t xml:space="preserve">: ask/answer threads per room.</w:t>
+        <w:t xml:space="preserve">Remaining:</w:t>
+      </w:r>
+      <w:r>
+        <w:t xml:space="preserve"> </w:t>
+      </w:r>
+      <w:r>
+        <w:t xml:space="preserve">request-list checklists, redaction.</w:t>
+      </w:r>
+    </w:p>
+    <w:p>
+      <w:pPr>
+        <w:pStyle w:val="Compact"/>
+        <w:numPr>
+          <w:ilvl w:val="0"/>
+          <w:numId w:val="1012"/>
+        </w:numPr>
+      </w:pPr>
+      <w:r>
+        <w:rPr>
+          <w:b/>
+          <w:bCs/>
+        </w:rPr>
+        <w:t xml:space="preserve">FR-I-5 (P2)</w:t>
+      </w:r>
+      <w:r>
+        <w:t xml:space="preserve"> </w:t>
+      </w:r>
+      <w:r>
+        <w:t xml:space="preserve">◐</w:t>
+      </w:r>
+      <w:r>
+        <w:t xml:space="preserve"> </w:t>
+      </w:r>
+      <w:r>
+        <w:rPr>
+          <w:b/>
+          <w:bCs/>
+        </w:rPr>
+        <w:t xml:space="preserve">Diligence readiness engine</w:t>
+      </w:r>
+      <w:r>
+        <w:t xml:space="preserve"> </w:t>
+      </w:r>
+      <w:r>
+        <w:t xml:space="preserve">(v1.3): 11 rules-as-data checks sweep the entity's own records (founder/team IP assignments, founder vesting, pending signatures, issuances without board approval, ESOP-vs-valuation, pool overruns, overdue filings, director register, expired data-room grants, stakeholder emails) → severity-weighted score + findings with deep links; report saved as a document.</w:t>
       </w:r>
       <w:r>
         <w:t xml:space="preserve"> </w:t>
@@ -4356,29 +4550,7 @@
         <w:t xml:space="preserve"> </w:t>
       </w:r>
       <w:r>
-        <w:t xml:space="preserve">request-list checklists, redaction.</w:t>
-      </w:r>
-    </w:p>
-    <w:p>
-      <w:pPr>
-        <w:pStyle w:val="Compact"/>
-        <w:numPr>
-          <w:ilvl w:val="0"/>
-          <w:numId w:val="1012"/>
-        </w:numPr>
-      </w:pPr>
-      <w:r>
-        <w:rPr>
-          <w:b/>
-          <w:bCs/>
-        </w:rPr>
-        <w:t xml:space="preserve">FR-I-5 (P2)</w:t>
-      </w:r>
-      <w:r>
-        <w:t xml:space="preserve"> </w:t>
-      </w:r>
-      <w:r>
-        <w:t xml:space="preserve">○ One-click diligence-ready export package.</w:t>
+        <w:t xml:space="preserve">one-click export package of the underlying documents.</w:t>
       </w:r>
     </w:p>
     <w:bookmarkEnd w:id="27"/>
@@ -5996,7 +6168,23 @@
         <w:t xml:space="preserve"> </w:t>
       </w:r>
       <w:r>
-        <w:t xml:space="preserve">✅ Provider directory: CS / CA / lawyer / registered valuer / RTA / fund admin, category-filterable, with</w:t>
+        <w:t xml:space="preserve">✅ Provider directory: CS / CA / lawyer / registered valuer / RTA / fund admin /</w:t>
+      </w:r>
+      <w:r>
+        <w:t xml:space="preserve"> </w:t>
+      </w:r>
+      <w:r>
+        <w:rPr>
+          <w:b/>
+          <w:bCs/>
+        </w:rPr>
+        <w:t xml:space="preserve">registered-office &amp; virtual-CFO providers</w:t>
+      </w:r>
+      <w:r>
+        <w:t xml:space="preserve"> </w:t>
+      </w:r>
+      <w:r>
+        <w:t xml:space="preserve">(v1.3), category-filterable, with</w:t>
       </w:r>
       <w:r>
         <w:t xml:space="preserve"> </w:t>
@@ -6474,7 +6662,71 @@
         <w:t xml:space="preserve"> </w:t>
       </w:r>
       <w:r>
-        <w:t xml:space="preserve">◐ Joiner/leaver: onboarding links the stakeholder; exit marks status.</w:t>
+        <w:t xml:space="preserve">✅ Joiner/leaver: onboarding links the stakeholder;</w:t>
+      </w:r>
+      <w:r>
+        <w:t xml:space="preserve"> </w:t>
+      </w:r>
+      <w:r>
+        <w:rPr>
+          <w:b/>
+          <w:bCs/>
+        </w:rPr>
+        <w:t xml:space="preserve">offboarding</w:t>
+      </w:r>
+      <w:r>
+        <w:t xml:space="preserve"> </w:t>
+      </w:r>
+      <w:r>
+        <w:t xml:space="preserve">(v1.3) exits the member and automatically lapses unvested options back to the scheme pool (vesting frozen at the leaving date).</w:t>
+      </w:r>
+    </w:p>
+    <w:bookmarkEnd w:id="36"/>
+    <w:bookmarkStart w:id="37" w:name="s-spv--co-investment-vehicles"/>
+    <w:p>
+      <w:pPr>
+        <w:pStyle w:val="Heading3"/>
+      </w:pPr>
+      <w:r>
+        <w:t xml:space="preserve">S. SPV / Co-Investment Vehicles</w:t>
+      </w:r>
+    </w:p>
+    <w:p>
+      <w:pPr>
+        <w:pStyle w:val="Compact"/>
+        <w:numPr>
+          <w:ilvl w:val="0"/>
+          <w:numId w:val="1022"/>
+        </w:numPr>
+      </w:pPr>
+      <w:r>
+        <w:rPr>
+          <w:b/>
+          <w:bCs/>
+        </w:rPr>
+        <w:t xml:space="preserve">FR-S-1 (P2)</w:t>
+      </w:r>
+      <w:r>
+        <w:t xml:space="preserve"> </w:t>
+      </w:r>
+      <w:r>
+        <w:t xml:space="preserve">◐ SPV creation: sponsor, target company, structure, optional portco link (same-tenant; cross-tenant consent model deferred);</w:t>
+      </w:r>
+      <w:r>
+        <w:t xml:space="preserve"> </w:t>
+      </w:r>
+      <w:r>
+        <w:rPr>
+          <w:b/>
+          <w:bCs/>
+        </w:rPr>
+        <w:t xml:space="preserve">subscription agreements</w:t>
+      </w:r>
+      <w:r>
+        <w:t xml:space="preserve"> </w:t>
+      </w:r>
+      <w:r>
+        <w:t xml:space="preserve">(v1.3) auto-generated per co-investor on commitment (re-versioned on revision, immutable once signed) and downloadable from the backer's portal.</w:t>
       </w:r>
       <w:r>
         <w:t xml:space="preserve"> </w:t>
@@ -6490,17 +6742,7 @@
         <w:t xml:space="preserve"> </w:t>
       </w:r>
       <w:r>
-        <w:t xml:space="preserve">automatic option-lapse on leaver.</w:t>
-      </w:r>
-    </w:p>
-    <w:bookmarkEnd w:id="36"/>
-    <w:bookmarkStart w:id="37" w:name="s-spv--co-investment-vehicles"/>
-    <w:p>
-      <w:pPr>
-        <w:pStyle w:val="Heading3"/>
-      </w:pPr>
-      <w:r>
-        <w:t xml:space="preserve">S. SPV / Co-Investment Vehicles</w:t>
+        <w:t xml:space="preserve">SPV operating-agreement generation.</w:t>
       </w:r>
     </w:p>
     <w:p>
@@ -6516,13 +6758,70 @@
           <w:b/>
           <w:bCs/>
         </w:rPr>
-        <w:t xml:space="preserve">FR-S-1 (P2)</w:t>
-      </w:r>
-      <w:r>
-        <w:t xml:space="preserve"> </w:t>
-      </w:r>
-      <w:r>
-        <w:t xml:space="preserve">◐ SPV creation: sponsor, target company, structure, optional portco link (same-tenant; cross-tenant consent model deferred).</w:t>
+        <w:t xml:space="preserve">FR-S-2 (P2)</w:t>
+      </w:r>
+      <w:r>
+        <w:t xml:space="preserve"> </w:t>
+      </w:r>
+      <w:r>
+        <w:t xml:space="preserve">✅ Co-investor register (commitment/contribution/paid) +</w:t>
+      </w:r>
+      <w:r>
+        <w:t xml:space="preserve"> </w:t>
+      </w:r>
+      <w:r>
+        <w:rPr>
+          <w:b/>
+          <w:bCs/>
+        </w:rPr>
+        <w:t xml:space="preserve">sweep</w:t>
+      </w:r>
+      <w:r>
+        <w:t xml:space="preserve">: the SPV's combined position issues into the portco cap table as a single ENTITY stakeholder.</w:t>
+      </w:r>
+    </w:p>
+    <w:p>
+      <w:pPr>
+        <w:pStyle w:val="Compact"/>
+        <w:numPr>
+          <w:ilvl w:val="0"/>
+          <w:numId w:val="1022"/>
+        </w:numPr>
+      </w:pPr>
+      <w:r>
+        <w:rPr>
+          <w:b/>
+          <w:bCs/>
+        </w:rPr>
+        <w:t xml:space="preserve">FR-S-3 (P2)</w:t>
+      </w:r>
+      <w:r>
+        <w:t xml:space="preserve"> </w:t>
+      </w:r>
+      <w:r>
+        <w:t xml:space="preserve">◐</w:t>
+      </w:r>
+      <w:r>
+        <w:t xml:space="preserve"> </w:t>
+      </w:r>
+      <w:r>
+        <w:rPr>
+          <w:b/>
+          <w:bCs/>
+        </w:rPr>
+        <w:t xml:space="preserve">Syndicate subscription flow</w:t>
+      </w:r>
+      <w:r>
+        <w:t xml:space="preserve">: the lead invites backers by email; the deal appears in their investor portal (terms, target, sponsor, status) where they commit — minimum ticket enforced — and the lead marks money received (</w:t>
+      </w:r>
+      <w:r>
+        <w:rPr>
+          <w:rStyle w:val="VerbatimChar"/>
+        </w:rPr>
+        <w:t xml:space="preserve">invited → committed → funded</w:t>
+      </w:r>
+      <w:r>
+        <w:t xml:space="preserve">).</w:t>
       </w:r>
       <w:r>
         <w:t xml:space="preserve"> </w:t>
@@ -6538,7 +6837,7 @@
         <w:t xml:space="preserve"> </w:t>
       </w:r>
       <w:r>
-        <w:t xml:space="preserve">SPV operating/subscription agreement generation.</w:t>
+        <w:t xml:space="preserve">distributions back to co-investors.</w:t>
       </w:r>
     </w:p>
     <w:p>
@@ -6554,26 +6853,26 @@
           <w:b/>
           <w:bCs/>
         </w:rPr>
-        <w:t xml:space="preserve">FR-S-2 (P2)</w:t>
-      </w:r>
-      <w:r>
-        <w:t xml:space="preserve"> </w:t>
-      </w:r>
-      <w:r>
-        <w:t xml:space="preserve">✅ Co-investor register (commitment/contribution/paid) +</w:t>
-      </w:r>
-      <w:r>
-        <w:t xml:space="preserve"> </w:t>
-      </w:r>
-      <w:r>
-        <w:rPr>
-          <w:b/>
-          <w:bCs/>
-        </w:rPr>
-        <w:t xml:space="preserve">sweep</w:t>
-      </w:r>
-      <w:r>
-        <w:t xml:space="preserve">: the SPV's combined position issues into the portco cap table as a single ENTITY stakeholder.</w:t>
+        <w:t xml:space="preserve">FR-S-4 (P2)</w:t>
+      </w:r>
+      <w:r>
+        <w:t xml:space="preserve"> </w:t>
+      </w:r>
+      <w:r>
+        <w:t xml:space="preserve">✅</w:t>
+      </w:r>
+      <w:r>
+        <w:t xml:space="preserve"> </w:t>
+      </w:r>
+      <w:r>
+        <w:rPr>
+          <w:b/>
+          <w:bCs/>
+        </w:rPr>
+        <w:t xml:space="preserve">Deal economics</w:t>
+      </w:r>
+      <w:r>
+        <w:t xml:space="preserve">: carry % + minimum ticket per SPV; saving terms provisions the fund profile on the SPV entity (carry mirrored, zero hurdle/management fee) so the capital-call and distribution-waterfall machinery applies to the vehicle.</w:t>
       </w:r>
     </w:p>
     <w:p>
@@ -6589,45 +6888,7 @@
           <w:b/>
           <w:bCs/>
         </w:rPr>
-        <w:t xml:space="preserve">FR-S-3 (P2)</w:t>
-      </w:r>
-      <w:r>
-        <w:t xml:space="preserve"> </w:t>
-      </w:r>
-      <w:r>
-        <w:t xml:space="preserve">◐ SPV ops: contributions tracked.</w:t>
-      </w:r>
-      <w:r>
-        <w:t xml:space="preserve"> </w:t>
-      </w:r>
-      <w:r>
-        <w:rPr>
-          <w:i/>
-          <w:iCs/>
-        </w:rPr>
-        <w:t xml:space="preserve">Remaining:</w:t>
-      </w:r>
-      <w:r>
-        <w:t xml:space="preserve"> </w:t>
-      </w:r>
-      <w:r>
-        <w:t xml:space="preserve">distributions back to co-investors.</w:t>
-      </w:r>
-    </w:p>
-    <w:p>
-      <w:pPr>
-        <w:pStyle w:val="Compact"/>
-        <w:numPr>
-          <w:ilvl w:val="0"/>
-          <w:numId w:val="1022"/>
-        </w:numPr>
-      </w:pPr>
-      <w:r>
-        <w:rPr>
-          <w:b/>
-          <w:bCs/>
-        </w:rPr>
-        <w:t xml:space="preserve">FR-S-4 (P3)</w:t>
+        <w:t xml:space="preserve">FR-S-5 (P3)</w:t>
       </w:r>
       <w:r>
         <w:t xml:space="preserve"> </w:t>
@@ -13611,7 +13872,251 @@
         <w:t xml:space="preserve">d3a5c7e9f1b3</w:t>
       </w:r>
       <w:r>
-        <w:t xml:space="preserve">), bounds on money/percentage inputs (negative principals, carry ≥ 100% etc. now 422), fee charging clamped to accrued-to-date, signup rate limiting, spreadsheet-formula neutralisation on CSV exports, import size/row caps. 185 backend tests.</w:t>
+        <w:t xml:space="preserve">), bounds on money/percentage inputs (negative principals, carry ≥ 100% etc. now 422), fee charging clamped to accrued-to-date, signup rate limiting, spreadsheet-formula neutralisation on CSV exports, import size/row caps.</w:t>
+      </w:r>
+    </w:p>
+    <w:p>
+      <w:pPr>
+        <w:pStyle w:val="Compact"/>
+        <w:numPr>
+          <w:ilvl w:val="0"/>
+          <w:numId w:val="1030"/>
+        </w:numPr>
+      </w:pPr>
+      <w:r>
+        <w:rPr>
+          <w:b/>
+          <w:bCs/>
+        </w:rPr>
+        <w:t xml:space="preserve">Incorporation wizard</w:t>
+      </w:r>
+      <w:r>
+        <w:t xml:space="preserve"> </w:t>
+      </w:r>
+      <w:r>
+        <w:t xml:space="preserve">(FR-B-1, Atlas gap analysis): intake → SPICe+/eMoA/eAoA pack → SRN → CIN with automatic allotment, director register and compliance calendar (Alembic</w:t>
+      </w:r>
+      <w:r>
+        <w:t xml:space="preserve"> </w:t>
+      </w:r>
+      <w:r>
+        <w:rPr>
+          <w:rStyle w:val="VerbatimChar"/>
+        </w:rPr>
+        <w:t xml:space="preserve">e5c7a9b1d3f5</w:t>
+      </w:r>
+      <w:r>
+        <w:t xml:space="preserve">); marketplace gains registered-office and virtual-CFO categories.</w:t>
+      </w:r>
+    </w:p>
+    <w:p>
+      <w:pPr>
+        <w:pStyle w:val="Compact"/>
+        <w:numPr>
+          <w:ilvl w:val="0"/>
+          <w:numId w:val="1030"/>
+        </w:numPr>
+      </w:pPr>
+      <w:r>
+        <w:rPr>
+          <w:b/>
+          <w:bCs/>
+        </w:rPr>
+        <w:t xml:space="preserve">Carta gap batch</w:t>
+      </w:r>
+      <w:r>
+        <w:t xml:space="preserve">: scenario modeling (FR-C-4 ✅), employee self-serve exercise requests (FR-D-3, Alembic</w:t>
+      </w:r>
+      <w:r>
+        <w:t xml:space="preserve"> </w:t>
+      </w:r>
+      <w:r>
+        <w:rPr>
+          <w:rStyle w:val="VerbatimChar"/>
+        </w:rPr>
+        <w:t xml:space="preserve">f7d9b1c3e5a7</w:t>
+      </w:r>
+      <w:r>
+        <w:t xml:space="preserve">), waterfall exit comparison (FR-C-5). 191 backend tests.</w:t>
+      </w:r>
+    </w:p>
+    <w:p>
+      <w:pPr>
+        <w:pStyle w:val="Compact"/>
+        <w:numPr>
+          <w:ilvl w:val="0"/>
+          <w:numId w:val="1030"/>
+        </w:numPr>
+      </w:pPr>
+      <w:r>
+        <w:rPr>
+          <w:b/>
+          <w:bCs/>
+        </w:rPr>
+        <w:t xml:space="preserve">Sydecar gap batch</w:t>
+      </w:r>
+      <w:r>
+        <w:t xml:space="preserve"> </w:t>
+      </w:r>
+      <w:r>
+        <w:t xml:space="preserve">(2026-07-15):</w:t>
+      </w:r>
+      <w:r>
+        <w:t xml:space="preserve"> </w:t>
+      </w:r>
+      <w:r>
+        <w:rPr>
+          <w:b/>
+          <w:bCs/>
+        </w:rPr>
+        <w:t xml:space="preserve">syndicate subscription flow</w:t>
+      </w:r>
+      <w:r>
+        <w:t xml:space="preserve"> </w:t>
+      </w:r>
+      <w:r>
+        <w:t xml:space="preserve">(FR-S-3 ◐) — invite co-investors by email, deal appears in their portal, portal commitments with minimum-ticket enforcement,</w:t>
+      </w:r>
+      <w:r>
+        <w:t xml:space="preserve"> </w:t>
+      </w:r>
+      <w:r>
+        <w:rPr>
+          <w:rStyle w:val="VerbatimChar"/>
+        </w:rPr>
+        <w:t xml:space="preserve">invited → committed → funded</w:t>
+      </w:r>
+      <w:r>
+        <w:t xml:space="preserve"> </w:t>
+      </w:r>
+      <w:r>
+        <w:t xml:space="preserve">lifecycle;</w:t>
+      </w:r>
+      <w:r>
+        <w:t xml:space="preserve"> </w:t>
+      </w:r>
+      <w:r>
+        <w:rPr>
+          <w:b/>
+          <w:bCs/>
+        </w:rPr>
+        <w:t xml:space="preserve">SPV deal economics</w:t>
+      </w:r>
+      <w:r>
+        <w:t xml:space="preserve"> </w:t>
+      </w:r>
+      <w:r>
+        <w:t xml:space="preserve">(new FR-S-4 ✅) — carry % + minimum ticket, terms provision the fund profile on the SPV entity; co-investor SPV positions and updates in the investor portal with portfolio aggregation. Alembic</w:t>
+      </w:r>
+      <w:r>
+        <w:t xml:space="preserve"> </w:t>
+      </w:r>
+      <w:r>
+        <w:rPr>
+          <w:rStyle w:val="VerbatimChar"/>
+        </w:rPr>
+        <w:t xml:space="preserve">a8f0c2d4e6b8</w:t>
+      </w:r>
+      <w:r>
+        <w:t xml:space="preserve">; 195 backend tests.</w:t>
+      </w:r>
+    </w:p>
+    <w:p>
+      <w:pPr>
+        <w:pStyle w:val="Compact"/>
+        <w:numPr>
+          <w:ilvl w:val="0"/>
+          <w:numId w:val="1030"/>
+        </w:numPr>
+      </w:pPr>
+      <w:r>
+        <w:rPr>
+          <w:b/>
+          <w:bCs/>
+        </w:rPr>
+        <w:t xml:space="preserve">Savvi/PaperOS gap batch</w:t>
+      </w:r>
+      <w:r>
+        <w:t xml:space="preserve"> </w:t>
+      </w:r>
+      <w:r>
+        <w:t xml:space="preserve">(2026-07-15):</w:t>
+      </w:r>
+      <w:r>
+        <w:t xml:space="preserve"> </w:t>
+      </w:r>
+      <w:r>
+        <w:rPr>
+          <w:b/>
+          <w:bCs/>
+        </w:rPr>
+        <w:t xml:space="preserve">diligence readiness engine</w:t>
+      </w:r>
+      <w:r>
+        <w:t xml:space="preserve"> </w:t>
+      </w:r>
+      <w:r>
+        <w:t xml:space="preserve">(FR-I-5 ◐) — 11 rules-as-data checks, severity-weighted score, findings with deep links, report-as-document;</w:t>
+      </w:r>
+      <w:r>
+        <w:t xml:space="preserve"> </w:t>
+      </w:r>
+      <w:r>
+        <w:rPr>
+          <w:b/>
+          <w:bCs/>
+        </w:rPr>
+        <w:t xml:space="preserve">public fundraising funnel</w:t>
+      </w:r>
+      <w:r>
+        <w:t xml:space="preserve"> </w:t>
+      </w:r>
+      <w:r>
+        <w:t xml:space="preserve">(FR-E-8) — shareable opt-in link per round (unauthenticated, rate-limited), prospects land in the CRM with optional automatic data-room access, admin funnel view;</w:t>
+      </w:r>
+      <w:r>
+        <w:t xml:space="preserve"> </w:t>
+      </w:r>
+      <w:r>
+        <w:rPr>
+          <w:b/>
+          <w:bCs/>
+        </w:rPr>
+        <w:t xml:space="preserve">financing doc automation</w:t>
+      </w:r>
+      <w:r>
+        <w:t xml:space="preserve"> </w:t>
+      </w:r>
+      <w:r>
+        <w:t xml:space="preserve">— SPV subscription agreements generated on commitment + portal PDF download (FR-S-1), PAS-4 offer letters per round commitment (new FR-E-10 ✅);</w:t>
+      </w:r>
+      <w:r>
+        <w:t xml:space="preserve"> </w:t>
+      </w:r>
+      <w:r>
+        <w:rPr>
+          <w:b/>
+          <w:bCs/>
+        </w:rPr>
+        <w:t xml:space="preserve">small fills</w:t>
+      </w:r>
+      <w:r>
+        <w:t xml:space="preserve"> </w:t>
+      </w:r>
+      <w:r>
+        <w:t xml:space="preserve">— founder IP assignments in the incorporation pack (FR-B-1), charter-amendment one-step (FR-G-2), offboarding with automatic option lapse (FR-R-4 ✅). Alembic</w:t>
+      </w:r>
+      <w:r>
+        <w:t xml:space="preserve"> </w:t>
+      </w:r>
+      <w:r>
+        <w:rPr>
+          <w:rStyle w:val="VerbatimChar"/>
+        </w:rPr>
+        <w:t xml:space="preserve">b9a1d3e5f7c9</w:t>
+      </w:r>
+      <w:r>
+        <w:t xml:space="preserve">; 204 backend tests.</w:t>
       </w:r>
     </w:p>
     <w:p>

</xml_diff>

<commit_message>
Add dashboard donuts, equity timeline, vesting projection (Eqvista)
- Dashboard: class-ownership + share-usage SVG donut charts, an
  authorized/issued/available capital panel (authorized derived from the
  incorporation charter), a valuation status card (active/expired/missing)
  and a quick-actions row deep-linking via ?tab=.
- Narrative equity timeline (FR-C-10): every ledger/equity event as a
  plain-language sentence, newest first, on a new Cap Table sub-tab.
- Tinted security-class chips across cap-table and portal holdings, and a
  holdings pivot (Positions | By stakeholder | By class).
- Portal vesting projection (FR-D-3): progress stat cards, vested/unvested
  bar, estimated full-vest date and upcoming vest events per grant.

Read-only API additions, no schema changes. 215 backend + 7 FE tests.

Co-Authored-By: Claude Fable 5 <noreply@anthropic.com>
</commit_message>
<xml_diff>
--- a/REQUIREMENTS.docx
+++ b/REQUIREMENTS.docx
@@ -2498,76 +2498,6 @@
       <w:r>
         <w:t xml:space="preserve">✅ Effective-dated, append-only ledger; positions recomputable as of any date; microsecond-ordered events.</w:t>
       </w:r>
-    </w:p>
-    <w:p>
-      <w:pPr>
-        <w:pStyle w:val="Compact"/>
-        <w:numPr>
-          <w:ilvl w:val="0"/>
-          <w:numId w:val="1006"/>
-        </w:numPr>
-      </w:pPr>
-      <w:r>
-        <w:rPr>
-          <w:b/>
-          <w:bCs/>
-        </w:rPr>
-        <w:t xml:space="preserve">FR-C-11 (M — added v1.0)</w:t>
-      </w:r>
-      <w:r>
-        <w:t xml:space="preserve"> </w:t>
-      </w:r>
-      <w:r>
-        <w:t xml:space="preserve">✅</w:t>
-      </w:r>
-      <w:r>
-        <w:t xml:space="preserve"> </w:t>
-      </w:r>
-      <w:r>
-        <w:rPr>
-          <w:b/>
-          <w:bCs/>
-        </w:rPr>
-        <w:t xml:space="preserve">Founder reverse-vesting / restricted stock</w:t>
-      </w:r>
-      <w:r>
-        <w:t xml:space="preserve">: cliff-then-monthly schedule over issued founder shares; unvested shares repurchasable (buy-back at nil) on early exit.</w:t>
-      </w:r>
-    </w:p>
-    <w:p>
-      <w:pPr>
-        <w:pStyle w:val="Compact"/>
-        <w:numPr>
-          <w:ilvl w:val="0"/>
-          <w:numId w:val="1006"/>
-        </w:numPr>
-      </w:pPr>
-      <w:r>
-        <w:rPr>
-          <w:b/>
-          <w:bCs/>
-        </w:rPr>
-        <w:t xml:space="preserve">FR-C-12 (M — added v1.0)</w:t>
-      </w:r>
-      <w:r>
-        <w:t xml:space="preserve"> </w:t>
-      </w:r>
-      <w:r>
-        <w:t xml:space="preserve">✅ Cap-table</w:t>
-      </w:r>
-      <w:r>
-        <w:t xml:space="preserve"> </w:t>
-      </w:r>
-      <w:r>
-        <w:rPr>
-          <w:b/>
-          <w:bCs/>
-        </w:rPr>
-        <w:t xml:space="preserve">CSV export</w:t>
-      </w:r>
-      <w:r>
-        <w:t xml:space="preserve">, and</w:t>
-      </w:r>
       <w:r>
         <w:t xml:space="preserve"> </w:t>
       </w:r>
@@ -2586,6 +2516,111 @@
           <w:b/>
           <w:bCs/>
         </w:rPr>
+        <w:t xml:space="preserve">Narrative timeline</w:t>
+      </w:r>
+      <w:r>
+        <w:t xml:space="preserve"> </w:t>
+      </w:r>
+      <w:r>
+        <w:t xml:space="preserve">— every equity event (issuances, transfers, conversions, buy-backs, corporate actions, SAFEs/notes, grants, exercises, valuations, rounds) rendered as a human-readable sentence, newest first, as a Cap Table sub-tab (</w:t>
+      </w:r>
+      <w:r>
+        <w:rPr>
+          <w:rStyle w:val="VerbatimChar"/>
+        </w:rPr>
+        <w:t xml:space="preserve">GET /entities/{id}/timeline</w:t>
+      </w:r>
+      <w:r>
+        <w:t xml:space="preserve">).</w:t>
+      </w:r>
+    </w:p>
+    <w:p>
+      <w:pPr>
+        <w:pStyle w:val="Compact"/>
+        <w:numPr>
+          <w:ilvl w:val="0"/>
+          <w:numId w:val="1006"/>
+        </w:numPr>
+      </w:pPr>
+      <w:r>
+        <w:rPr>
+          <w:b/>
+          <w:bCs/>
+        </w:rPr>
+        <w:t xml:space="preserve">FR-C-11 (M — added v1.0)</w:t>
+      </w:r>
+      <w:r>
+        <w:t xml:space="preserve"> </w:t>
+      </w:r>
+      <w:r>
+        <w:t xml:space="preserve">✅</w:t>
+      </w:r>
+      <w:r>
+        <w:t xml:space="preserve"> </w:t>
+      </w:r>
+      <w:r>
+        <w:rPr>
+          <w:b/>
+          <w:bCs/>
+        </w:rPr>
+        <w:t xml:space="preserve">Founder reverse-vesting / restricted stock</w:t>
+      </w:r>
+      <w:r>
+        <w:t xml:space="preserve">: cliff-then-monthly schedule over issued founder shares; unvested shares repurchasable (buy-back at nil) on early exit.</w:t>
+      </w:r>
+    </w:p>
+    <w:p>
+      <w:pPr>
+        <w:pStyle w:val="Compact"/>
+        <w:numPr>
+          <w:ilvl w:val="0"/>
+          <w:numId w:val="1006"/>
+        </w:numPr>
+      </w:pPr>
+      <w:r>
+        <w:rPr>
+          <w:b/>
+          <w:bCs/>
+        </w:rPr>
+        <w:t xml:space="preserve">FR-C-12 (M — added v1.0)</w:t>
+      </w:r>
+      <w:r>
+        <w:t xml:space="preserve"> </w:t>
+      </w:r>
+      <w:r>
+        <w:t xml:space="preserve">✅ Cap-table</w:t>
+      </w:r>
+      <w:r>
+        <w:t xml:space="preserve"> </w:t>
+      </w:r>
+      <w:r>
+        <w:rPr>
+          <w:b/>
+          <w:bCs/>
+        </w:rPr>
+        <w:t xml:space="preserve">CSV export</w:t>
+      </w:r>
+      <w:r>
+        <w:t xml:space="preserve">, and</w:t>
+      </w:r>
+      <w:r>
+        <w:t xml:space="preserve"> </w:t>
+      </w:r>
+      <w:r>
+        <w:rPr>
+          <w:i/>
+          <w:iCs/>
+        </w:rPr>
+        <w:t xml:space="preserve">(v1.3)</w:t>
+      </w:r>
+      <w:r>
+        <w:t xml:space="preserve"> </w:t>
+      </w:r>
+      <w:r>
+        <w:rPr>
+          <w:b/>
+          <w:bCs/>
+        </w:rPr>
         <w:t xml:space="preserve">CSV import</w:t>
       </w:r>
       <w:r>
@@ -2750,28 +2785,6 @@
       <w:r>
         <w:t xml:space="preserve">(v1.3) — employees request exercise in the portal (validated against vested-minus-exercised-minus-pending), the company approves into a chosen class (the real exercise lands on the ledger, perquisite computed) or rejects; perquisite (FMV − strike) computed on exercise.</w:t>
       </w:r>
-    </w:p>
-    <w:p>
-      <w:pPr>
-        <w:pStyle w:val="Compact"/>
-        <w:numPr>
-          <w:ilvl w:val="0"/>
-          <w:numId w:val="1007"/>
-        </w:numPr>
-      </w:pPr>
-      <w:r>
-        <w:rPr>
-          <w:b/>
-          <w:bCs/>
-        </w:rPr>
-        <w:t xml:space="preserve">FR-D-4 (P2)</w:t>
-      </w:r>
-      <w:r>
-        <w:t xml:space="preserve"> </w:t>
-      </w:r>
-      <w:r>
-        <w:t xml:space="preserve">◐</w:t>
-      </w:r>
       <w:r>
         <w:t xml:space="preserve"> </w:t>
       </w:r>
@@ -2780,13 +2793,45 @@
           <w:i/>
           <w:iCs/>
         </w:rPr>
-        <w:t xml:space="preserve">(largely promoted)</w:t>
-      </w:r>
-      <w:r>
-        <w:t xml:space="preserve"> </w:t>
-      </w:r>
-      <w:r>
-        <w:t xml:space="preserve">Exercise.</w:t>
+        <w:t xml:space="preserve">(v1.3)</w:t>
+      </w:r>
+      <w:r>
+        <w:t xml:space="preserve"> </w:t>
+      </w:r>
+      <w:r>
+        <w:rPr>
+          <w:b/>
+          <w:bCs/>
+        </w:rPr>
+        <w:t xml:space="preserve">Vesting projection</w:t>
+      </w:r>
+      <w:r>
+        <w:t xml:space="preserve"> </w:t>
+      </w:r>
+      <w:r>
+        <w:t xml:space="preserve">— the portal equity view leads with vesting-progress %, a vested/unvested progress bar, the estimated 100%-vesting date, and the next scheduled vest events per grant.</w:t>
+      </w:r>
+    </w:p>
+    <w:p>
+      <w:pPr>
+        <w:pStyle w:val="Compact"/>
+        <w:numPr>
+          <w:ilvl w:val="0"/>
+          <w:numId w:val="1007"/>
+        </w:numPr>
+      </w:pPr>
+      <w:r>
+        <w:rPr>
+          <w:b/>
+          <w:bCs/>
+        </w:rPr>
+        <w:t xml:space="preserve">FR-D-4 (P2)</w:t>
+      </w:r>
+      <w:r>
+        <w:t xml:space="preserve"> </w:t>
+      </w:r>
+      <w:r>
+        <w:t xml:space="preserve">◐</w:t>
       </w:r>
       <w:r>
         <w:t xml:space="preserve"> </w:t>
@@ -2796,29 +2841,13 @@
           <w:i/>
           <w:iCs/>
         </w:rPr>
-        <w:t xml:space="preserve">Built:</w:t>
-      </w:r>
-      <w:r>
-        <w:t xml:space="preserve"> </w:t>
-      </w:r>
-      <w:r>
-        <w:t xml:space="preserve">exercise → cap-table issuance;</w:t>
-      </w:r>
-      <w:r>
-        <w:t xml:space="preserve"> </w:t>
-      </w:r>
-      <w:r>
-        <w:rPr>
-          <w:b/>
-          <w:bCs/>
-        </w:rPr>
-        <w:t xml:space="preserve">cashless exercise</w:t>
-      </w:r>
-      <w:r>
-        <w:t xml:space="preserve"> </w:t>
-      </w:r>
-      <w:r>
-        <w:t xml:space="preserve">(net shares after withholding to cover strike; gross consumed from grant).</w:t>
+        <w:t xml:space="preserve">(largely promoted)</w:t>
+      </w:r>
+      <w:r>
+        <w:t xml:space="preserve"> </w:t>
+      </w:r>
+      <w:r>
+        <w:t xml:space="preserve">Exercise.</w:t>
       </w:r>
       <w:r>
         <w:t xml:space="preserve"> </w:t>
@@ -2828,35 +2857,29 @@
           <w:i/>
           <w:iCs/>
         </w:rPr>
-        <w:t xml:space="preserve">Remaining:</w:t>
-      </w:r>
-      <w:r>
-        <w:t xml:space="preserve"> </w:t>
-      </w:r>
-      <w:r>
-        <w:t xml:space="preserve">loan-funded and leaver scenarios.</w:t>
-      </w:r>
-    </w:p>
-    <w:p>
-      <w:pPr>
-        <w:pStyle w:val="Compact"/>
-        <w:numPr>
-          <w:ilvl w:val="0"/>
-          <w:numId w:val="1007"/>
-        </w:numPr>
-      </w:pPr>
-      <w:r>
-        <w:rPr>
-          <w:b/>
-          <w:bCs/>
-        </w:rPr>
-        <w:t xml:space="preserve">FR-D-5 (P2)</w:t>
-      </w:r>
-      <w:r>
-        <w:t xml:space="preserve"> </w:t>
-      </w:r>
-      <w:r>
-        <w:t xml:space="preserve">✅</w:t>
+        <w:t xml:space="preserve">Built:</w:t>
+      </w:r>
+      <w:r>
+        <w:t xml:space="preserve"> </w:t>
+      </w:r>
+      <w:r>
+        <w:t xml:space="preserve">exercise → cap-table issuance;</w:t>
+      </w:r>
+      <w:r>
+        <w:t xml:space="preserve"> </w:t>
+      </w:r>
+      <w:r>
+        <w:rPr>
+          <w:b/>
+          <w:bCs/>
+        </w:rPr>
+        <w:t xml:space="preserve">cashless exercise</w:t>
+      </w:r>
+      <w:r>
+        <w:t xml:space="preserve"> </w:t>
+      </w:r>
+      <w:r>
+        <w:t xml:space="preserve">(net shares after withholding to cover strike; gross consumed from grant).</w:t>
       </w:r>
       <w:r>
         <w:t xml:space="preserve"> </w:t>
@@ -2866,6 +2889,44 @@
           <w:i/>
           <w:iCs/>
         </w:rPr>
+        <w:t xml:space="preserve">Remaining:</w:t>
+      </w:r>
+      <w:r>
+        <w:t xml:space="preserve"> </w:t>
+      </w:r>
+      <w:r>
+        <w:t xml:space="preserve">loan-funded and leaver scenarios.</w:t>
+      </w:r>
+    </w:p>
+    <w:p>
+      <w:pPr>
+        <w:pStyle w:val="Compact"/>
+        <w:numPr>
+          <w:ilvl w:val="0"/>
+          <w:numId w:val="1007"/>
+        </w:numPr>
+      </w:pPr>
+      <w:r>
+        <w:rPr>
+          <w:b/>
+          <w:bCs/>
+        </w:rPr>
+        <w:t xml:space="preserve">FR-D-5 (P2)</w:t>
+      </w:r>
+      <w:r>
+        <w:t xml:space="preserve"> </w:t>
+      </w:r>
+      <w:r>
+        <w:t xml:space="preserve">✅</w:t>
+      </w:r>
+      <w:r>
+        <w:t xml:space="preserve"> </w:t>
+      </w:r>
+      <w:r>
+        <w:rPr>
+          <w:i/>
+          <w:iCs/>
+        </w:rPr>
         <w:t xml:space="preserve">(promoted — implemented)</w:t>
       </w:r>
       <w:r>
@@ -7069,6 +7130,96 @@
       </w:r>
       <w:r>
         <w:t xml:space="preserve">✅ Unified per-entity dashboard: cap table, fundraising, compliance (incl. overdue), ESOP, governance, documents, data rooms — plus a fund block for fund entities. Default landing tab.</w:t>
+      </w:r>
+      <w:r>
+        <w:t xml:space="preserve"> </w:t>
+      </w:r>
+      <w:r>
+        <w:rPr>
+          <w:i/>
+          <w:iCs/>
+        </w:rPr>
+        <w:t xml:space="preserve">(v1.3)</w:t>
+      </w:r>
+      <w:r>
+        <w:t xml:space="preserve"> </w:t>
+      </w:r>
+      <w:r>
+        <w:rPr>
+          <w:b/>
+          <w:bCs/>
+        </w:rPr>
+        <w:t xml:space="preserve">Visual overview</w:t>
+      </w:r>
+      <w:r>
+        <w:t xml:space="preserve"> </w:t>
+      </w:r>
+      <w:r>
+        <w:t xml:space="preserve">— class-ownership and share-usage</w:t>
+      </w:r>
+      <w:r>
+        <w:t xml:space="preserve"> </w:t>
+      </w:r>
+      <w:r>
+        <w:rPr>
+          <w:b/>
+          <w:bCs/>
+        </w:rPr>
+        <w:t xml:space="preserve">donut charts</w:t>
+      </w:r>
+      <w:r>
+        <w:t xml:space="preserve"> </w:t>
+      </w:r>
+      <w:r>
+        <w:t xml:space="preserve">(dependency-free SVG), a general-details panel with</w:t>
+      </w:r>
+      <w:r>
+        <w:t xml:space="preserve"> </w:t>
+      </w:r>
+      <w:r>
+        <w:rPr>
+          <w:b/>
+          <w:bCs/>
+        </w:rPr>
+        <w:t xml:space="preserve">authorized vs issued vs available</w:t>
+      </w:r>
+      <w:r>
+        <w:t xml:space="preserve"> </w:t>
+      </w:r>
+      <w:r>
+        <w:t xml:space="preserve">shares (authorized derived from the incorporation charter when present), a</w:t>
+      </w:r>
+      <w:r>
+        <w:t xml:space="preserve"> </w:t>
+      </w:r>
+      <w:r>
+        <w:rPr>
+          <w:b/>
+          <w:bCs/>
+        </w:rPr>
+        <w:t xml:space="preserve">valuation status card</w:t>
+      </w:r>
+      <w:r>
+        <w:t xml:space="preserve"> </w:t>
+      </w:r>
+      <w:r>
+        <w:t xml:space="preserve">(active with FMV/method/dates, or action-needed when missing/expired), and a</w:t>
+      </w:r>
+      <w:r>
+        <w:t xml:space="preserve"> </w:t>
+      </w:r>
+      <w:r>
+        <w:rPr>
+          <w:b/>
+          <w:bCs/>
+        </w:rPr>
+        <w:t xml:space="preserve">quick-actions row</w:t>
+      </w:r>
+      <w:r>
+        <w:t xml:space="preserve"> </w:t>
+      </w:r>
+      <w:r>
+        <w:t xml:space="preserve">deep-linking to issue shares / grant options / raise / pass a resolution.</w:t>
       </w:r>
     </w:p>
     <w:p>
@@ -14437,6 +14588,152 @@
       </w:r>
       <w:r>
         <w:t xml:space="preserve">template). 209 backend tests.</w:t>
+      </w:r>
+    </w:p>
+    <w:p>
+      <w:pPr>
+        <w:pStyle w:val="Compact"/>
+        <w:numPr>
+          <w:ilvl w:val="0"/>
+          <w:numId w:val="1030"/>
+        </w:numPr>
+      </w:pPr>
+      <w:r>
+        <w:rPr>
+          <w:b/>
+          <w:bCs/>
+        </w:rPr>
+        <w:t xml:space="preserve">Eqvista visual batch</w:t>
+      </w:r>
+      <w:r>
+        <w:t xml:space="preserve"> </w:t>
+      </w:r>
+      <w:r>
+        <w:t xml:space="preserve">(2026-07-15, read-only API + presentation): dashboard</w:t>
+      </w:r>
+      <w:r>
+        <w:t xml:space="preserve"> </w:t>
+      </w:r>
+      <w:r>
+        <w:rPr>
+          <w:b/>
+          <w:bCs/>
+        </w:rPr>
+        <w:t xml:space="preserve">donut charts</w:t>
+      </w:r>
+      <w:r>
+        <w:t xml:space="preserve"> </w:t>
+      </w:r>
+      <w:r>
+        <w:t xml:space="preserve">for class ownership and share usage with an authorized/issued/available capital panel (authorized derived from the incorporation charter) and a</w:t>
+      </w:r>
+      <w:r>
+        <w:t xml:space="preserve"> </w:t>
+      </w:r>
+      <w:r>
+        <w:rPr>
+          <w:b/>
+          <w:bCs/>
+        </w:rPr>
+        <w:t xml:space="preserve">valuation status card</w:t>
+      </w:r>
+      <w:r>
+        <w:t xml:space="preserve"> </w:t>
+      </w:r>
+      <w:r>
+        <w:t xml:space="preserve">(active / expired / missing, FR-T-3);</w:t>
+      </w:r>
+      <w:r>
+        <w:t xml:space="preserve"> </w:t>
+      </w:r>
+      <w:r>
+        <w:rPr>
+          <w:b/>
+          <w:bCs/>
+        </w:rPr>
+        <w:t xml:space="preserve">quick-actions row</w:t>
+      </w:r>
+      <w:r>
+        <w:t xml:space="preserve"> </w:t>
+      </w:r>
+      <w:r>
+        <w:t xml:space="preserve">deep-linking via</w:t>
+      </w:r>
+      <w:r>
+        <w:t xml:space="preserve"> </w:t>
+      </w:r>
+      <w:r>
+        <w:rPr>
+          <w:rStyle w:val="VerbatimChar"/>
+        </w:rPr>
+        <w:t xml:space="preserve">?tab=</w:t>
+      </w:r>
+      <w:r>
+        <w:t xml:space="preserve">;</w:t>
+      </w:r>
+      <w:r>
+        <w:t xml:space="preserve"> </w:t>
+      </w:r>
+      <w:r>
+        <w:rPr>
+          <w:b/>
+          <w:bCs/>
+        </w:rPr>
+        <w:t xml:space="preserve">narrative equity timeline</w:t>
+      </w:r>
+      <w:r>
+        <w:t xml:space="preserve"> </w:t>
+      </w:r>
+      <w:r>
+        <w:t xml:space="preserve">(FR-C-10) — every ledger/equity event as a plain-language sentence, newest first, on a new Cap Table sub-tab;</w:t>
+      </w:r>
+      <w:r>
+        <w:t xml:space="preserve"> </w:t>
+      </w:r>
+      <w:r>
+        <w:rPr>
+          <w:b/>
+          <w:bCs/>
+        </w:rPr>
+        <w:t xml:space="preserve">tinted security-class chips</w:t>
+      </w:r>
+      <w:r>
+        <w:t xml:space="preserve"> </w:t>
+      </w:r>
+      <w:r>
+        <w:t xml:space="preserve">(coloured by class kind) across cap-table and portal holdings tables;</w:t>
+      </w:r>
+      <w:r>
+        <w:t xml:space="preserve"> </w:t>
+      </w:r>
+      <w:r>
+        <w:rPr>
+          <w:b/>
+          <w:bCs/>
+        </w:rPr>
+        <w:t xml:space="preserve">holdings pivot</w:t>
+      </w:r>
+      <w:r>
+        <w:t xml:space="preserve"> </w:t>
+      </w:r>
+      <w:r>
+        <w:t xml:space="preserve">— the cap table re-slices client-side as Positions | By stakeholder | By class;</w:t>
+      </w:r>
+      <w:r>
+        <w:t xml:space="preserve"> </w:t>
+      </w:r>
+      <w:r>
+        <w:rPr>
+          <w:b/>
+          <w:bCs/>
+        </w:rPr>
+        <w:t xml:space="preserve">portal vesting projection</w:t>
+      </w:r>
+      <w:r>
+        <w:t xml:space="preserve"> </w:t>
+      </w:r>
+      <w:r>
+        <w:t xml:space="preserve">(FR-D-3) — vesting-progress stat cards, vested/unvested progress bar, estimated full-vest date and upcoming vest events. No schema changes. 215 backend tests.</w:t>
       </w:r>
     </w:p>
     <w:p>

</xml_diff>

<commit_message>
Add valuation UI, charts, RSU-RSA, advisor console, token refresh (frontend)
Frontend for four batches since the last push:

- Eqvista F6/F7: indicative-valuation tool (scorecard/VC/DCF with weights,
  smartfill, saved scenarios, workpaper) and an FMV-over-time LineChart;
  Valuations split into Reports & FMV | Indicative estimate sub-tabs.
- Mantle visual: StackedBar ownership bar + Avatar chips on cap-table rows;
  document card grid with type tags; portal value hero (LineChart + range
  toggles); app-wide Tasks hub tab.
- Mantle F1: ESOP grant-type tabs (Options/RSUs/RSAs) with type-aware fields
  and grants table (settle vs exercise vs issued-at-grant).
- Mantle F2: Advisors management tab + cross-tenant /advisor console + nav.
- Gap-review fix: silent sliding token refresh (/auth/refresh) on load,
  interval, and focus so active sessions don't expire.

REQUIREMENTS v1.4 + docx updated. tsc + 7 vitest tests pass.

Co-Authored-By: Claude Fable 5 <noreply@anthropic.com>
</commit_message>
<xml_diff>
--- a/REQUIREMENTS.docx
+++ b/REQUIREMENTS.docx
@@ -1443,35 +1443,100 @@
           <w:i/>
           <w:iCs/>
         </w:rPr>
-        <w:t xml:space="preserve">Remaining:</w:t>
-      </w:r>
-      <w:r>
-        <w:t xml:space="preserve"> </w:t>
-      </w:r>
-      <w:r>
-        <w:t xml:space="preserve">fine-grained per-document/per-section permissions.</w:t>
-      </w:r>
-    </w:p>
-    <w:p>
-      <w:pPr>
-        <w:pStyle w:val="Compact"/>
-        <w:numPr>
-          <w:ilvl w:val="0"/>
-          <w:numId w:val="1004"/>
-        </w:numPr>
-      </w:pPr>
-      <w:r>
-        <w:rPr>
-          <w:b/>
-          <w:bCs/>
-        </w:rPr>
-        <w:t xml:space="preserve">FR-A-3 (M)</w:t>
-      </w:r>
-      <w:r>
-        <w:t xml:space="preserve"> </w:t>
-      </w:r>
-      <w:r>
-        <w:t xml:space="preserve">◐ Onboarding.</w:t>
+        <w:t xml:space="preserve">(v1.4)</w:t>
+      </w:r>
+      <w:r>
+        <w:t xml:space="preserve"> </w:t>
+      </w:r>
+      <w:r>
+        <w:rPr>
+          <w:b/>
+          <w:bCs/>
+        </w:rPr>
+        <w:t xml:space="preserve">External advisor access</w:t>
+      </w:r>
+      <w:r>
+        <w:t xml:space="preserve"> </w:t>
+      </w:r>
+      <w:r>
+        <w:t xml:space="preserve">(</w:t>
+      </w:r>
+      <w:r>
+        <w:rPr>
+          <w:rStyle w:val="VerbatimChar"/>
+        </w:rPr>
+        <w:t xml:space="preserve">AdvisorAccess</w:t>
+      </w:r>
+      <w:r>
+        <w:t xml:space="preserve">, Alembic</w:t>
+      </w:r>
+      <w:r>
+        <w:t xml:space="preserve"> </w:t>
+      </w:r>
+      <w:r>
+        <w:rPr>
+          <w:rStyle w:val="VerbatimChar"/>
+        </w:rPr>
+        <w:t xml:space="preserve">e2b4d6c8f0a2</w:t>
+      </w:r>
+      <w:r>
+        <w:t xml:space="preserve">): a company grants a law firm / CA / CS scoped,</w:t>
+      </w:r>
+      <w:r>
+        <w:t xml:space="preserve"> </w:t>
+      </w:r>
+      <w:r>
+        <w:rPr>
+          <w:b/>
+          <w:bCs/>
+        </w:rPr>
+        <w:t xml:space="preserve">cross-tenant</w:t>
+      </w:r>
+      <w:r>
+        <w:t xml:space="preserve"> </w:t>
+      </w:r>
+      <w:r>
+        <w:t xml:space="preserve">access to a single entity by email — viewer (read-only) or member (acting) — resolved in</w:t>
+      </w:r>
+      <w:r>
+        <w:t xml:space="preserve"> </w:t>
+      </w:r>
+      <w:r>
+        <w:rPr>
+          <w:rStyle w:val="VerbatimChar"/>
+        </w:rPr>
+        <w:t xml:space="preserve">deps._entity_role</w:t>
+      </w:r>
+      <w:r>
+        <w:t xml:space="preserve"> </w:t>
+      </w:r>
+      <w:r>
+        <w:t xml:space="preserve">alongside tenant membership, so the advisor reaches the normal entity workspace at their granted level without any membership in the client's organisation. Advisors get a consolidated</w:t>
+      </w:r>
+      <w:r>
+        <w:t xml:space="preserve"> </w:t>
+      </w:r>
+      <w:r>
+        <w:rPr>
+          <w:b/>
+          <w:bCs/>
+        </w:rPr>
+        <w:t xml:space="preserve">advisor console</w:t>
+      </w:r>
+      <w:r>
+        <w:t xml:space="preserve"> </w:t>
+      </w:r>
+      <w:r>
+        <w:t xml:space="preserve">(</w:t>
+      </w:r>
+      <w:r>
+        <w:rPr>
+          <w:rStyle w:val="VerbatimChar"/>
+        </w:rPr>
+        <w:t xml:space="preserve">/advisor</w:t>
+      </w:r>
+      <w:r>
+        <w:t xml:space="preserve">) listing every client entity they can act on.</w:t>
       </w:r>
       <w:r>
         <w:t xml:space="preserve"> </w:t>
@@ -1481,13 +1546,35 @@
           <w:i/>
           <w:iCs/>
         </w:rPr>
-        <w:t xml:space="preserve">Built:</w:t>
-      </w:r>
-      <w:r>
-        <w:t xml:space="preserve"> </w:t>
-      </w:r>
-      <w:r>
-        <w:t xml:space="preserve">email+password JWT auth (signup/login/me/refresh) with password policy (min 8), failed-login rate limiting (5 per 5 min, reset on success), and fail-fast boot if the default JWT secret is used outside dev/test; investor/LP/employee access granted by email match without tenant membership.</w:t>
+        <w:t xml:space="preserve">Remaining:</w:t>
+      </w:r>
+      <w:r>
+        <w:t xml:space="preserve"> </w:t>
+      </w:r>
+      <w:r>
+        <w:t xml:space="preserve">fine-grained per-document/per-section permissions.</w:t>
+      </w:r>
+    </w:p>
+    <w:p>
+      <w:pPr>
+        <w:pStyle w:val="Compact"/>
+        <w:numPr>
+          <w:ilvl w:val="0"/>
+          <w:numId w:val="1004"/>
+        </w:numPr>
+      </w:pPr>
+      <w:r>
+        <w:rPr>
+          <w:b/>
+          <w:bCs/>
+        </w:rPr>
+        <w:t xml:space="preserve">FR-A-3 (M)</w:t>
+      </w:r>
+      <w:r>
+        <w:t xml:space="preserve"> </w:t>
+      </w:r>
+      <w:r>
+        <w:t xml:space="preserve">◐ Onboarding.</w:t>
       </w:r>
       <w:r>
         <w:t xml:space="preserve"> </w:t>
@@ -1497,57 +1584,13 @@
           <w:i/>
           <w:iCs/>
         </w:rPr>
-        <w:t xml:space="preserve">Remaining:</w:t>
-      </w:r>
-      <w:r>
-        <w:t xml:space="preserve"> </w:t>
-      </w:r>
-      <w:r>
-        <w:t xml:space="preserve">OTP/SSO (OIDC), invite emails. ⛔ partially (SSO/OTP need providers).</w:t>
-      </w:r>
-    </w:p>
-    <w:p>
-      <w:pPr>
-        <w:pStyle w:val="Compact"/>
-        <w:numPr>
-          <w:ilvl w:val="0"/>
-          <w:numId w:val="1004"/>
-        </w:numPr>
-      </w:pPr>
-      <w:r>
-        <w:rPr>
-          <w:b/>
-          <w:bCs/>
-        </w:rPr>
-        <w:t xml:space="preserve">FR-A-4 (M)</w:t>
-      </w:r>
-      <w:r>
-        <w:t xml:space="preserve"> </w:t>
-      </w:r>
-      <w:r>
-        <w:t xml:space="preserve">○ ⛔ KYC/identity capture (PAN, Aadhaar/DigiLocker, CKYC) — needs live KYC providers.</w:t>
-      </w:r>
-    </w:p>
-    <w:p>
-      <w:pPr>
-        <w:pStyle w:val="Compact"/>
-        <w:numPr>
-          <w:ilvl w:val="0"/>
-          <w:numId w:val="1004"/>
-        </w:numPr>
-      </w:pPr>
-      <w:r>
-        <w:rPr>
-          <w:b/>
-          <w:bCs/>
-        </w:rPr>
-        <w:t xml:space="preserve">FR-A-5 (P2)</w:t>
-      </w:r>
-      <w:r>
-        <w:t xml:space="preserve"> </w:t>
-      </w:r>
-      <w:r>
-        <w:t xml:space="preserve">✅</w:t>
+        <w:t xml:space="preserve">Built:</w:t>
+      </w:r>
+      <w:r>
+        <w:t xml:space="preserve"> </w:t>
+      </w:r>
+      <w:r>
+        <w:t xml:space="preserve">email+password JWT auth (signup/login/me/refresh) with password policy (min 8), failed-login rate limiting (5 per 5 min, reset on success), and fail-fast boot if the default JWT secret is used outside dev/test; investor/LP/employee access granted by email match without tenant membership.</w:t>
       </w:r>
       <w:r>
         <w:t xml:space="preserve"> </w:t>
@@ -1557,6 +1600,66 @@
           <w:i/>
           <w:iCs/>
         </w:rPr>
+        <w:t xml:space="preserve">Remaining:</w:t>
+      </w:r>
+      <w:r>
+        <w:t xml:space="preserve"> </w:t>
+      </w:r>
+      <w:r>
+        <w:t xml:space="preserve">OTP/SSO (OIDC), invite emails. ⛔ partially (SSO/OTP need providers).</w:t>
+      </w:r>
+    </w:p>
+    <w:p>
+      <w:pPr>
+        <w:pStyle w:val="Compact"/>
+        <w:numPr>
+          <w:ilvl w:val="0"/>
+          <w:numId w:val="1004"/>
+        </w:numPr>
+      </w:pPr>
+      <w:r>
+        <w:rPr>
+          <w:b/>
+          <w:bCs/>
+        </w:rPr>
+        <w:t xml:space="preserve">FR-A-4 (M)</w:t>
+      </w:r>
+      <w:r>
+        <w:t xml:space="preserve"> </w:t>
+      </w:r>
+      <w:r>
+        <w:t xml:space="preserve">○ ⛔ KYC/identity capture (PAN, Aadhaar/DigiLocker, CKYC) — needs live KYC providers.</w:t>
+      </w:r>
+    </w:p>
+    <w:p>
+      <w:pPr>
+        <w:pStyle w:val="Compact"/>
+        <w:numPr>
+          <w:ilvl w:val="0"/>
+          <w:numId w:val="1004"/>
+        </w:numPr>
+      </w:pPr>
+      <w:r>
+        <w:rPr>
+          <w:b/>
+          <w:bCs/>
+        </w:rPr>
+        <w:t xml:space="preserve">FR-A-5 (P2)</w:t>
+      </w:r>
+      <w:r>
+        <w:t xml:space="preserve"> </w:t>
+      </w:r>
+      <w:r>
+        <w:t xml:space="preserve">✅</w:t>
+      </w:r>
+      <w:r>
+        <w:t xml:space="preserve"> </w:t>
+      </w:r>
+      <w:r>
+        <w:rPr>
+          <w:i/>
+          <w:iCs/>
+        </w:rPr>
         <w:t xml:space="preserve">(promoted in practice)</w:t>
       </w:r>
       <w:r>
@@ -2739,51 +2842,92 @@
           <w:i/>
           <w:iCs/>
         </w:rPr>
-        <w:t xml:space="preserve">Remaining:</w:t>
-      </w:r>
-      <w:r>
-        <w:t xml:space="preserve"> </w:t>
-      </w:r>
-      <w:r>
-        <w:t xml:space="preserve">grant letters, milestone vesting, acceleration on exit.</w:t>
-      </w:r>
-    </w:p>
-    <w:p>
-      <w:pPr>
-        <w:pStyle w:val="Compact"/>
-        <w:numPr>
-          <w:ilvl w:val="0"/>
-          <w:numId w:val="1007"/>
-        </w:numPr>
-      </w:pPr>
-      <w:r>
-        <w:rPr>
-          <w:b/>
-          <w:bCs/>
-        </w:rPr>
-        <w:t xml:space="preserve">FR-D-3 (M)</w:t>
-      </w:r>
-      <w:r>
-        <w:t xml:space="preserve"> </w:t>
-      </w:r>
-      <w:r>
-        <w:t xml:space="preserve">✅ Employee self-service: portal shows granted/vested/exercised/exercisable, strike, current FMV and unrealised gain;</w:t>
-      </w:r>
-      <w:r>
-        <w:t xml:space="preserve"> </w:t>
-      </w:r>
-      <w:r>
-        <w:rPr>
-          <w:b/>
-          <w:bCs/>
-        </w:rPr>
-        <w:t xml:space="preserve">self-serve exercise requests</w:t>
-      </w:r>
-      <w:r>
-        <w:t xml:space="preserve"> </w:t>
-      </w:r>
-      <w:r>
-        <w:t xml:space="preserve">(v1.3) — employees request exercise in the portal (validated against vested-minus-exercised-minus-pending), the company approves into a chosen class (the real exercise lands on the ledger, perquisite computed) or rejects; perquisite (FMV − strike) computed on exercise.</w:t>
+        <w:t xml:space="preserve">(v1.4)</w:t>
+      </w:r>
+      <w:r>
+        <w:t xml:space="preserve"> </w:t>
+      </w:r>
+      <w:r>
+        <w:rPr>
+          <w:b/>
+          <w:bCs/>
+        </w:rPr>
+        <w:t xml:space="preserve">Three award types</w:t>
+      </w:r>
+      <w:r>
+        <w:t xml:space="preserve"> </w:t>
+      </w:r>
+      <w:r>
+        <w:t xml:space="preserve">on one vesting model (</w:t>
+      </w:r>
+      <w:r>
+        <w:rPr>
+          <w:rStyle w:val="VerbatimChar"/>
+        </w:rPr>
+        <w:t xml:space="preserve">grant_type</w:t>
+      </w:r>
+      <w:r>
+        <w:t xml:space="preserve">, Alembic</w:t>
+      </w:r>
+      <w:r>
+        <w:t xml:space="preserve"> </w:t>
+      </w:r>
+      <w:r>
+        <w:rPr>
+          <w:rStyle w:val="VerbatimChar"/>
+        </w:rPr>
+        <w:t xml:space="preserve">e1a3c5b7d9f0</w:t>
+      </w:r>
+      <w:r>
+        <w:t xml:space="preserve">):</w:t>
+      </w:r>
+      <w:r>
+        <w:t xml:space="preserve"> </w:t>
+      </w:r>
+      <w:r>
+        <w:rPr>
+          <w:b/>
+          <w:bCs/>
+        </w:rPr>
+        <w:t xml:space="preserve">options</w:t>
+      </w:r>
+      <w:r>
+        <w:t xml:space="preserve"> </w:t>
+      </w:r>
+      <w:r>
+        <w:t xml:space="preserve">(vest → exercise at strike; perquisite = FMV−strike at exercise),</w:t>
+      </w:r>
+      <w:r>
+        <w:t xml:space="preserve"> </w:t>
+      </w:r>
+      <w:r>
+        <w:rPr>
+          <w:b/>
+          <w:bCs/>
+        </w:rPr>
+        <w:t xml:space="preserve">RSUs</w:t>
+      </w:r>
+      <w:r>
+        <w:t xml:space="preserve"> </w:t>
+      </w:r>
+      <w:r>
+        <w:t xml:space="preserve">(no strike; vest → settle to shares for no consideration; perquisite = full FMV at settlement, per Sec 17(2) at vesting), and</w:t>
+      </w:r>
+      <w:r>
+        <w:t xml:space="preserve"> </w:t>
+      </w:r>
+      <w:r>
+        <w:rPr>
+          <w:b/>
+          <w:bCs/>
+        </w:rPr>
+        <w:t xml:space="preserve">RSAs</w:t>
+      </w:r>
+      <w:r>
+        <w:t xml:space="preserve"> </w:t>
+      </w:r>
+      <w:r>
+        <w:t xml:space="preserve">(shares issued upfront at grant, unvested portion subject to repurchase; perquisite = FMV−price at allotment).</w:t>
       </w:r>
       <w:r>
         <w:t xml:space="preserve"> </w:t>
@@ -2793,23 +2937,13 @@
           <w:i/>
           <w:iCs/>
         </w:rPr>
-        <w:t xml:space="preserve">(v1.3)</w:t>
-      </w:r>
-      <w:r>
-        <w:t xml:space="preserve"> </w:t>
-      </w:r>
-      <w:r>
-        <w:rPr>
-          <w:b/>
-          <w:bCs/>
-        </w:rPr>
-        <w:t xml:space="preserve">Vesting projection</w:t>
-      </w:r>
-      <w:r>
-        <w:t xml:space="preserve"> </w:t>
-      </w:r>
-      <w:r>
-        <w:t xml:space="preserve">— the portal equity view leads with vesting-progress %, a vested/unvested progress bar, the estimated 100%-vesting date, and the next scheduled vest events per grant.</w:t>
+        <w:t xml:space="preserve">Remaining:</w:t>
+      </w:r>
+      <w:r>
+        <w:t xml:space="preserve"> </w:t>
+      </w:r>
+      <w:r>
+        <w:t xml:space="preserve">grant letters, milestone vesting, acceleration on exit, RSA repurchase-on-exit automation.</w:t>
       </w:r>
     </w:p>
     <w:p>
@@ -2825,13 +2959,29 @@
           <w:b/>
           <w:bCs/>
         </w:rPr>
-        <w:t xml:space="preserve">FR-D-4 (P2)</w:t>
-      </w:r>
-      <w:r>
-        <w:t xml:space="preserve"> </w:t>
-      </w:r>
-      <w:r>
-        <w:t xml:space="preserve">◐</w:t>
+        <w:t xml:space="preserve">FR-D-3 (M)</w:t>
+      </w:r>
+      <w:r>
+        <w:t xml:space="preserve"> </w:t>
+      </w:r>
+      <w:r>
+        <w:t xml:space="preserve">✅ Employee self-service: portal shows granted/vested/exercised/exercisable, strike, current FMV and unrealised gain;</w:t>
+      </w:r>
+      <w:r>
+        <w:t xml:space="preserve"> </w:t>
+      </w:r>
+      <w:r>
+        <w:rPr>
+          <w:b/>
+          <w:bCs/>
+        </w:rPr>
+        <w:t xml:space="preserve">self-serve exercise requests</w:t>
+      </w:r>
+      <w:r>
+        <w:t xml:space="preserve"> </w:t>
+      </w:r>
+      <w:r>
+        <w:t xml:space="preserve">(v1.3) — employees request exercise in the portal (validated against vested-minus-exercised-minus-pending), the company approves into a chosen class (the real exercise lands on the ledger, perquisite computed) or rejects; perquisite (FMV − strike) computed on exercise.</w:t>
       </w:r>
       <w:r>
         <w:t xml:space="preserve"> </w:t>
@@ -2841,13 +2991,45 @@
           <w:i/>
           <w:iCs/>
         </w:rPr>
-        <w:t xml:space="preserve">(largely promoted)</w:t>
-      </w:r>
-      <w:r>
-        <w:t xml:space="preserve"> </w:t>
-      </w:r>
-      <w:r>
-        <w:t xml:space="preserve">Exercise.</w:t>
+        <w:t xml:space="preserve">(v1.3)</w:t>
+      </w:r>
+      <w:r>
+        <w:t xml:space="preserve"> </w:t>
+      </w:r>
+      <w:r>
+        <w:rPr>
+          <w:b/>
+          <w:bCs/>
+        </w:rPr>
+        <w:t xml:space="preserve">Vesting projection</w:t>
+      </w:r>
+      <w:r>
+        <w:t xml:space="preserve"> </w:t>
+      </w:r>
+      <w:r>
+        <w:t xml:space="preserve">— the portal equity view leads with vesting-progress %, a vested/unvested progress bar, the estimated 100%-vesting date, and the next scheduled vest events per grant.</w:t>
+      </w:r>
+    </w:p>
+    <w:p>
+      <w:pPr>
+        <w:pStyle w:val="Compact"/>
+        <w:numPr>
+          <w:ilvl w:val="0"/>
+          <w:numId w:val="1007"/>
+        </w:numPr>
+      </w:pPr>
+      <w:r>
+        <w:rPr>
+          <w:b/>
+          <w:bCs/>
+        </w:rPr>
+        <w:t xml:space="preserve">FR-D-4 (P2)</w:t>
+      </w:r>
+      <w:r>
+        <w:t xml:space="preserve"> </w:t>
+      </w:r>
+      <w:r>
+        <w:t xml:space="preserve">◐</w:t>
       </w:r>
       <w:r>
         <w:t xml:space="preserve"> </w:t>
@@ -2857,29 +3039,13 @@
           <w:i/>
           <w:iCs/>
         </w:rPr>
-        <w:t xml:space="preserve">Built:</w:t>
-      </w:r>
-      <w:r>
-        <w:t xml:space="preserve"> </w:t>
-      </w:r>
-      <w:r>
-        <w:t xml:space="preserve">exercise → cap-table issuance;</w:t>
-      </w:r>
-      <w:r>
-        <w:t xml:space="preserve"> </w:t>
-      </w:r>
-      <w:r>
-        <w:rPr>
-          <w:b/>
-          <w:bCs/>
-        </w:rPr>
-        <w:t xml:space="preserve">cashless exercise</w:t>
-      </w:r>
-      <w:r>
-        <w:t xml:space="preserve"> </w:t>
-      </w:r>
-      <w:r>
-        <w:t xml:space="preserve">(net shares after withholding to cover strike; gross consumed from grant).</w:t>
+        <w:t xml:space="preserve">(largely promoted)</w:t>
+      </w:r>
+      <w:r>
+        <w:t xml:space="preserve"> </w:t>
+      </w:r>
+      <w:r>
+        <w:t xml:space="preserve">Exercise.</w:t>
       </w:r>
       <w:r>
         <w:t xml:space="preserve"> </w:t>
@@ -2889,35 +3055,29 @@
           <w:i/>
           <w:iCs/>
         </w:rPr>
-        <w:t xml:space="preserve">Remaining:</w:t>
-      </w:r>
-      <w:r>
-        <w:t xml:space="preserve"> </w:t>
-      </w:r>
-      <w:r>
-        <w:t xml:space="preserve">loan-funded and leaver scenarios.</w:t>
-      </w:r>
-    </w:p>
-    <w:p>
-      <w:pPr>
-        <w:pStyle w:val="Compact"/>
-        <w:numPr>
-          <w:ilvl w:val="0"/>
-          <w:numId w:val="1007"/>
-        </w:numPr>
-      </w:pPr>
-      <w:r>
-        <w:rPr>
-          <w:b/>
-          <w:bCs/>
-        </w:rPr>
-        <w:t xml:space="preserve">FR-D-5 (P2)</w:t>
-      </w:r>
-      <w:r>
-        <w:t xml:space="preserve"> </w:t>
-      </w:r>
-      <w:r>
-        <w:t xml:space="preserve">✅</w:t>
+        <w:t xml:space="preserve">Built:</w:t>
+      </w:r>
+      <w:r>
+        <w:t xml:space="preserve"> </w:t>
+      </w:r>
+      <w:r>
+        <w:t xml:space="preserve">exercise → cap-table issuance;</w:t>
+      </w:r>
+      <w:r>
+        <w:t xml:space="preserve"> </w:t>
+      </w:r>
+      <w:r>
+        <w:rPr>
+          <w:b/>
+          <w:bCs/>
+        </w:rPr>
+        <w:t xml:space="preserve">cashless exercise</w:t>
+      </w:r>
+      <w:r>
+        <w:t xml:space="preserve"> </w:t>
+      </w:r>
+      <w:r>
+        <w:t xml:space="preserve">(net shares after withholding to cover strike; gross consumed from grant).</w:t>
       </w:r>
       <w:r>
         <w:t xml:space="preserve"> </w:t>
@@ -2927,6 +3087,44 @@
           <w:i/>
           <w:iCs/>
         </w:rPr>
+        <w:t xml:space="preserve">Remaining:</w:t>
+      </w:r>
+      <w:r>
+        <w:t xml:space="preserve"> </w:t>
+      </w:r>
+      <w:r>
+        <w:t xml:space="preserve">loan-funded and leaver scenarios.</w:t>
+      </w:r>
+    </w:p>
+    <w:p>
+      <w:pPr>
+        <w:pStyle w:val="Compact"/>
+        <w:numPr>
+          <w:ilvl w:val="0"/>
+          <w:numId w:val="1007"/>
+        </w:numPr>
+      </w:pPr>
+      <w:r>
+        <w:rPr>
+          <w:b/>
+          <w:bCs/>
+        </w:rPr>
+        <w:t xml:space="preserve">FR-D-5 (P2)</w:t>
+      </w:r>
+      <w:r>
+        <w:t xml:space="preserve"> </w:t>
+      </w:r>
+      <w:r>
+        <w:t xml:space="preserve">✅</w:t>
+      </w:r>
+      <w:r>
+        <w:t xml:space="preserve"> </w:t>
+      </w:r>
+      <w:r>
+        <w:rPr>
+          <w:i/>
+          <w:iCs/>
+        </w:rPr>
         <w:t xml:space="preserve">(promoted — implemented)</w:t>
       </w:r>
       <w:r>
@@ -5348,28 +5546,6 @@
       <w:r>
         <w:t xml:space="preserve">) showing company holdings (own stakeholder only), fund capital accounts, documents shared via data rooms, and a portfolio summary (companies, funds, total invested, total committed).</w:t>
       </w:r>
-    </w:p>
-    <w:p>
-      <w:pPr>
-        <w:pStyle w:val="Compact"/>
-        <w:numPr>
-          <w:ilvl w:val="0"/>
-          <w:numId w:val="1014"/>
-        </w:numPr>
-      </w:pPr>
-      <w:r>
-        <w:rPr>
-          <w:b/>
-          <w:bCs/>
-        </w:rPr>
-        <w:t xml:space="preserve">FR-K-2 (M)</w:t>
-      </w:r>
-      <w:r>
-        <w:t xml:space="preserve"> </w:t>
-      </w:r>
-      <w:r>
-        <w:t xml:space="preserve">◐ Investor updates: publish + view per entity.</w:t>
-      </w:r>
       <w:r>
         <w:t xml:space="preserve"> </w:t>
       </w:r>
@@ -5378,13 +5554,39 @@
           <w:i/>
           <w:iCs/>
         </w:rPr>
-        <w:t xml:space="preserve">Remaining:</w:t>
-      </w:r>
-      <w:r>
-        <w:t xml:space="preserve"> </w:t>
-      </w:r>
-      <w:r>
-        <w:t xml:space="preserve">acknowledgement tracking.</w:t>
+        <w:t xml:space="preserve">(v1.4)</w:t>
+      </w:r>
+      <w:r>
+        <w:t xml:space="preserve"> </w:t>
+      </w:r>
+      <w:r>
+        <w:rPr>
+          <w:b/>
+          <w:bCs/>
+        </w:rPr>
+        <w:t xml:space="preserve">Value hero</w:t>
+      </w:r>
+      <w:r>
+        <w:t xml:space="preserve"> </w:t>
+      </w:r>
+      <w:r>
+        <w:t xml:space="preserve">— a big current marked-value figure over a</w:t>
+      </w:r>
+      <w:r>
+        <w:t xml:space="preserve"> </w:t>
+      </w:r>
+      <w:r>
+        <w:rPr>
+          <w:b/>
+          <w:bCs/>
+        </w:rPr>
+        <w:t xml:space="preserve">value-over-time line chart</w:t>
+      </w:r>
+      <w:r>
+        <w:t xml:space="preserve"> </w:t>
+      </w:r>
+      <w:r>
+        <w:t xml:space="preserve">with 3M/6M/1Y/All range toggles, reconstructed from each company's FMV history (holdings × FMV at each valuation date, held at cost before the first valuation; equity-holdings series only, labelled distinct from the all-in portfolio stat).</w:t>
       </w:r>
     </w:p>
     <w:p>
@@ -5400,13 +5602,13 @@
           <w:b/>
           <w:bCs/>
         </w:rPr>
-        <w:t xml:space="preserve">FR-K-3 (P2)</w:t>
-      </w:r>
-      <w:r>
-        <w:t xml:space="preserve"> </w:t>
-      </w:r>
-      <w:r>
-        <w:t xml:space="preserve">◐ Self-service documents: shared data-room documents listed in the portal (expiry-enforced).</w:t>
+        <w:t xml:space="preserve">FR-K-2 (M)</w:t>
+      </w:r>
+      <w:r>
+        <w:t xml:space="preserve"> </w:t>
+      </w:r>
+      <w:r>
+        <w:t xml:space="preserve">◐ Investor updates: publish + view per entity.</w:t>
       </w:r>
       <w:r>
         <w:t xml:space="preserve"> </w:t>
@@ -5422,7 +5624,7 @@
         <w:t xml:space="preserve"> </w:t>
       </w:r>
       <w:r>
-        <w:t xml:space="preserve">statements/certificates/tax-doc downloads.</w:t>
+        <w:t xml:space="preserve">acknowledgement tracking.</w:t>
       </w:r>
     </w:p>
     <w:p>
@@ -5438,13 +5640,13 @@
           <w:b/>
           <w:bCs/>
         </w:rPr>
-        <w:t xml:space="preserve">FR-K-4 (P2)</w:t>
-      </w:r>
-      <w:r>
-        <w:t xml:space="preserve"> </w:t>
-      </w:r>
-      <w:r>
-        <w:t xml:space="preserve">◐ Q&amp;A: data-room diligence Q&amp;A.</w:t>
+        <w:t xml:space="preserve">FR-K-3 (P2)</w:t>
+      </w:r>
+      <w:r>
+        <w:t xml:space="preserve"> </w:t>
+      </w:r>
+      <w:r>
+        <w:t xml:space="preserve">◐ Self-service documents: shared data-room documents listed in the portal (expiry-enforced).</w:t>
       </w:r>
       <w:r>
         <w:t xml:space="preserve"> </w:t>
@@ -5460,6 +5662,44 @@
         <w:t xml:space="preserve"> </w:t>
       </w:r>
       <w:r>
+        <w:t xml:space="preserve">statements/certificates/tax-doc downloads.</w:t>
+      </w:r>
+    </w:p>
+    <w:p>
+      <w:pPr>
+        <w:pStyle w:val="Compact"/>
+        <w:numPr>
+          <w:ilvl w:val="0"/>
+          <w:numId w:val="1014"/>
+        </w:numPr>
+      </w:pPr>
+      <w:r>
+        <w:rPr>
+          <w:b/>
+          <w:bCs/>
+        </w:rPr>
+        <w:t xml:space="preserve">FR-K-4 (P2)</w:t>
+      </w:r>
+      <w:r>
+        <w:t xml:space="preserve"> </w:t>
+      </w:r>
+      <w:r>
+        <w:t xml:space="preserve">◐ Q&amp;A: data-room diligence Q&amp;A.</w:t>
+      </w:r>
+      <w:r>
+        <w:t xml:space="preserve"> </w:t>
+      </w:r>
+      <w:r>
+        <w:rPr>
+          <w:i/>
+          <w:iCs/>
+        </w:rPr>
+        <w:t xml:space="preserve">Remaining:</w:t>
+      </w:r>
+      <w:r>
+        <w:t xml:space="preserve"> </w:t>
+      </w:r>
+      <w:r>
         <w:t xml:space="preserve">general secure messaging.</w:t>
       </w:r>
     </w:p>
@@ -5669,50 +5909,6 @@
       <w:r>
         <w:t xml:space="preserve">= latest final, effective, unexpired report as of a date.</w:t>
       </w:r>
-    </w:p>
-    <w:p>
-      <w:pPr>
-        <w:pStyle w:val="Compact"/>
-        <w:numPr>
-          <w:ilvl w:val="0"/>
-          <w:numId w:val="1015"/>
-        </w:numPr>
-      </w:pPr>
-      <w:r>
-        <w:rPr>
-          <w:b/>
-          <w:bCs/>
-        </w:rPr>
-        <w:t xml:space="preserve">FR-L-3 (P2)</w:t>
-      </w:r>
-      <w:r>
-        <w:t xml:space="preserve"> </w:t>
-      </w:r>
-      <w:r>
-        <w:t xml:space="preserve">○ In-app DCF/comparables modelling.</w:t>
-      </w:r>
-    </w:p>
-    <w:p>
-      <w:pPr>
-        <w:pStyle w:val="Compact"/>
-        <w:numPr>
-          <w:ilvl w:val="0"/>
-          <w:numId w:val="1015"/>
-        </w:numPr>
-      </w:pPr>
-      <w:r>
-        <w:rPr>
-          <w:b/>
-          <w:bCs/>
-        </w:rPr>
-        <w:t xml:space="preserve">FR-L-4 (P2)</w:t>
-      </w:r>
-      <w:r>
-        <w:t xml:space="preserve"> </w:t>
-      </w:r>
-      <w:r>
-        <w:t xml:space="preserve">◐ Expiry: validity honoured in current-FMV resolution.</w:t>
-      </w:r>
       <w:r>
         <w:t xml:space="preserve"> </w:t>
       </w:r>
@@ -5721,6 +5917,142 @@
           <w:i/>
           <w:iCs/>
         </w:rPr>
+        <w:t xml:space="preserve">(v1.3)</w:t>
+      </w:r>
+      <w:r>
+        <w:t xml:space="preserve"> </w:t>
+      </w:r>
+      <w:r>
+        <w:rPr>
+          <w:b/>
+          <w:bCs/>
+        </w:rPr>
+        <w:t xml:space="preserve">FMV-over-time chart</w:t>
+      </w:r>
+      <w:r>
+        <w:t xml:space="preserve"> </w:t>
+      </w:r>
+      <w:r>
+        <w:t xml:space="preserve">— registered valuations plotted as a line series, overlaid with saved indicative per-share estimates.</w:t>
+      </w:r>
+    </w:p>
+    <w:p>
+      <w:pPr>
+        <w:pStyle w:val="Compact"/>
+        <w:numPr>
+          <w:ilvl w:val="0"/>
+          <w:numId w:val="1015"/>
+        </w:numPr>
+      </w:pPr>
+      <w:r>
+        <w:rPr>
+          <w:b/>
+          <w:bCs/>
+        </w:rPr>
+        <w:t xml:space="preserve">FR-L-3 (P2)</w:t>
+      </w:r>
+      <w:r>
+        <w:t xml:space="preserve"> </w:t>
+      </w:r>
+      <w:r>
+        <w:t xml:space="preserve">✅</w:t>
+      </w:r>
+      <w:r>
+        <w:t xml:space="preserve"> </w:t>
+      </w:r>
+      <w:r>
+        <w:rPr>
+          <w:i/>
+          <w:iCs/>
+        </w:rPr>
+        <w:t xml:space="preserve">(v1.3, Eqvista gap analysis)</w:t>
+      </w:r>
+      <w:r>
+        <w:t xml:space="preserve"> </w:t>
+      </w:r>
+      <w:r>
+        <w:rPr>
+          <w:b/>
+          <w:bCs/>
+        </w:rPr>
+        <w:t xml:space="preserve">Self-serve indicative valuation</w:t>
+      </w:r>
+      <w:r>
+        <w:t xml:space="preserve">: scorecard (Bill Payne weighted factors over a benchmark pre-money), VC method (exit ÷ target multiple − planned raise), and DCF-lite (discounted projection cash flows + terminal value) — any subset blended by custom weights, translated to a per-share value on the fully-diluted count,</w:t>
+      </w:r>
+      <w:r>
+        <w:t xml:space="preserve"> </w:t>
+      </w:r>
+      <w:r>
+        <w:rPr>
+          <w:b/>
+          <w:bCs/>
+        </w:rPr>
+        <w:t xml:space="preserve">smartfilled</w:t>
+      </w:r>
+      <w:r>
+        <w:t xml:space="preserve"> </w:t>
+      </w:r>
+      <w:r>
+        <w:t xml:space="preserve">from the entity's financial snapshots, saved as reusable scenarios, and exported as an indicative-valuation workpaper document. Indicative only (disclaimer travels with every result); not a registered-valuer report.</w:t>
+      </w:r>
+      <w:r>
+        <w:t xml:space="preserve"> </w:t>
+      </w:r>
+      <w:r>
+        <w:rPr>
+          <w:rStyle w:val="VerbatimChar"/>
+        </w:rPr>
+        <w:t xml:space="preserve">ValuationEstimate</w:t>
+      </w:r>
+      <w:r>
+        <w:t xml:space="preserve"> </w:t>
+      </w:r>
+      <w:r>
+        <w:t xml:space="preserve">model, Alembic</w:t>
+      </w:r>
+      <w:r>
+        <w:t xml:space="preserve"> </w:t>
+      </w:r>
+      <w:r>
+        <w:rPr>
+          <w:rStyle w:val="VerbatimChar"/>
+        </w:rPr>
+        <w:t xml:space="preserve">d4f6a8c0b2e4</w:t>
+      </w:r>
+      <w:r>
+        <w:t xml:space="preserve">.</w:t>
+      </w:r>
+    </w:p>
+    <w:p>
+      <w:pPr>
+        <w:pStyle w:val="Compact"/>
+        <w:numPr>
+          <w:ilvl w:val="0"/>
+          <w:numId w:val="1015"/>
+        </w:numPr>
+      </w:pPr>
+      <w:r>
+        <w:rPr>
+          <w:b/>
+          <w:bCs/>
+        </w:rPr>
+        <w:t xml:space="preserve">FR-L-4 (P2)</w:t>
+      </w:r>
+      <w:r>
+        <w:t xml:space="preserve"> </w:t>
+      </w:r>
+      <w:r>
+        <w:t xml:space="preserve">◐ Expiry: validity honoured in current-FMV resolution.</w:t>
+      </w:r>
+      <w:r>
+        <w:t xml:space="preserve"> </w:t>
+      </w:r>
+      <w:r>
+        <w:rPr>
+          <w:i/>
+          <w:iCs/>
+        </w:rPr>
         <w:t xml:space="preserve">Remaining:</w:t>
       </w:r>
       <w:r>
@@ -7220,6 +7552,112 @@
       </w:r>
       <w:r>
         <w:t xml:space="preserve">deep-linking to issue shares / grant options / raise / pass a resolution.</w:t>
+      </w:r>
+      <w:r>
+        <w:t xml:space="preserve"> </w:t>
+      </w:r>
+      <w:r>
+        <w:rPr>
+          <w:i/>
+          <w:iCs/>
+        </w:rPr>
+        <w:t xml:space="preserve">(v1.4)</w:t>
+      </w:r>
+      <w:r>
+        <w:t xml:space="preserve"> </w:t>
+      </w:r>
+      <w:r>
+        <w:rPr>
+          <w:b/>
+          <w:bCs/>
+        </w:rPr>
+        <w:t xml:space="preserve">Tasks hub</w:t>
+      </w:r>
+      <w:r>
+        <w:t xml:space="preserve"> </w:t>
+      </w:r>
+      <w:r>
+        <w:t xml:space="preserve">— a Home-group tab aggregating everything actionable for the entity (pending e-signatures, open option-exercise requests, overdue compliance filings, outstanding investor consents), ranked with overdue first, each row deep-linking to the tab that resolves it.</w:t>
+      </w:r>
+    </w:p>
+    <w:p>
+      <w:pPr>
+        <w:pStyle w:val="Compact"/>
+        <w:numPr>
+          <w:ilvl w:val="0"/>
+          <w:numId w:val="1023"/>
+        </w:numPr>
+      </w:pPr>
+      <w:r>
+        <w:rPr>
+          <w:b/>
+          <w:bCs/>
+        </w:rPr>
+        <w:t xml:space="preserve">FR-T-9 (M)</w:t>
+      </w:r>
+      <w:r>
+        <w:t xml:space="preserve"> </w:t>
+      </w:r>
+      <w:r>
+        <w:t xml:space="preserve">✅</w:t>
+      </w:r>
+      <w:r>
+        <w:t xml:space="preserve"> </w:t>
+      </w:r>
+      <w:r>
+        <w:rPr>
+          <w:i/>
+          <w:iCs/>
+        </w:rPr>
+        <w:t xml:space="preserve">(v1.4, Mantle gap analysis)</w:t>
+      </w:r>
+      <w:r>
+        <w:t xml:space="preserve"> </w:t>
+      </w:r>
+      <w:r>
+        <w:rPr>
+          <w:b/>
+          <w:bCs/>
+        </w:rPr>
+        <w:t xml:space="preserve">Cap-table ownership bar</w:t>
+      </w:r>
+      <w:r>
+        <w:t xml:space="preserve"> </w:t>
+      </w:r>
+      <w:r>
+        <w:t xml:space="preserve">— a 100%-stacked horizontal share-class bar above the holdings table;</w:t>
+      </w:r>
+      <w:r>
+        <w:t xml:space="preserve"> </w:t>
+      </w:r>
+      <w:r>
+        <w:rPr>
+          <w:b/>
+          <w:bCs/>
+        </w:rPr>
+        <w:t xml:space="preserve">avatar initials chips</w:t>
+      </w:r>
+      <w:r>
+        <w:t xml:space="preserve"> </w:t>
+      </w:r>
+      <w:r>
+        <w:t xml:space="preserve">on stakeholder/holder rows;</w:t>
+      </w:r>
+      <w:r>
+        <w:t xml:space="preserve"> </w:t>
+      </w:r>
+      <w:r>
+        <w:rPr>
+          <w:b/>
+          <w:bCs/>
+        </w:rPr>
+        <w:t xml:space="preserve">document card grid</w:t>
+      </w:r>
+      <w:r>
+        <w:t xml:space="preserve"> </w:t>
+      </w:r>
+      <w:r>
+        <w:t xml:space="preserve">with per-type tag chips replacing the flat document list.</w:t>
       </w:r>
     </w:p>
     <w:p>
@@ -14588,6 +15026,408 @@
       </w:r>
       <w:r>
         <w:t xml:space="preserve">template). 209 backend tests.</w:t>
+      </w:r>
+    </w:p>
+    <w:p>
+      <w:pPr>
+        <w:pStyle w:val="Compact"/>
+        <w:numPr>
+          <w:ilvl w:val="0"/>
+          <w:numId w:val="1030"/>
+        </w:numPr>
+      </w:pPr>
+      <w:r>
+        <w:rPr>
+          <w:b/>
+          <w:bCs/>
+        </w:rPr>
+        <w:t xml:space="preserve">Mantle functional batch</w:t>
+      </w:r>
+      <w:r>
+        <w:t xml:space="preserve"> </w:t>
+      </w:r>
+      <w:r>
+        <w:t xml:space="preserve">(2026-07-15):</w:t>
+      </w:r>
+      <w:r>
+        <w:t xml:space="preserve"> </w:t>
+      </w:r>
+      <w:r>
+        <w:rPr>
+          <w:b/>
+          <w:bCs/>
+        </w:rPr>
+        <w:t xml:space="preserve">RSU / RSA instruments</w:t>
+      </w:r>
+      <w:r>
+        <w:t xml:space="preserve"> </w:t>
+      </w:r>
+      <w:r>
+        <w:t xml:space="preserve">(FR-D-2) — the ESOP grant model gained a</w:t>
+      </w:r>
+      <w:r>
+        <w:t xml:space="preserve"> </w:t>
+      </w:r>
+      <w:r>
+        <w:rPr>
+          <w:rStyle w:val="VerbatimChar"/>
+        </w:rPr>
+        <w:t xml:space="preserve">grant_type</w:t>
+      </w:r>
+      <w:r>
+        <w:t xml:space="preserve"> </w:t>
+      </w:r>
+      <w:r>
+        <w:t xml:space="preserve">(option | rsu | rsa) sharing the vesting engine: RSUs settle to shares at vest for no strike with full-FMV perquisite, RSAs issue shares upfront with perquisite at allotment and an unvested-at-repurchase-risk figure; Alembic</w:t>
+      </w:r>
+      <w:r>
+        <w:t xml:space="preserve"> </w:t>
+      </w:r>
+      <w:r>
+        <w:rPr>
+          <w:rStyle w:val="VerbatimChar"/>
+        </w:rPr>
+        <w:t xml:space="preserve">e1a3c5b7d9f0</w:t>
+      </w:r>
+      <w:r>
+        <w:t xml:space="preserve">; grant-type tabs + type-aware table in the ESOP screen.</w:t>
+      </w:r>
+      <w:r>
+        <w:t xml:space="preserve"> </w:t>
+      </w:r>
+      <w:r>
+        <w:rPr>
+          <w:b/>
+          <w:bCs/>
+        </w:rPr>
+        <w:t xml:space="preserve">External advisor workspace</w:t>
+      </w:r>
+      <w:r>
+        <w:t xml:space="preserve"> </w:t>
+      </w:r>
+      <w:r>
+        <w:t xml:space="preserve">(FR-A-2) —</w:t>
+      </w:r>
+      <w:r>
+        <w:t xml:space="preserve"> </w:t>
+      </w:r>
+      <w:r>
+        <w:rPr>
+          <w:rStyle w:val="VerbatimChar"/>
+        </w:rPr>
+        <w:t xml:space="preserve">AdvisorAccess</w:t>
+      </w:r>
+      <w:r>
+        <w:t xml:space="preserve"> </w:t>
+      </w:r>
+      <w:r>
+        <w:t xml:space="preserve">grants a law firm / CA / CS scoped cross-tenant access (viewer/member) enforced via a shared</w:t>
+      </w:r>
+      <w:r>
+        <w:t xml:space="preserve"> </w:t>
+      </w:r>
+      <w:r>
+        <w:rPr>
+          <w:rStyle w:val="VerbatimChar"/>
+        </w:rPr>
+        <w:t xml:space="preserve">deps._entity_role</w:t>
+      </w:r>
+      <w:r>
+        <w:t xml:space="preserve">, an entity-side Advisors management tab, and a</w:t>
+      </w:r>
+      <w:r>
+        <w:t xml:space="preserve"> </w:t>
+      </w:r>
+      <w:r>
+        <w:rPr>
+          <w:rStyle w:val="VerbatimChar"/>
+        </w:rPr>
+        <w:t xml:space="preserve">/advisor</w:t>
+      </w:r>
+      <w:r>
+        <w:t xml:space="preserve"> </w:t>
+      </w:r>
+      <w:r>
+        <w:t xml:space="preserve">console listing all client entities; Alembic</w:t>
+      </w:r>
+      <w:r>
+        <w:t xml:space="preserve"> </w:t>
+      </w:r>
+      <w:r>
+        <w:rPr>
+          <w:rStyle w:val="VerbatimChar"/>
+        </w:rPr>
+        <w:t xml:space="preserve">e2b4d6c8f0a2</w:t>
+      </w:r>
+      <w:r>
+        <w:t xml:space="preserve">. 238 backend tests.</w:t>
+      </w:r>
+    </w:p>
+    <w:p>
+      <w:pPr>
+        <w:pStyle w:val="Compact"/>
+        <w:numPr>
+          <w:ilvl w:val="0"/>
+          <w:numId w:val="1030"/>
+        </w:numPr>
+      </w:pPr>
+      <w:r>
+        <w:rPr>
+          <w:b/>
+          <w:bCs/>
+        </w:rPr>
+        <w:t xml:space="preserve">Mantle visual batch</w:t>
+      </w:r>
+      <w:r>
+        <w:t xml:space="preserve"> </w:t>
+      </w:r>
+      <w:r>
+        <w:t xml:space="preserve">(2026-07-15):</w:t>
+      </w:r>
+      <w:r>
+        <w:t xml:space="preserve"> </w:t>
+      </w:r>
+      <w:r>
+        <w:rPr>
+          <w:b/>
+          <w:bCs/>
+        </w:rPr>
+        <w:t xml:space="preserve">100%-stacked ownership bar</w:t>
+      </w:r>
+      <w:r>
+        <w:t xml:space="preserve"> </w:t>
+      </w:r>
+      <w:r>
+        <w:t xml:space="preserve">above the cap-table holdings (FR-T-9 ✅);</w:t>
+      </w:r>
+      <w:r>
+        <w:t xml:space="preserve"> </w:t>
+      </w:r>
+      <w:r>
+        <w:rPr>
+          <w:b/>
+          <w:bCs/>
+        </w:rPr>
+        <w:t xml:space="preserve">avatar-initials chips</w:t>
+      </w:r>
+      <w:r>
+        <w:t xml:space="preserve"> </w:t>
+      </w:r>
+      <w:r>
+        <w:t xml:space="preserve">on stakeholder/holder rows;</w:t>
+      </w:r>
+      <w:r>
+        <w:t xml:space="preserve"> </w:t>
+      </w:r>
+      <w:r>
+        <w:rPr>
+          <w:b/>
+          <w:bCs/>
+        </w:rPr>
+        <w:t xml:space="preserve">document card grid</w:t>
+      </w:r>
+      <w:r>
+        <w:t xml:space="preserve"> </w:t>
+      </w:r>
+      <w:r>
+        <w:t xml:space="preserve">with per-type tag chips (replacing the flat list);</w:t>
+      </w:r>
+      <w:r>
+        <w:t xml:space="preserve"> </w:t>
+      </w:r>
+      <w:r>
+        <w:rPr>
+          <w:b/>
+          <w:bCs/>
+        </w:rPr>
+        <w:t xml:space="preserve">portal value hero</w:t>
+      </w:r>
+      <w:r>
+        <w:t xml:space="preserve"> </w:t>
+      </w:r>
+      <w:r>
+        <w:t xml:space="preserve">(FR-K-1) — big current marked value over a value-over-time line chart with 3M/6M/1Y/All range toggles, from a new read-only</w:t>
+      </w:r>
+      <w:r>
+        <w:t xml:space="preserve"> </w:t>
+      </w:r>
+      <w:r>
+        <w:rPr>
+          <w:rStyle w:val="VerbatimChar"/>
+        </w:rPr>
+        <w:t xml:space="preserve">/portal/value-history</w:t>
+      </w:r>
+      <w:r>
+        <w:t xml:space="preserve"> </w:t>
+      </w:r>
+      <w:r>
+        <w:t xml:space="preserve">(holdings × FMV at each valuation date);</w:t>
+      </w:r>
+      <w:r>
+        <w:t xml:space="preserve"> </w:t>
+      </w:r>
+      <w:r>
+        <w:rPr>
+          <w:b/>
+          <w:bCs/>
+        </w:rPr>
+        <w:t xml:space="preserve">app-wide Tasks hub</w:t>
+      </w:r>
+      <w:r>
+        <w:t xml:space="preserve"> </w:t>
+      </w:r>
+      <w:r>
+        <w:t xml:space="preserve">(FR-T-3) —</w:t>
+      </w:r>
+      <w:r>
+        <w:t xml:space="preserve"> </w:t>
+      </w:r>
+      <w:r>
+        <w:rPr>
+          <w:rStyle w:val="VerbatimChar"/>
+        </w:rPr>
+        <w:t xml:space="preserve">/entities/{id}/tasks</w:t>
+      </w:r>
+      <w:r>
+        <w:t xml:space="preserve"> </w:t>
+      </w:r>
+      <w:r>
+        <w:t xml:space="preserve">aggregating pending signatures, open exercise requests, overdue compliance and outstanding consents, ranked, deep-linking to the resolving tab. Reusable</w:t>
+      </w:r>
+      <w:r>
+        <w:t xml:space="preserve"> </w:t>
+      </w:r>
+      <w:r>
+        <w:rPr>
+          <w:rStyle w:val="VerbatimChar"/>
+        </w:rPr>
+        <w:t xml:space="preserve">StackedBar</w:t>
+      </w:r>
+      <w:r>
+        <w:t xml:space="preserve"> </w:t>
+      </w:r>
+      <w:r>
+        <w:t xml:space="preserve">/</w:t>
+      </w:r>
+      <w:r>
+        <w:t xml:space="preserve"> </w:t>
+      </w:r>
+      <w:r>
+        <w:rPr>
+          <w:rStyle w:val="VerbatimChar"/>
+        </w:rPr>
+        <w:t xml:space="preserve">Avatar</w:t>
+      </w:r>
+      <w:r>
+        <w:t xml:space="preserve"> </w:t>
+      </w:r>
+      <w:r>
+        <w:t xml:space="preserve">components; no schema changes. 229 backend tests.</w:t>
+      </w:r>
+    </w:p>
+    <w:p>
+      <w:pPr>
+        <w:pStyle w:val="Compact"/>
+        <w:numPr>
+          <w:ilvl w:val="0"/>
+          <w:numId w:val="1030"/>
+        </w:numPr>
+      </w:pPr>
+      <w:r>
+        <w:rPr>
+          <w:b/>
+          <w:bCs/>
+        </w:rPr>
+        <w:t xml:space="preserve">Eqvista functional batch</w:t>
+      </w:r>
+      <w:r>
+        <w:t xml:space="preserve"> </w:t>
+      </w:r>
+      <w:r>
+        <w:t xml:space="preserve">(2026-07-15):</w:t>
+      </w:r>
+      <w:r>
+        <w:t xml:space="preserve"> </w:t>
+      </w:r>
+      <w:r>
+        <w:rPr>
+          <w:b/>
+          <w:bCs/>
+        </w:rPr>
+        <w:t xml:space="preserve">self-serve indicative valuation</w:t>
+      </w:r>
+      <w:r>
+        <w:t xml:space="preserve"> </w:t>
+      </w:r>
+      <w:r>
+        <w:t xml:space="preserve">(FR-L-3 ✅) — scorecard / VC-method / DCF-lite blended by custom weights, per-share on the fully-diluted count, smartfill from financial snapshots, saved scenarios, and a workpaper document (</w:t>
+      </w:r>
+      <w:r>
+        <w:rPr>
+          <w:rStyle w:val="VerbatimChar"/>
+        </w:rPr>
+        <w:t xml:space="preserve">ValuationEstimate</w:t>
+      </w:r>
+      <w:r>
+        <w:t xml:space="preserve">, Alembic</w:t>
+      </w:r>
+      <w:r>
+        <w:t xml:space="preserve"> </w:t>
+      </w:r>
+      <w:r>
+        <w:rPr>
+          <w:rStyle w:val="VerbatimChar"/>
+        </w:rPr>
+        <w:t xml:space="preserve">d4f6a8c0b2e4</w:t>
+      </w:r>
+      <w:r>
+        <w:t xml:space="preserve">, new</w:t>
+      </w:r>
+      <w:r>
+        <w:t xml:space="preserve"> </w:t>
+      </w:r>
+      <w:r>
+        <w:rPr>
+          <w:rStyle w:val="VerbatimChar"/>
+        </w:rPr>
+        <w:t xml:space="preserve">valuation_estimate</w:t>
+      </w:r>
+      <w:r>
+        <w:t xml:space="preserve"> </w:t>
+      </w:r>
+      <w:r>
+        <w:t xml:space="preserve">template);</w:t>
+      </w:r>
+      <w:r>
+        <w:t xml:space="preserve"> </w:t>
+      </w:r>
+      <w:r>
+        <w:rPr>
+          <w:b/>
+          <w:bCs/>
+        </w:rPr>
+        <w:t xml:space="preserve">FMV-over-time line chart</w:t>
+      </w:r>
+      <w:r>
+        <w:t xml:space="preserve"> </w:t>
+      </w:r>
+      <w:r>
+        <w:t xml:space="preserve">(FR-L-2) — registered valuations plus saved indicative estimates as two series. Dependency-free SVG</w:t>
+      </w:r>
+      <w:r>
+        <w:t xml:space="preserve"> </w:t>
+      </w:r>
+      <w:r>
+        <w:rPr>
+          <w:rStyle w:val="VerbatimChar"/>
+        </w:rPr>
+        <w:t xml:space="preserve">LineChart</w:t>
+      </w:r>
+      <w:r>
+        <w:t xml:space="preserve"> </w:t>
+      </w:r>
+      <w:r>
+        <w:t xml:space="preserve">component; Valuations tab split into Reports &amp; FMV | Indicative estimate sub-tabs. 225 backend tests.</w:t>
       </w:r>
     </w:p>
     <w:p>

</xml_diff>

<commit_message>
Add grant detail, liquidity/overview UI, visual-language pass (frontend)
Frontend for four batches since the last push:

- Ledgy: employee grant-detail view (value stats + segment bar + vesting
  timeline) and equity hero card; exercise-windows admin card, Liquidity
  sub-tab and portal tender UI.
- Fund look-through table (portal) + Schedule-of-Investments card.
- trica: Ind AS 102 expense card + report, investor-report composer, ESOP
  adoption-pack button, ESOP overview dashboard (pool donut + tiles +
  leaderboard), Stat info-tooltips.
- Visual-language pass: reusable EmptyState / ProgressRing / BarChart /
  PageHeader; gauges for diligence & compliance, waterfall as bars, empty
  states across 7 tabs, metric icons.

REQUIREMENTS v1.4 + docx updated. tsc clean; 7 vitest tests pass.

Co-Authored-By: Claude Fable 5 <noreply@anthropic.com>
</commit_message>
<xml_diff>
--- a/REQUIREMENTS.docx
+++ b/REQUIREMENTS.docx
@@ -2685,26 +2685,88 @@
           <w:b/>
           <w:bCs/>
         </w:rPr>
-        <w:t xml:space="preserve">FR-C-12 (M — added v1.0)</w:t>
-      </w:r>
-      <w:r>
-        <w:t xml:space="preserve"> </w:t>
-      </w:r>
-      <w:r>
-        <w:t xml:space="preserve">✅ Cap-table</w:t>
-      </w:r>
-      <w:r>
-        <w:t xml:space="preserve"> </w:t>
-      </w:r>
-      <w:r>
-        <w:rPr>
-          <w:b/>
-          <w:bCs/>
-        </w:rPr>
-        <w:t xml:space="preserve">CSV export</w:t>
-      </w:r>
-      <w:r>
-        <w:t xml:space="preserve">, and</w:t>
+        <w:t xml:space="preserve">FR-C-13 (M — added v1.4, Ledgy gap)</w:t>
+      </w:r>
+      <w:r>
+        <w:t xml:space="preserve"> </w:t>
+      </w:r>
+      <w:r>
+        <w:t xml:space="preserve">✅</w:t>
+      </w:r>
+      <w:r>
+        <w:t xml:space="preserve"> </w:t>
+      </w:r>
+      <w:r>
+        <w:rPr>
+          <w:b/>
+          <w:bCs/>
+        </w:rPr>
+        <w:t xml:space="preserve">Company liquidity windows (buyback / tender)</w:t>
+      </w:r>
+      <w:r>
+        <w:t xml:space="preserve">: the company opens a fixed-price window over a period (</w:t>
+      </w:r>
+      <w:r>
+        <w:rPr>
+          <w:rStyle w:val="VerbatimChar"/>
+        </w:rPr>
+        <w:t xml:space="preserve">liquidity_events</w:t>
+      </w:r>
+      <w:r>
+        <w:t xml:space="preserve">); shareholders</w:t>
+      </w:r>
+      <w:r>
+        <w:t xml:space="preserve"> </w:t>
+      </w:r>
+      <w:r>
+        <w:rPr>
+          <w:b/>
+          <w:bCs/>
+        </w:rPr>
+        <w:t xml:space="preserve">tender</w:t>
+      </w:r>
+      <w:r>
+        <w:t xml:space="preserve"> </w:t>
+      </w:r>
+      <w:r>
+        <w:t xml:space="preserve">shares from their portal (</w:t>
+      </w:r>
+      <w:r>
+        <w:rPr>
+          <w:rStyle w:val="VerbatimChar"/>
+        </w:rPr>
+        <w:t xml:space="preserve">tenders</w:t>
+      </w:r>
+      <w:r>
+        <w:t xml:space="preserve">, validated against holdings);</w:t>
+      </w:r>
+      <w:r>
+        <w:t xml:space="preserve"> </w:t>
+      </w:r>
+      <w:r>
+        <w:rPr>
+          <w:b/>
+          <w:bCs/>
+        </w:rPr>
+        <w:t xml:space="preserve">settlement</w:t>
+      </w:r>
+      <w:r>
+        <w:t xml:space="preserve"> </w:t>
+      </w:r>
+      <w:r>
+        <w:t xml:space="preserve">buys back every accepted tender at the event price as append-only cap-table</w:t>
+      </w:r>
+      <w:r>
+        <w:t xml:space="preserve"> </w:t>
+      </w:r>
+      <w:r>
+        <w:rPr>
+          <w:rStyle w:val="VerbatimChar"/>
+        </w:rPr>
+        <w:t xml:space="preserve">BuybackTransaction</w:t>
+      </w:r>
+      <w:r>
+        <w:t xml:space="preserve">s (skipping any holder who no longer has the shares). Admin sees tender counts and an indicative payout; the portal surfaces open windows across every entity where the user holds shares.</w:t>
       </w:r>
       <w:r>
         <w:t xml:space="preserve"> </w:t>
@@ -2714,6 +2776,57 @@
           <w:i/>
           <w:iCs/>
         </w:rPr>
+        <w:t xml:space="preserve">Remaining:</w:t>
+      </w:r>
+      <w:r>
+        <w:t xml:space="preserve"> </w:t>
+      </w:r>
+      <w:r>
+        <w:t xml:space="preserve">per-tender accept/reject, proration on oversubscription, external-buyer (secondary) settlement.</w:t>
+      </w:r>
+    </w:p>
+    <w:p>
+      <w:pPr>
+        <w:pStyle w:val="Compact"/>
+        <w:numPr>
+          <w:ilvl w:val="0"/>
+          <w:numId w:val="1006"/>
+        </w:numPr>
+      </w:pPr>
+      <w:r>
+        <w:rPr>
+          <w:b/>
+          <w:bCs/>
+        </w:rPr>
+        <w:t xml:space="preserve">FR-C-12 (M — added v1.0)</w:t>
+      </w:r>
+      <w:r>
+        <w:t xml:space="preserve"> </w:t>
+      </w:r>
+      <w:r>
+        <w:t xml:space="preserve">✅ Cap-table</w:t>
+      </w:r>
+      <w:r>
+        <w:t xml:space="preserve"> </w:t>
+      </w:r>
+      <w:r>
+        <w:rPr>
+          <w:b/>
+          <w:bCs/>
+        </w:rPr>
+        <w:t xml:space="preserve">CSV export</w:t>
+      </w:r>
+      <w:r>
+        <w:t xml:space="preserve">, and</w:t>
+      </w:r>
+      <w:r>
+        <w:t xml:space="preserve"> </w:t>
+      </w:r>
+      <w:r>
+        <w:rPr>
+          <w:i/>
+          <w:iCs/>
+        </w:rPr>
         <w:t xml:space="preserve">(v1.3)</w:t>
       </w:r>
       <w:r>
@@ -2778,7 +2891,7 @@
         <w:t xml:space="preserve"> </w:t>
       </w:r>
       <w:r>
-        <w:t xml:space="preserve">scheme with pool size and pool-limit enforcement on grants.</w:t>
+        <w:t xml:space="preserve">scheme with pool size and pool-limit enforcement on grants;</w:t>
       </w:r>
       <w:r>
         <w:t xml:space="preserve"> </w:t>
@@ -2788,35 +2901,48 @@
           <w:i/>
           <w:iCs/>
         </w:rPr>
-        <w:t xml:space="preserve">Remaining:</w:t>
-      </w:r>
-      <w:r>
-        <w:t xml:space="preserve"> </w:t>
-      </w:r>
-      <w:r>
-        <w:t xml:space="preserve">scheme versioning, exercise-window rules, SEBI SBEB variants.</w:t>
-      </w:r>
-    </w:p>
-    <w:p>
-      <w:pPr>
-        <w:pStyle w:val="Compact"/>
-        <w:numPr>
-          <w:ilvl w:val="0"/>
-          <w:numId w:val="1007"/>
-        </w:numPr>
-      </w:pPr>
-      <w:r>
-        <w:rPr>
-          <w:b/>
-          <w:bCs/>
-        </w:rPr>
-        <w:t xml:space="preserve">FR-D-2 (M)</w:t>
-      </w:r>
-      <w:r>
-        <w:t xml:space="preserve"> </w:t>
-      </w:r>
-      <w:r>
-        <w:t xml:space="preserve">◐ Grants.</w:t>
+        <w:t xml:space="preserve">(v1.4)</w:t>
+      </w:r>
+      <w:r>
+        <w:t xml:space="preserve"> </w:t>
+      </w:r>
+      <w:r>
+        <w:rPr>
+          <w:b/>
+          <w:bCs/>
+        </w:rPr>
+        <w:t xml:space="preserve">adoption pack</w:t>
+      </w:r>
+      <w:r>
+        <w:t xml:space="preserve"> </w:t>
+      </w:r>
+      <w:r>
+        <w:t xml:space="preserve">— one-click generation of the statutory documents to adopt a scheme (board resolution, EGM notice with the s.62(1)(b) special resolution, and the ESOP policy);</w:t>
+      </w:r>
+      <w:r>
+        <w:t xml:space="preserve"> </w:t>
+      </w:r>
+      <w:r>
+        <w:rPr>
+          <w:b/>
+          <w:bCs/>
+        </w:rPr>
+        <w:t xml:space="preserve">ESOP overview dashboard</w:t>
+      </w:r>
+      <w:r>
+        <w:t xml:space="preserve"> </w:t>
+      </w:r>
+      <w:r>
+        <w:t xml:space="preserve">— pool size / granted / available + used %, option states (vested / exercised / exercisable / unvested), grantee count, a pool-composition donut and a top-grants leaderboard (</w:t>
+      </w:r>
+      <w:r>
+        <w:rPr>
+          <w:rStyle w:val="VerbatimChar"/>
+        </w:rPr>
+        <w:t xml:space="preserve">GET /esop/overview</w:t>
+      </w:r>
+      <w:r>
+        <w:t xml:space="preserve">, read-only).</w:t>
       </w:r>
       <w:r>
         <w:t xml:space="preserve"> </w:t>
@@ -2826,13 +2952,35 @@
           <w:i/>
           <w:iCs/>
         </w:rPr>
-        <w:t xml:space="preserve">Built:</w:t>
-      </w:r>
-      <w:r>
-        <w:t xml:space="preserve"> </w:t>
-      </w:r>
-      <w:r>
-        <w:t xml:space="preserve">per-employee grants, cliff + linear monthly vesting, time-based tracking.</w:t>
+        <w:t xml:space="preserve">Remaining:</w:t>
+      </w:r>
+      <w:r>
+        <w:t xml:space="preserve"> </w:t>
+      </w:r>
+      <w:r>
+        <w:t xml:space="preserve">scheme versioning, SEBI SBEB variants.</w:t>
+      </w:r>
+    </w:p>
+    <w:p>
+      <w:pPr>
+        <w:pStyle w:val="Compact"/>
+        <w:numPr>
+          <w:ilvl w:val="0"/>
+          <w:numId w:val="1007"/>
+        </w:numPr>
+      </w:pPr>
+      <w:r>
+        <w:rPr>
+          <w:b/>
+          <w:bCs/>
+        </w:rPr>
+        <w:t xml:space="preserve">FR-D-2 (M)</w:t>
+      </w:r>
+      <w:r>
+        <w:t xml:space="preserve"> </w:t>
+      </w:r>
+      <w:r>
+        <w:t xml:space="preserve">◐ Grants.</w:t>
       </w:r>
       <w:r>
         <w:t xml:space="preserve"> </w:t>
@@ -2842,92 +2990,13 @@
           <w:i/>
           <w:iCs/>
         </w:rPr>
-        <w:t xml:space="preserve">(v1.4)</w:t>
-      </w:r>
-      <w:r>
-        <w:t xml:space="preserve"> </w:t>
-      </w:r>
-      <w:r>
-        <w:rPr>
-          <w:b/>
-          <w:bCs/>
-        </w:rPr>
-        <w:t xml:space="preserve">Three award types</w:t>
-      </w:r>
-      <w:r>
-        <w:t xml:space="preserve"> </w:t>
-      </w:r>
-      <w:r>
-        <w:t xml:space="preserve">on one vesting model (</w:t>
-      </w:r>
-      <w:r>
-        <w:rPr>
-          <w:rStyle w:val="VerbatimChar"/>
-        </w:rPr>
-        <w:t xml:space="preserve">grant_type</w:t>
-      </w:r>
-      <w:r>
-        <w:t xml:space="preserve">, Alembic</w:t>
-      </w:r>
-      <w:r>
-        <w:t xml:space="preserve"> </w:t>
-      </w:r>
-      <w:r>
-        <w:rPr>
-          <w:rStyle w:val="VerbatimChar"/>
-        </w:rPr>
-        <w:t xml:space="preserve">e1a3c5b7d9f0</w:t>
-      </w:r>
-      <w:r>
-        <w:t xml:space="preserve">):</w:t>
-      </w:r>
-      <w:r>
-        <w:t xml:space="preserve"> </w:t>
-      </w:r>
-      <w:r>
-        <w:rPr>
-          <w:b/>
-          <w:bCs/>
-        </w:rPr>
-        <w:t xml:space="preserve">options</w:t>
-      </w:r>
-      <w:r>
-        <w:t xml:space="preserve"> </w:t>
-      </w:r>
-      <w:r>
-        <w:t xml:space="preserve">(vest → exercise at strike; perquisite = FMV−strike at exercise),</w:t>
-      </w:r>
-      <w:r>
-        <w:t xml:space="preserve"> </w:t>
-      </w:r>
-      <w:r>
-        <w:rPr>
-          <w:b/>
-          <w:bCs/>
-        </w:rPr>
-        <w:t xml:space="preserve">RSUs</w:t>
-      </w:r>
-      <w:r>
-        <w:t xml:space="preserve"> </w:t>
-      </w:r>
-      <w:r>
-        <w:t xml:space="preserve">(no strike; vest → settle to shares for no consideration; perquisite = full FMV at settlement, per Sec 17(2) at vesting), and</w:t>
-      </w:r>
-      <w:r>
-        <w:t xml:space="preserve"> </w:t>
-      </w:r>
-      <w:r>
-        <w:rPr>
-          <w:b/>
-          <w:bCs/>
-        </w:rPr>
-        <w:t xml:space="preserve">RSAs</w:t>
-      </w:r>
-      <w:r>
-        <w:t xml:space="preserve"> </w:t>
-      </w:r>
-      <w:r>
-        <w:t xml:space="preserve">(shares issued upfront at grant, unvested portion subject to repurchase; perquisite = FMV−price at allotment).</w:t>
+        <w:t xml:space="preserve">Built:</w:t>
+      </w:r>
+      <w:r>
+        <w:t xml:space="preserve"> </w:t>
+      </w:r>
+      <w:r>
+        <w:t xml:space="preserve">per-employee grants, cliff + linear monthly vesting, time-based tracking.</w:t>
       </w:r>
       <w:r>
         <w:t xml:space="preserve"> </w:t>
@@ -2937,51 +3006,92 @@
           <w:i/>
           <w:iCs/>
         </w:rPr>
-        <w:t xml:space="preserve">Remaining:</w:t>
-      </w:r>
-      <w:r>
-        <w:t xml:space="preserve"> </w:t>
-      </w:r>
-      <w:r>
-        <w:t xml:space="preserve">grant letters, milestone vesting, acceleration on exit, RSA repurchase-on-exit automation.</w:t>
-      </w:r>
-    </w:p>
-    <w:p>
-      <w:pPr>
-        <w:pStyle w:val="Compact"/>
-        <w:numPr>
-          <w:ilvl w:val="0"/>
-          <w:numId w:val="1007"/>
-        </w:numPr>
-      </w:pPr>
-      <w:r>
-        <w:rPr>
-          <w:b/>
-          <w:bCs/>
-        </w:rPr>
-        <w:t xml:space="preserve">FR-D-3 (M)</w:t>
-      </w:r>
-      <w:r>
-        <w:t xml:space="preserve"> </w:t>
-      </w:r>
-      <w:r>
-        <w:t xml:space="preserve">✅ Employee self-service: portal shows granted/vested/exercised/exercisable, strike, current FMV and unrealised gain;</w:t>
-      </w:r>
-      <w:r>
-        <w:t xml:space="preserve"> </w:t>
-      </w:r>
-      <w:r>
-        <w:rPr>
-          <w:b/>
-          <w:bCs/>
-        </w:rPr>
-        <w:t xml:space="preserve">self-serve exercise requests</w:t>
-      </w:r>
-      <w:r>
-        <w:t xml:space="preserve"> </w:t>
-      </w:r>
-      <w:r>
-        <w:t xml:space="preserve">(v1.3) — employees request exercise in the portal (validated against vested-minus-exercised-minus-pending), the company approves into a chosen class (the real exercise lands on the ledger, perquisite computed) or rejects; perquisite (FMV − strike) computed on exercise.</w:t>
+        <w:t xml:space="preserve">(v1.4)</w:t>
+      </w:r>
+      <w:r>
+        <w:t xml:space="preserve"> </w:t>
+      </w:r>
+      <w:r>
+        <w:rPr>
+          <w:b/>
+          <w:bCs/>
+        </w:rPr>
+        <w:t xml:space="preserve">Three award types</w:t>
+      </w:r>
+      <w:r>
+        <w:t xml:space="preserve"> </w:t>
+      </w:r>
+      <w:r>
+        <w:t xml:space="preserve">on one vesting model (</w:t>
+      </w:r>
+      <w:r>
+        <w:rPr>
+          <w:rStyle w:val="VerbatimChar"/>
+        </w:rPr>
+        <w:t xml:space="preserve">grant_type</w:t>
+      </w:r>
+      <w:r>
+        <w:t xml:space="preserve">, Alembic</w:t>
+      </w:r>
+      <w:r>
+        <w:t xml:space="preserve"> </w:t>
+      </w:r>
+      <w:r>
+        <w:rPr>
+          <w:rStyle w:val="VerbatimChar"/>
+        </w:rPr>
+        <w:t xml:space="preserve">e1a3c5b7d9f0</w:t>
+      </w:r>
+      <w:r>
+        <w:t xml:space="preserve">):</w:t>
+      </w:r>
+      <w:r>
+        <w:t xml:space="preserve"> </w:t>
+      </w:r>
+      <w:r>
+        <w:rPr>
+          <w:b/>
+          <w:bCs/>
+        </w:rPr>
+        <w:t xml:space="preserve">options</w:t>
+      </w:r>
+      <w:r>
+        <w:t xml:space="preserve"> </w:t>
+      </w:r>
+      <w:r>
+        <w:t xml:space="preserve">(vest → exercise at strike; perquisite = FMV−strike at exercise),</w:t>
+      </w:r>
+      <w:r>
+        <w:t xml:space="preserve"> </w:t>
+      </w:r>
+      <w:r>
+        <w:rPr>
+          <w:b/>
+          <w:bCs/>
+        </w:rPr>
+        <w:t xml:space="preserve">RSUs</w:t>
+      </w:r>
+      <w:r>
+        <w:t xml:space="preserve"> </w:t>
+      </w:r>
+      <w:r>
+        <w:t xml:space="preserve">(no strike; vest → settle to shares for no consideration; perquisite = full FMV at settlement, per Sec 17(2) at vesting), and</w:t>
+      </w:r>
+      <w:r>
+        <w:t xml:space="preserve"> </w:t>
+      </w:r>
+      <w:r>
+        <w:rPr>
+          <w:b/>
+          <w:bCs/>
+        </w:rPr>
+        <w:t xml:space="preserve">RSAs</w:t>
+      </w:r>
+      <w:r>
+        <w:t xml:space="preserve"> </w:t>
+      </w:r>
+      <w:r>
+        <w:t xml:space="preserve">(shares issued upfront at grant, unvested portion subject to repurchase; perquisite = FMV−price at allotment).</w:t>
       </w:r>
       <w:r>
         <w:t xml:space="preserve"> </w:t>
@@ -2991,23 +3101,13 @@
           <w:i/>
           <w:iCs/>
         </w:rPr>
-        <w:t xml:space="preserve">(v1.3)</w:t>
-      </w:r>
-      <w:r>
-        <w:t xml:space="preserve"> </w:t>
-      </w:r>
-      <w:r>
-        <w:rPr>
-          <w:b/>
-          <w:bCs/>
-        </w:rPr>
-        <w:t xml:space="preserve">Vesting projection</w:t>
-      </w:r>
-      <w:r>
-        <w:t xml:space="preserve"> </w:t>
-      </w:r>
-      <w:r>
-        <w:t xml:space="preserve">— the portal equity view leads with vesting-progress %, a vested/unvested progress bar, the estimated 100%-vesting date, and the next scheduled vest events per grant.</w:t>
+        <w:t xml:space="preserve">Remaining:</w:t>
+      </w:r>
+      <w:r>
+        <w:t xml:space="preserve"> </w:t>
+      </w:r>
+      <w:r>
+        <w:t xml:space="preserve">grant letters, milestone vesting, acceleration on exit, RSA repurchase-on-exit automation.</w:t>
       </w:r>
     </w:p>
     <w:p>
@@ -3023,13 +3123,29 @@
           <w:b/>
           <w:bCs/>
         </w:rPr>
-        <w:t xml:space="preserve">FR-D-4 (P2)</w:t>
-      </w:r>
-      <w:r>
-        <w:t xml:space="preserve"> </w:t>
-      </w:r>
-      <w:r>
-        <w:t xml:space="preserve">◐</w:t>
+        <w:t xml:space="preserve">FR-D-3 (M)</w:t>
+      </w:r>
+      <w:r>
+        <w:t xml:space="preserve"> </w:t>
+      </w:r>
+      <w:r>
+        <w:t xml:space="preserve">✅ Employee self-service: portal shows granted/vested/exercised/exercisable, strike, current FMV and unrealised gain;</w:t>
+      </w:r>
+      <w:r>
+        <w:t xml:space="preserve"> </w:t>
+      </w:r>
+      <w:r>
+        <w:rPr>
+          <w:b/>
+          <w:bCs/>
+        </w:rPr>
+        <w:t xml:space="preserve">self-serve exercise requests</w:t>
+      </w:r>
+      <w:r>
+        <w:t xml:space="preserve"> </w:t>
+      </w:r>
+      <w:r>
+        <w:t xml:space="preserve">(v1.3) — employees request exercise in the portal (validated against vested-minus-exercised-minus-pending), the company approves into a chosen class (the real exercise lands on the ledger, perquisite computed) or rejects; perquisite (FMV − strike) computed on exercise.</w:t>
       </w:r>
       <w:r>
         <w:t xml:space="preserve"> </w:t>
@@ -3039,13 +3155,45 @@
           <w:i/>
           <w:iCs/>
         </w:rPr>
-        <w:t xml:space="preserve">(largely promoted)</w:t>
-      </w:r>
-      <w:r>
-        <w:t xml:space="preserve"> </w:t>
-      </w:r>
-      <w:r>
-        <w:t xml:space="preserve">Exercise.</w:t>
+        <w:t xml:space="preserve">(v1.3)</w:t>
+      </w:r>
+      <w:r>
+        <w:t xml:space="preserve"> </w:t>
+      </w:r>
+      <w:r>
+        <w:rPr>
+          <w:b/>
+          <w:bCs/>
+        </w:rPr>
+        <w:t xml:space="preserve">Vesting projection</w:t>
+      </w:r>
+      <w:r>
+        <w:t xml:space="preserve"> </w:t>
+      </w:r>
+      <w:r>
+        <w:t xml:space="preserve">— the portal equity view leads with vesting-progress %, a vested/unvested progress bar, the estimated 100%-vesting date, and the next scheduled vest events per grant.</w:t>
+      </w:r>
+    </w:p>
+    <w:p>
+      <w:pPr>
+        <w:pStyle w:val="Compact"/>
+        <w:numPr>
+          <w:ilvl w:val="0"/>
+          <w:numId w:val="1007"/>
+        </w:numPr>
+      </w:pPr>
+      <w:r>
+        <w:rPr>
+          <w:b/>
+          <w:bCs/>
+        </w:rPr>
+        <w:t xml:space="preserve">FR-D-4 (P2)</w:t>
+      </w:r>
+      <w:r>
+        <w:t xml:space="preserve"> </w:t>
+      </w:r>
+      <w:r>
+        <w:t xml:space="preserve">◐</w:t>
       </w:r>
       <w:r>
         <w:t xml:space="preserve"> </w:t>
@@ -3055,29 +3203,13 @@
           <w:i/>
           <w:iCs/>
         </w:rPr>
-        <w:t xml:space="preserve">Built:</w:t>
-      </w:r>
-      <w:r>
-        <w:t xml:space="preserve"> </w:t>
-      </w:r>
-      <w:r>
-        <w:t xml:space="preserve">exercise → cap-table issuance;</w:t>
-      </w:r>
-      <w:r>
-        <w:t xml:space="preserve"> </w:t>
-      </w:r>
-      <w:r>
-        <w:rPr>
-          <w:b/>
-          <w:bCs/>
-        </w:rPr>
-        <w:t xml:space="preserve">cashless exercise</w:t>
-      </w:r>
-      <w:r>
-        <w:t xml:space="preserve"> </w:t>
-      </w:r>
-      <w:r>
-        <w:t xml:space="preserve">(net shares after withholding to cover strike; gross consumed from grant).</w:t>
+        <w:t xml:space="preserve">(largely promoted)</w:t>
+      </w:r>
+      <w:r>
+        <w:t xml:space="preserve"> </w:t>
+      </w:r>
+      <w:r>
+        <w:t xml:space="preserve">Exercise.</w:t>
       </w:r>
       <w:r>
         <w:t xml:space="preserve"> </w:t>
@@ -3087,35 +3219,29 @@
           <w:i/>
           <w:iCs/>
         </w:rPr>
-        <w:t xml:space="preserve">Remaining:</w:t>
-      </w:r>
-      <w:r>
-        <w:t xml:space="preserve"> </w:t>
-      </w:r>
-      <w:r>
-        <w:t xml:space="preserve">loan-funded and leaver scenarios.</w:t>
-      </w:r>
-    </w:p>
-    <w:p>
-      <w:pPr>
-        <w:pStyle w:val="Compact"/>
-        <w:numPr>
-          <w:ilvl w:val="0"/>
-          <w:numId w:val="1007"/>
-        </w:numPr>
-      </w:pPr>
-      <w:r>
-        <w:rPr>
-          <w:b/>
-          <w:bCs/>
-        </w:rPr>
-        <w:t xml:space="preserve">FR-D-5 (P2)</w:t>
-      </w:r>
-      <w:r>
-        <w:t xml:space="preserve"> </w:t>
-      </w:r>
-      <w:r>
-        <w:t xml:space="preserve">✅</w:t>
+        <w:t xml:space="preserve">Built:</w:t>
+      </w:r>
+      <w:r>
+        <w:t xml:space="preserve"> </w:t>
+      </w:r>
+      <w:r>
+        <w:t xml:space="preserve">exercise → cap-table issuance;</w:t>
+      </w:r>
+      <w:r>
+        <w:t xml:space="preserve"> </w:t>
+      </w:r>
+      <w:r>
+        <w:rPr>
+          <w:b/>
+          <w:bCs/>
+        </w:rPr>
+        <w:t xml:space="preserve">cashless exercise</w:t>
+      </w:r>
+      <w:r>
+        <w:t xml:space="preserve"> </w:t>
+      </w:r>
+      <w:r>
+        <w:t xml:space="preserve">(net shares after withholding to cover strike; gross consumed from grant);</w:t>
       </w:r>
       <w:r>
         <w:t xml:space="preserve"> </w:t>
@@ -3125,6 +3251,79 @@
           <w:i/>
           <w:iCs/>
         </w:rPr>
+        <w:t xml:space="preserve">(v1.4)</w:t>
+      </w:r>
+      <w:r>
+        <w:t xml:space="preserve"> </w:t>
+      </w:r>
+      <w:r>
+        <w:rPr>
+          <w:b/>
+          <w:bCs/>
+        </w:rPr>
+        <w:t xml:space="preserve">exercise windows</w:t>
+      </w:r>
+      <w:r>
+        <w:t xml:space="preserve"> </w:t>
+      </w:r>
+      <w:r>
+        <w:t xml:space="preserve">— opt-in open/upcoming/closed periods (</w:t>
+      </w:r>
+      <w:r>
+        <w:rPr>
+          <w:rStyle w:val="VerbatimChar"/>
+        </w:rPr>
+        <w:t xml:space="preserve">exercise_windows</w:t>
+      </w:r>
+      <w:r>
+        <w:t xml:space="preserve">); once an entity defines any, exercise requests are gated to an open window, else unrestricted.</w:t>
+      </w:r>
+      <w:r>
+        <w:t xml:space="preserve"> </w:t>
+      </w:r>
+      <w:r>
+        <w:rPr>
+          <w:i/>
+          <w:iCs/>
+        </w:rPr>
+        <w:t xml:space="preserve">Remaining:</w:t>
+      </w:r>
+      <w:r>
+        <w:t xml:space="preserve"> </w:t>
+      </w:r>
+      <w:r>
+        <w:t xml:space="preserve">loan-funded and leaver scenarios.</w:t>
+      </w:r>
+    </w:p>
+    <w:p>
+      <w:pPr>
+        <w:pStyle w:val="Compact"/>
+        <w:numPr>
+          <w:ilvl w:val="0"/>
+          <w:numId w:val="1007"/>
+        </w:numPr>
+      </w:pPr>
+      <w:r>
+        <w:rPr>
+          <w:b/>
+          <w:bCs/>
+        </w:rPr>
+        <w:t xml:space="preserve">FR-D-5 (P2)</w:t>
+      </w:r>
+      <w:r>
+        <w:t xml:space="preserve"> </w:t>
+      </w:r>
+      <w:r>
+        <w:t xml:space="preserve">✅</w:t>
+      </w:r>
+      <w:r>
+        <w:t xml:space="preserve"> </w:t>
+      </w:r>
+      <w:r>
+        <w:rPr>
+          <w:i/>
+          <w:iCs/>
+        </w:rPr>
         <w:t xml:space="preserve">(promoted — implemented)</w:t>
       </w:r>
       <w:r>
@@ -3153,7 +3352,90 @@
         <w:t xml:space="preserve"> </w:t>
       </w:r>
       <w:r>
-        <w:t xml:space="preserve">○ Option-holder buyback / liquidity events.</w:t>
+        <w:t xml:space="preserve">✅</w:t>
+      </w:r>
+      <w:r>
+        <w:t xml:space="preserve"> </w:t>
+      </w:r>
+      <w:r>
+        <w:rPr>
+          <w:i/>
+          <w:iCs/>
+        </w:rPr>
+        <w:t xml:space="preserve">(v1.4)</w:t>
+      </w:r>
+      <w:r>
+        <w:t xml:space="preserve"> </w:t>
+      </w:r>
+      <w:r>
+        <w:t xml:space="preserve">Option-holder buyback / liquidity events — see</w:t>
+      </w:r>
+      <w:r>
+        <w:t xml:space="preserve"> </w:t>
+      </w:r>
+      <w:r>
+        <w:rPr>
+          <w:b/>
+          <w:bCs/>
+        </w:rPr>
+        <w:t xml:space="preserve">FR-C-13</w:t>
+      </w:r>
+      <w:r>
+        <w:t xml:space="preserve"> </w:t>
+      </w:r>
+      <w:r>
+        <w:t xml:space="preserve">(company-run buyback/tender windows; holders tender vested shares, settlement writes cap-table buybacks).</w:t>
+      </w:r>
+    </w:p>
+    <w:p>
+      <w:pPr>
+        <w:pStyle w:val="Compact"/>
+        <w:numPr>
+          <w:ilvl w:val="0"/>
+          <w:numId w:val="1007"/>
+        </w:numPr>
+      </w:pPr>
+      <w:r>
+        <w:rPr>
+          <w:b/>
+          <w:bCs/>
+        </w:rPr>
+        <w:t xml:space="preserve">FR-D-7 (M — added v1.4, recurring competitor gap)</w:t>
+      </w:r>
+      <w:r>
+        <w:t xml:space="preserve"> </w:t>
+      </w:r>
+      <w:r>
+        <w:t xml:space="preserve">✅</w:t>
+      </w:r>
+      <w:r>
+        <w:t xml:space="preserve"> </w:t>
+      </w:r>
+      <w:r>
+        <w:rPr>
+          <w:b/>
+          <w:bCs/>
+        </w:rPr>
+        <w:t xml:space="preserve">Share-based-payment expense (Ind AS 102)</w:t>
+      </w:r>
+      <w:r>
+        <w:t xml:space="preserve">: grant-date fair value — Black-Scholes for options (spot = FMV at grant + user-supplied volatility / risk-free rate / expected life / dividend yield), full FMV for RSUs/RSAs — amortised straight-line over the vesting term, aggregated per Indian financial year, with recognised-to-date vs unrecognised totals and an expense-report document. Grants with no FMV at grant date are surfaced as unpriced.</w:t>
+      </w:r>
+      <w:r>
+        <w:t xml:space="preserve"> </w:t>
+      </w:r>
+      <w:r>
+        <w:rPr>
+          <w:i/>
+          <w:iCs/>
+        </w:rPr>
+        <w:t xml:space="preserve">Remaining:</w:t>
+      </w:r>
+      <w:r>
+        <w:t xml:space="preserve"> </w:t>
+      </w:r>
+      <w:r>
+        <w:t xml:space="preserve">forfeiture true-ups, graded per-tranche curves.</w:t>
       </w:r>
     </w:p>
     <w:bookmarkEnd w:id="22"/>
@@ -5455,13 +5737,58 @@
           <w:b/>
           <w:bCs/>
         </w:rPr>
-        <w:t xml:space="preserve">FR-J-9 (P2)</w:t>
+        <w:t xml:space="preserve">FR-J-11 (M — added v1.4, Mantle gap)</w:t>
       </w:r>
       <w:r>
         <w:t xml:space="preserve"> </w:t>
       </w:r>
       <w:r>
         <w:t xml:space="preserve">✅</w:t>
+      </w:r>
+      <w:r>
+        <w:t xml:space="preserve"> </w:t>
+      </w:r>
+      <w:r>
+        <w:rPr>
+          <w:b/>
+          <w:bCs/>
+        </w:rPr>
+        <w:t xml:space="preserve">Schedule of Investments &amp; LP look-through</w:t>
+      </w:r>
+      <w:r>
+        <w:t xml:space="preserve">: a GP-facing</w:t>
+      </w:r>
+      <w:r>
+        <w:t xml:space="preserve"> </w:t>
+      </w:r>
+      <w:r>
+        <w:rPr>
+          <w:b/>
+          <w:bCs/>
+        </w:rPr>
+        <w:t xml:space="preserve">SOI</w:t>
+      </w:r>
+      <w:r>
+        <w:t xml:space="preserve"> </w:t>
+      </w:r>
+      <w:r>
+        <w:t xml:space="preserve">— per holding cost, fair-value mark, MOIC, unrealised gain and % of NAV, with portfolio totals and a generated SOI statement document; and LP-facing</w:t>
+      </w:r>
+      <w:r>
+        <w:t xml:space="preserve"> </w:t>
+      </w:r>
+      <w:r>
+        <w:rPr>
+          <w:b/>
+          <w:bCs/>
+        </w:rPr>
+        <w:t xml:space="preserve">look-through</w:t>
+      </w:r>
+      <w:r>
+        <w:t xml:space="preserve"> </w:t>
+      </w:r>
+      <w:r>
+        <w:t xml:space="preserve">in the portal — each LP's pro-rata slice (paid-in share, falling back to commitment share) of every underlying holding at the fund's own marks, so an LP sees</w:t>
       </w:r>
       <w:r>
         <w:t xml:space="preserve"> </w:t>
@@ -5471,6 +5798,60 @@
           <w:i/>
           <w:iCs/>
         </w:rPr>
+        <w:t xml:space="preserve">through</w:t>
+      </w:r>
+      <w:r>
+        <w:t xml:space="preserve"> </w:t>
+      </w:r>
+      <w:r>
+        <w:t xml:space="preserve">their fund position to the companies it exposes them to. Uses the fund's reported marks only — no portfolio-company privacy boundary crossed.</w:t>
+      </w:r>
+      <w:r>
+        <w:t xml:space="preserve"> </w:t>
+      </w:r>
+      <w:r>
+        <w:rPr>
+          <w:i/>
+          <w:iCs/>
+        </w:rPr>
+        <w:t xml:space="preserve">Remaining:</w:t>
+      </w:r>
+      <w:r>
+        <w:t xml:space="preserve"> </w:t>
+      </w:r>
+      <w:r>
+        <w:t xml:space="preserve">multi-level fund-of-funds look-through (one level today).</w:t>
+      </w:r>
+    </w:p>
+    <w:p>
+      <w:pPr>
+        <w:pStyle w:val="Compact"/>
+        <w:numPr>
+          <w:ilvl w:val="0"/>
+          <w:numId w:val="1013"/>
+        </w:numPr>
+      </w:pPr>
+      <w:r>
+        <w:rPr>
+          <w:b/>
+          <w:bCs/>
+        </w:rPr>
+        <w:t xml:space="preserve">FR-J-9 (P2)</w:t>
+      </w:r>
+      <w:r>
+        <w:t xml:space="preserve"> </w:t>
+      </w:r>
+      <w:r>
+        <w:t xml:space="preserve">✅</w:t>
+      </w:r>
+      <w:r>
+        <w:t xml:space="preserve"> </w:t>
+      </w:r>
+      <w:r>
+        <w:rPr>
+          <w:i/>
+          <w:iCs/>
+        </w:rPr>
         <w:t xml:space="preserve">(promoted — implemented)</w:t>
       </w:r>
       <w:r>
@@ -5640,13 +6021,99 @@
           <w:b/>
           <w:bCs/>
         </w:rPr>
-        <w:t xml:space="preserve">FR-K-3 (P2)</w:t>
-      </w:r>
-      <w:r>
-        <w:t xml:space="preserve"> </w:t>
-      </w:r>
-      <w:r>
-        <w:t xml:space="preserve">◐ Self-service documents: shared data-room documents listed in the portal (expiry-enforced).</w:t>
+        <w:t xml:space="preserve">FR-K-3 (M — added v1.4, Ledgy gap)</w:t>
+      </w:r>
+      <w:r>
+        <w:t xml:space="preserve"> </w:t>
+      </w:r>
+      <w:r>
+        <w:t xml:space="preserve">✅</w:t>
+      </w:r>
+      <w:r>
+        <w:t xml:space="preserve"> </w:t>
+      </w:r>
+      <w:r>
+        <w:rPr>
+          <w:b/>
+          <w:bCs/>
+        </w:rPr>
+        <w:t xml:space="preserve">Employee equity views</w:t>
+      </w:r>
+      <w:r>
+        <w:t xml:space="preserve">: an</w:t>
+      </w:r>
+      <w:r>
+        <w:t xml:space="preserve"> </w:t>
+      </w:r>
+      <w:r>
+        <w:rPr>
+          <w:b/>
+          <w:bCs/>
+        </w:rPr>
+        <w:t xml:space="preserve">equity hero</w:t>
+      </w:r>
+      <w:r>
+        <w:t xml:space="preserve"> </w:t>
+      </w:r>
+      <w:r>
+        <w:t xml:space="preserve">framing the portal ESOP section — today's value (vested units at intrinsic value for options, full FMV for RSUs/RSAs), max potential value of the whole grant, a vested/unvested bar, and next-vest / fully-vested dates; and a</w:t>
+      </w:r>
+      <w:r>
+        <w:t xml:space="preserve"> </w:t>
+      </w:r>
+      <w:r>
+        <w:rPr>
+          <w:b/>
+          <w:bCs/>
+        </w:rPr>
+        <w:t xml:space="preserve">per-grant detail</w:t>
+      </w:r>
+      <w:r>
+        <w:t xml:space="preserve"> </w:t>
+      </w:r>
+      <w:r>
+        <w:t xml:space="preserve">(</w:t>
+      </w:r>
+      <w:r>
+        <w:rPr>
+          <w:rStyle w:val="VerbatimChar"/>
+        </w:rPr>
+        <w:t xml:space="preserve">GET /portal/grants/{id}/detail</w:t>
+      </w:r>
+      <w:r>
+        <w:t xml:space="preserve">, own-grant only) with three value stats, a</w:t>
+      </w:r>
+      <w:r>
+        <w:t xml:space="preserve"> </w:t>
+      </w:r>
+      <w:r>
+        <w:rPr>
+          <w:b/>
+          <w:bCs/>
+        </w:rPr>
+        <w:t xml:space="preserve">vesting-status segment bar</w:t>
+      </w:r>
+      <w:r>
+        <w:t xml:space="preserve"> </w:t>
+      </w:r>
+      <w:r>
+        <w:t xml:space="preserve">(exercised/settled · vested · unvested) and a</w:t>
+      </w:r>
+      <w:r>
+        <w:t xml:space="preserve"> </w:t>
+      </w:r>
+      <w:r>
+        <w:rPr>
+          <w:b/>
+          <w:bCs/>
+        </w:rPr>
+        <w:t xml:space="preserve">vesting timeline</w:t>
+      </w:r>
+      <w:r>
+        <w:t xml:space="preserve"> </w:t>
+      </w:r>
+      <w:r>
+        <w:t xml:space="preserve">(start → past events collapsed → a</w:t>
       </w:r>
       <w:r>
         <w:t xml:space="preserve"> </w:t>
@@ -5656,13 +6123,13 @@
           <w:i/>
           <w:iCs/>
         </w:rPr>
-        <w:t xml:space="preserve">Remaining:</w:t>
-      </w:r>
-      <w:r>
-        <w:t xml:space="preserve"> </w:t>
-      </w:r>
-      <w:r>
-        <w:t xml:space="preserve">statements/certificates/tax-doc downloads.</w:t>
+        <w:t xml:space="preserve">today</w:t>
+      </w:r>
+      <w:r>
+        <w:t xml:space="preserve"> </w:t>
+      </w:r>
+      <w:r>
+        <w:t xml:space="preserve">marker → upcoming events → fully vested) from a computed month-by-month schedule.</w:t>
       </w:r>
     </w:p>
     <w:p>
@@ -5678,13 +6145,13 @@
           <w:b/>
           <w:bCs/>
         </w:rPr>
-        <w:t xml:space="preserve">FR-K-4 (P2)</w:t>
-      </w:r>
-      <w:r>
-        <w:t xml:space="preserve"> </w:t>
-      </w:r>
-      <w:r>
-        <w:t xml:space="preserve">◐ Q&amp;A: data-room diligence Q&amp;A.</w:t>
+        <w:t xml:space="preserve">FR-K-3 (P2)</w:t>
+      </w:r>
+      <w:r>
+        <w:t xml:space="preserve"> </w:t>
+      </w:r>
+      <w:r>
+        <w:t xml:space="preserve">◐ Self-service documents: shared data-room documents listed in the portal (expiry-enforced).</w:t>
       </w:r>
       <w:r>
         <w:t xml:space="preserve"> </w:t>
@@ -5700,6 +6167,44 @@
         <w:t xml:space="preserve"> </w:t>
       </w:r>
       <w:r>
+        <w:t xml:space="preserve">statements/certificates/tax-doc downloads.</w:t>
+      </w:r>
+    </w:p>
+    <w:p>
+      <w:pPr>
+        <w:pStyle w:val="Compact"/>
+        <w:numPr>
+          <w:ilvl w:val="0"/>
+          <w:numId w:val="1014"/>
+        </w:numPr>
+      </w:pPr>
+      <w:r>
+        <w:rPr>
+          <w:b/>
+          <w:bCs/>
+        </w:rPr>
+        <w:t xml:space="preserve">FR-K-4 (P2)</w:t>
+      </w:r>
+      <w:r>
+        <w:t xml:space="preserve"> </w:t>
+      </w:r>
+      <w:r>
+        <w:t xml:space="preserve">◐ Q&amp;A: data-room diligence Q&amp;A.</w:t>
+      </w:r>
+      <w:r>
+        <w:t xml:space="preserve"> </w:t>
+      </w:r>
+      <w:r>
+        <w:rPr>
+          <w:i/>
+          <w:iCs/>
+        </w:rPr>
+        <w:t xml:space="preserve">Remaining:</w:t>
+      </w:r>
+      <w:r>
+        <w:t xml:space="preserve"> </w:t>
+      </w:r>
+      <w:r>
         <w:t xml:space="preserve">general secure messaging.</w:t>
       </w:r>
     </w:p>
@@ -5822,6 +6327,71 @@
       </w:r>
       <w:r>
         <w:t xml:space="preserve">: Form 64C generated per LP from the FY's distribution ledger (auto-visible in the LP portal beside statements) and fund-level Form 64D, per section 115UB / rule 12CB.</w:t>
+      </w:r>
+    </w:p>
+    <w:p>
+      <w:pPr>
+        <w:pStyle w:val="Compact"/>
+        <w:numPr>
+          <w:ilvl w:val="0"/>
+          <w:numId w:val="1014"/>
+        </w:numPr>
+      </w:pPr>
+      <w:r>
+        <w:rPr>
+          <w:b/>
+          <w:bCs/>
+        </w:rPr>
+        <w:t xml:space="preserve">FR-K-8 (M — added v1.4, trica gap)</w:t>
+      </w:r>
+      <w:r>
+        <w:t xml:space="preserve"> </w:t>
+      </w:r>
+      <w:r>
+        <w:t xml:space="preserve">✅</w:t>
+      </w:r>
+      <w:r>
+        <w:t xml:space="preserve"> </w:t>
+      </w:r>
+      <w:r>
+        <w:rPr>
+          <w:b/>
+          <w:bCs/>
+        </w:rPr>
+        <w:t xml:space="preserve">Periodic investor report</w:t>
+      </w:r>
+      <w:r>
+        <w:t xml:space="preserve">: a live metrics snapshot assembled from the entity's own records (shares issued, stakeholders, capital raised, current FMV, open rounds, options granted, cash/burn/runway, overdue compliance) combined with founder-entered highlights into a generated report document, shareable via a data room.</w:t>
+      </w:r>
+      <w:r>
+        <w:t xml:space="preserve"> </w:t>
+      </w:r>
+      <w:r>
+        <w:rPr>
+          <w:rStyle w:val="VerbatimChar"/>
+        </w:rPr>
+        <w:t xml:space="preserve">GET /investor-report/preview</w:t>
+      </w:r>
+      <w:r>
+        <w:t xml:space="preserve"> </w:t>
+      </w:r>
+      <w:r>
+        <w:t xml:space="preserve">for the metrics;</w:t>
+      </w:r>
+      <w:r>
+        <w:t xml:space="preserve"> </w:t>
+      </w:r>
+      <w:r>
+        <w:rPr>
+          <w:rStyle w:val="VerbatimChar"/>
+        </w:rPr>
+        <w:t xml:space="preserve">POST /investor-reports</w:t>
+      </w:r>
+      <w:r>
+        <w:t xml:space="preserve"> </w:t>
+      </w:r>
+      <w:r>
+        <w:t xml:space="preserve">to generate.</w:t>
       </w:r>
     </w:p>
     <w:bookmarkEnd w:id="29"/>
@@ -15026,6 +15596,704 @@
       </w:r>
       <w:r>
         <w:t xml:space="preserve">template). 209 backend tests.</w:t>
+      </w:r>
+    </w:p>
+    <w:p>
+      <w:pPr>
+        <w:pStyle w:val="Compact"/>
+        <w:numPr>
+          <w:ilvl w:val="0"/>
+          <w:numId w:val="1030"/>
+        </w:numPr>
+      </w:pPr>
+      <w:r>
+        <w:rPr>
+          <w:b/>
+          <w:bCs/>
+        </w:rPr>
+        <w:t xml:space="preserve">Visual-language pass</w:t>
+      </w:r>
+      <w:r>
+        <w:t xml:space="preserve"> </w:t>
+      </w:r>
+      <w:r>
+        <w:t xml:space="preserve">(2026-07-16, cross-competitor inspiration, presentation-only): reusable primitives to move surfaces beyond bare tables/numbers —</w:t>
+      </w:r>
+      <w:r>
+        <w:t xml:space="preserve"> </w:t>
+      </w:r>
+      <w:r>
+        <w:rPr>
+          <w:b/>
+          <w:bCs/>
+        </w:rPr>
+        <w:t xml:space="preserve">EmptyState</w:t>
+      </w:r>
+      <w:r>
+        <w:t xml:space="preserve"> </w:t>
+      </w:r>
+      <w:r>
+        <w:t xml:space="preserve">(icon + title + hint + action) replacing "No X yet." across Cap Table, ESOP, Documents, Team, Investors, Data Room and Diligence;</w:t>
+      </w:r>
+      <w:r>
+        <w:t xml:space="preserve"> </w:t>
+      </w:r>
+      <w:r>
+        <w:rPr>
+          <w:b/>
+          <w:bCs/>
+        </w:rPr>
+        <w:t xml:space="preserve">ProgressRing</w:t>
+      </w:r>
+      <w:r>
+        <w:t xml:space="preserve"> </w:t>
+      </w:r>
+      <w:r>
+        <w:t xml:space="preserve">circular gauges for the diligence readiness score and compliance health;</w:t>
+      </w:r>
+      <w:r>
+        <w:t xml:space="preserve"> </w:t>
+      </w:r>
+      <w:r>
+        <w:rPr>
+          <w:b/>
+          <w:bCs/>
+        </w:rPr>
+        <w:t xml:space="preserve">BarChart</w:t>
+      </w:r>
+      <w:r>
+        <w:t xml:space="preserve"> </w:t>
+      </w:r>
+      <w:r>
+        <w:t xml:space="preserve">rendering the liquidation waterfall as horizontal payout bars instead of a number table;</w:t>
+      </w:r>
+      <w:r>
+        <w:t xml:space="preserve"> </w:t>
+      </w:r>
+      <w:r>
+        <w:rPr>
+          <w:b/>
+          <w:bCs/>
+        </w:rPr>
+        <w:t xml:space="preserve">PageHeader</w:t>
+      </w:r>
+      <w:r>
+        <w:t xml:space="preserve"> </w:t>
+      </w:r>
+      <w:r>
+        <w:t xml:space="preserve">(icon · title · subtitle · action) on the Team tab; and</w:t>
+      </w:r>
+      <w:r>
+        <w:t xml:space="preserve"> </w:t>
+      </w:r>
+      <w:r>
+        <w:rPr>
+          <w:b/>
+          <w:bCs/>
+        </w:rPr>
+        <w:t xml:space="preserve">metric icons</w:t>
+      </w:r>
+      <w:r>
+        <w:t xml:space="preserve"> </w:t>
+      </w:r>
+      <w:r>
+        <w:t xml:space="preserve">on</w:t>
+      </w:r>
+      <w:r>
+        <w:t xml:space="preserve"> </w:t>
+      </w:r>
+      <w:r>
+        <w:rPr>
+          <w:rStyle w:val="VerbatimChar"/>
+        </w:rPr>
+        <w:t xml:space="preserve">Stat</w:t>
+      </w:r>
+      <w:r>
+        <w:t xml:space="preserve"> </w:t>
+      </w:r>
+      <w:r>
+        <w:t xml:space="preserve">cards (ESOP overview). No backend/schema change.</w:t>
+      </w:r>
+    </w:p>
+    <w:p>
+      <w:pPr>
+        <w:pStyle w:val="Compact"/>
+        <w:numPr>
+          <w:ilvl w:val="0"/>
+          <w:numId w:val="1030"/>
+        </w:numPr>
+      </w:pPr>
+      <w:r>
+        <w:rPr>
+          <w:b/>
+          <w:bCs/>
+        </w:rPr>
+        <w:t xml:space="preserve">trica visual batch</w:t>
+      </w:r>
+      <w:r>
+        <w:t xml:space="preserve"> </w:t>
+      </w:r>
+      <w:r>
+        <w:t xml:space="preserve">(2026-07-16):</w:t>
+      </w:r>
+      <w:r>
+        <w:t xml:space="preserve"> </w:t>
+      </w:r>
+      <w:r>
+        <w:rPr>
+          <w:b/>
+          <w:bCs/>
+        </w:rPr>
+        <w:t xml:space="preserve">ESOP overview dashboard</w:t>
+      </w:r>
+      <w:r>
+        <w:t xml:space="preserve"> </w:t>
+      </w:r>
+      <w:r>
+        <w:t xml:space="preserve">(FR-D-1) atop the ESOP tab — pool-usage hero stats, option-state tiles (vested/exercised/exercisable/unvested), a pool-composition donut and a top-grants leaderboard, from a read-only</w:t>
+      </w:r>
+      <w:r>
+        <w:t xml:space="preserve"> </w:t>
+      </w:r>
+      <w:r>
+        <w:rPr>
+          <w:rStyle w:val="VerbatimChar"/>
+        </w:rPr>
+        <w:t xml:space="preserve">GET /esop/overview</w:t>
+      </w:r>
+      <w:r>
+        <w:t xml:space="preserve"> </w:t>
+      </w:r>
+      <w:r>
+        <w:t xml:space="preserve">aggregation; and</w:t>
+      </w:r>
+      <w:r>
+        <w:t xml:space="preserve"> </w:t>
+      </w:r>
+      <w:r>
+        <w:rPr>
+          <w:b/>
+          <w:bCs/>
+        </w:rPr>
+        <w:t xml:space="preserve">info tooltips</w:t>
+      </w:r>
+      <w:r>
+        <w:t xml:space="preserve"> </w:t>
+      </w:r>
+      <w:r>
+        <w:t xml:space="preserve">on stat cards (</w:t>
+      </w:r>
+      <w:r>
+        <w:rPr>
+          <w:rStyle w:val="VerbatimChar"/>
+        </w:rPr>
+        <w:t xml:space="preserve">Stat</w:t>
+      </w:r>
+      <w:r>
+        <w:t xml:space="preserve"> </w:t>
+      </w:r>
+      <w:r>
+        <w:t xml:space="preserve">gained an optional</w:t>
+      </w:r>
+      <w:r>
+        <w:t xml:space="preserve"> </w:t>
+      </w:r>
+      <w:r>
+        <w:rPr>
+          <w:rStyle w:val="VerbatimChar"/>
+        </w:rPr>
+        <w:t xml:space="preserve">hint</w:t>
+      </w:r>
+      <w:r>
+        <w:t xml:space="preserve">, applied across the Dashboard, Portal and ESOP overview). No schema change. 261 backend tests.</w:t>
+      </w:r>
+    </w:p>
+    <w:p>
+      <w:pPr>
+        <w:pStyle w:val="Compact"/>
+        <w:numPr>
+          <w:ilvl w:val="0"/>
+          <w:numId w:val="1030"/>
+        </w:numPr>
+      </w:pPr>
+      <w:r>
+        <w:rPr>
+          <w:b/>
+          <w:bCs/>
+        </w:rPr>
+        <w:t xml:space="preserve">trica functional batch</w:t>
+      </w:r>
+      <w:r>
+        <w:t xml:space="preserve"> </w:t>
+      </w:r>
+      <w:r>
+        <w:t xml:space="preserve">(2026-07-16):</w:t>
+      </w:r>
+      <w:r>
+        <w:t xml:space="preserve"> </w:t>
+      </w:r>
+      <w:r>
+        <w:rPr>
+          <w:b/>
+          <w:bCs/>
+        </w:rPr>
+        <w:t xml:space="preserve">Ind AS 102 ESOP expense report</w:t>
+      </w:r>
+      <w:r>
+        <w:t xml:space="preserve"> </w:t>
+      </w:r>
+      <w:r>
+        <w:t xml:space="preserve">(new FR-D-7 ✅) — grant-date fair value (Black-Scholes for options, full FMV for RSU/RSA) amortised straight-line over vesting, aggregated by Indian financial year, with recognised/unrecognised totals and a generated report document (</w:t>
+      </w:r>
+      <w:r>
+        <w:rPr>
+          <w:rStyle w:val="VerbatimChar"/>
+        </w:rPr>
+        <w:t xml:space="preserve">services/sbp.py</w:t>
+      </w:r>
+      <w:r>
+        <w:t xml:space="preserve">,</w:t>
+      </w:r>
+      <w:r>
+        <w:t xml:space="preserve"> </w:t>
+      </w:r>
+      <w:r>
+        <w:rPr>
+          <w:rStyle w:val="VerbatimChar"/>
+        </w:rPr>
+        <w:t xml:space="preserve">esop_expense</w:t>
+      </w:r>
+      <w:r>
+        <w:t xml:space="preserve"> </w:t>
+      </w:r>
+      <w:r>
+        <w:t xml:space="preserve">template; the fifth competitor to flag SBP expensing);</w:t>
+      </w:r>
+      <w:r>
+        <w:t xml:space="preserve"> </w:t>
+      </w:r>
+      <w:r>
+        <w:rPr>
+          <w:b/>
+          <w:bCs/>
+        </w:rPr>
+        <w:t xml:space="preserve">periodic investor report</w:t>
+      </w:r>
+      <w:r>
+        <w:t xml:space="preserve"> </w:t>
+      </w:r>
+      <w:r>
+        <w:t xml:space="preserve">(new FR-K-8 ✅) — live metrics snapshot (cap table, valuation, runway, compliance) + founder highlights → report document (</w:t>
+      </w:r>
+      <w:r>
+        <w:rPr>
+          <w:rStyle w:val="VerbatimChar"/>
+        </w:rPr>
+        <w:t xml:space="preserve">services/reporting.py</w:t>
+      </w:r>
+      <w:r>
+        <w:t xml:space="preserve">, reuses the dashboard + runway services);</w:t>
+      </w:r>
+      <w:r>
+        <w:t xml:space="preserve"> </w:t>
+      </w:r>
+      <w:r>
+        <w:rPr>
+          <w:b/>
+          <w:bCs/>
+        </w:rPr>
+        <w:t xml:space="preserve">ESOP adoption pack</w:t>
+      </w:r>
+      <w:r>
+        <w:t xml:space="preserve"> </w:t>
+      </w:r>
+      <w:r>
+        <w:t xml:space="preserve">(FR-D-1) — one-click board resolution + EGM notice (s.62(1)(b) special resolution) + ESOP policy (</w:t>
+      </w:r>
+      <w:r>
+        <w:rPr>
+          <w:rStyle w:val="VerbatimChar"/>
+        </w:rPr>
+        <w:t xml:space="preserve">esop.generate_scheme_pack</w:t>
+      </w:r>
+      <w:r>
+        <w:t xml:space="preserve">,</w:t>
+      </w:r>
+      <w:r>
+        <w:t xml:space="preserve"> </w:t>
+      </w:r>
+      <w:r>
+        <w:rPr>
+          <w:rStyle w:val="VerbatimChar"/>
+        </w:rPr>
+        <w:t xml:space="preserve">esop_egm_notice</w:t>
+      </w:r>
+      <w:r>
+        <w:t xml:space="preserve">/</w:t>
+      </w:r>
+      <w:r>
+        <w:rPr>
+          <w:rStyle w:val="VerbatimChar"/>
+        </w:rPr>
+        <w:t xml:space="preserve">esop_policy</w:t>
+      </w:r>
+      <w:r>
+        <w:t xml:space="preserve"> </w:t>
+      </w:r>
+      <w:r>
+        <w:t xml:space="preserve">templates). No schema change (all document-generation over existing data). 259 backend tests.</w:t>
+      </w:r>
+    </w:p>
+    <w:p>
+      <w:pPr>
+        <w:pStyle w:val="Compact"/>
+        <w:numPr>
+          <w:ilvl w:val="0"/>
+          <w:numId w:val="1030"/>
+        </w:numPr>
+      </w:pPr>
+      <w:r>
+        <w:rPr>
+          <w:b/>
+          <w:bCs/>
+        </w:rPr>
+        <w:t xml:space="preserve">Ledgy functional batch</w:t>
+      </w:r>
+      <w:r>
+        <w:t xml:space="preserve"> </w:t>
+      </w:r>
+      <w:r>
+        <w:t xml:space="preserve">(2026-07-16):</w:t>
+      </w:r>
+      <w:r>
+        <w:t xml:space="preserve"> </w:t>
+      </w:r>
+      <w:r>
+        <w:rPr>
+          <w:b/>
+          <w:bCs/>
+        </w:rPr>
+        <w:t xml:space="preserve">exercise windows</w:t>
+      </w:r>
+      <w:r>
+        <w:t xml:space="preserve"> </w:t>
+      </w:r>
+      <w:r>
+        <w:t xml:space="preserve">(FR-D-4) — opt-in open/upcoming/closed periods (</w:t>
+      </w:r>
+      <w:r>
+        <w:rPr>
+          <w:rStyle w:val="VerbatimChar"/>
+        </w:rPr>
+        <w:t xml:space="preserve">exercise_windows</w:t>
+      </w:r>
+      <w:r>
+        <w:t xml:space="preserve">) that gate exercise requests once defined; and</w:t>
+      </w:r>
+      <w:r>
+        <w:t xml:space="preserve"> </w:t>
+      </w:r>
+      <w:r>
+        <w:rPr>
+          <w:b/>
+          <w:bCs/>
+        </w:rPr>
+        <w:t xml:space="preserve">company liquidity / buyback-tender windows</w:t>
+      </w:r>
+      <w:r>
+        <w:t xml:space="preserve"> </w:t>
+      </w:r>
+      <w:r>
+        <w:t xml:space="preserve">(new FR-C-13 ✅) —</w:t>
+      </w:r>
+      <w:r>
+        <w:t xml:space="preserve"> </w:t>
+      </w:r>
+      <w:r>
+        <w:rPr>
+          <w:rStyle w:val="VerbatimChar"/>
+        </w:rPr>
+        <w:t xml:space="preserve">liquidity_events</w:t>
+      </w:r>
+      <w:r>
+        <w:t xml:space="preserve"> </w:t>
+      </w:r>
+      <w:r>
+        <w:t xml:space="preserve">+</w:t>
+      </w:r>
+      <w:r>
+        <w:t xml:space="preserve"> </w:t>
+      </w:r>
+      <w:r>
+        <w:rPr>
+          <w:rStyle w:val="VerbatimChar"/>
+        </w:rPr>
+        <w:t xml:space="preserve">tenders</w:t>
+      </w:r>
+      <w:r>
+        <w:t xml:space="preserve">: admin opens a fixed-price window, holders tender from the portal, settlement writes cap-table buybacks; Alembic</w:t>
+      </w:r>
+      <w:r>
+        <w:t xml:space="preserve"> </w:t>
+      </w:r>
+      <w:r>
+        <w:rPr>
+          <w:rStyle w:val="VerbatimChar"/>
+        </w:rPr>
+        <w:t xml:space="preserve">f3c5e7a9b1d2</w:t>
+      </w:r>
+      <w:r>
+        <w:t xml:space="preserve">, new routes/models</w:t>
+      </w:r>
+      <w:r>
+        <w:t xml:space="preserve"> </w:t>
+      </w:r>
+      <w:r>
+        <w:rPr>
+          <w:rStyle w:val="VerbatimChar"/>
+        </w:rPr>
+        <w:t xml:space="preserve">liquidity</w:t>
+      </w:r>
+      <w:r>
+        <w:t xml:space="preserve">, Esop exercise-windows card, CapTableHub</w:t>
+      </w:r>
+      <w:r>
+        <w:t xml:space="preserve"> </w:t>
+      </w:r>
+      <w:r>
+        <w:rPr>
+          <w:b/>
+          <w:bCs/>
+        </w:rPr>
+        <w:t xml:space="preserve">Liquidity</w:t>
+      </w:r>
+      <w:r>
+        <w:t xml:space="preserve"> </w:t>
+      </w:r>
+      <w:r>
+        <w:t xml:space="preserve">sub-tab, portal tender UI. 252 backend tests.</w:t>
+      </w:r>
+    </w:p>
+    <w:p>
+      <w:pPr>
+        <w:pStyle w:val="Compact"/>
+        <w:numPr>
+          <w:ilvl w:val="0"/>
+          <w:numId w:val="1030"/>
+        </w:numPr>
+      </w:pPr>
+      <w:r>
+        <w:rPr>
+          <w:b/>
+          <w:bCs/>
+        </w:rPr>
+        <w:t xml:space="preserve">Ledgy visual batch</w:t>
+      </w:r>
+      <w:r>
+        <w:t xml:space="preserve"> </w:t>
+      </w:r>
+      <w:r>
+        <w:t xml:space="preserve">(2026-07-16): employee</w:t>
+      </w:r>
+      <w:r>
+        <w:t xml:space="preserve"> </w:t>
+      </w:r>
+      <w:r>
+        <w:rPr>
+          <w:b/>
+          <w:bCs/>
+        </w:rPr>
+        <w:t xml:space="preserve">equity hero</w:t>
+      </w:r>
+      <w:r>
+        <w:t xml:space="preserve"> </w:t>
+      </w:r>
+      <w:r>
+        <w:t xml:space="preserve">(today's value / max potential value / vested-bar / next-vest &amp; fully-vested dates) reframing the portal ESOP section, and a</w:t>
+      </w:r>
+      <w:r>
+        <w:t xml:space="preserve"> </w:t>
+      </w:r>
+      <w:r>
+        <w:rPr>
+          <w:b/>
+          <w:bCs/>
+        </w:rPr>
+        <w:t xml:space="preserve">per-grant detail view</w:t>
+      </w:r>
+      <w:r>
+        <w:t xml:space="preserve"> </w:t>
+      </w:r>
+      <w:r>
+        <w:t xml:space="preserve">(new FR-K-3 ✅) — three value stats, a vesting-status segment bar (exercised/settled · vested · unvested, reusing StackedBar) and a vesting timeline with a</w:t>
+      </w:r>
+      <w:r>
+        <w:t xml:space="preserve"> </w:t>
+      </w:r>
+      <w:r>
+        <w:rPr>
+          <w:i/>
+          <w:iCs/>
+        </w:rPr>
+        <w:t xml:space="preserve">today</w:t>
+      </w:r>
+      <w:r>
+        <w:t xml:space="preserve"> </w:t>
+      </w:r>
+      <w:r>
+        <w:t xml:space="preserve">marker, from</w:t>
+      </w:r>
+      <w:r>
+        <w:t xml:space="preserve"> </w:t>
+      </w:r>
+      <w:r>
+        <w:rPr>
+          <w:rStyle w:val="VerbatimChar"/>
+        </w:rPr>
+        <w:t xml:space="preserve">esop.grant_value_summary</w:t>
+      </w:r>
+      <w:r>
+        <w:t xml:space="preserve"> </w:t>
+      </w:r>
+      <w:r>
+        <w:t xml:space="preserve">+</w:t>
+      </w:r>
+      <w:r>
+        <w:t xml:space="preserve"> </w:t>
+      </w:r>
+      <w:r>
+        <w:rPr>
+          <w:rStyle w:val="VerbatimChar"/>
+        </w:rPr>
+        <w:t xml:space="preserve">grant_schedule</w:t>
+      </w:r>
+      <w:r>
+        <w:t xml:space="preserve"> </w:t>
+      </w:r>
+      <w:r>
+        <w:t xml:space="preserve">and a</w:t>
+      </w:r>
+      <w:r>
+        <w:t xml:space="preserve"> </w:t>
+      </w:r>
+      <w:r>
+        <w:rPr>
+          <w:rStyle w:val="VerbatimChar"/>
+        </w:rPr>
+        <w:t xml:space="preserve">GET /portal/grants/{id}/detail</w:t>
+      </w:r>
+      <w:r>
+        <w:t xml:space="preserve"> </w:t>
+      </w:r>
+      <w:r>
+        <w:t xml:space="preserve">endpoint (own-grant only). Value model: intrinsic (FMV−strike) per unit for options, full FMV for RSUs/RSAs. No schema change. 248 backend tests.</w:t>
+      </w:r>
+    </w:p>
+    <w:p>
+      <w:pPr>
+        <w:pStyle w:val="Compact"/>
+        <w:numPr>
+          <w:ilvl w:val="0"/>
+          <w:numId w:val="1030"/>
+        </w:numPr>
+      </w:pPr>
+      <w:r>
+        <w:rPr>
+          <w:b/>
+          <w:bCs/>
+        </w:rPr>
+        <w:t xml:space="preserve">Mantle functional batch 2</w:t>
+      </w:r>
+      <w:r>
+        <w:t xml:space="preserve"> </w:t>
+      </w:r>
+      <w:r>
+        <w:t xml:space="preserve">(2026-07-16):</w:t>
+      </w:r>
+      <w:r>
+        <w:t xml:space="preserve"> </w:t>
+      </w:r>
+      <w:r>
+        <w:rPr>
+          <w:b/>
+          <w:bCs/>
+        </w:rPr>
+        <w:t xml:space="preserve">fund look-through / Schedule of Investments</w:t>
+      </w:r>
+      <w:r>
+        <w:t xml:space="preserve"> </w:t>
+      </w:r>
+      <w:r>
+        <w:t xml:space="preserve">(new FR-J-11 ✅) — GP-facing SOI (cost / mark / MOIC / %NAV / unrealised gain per holding + totals + generated statement document, new</w:t>
+      </w:r>
+      <w:r>
+        <w:t xml:space="preserve"> </w:t>
+      </w:r>
+      <w:r>
+        <w:rPr>
+          <w:rStyle w:val="VerbatimChar"/>
+        </w:rPr>
+        <w:t xml:space="preserve">soi_statement</w:t>
+      </w:r>
+      <w:r>
+        <w:t xml:space="preserve"> </w:t>
+      </w:r>
+      <w:r>
+        <w:t xml:space="preserve">template) via</w:t>
+      </w:r>
+      <w:r>
+        <w:t xml:space="preserve"> </w:t>
+      </w:r>
+      <w:r>
+        <w:rPr>
+          <w:rStyle w:val="VerbatimChar"/>
+        </w:rPr>
+        <w:t xml:space="preserve">GET /funds/{id}/soi</w:t>
+      </w:r>
+      <w:r>
+        <w:t xml:space="preserve">; LP-facing look-through folded into the portal (</w:t>
+      </w:r>
+      <w:r>
+        <w:rPr>
+          <w:rStyle w:val="VerbatimChar"/>
+        </w:rPr>
+        <w:t xml:space="preserve">look_through</w:t>
+      </w:r>
+      <w:r>
+        <w:t xml:space="preserve"> </w:t>
+      </w:r>
+      <w:r>
+        <w:t xml:space="preserve">per fund) showing each LP's pro-rata exposure to the underlying holdings at the fund's own marks. No schema change (read-only over existing portfolio marks). Incidental: removed a pre-existing unused</w:t>
+      </w:r>
+      <w:r>
+        <w:t xml:space="preserve"> </w:t>
+      </w:r>
+      <w:r>
+        <w:rPr>
+          <w:rStyle w:val="VerbatimChar"/>
+        </w:rPr>
+        <w:t xml:space="preserve">CENTS</w:t>
+      </w:r>
+      <w:r>
+        <w:t xml:space="preserve"> </w:t>
+      </w:r>
+      <w:r>
+        <w:t xml:space="preserve">import in</w:t>
+      </w:r>
+      <w:r>
+        <w:t xml:space="preserve"> </w:t>
+      </w:r>
+      <w:r>
+        <w:rPr>
+          <w:rStyle w:val="VerbatimChar"/>
+        </w:rPr>
+        <w:t xml:space="preserve">services/fund.py</w:t>
+      </w:r>
+      <w:r>
+        <w:t xml:space="preserve"> </w:t>
+      </w:r>
+      <w:r>
+        <w:t xml:space="preserve">surfaced by ruff. 242 backend tests.</w:t>
       </w:r>
     </w:p>
     <w:p>

</xml_diff>

<commit_message>
Backend: email verification, admin-only grants, FY helper, dead-code sweep
Full-round review remediation (SEC + quality):
- Email verification gate (SEC H-1): users.email_verified +
  email_verification_token (Alembic f4d6c8e0a2b4), POST /auth/verify-email,
  PAPER_EMAIL_VERIFICATION_REQUIRED flag (dev off / prod on). Enforced in
  deps._entity_role (advisor branch) + require_verified_email on all
  /portal* and advisor routes.
- Admin-only delegation (SEC M-1): require_admin on advisor-access
  grant/revoke and investor-access grant.
- services/fy.py: single source for Indian-FY math; unified the FY label
  format and removed 4 re-implementations of the Apr-Mar rule.
- Dead-code sweep: removed MembershipOut schema + 4 unused imports.
- New tests/test_email_verification.py (5 tests); 266 backend tests pass.

Co-Authored-By: Claude Fable 5 <noreply@anthropic.com>
</commit_message>
<xml_diff>
--- a/REQUIREMENTS.docx
+++ b/REQUIREMENTS.docx
@@ -1590,7 +1590,62 @@
         <w:t xml:space="preserve"> </w:t>
       </w:r>
       <w:r>
-        <w:t xml:space="preserve">email+password JWT auth (signup/login/me/refresh) with password policy (min 8), failed-login rate limiting (5 per 5 min, reset on success), and fail-fast boot if the default JWT secret is used outside dev/test; investor/LP/employee access granted by email match without tenant membership.</w:t>
+        <w:t xml:space="preserve">email+password JWT auth (signup/login/me/refresh) with password policy (min 8), failed-login rate limiting (5 per 5 min, reset on success), and fail-fast boot if the default JWT secret is used outside dev/test; investor/LP/employee access granted by email match without tenant membership,</w:t>
+      </w:r>
+      <w:r>
+        <w:t xml:space="preserve"> </w:t>
+      </w:r>
+      <w:r>
+        <w:rPr>
+          <w:b/>
+          <w:bCs/>
+        </w:rPr>
+        <w:t xml:space="preserve">now gated on email verification</w:t>
+      </w:r>
+      <w:r>
+        <w:t xml:space="preserve"> </w:t>
+      </w:r>
+      <w:r>
+        <w:t xml:space="preserve">(</w:t>
+      </w:r>
+      <w:r>
+        <w:rPr>
+          <w:rStyle w:val="VerbatimChar"/>
+        </w:rPr>
+        <w:t xml:space="preserve">email_verified</w:t>
+      </w:r>
+      <w:r>
+        <w:t xml:space="preserve"> </w:t>
+      </w:r>
+      <w:r>
+        <w:t xml:space="preserve">+</w:t>
+      </w:r>
+      <w:r>
+        <w:t xml:space="preserve"> </w:t>
+      </w:r>
+      <w:r>
+        <w:rPr>
+          <w:rStyle w:val="VerbatimChar"/>
+        </w:rPr>
+        <w:t xml:space="preserve">/auth/verify-email</w:t>
+      </w:r>
+      <w:r>
+        <w:t xml:space="preserve"> </w:t>
+      </w:r>
+      <w:r>
+        <w:t xml:space="preserve">+</w:t>
+      </w:r>
+      <w:r>
+        <w:t xml:space="preserve"> </w:t>
+      </w:r>
+      <w:r>
+        <w:rPr>
+          <w:rStyle w:val="VerbatimChar"/>
+        </w:rPr>
+        <w:t xml:space="preserve">PAPER_EMAIL_VERIFICATION_REQUIRED</w:t>
+      </w:r>
+      <w:r>
+        <w:t xml:space="preserve">, dev-off/prod-on) so an unverified pre-registered email cannot inherit another party's access.</w:t>
       </w:r>
       <w:r>
         <w:t xml:space="preserve"> </w:t>
@@ -1606,7 +1661,7 @@
         <w:t xml:space="preserve"> </w:t>
       </w:r>
       <w:r>
-        <w:t xml:space="preserve">OTP/SSO (OIDC), invite emails. ⛔ partially (SSO/OTP need providers).</w:t>
+        <w:t xml:space="preserve">OTP/SSO (OIDC) and the transactional-email delivery of the verification token (currently logged). ⛔ partially (SSO/OTP and email transport need providers).</w:t>
       </w:r>
     </w:p>
     <w:p>
@@ -14651,6 +14706,711 @@
           <w:b/>
           <w:bCs/>
         </w:rPr>
+        <w:t xml:space="preserve">v1.4 (2026-07-16)</w:t>
+      </w:r>
+      <w:r>
+        <w:t xml:space="preserve"> </w:t>
+      </w:r>
+      <w:r>
+        <w:t xml:space="preserve">— full-round review remediation (security + quality, no new features):</w:t>
+      </w:r>
+    </w:p>
+    <w:p>
+      <w:pPr>
+        <w:pStyle w:val="Compact"/>
+        <w:numPr>
+          <w:ilvl w:val="0"/>
+          <w:numId w:val="1030"/>
+        </w:numPr>
+      </w:pPr>
+      <w:r>
+        <w:rPr>
+          <w:b/>
+          <w:bCs/>
+        </w:rPr>
+        <w:t xml:space="preserve">Email verification gate</w:t>
+      </w:r>
+      <w:r>
+        <w:t xml:space="preserve"> </w:t>
+      </w:r>
+      <w:r>
+        <w:t xml:space="preserve">(FR-A-3, SEC review H-1): email-matched cross-tenant access (investor portal, LP statements, advisor console, data-room documents) now resolves only for a user who has proven ownership of their email.</w:t>
+      </w:r>
+      <w:r>
+        <w:t xml:space="preserve"> </w:t>
+      </w:r>
+      <w:r>
+        <w:rPr>
+          <w:rStyle w:val="VerbatimChar"/>
+        </w:rPr>
+        <w:t xml:space="preserve">users.email_verified</w:t>
+      </w:r>
+      <w:r>
+        <w:t xml:space="preserve"> </w:t>
+      </w:r>
+      <w:r>
+        <w:t xml:space="preserve">+</w:t>
+      </w:r>
+      <w:r>
+        <w:t xml:space="preserve"> </w:t>
+      </w:r>
+      <w:r>
+        <w:rPr>
+          <w:rStyle w:val="VerbatimChar"/>
+        </w:rPr>
+        <w:t xml:space="preserve">email_verification_token</w:t>
+      </w:r>
+      <w:r>
+        <w:t xml:space="preserve"> </w:t>
+      </w:r>
+      <w:r>
+        <w:t xml:space="preserve">(Alembic</w:t>
+      </w:r>
+      <w:r>
+        <w:t xml:space="preserve"> </w:t>
+      </w:r>
+      <w:r>
+        <w:rPr>
+          <w:rStyle w:val="VerbatimChar"/>
+        </w:rPr>
+        <w:t xml:space="preserve">f4d6c8e0a2b4</w:t>
+      </w:r>
+      <w:r>
+        <w:t xml:space="preserve">),</w:t>
+      </w:r>
+      <w:r>
+        <w:t xml:space="preserve"> </w:t>
+      </w:r>
+      <w:r>
+        <w:rPr>
+          <w:rStyle w:val="VerbatimChar"/>
+        </w:rPr>
+        <w:t xml:space="preserve">POST /auth/verify-email</w:t>
+      </w:r>
+      <w:r>
+        <w:t xml:space="preserve">, and a</w:t>
+      </w:r>
+      <w:r>
+        <w:t xml:space="preserve"> </w:t>
+      </w:r>
+      <w:r>
+        <w:rPr>
+          <w:rStyle w:val="VerbatimChar"/>
+        </w:rPr>
+        <w:t xml:space="preserve">PAPER_EMAIL_VERIFICATION_REQUIRED</w:t>
+      </w:r>
+      <w:r>
+        <w:t xml:space="preserve"> </w:t>
+      </w:r>
+      <w:r>
+        <w:t xml:space="preserve">flag (off in dev so signups verify immediately — mirrors</w:t>
+      </w:r>
+      <w:r>
+        <w:t xml:space="preserve"> </w:t>
+      </w:r>
+      <w:r>
+        <w:rPr>
+          <w:rStyle w:val="VerbatimChar"/>
+        </w:rPr>
+        <w:t xml:space="preserve">auto_create_tables</w:t>
+      </w:r>
+      <w:r>
+        <w:t xml:space="preserve">; on in prod). Enforced in</w:t>
+      </w:r>
+      <w:r>
+        <w:t xml:space="preserve"> </w:t>
+      </w:r>
+      <w:r>
+        <w:rPr>
+          <w:rStyle w:val="VerbatimChar"/>
+        </w:rPr>
+        <w:t xml:space="preserve">deps._entity_role</w:t>
+      </w:r>
+      <w:r>
+        <w:t xml:space="preserve"> </w:t>
+      </w:r>
+      <w:r>
+        <w:t xml:space="preserve">(advisor branch) and a</w:t>
+      </w:r>
+      <w:r>
+        <w:t xml:space="preserve"> </w:t>
+      </w:r>
+      <w:r>
+        <w:rPr>
+          <w:rStyle w:val="VerbatimChar"/>
+        </w:rPr>
+        <w:t xml:space="preserve">require_verified_email</w:t>
+      </w:r>
+      <w:r>
+        <w:t xml:space="preserve"> </w:t>
+      </w:r>
+      <w:r>
+        <w:t xml:space="preserve">dependency on all</w:t>
+      </w:r>
+      <w:r>
+        <w:t xml:space="preserve"> </w:t>
+      </w:r>
+      <w:r>
+        <w:rPr>
+          <w:rStyle w:val="VerbatimChar"/>
+        </w:rPr>
+        <w:t xml:space="preserve">/portal*</w:t>
+      </w:r>
+      <w:r>
+        <w:t xml:space="preserve"> </w:t>
+      </w:r>
+      <w:r>
+        <w:t xml:space="preserve">+ advisor routes.</w:t>
+      </w:r>
+    </w:p>
+    <w:p>
+      <w:pPr>
+        <w:pStyle w:val="Compact"/>
+        <w:numPr>
+          <w:ilvl w:val="0"/>
+          <w:numId w:val="1030"/>
+        </w:numPr>
+      </w:pPr>
+      <w:r>
+        <w:rPr>
+          <w:b/>
+          <w:bCs/>
+        </w:rPr>
+        <w:t xml:space="preserve">Admin-only access delegation</w:t>
+      </w:r>
+      <w:r>
+        <w:t xml:space="preserve"> </w:t>
+      </w:r>
+      <w:r>
+        <w:t xml:space="preserve">(SEC review M-1): granting/revoking external advisor access and granting investor-portal access now require owner/admin (new</w:t>
+      </w:r>
+      <w:r>
+        <w:t xml:space="preserve"> </w:t>
+      </w:r>
+      <w:r>
+        <w:rPr>
+          <w:rStyle w:val="VerbatimChar"/>
+        </w:rPr>
+        <w:t xml:space="preserve">deps.require_admin</w:t>
+      </w:r>
+      <w:r>
+        <w:t xml:space="preserve">), not any write role — a member-level advisor can no longer create a durable second foothold.</w:t>
+      </w:r>
+    </w:p>
+    <w:p>
+      <w:pPr>
+        <w:pStyle w:val="Compact"/>
+        <w:numPr>
+          <w:ilvl w:val="0"/>
+          <w:numId w:val="1030"/>
+        </w:numPr>
+      </w:pPr>
+      <w:r>
+        <w:rPr>
+          <w:b/>
+          <w:bCs/>
+        </w:rPr>
+        <w:t xml:space="preserve">Readable API errors</w:t>
+      </w:r>
+      <w:r>
+        <w:t xml:space="preserve">: the web client now formats FastAPI 422 validation</w:t>
+      </w:r>
+      <w:r>
+        <w:t xml:space="preserve"> </w:t>
+      </w:r>
+      <w:r>
+        <w:rPr>
+          <w:rStyle w:val="VerbatimChar"/>
+        </w:rPr>
+        <w:t xml:space="preserve">detail</w:t>
+      </w:r>
+      <w:r>
+        <w:t xml:space="preserve"> </w:t>
+      </w:r>
+      <w:r>
+        <w:t xml:space="preserve">lists into</w:t>
+      </w:r>
+      <w:r>
+        <w:t xml:space="preserve"> </w:t>
+      </w:r>
+      <w:r>
+        <w:rPr>
+          <w:rStyle w:val="VerbatimChar"/>
+        </w:rPr>
+        <w:t xml:space="preserve">field: message</w:t>
+      </w:r>
+      <w:r>
+        <w:t xml:space="preserve"> </w:t>
+      </w:r>
+      <w:r>
+        <w:t xml:space="preserve">instead of rendering</w:t>
+      </w:r>
+      <w:r>
+        <w:t xml:space="preserve"> </w:t>
+      </w:r>
+      <w:r>
+        <w:rPr>
+          <w:rStyle w:val="VerbatimChar"/>
+        </w:rPr>
+        <w:t xml:space="preserve">[object Object]</w:t>
+      </w:r>
+      <w:r>
+        <w:t xml:space="preserve">.</w:t>
+      </w:r>
+    </w:p>
+    <w:p>
+      <w:pPr>
+        <w:pStyle w:val="Compact"/>
+        <w:numPr>
+          <w:ilvl w:val="0"/>
+          <w:numId w:val="1030"/>
+        </w:numPr>
+      </w:pPr>
+      <w:r>
+        <w:rPr>
+          <w:b/>
+          <w:bCs/>
+        </w:rPr>
+        <w:t xml:space="preserve">In-app prompt dialog</w:t>
+      </w:r>
+      <w:r>
+        <w:t xml:space="preserve">:</w:t>
+      </w:r>
+      <w:r>
+        <w:t xml:space="preserve"> </w:t>
+      </w:r>
+      <w:r>
+        <w:rPr>
+          <w:rStyle w:val="VerbatimChar"/>
+        </w:rPr>
+        <w:t xml:space="preserve">window.prompt()</w:t>
+      </w:r>
+      <w:r>
+        <w:t xml:space="preserve"> </w:t>
+      </w:r>
+      <w:r>
+        <w:t xml:space="preserve">(blocked in embedded browsers/webviews — the incorporation "Mark filed"/"Record CIN", data-room answer, and other flows dead-ended) replaced by a promise-based in-app modal (</w:t>
+      </w:r>
+      <w:r>
+        <w:rPr>
+          <w:rStyle w:val="VerbatimChar"/>
+        </w:rPr>
+        <w:t xml:space="preserve">uiPrompt</w:t>
+      </w:r>
+      <w:r>
+        <w:t xml:space="preserve">), across 8 files.</w:t>
+      </w:r>
+    </w:p>
+    <w:p>
+      <w:pPr>
+        <w:pStyle w:val="Compact"/>
+        <w:numPr>
+          <w:ilvl w:val="0"/>
+          <w:numId w:val="1030"/>
+        </w:numPr>
+      </w:pPr>
+      <w:r>
+        <w:rPr>
+          <w:b/>
+          <w:bCs/>
+        </w:rPr>
+        <w:t xml:space="preserve">Quality/consistency</w:t>
+      </w:r>
+      <w:r>
+        <w:t xml:space="preserve">: single-source</w:t>
+      </w:r>
+      <w:r>
+        <w:t xml:space="preserve"> </w:t>
+      </w:r>
+      <w:r>
+        <w:rPr>
+          <w:rStyle w:val="VerbatimChar"/>
+        </w:rPr>
+        <w:t xml:space="preserve">services/fy.py</w:t>
+      </w:r>
+      <w:r>
+        <w:t xml:space="preserve"> </w:t>
+      </w:r>
+      <w:r>
+        <w:t xml:space="preserve">for Indian-FY math (label format unified to</w:t>
+      </w:r>
+      <w:r>
+        <w:t xml:space="preserve"> </w:t>
+      </w:r>
+      <w:r>
+        <w:rPr>
+          <w:rStyle w:val="VerbatimChar"/>
+        </w:rPr>
+        <w:t xml:space="preserve">FY{end}</w:t>
+      </w:r>
+      <w:r>
+        <w:t xml:space="preserve"> </w:t>
+      </w:r>
+      <w:r>
+        <w:t xml:space="preserve">across ESOP expense / compliance / fund tax statements; removed 4 re-implementations of the Apr–Mar rule); frontend</w:t>
+      </w:r>
+      <w:r>
+        <w:t xml:space="preserve"> </w:t>
+      </w:r>
+      <w:r>
+        <w:rPr>
+          <w:rStyle w:val="VerbatimChar"/>
+        </w:rPr>
+        <w:t xml:space="preserve">lib/format.ts</w:t>
+      </w:r>
+      <w:r>
+        <w:t xml:space="preserve"> </w:t>
+      </w:r>
+      <w:r>
+        <w:t xml:space="preserve">(</w:t>
+      </w:r>
+      <w:r>
+        <w:rPr>
+          <w:rStyle w:val="VerbatimChar"/>
+        </w:rPr>
+        <w:t xml:space="preserve">fmtMoney</w:t>
+      </w:r>
+      <w:r>
+        <w:t xml:space="preserve">/</w:t>
+      </w:r>
+      <w:r>
+        <w:rPr>
+          <w:rStyle w:val="VerbatimChar"/>
+        </w:rPr>
+        <w:t xml:space="preserve">fmtInt</w:t>
+      </w:r>
+      <w:r>
+        <w:t xml:space="preserve">) with the two disagreeing private helpers consolidated and the portal value hero migrated; shared</w:t>
+      </w:r>
+      <w:r>
+        <w:t xml:space="preserve"> </w:t>
+      </w:r>
+      <w:r>
+        <w:rPr>
+          <w:rStyle w:val="VerbatimChar"/>
+        </w:rPr>
+        <w:t xml:space="preserve">useResource</w:t>
+      </w:r>
+      <w:r>
+        <w:t xml:space="preserve"> </w:t>
+      </w:r>
+      <w:r>
+        <w:t xml:space="preserve">hook added and Portal's private</w:t>
+      </w:r>
+      <w:r>
+        <w:t xml:space="preserve"> </w:t>
+      </w:r>
+      <w:r>
+        <w:rPr>
+          <w:rStyle w:val="VerbatimChar"/>
+        </w:rPr>
+        <w:t xml:space="preserve">useGuard</w:t>
+      </w:r>
+      <w:r>
+        <w:t xml:space="preserve"> </w:t>
+      </w:r>
+      <w:r>
+        <w:t xml:space="preserve">re-implementation removed. Dead-code sweep: removed</w:t>
+      </w:r>
+      <w:r>
+        <w:t xml:space="preserve"> </w:t>
+      </w:r>
+      <w:r>
+        <w:rPr>
+          <w:rStyle w:val="VerbatimChar"/>
+        </w:rPr>
+        <w:t xml:space="preserve">MembershipOut</w:t>
+      </w:r>
+      <w:r>
+        <w:t xml:space="preserve"> </w:t>
+      </w:r>
+      <w:r>
+        <w:t xml:space="preserve">schema, 6 unused API-client methods, 4 unused imports. 266 backend tests, 7 frontend tests.</w:t>
+      </w:r>
+    </w:p>
+    <w:p>
+      <w:pPr>
+        <w:pStyle w:val="Compact"/>
+        <w:numPr>
+          <w:ilvl w:val="0"/>
+          <w:numId w:val="1030"/>
+        </w:numPr>
+      </w:pPr>
+      <w:r>
+        <w:rPr>
+          <w:b/>
+          <w:bCs/>
+        </w:rPr>
+        <w:t xml:space="preserve">UI modernization pass</w:t>
+      </w:r>
+      <w:r>
+        <w:t xml:space="preserve"> </w:t>
+      </w:r>
+      <w:r>
+        <w:t xml:space="preserve">(presentation-only, all in</w:t>
+      </w:r>
+      <w:r>
+        <w:t xml:space="preserve"> </w:t>
+      </w:r>
+      <w:r>
+        <w:rPr>
+          <w:rStyle w:val="VerbatimChar"/>
+        </w:rPr>
+        <w:t xml:space="preserve">styles.css</w:t>
+      </w:r>
+      <w:r>
+        <w:t xml:space="preserve"> </w:t>
+      </w:r>
+      <w:r>
+        <w:t xml:space="preserve">+ small components): modern</w:t>
+      </w:r>
+      <w:r>
+        <w:t xml:space="preserve"> </w:t>
+      </w:r>
+      <w:r>
+        <w:rPr>
+          <w:b/>
+          <w:bCs/>
+        </w:rPr>
+        <w:t xml:space="preserve">design tokens</w:t>
+      </w:r>
+      <w:r>
+        <w:t xml:space="preserve"> </w:t>
+      </w:r>
+      <w:r>
+        <w:t xml:space="preserve">— system-ui body font (replacing Calibri), a shadow/radius scale, soft card elevation, global transitions, branded focus rings, and modern data tables (uppercase muted headers, horizontal rules only,</w:t>
+      </w:r>
+      <w:r>
+        <w:t xml:space="preserve"> </w:t>
+      </w:r>
+      <w:r>
+        <w:rPr>
+          <w:rStyle w:val="VerbatimChar"/>
+        </w:rPr>
+        <w:t xml:space="preserve">tabular-nums</w:t>
+      </w:r>
+      <w:r>
+        <w:t xml:space="preserve">, row hover);</w:t>
+      </w:r>
+      <w:r>
+        <w:t xml:space="preserve"> </w:t>
+      </w:r>
+      <w:r>
+        <w:rPr>
+          <w:b/>
+          <w:bCs/>
+        </w:rPr>
+        <w:t xml:space="preserve">responsive top bar</w:t>
+      </w:r>
+      <w:r>
+        <w:t xml:space="preserve"> </w:t>
+      </w:r>
+      <w:r>
+        <w:t xml:space="preserve">(wraps + hides tagline on small screens, fixing a real mobile horizontal-scroll bug);</w:t>
+      </w:r>
+      <w:r>
+        <w:t xml:space="preserve"> </w:t>
+      </w:r>
+      <w:r>
+        <w:rPr>
+          <w:b/>
+          <w:bCs/>
+        </w:rPr>
+        <w:t xml:space="preserve">toast notifications</w:t>
+      </w:r>
+      <w:r>
+        <w:t xml:space="preserve"> </w:t>
+      </w:r>
+      <w:r>
+        <w:t xml:space="preserve">(</w:t>
+      </w:r>
+      <w:r>
+        <w:rPr>
+          <w:rStyle w:val="VerbatimChar"/>
+        </w:rPr>
+        <w:t xml:space="preserve">components/Toast.tsx</w:t>
+      </w:r>
+      <w:r>
+        <w:t xml:space="preserve">, fired via a</w:t>
+      </w:r>
+      <w:r>
+        <w:t xml:space="preserve"> </w:t>
+      </w:r>
+      <w:r>
+        <w:rPr>
+          <w:rStyle w:val="VerbatimChar"/>
+        </w:rPr>
+        <w:t xml:space="preserve">useGuard(fn, successMsg)</w:t>
+      </w:r>
+      <w:r>
+        <w:t xml:space="preserve"> </w:t>
+      </w:r>
+      <w:r>
+        <w:t xml:space="preserve">chokepoint);</w:t>
+      </w:r>
+      <w:r>
+        <w:t xml:space="preserve"> </w:t>
+      </w:r>
+      <w:r>
+        <w:rPr>
+          <w:b/>
+          <w:bCs/>
+        </w:rPr>
+        <w:t xml:space="preserve">skeleton loaders</w:t>
+      </w:r>
+      <w:r>
+        <w:t xml:space="preserve"> </w:t>
+      </w:r>
+      <w:r>
+        <w:t xml:space="preserve">(</w:t>
+      </w:r>
+      <w:r>
+        <w:rPr>
+          <w:rStyle w:val="VerbatimChar"/>
+        </w:rPr>
+        <w:t xml:space="preserve">components/Skeleton.tsx</w:t>
+      </w:r>
+      <w:r>
+        <w:t xml:space="preserve">, in the portal); and sharper</w:t>
+      </w:r>
+      <w:r>
+        <w:t xml:space="preserve"> </w:t>
+      </w:r>
+      <w:r>
+        <w:rPr>
+          <w:b/>
+          <w:bCs/>
+        </w:rPr>
+        <w:t xml:space="preserve">KPI stat tiles</w:t>
+      </w:r>
+      <w:r>
+        <w:t xml:space="preserve">.</w:t>
+      </w:r>
+      <w:r>
+        <w:t xml:space="preserve"> </w:t>
+      </w:r>
+      <w:r>
+        <w:rPr>
+          <w:b/>
+          <w:bCs/>
+        </w:rPr>
+        <w:t xml:space="preserve">Dark mode</w:t>
+      </w:r>
+      <w:r>
+        <w:t xml:space="preserve">: full token-based theming (</w:t>
+      </w:r>
+      <w:r>
+        <w:rPr>
+          <w:rStyle w:val="VerbatimChar"/>
+        </w:rPr>
+        <w:t xml:space="preserve">--heading</w:t>
+      </w:r>
+      <w:r>
+        <w:t xml:space="preserve">/</w:t>
+      </w:r>
+      <w:r>
+        <w:rPr>
+          <w:rStyle w:val="VerbatimChar"/>
+        </w:rPr>
+        <w:t xml:space="preserve">--panel</w:t>
+      </w:r>
+      <w:r>
+        <w:t xml:space="preserve"> </w:t>
+      </w:r>
+      <w:r>
+        <w:t xml:space="preserve">split so brand surfaces stay green while heading text and panels flip), an OS-preference default with a persisted top-bar toggle (</w:t>
+      </w:r>
+      <w:r>
+        <w:rPr>
+          <w:rStyle w:val="VerbatimChar"/>
+        </w:rPr>
+        <w:t xml:space="preserve">data-theme</w:t>
+      </w:r>
+      <w:r>
+        <w:t xml:space="preserve"> </w:t>
+      </w:r>
+      <w:r>
+        <w:t xml:space="preserve">on</w:t>
+      </w:r>
+      <w:r>
+        <w:t xml:space="preserve"> </w:t>
+      </w:r>
+      <w:r>
+        <w:rPr>
+          <w:rStyle w:val="VerbatimChar"/>
+        </w:rPr>
+        <w:t xml:space="preserve">&lt;html&gt;</w:t>
+      </w:r>
+      <w:r>
+        <w:t xml:space="preserve">), verified readable across headings, tables, badges, popovers and inputs.</w:t>
+      </w:r>
+      <w:r>
+        <w:t xml:space="preserve"> </w:t>
+      </w:r>
+      <w:r>
+        <w:rPr>
+          <w:b/>
+          <w:bCs/>
+        </w:rPr>
+        <w:t xml:space="preserve">Consistency rollout</w:t>
+      </w:r>
+      <w:r>
+        <w:t xml:space="preserve">: the shared</w:t>
+      </w:r>
+      <w:r>
+        <w:t xml:space="preserve"> </w:t>
+      </w:r>
+      <w:r>
+        <w:rPr>
+          <w:rStyle w:val="VerbatimChar"/>
+        </w:rPr>
+        <w:t xml:space="preserve">EmptyState</w:t>
+      </w:r>
+      <w:r>
+        <w:t xml:space="preserve"> </w:t>
+      </w:r>
+      <w:r>
+        <w:t xml:space="preserve">(icon + title + hint) replaced hand-rolled "None yet." text across ~15 more feature/page surfaces (Governance, Fundraising, Workflows, Fund, SPV, Admin, Advisors, Compliance, Contracts, Services, Valuations, cap-table timeline, Activity, Entities, Tenants, Advisor console, portal updates); a</w:t>
+      </w:r>
+      <w:r>
+        <w:t xml:space="preserve"> </w:t>
+      </w:r>
+      <w:r>
+        <w:rPr>
+          <w:b/>
+          <w:bCs/>
+        </w:rPr>
+        <w:t xml:space="preserve">branded, centered login screen</w:t>
+      </w:r>
+      <w:r>
+        <w:t xml:space="preserve">; and</w:t>
+      </w:r>
+      <w:r>
+        <w:t xml:space="preserve"> </w:t>
+      </w:r>
+      <w:r>
+        <w:rPr>
+          <w:b/>
+          <w:bCs/>
+        </w:rPr>
+        <w:t xml:space="preserve">success toasts</w:t>
+      </w:r>
+      <w:r>
+        <w:t xml:space="preserve"> </w:t>
+      </w:r>
+      <w:r>
+        <w:t xml:space="preserve">wired into the core create flows (cap-table issue/add, valuations, fundraising round/commitment/term-sheet/close, governance, team).</w:t>
+      </w:r>
+    </w:p>
+    <w:p>
+      <w:pPr>
+        <w:pStyle w:val="FirstParagraph"/>
+      </w:pPr>
+      <w:r>
+        <w:rPr>
+          <w:b/>
+          <w:bCs/>
+        </w:rPr>
         <w:t xml:space="preserve">v1.3 (2026-07-14)</w:t>
       </w:r>
       <w:r>
@@ -14665,7 +15425,7 @@
         <w:pStyle w:val="Compact"/>
         <w:numPr>
           <w:ilvl w:val="0"/>
-          <w:numId w:val="1030"/>
+          <w:numId w:val="1031"/>
         </w:numPr>
       </w:pPr>
       <w:r>
@@ -14746,7 +15506,7 @@
         <w:pStyle w:val="Compact"/>
         <w:numPr>
           <w:ilvl w:val="0"/>
-          <w:numId w:val="1030"/>
+          <w:numId w:val="1031"/>
         </w:numPr>
       </w:pPr>
       <w:r>
@@ -14780,7 +15540,7 @@
         <w:pStyle w:val="Compact"/>
         <w:numPr>
           <w:ilvl w:val="0"/>
-          <w:numId w:val="1030"/>
+          <w:numId w:val="1031"/>
         </w:numPr>
       </w:pPr>
       <w:r>
@@ -14841,7 +15601,7 @@
         <w:pStyle w:val="Compact"/>
         <w:numPr>
           <w:ilvl w:val="0"/>
-          <w:numId w:val="1030"/>
+          <w:numId w:val="1031"/>
         </w:numPr>
       </w:pPr>
       <w:r>
@@ -14873,7 +15633,7 @@
         <w:pStyle w:val="Compact"/>
         <w:numPr>
           <w:ilvl w:val="0"/>
-          <w:numId w:val="1030"/>
+          <w:numId w:val="1031"/>
         </w:numPr>
       </w:pPr>
       <w:r>
@@ -14967,7 +15727,7 @@
         <w:pStyle w:val="Compact"/>
         <w:numPr>
           <w:ilvl w:val="0"/>
-          <w:numId w:val="1030"/>
+          <w:numId w:val="1031"/>
         </w:numPr>
       </w:pPr>
       <w:r>
@@ -15033,7 +15793,7 @@
         <w:pStyle w:val="Compact"/>
         <w:numPr>
           <w:ilvl w:val="0"/>
-          <w:numId w:val="1030"/>
+          <w:numId w:val="1031"/>
         </w:numPr>
       </w:pPr>
       <w:r>
@@ -15071,7 +15831,7 @@
         <w:pStyle w:val="Compact"/>
         <w:numPr>
           <w:ilvl w:val="0"/>
-          <w:numId w:val="1030"/>
+          <w:numId w:val="1031"/>
         </w:numPr>
       </w:pPr>
       <w:r>
@@ -15105,7 +15865,7 @@
         <w:pStyle w:val="Compact"/>
         <w:numPr>
           <w:ilvl w:val="0"/>
-          <w:numId w:val="1030"/>
+          <w:numId w:val="1031"/>
         </w:numPr>
       </w:pPr>
       <w:r>
@@ -15139,7 +15899,7 @@
         <w:pStyle w:val="Compact"/>
         <w:numPr>
           <w:ilvl w:val="0"/>
-          <w:numId w:val="1030"/>
+          <w:numId w:val="1031"/>
         </w:numPr>
       </w:pPr>
       <w:r>
@@ -15170,7 +15930,7 @@
         <w:pStyle w:val="Compact"/>
         <w:numPr>
           <w:ilvl w:val="0"/>
-          <w:numId w:val="1030"/>
+          <w:numId w:val="1031"/>
         </w:numPr>
       </w:pPr>
       <w:r>
@@ -15251,7 +16011,7 @@
         <w:pStyle w:val="Compact"/>
         <w:numPr>
           <w:ilvl w:val="0"/>
-          <w:numId w:val="1030"/>
+          <w:numId w:val="1031"/>
         </w:numPr>
       </w:pPr>
       <w:r>
@@ -15332,7 +16092,7 @@
         <w:pStyle w:val="Compact"/>
         <w:numPr>
           <w:ilvl w:val="0"/>
-          <w:numId w:val="1030"/>
+          <w:numId w:val="1031"/>
         </w:numPr>
       </w:pPr>
       <w:r>
@@ -15354,7 +16114,7 @@
         <w:pStyle w:val="Compact"/>
         <w:numPr>
           <w:ilvl w:val="0"/>
-          <w:numId w:val="1030"/>
+          <w:numId w:val="1031"/>
         </w:numPr>
       </w:pPr>
       <w:r>
@@ -15455,7 +16215,7 @@
         <w:pStyle w:val="Compact"/>
         <w:numPr>
           <w:ilvl w:val="0"/>
-          <w:numId w:val="1030"/>
+          <w:numId w:val="1031"/>
         </w:numPr>
       </w:pPr>
       <w:r>
@@ -15603,7 +16363,7 @@
         <w:pStyle w:val="Compact"/>
         <w:numPr>
           <w:ilvl w:val="0"/>
-          <w:numId w:val="1030"/>
+          <w:numId w:val="1031"/>
         </w:numPr>
       </w:pPr>
       <w:r>
@@ -15720,7 +16480,7 @@
         <w:pStyle w:val="Compact"/>
         <w:numPr>
           <w:ilvl w:val="0"/>
-          <w:numId w:val="1030"/>
+          <w:numId w:val="1031"/>
         </w:numPr>
       </w:pPr>
       <w:r>
@@ -15813,7 +16573,7 @@
         <w:pStyle w:val="Compact"/>
         <w:numPr>
           <w:ilvl w:val="0"/>
-          <w:numId w:val="1030"/>
+          <w:numId w:val="1031"/>
         </w:numPr>
       </w:pPr>
       <w:r>
@@ -15949,7 +16709,7 @@
         <w:pStyle w:val="Compact"/>
         <w:numPr>
           <w:ilvl w:val="0"/>
-          <w:numId w:val="1030"/>
+          <w:numId w:val="1031"/>
         </w:numPr>
       </w:pPr>
       <w:r>
@@ -16079,7 +16839,7 @@
         <w:pStyle w:val="Compact"/>
         <w:numPr>
           <w:ilvl w:val="0"/>
-          <w:numId w:val="1030"/>
+          <w:numId w:val="1031"/>
         </w:numPr>
       </w:pPr>
       <w:r>
@@ -16194,7 +16954,7 @@
         <w:pStyle w:val="Compact"/>
         <w:numPr>
           <w:ilvl w:val="0"/>
-          <w:numId w:val="1030"/>
+          <w:numId w:val="1031"/>
         </w:numPr>
       </w:pPr>
       <w:r>
@@ -16301,7 +17061,7 @@
         <w:pStyle w:val="Compact"/>
         <w:numPr>
           <w:ilvl w:val="0"/>
-          <w:numId w:val="1030"/>
+          <w:numId w:val="1031"/>
         </w:numPr>
       </w:pPr>
       <w:r>
@@ -16436,7 +17196,7 @@
         <w:pStyle w:val="Compact"/>
         <w:numPr>
           <w:ilvl w:val="0"/>
-          <w:numId w:val="1030"/>
+          <w:numId w:val="1031"/>
         </w:numPr>
       </w:pPr>
       <w:r>
@@ -16598,7 +17358,7 @@
         <w:pStyle w:val="Compact"/>
         <w:numPr>
           <w:ilvl w:val="0"/>
-          <w:numId w:val="1030"/>
+          <w:numId w:val="1031"/>
         </w:numPr>
       </w:pPr>
       <w:r>
@@ -16703,7 +17463,7 @@
         <w:pStyle w:val="Compact"/>
         <w:numPr>
           <w:ilvl w:val="0"/>
-          <w:numId w:val="1030"/>
+          <w:numId w:val="1031"/>
         </w:numPr>
       </w:pPr>
       <w:r>
@@ -16849,7 +17609,7 @@
         <w:pStyle w:val="Compact"/>
         <w:numPr>
           <w:ilvl w:val="0"/>
-          <w:numId w:val="1030"/>
+          <w:numId w:val="1031"/>
         </w:numPr>
       </w:pPr>
       <w:r>
@@ -16991,7 +17751,7 @@
         <w:pStyle w:val="Compact"/>
         <w:numPr>
           <w:ilvl w:val="0"/>
-          <w:numId w:val="1031"/>
+          <w:numId w:val="1032"/>
         </w:numPr>
       </w:pPr>
       <w:r>
@@ -17024,7 +17784,7 @@
         <w:pStyle w:val="Compact"/>
         <w:numPr>
           <w:ilvl w:val="0"/>
-          <w:numId w:val="1031"/>
+          <w:numId w:val="1032"/>
         </w:numPr>
       </w:pPr>
       <w:r>
@@ -17036,7 +17796,7 @@
         <w:pStyle w:val="Compact"/>
         <w:numPr>
           <w:ilvl w:val="0"/>
-          <w:numId w:val="1031"/>
+          <w:numId w:val="1032"/>
         </w:numPr>
       </w:pPr>
       <w:r>
@@ -17064,7 +17824,7 @@
         <w:pStyle w:val="Compact"/>
         <w:numPr>
           <w:ilvl w:val="0"/>
-          <w:numId w:val="1031"/>
+          <w:numId w:val="1032"/>
         </w:numPr>
       </w:pPr>
       <w:r>
@@ -17095,7 +17855,7 @@
         <w:pStyle w:val="Compact"/>
         <w:numPr>
           <w:ilvl w:val="0"/>
-          <w:numId w:val="1031"/>
+          <w:numId w:val="1032"/>
         </w:numPr>
       </w:pPr>
       <w:r>
@@ -17141,7 +17901,7 @@
         <w:pStyle w:val="Compact"/>
         <w:numPr>
           <w:ilvl w:val="0"/>
-          <w:numId w:val="1032"/>
+          <w:numId w:val="1033"/>
         </w:numPr>
       </w:pPr>
       <w:r>
@@ -17160,7 +17920,7 @@
         <w:pStyle w:val="Compact"/>
         <w:numPr>
           <w:ilvl w:val="0"/>
-          <w:numId w:val="1032"/>
+          <w:numId w:val="1033"/>
         </w:numPr>
       </w:pPr>
       <w:r>
@@ -17179,7 +17939,7 @@
         <w:pStyle w:val="Compact"/>
         <w:numPr>
           <w:ilvl w:val="0"/>
-          <w:numId w:val="1032"/>
+          <w:numId w:val="1033"/>
         </w:numPr>
       </w:pPr>
       <w:r>
@@ -17198,7 +17958,7 @@
         <w:pStyle w:val="Compact"/>
         <w:numPr>
           <w:ilvl w:val="0"/>
-          <w:numId w:val="1032"/>
+          <w:numId w:val="1033"/>
         </w:numPr>
       </w:pPr>
       <w:r>
@@ -17243,7 +18003,7 @@
         <w:pStyle w:val="Compact"/>
         <w:numPr>
           <w:ilvl w:val="0"/>
-          <w:numId w:val="1033"/>
+          <w:numId w:val="1034"/>
         </w:numPr>
       </w:pPr>
       <w:r>
@@ -17255,7 +18015,7 @@
         <w:pStyle w:val="Compact"/>
         <w:numPr>
           <w:ilvl w:val="0"/>
-          <w:numId w:val="1033"/>
+          <w:numId w:val="1034"/>
         </w:numPr>
       </w:pPr>
       <w:r>
@@ -17290,7 +18050,7 @@
         <w:pStyle w:val="Compact"/>
         <w:numPr>
           <w:ilvl w:val="0"/>
-          <w:numId w:val="1033"/>
+          <w:numId w:val="1034"/>
         </w:numPr>
       </w:pPr>
       <w:r>
@@ -17302,7 +18062,7 @@
         <w:pStyle w:val="Compact"/>
         <w:numPr>
           <w:ilvl w:val="0"/>
-          <w:numId w:val="1033"/>
+          <w:numId w:val="1034"/>
         </w:numPr>
       </w:pPr>
       <w:r>
@@ -17314,7 +18074,7 @@
         <w:pStyle w:val="Compact"/>
         <w:numPr>
           <w:ilvl w:val="0"/>
-          <w:numId w:val="1033"/>
+          <w:numId w:val="1034"/>
         </w:numPr>
       </w:pPr>
       <w:r>
@@ -17342,7 +18102,7 @@
         <w:pStyle w:val="Compact"/>
         <w:numPr>
           <w:ilvl w:val="0"/>
-          <w:numId w:val="1033"/>
+          <w:numId w:val="1034"/>
         </w:numPr>
       </w:pPr>
       <w:r>
@@ -17385,7 +18145,7 @@
         <w:pStyle w:val="Compact"/>
         <w:numPr>
           <w:ilvl w:val="0"/>
-          <w:numId w:val="1033"/>
+          <w:numId w:val="1034"/>
         </w:numPr>
       </w:pPr>
       <w:r>
@@ -17397,7 +18157,7 @@
         <w:pStyle w:val="Compact"/>
         <w:numPr>
           <w:ilvl w:val="0"/>
-          <w:numId w:val="1033"/>
+          <w:numId w:val="1034"/>
         </w:numPr>
       </w:pPr>
       <w:r>
@@ -18044,6 +18804,9 @@
     <w:abstractNumId w:val="991"/>
   </w:num>
   <w:num w:numId="1033">
+    <w:abstractNumId w:val="991"/>
+  </w:num>
+  <w:num w:numId="1034">
     <w:abstractNumId w:val="991"/>
   </w:num>
 </w:numbering>

</xml_diff>

<commit_message>
Backend: SEBI-compliant independent portfolio valuation (Carta fund gap #4)
FR-J-15. A fund valuation policy (independent valuer + revaluation frequency)
and append-only per-holding valuation records (fair value, as-of, methodology,
valuer, independence flag). The latest valuation by as-of rolls into the
holding's mark, so NAV / Schedule of Investments / performance stay in sync.
A dashboard flags holdings stale against the policy frequency and rolls up
valued / independent / stale counts; a fund_valuation report document is
generated on demand.

- PortfolioValuation model + funds.valuer_name / valuation_frequency_months
  (Alembic c3d4e5f6a7b8)
- services: set_valuation_policy, record_valuation, valuation_summary
- routes: PUT /funds/{id}/valuation-policy, POST/GET .../portfolio/{iid}/
  valuations, GET /funds/{id}/valuations, POST /funds/{id}/valuations/report
- 3 tests; full suite 281 passing. REQUIREMENTS -> v1.6.

Co-Authored-By: Claude Opus 4.8 <noreply@anthropic.com>
</commit_message>
<xml_diff>
--- a/REQUIREMENTS.docx
+++ b/REQUIREMENTS.docx
@@ -5891,6 +5891,168 @@
           <w:b/>
           <w:bCs/>
         </w:rPr>
+        <w:t xml:space="preserve">FR-J-15 (M — added v1.6, Carta fund gap)</w:t>
+      </w:r>
+      <w:r>
+        <w:t xml:space="preserve"> </w:t>
+      </w:r>
+      <w:r>
+        <w:t xml:space="preserve">✅</w:t>
+      </w:r>
+      <w:r>
+        <w:t xml:space="preserve"> </w:t>
+      </w:r>
+      <w:r>
+        <w:rPr>
+          <w:b/>
+          <w:bCs/>
+        </w:rPr>
+        <w:t xml:space="preserve">SEBI-compliant independent portfolio valuation</w:t>
+      </w:r>
+      <w:r>
+        <w:t xml:space="preserve">: a fund</w:t>
+      </w:r>
+      <w:r>
+        <w:t xml:space="preserve"> </w:t>
+      </w:r>
+      <w:r>
+        <w:rPr>
+          <w:b/>
+          <w:bCs/>
+        </w:rPr>
+        <w:t xml:space="preserve">valuation policy</w:t>
+      </w:r>
+      <w:r>
+        <w:t xml:space="preserve"> </w:t>
+      </w:r>
+      <w:r>
+        <w:t xml:space="preserve">(appointed independent valuer + revaluation frequency in months) and per-holding</w:t>
+      </w:r>
+      <w:r>
+        <w:t xml:space="preserve"> </w:t>
+      </w:r>
+      <w:r>
+        <w:rPr>
+          <w:b/>
+          <w:bCs/>
+        </w:rPr>
+        <w:t xml:space="preserve">valuation records</w:t>
+      </w:r>
+      <w:r>
+        <w:t xml:space="preserve"> </w:t>
+      </w:r>
+      <w:r>
+        <w:t xml:space="preserve">(fair value, as-of, methodology — IPEV market/recent-txn, DCF, NAV, cost — valuer, independence flag, note; append-only history, latest by as-of becomes the holding's mark so NAV/SoI/performance stay in sync). A valuation dashboard flags holdings</w:t>
+      </w:r>
+      <w:r>
+        <w:t xml:space="preserve"> </w:t>
+      </w:r>
+      <w:r>
+        <w:rPr>
+          <w:b/>
+          <w:bCs/>
+        </w:rPr>
+        <w:t xml:space="preserve">stale</w:t>
+      </w:r>
+      <w:r>
+        <w:t xml:space="preserve"> </w:t>
+      </w:r>
+      <w:r>
+        <w:t xml:space="preserve">against the policy frequency, rolls up valued/independent/stale counts, and generates a</w:t>
+      </w:r>
+      <w:r>
+        <w:t xml:space="preserve"> </w:t>
+      </w:r>
+      <w:r>
+        <w:rPr>
+          <w:rStyle w:val="VerbatimChar"/>
+        </w:rPr>
+        <w:t xml:space="preserve">fund_valuation</w:t>
+      </w:r>
+      <w:r>
+        <w:t xml:space="preserve"> </w:t>
+      </w:r>
+      <w:r>
+        <w:t xml:space="preserve">report document.</w:t>
+      </w:r>
+      <w:r>
+        <w:t xml:space="preserve"> </w:t>
+      </w:r>
+      <w:r>
+        <w:rPr>
+          <w:rStyle w:val="VerbatimChar"/>
+        </w:rPr>
+        <w:t xml:space="preserve">PUT /funds/{id}/valuation-policy</w:t>
+      </w:r>
+      <w:r>
+        <w:t xml:space="preserve">,</w:t>
+      </w:r>
+      <w:r>
+        <w:t xml:space="preserve"> </w:t>
+      </w:r>
+      <w:r>
+        <w:rPr>
+          <w:rStyle w:val="VerbatimChar"/>
+        </w:rPr>
+        <w:t xml:space="preserve">POST/GET /funds/{id}/portfolio/{iid}/valuations</w:t>
+      </w:r>
+      <w:r>
+        <w:t xml:space="preserve">,</w:t>
+      </w:r>
+      <w:r>
+        <w:t xml:space="preserve"> </w:t>
+      </w:r>
+      <w:r>
+        <w:rPr>
+          <w:rStyle w:val="VerbatimChar"/>
+        </w:rPr>
+        <w:t xml:space="preserve">GET /funds/{id}/valuations</w:t>
+      </w:r>
+      <w:r>
+        <w:t xml:space="preserve">,</w:t>
+      </w:r>
+      <w:r>
+        <w:t xml:space="preserve"> </w:t>
+      </w:r>
+      <w:r>
+        <w:rPr>
+          <w:rStyle w:val="VerbatimChar"/>
+        </w:rPr>
+        <w:t xml:space="preserve">POST /funds/{id}/valuations/report</w:t>
+      </w:r>
+      <w:r>
+        <w:t xml:space="preserve">. An India-native differentiator (SEBI AIF independent-valuation duty that global tools don't localise).</w:t>
+      </w:r>
+      <w:r>
+        <w:t xml:space="preserve"> </w:t>
+      </w:r>
+      <w:r>
+        <w:rPr>
+          <w:i/>
+          <w:iCs/>
+        </w:rPr>
+        <w:t xml:space="preserve">Remaining:</w:t>
+      </w:r>
+      <w:r>
+        <w:t xml:space="preserve"> </w:t>
+      </w:r>
+      <w:r>
+        <w:t xml:space="preserve">valuer e-sign/attestation; multi-valuer reconciliation.</w:t>
+      </w:r>
+    </w:p>
+    <w:p>
+      <w:pPr>
+        <w:pStyle w:val="Compact"/>
+        <w:numPr>
+          <w:ilvl w:val="0"/>
+          <w:numId w:val="1013"/>
+        </w:numPr>
+      </w:pPr>
+      <w:r>
+        <w:rPr>
+          <w:b/>
+          <w:bCs/>
+        </w:rPr>
         <w:t xml:space="preserve">FR-J-14 (M — added v1.5, Carta fund gap)</w:t>
       </w:r>
       <w:r>
@@ -12483,6 +12645,55 @@
             </w:pPr>
             <w:r>
               <w:t xml:space="preserve">append-only per-period ops KPIs; runway/growth derived</w:t>
+            </w:r>
+          </w:p>
+        </w:tc>
+      </w:tr>
+      <w:tr>
+        <w:tc>
+          <w:tcPr/>
+          <w:p>
+            <w:pPr>
+              <w:pStyle w:val="Compact"/>
+            </w:pPr>
+            <w:r>
+              <w:rPr>
+                <w:b/>
+                <w:bCs/>
+              </w:rPr>
+              <w:t xml:space="preserve">PortfolioValuation</w:t>
+            </w:r>
+            <w:r>
+              <w:t xml:space="preserve"> </w:t>
+            </w:r>
+            <w:r>
+              <w:rPr>
+                <w:i/>
+                <w:iCs/>
+              </w:rPr>
+              <w:t xml:space="preserve">(v1.6)</w:t>
+            </w:r>
+          </w:p>
+        </w:tc>
+        <w:tc>
+          <w:tcPr/>
+          <w:p>
+            <w:pPr>
+              <w:pStyle w:val="Compact"/>
+            </w:pPr>
+            <w:r>
+              <w:t xml:space="preserve">investment_id, fund_id, as_of, value, methodology, valuer, is_independent</w:t>
+            </w:r>
+          </w:p>
+        </w:tc>
+        <w:tc>
+          <w:tcPr/>
+          <w:p>
+            <w:pPr>
+              <w:pStyle w:val="Compact"/>
+            </w:pPr>
+            <w:r>
+              <w:t xml:space="preserve">append-only; latest updates the holding mark. Fund gains valuer_name + valuation_frequency_months (policy)</w:t>
             </w:r>
           </w:p>
         </w:tc>
@@ -15243,6 +15454,253 @@
           <w:b/>
           <w:bCs/>
         </w:rPr>
+        <w:t xml:space="preserve">v1.6 (2026-07-20)</w:t>
+      </w:r>
+      <w:r>
+        <w:t xml:space="preserve"> </w:t>
+      </w:r>
+      <w:r>
+        <w:t xml:space="preserve">— Carta fund gap #4:</w:t>
+      </w:r>
+    </w:p>
+    <w:p>
+      <w:pPr>
+        <w:pStyle w:val="Compact"/>
+        <w:numPr>
+          <w:ilvl w:val="0"/>
+          <w:numId w:val="1030"/>
+        </w:numPr>
+      </w:pPr>
+      <w:r>
+        <w:rPr>
+          <w:b/>
+          <w:bCs/>
+        </w:rPr>
+        <w:t xml:space="preserve">FR-J-15 SEBI-compliant independent portfolio valuation</w:t>
+      </w:r>
+      <w:r>
+        <w:t xml:space="preserve"> </w:t>
+      </w:r>
+      <w:r>
+        <w:t xml:space="preserve">✅ — new</w:t>
+      </w:r>
+      <w:r>
+        <w:t xml:space="preserve"> </w:t>
+      </w:r>
+      <w:r>
+        <w:rPr>
+          <w:rStyle w:val="VerbatimChar"/>
+        </w:rPr>
+        <w:t xml:space="preserve">PortfolioValuation</w:t>
+      </w:r>
+      <w:r>
+        <w:t xml:space="preserve"> </w:t>
+      </w:r>
+      <w:r>
+        <w:t xml:space="preserve">(append-only per-holding valuations; Alembic</w:t>
+      </w:r>
+      <w:r>
+        <w:t xml:space="preserve"> </w:t>
+      </w:r>
+      <w:r>
+        <w:rPr>
+          <w:rStyle w:val="VerbatimChar"/>
+        </w:rPr>
+        <w:t xml:space="preserve">c3d4e5f6a7b8</w:t>
+      </w:r>
+      <w:r>
+        <w:t xml:space="preserve">, which also adds</w:t>
+      </w:r>
+      <w:r>
+        <w:t xml:space="preserve"> </w:t>
+      </w:r>
+      <w:r>
+        <w:rPr>
+          <w:rStyle w:val="VerbatimChar"/>
+        </w:rPr>
+        <w:t xml:space="preserve">funds.valuer_name</w:t>
+      </w:r>
+      <w:r>
+        <w:t xml:space="preserve"> </w:t>
+      </w:r>
+      <w:r>
+        <w:t xml:space="preserve">+</w:t>
+      </w:r>
+      <w:r>
+        <w:t xml:space="preserve"> </w:t>
+      </w:r>
+      <w:r>
+        <w:rPr>
+          <w:rStyle w:val="VerbatimChar"/>
+        </w:rPr>
+        <w:t xml:space="preserve">funds.valuation_frequency_months</w:t>
+      </w:r>
+      <w:r>
+        <w:t xml:space="preserve">).</w:t>
+      </w:r>
+      <w:r>
+        <w:t xml:space="preserve"> </w:t>
+      </w:r>
+      <w:r>
+        <w:rPr>
+          <w:rStyle w:val="VerbatimChar"/>
+        </w:rPr>
+        <w:t xml:space="preserve">services/fund.py</w:t>
+      </w:r>
+      <w:r>
+        <w:t xml:space="preserve">:</w:t>
+      </w:r>
+      <w:r>
+        <w:t xml:space="preserve"> </w:t>
+      </w:r>
+      <w:r>
+        <w:rPr>
+          <w:rStyle w:val="VerbatimChar"/>
+        </w:rPr>
+        <w:t xml:space="preserve">set_valuation_policy</w:t>
+      </w:r>
+      <w:r>
+        <w:t xml:space="preserve">,</w:t>
+      </w:r>
+      <w:r>
+        <w:t xml:space="preserve"> </w:t>
+      </w:r>
+      <w:r>
+        <w:rPr>
+          <w:rStyle w:val="VerbatimChar"/>
+        </w:rPr>
+        <w:t xml:space="preserve">record_valuation</w:t>
+      </w:r>
+      <w:r>
+        <w:t xml:space="preserve"> </w:t>
+      </w:r>
+      <w:r>
+        <w:t xml:space="preserve">(latest by as-of rolls into</w:t>
+      </w:r>
+      <w:r>
+        <w:t xml:space="preserve"> </w:t>
+      </w:r>
+      <w:r>
+        <w:rPr>
+          <w:rStyle w:val="VerbatimChar"/>
+        </w:rPr>
+        <w:t xml:space="preserve">PortfolioInvestment.current_value</w:t>
+      </w:r>
+      <w:r>
+        <w:t xml:space="preserve">, keeping NAV/SoI/perf in sync),</w:t>
+      </w:r>
+      <w:r>
+        <w:t xml:space="preserve"> </w:t>
+      </w:r>
+      <w:r>
+        <w:rPr>
+          <w:rStyle w:val="VerbatimChar"/>
+        </w:rPr>
+        <w:t xml:space="preserve">valuation_summary</w:t>
+      </w:r>
+      <w:r>
+        <w:t xml:space="preserve"> </w:t>
+      </w:r>
+      <w:r>
+        <w:t xml:space="preserve">(staleness vs policy frequency + valued/independent/stale roll-ups); new</w:t>
+      </w:r>
+      <w:r>
+        <w:t xml:space="preserve"> </w:t>
+      </w:r>
+      <w:r>
+        <w:rPr>
+          <w:rStyle w:val="VerbatimChar"/>
+        </w:rPr>
+        <w:t xml:space="preserve">fund_valuation</w:t>
+      </w:r>
+      <w:r>
+        <w:t xml:space="preserve"> </w:t>
+      </w:r>
+      <w:r>
+        <w:t xml:space="preserve">document template. Routes</w:t>
+      </w:r>
+      <w:r>
+        <w:t xml:space="preserve"> </w:t>
+      </w:r>
+      <w:r>
+        <w:rPr>
+          <w:rStyle w:val="VerbatimChar"/>
+        </w:rPr>
+        <w:t xml:space="preserve">PUT /funds/{id}/valuation-policy</w:t>
+      </w:r>
+      <w:r>
+        <w:t xml:space="preserve">,</w:t>
+      </w:r>
+      <w:r>
+        <w:t xml:space="preserve"> </w:t>
+      </w:r>
+      <w:r>
+        <w:rPr>
+          <w:rStyle w:val="VerbatimChar"/>
+        </w:rPr>
+        <w:t xml:space="preserve">POST/GET /funds/{id}/portfolio/{iid}/valuations</w:t>
+      </w:r>
+      <w:r>
+        <w:t xml:space="preserve">,</w:t>
+      </w:r>
+      <w:r>
+        <w:t xml:space="preserve"> </w:t>
+      </w:r>
+      <w:r>
+        <w:rPr>
+          <w:rStyle w:val="VerbatimChar"/>
+        </w:rPr>
+        <w:t xml:space="preserve">GET /funds/{id}/valuations</w:t>
+      </w:r>
+      <w:r>
+        <w:t xml:space="preserve">,</w:t>
+      </w:r>
+      <w:r>
+        <w:t xml:space="preserve"> </w:t>
+      </w:r>
+      <w:r>
+        <w:rPr>
+          <w:rStyle w:val="VerbatimChar"/>
+        </w:rPr>
+        <w:t xml:space="preserve">POST /funds/{id}/valuations/report</w:t>
+      </w:r>
+      <w:r>
+        <w:t xml:space="preserve">. Frontend</w:t>
+      </w:r>
+      <w:r>
+        <w:t xml:space="preserve"> </w:t>
+      </w:r>
+      <w:r>
+        <w:rPr>
+          <w:rStyle w:val="VerbatimChar"/>
+        </w:rPr>
+        <w:t xml:space="preserve">features/FundValuations.tsx</w:t>
+      </w:r>
+      <w:r>
+        <w:t xml:space="preserve"> </w:t>
+      </w:r>
+      <w:r>
+        <w:t xml:space="preserve">(policy editor, roll-up tiles, per-holding table with methodology/valuer/independent + stale badges, per-holding value form, report) mounted in the Fund workspace. 3 tests (</w:t>
+      </w:r>
+      <w:r>
+        <w:rPr>
+          <w:rStyle w:val="VerbatimChar"/>
+        </w:rPr>
+        <w:t xml:space="preserve">test_portfolio_valuations.py</w:t>
+      </w:r>
+      <w:r>
+        <w:t xml:space="preserve">). The India-native item where Paper exceeds Carta. (Remaining Carta gaps: subsequent-close equalisation, LP/deal-CRM depth, deeper LP self-service / money movement.)</w:t>
+      </w:r>
+    </w:p>
+    <w:p>
+      <w:pPr>
+        <w:pStyle w:val="FirstParagraph"/>
+      </w:pPr>
+      <w:r>
+        <w:rPr>
+          <w:b/>
+          <w:bCs/>
+        </w:rPr>
         <w:t xml:space="preserve">v1.5 (2026-07-20)</w:t>
       </w:r>
       <w:r>
@@ -15257,7 +15715,7 @@
         <w:pStyle w:val="Compact"/>
         <w:numPr>
           <w:ilvl w:val="0"/>
-          <w:numId w:val="1030"/>
+          <w:numId w:val="1031"/>
         </w:numPr>
       </w:pPr>
       <w:r>
@@ -15369,7 +15827,7 @@
         <w:pStyle w:val="Compact"/>
         <w:numPr>
           <w:ilvl w:val="0"/>
-          <w:numId w:val="1030"/>
+          <w:numId w:val="1031"/>
         </w:numPr>
       </w:pPr>
       <w:r>
@@ -15493,7 +15951,7 @@
         <w:pStyle w:val="Compact"/>
         <w:numPr>
           <w:ilvl w:val="0"/>
-          <w:numId w:val="1030"/>
+          <w:numId w:val="1031"/>
         </w:numPr>
       </w:pPr>
       <w:r>
@@ -15621,7 +16079,7 @@
         <w:pStyle w:val="Compact"/>
         <w:numPr>
           <w:ilvl w:val="0"/>
-          <w:numId w:val="1030"/>
+          <w:numId w:val="1031"/>
         </w:numPr>
       </w:pPr>
       <w:r>
@@ -15651,7 +16109,7 @@
         <w:pStyle w:val="Compact"/>
         <w:numPr>
           <w:ilvl w:val="0"/>
-          <w:numId w:val="1031"/>
+          <w:numId w:val="1032"/>
         </w:numPr>
       </w:pPr>
       <w:r>
@@ -15799,7 +16257,7 @@
         <w:pStyle w:val="Compact"/>
         <w:numPr>
           <w:ilvl w:val="0"/>
-          <w:numId w:val="1031"/>
+          <w:numId w:val="1032"/>
         </w:numPr>
       </w:pPr>
       <w:r>
@@ -15833,7 +16291,7 @@
         <w:pStyle w:val="Compact"/>
         <w:numPr>
           <w:ilvl w:val="0"/>
-          <w:numId w:val="1031"/>
+          <w:numId w:val="1032"/>
         </w:numPr>
       </w:pPr>
       <w:r>
@@ -15894,7 +16352,7 @@
         <w:pStyle w:val="Compact"/>
         <w:numPr>
           <w:ilvl w:val="0"/>
-          <w:numId w:val="1031"/>
+          <w:numId w:val="1032"/>
         </w:numPr>
       </w:pPr>
       <w:r>
@@ -15937,7 +16395,7 @@
         <w:pStyle w:val="Compact"/>
         <w:numPr>
           <w:ilvl w:val="0"/>
-          <w:numId w:val="1031"/>
+          <w:numId w:val="1032"/>
         </w:numPr>
       </w:pPr>
       <w:r>
@@ -16064,7 +16522,7 @@
         <w:pStyle w:val="Compact"/>
         <w:numPr>
           <w:ilvl w:val="0"/>
-          <w:numId w:val="1031"/>
+          <w:numId w:val="1032"/>
         </w:numPr>
       </w:pPr>
       <w:r>
@@ -16356,7 +16814,7 @@
         <w:pStyle w:val="Compact"/>
         <w:numPr>
           <w:ilvl w:val="0"/>
-          <w:numId w:val="1032"/>
+          <w:numId w:val="1033"/>
         </w:numPr>
       </w:pPr>
       <w:r>
@@ -16437,7 +16895,7 @@
         <w:pStyle w:val="Compact"/>
         <w:numPr>
           <w:ilvl w:val="0"/>
-          <w:numId w:val="1032"/>
+          <w:numId w:val="1033"/>
         </w:numPr>
       </w:pPr>
       <w:r>
@@ -16471,7 +16929,7 @@
         <w:pStyle w:val="Compact"/>
         <w:numPr>
           <w:ilvl w:val="0"/>
-          <w:numId w:val="1032"/>
+          <w:numId w:val="1033"/>
         </w:numPr>
       </w:pPr>
       <w:r>
@@ -16532,7 +16990,7 @@
         <w:pStyle w:val="Compact"/>
         <w:numPr>
           <w:ilvl w:val="0"/>
-          <w:numId w:val="1032"/>
+          <w:numId w:val="1033"/>
         </w:numPr>
       </w:pPr>
       <w:r>
@@ -16564,7 +17022,7 @@
         <w:pStyle w:val="Compact"/>
         <w:numPr>
           <w:ilvl w:val="0"/>
-          <w:numId w:val="1032"/>
+          <w:numId w:val="1033"/>
         </w:numPr>
       </w:pPr>
       <w:r>
@@ -16658,7 +17116,7 @@
         <w:pStyle w:val="Compact"/>
         <w:numPr>
           <w:ilvl w:val="0"/>
-          <w:numId w:val="1032"/>
+          <w:numId w:val="1033"/>
         </w:numPr>
       </w:pPr>
       <w:r>
@@ -16724,7 +17182,7 @@
         <w:pStyle w:val="Compact"/>
         <w:numPr>
           <w:ilvl w:val="0"/>
-          <w:numId w:val="1032"/>
+          <w:numId w:val="1033"/>
         </w:numPr>
       </w:pPr>
       <w:r>
@@ -16762,7 +17220,7 @@
         <w:pStyle w:val="Compact"/>
         <w:numPr>
           <w:ilvl w:val="0"/>
-          <w:numId w:val="1032"/>
+          <w:numId w:val="1033"/>
         </w:numPr>
       </w:pPr>
       <w:r>
@@ -16796,7 +17254,7 @@
         <w:pStyle w:val="Compact"/>
         <w:numPr>
           <w:ilvl w:val="0"/>
-          <w:numId w:val="1032"/>
+          <w:numId w:val="1033"/>
         </w:numPr>
       </w:pPr>
       <w:r>
@@ -16830,7 +17288,7 @@
         <w:pStyle w:val="Compact"/>
         <w:numPr>
           <w:ilvl w:val="0"/>
-          <w:numId w:val="1032"/>
+          <w:numId w:val="1033"/>
         </w:numPr>
       </w:pPr>
       <w:r>
@@ -16861,7 +17319,7 @@
         <w:pStyle w:val="Compact"/>
         <w:numPr>
           <w:ilvl w:val="0"/>
-          <w:numId w:val="1032"/>
+          <w:numId w:val="1033"/>
         </w:numPr>
       </w:pPr>
       <w:r>
@@ -16942,7 +17400,7 @@
         <w:pStyle w:val="Compact"/>
         <w:numPr>
           <w:ilvl w:val="0"/>
-          <w:numId w:val="1032"/>
+          <w:numId w:val="1033"/>
         </w:numPr>
       </w:pPr>
       <w:r>
@@ -17023,7 +17481,7 @@
         <w:pStyle w:val="Compact"/>
         <w:numPr>
           <w:ilvl w:val="0"/>
-          <w:numId w:val="1032"/>
+          <w:numId w:val="1033"/>
         </w:numPr>
       </w:pPr>
       <w:r>
@@ -17045,7 +17503,7 @@
         <w:pStyle w:val="Compact"/>
         <w:numPr>
           <w:ilvl w:val="0"/>
-          <w:numId w:val="1032"/>
+          <w:numId w:val="1033"/>
         </w:numPr>
       </w:pPr>
       <w:r>
@@ -17146,7 +17604,7 @@
         <w:pStyle w:val="Compact"/>
         <w:numPr>
           <w:ilvl w:val="0"/>
-          <w:numId w:val="1032"/>
+          <w:numId w:val="1033"/>
         </w:numPr>
       </w:pPr>
       <w:r>
@@ -17294,7 +17752,7 @@
         <w:pStyle w:val="Compact"/>
         <w:numPr>
           <w:ilvl w:val="0"/>
-          <w:numId w:val="1032"/>
+          <w:numId w:val="1033"/>
         </w:numPr>
       </w:pPr>
       <w:r>
@@ -17411,7 +17869,7 @@
         <w:pStyle w:val="Compact"/>
         <w:numPr>
           <w:ilvl w:val="0"/>
-          <w:numId w:val="1032"/>
+          <w:numId w:val="1033"/>
         </w:numPr>
       </w:pPr>
       <w:r>
@@ -17504,7 +17962,7 @@
         <w:pStyle w:val="Compact"/>
         <w:numPr>
           <w:ilvl w:val="0"/>
-          <w:numId w:val="1032"/>
+          <w:numId w:val="1033"/>
         </w:numPr>
       </w:pPr>
       <w:r>
@@ -17640,7 +18098,7 @@
         <w:pStyle w:val="Compact"/>
         <w:numPr>
           <w:ilvl w:val="0"/>
-          <w:numId w:val="1032"/>
+          <w:numId w:val="1033"/>
         </w:numPr>
       </w:pPr>
       <w:r>
@@ -17770,7 +18228,7 @@
         <w:pStyle w:val="Compact"/>
         <w:numPr>
           <w:ilvl w:val="0"/>
-          <w:numId w:val="1032"/>
+          <w:numId w:val="1033"/>
         </w:numPr>
       </w:pPr>
       <w:r>
@@ -17885,7 +18343,7 @@
         <w:pStyle w:val="Compact"/>
         <w:numPr>
           <w:ilvl w:val="0"/>
-          <w:numId w:val="1032"/>
+          <w:numId w:val="1033"/>
         </w:numPr>
       </w:pPr>
       <w:r>
@@ -17992,7 +18450,7 @@
         <w:pStyle w:val="Compact"/>
         <w:numPr>
           <w:ilvl w:val="0"/>
-          <w:numId w:val="1032"/>
+          <w:numId w:val="1033"/>
         </w:numPr>
       </w:pPr>
       <w:r>
@@ -18127,7 +18585,7 @@
         <w:pStyle w:val="Compact"/>
         <w:numPr>
           <w:ilvl w:val="0"/>
-          <w:numId w:val="1032"/>
+          <w:numId w:val="1033"/>
         </w:numPr>
       </w:pPr>
       <w:r>
@@ -18289,7 +18747,7 @@
         <w:pStyle w:val="Compact"/>
         <w:numPr>
           <w:ilvl w:val="0"/>
-          <w:numId w:val="1032"/>
+          <w:numId w:val="1033"/>
         </w:numPr>
       </w:pPr>
       <w:r>
@@ -18394,7 +18852,7 @@
         <w:pStyle w:val="Compact"/>
         <w:numPr>
           <w:ilvl w:val="0"/>
-          <w:numId w:val="1032"/>
+          <w:numId w:val="1033"/>
         </w:numPr>
       </w:pPr>
       <w:r>
@@ -18540,7 +18998,7 @@
         <w:pStyle w:val="Compact"/>
         <w:numPr>
           <w:ilvl w:val="0"/>
-          <w:numId w:val="1032"/>
+          <w:numId w:val="1033"/>
         </w:numPr>
       </w:pPr>
       <w:r>
@@ -18682,7 +19140,7 @@
         <w:pStyle w:val="Compact"/>
         <w:numPr>
           <w:ilvl w:val="0"/>
-          <w:numId w:val="1033"/>
+          <w:numId w:val="1034"/>
         </w:numPr>
       </w:pPr>
       <w:r>
@@ -18715,7 +19173,7 @@
         <w:pStyle w:val="Compact"/>
         <w:numPr>
           <w:ilvl w:val="0"/>
-          <w:numId w:val="1033"/>
+          <w:numId w:val="1034"/>
         </w:numPr>
       </w:pPr>
       <w:r>
@@ -18727,7 +19185,7 @@
         <w:pStyle w:val="Compact"/>
         <w:numPr>
           <w:ilvl w:val="0"/>
-          <w:numId w:val="1033"/>
+          <w:numId w:val="1034"/>
         </w:numPr>
       </w:pPr>
       <w:r>
@@ -18755,7 +19213,7 @@
         <w:pStyle w:val="Compact"/>
         <w:numPr>
           <w:ilvl w:val="0"/>
-          <w:numId w:val="1033"/>
+          <w:numId w:val="1034"/>
         </w:numPr>
       </w:pPr>
       <w:r>
@@ -18786,7 +19244,7 @@
         <w:pStyle w:val="Compact"/>
         <w:numPr>
           <w:ilvl w:val="0"/>
-          <w:numId w:val="1033"/>
+          <w:numId w:val="1034"/>
         </w:numPr>
       </w:pPr>
       <w:r>
@@ -18832,7 +19290,7 @@
         <w:pStyle w:val="Compact"/>
         <w:numPr>
           <w:ilvl w:val="0"/>
-          <w:numId w:val="1034"/>
+          <w:numId w:val="1035"/>
         </w:numPr>
       </w:pPr>
       <w:r>
@@ -18851,7 +19309,7 @@
         <w:pStyle w:val="Compact"/>
         <w:numPr>
           <w:ilvl w:val="0"/>
-          <w:numId w:val="1034"/>
+          <w:numId w:val="1035"/>
         </w:numPr>
       </w:pPr>
       <w:r>
@@ -18870,7 +19328,7 @@
         <w:pStyle w:val="Compact"/>
         <w:numPr>
           <w:ilvl w:val="0"/>
-          <w:numId w:val="1034"/>
+          <w:numId w:val="1035"/>
         </w:numPr>
       </w:pPr>
       <w:r>
@@ -18889,7 +19347,7 @@
         <w:pStyle w:val="Compact"/>
         <w:numPr>
           <w:ilvl w:val="0"/>
-          <w:numId w:val="1034"/>
+          <w:numId w:val="1035"/>
         </w:numPr>
       </w:pPr>
       <w:r>
@@ -18934,7 +19392,7 @@
         <w:pStyle w:val="Compact"/>
         <w:numPr>
           <w:ilvl w:val="0"/>
-          <w:numId w:val="1035"/>
+          <w:numId w:val="1036"/>
         </w:numPr>
       </w:pPr>
       <w:r>
@@ -18946,7 +19404,7 @@
         <w:pStyle w:val="Compact"/>
         <w:numPr>
           <w:ilvl w:val="0"/>
-          <w:numId w:val="1035"/>
+          <w:numId w:val="1036"/>
         </w:numPr>
       </w:pPr>
       <w:r>
@@ -18981,7 +19439,7 @@
         <w:pStyle w:val="Compact"/>
         <w:numPr>
           <w:ilvl w:val="0"/>
-          <w:numId w:val="1035"/>
+          <w:numId w:val="1036"/>
         </w:numPr>
       </w:pPr>
       <w:r>
@@ -18993,7 +19451,7 @@
         <w:pStyle w:val="Compact"/>
         <w:numPr>
           <w:ilvl w:val="0"/>
-          <w:numId w:val="1035"/>
+          <w:numId w:val="1036"/>
         </w:numPr>
       </w:pPr>
       <w:r>
@@ -19005,7 +19463,7 @@
         <w:pStyle w:val="Compact"/>
         <w:numPr>
           <w:ilvl w:val="0"/>
-          <w:numId w:val="1035"/>
+          <w:numId w:val="1036"/>
         </w:numPr>
       </w:pPr>
       <w:r>
@@ -19033,7 +19491,7 @@
         <w:pStyle w:val="Compact"/>
         <w:numPr>
           <w:ilvl w:val="0"/>
-          <w:numId w:val="1035"/>
+          <w:numId w:val="1036"/>
         </w:numPr>
       </w:pPr>
       <w:r>
@@ -19076,7 +19534,7 @@
         <w:pStyle w:val="Compact"/>
         <w:numPr>
           <w:ilvl w:val="0"/>
-          <w:numId w:val="1035"/>
+          <w:numId w:val="1036"/>
         </w:numPr>
       </w:pPr>
       <w:r>
@@ -19088,7 +19546,7 @@
         <w:pStyle w:val="Compact"/>
         <w:numPr>
           <w:ilvl w:val="0"/>
-          <w:numId w:val="1035"/>
+          <w:numId w:val="1036"/>
         </w:numPr>
       </w:pPr>
       <w:r>
@@ -19741,6 +20199,9 @@
     <w:abstractNumId w:val="991"/>
   </w:num>
   <w:num w:numId="1035">
+    <w:abstractNumId w:val="991"/>
+  </w:num>
+  <w:num w:numId="1036">
     <w:abstractNumId w:val="991"/>
   </w:num>
 </w:numbering>

</xml_diff>

<commit_message>
Backend: LP-fundraising CRM — prospect pipeline to commitment (Carta fund gap #5)
FR-J-16. A GP-side pipeline for raising the fund from prospective LPs, distinct
from the deal pipeline (which deploys capital). Prospects carry firm, kind
(institutional / family office / HNI / fund-of-funds), target cheque and a
stage; converting a won prospect creates an LP with their commitment
(idempotent-guarded). A fundraise summary shows committed vs target corpus with
progress, soft-circled and active-pipeline totals, and a per-stage breakdown.

- LPProspect model + LPProspectStage (Alembic d4e5f6a7b8c9)
- services: add_prospect, set_prospect_stage, convert_prospect_to_lp,
  fundraise_summary
- routes: GET /funds/{id}/fundraise, POST /funds/{id}/prospects,
  POST .../prospects/{pid}/stage, POST .../prospects/{pid}/convert
- 3 tests; full suite 284 passing. REQUIREMENTS -> v1.6 (FR-J-16).

Co-Authored-By: Claude Opus 4.8 <noreply@anthropic.com>
</commit_message>
<xml_diff>
--- a/REQUIREMENTS.docx
+++ b/REQUIREMENTS.docx
@@ -5891,6 +5891,168 @@
           <w:b/>
           <w:bCs/>
         </w:rPr>
+        <w:t xml:space="preserve">FR-J-16 (M — added v1.6, Carta fund gap)</w:t>
+      </w:r>
+      <w:r>
+        <w:t xml:space="preserve"> </w:t>
+      </w:r>
+      <w:r>
+        <w:t xml:space="preserve">✅</w:t>
+      </w:r>
+      <w:r>
+        <w:t xml:space="preserve"> </w:t>
+      </w:r>
+      <w:r>
+        <w:rPr>
+          <w:b/>
+          <w:bCs/>
+        </w:rPr>
+        <w:t xml:space="preserve">LP-fundraising CRM</w:t>
+      </w:r>
+      <w:r>
+        <w:t xml:space="preserve">: the GP-side pipeline for raising the fund</w:t>
+      </w:r>
+      <w:r>
+        <w:t xml:space="preserve"> </w:t>
+      </w:r>
+      <w:r>
+        <w:rPr>
+          <w:i/>
+          <w:iCs/>
+        </w:rPr>
+        <w:t xml:space="preserve">from</w:t>
+      </w:r>
+      <w:r>
+        <w:t xml:space="preserve"> </w:t>
+      </w:r>
+      <w:r>
+        <w:t xml:space="preserve">prospective LPs (distinct from the deal pipeline, which deploys capital). Prospects carry firm, kind (institutional / family office / HNI / fund-of-funds), target cheque and a stage (prospect → contacted → meeting → diligence → soft-circled → committed / passed);</w:t>
+      </w:r>
+      <w:r>
+        <w:t xml:space="preserve"> </w:t>
+      </w:r>
+      <w:r>
+        <w:rPr>
+          <w:b/>
+          <w:bCs/>
+        </w:rPr>
+        <w:t xml:space="preserve">converting</w:t>
+      </w:r>
+      <w:r>
+        <w:t xml:space="preserve"> </w:t>
+      </w:r>
+      <w:r>
+        <w:t xml:space="preserve">a won prospect creates an</w:t>
+      </w:r>
+      <w:r>
+        <w:t xml:space="preserve"> </w:t>
+      </w:r>
+      <w:r>
+        <w:rPr>
+          <w:rStyle w:val="VerbatimChar"/>
+        </w:rPr>
+        <w:t xml:space="preserve">LP</w:t>
+      </w:r>
+      <w:r>
+        <w:t xml:space="preserve"> </w:t>
+      </w:r>
+      <w:r>
+        <w:t xml:space="preserve">with their commitment (idempotent-guarded). A fundraise summary shows committed (actual LP capital) vs</w:t>
+      </w:r>
+      <w:r>
+        <w:t xml:space="preserve"> </w:t>
+      </w:r>
+      <w:r>
+        <w:rPr>
+          <w:b/>
+          <w:bCs/>
+        </w:rPr>
+        <w:t xml:space="preserve">target corpus</w:t>
+      </w:r>
+      <w:r>
+        <w:t xml:space="preserve"> </w:t>
+      </w:r>
+      <w:r>
+        <w:t xml:space="preserve">with progress, soft-circled and active-pipeline totals, and a per-stage breakdown.</w:t>
+      </w:r>
+      <w:r>
+        <w:t xml:space="preserve"> </w:t>
+      </w:r>
+      <w:r>
+        <w:rPr>
+          <w:rStyle w:val="VerbatimChar"/>
+        </w:rPr>
+        <w:t xml:space="preserve">GET /funds/{id}/fundraise</w:t>
+      </w:r>
+      <w:r>
+        <w:t xml:space="preserve">,</w:t>
+      </w:r>
+      <w:r>
+        <w:t xml:space="preserve"> </w:t>
+      </w:r>
+      <w:r>
+        <w:rPr>
+          <w:rStyle w:val="VerbatimChar"/>
+        </w:rPr>
+        <w:t xml:space="preserve">POST /funds/{id}/prospects</w:t>
+      </w:r>
+      <w:r>
+        <w:t xml:space="preserve">,</w:t>
+      </w:r>
+      <w:r>
+        <w:t xml:space="preserve"> </w:t>
+      </w:r>
+      <w:r>
+        <w:rPr>
+          <w:rStyle w:val="VerbatimChar"/>
+        </w:rPr>
+        <w:t xml:space="preserve">POST /funds/{id}/prospects/{pid}/stage</w:t>
+      </w:r>
+      <w:r>
+        <w:t xml:space="preserve">,</w:t>
+      </w:r>
+      <w:r>
+        <w:t xml:space="preserve"> </w:t>
+      </w:r>
+      <w:r>
+        <w:rPr>
+          <w:rStyle w:val="VerbatimChar"/>
+        </w:rPr>
+        <w:t xml:space="preserve">POST /funds/{id}/prospects/{pid}/convert</w:t>
+      </w:r>
+      <w:r>
+        <w:t xml:space="preserve">.</w:t>
+      </w:r>
+      <w:r>
+        <w:t xml:space="preserve"> </w:t>
+      </w:r>
+      <w:r>
+        <w:rPr>
+          <w:i/>
+          <w:iCs/>
+        </w:rPr>
+        <w:t xml:space="preserve">Remaining:</w:t>
+      </w:r>
+      <w:r>
+        <w:t xml:space="preserve"> </w:t>
+      </w:r>
+      <w:r>
+        <w:t xml:space="preserve">per-prospect activity log / documents; email capture.</w:t>
+      </w:r>
+    </w:p>
+    <w:p>
+      <w:pPr>
+        <w:pStyle w:val="Compact"/>
+        <w:numPr>
+          <w:ilvl w:val="0"/>
+          <w:numId w:val="1013"/>
+        </w:numPr>
+      </w:pPr>
+      <w:r>
+        <w:rPr>
+          <w:b/>
+          <w:bCs/>
+        </w:rPr>
         <w:t xml:space="preserve">FR-J-15 (M — added v1.6, Carta fund gap)</w:t>
       </w:r>
       <w:r>
@@ -12694,6 +12856,55 @@
             </w:pPr>
             <w:r>
               <w:t xml:space="preserve">append-only; latest updates the holding mark. Fund gains valuer_name + valuation_frequency_months (policy)</w:t>
+            </w:r>
+          </w:p>
+        </w:tc>
+      </w:tr>
+      <w:tr>
+        <w:tc>
+          <w:tcPr/>
+          <w:p>
+            <w:pPr>
+              <w:pStyle w:val="Compact"/>
+            </w:pPr>
+            <w:r>
+              <w:rPr>
+                <w:b/>
+                <w:bCs/>
+              </w:rPr>
+              <w:t xml:space="preserve">LPProspect</w:t>
+            </w:r>
+            <w:r>
+              <w:t xml:space="preserve"> </w:t>
+            </w:r>
+            <w:r>
+              <w:rPr>
+                <w:i/>
+                <w:iCs/>
+              </w:rPr>
+              <w:t xml:space="preserve">(v1.6)</w:t>
+            </w:r>
+          </w:p>
+        </w:tc>
+        <w:tc>
+          <w:tcPr/>
+          <w:p>
+            <w:pPr>
+              <w:pStyle w:val="Compact"/>
+            </w:pPr>
+            <w:r>
+              <w:t xml:space="preserve">fund_id, name, firm, kind, stage, target_commitment, lp_id</w:t>
+            </w:r>
+          </w:p>
+        </w:tc>
+        <w:tc>
+          <w:tcPr/>
+          <w:p>
+            <w:pPr>
+              <w:pStyle w:val="Compact"/>
+            </w:pPr>
+            <w:r>
+              <w:t xml:space="preserve">fund-raising pipeline; converting creates an LP</w:t>
             </w:r>
           </w:p>
         </w:tc>
@@ -15460,7 +15671,134 @@
         <w:t xml:space="preserve"> </w:t>
       </w:r>
       <w:r>
-        <w:t xml:space="preserve">— Carta fund gap #4:</w:t>
+        <w:t xml:space="preserve">— Carta fund gaps #4–#5:</w:t>
+      </w:r>
+    </w:p>
+    <w:p>
+      <w:pPr>
+        <w:pStyle w:val="Compact"/>
+        <w:numPr>
+          <w:ilvl w:val="0"/>
+          <w:numId w:val="1030"/>
+        </w:numPr>
+      </w:pPr>
+      <w:r>
+        <w:rPr>
+          <w:b/>
+          <w:bCs/>
+        </w:rPr>
+        <w:t xml:space="preserve">FR-J-16 LP-fundraising CRM</w:t>
+      </w:r>
+      <w:r>
+        <w:t xml:space="preserve"> </w:t>
+      </w:r>
+      <w:r>
+        <w:t xml:space="preserve">✅ — new</w:t>
+      </w:r>
+      <w:r>
+        <w:t xml:space="preserve"> </w:t>
+      </w:r>
+      <w:r>
+        <w:rPr>
+          <w:rStyle w:val="VerbatimChar"/>
+        </w:rPr>
+        <w:t xml:space="preserve">LPProspect</w:t>
+      </w:r>
+      <w:r>
+        <w:t xml:space="preserve"> </w:t>
+      </w:r>
+      <w:r>
+        <w:t xml:space="preserve">(Alembic</w:t>
+      </w:r>
+      <w:r>
+        <w:t xml:space="preserve"> </w:t>
+      </w:r>
+      <w:r>
+        <w:rPr>
+          <w:rStyle w:val="VerbatimChar"/>
+        </w:rPr>
+        <w:t xml:space="preserve">d4e5f6a7b8c9</w:t>
+      </w:r>
+      <w:r>
+        <w:t xml:space="preserve">): a GP-side pipeline for raising the fund from prospective LPs, with stages and convert-to-LP;</w:t>
+      </w:r>
+      <w:r>
+        <w:t xml:space="preserve"> </w:t>
+      </w:r>
+      <w:r>
+        <w:rPr>
+          <w:rStyle w:val="VerbatimChar"/>
+        </w:rPr>
+        <w:t xml:space="preserve">services/fund.py::add_prospect/set_prospect_stage/convert_prospect_to_lp/fundraise_summary</w:t>
+      </w:r>
+      <w:r>
+        <w:t xml:space="preserve">; routes under</w:t>
+      </w:r>
+      <w:r>
+        <w:t xml:space="preserve"> </w:t>
+      </w:r>
+      <w:r>
+        <w:rPr>
+          <w:rStyle w:val="VerbatimChar"/>
+        </w:rPr>
+        <w:t xml:space="preserve">/funds/{id}/prospects</w:t>
+      </w:r>
+      <w:r>
+        <w:t xml:space="preserve"> </w:t>
+      </w:r>
+      <w:r>
+        <w:t xml:space="preserve">+</w:t>
+      </w:r>
+      <w:r>
+        <w:t xml:space="preserve"> </w:t>
+      </w:r>
+      <w:r>
+        <w:rPr>
+          <w:rStyle w:val="VerbatimChar"/>
+        </w:rPr>
+        <w:t xml:space="preserve">/funds/{id}/fundraise</w:t>
+      </w:r>
+      <w:r>
+        <w:t xml:space="preserve">. Frontend</w:t>
+      </w:r>
+      <w:r>
+        <w:t xml:space="preserve"> </w:t>
+      </w:r>
+      <w:r>
+        <w:rPr>
+          <w:rStyle w:val="VerbatimChar"/>
+        </w:rPr>
+        <w:t xml:space="preserve">features/FundRaise.tsx</w:t>
+      </w:r>
+      <w:r>
+        <w:t xml:space="preserve"> </w:t>
+      </w:r>
+      <w:r>
+        <w:t xml:space="preserve">(summary tiles, progress-to-corpus bar, add-prospect form, pipeline table with stage select + convert) in the Fund workspace. 3 tests (</w:t>
+      </w:r>
+      <w:r>
+        <w:rPr>
+          <w:rStyle w:val="VerbatimChar"/>
+        </w:rPr>
+        <w:t xml:space="preserve">test_lp_prospects.py</w:t>
+      </w:r>
+      <w:r>
+        <w:t xml:space="preserve">). (Frontend api method names namespaced</w:t>
+      </w:r>
+      <w:r>
+        <w:t xml:space="preserve"> </w:t>
+      </w:r>
+      <w:r>
+        <w:rPr>
+          <w:rStyle w:val="VerbatimChar"/>
+        </w:rPr>
+        <w:t xml:space="preserve">addLpProspect</w:t>
+      </w:r>
+      <w:r>
+        <w:t xml:space="preserve"> </w:t>
+      </w:r>
+      <w:r>
+        <w:t xml:space="preserve">etc. to avoid clashing with the startup investor-funnel methods.)</w:t>
       </w:r>
     </w:p>
     <w:p>

</xml_diff>

<commit_message>
Backend: deal-CRM depth — contacts + activity timeline (Carta fund gap #6)
FR-J-17. Relationship intelligence on the deal pipeline: per-deal contacts
(name, role, email) and a dated, append-only activity timeline (note / meeting
/ call / email), newest-first.

- DealContact + DealActivity models (Alembic e5f6a7b8c9d0)
- routes (deal_ctx-scoped): GET /deals/{id}/crm, POST /deals/{id}/contacts,
  POST /deals/{id}/activities
- 3 tests; full suite 287 passing. REQUIREMENTS -> v1.6 (FR-J-17).

Co-Authored-By: Claude Opus 4.8 <noreply@anthropic.com>
</commit_message>
<xml_diff>
--- a/REQUIREMENTS.docx
+++ b/REQUIREMENTS.docx
@@ -5891,6 +5891,125 @@
           <w:b/>
           <w:bCs/>
         </w:rPr>
+        <w:t xml:space="preserve">FR-J-17 (M — added v1.6, Carta fund gap)</w:t>
+      </w:r>
+      <w:r>
+        <w:t xml:space="preserve"> </w:t>
+      </w:r>
+      <w:r>
+        <w:t xml:space="preserve">✅</w:t>
+      </w:r>
+      <w:r>
+        <w:t xml:space="preserve"> </w:t>
+      </w:r>
+      <w:r>
+        <w:rPr>
+          <w:b/>
+          <w:bCs/>
+        </w:rPr>
+        <w:t xml:space="preserve">Deal-CRM depth</w:t>
+      </w:r>
+      <w:r>
+        <w:t xml:space="preserve">: relationship intelligence on the deal pipeline — per-deal</w:t>
+      </w:r>
+      <w:r>
+        <w:t xml:space="preserve"> </w:t>
+      </w:r>
+      <w:r>
+        <w:rPr>
+          <w:b/>
+          <w:bCs/>
+        </w:rPr>
+        <w:t xml:space="preserve">contacts</w:t>
+      </w:r>
+      <w:r>
+        <w:t xml:space="preserve"> </w:t>
+      </w:r>
+      <w:r>
+        <w:t xml:space="preserve">(name, role, email) and a dated</w:t>
+      </w:r>
+      <w:r>
+        <w:t xml:space="preserve"> </w:t>
+      </w:r>
+      <w:r>
+        <w:rPr>
+          <w:b/>
+          <w:bCs/>
+        </w:rPr>
+        <w:t xml:space="preserve">activity timeline</w:t>
+      </w:r>
+      <w:r>
+        <w:t xml:space="preserve"> </w:t>
+      </w:r>
+      <w:r>
+        <w:t xml:space="preserve">(note / meeting / call / email, newest-first, append-only). Expandable per-deal panel in the pipeline.</w:t>
+      </w:r>
+      <w:r>
+        <w:t xml:space="preserve"> </w:t>
+      </w:r>
+      <w:r>
+        <w:rPr>
+          <w:rStyle w:val="VerbatimChar"/>
+        </w:rPr>
+        <w:t xml:space="preserve">GET /deals/{id}/crm</w:t>
+      </w:r>
+      <w:r>
+        <w:t xml:space="preserve">,</w:t>
+      </w:r>
+      <w:r>
+        <w:t xml:space="preserve"> </w:t>
+      </w:r>
+      <w:r>
+        <w:rPr>
+          <w:rStyle w:val="VerbatimChar"/>
+        </w:rPr>
+        <w:t xml:space="preserve">POST /deals/{id}/contacts</w:t>
+      </w:r>
+      <w:r>
+        <w:t xml:space="preserve">,</w:t>
+      </w:r>
+      <w:r>
+        <w:t xml:space="preserve"> </w:t>
+      </w:r>
+      <w:r>
+        <w:rPr>
+          <w:rStyle w:val="VerbatimChar"/>
+        </w:rPr>
+        <w:t xml:space="preserve">POST /deals/{id}/activities</w:t>
+      </w:r>
+      <w:r>
+        <w:t xml:space="preserve">.</w:t>
+      </w:r>
+      <w:r>
+        <w:t xml:space="preserve"> </w:t>
+      </w:r>
+      <w:r>
+        <w:rPr>
+          <w:i/>
+          <w:iCs/>
+        </w:rPr>
+        <w:t xml:space="preserve">Remaining:</w:t>
+      </w:r>
+      <w:r>
+        <w:t xml:space="preserve"> </w:t>
+      </w:r>
+      <w:r>
+        <w:t xml:space="preserve">email/calendar sync; relationship-path mapping.</w:t>
+      </w:r>
+    </w:p>
+    <w:p>
+      <w:pPr>
+        <w:pStyle w:val="Compact"/>
+        <w:numPr>
+          <w:ilvl w:val="0"/>
+          <w:numId w:val="1013"/>
+        </w:numPr>
+      </w:pPr>
+      <w:r>
+        <w:rPr>
+          <w:b/>
+          <w:bCs/>
+        </w:rPr>
         <w:t xml:space="preserve">FR-J-16 (M — added v1.6, Carta fund gap)</w:t>
       </w:r>
       <w:r>
@@ -12905,6 +13024,55 @@
             </w:pPr>
             <w:r>
               <w:t xml:space="preserve">fund-raising pipeline; converting creates an LP</w:t>
+            </w:r>
+          </w:p>
+        </w:tc>
+      </w:tr>
+      <w:tr>
+        <w:tc>
+          <w:tcPr/>
+          <w:p>
+            <w:pPr>
+              <w:pStyle w:val="Compact"/>
+            </w:pPr>
+            <w:r>
+              <w:rPr>
+                <w:b/>
+                <w:bCs/>
+              </w:rPr>
+              <w:t xml:space="preserve">DealContact / DealActivity</w:t>
+            </w:r>
+            <w:r>
+              <w:t xml:space="preserve"> </w:t>
+            </w:r>
+            <w:r>
+              <w:rPr>
+                <w:i/>
+                <w:iCs/>
+              </w:rPr>
+              <w:t xml:space="preserve">(v1.6)</w:t>
+            </w:r>
+          </w:p>
+        </w:tc>
+        <w:tc>
+          <w:tcPr/>
+          <w:p>
+            <w:pPr>
+              <w:pStyle w:val="Compact"/>
+            </w:pPr>
+            <w:r>
+              <w:t xml:space="preserve">deal_id; name/role/email · kind/body/occurred_on</w:t>
+            </w:r>
+          </w:p>
+        </w:tc>
+        <w:tc>
+          <w:tcPr/>
+          <w:p>
+            <w:pPr>
+              <w:pStyle w:val="Compact"/>
+            </w:pPr>
+            <w:r>
+              <w:t xml:space="preserve">deal-CRM relationship intelligence + activity timeline</w:t>
             </w:r>
           </w:p>
         </w:tc>
@@ -15671,7 +15839,131 @@
         <w:t xml:space="preserve"> </w:t>
       </w:r>
       <w:r>
-        <w:t xml:space="preserve">— Carta fund gaps #4–#5:</w:t>
+        <w:t xml:space="preserve">— Carta fund gaps #4–#6:</w:t>
+      </w:r>
+    </w:p>
+    <w:p>
+      <w:pPr>
+        <w:pStyle w:val="Compact"/>
+        <w:numPr>
+          <w:ilvl w:val="0"/>
+          <w:numId w:val="1030"/>
+        </w:numPr>
+      </w:pPr>
+      <w:r>
+        <w:rPr>
+          <w:b/>
+          <w:bCs/>
+        </w:rPr>
+        <w:t xml:space="preserve">FR-J-17 Deal-CRM depth</w:t>
+      </w:r>
+      <w:r>
+        <w:t xml:space="preserve"> </w:t>
+      </w:r>
+      <w:r>
+        <w:t xml:space="preserve">✅ — new</w:t>
+      </w:r>
+      <w:r>
+        <w:t xml:space="preserve"> </w:t>
+      </w:r>
+      <w:r>
+        <w:rPr>
+          <w:rStyle w:val="VerbatimChar"/>
+        </w:rPr>
+        <w:t xml:space="preserve">DealContact</w:t>
+      </w:r>
+      <w:r>
+        <w:t xml:space="preserve"> </w:t>
+      </w:r>
+      <w:r>
+        <w:t xml:space="preserve">+</w:t>
+      </w:r>
+      <w:r>
+        <w:t xml:space="preserve"> </w:t>
+      </w:r>
+      <w:r>
+        <w:rPr>
+          <w:rStyle w:val="VerbatimChar"/>
+        </w:rPr>
+        <w:t xml:space="preserve">DealActivity</w:t>
+      </w:r>
+      <w:r>
+        <w:t xml:space="preserve"> </w:t>
+      </w:r>
+      <w:r>
+        <w:t xml:space="preserve">(Alembic</w:t>
+      </w:r>
+      <w:r>
+        <w:t xml:space="preserve"> </w:t>
+      </w:r>
+      <w:r>
+        <w:rPr>
+          <w:rStyle w:val="VerbatimChar"/>
+        </w:rPr>
+        <w:t xml:space="preserve">e5f6a7b8c9d0</w:t>
+      </w:r>
+      <w:r>
+        <w:t xml:space="preserve">): per-deal contacts and a dated activity timeline on the existing deal pipeline. Routes</w:t>
+      </w:r>
+      <w:r>
+        <w:t xml:space="preserve"> </w:t>
+      </w:r>
+      <w:r>
+        <w:rPr>
+          <w:rStyle w:val="VerbatimChar"/>
+        </w:rPr>
+        <w:t xml:space="preserve">GET /deals/{id}/crm</w:t>
+      </w:r>
+      <w:r>
+        <w:t xml:space="preserve">,</w:t>
+      </w:r>
+      <w:r>
+        <w:t xml:space="preserve"> </w:t>
+      </w:r>
+      <w:r>
+        <w:rPr>
+          <w:rStyle w:val="VerbatimChar"/>
+        </w:rPr>
+        <w:t xml:space="preserve">POST /deals/{id}/contacts</w:t>
+      </w:r>
+      <w:r>
+        <w:t xml:space="preserve">,</w:t>
+      </w:r>
+      <w:r>
+        <w:t xml:space="preserve"> </w:t>
+      </w:r>
+      <w:r>
+        <w:rPr>
+          <w:rStyle w:val="VerbatimChar"/>
+        </w:rPr>
+        <w:t xml:space="preserve">POST /deals/{id}/activities</w:t>
+      </w:r>
+      <w:r>
+        <w:t xml:space="preserve">. Frontend: expandable per-deal CRM panel in</w:t>
+      </w:r>
+      <w:r>
+        <w:t xml:space="preserve"> </w:t>
+      </w:r>
+      <w:r>
+        <w:rPr>
+          <w:rStyle w:val="VerbatimChar"/>
+        </w:rPr>
+        <w:t xml:space="preserve">features/DealPipeline.tsx</w:t>
+      </w:r>
+      <w:r>
+        <w:t xml:space="preserve"> </w:t>
+      </w:r>
+      <w:r>
+        <w:t xml:space="preserve">(contacts list + add, activity timeline + log). 3 tests (</w:t>
+      </w:r>
+      <w:r>
+        <w:rPr>
+          <w:rStyle w:val="VerbatimChar"/>
+        </w:rPr>
+        <w:t xml:space="preserve">test_deal_crm.py</w:t>
+      </w:r>
+      <w:r>
+        <w:t xml:space="preserve">).</w:t>
       </w:r>
     </w:p>
     <w:p>

</xml_diff>

<commit_message>
Backend: LP self-service — consolidated position + online capital-call notices
FR-J-18 (Carta fund gap #7, self-service half; money movement via NACH/UPI is
explicitly out of scope — integration-blocked). The portal payload gains:

- lp_summary: consolidated cross-fund LP position — committed / drawn /
  uncalled / distributed, NAV of the LP's units (unitised model), and a
  pending-call count.
- per-fund capital_calls: the LP's drawdown notices with call no., purpose,
  due date, amount, paid state and an overdue flag.

LPs acknowledge notices online (POST /portal/notices/{id}/ack — email-scoped,
idempotent; drawdown_notices.acknowledged_at, Alembic f6a7b8c9d0e1) and the GP
sees acknowledgement status per notice.

3 tests; full suite 290 passing. REQUIREMENTS -> v1.6 (FR-J-18).

Co-Authored-By: Claude Opus 4.8 <noreply@anthropic.com>
</commit_message>
<xml_diff>
--- a/REQUIREMENTS.docx
+++ b/REQUIREMENTS.docx
@@ -5891,6 +5891,158 @@
           <w:b/>
           <w:bCs/>
         </w:rPr>
+        <w:t xml:space="preserve">FR-J-18 (M — added v1.6, Carta fund gap)</w:t>
+      </w:r>
+      <w:r>
+        <w:t xml:space="preserve"> </w:t>
+      </w:r>
+      <w:r>
+        <w:t xml:space="preserve">✅</w:t>
+      </w:r>
+      <w:r>
+        <w:t xml:space="preserve"> </w:t>
+      </w:r>
+      <w:r>
+        <w:rPr>
+          <w:b/>
+          <w:bCs/>
+        </w:rPr>
+        <w:t xml:space="preserve">LP self-service — consolidated view + online capital-call notices</w:t>
+      </w:r>
+      <w:r>
+        <w:t xml:space="preserve">: the portal shows a</w:t>
+      </w:r>
+      <w:r>
+        <w:t xml:space="preserve"> </w:t>
+      </w:r>
+      <w:r>
+        <w:rPr>
+          <w:b/>
+          <w:bCs/>
+        </w:rPr>
+        <w:t xml:space="preserve">consolidated LP position across every fund</w:t>
+      </w:r>
+      <w:r>
+        <w:t xml:space="preserve"> </w:t>
+      </w:r>
+      <w:r>
+        <w:t xml:space="preserve">(committed / drawn / uncalled / distributed /</w:t>
+      </w:r>
+      <w:r>
+        <w:t xml:space="preserve"> </w:t>
+      </w:r>
+      <w:r>
+        <w:rPr>
+          <w:b/>
+          <w:bCs/>
+        </w:rPr>
+        <w:t xml:space="preserve">NAV of the LP's units</w:t>
+      </w:r>
+      <w:r>
+        <w:t xml:space="preserve"> </w:t>
+      </w:r>
+      <w:r>
+        <w:t xml:space="preserve">via the unitised model / pending-call count) and, per fund, the LP's</w:t>
+      </w:r>
+      <w:r>
+        <w:t xml:space="preserve"> </w:t>
+      </w:r>
+      <w:r>
+        <w:rPr>
+          <w:b/>
+          <w:bCs/>
+        </w:rPr>
+        <w:t xml:space="preserve">capital-call notices</w:t>
+      </w:r>
+      <w:r>
+        <w:t xml:space="preserve"> </w:t>
+      </w:r>
+      <w:r>
+        <w:t xml:space="preserve">(call no., purpose, due date, amount, paid / pending /</w:t>
+      </w:r>
+      <w:r>
+        <w:t xml:space="preserve"> </w:t>
+      </w:r>
+      <w:r>
+        <w:rPr>
+          <w:b/>
+          <w:bCs/>
+        </w:rPr>
+        <w:t xml:space="preserve">overdue</w:t>
+      </w:r>
+      <w:r>
+        <w:t xml:space="preserve"> </w:t>
+      </w:r>
+      <w:r>
+        <w:t xml:space="preserve">status) which the LP can</w:t>
+      </w:r>
+      <w:r>
+        <w:t xml:space="preserve"> </w:t>
+      </w:r>
+      <w:r>
+        <w:rPr>
+          <w:b/>
+          <w:bCs/>
+        </w:rPr>
+        <w:t xml:space="preserve">acknowledge</w:t>
+      </w:r>
+      <w:r>
+        <w:t xml:space="preserve"> </w:t>
+      </w:r>
+      <w:r>
+        <w:t xml:space="preserve">online (idempotent, email-scoped); the GP sees acknowledgement status per notice in the Fund workspace (</w:t>
+      </w:r>
+      <w:r>
+        <w:rPr>
+          <w:rStyle w:val="VerbatimChar"/>
+        </w:rPr>
+        <w:t xml:space="preserve">drawdown_notices.acknowledged_at</w:t>
+      </w:r>
+      <w:r>
+        <w:t xml:space="preserve">).</w:t>
+      </w:r>
+      <w:r>
+        <w:t xml:space="preserve"> </w:t>
+      </w:r>
+      <w:r>
+        <w:rPr>
+          <w:rStyle w:val="VerbatimChar"/>
+        </w:rPr>
+        <w:t xml:space="preserve">POST /portal/notices/{id}/ack</w:t>
+      </w:r>
+      <w:r>
+        <w:t xml:space="preserve">.</w:t>
+      </w:r>
+      <w:r>
+        <w:t xml:space="preserve"> </w:t>
+      </w:r>
+      <w:r>
+        <w:rPr>
+          <w:i/>
+          <w:iCs/>
+        </w:rPr>
+        <w:t xml:space="preserve">Explicitly out of scope (integration-blocked):</w:t>
+      </w:r>
+      <w:r>
+        <w:t xml:space="preserve"> </w:t>
+      </w:r>
+      <w:r>
+        <w:t xml:space="preserve">money movement — collecting drawdowns / paying distributions via NACH/UPI needs live payment rails.</w:t>
+      </w:r>
+    </w:p>
+    <w:p>
+      <w:pPr>
+        <w:pStyle w:val="Compact"/>
+        <w:numPr>
+          <w:ilvl w:val="0"/>
+          <w:numId w:val="1013"/>
+        </w:numPr>
+      </w:pPr>
+      <w:r>
+        <w:rPr>
+          <w:b/>
+          <w:bCs/>
+        </w:rPr>
         <w:t xml:space="preserve">FR-J-17 (M — added v1.6, Carta fund gap)</w:t>
       </w:r>
       <w:r>
@@ -15839,7 +15991,140 @@
         <w:t xml:space="preserve"> </w:t>
       </w:r>
       <w:r>
-        <w:t xml:space="preserve">— Carta fund gaps #4–#6:</w:t>
+        <w:t xml:space="preserve">— Carta fund gaps #4–#7:</w:t>
+      </w:r>
+    </w:p>
+    <w:p>
+      <w:pPr>
+        <w:pStyle w:val="Compact"/>
+        <w:numPr>
+          <w:ilvl w:val="0"/>
+          <w:numId w:val="1030"/>
+        </w:numPr>
+      </w:pPr>
+      <w:r>
+        <w:rPr>
+          <w:b/>
+          <w:bCs/>
+        </w:rPr>
+        <w:t xml:space="preserve">FR-J-18 LP self-service</w:t>
+      </w:r>
+      <w:r>
+        <w:t xml:space="preserve"> </w:t>
+      </w:r>
+      <w:r>
+        <w:t xml:space="preserve">✅ —</w:t>
+      </w:r>
+      <w:r>
+        <w:t xml:space="preserve"> </w:t>
+      </w:r>
+      <w:r>
+        <w:rPr>
+          <w:rStyle w:val="VerbatimChar"/>
+        </w:rPr>
+        <w:t xml:space="preserve">drawdown_notices.acknowledged_at</w:t>
+      </w:r>
+      <w:r>
+        <w:t xml:space="preserve"> </w:t>
+      </w:r>
+      <w:r>
+        <w:t xml:space="preserve">(Alembic</w:t>
+      </w:r>
+      <w:r>
+        <w:t xml:space="preserve"> </w:t>
+      </w:r>
+      <w:r>
+        <w:rPr>
+          <w:rStyle w:val="VerbatimChar"/>
+        </w:rPr>
+        <w:t xml:space="preserve">f6a7b8c9d0e1</w:t>
+      </w:r>
+      <w:r>
+        <w:t xml:space="preserve">); portal payload gains</w:t>
+      </w:r>
+      <w:r>
+        <w:t xml:space="preserve"> </w:t>
+      </w:r>
+      <w:r>
+        <w:rPr>
+          <w:rStyle w:val="VerbatimChar"/>
+        </w:rPr>
+        <w:t xml:space="preserve">lp_summary</w:t>
+      </w:r>
+      <w:r>
+        <w:t xml:space="preserve"> </w:t>
+      </w:r>
+      <w:r>
+        <w:t xml:space="preserve">(consolidated cross-fund LP position incl. NAV of units) and per-fund</w:t>
+      </w:r>
+      <w:r>
+        <w:t xml:space="preserve"> </w:t>
+      </w:r>
+      <w:r>
+        <w:rPr>
+          <w:rStyle w:val="VerbatimChar"/>
+        </w:rPr>
+        <w:t xml:space="preserve">capital_calls</w:t>
+      </w:r>
+      <w:r>
+        <w:t xml:space="preserve"> </w:t>
+      </w:r>
+      <w:r>
+        <w:t xml:space="preserve">(notices w/ purpose, due date, overdue flag);</w:t>
+      </w:r>
+      <w:r>
+        <w:t xml:space="preserve"> </w:t>
+      </w:r>
+      <w:r>
+        <w:rPr>
+          <w:rStyle w:val="VerbatimChar"/>
+        </w:rPr>
+        <w:t xml:space="preserve">POST /portal/notices/{id}/ack</w:t>
+      </w:r>
+      <w:r>
+        <w:t xml:space="preserve"> </w:t>
+      </w:r>
+      <w:r>
+        <w:t xml:space="preserve">(email-scoped, idempotent); GP capital-calls table shows acknowledgement. Frontend:</w:t>
+      </w:r>
+      <w:r>
+        <w:t xml:space="preserve"> </w:t>
+      </w:r>
+      <w:r>
+        <w:rPr>
+          <w:rStyle w:val="VerbatimChar"/>
+        </w:rPr>
+        <w:t xml:space="preserve">Portal.tsx</w:t>
+      </w:r>
+      <w:r>
+        <w:t xml:space="preserve"> </w:t>
+      </w:r>
+      <w:r>
+        <w:t xml:space="preserve">LP-position tile row + notices table with Acknowledge;</w:t>
+      </w:r>
+      <w:r>
+        <w:t xml:space="preserve"> </w:t>
+      </w:r>
+      <w:r>
+        <w:rPr>
+          <w:rStyle w:val="VerbatimChar"/>
+        </w:rPr>
+        <w:t xml:space="preserve">Fund.tsx</w:t>
+      </w:r>
+      <w:r>
+        <w:t xml:space="preserve"> </w:t>
+      </w:r>
+      <w:r>
+        <w:t xml:space="preserve">ack badges. 3 tests (</w:t>
+      </w:r>
+      <w:r>
+        <w:rPr>
+          <w:rStyle w:val="VerbatimChar"/>
+        </w:rPr>
+        <w:t xml:space="preserve">test_lp_selfservice.py</w:t>
+      </w:r>
+      <w:r>
+        <w:t xml:space="preserve">). Money movement (NACH/UPI) explicitly excluded — integration-blocked.</w:t>
       </w:r>
     </w:p>
     <w:p>

</xml_diff>

<commit_message>
Frontend: Fund workspace QA pass — sub-tabs + formatting consistency
The Fund tab had grown to 13 stacked sections. Reorganised into six sub-tabs
(Capital & LPs / LP fundraise / Portfolio / Deal pipeline / Plan & forecast /
Financials) following the CapTableHub pattern, with the fund summary card
always visible above.

Consistency sweep: legacy raw ₹ interpolation routed through fmtMoney/fmtInt
(lakh/crore grouping) across the header, capital accounts, calls,
distributions, portfolio, SoI and deal cheques; drawdown-notice table gained a
header row; capital-accounts and portfolio empties now use EmptyState; success
toasts wired on the remaining fund actions.

Presentation-only — no backend changes. tsc clean, 7/7 frontend tests, all six
sub-tabs verified live.

Co-Authored-By: Claude Opus 4.8 <noreply@anthropic.com>
</commit_message>
<xml_diff>
--- a/REQUIREMENTS.docx
+++ b/REQUIREMENTS.docx
@@ -15992,6 +15992,95 @@
       </w:r>
       <w:r>
         <w:t xml:space="preserve">— Carta fund gaps #4–#7:</w:t>
+      </w:r>
+    </w:p>
+    <w:p>
+      <w:pPr>
+        <w:pStyle w:val="Compact"/>
+        <w:numPr>
+          <w:ilvl w:val="0"/>
+          <w:numId w:val="1030"/>
+        </w:numPr>
+      </w:pPr>
+      <w:r>
+        <w:rPr>
+          <w:b/>
+          <w:bCs/>
+        </w:rPr>
+        <w:t xml:space="preserve">Fund workspace QA pass</w:t>
+      </w:r>
+      <w:r>
+        <w:t xml:space="preserve"> </w:t>
+      </w:r>
+      <w:r>
+        <w:t xml:space="preserve">(presentation-only, after the batch): the Fund tab's 13 stacked sections reorganised into</w:t>
+      </w:r>
+      <w:r>
+        <w:t xml:space="preserve"> </w:t>
+      </w:r>
+      <w:r>
+        <w:rPr>
+          <w:b/>
+          <w:bCs/>
+        </w:rPr>
+        <w:t xml:space="preserve">six sub-tabs</w:t>
+      </w:r>
+      <w:r>
+        <w:t xml:space="preserve"> </w:t>
+      </w:r>
+      <w:r>
+        <w:t xml:space="preserve">(Capital &amp; LPs · LP fundraise · Portfolio · Deal pipeline · Plan &amp; forecast · Financials) following the CapTableHub pattern, with the fund summary card always visible above; all legacy raw</w:t>
+      </w:r>
+      <w:r>
+        <w:t xml:space="preserve"> </w:t>
+      </w:r>
+      <w:r>
+        <w:rPr>
+          <w:rStyle w:val="VerbatimChar"/>
+        </w:rPr>
+        <w:t xml:space="preserve">₹{...}</w:t>
+      </w:r>
+      <w:r>
+        <w:t xml:space="preserve"> </w:t>
+      </w:r>
+      <w:r>
+        <w:t xml:space="preserve">interpolation in Fund/DealPipeline routed through</w:t>
+      </w:r>
+      <w:r>
+        <w:t xml:space="preserve"> </w:t>
+      </w:r>
+      <w:r>
+        <w:rPr>
+          <w:rStyle w:val="VerbatimChar"/>
+        </w:rPr>
+        <w:t xml:space="preserve">fmtMoney</w:t>
+      </w:r>
+      <w:r>
+        <w:t xml:space="preserve">/</w:t>
+      </w:r>
+      <w:r>
+        <w:rPr>
+          <w:rStyle w:val="VerbatimChar"/>
+        </w:rPr>
+        <w:t xml:space="preserve">fmtInt</w:t>
+      </w:r>
+      <w:r>
+        <w:t xml:space="preserve"> </w:t>
+      </w:r>
+      <w:r>
+        <w:t xml:space="preserve">(lakh/crore grouping); drawdown-notice table gained a header; portfolio/capital-accounts empties now use</w:t>
+      </w:r>
+      <w:r>
+        <w:t xml:space="preserve"> </w:t>
+      </w:r>
+      <w:r>
+        <w:rPr>
+          <w:rStyle w:val="VerbatimChar"/>
+        </w:rPr>
+        <w:t xml:space="preserve">EmptyState</w:t>
+      </w:r>
+      <w:r>
+        <w:t xml:space="preserve">; success toasts wired on the remaining fund actions. No backend changes.</w:t>
       </w:r>
     </w:p>
     <w:p>

</xml_diff>

<commit_message>
Frontend: app-wide money-format sweep + deep-linkable Fund sub-tabs
QA pass 2 (presentation-only):

- Routed the remaining ~60 raw JSX `₹{...}` interpolations across 21 files
  (Portal, Fundraising, CapTable/Advanced, ESOP expense, SPV, scenario and
  valuation tools, registers, pipeline, Invest page, ...) through fmtMoney so
  every amount renders with Indian lakh/crore grouping. Zero raw
  interpolations remain (`grep '₹{'` is clean). Dashboard FMV test updated
  for the <=2dp formatting.
- The Fund workspace honours ?tab=fund&sub=<key> deep links: EntityDetail
  captures ?sub= alongside ?tab= and Fund validates it against its sub-tabs.

tsc clean, 7/7 frontend tests, Portal / Fundraising / Fund deep link verified
live with a clean console. No backend changes.

Co-Authored-By: Claude Opus 4.8 <noreply@anthropic.com>
</commit_message>
<xml_diff>
--- a/REQUIREMENTS.docx
+++ b/REQUIREMENTS.docx
@@ -15992,6 +15992,73 @@
       </w:r>
       <w:r>
         <w:t xml:space="preserve">— Carta fund gaps #4–#7:</w:t>
+      </w:r>
+    </w:p>
+    <w:p>
+      <w:pPr>
+        <w:pStyle w:val="Compact"/>
+        <w:numPr>
+          <w:ilvl w:val="0"/>
+          <w:numId w:val="1030"/>
+        </w:numPr>
+      </w:pPr>
+      <w:r>
+        <w:rPr>
+          <w:b/>
+          <w:bCs/>
+        </w:rPr>
+        <w:t xml:space="preserve">App-wide money-format sweep + deep-linkable Fund sub-tabs</w:t>
+      </w:r>
+      <w:r>
+        <w:t xml:space="preserve"> </w:t>
+      </w:r>
+      <w:r>
+        <w:t xml:space="preserve">(presentation-only): the remaining ~60 raw</w:t>
+      </w:r>
+      <w:r>
+        <w:t xml:space="preserve"> </w:t>
+      </w:r>
+      <w:r>
+        <w:rPr>
+          <w:rStyle w:val="VerbatimChar"/>
+        </w:rPr>
+        <w:t xml:space="preserve">₹{...}</w:t>
+      </w:r>
+      <w:r>
+        <w:t xml:space="preserve"> </w:t>
+      </w:r>
+      <w:r>
+        <w:t xml:space="preserve">interpolations across 21 files (Portal, Fundraising, CapTable(+Advanced), ESOP, SPV, scenario/valuation tools, registers, pipeline, Invest page …) routed through</w:t>
+      </w:r>
+      <w:r>
+        <w:t xml:space="preserve"> </w:t>
+      </w:r>
+      <w:r>
+        <w:rPr>
+          <w:rStyle w:val="VerbatimChar"/>
+        </w:rPr>
+        <w:t xml:space="preserve">fmtMoney</w:t>
+      </w:r>
+      <w:r>
+        <w:t xml:space="preserve"> </w:t>
+      </w:r>
+      <w:r>
+        <w:t xml:space="preserve">(lakh/crore grouping; per-share prices now ≤2dp — the dashboard FMV test updated accordingly); the Fund workspace honours</w:t>
+      </w:r>
+      <w:r>
+        <w:t xml:space="preserve"> </w:t>
+      </w:r>
+      <w:r>
+        <w:rPr>
+          <w:rStyle w:val="VerbatimChar"/>
+        </w:rPr>
+        <w:t xml:space="preserve">?tab=fund&amp;sub=&lt;key&gt;</w:t>
+      </w:r>
+      <w:r>
+        <w:t xml:space="preserve"> </w:t>
+      </w:r>
+      <w:r>
+        <w:t xml:space="preserve">deep links (command palette / shared URLs).</w:t>
       </w:r>
     </w:p>
     <w:p>

</xml_diff>

<commit_message>
Backend: KPI reporting requests — investee self-service (Vestberry gap #1)
FR-J-19. The GP asks each portfolio company's reporting contact for a KPI
period; the contact sees the request in their portal (plus an in-app
notification if they have an account), submits revenue/cash/burn/headcount,
and the GP accepts the submission into PortfolioKPI or reopens it for
resubmission. Lifecycle pending -> submitted -> accepted with email-scoped
submission and 409 double-submit/accept guards; overdue flags vs due date.

- KPIRequest model + portfolio_investments.contact_email (Alembic a7b8c9d0e1f2)
- services: create/list/accept/reopen (fund), kpi_requests_for_user + submit
  (portal); monitoring payload now carries contact_email
- routes: /funds/{id}/kpi-requests (+ per-investment create, accept, reopen),
  /portal/kpi-requests/{id}/submit
- 3 tests; full suite 293 passing. REQUIREMENTS -> v1.7 (FR-J-19).

Co-Authored-By: Claude Opus 4.8 <noreply@anthropic.com>
</commit_message>
<xml_diff>
--- a/REQUIREMENTS.docx
+++ b/REQUIREMENTS.docx
@@ -5891,6 +5891,184 @@
           <w:b/>
           <w:bCs/>
         </w:rPr>
+        <w:t xml:space="preserve">FR-J-19 (M — added v1.7, Vestberry gap)</w:t>
+      </w:r>
+      <w:r>
+        <w:t xml:space="preserve"> </w:t>
+      </w:r>
+      <w:r>
+        <w:t xml:space="preserve">✅</w:t>
+      </w:r>
+      <w:r>
+        <w:t xml:space="preserve"> </w:t>
+      </w:r>
+      <w:r>
+        <w:rPr>
+          <w:b/>
+          <w:bCs/>
+        </w:rPr>
+        <w:t xml:space="preserve">KPI reporting requests (investee self-service)</w:t>
+      </w:r>
+      <w:r>
+        <w:t xml:space="preserve">: the GP asks each portfolio company's</w:t>
+      </w:r>
+      <w:r>
+        <w:t xml:space="preserve"> </w:t>
+      </w:r>
+      <w:r>
+        <w:rPr>
+          <w:b/>
+          <w:bCs/>
+        </w:rPr>
+        <w:t xml:space="preserve">reporting contact</w:t>
+      </w:r>
+      <w:r>
+        <w:t xml:space="preserve"> </w:t>
+      </w:r>
+      <w:r>
+        <w:t xml:space="preserve">(email stored on the investment) for a KPI period; the contact sees the request in</w:t>
+      </w:r>
+      <w:r>
+        <w:t xml:space="preserve"> </w:t>
+      </w:r>
+      <w:r>
+        <w:rPr>
+          <w:b/>
+          <w:bCs/>
+        </w:rPr>
+        <w:t xml:space="preserve">their portal</w:t>
+      </w:r>
+      <w:r>
+        <w:t xml:space="preserve"> </w:t>
+      </w:r>
+      <w:r>
+        <w:t xml:space="preserve">(plus an in-app notification if they have an account) with due date and overdue flag, submits revenue/cash/burn/headcount, and the GP</w:t>
+      </w:r>
+      <w:r>
+        <w:t xml:space="preserve"> </w:t>
+      </w:r>
+      <w:r>
+        <w:rPr>
+          <w:b/>
+          <w:bCs/>
+        </w:rPr>
+        <w:t xml:space="preserve">accepts</w:t>
+      </w:r>
+      <w:r>
+        <w:t xml:space="preserve"> </w:t>
+      </w:r>
+      <w:r>
+        <w:t xml:space="preserve">the submission into</w:t>
+      </w:r>
+      <w:r>
+        <w:t xml:space="preserve"> </w:t>
+      </w:r>
+      <w:r>
+        <w:rPr>
+          <w:rStyle w:val="VerbatimChar"/>
+        </w:rPr>
+        <w:t xml:space="preserve">PortfolioKPI</w:t>
+      </w:r>
+      <w:r>
+        <w:t xml:space="preserve"> </w:t>
+      </w:r>
+      <w:r>
+        <w:t xml:space="preserve">(or</w:t>
+      </w:r>
+      <w:r>
+        <w:t xml:space="preserve"> </w:t>
+      </w:r>
+      <w:r>
+        <w:rPr>
+          <w:b/>
+          <w:bCs/>
+        </w:rPr>
+        <w:t xml:space="preserve">reopens</w:t>
+      </w:r>
+      <w:r>
+        <w:t xml:space="preserve"> </w:t>
+      </w:r>
+      <w:r>
+        <w:t xml:space="preserve">it for resubmission). Request lifecycle pending → submitted → accepted, email-scoped submission, 409 double-submit/accept guards.</w:t>
+      </w:r>
+      <w:r>
+        <w:t xml:space="preserve"> </w:t>
+      </w:r>
+      <w:r>
+        <w:rPr>
+          <w:rStyle w:val="VerbatimChar"/>
+        </w:rPr>
+        <w:t xml:space="preserve">POST /funds/{id}/portfolio/{iid}/kpi-requests</w:t>
+      </w:r>
+      <w:r>
+        <w:t xml:space="preserve">,</w:t>
+      </w:r>
+      <w:r>
+        <w:t xml:space="preserve"> </w:t>
+      </w:r>
+      <w:r>
+        <w:rPr>
+          <w:rStyle w:val="VerbatimChar"/>
+        </w:rPr>
+        <w:t xml:space="preserve">GET /funds/{id}/kpi-requests</w:t>
+      </w:r>
+      <w:r>
+        <w:t xml:space="preserve">,</w:t>
+      </w:r>
+      <w:r>
+        <w:t xml:space="preserve"> </w:t>
+      </w:r>
+      <w:r>
+        <w:rPr>
+          <w:rStyle w:val="VerbatimChar"/>
+        </w:rPr>
+        <w:t xml:space="preserve">POST .../accept|reopen</w:t>
+      </w:r>
+      <w:r>
+        <w:t xml:space="preserve">, portal</w:t>
+      </w:r>
+      <w:r>
+        <w:t xml:space="preserve"> </w:t>
+      </w:r>
+      <w:r>
+        <w:rPr>
+          <w:rStyle w:val="VerbatimChar"/>
+        </w:rPr>
+        <w:t xml:space="preserve">POST /portal/kpi-requests/{id}/submit</w:t>
+      </w:r>
+      <w:r>
+        <w:t xml:space="preserve">.</w:t>
+      </w:r>
+      <w:r>
+        <w:t xml:space="preserve"> </w:t>
+      </w:r>
+      <w:r>
+        <w:rPr>
+          <w:i/>
+          <w:iCs/>
+        </w:rPr>
+        <w:t xml:space="preserve">Remaining:</w:t>
+      </w:r>
+      <w:r>
+        <w:t xml:space="preserve"> </w:t>
+      </w:r>
+      <w:r>
+        <w:t xml:space="preserve">recurring request schedules; custom-metric requests (FR-J-21 planned).</w:t>
+      </w:r>
+    </w:p>
+    <w:p>
+      <w:pPr>
+        <w:pStyle w:val="Compact"/>
+        <w:numPr>
+          <w:ilvl w:val="0"/>
+          <w:numId w:val="1013"/>
+        </w:numPr>
+      </w:pPr>
+      <w:r>
+        <w:rPr>
+          <w:b/>
+          <w:bCs/>
+        </w:rPr>
         <w:t xml:space="preserve">FR-J-18 (M — added v1.6, Carta fund gap)</w:t>
       </w:r>
       <w:r>
@@ -13225,6 +13403,55 @@
             </w:pPr>
             <w:r>
               <w:t xml:space="preserve">deal-CRM relationship intelligence + activity timeline</w:t>
+            </w:r>
+          </w:p>
+        </w:tc>
+      </w:tr>
+      <w:tr>
+        <w:tc>
+          <w:tcPr/>
+          <w:p>
+            <w:pPr>
+              <w:pStyle w:val="Compact"/>
+            </w:pPr>
+            <w:r>
+              <w:rPr>
+                <w:b/>
+                <w:bCs/>
+              </w:rPr>
+              <w:t xml:space="preserve">KPIRequest</w:t>
+            </w:r>
+            <w:r>
+              <w:t xml:space="preserve"> </w:t>
+            </w:r>
+            <w:r>
+              <w:rPr>
+                <w:i/>
+                <w:iCs/>
+              </w:rPr>
+              <w:t xml:space="preserve">(v1.7)</w:t>
+            </w:r>
+          </w:p>
+        </w:tc>
+        <w:tc>
+          <w:tcPr/>
+          <w:p>
+            <w:pPr>
+              <w:pStyle w:val="Compact"/>
+            </w:pPr>
+            <w:r>
+              <w:t xml:space="preserve">investment_id, fund_id, period_label, as_of, due_date, contact_email, status, submitted values, kpi_id</w:t>
+            </w:r>
+          </w:p>
+        </w:tc>
+        <w:tc>
+          <w:tcPr/>
+          <w:p>
+            <w:pPr>
+              <w:pStyle w:val="Compact"/>
+            </w:pPr>
+            <w:r>
+              <w:t xml:space="preserve">investee self-reporting; PortfolioInvestment gains contact_email</w:t>
             </w:r>
           </w:p>
         </w:tc>
@@ -15985,6 +16212,163 @@
           <w:b/>
           <w:bCs/>
         </w:rPr>
+        <w:t xml:space="preserve">v1.7 (2026-07-20)</w:t>
+      </w:r>
+      <w:r>
+        <w:t xml:space="preserve"> </w:t>
+      </w:r>
+      <w:r>
+        <w:t xml:space="preserve">— portfolio intelligence (Vestberry competitive gap analysis, fund side):</w:t>
+      </w:r>
+    </w:p>
+    <w:p>
+      <w:pPr>
+        <w:pStyle w:val="Compact"/>
+        <w:numPr>
+          <w:ilvl w:val="0"/>
+          <w:numId w:val="1030"/>
+        </w:numPr>
+      </w:pPr>
+      <w:r>
+        <w:rPr>
+          <w:b/>
+          <w:bCs/>
+        </w:rPr>
+        <w:t xml:space="preserve">FR-J-19 KPI reporting requests</w:t>
+      </w:r>
+      <w:r>
+        <w:t xml:space="preserve"> </w:t>
+      </w:r>
+      <w:r>
+        <w:t xml:space="preserve">✅ — new</w:t>
+      </w:r>
+      <w:r>
+        <w:t xml:space="preserve"> </w:t>
+      </w:r>
+      <w:r>
+        <w:rPr>
+          <w:rStyle w:val="VerbatimChar"/>
+        </w:rPr>
+        <w:t xml:space="preserve">KPIRequest</w:t>
+      </w:r>
+      <w:r>
+        <w:t xml:space="preserve"> </w:t>
+      </w:r>
+      <w:r>
+        <w:t xml:space="preserve">+</w:t>
+      </w:r>
+      <w:r>
+        <w:t xml:space="preserve"> </w:t>
+      </w:r>
+      <w:r>
+        <w:rPr>
+          <w:rStyle w:val="VerbatimChar"/>
+        </w:rPr>
+        <w:t xml:space="preserve">portfolio_investments.contact_email</w:t>
+      </w:r>
+      <w:r>
+        <w:t xml:space="preserve"> </w:t>
+      </w:r>
+      <w:r>
+        <w:t xml:space="preserve">(Alembic</w:t>
+      </w:r>
+      <w:r>
+        <w:t xml:space="preserve"> </w:t>
+      </w:r>
+      <w:r>
+        <w:rPr>
+          <w:rStyle w:val="VerbatimChar"/>
+        </w:rPr>
+        <w:t xml:space="preserve">a7b8c9d0e1f2</w:t>
+      </w:r>
+      <w:r>
+        <w:t xml:space="preserve">). GP requests a period from the company's reporting contact (in-app notification via the existing</w:t>
+      </w:r>
+      <w:r>
+        <w:t xml:space="preserve"> </w:t>
+      </w:r>
+      <w:r>
+        <w:rPr>
+          <w:rStyle w:val="VerbatimChar"/>
+        </w:rPr>
+        <w:t xml:space="preserve">notify</w:t>
+      </w:r>
+      <w:r>
+        <w:t xml:space="preserve"> </w:t>
+      </w:r>
+      <w:r>
+        <w:t xml:space="preserve">service); the contact submits from their portal (email-scoped, 409 on double-submit); GP accepts into</w:t>
+      </w:r>
+      <w:r>
+        <w:t xml:space="preserve"> </w:t>
+      </w:r>
+      <w:r>
+        <w:rPr>
+          <w:rStyle w:val="VerbatimChar"/>
+        </w:rPr>
+        <w:t xml:space="preserve">PortfolioKPI</w:t>
+      </w:r>
+      <w:r>
+        <w:t xml:space="preserve"> </w:t>
+      </w:r>
+      <w:r>
+        <w:t xml:space="preserve">(linking</w:t>
+      </w:r>
+      <w:r>
+        <w:t xml:space="preserve"> </w:t>
+      </w:r>
+      <w:r>
+        <w:rPr>
+          <w:rStyle w:val="VerbatimChar"/>
+        </w:rPr>
+        <w:t xml:space="preserve">kpi_id</w:t>
+      </w:r>
+      <w:r>
+        <w:t xml:space="preserve">) or reopens for resubmission; overdue flags against the due date. Frontend: request form + requests table (status/submitted-values/Accept/Reopen) in</w:t>
+      </w:r>
+      <w:r>
+        <w:t xml:space="preserve"> </w:t>
+      </w:r>
+      <w:r>
+        <w:rPr>
+          <w:rStyle w:val="VerbatimChar"/>
+        </w:rPr>
+        <w:t xml:space="preserve">PortfolioMonitoring.tsx</w:t>
+      </w:r>
+      <w:r>
+        <w:t xml:space="preserve">; "KPI requests from your investors" card with submit form in</w:t>
+      </w:r>
+      <w:r>
+        <w:t xml:space="preserve"> </w:t>
+      </w:r>
+      <w:r>
+        <w:rPr>
+          <w:rStyle w:val="VerbatimChar"/>
+        </w:rPr>
+        <w:t xml:space="preserve">Portal.tsx</w:t>
+      </w:r>
+      <w:r>
+        <w:t xml:space="preserve">. 3 tests (</w:t>
+      </w:r>
+      <w:r>
+        <w:rPr>
+          <w:rStyle w:val="VerbatimChar"/>
+        </w:rPr>
+        <w:t xml:space="preserve">test_kpi_requests.py</w:t>
+      </w:r>
+      <w:r>
+        <w:t xml:space="preserve">). Next per the Vestberry review: signals (#2), tear sheets (#3).</w:t>
+      </w:r>
+    </w:p>
+    <w:p>
+      <w:pPr>
+        <w:pStyle w:val="FirstParagraph"/>
+      </w:pPr>
+      <w:r>
+        <w:rPr>
+          <w:b/>
+          <w:bCs/>
+        </w:rPr>
         <w:t xml:space="preserve">v1.6 (2026-07-20)</w:t>
       </w:r>
       <w:r>
@@ -15999,7 +16383,7 @@
         <w:pStyle w:val="Compact"/>
         <w:numPr>
           <w:ilvl w:val="0"/>
-          <w:numId w:val="1030"/>
+          <w:numId w:val="1031"/>
         </w:numPr>
       </w:pPr>
       <w:r>
@@ -16066,7 +16450,7 @@
         <w:pStyle w:val="Compact"/>
         <w:numPr>
           <w:ilvl w:val="0"/>
-          <w:numId w:val="1030"/>
+          <w:numId w:val="1031"/>
         </w:numPr>
       </w:pPr>
       <w:r>
@@ -16155,7 +16539,7 @@
         <w:pStyle w:val="Compact"/>
         <w:numPr>
           <w:ilvl w:val="0"/>
-          <w:numId w:val="1030"/>
+          <w:numId w:val="1031"/>
         </w:numPr>
       </w:pPr>
       <w:r>
@@ -16288,7 +16672,7 @@
         <w:pStyle w:val="Compact"/>
         <w:numPr>
           <w:ilvl w:val="0"/>
-          <w:numId w:val="1030"/>
+          <w:numId w:val="1031"/>
         </w:numPr>
       </w:pPr>
       <w:r>
@@ -16412,7 +16796,7 @@
         <w:pStyle w:val="Compact"/>
         <w:numPr>
           <w:ilvl w:val="0"/>
-          <w:numId w:val="1030"/>
+          <w:numId w:val="1031"/>
         </w:numPr>
       </w:pPr>
       <w:r>
@@ -16539,7 +16923,7 @@
         <w:pStyle w:val="Compact"/>
         <w:numPr>
           <w:ilvl w:val="0"/>
-          <w:numId w:val="1030"/>
+          <w:numId w:val="1031"/>
         </w:numPr>
       </w:pPr>
       <w:r>
@@ -16786,7 +17170,7 @@
         <w:pStyle w:val="Compact"/>
         <w:numPr>
           <w:ilvl w:val="0"/>
-          <w:numId w:val="1031"/>
+          <w:numId w:val="1032"/>
         </w:numPr>
       </w:pPr>
       <w:r>
@@ -16898,7 +17282,7 @@
         <w:pStyle w:val="Compact"/>
         <w:numPr>
           <w:ilvl w:val="0"/>
-          <w:numId w:val="1031"/>
+          <w:numId w:val="1032"/>
         </w:numPr>
       </w:pPr>
       <w:r>
@@ -17022,7 +17406,7 @@
         <w:pStyle w:val="Compact"/>
         <w:numPr>
           <w:ilvl w:val="0"/>
-          <w:numId w:val="1031"/>
+          <w:numId w:val="1032"/>
         </w:numPr>
       </w:pPr>
       <w:r>
@@ -17150,7 +17534,7 @@
         <w:pStyle w:val="Compact"/>
         <w:numPr>
           <w:ilvl w:val="0"/>
-          <w:numId w:val="1031"/>
+          <w:numId w:val="1032"/>
         </w:numPr>
       </w:pPr>
       <w:r>
@@ -17180,7 +17564,7 @@
         <w:pStyle w:val="Compact"/>
         <w:numPr>
           <w:ilvl w:val="0"/>
-          <w:numId w:val="1032"/>
+          <w:numId w:val="1033"/>
         </w:numPr>
       </w:pPr>
       <w:r>
@@ -17328,7 +17712,7 @@
         <w:pStyle w:val="Compact"/>
         <w:numPr>
           <w:ilvl w:val="0"/>
-          <w:numId w:val="1032"/>
+          <w:numId w:val="1033"/>
         </w:numPr>
       </w:pPr>
       <w:r>
@@ -17362,7 +17746,7 @@
         <w:pStyle w:val="Compact"/>
         <w:numPr>
           <w:ilvl w:val="0"/>
-          <w:numId w:val="1032"/>
+          <w:numId w:val="1033"/>
         </w:numPr>
       </w:pPr>
       <w:r>
@@ -17423,7 +17807,7 @@
         <w:pStyle w:val="Compact"/>
         <w:numPr>
           <w:ilvl w:val="0"/>
-          <w:numId w:val="1032"/>
+          <w:numId w:val="1033"/>
         </w:numPr>
       </w:pPr>
       <w:r>
@@ -17466,7 +17850,7 @@
         <w:pStyle w:val="Compact"/>
         <w:numPr>
           <w:ilvl w:val="0"/>
-          <w:numId w:val="1032"/>
+          <w:numId w:val="1033"/>
         </w:numPr>
       </w:pPr>
       <w:r>
@@ -17593,7 +17977,7 @@
         <w:pStyle w:val="Compact"/>
         <w:numPr>
           <w:ilvl w:val="0"/>
-          <w:numId w:val="1032"/>
+          <w:numId w:val="1033"/>
         </w:numPr>
       </w:pPr>
       <w:r>
@@ -17885,7 +18269,7 @@
         <w:pStyle w:val="Compact"/>
         <w:numPr>
           <w:ilvl w:val="0"/>
-          <w:numId w:val="1033"/>
+          <w:numId w:val="1034"/>
         </w:numPr>
       </w:pPr>
       <w:r>
@@ -17966,7 +18350,7 @@
         <w:pStyle w:val="Compact"/>
         <w:numPr>
           <w:ilvl w:val="0"/>
-          <w:numId w:val="1033"/>
+          <w:numId w:val="1034"/>
         </w:numPr>
       </w:pPr>
       <w:r>
@@ -18000,7 +18384,7 @@
         <w:pStyle w:val="Compact"/>
         <w:numPr>
           <w:ilvl w:val="0"/>
-          <w:numId w:val="1033"/>
+          <w:numId w:val="1034"/>
         </w:numPr>
       </w:pPr>
       <w:r>
@@ -18061,7 +18445,7 @@
         <w:pStyle w:val="Compact"/>
         <w:numPr>
           <w:ilvl w:val="0"/>
-          <w:numId w:val="1033"/>
+          <w:numId w:val="1034"/>
         </w:numPr>
       </w:pPr>
       <w:r>
@@ -18093,7 +18477,7 @@
         <w:pStyle w:val="Compact"/>
         <w:numPr>
           <w:ilvl w:val="0"/>
-          <w:numId w:val="1033"/>
+          <w:numId w:val="1034"/>
         </w:numPr>
       </w:pPr>
       <w:r>
@@ -18187,7 +18571,7 @@
         <w:pStyle w:val="Compact"/>
         <w:numPr>
           <w:ilvl w:val="0"/>
-          <w:numId w:val="1033"/>
+          <w:numId w:val="1034"/>
         </w:numPr>
       </w:pPr>
       <w:r>
@@ -18253,7 +18637,7 @@
         <w:pStyle w:val="Compact"/>
         <w:numPr>
           <w:ilvl w:val="0"/>
-          <w:numId w:val="1033"/>
+          <w:numId w:val="1034"/>
         </w:numPr>
       </w:pPr>
       <w:r>
@@ -18291,7 +18675,7 @@
         <w:pStyle w:val="Compact"/>
         <w:numPr>
           <w:ilvl w:val="0"/>
-          <w:numId w:val="1033"/>
+          <w:numId w:val="1034"/>
         </w:numPr>
       </w:pPr>
       <w:r>
@@ -18325,7 +18709,7 @@
         <w:pStyle w:val="Compact"/>
         <w:numPr>
           <w:ilvl w:val="0"/>
-          <w:numId w:val="1033"/>
+          <w:numId w:val="1034"/>
         </w:numPr>
       </w:pPr>
       <w:r>
@@ -18359,7 +18743,7 @@
         <w:pStyle w:val="Compact"/>
         <w:numPr>
           <w:ilvl w:val="0"/>
-          <w:numId w:val="1033"/>
+          <w:numId w:val="1034"/>
         </w:numPr>
       </w:pPr>
       <w:r>
@@ -18390,7 +18774,7 @@
         <w:pStyle w:val="Compact"/>
         <w:numPr>
           <w:ilvl w:val="0"/>
-          <w:numId w:val="1033"/>
+          <w:numId w:val="1034"/>
         </w:numPr>
       </w:pPr>
       <w:r>
@@ -18471,7 +18855,7 @@
         <w:pStyle w:val="Compact"/>
         <w:numPr>
           <w:ilvl w:val="0"/>
-          <w:numId w:val="1033"/>
+          <w:numId w:val="1034"/>
         </w:numPr>
       </w:pPr>
       <w:r>
@@ -18552,7 +18936,7 @@
         <w:pStyle w:val="Compact"/>
         <w:numPr>
           <w:ilvl w:val="0"/>
-          <w:numId w:val="1033"/>
+          <w:numId w:val="1034"/>
         </w:numPr>
       </w:pPr>
       <w:r>
@@ -18574,7 +18958,7 @@
         <w:pStyle w:val="Compact"/>
         <w:numPr>
           <w:ilvl w:val="0"/>
-          <w:numId w:val="1033"/>
+          <w:numId w:val="1034"/>
         </w:numPr>
       </w:pPr>
       <w:r>
@@ -18675,7 +19059,7 @@
         <w:pStyle w:val="Compact"/>
         <w:numPr>
           <w:ilvl w:val="0"/>
-          <w:numId w:val="1033"/>
+          <w:numId w:val="1034"/>
         </w:numPr>
       </w:pPr>
       <w:r>
@@ -18823,7 +19207,7 @@
         <w:pStyle w:val="Compact"/>
         <w:numPr>
           <w:ilvl w:val="0"/>
-          <w:numId w:val="1033"/>
+          <w:numId w:val="1034"/>
         </w:numPr>
       </w:pPr>
       <w:r>
@@ -18940,7 +19324,7 @@
         <w:pStyle w:val="Compact"/>
         <w:numPr>
           <w:ilvl w:val="0"/>
-          <w:numId w:val="1033"/>
+          <w:numId w:val="1034"/>
         </w:numPr>
       </w:pPr>
       <w:r>
@@ -19033,7 +19417,7 @@
         <w:pStyle w:val="Compact"/>
         <w:numPr>
           <w:ilvl w:val="0"/>
-          <w:numId w:val="1033"/>
+          <w:numId w:val="1034"/>
         </w:numPr>
       </w:pPr>
       <w:r>
@@ -19169,7 +19553,7 @@
         <w:pStyle w:val="Compact"/>
         <w:numPr>
           <w:ilvl w:val="0"/>
-          <w:numId w:val="1033"/>
+          <w:numId w:val="1034"/>
         </w:numPr>
       </w:pPr>
       <w:r>
@@ -19299,7 +19683,7 @@
         <w:pStyle w:val="Compact"/>
         <w:numPr>
           <w:ilvl w:val="0"/>
-          <w:numId w:val="1033"/>
+          <w:numId w:val="1034"/>
         </w:numPr>
       </w:pPr>
       <w:r>
@@ -19414,7 +19798,7 @@
         <w:pStyle w:val="Compact"/>
         <w:numPr>
           <w:ilvl w:val="0"/>
-          <w:numId w:val="1033"/>
+          <w:numId w:val="1034"/>
         </w:numPr>
       </w:pPr>
       <w:r>
@@ -19521,7 +19905,7 @@
         <w:pStyle w:val="Compact"/>
         <w:numPr>
           <w:ilvl w:val="0"/>
-          <w:numId w:val="1033"/>
+          <w:numId w:val="1034"/>
         </w:numPr>
       </w:pPr>
       <w:r>
@@ -19656,7 +20040,7 @@
         <w:pStyle w:val="Compact"/>
         <w:numPr>
           <w:ilvl w:val="0"/>
-          <w:numId w:val="1033"/>
+          <w:numId w:val="1034"/>
         </w:numPr>
       </w:pPr>
       <w:r>
@@ -19818,7 +20202,7 @@
         <w:pStyle w:val="Compact"/>
         <w:numPr>
           <w:ilvl w:val="0"/>
-          <w:numId w:val="1033"/>
+          <w:numId w:val="1034"/>
         </w:numPr>
       </w:pPr>
       <w:r>
@@ -19923,7 +20307,7 @@
         <w:pStyle w:val="Compact"/>
         <w:numPr>
           <w:ilvl w:val="0"/>
-          <w:numId w:val="1033"/>
+          <w:numId w:val="1034"/>
         </w:numPr>
       </w:pPr>
       <w:r>
@@ -20069,7 +20453,7 @@
         <w:pStyle w:val="Compact"/>
         <w:numPr>
           <w:ilvl w:val="0"/>
-          <w:numId w:val="1033"/>
+          <w:numId w:val="1034"/>
         </w:numPr>
       </w:pPr>
       <w:r>
@@ -20211,7 +20595,7 @@
         <w:pStyle w:val="Compact"/>
         <w:numPr>
           <w:ilvl w:val="0"/>
-          <w:numId w:val="1034"/>
+          <w:numId w:val="1035"/>
         </w:numPr>
       </w:pPr>
       <w:r>
@@ -20244,7 +20628,7 @@
         <w:pStyle w:val="Compact"/>
         <w:numPr>
           <w:ilvl w:val="0"/>
-          <w:numId w:val="1034"/>
+          <w:numId w:val="1035"/>
         </w:numPr>
       </w:pPr>
       <w:r>
@@ -20256,7 +20640,7 @@
         <w:pStyle w:val="Compact"/>
         <w:numPr>
           <w:ilvl w:val="0"/>
-          <w:numId w:val="1034"/>
+          <w:numId w:val="1035"/>
         </w:numPr>
       </w:pPr>
       <w:r>
@@ -20284,7 +20668,7 @@
         <w:pStyle w:val="Compact"/>
         <w:numPr>
           <w:ilvl w:val="0"/>
-          <w:numId w:val="1034"/>
+          <w:numId w:val="1035"/>
         </w:numPr>
       </w:pPr>
       <w:r>
@@ -20315,7 +20699,7 @@
         <w:pStyle w:val="Compact"/>
         <w:numPr>
           <w:ilvl w:val="0"/>
-          <w:numId w:val="1034"/>
+          <w:numId w:val="1035"/>
         </w:numPr>
       </w:pPr>
       <w:r>
@@ -20361,7 +20745,7 @@
         <w:pStyle w:val="Compact"/>
         <w:numPr>
           <w:ilvl w:val="0"/>
-          <w:numId w:val="1035"/>
+          <w:numId w:val="1036"/>
         </w:numPr>
       </w:pPr>
       <w:r>
@@ -20380,7 +20764,7 @@
         <w:pStyle w:val="Compact"/>
         <w:numPr>
           <w:ilvl w:val="0"/>
-          <w:numId w:val="1035"/>
+          <w:numId w:val="1036"/>
         </w:numPr>
       </w:pPr>
       <w:r>
@@ -20399,7 +20783,7 @@
         <w:pStyle w:val="Compact"/>
         <w:numPr>
           <w:ilvl w:val="0"/>
-          <w:numId w:val="1035"/>
+          <w:numId w:val="1036"/>
         </w:numPr>
       </w:pPr>
       <w:r>
@@ -20418,7 +20802,7 @@
         <w:pStyle w:val="Compact"/>
         <w:numPr>
           <w:ilvl w:val="0"/>
-          <w:numId w:val="1035"/>
+          <w:numId w:val="1036"/>
         </w:numPr>
       </w:pPr>
       <w:r>
@@ -20463,7 +20847,7 @@
         <w:pStyle w:val="Compact"/>
         <w:numPr>
           <w:ilvl w:val="0"/>
-          <w:numId w:val="1036"/>
+          <w:numId w:val="1037"/>
         </w:numPr>
       </w:pPr>
       <w:r>
@@ -20475,7 +20859,7 @@
         <w:pStyle w:val="Compact"/>
         <w:numPr>
           <w:ilvl w:val="0"/>
-          <w:numId w:val="1036"/>
+          <w:numId w:val="1037"/>
         </w:numPr>
       </w:pPr>
       <w:r>
@@ -20510,7 +20894,7 @@
         <w:pStyle w:val="Compact"/>
         <w:numPr>
           <w:ilvl w:val="0"/>
-          <w:numId w:val="1036"/>
+          <w:numId w:val="1037"/>
         </w:numPr>
       </w:pPr>
       <w:r>
@@ -20522,7 +20906,7 @@
         <w:pStyle w:val="Compact"/>
         <w:numPr>
           <w:ilvl w:val="0"/>
-          <w:numId w:val="1036"/>
+          <w:numId w:val="1037"/>
         </w:numPr>
       </w:pPr>
       <w:r>
@@ -20534,7 +20918,7 @@
         <w:pStyle w:val="Compact"/>
         <w:numPr>
           <w:ilvl w:val="0"/>
-          <w:numId w:val="1036"/>
+          <w:numId w:val="1037"/>
         </w:numPr>
       </w:pPr>
       <w:r>
@@ -20562,7 +20946,7 @@
         <w:pStyle w:val="Compact"/>
         <w:numPr>
           <w:ilvl w:val="0"/>
-          <w:numId w:val="1036"/>
+          <w:numId w:val="1037"/>
         </w:numPr>
       </w:pPr>
       <w:r>
@@ -20605,7 +20989,7 @@
         <w:pStyle w:val="Compact"/>
         <w:numPr>
           <w:ilvl w:val="0"/>
-          <w:numId w:val="1036"/>
+          <w:numId w:val="1037"/>
         </w:numPr>
       </w:pPr>
       <w:r>
@@ -20617,7 +21001,7 @@
         <w:pStyle w:val="Compact"/>
         <w:numPr>
           <w:ilvl w:val="0"/>
-          <w:numId w:val="1036"/>
+          <w:numId w:val="1037"/>
         </w:numPr>
       </w:pPr>
       <w:r>
@@ -21273,6 +21657,9 @@
     <w:abstractNumId w:val="991"/>
   </w:num>
   <w:num w:numId="1036">
+    <w:abstractNumId w:val="991"/>
+  </w:num>
+  <w:num w:numId="1037">
     <w:abstractNumId w:val="991"/>
   </w:num>
 </w:numbering>

</xml_diff>

<commit_message>
Backend: portfolio signals — risk early-warning (Vestberry gap #2)
FR-J-20. Rules-based signals derived from the KPI history and marks, no
schema change: revenue decline period-over-period (high severity beyond 20%),
low runway (< 6 months), mark below cost (impairment %), reporting gone
silent (> 6 months; "never reported" info) — plus the positive signal,
follow-on candidates (growing revenue with >= 12 months runway). Severity
roll-ups high / warn / info / positive / all-clear; amounts in signal text
formatted with Indian lakh/crore grouping (_inr helper).

GET /funds/{id}/signals. 3 tests; full suite 296 passing.
REQUIREMENTS -> v1.7 (FR-J-20).

Co-Authored-By: Claude Opus 4.8 <noreply@anthropic.com>
</commit_message>
<xml_diff>
--- a/REQUIREMENTS.docx
+++ b/REQUIREMENTS.docx
@@ -5891,6 +5891,149 @@
           <w:b/>
           <w:bCs/>
         </w:rPr>
+        <w:t xml:space="preserve">FR-J-20 (M — added v1.7, Vestberry gap)</w:t>
+      </w:r>
+      <w:r>
+        <w:t xml:space="preserve"> </w:t>
+      </w:r>
+      <w:r>
+        <w:t xml:space="preserve">✅</w:t>
+      </w:r>
+      <w:r>
+        <w:t xml:space="preserve"> </w:t>
+      </w:r>
+      <w:r>
+        <w:rPr>
+          <w:b/>
+          <w:bCs/>
+        </w:rPr>
+        <w:t xml:space="preserve">Portfolio signals</w:t>
+      </w:r>
+      <w:r>
+        <w:t xml:space="preserve">: rules-based early warning derived from the KPI history and marks —</w:t>
+      </w:r>
+      <w:r>
+        <w:t xml:space="preserve"> </w:t>
+      </w:r>
+      <w:r>
+        <w:rPr>
+          <w:b/>
+          <w:bCs/>
+        </w:rPr>
+        <w:t xml:space="preserve">revenue decline</w:t>
+      </w:r>
+      <w:r>
+        <w:t xml:space="preserve"> </w:t>
+      </w:r>
+      <w:r>
+        <w:t xml:space="preserve">period-over-period (high severity beyond 20%),</w:t>
+      </w:r>
+      <w:r>
+        <w:t xml:space="preserve"> </w:t>
+      </w:r>
+      <w:r>
+        <w:rPr>
+          <w:b/>
+          <w:bCs/>
+        </w:rPr>
+        <w:t xml:space="preserve">low runway</w:t>
+      </w:r>
+      <w:r>
+        <w:t xml:space="preserve"> </w:t>
+      </w:r>
+      <w:r>
+        <w:t xml:space="preserve">(&lt; 6 months),</w:t>
+      </w:r>
+      <w:r>
+        <w:t xml:space="preserve"> </w:t>
+      </w:r>
+      <w:r>
+        <w:rPr>
+          <w:b/>
+          <w:bCs/>
+        </w:rPr>
+        <w:t xml:space="preserve">mark below cost</w:t>
+      </w:r>
+      <w:r>
+        <w:t xml:space="preserve"> </w:t>
+      </w:r>
+      <w:r>
+        <w:t xml:space="preserve">(impairment %),</w:t>
+      </w:r>
+      <w:r>
+        <w:t xml:space="preserve"> </w:t>
+      </w:r>
+      <w:r>
+        <w:rPr>
+          <w:b/>
+          <w:bCs/>
+        </w:rPr>
+        <w:t xml:space="preserve">reporting gone silent</w:t>
+      </w:r>
+      <w:r>
+        <w:t xml:space="preserve"> </w:t>
+      </w:r>
+      <w:r>
+        <w:t xml:space="preserve">(&gt; 6 months since the last period; "never reported" info) — plus the positive signal,</w:t>
+      </w:r>
+      <w:r>
+        <w:t xml:space="preserve"> </w:t>
+      </w:r>
+      <w:r>
+        <w:rPr>
+          <w:b/>
+          <w:bCs/>
+        </w:rPr>
+        <w:t xml:space="preserve">follow-on candidates</w:t>
+      </w:r>
+      <w:r>
+        <w:t xml:space="preserve"> </w:t>
+      </w:r>
+      <w:r>
+        <w:t xml:space="preserve">(growing revenue with ≥ 12 months runway, feeding the FR-J-12 reserves decision). Severity roll-ups (high / warn / info / positive / all-clear) and per-company signal rows, worst first. Pure derivation, no schema.</w:t>
+      </w:r>
+      <w:r>
+        <w:t xml:space="preserve"> </w:t>
+      </w:r>
+      <w:r>
+        <w:rPr>
+          <w:rStyle w:val="VerbatimChar"/>
+        </w:rPr>
+        <w:t xml:space="preserve">GET /funds/{id}/signals</w:t>
+      </w:r>
+      <w:r>
+        <w:t xml:space="preserve">.</w:t>
+      </w:r>
+      <w:r>
+        <w:t xml:space="preserve"> </w:t>
+      </w:r>
+      <w:r>
+        <w:rPr>
+          <w:i/>
+          <w:iCs/>
+        </w:rPr>
+        <w:t xml:space="preserve">Remaining:</w:t>
+      </w:r>
+      <w:r>
+        <w:t xml:space="preserve"> </w:t>
+      </w:r>
+      <w:r>
+        <w:t xml:space="preserve">signal thresholds per fund; notification digests.</w:t>
+      </w:r>
+    </w:p>
+    <w:p>
+      <w:pPr>
+        <w:pStyle w:val="Compact"/>
+        <w:numPr>
+          <w:ilvl w:val="0"/>
+          <w:numId w:val="1013"/>
+        </w:numPr>
+      </w:pPr>
+      <w:r>
+        <w:rPr>
+          <w:b/>
+          <w:bCs/>
+        </w:rPr>
         <w:t xml:space="preserve">FR-J-19 (M — added v1.7, Vestberry gap)</w:t>
       </w:r>
       <w:r>
@@ -16219,6 +16362,91 @@
       </w:r>
       <w:r>
         <w:t xml:space="preserve">— portfolio intelligence (Vestberry competitive gap analysis, fund side):</w:t>
+      </w:r>
+    </w:p>
+    <w:p>
+      <w:pPr>
+        <w:pStyle w:val="Compact"/>
+        <w:numPr>
+          <w:ilvl w:val="0"/>
+          <w:numId w:val="1030"/>
+        </w:numPr>
+      </w:pPr>
+      <w:r>
+        <w:rPr>
+          <w:b/>
+          <w:bCs/>
+        </w:rPr>
+        <w:t xml:space="preserve">FR-J-20 Portfolio signals</w:t>
+      </w:r>
+      <w:r>
+        <w:t xml:space="preserve"> </w:t>
+      </w:r>
+      <w:r>
+        <w:t xml:space="preserve">✅ —</w:t>
+      </w:r>
+      <w:r>
+        <w:t xml:space="preserve"> </w:t>
+      </w:r>
+      <w:r>
+        <w:rPr>
+          <w:rStyle w:val="VerbatimChar"/>
+        </w:rPr>
+        <w:t xml:space="preserve">services/fund.py::portfolio_signals</w:t>
+      </w:r>
+      <w:r>
+        <w:t xml:space="preserve"> </w:t>
+      </w:r>
+      <w:r>
+        <w:t xml:space="preserve">(rules: revenue decline w/ 20% high threshold, runway &lt; 6 mo, mark below cost, silent &gt; 183 days, follow-on = growth + runway ≥ 12 mo; amounts in signal text formatted lakh/crore via</w:t>
+      </w:r>
+      <w:r>
+        <w:t xml:space="preserve"> </w:t>
+      </w:r>
+      <w:r>
+        <w:rPr>
+          <w:rStyle w:val="VerbatimChar"/>
+        </w:rPr>
+        <w:t xml:space="preserve">_inr</w:t>
+      </w:r>
+      <w:r>
+        <w:t xml:space="preserve">);</w:t>
+      </w:r>
+      <w:r>
+        <w:t xml:space="preserve"> </w:t>
+      </w:r>
+      <w:r>
+        <w:rPr>
+          <w:rStyle w:val="VerbatimChar"/>
+        </w:rPr>
+        <w:t xml:space="preserve">GET /funds/{id}/signals</w:t>
+      </w:r>
+      <w:r>
+        <w:t xml:space="preserve">;</w:t>
+      </w:r>
+      <w:r>
+        <w:t xml:space="preserve"> </w:t>
+      </w:r>
+      <w:r>
+        <w:rPr>
+          <w:rStyle w:val="VerbatimChar"/>
+        </w:rPr>
+        <w:t xml:space="preserve">features/FundSignals.tsx</w:t>
+      </w:r>
+      <w:r>
+        <w:t xml:space="preserve"> </w:t>
+      </w:r>
+      <w:r>
+        <w:t xml:space="preserve">(severity tiles + worst-first signal table, healthy empty state) at the top of the Portfolio sub-tab. No schema change. 3 tests (</w:t>
+      </w:r>
+      <w:r>
+        <w:rPr>
+          <w:rStyle w:val="VerbatimChar"/>
+        </w:rPr>
+        <w:t xml:space="preserve">test_portfolio_signals.py</w:t>
+      </w:r>
+      <w:r>
+        <w:t xml:space="preserve">).</w:t>
       </w:r>
     </w:p>
     <w:p>

</xml_diff>

<commit_message>
Backend: company tear-sheet document (Vestberry gap #3)
FR-J-21: tear_sheet template + POST /funds/{id}/portfolio/{iid}/tear-sheet
composing investment summary, value/MOIC, latest valuation, KPI trend
(last 4, newest first) and active signals from existing services.
3 tests. REQUIREMENTS v1.7 + docx.

Co-Authored-By: Claude Opus 4.8 <noreply@anthropic.com>
</commit_message>
<xml_diff>
--- a/REQUIREMENTS.docx
+++ b/REQUIREMENTS.docx
@@ -5891,7 +5891,7 @@
           <w:b/>
           <w:bCs/>
         </w:rPr>
-        <w:t xml:space="preserve">FR-J-20 (M — added v1.7, Vestberry gap)</w:t>
+        <w:t xml:space="preserve">FR-J-21 (M — added v1.7, Vestberry gap)</w:t>
       </w:r>
       <w:r>
         <w:t xml:space="preserve"> </w:t>
@@ -5907,99 +5907,83 @@
           <w:b/>
           <w:bCs/>
         </w:rPr>
-        <w:t xml:space="preserve">Portfolio signals</w:t>
-      </w:r>
-      <w:r>
-        <w:t xml:space="preserve">: rules-based early warning derived from the KPI history and marks —</w:t>
-      </w:r>
-      <w:r>
-        <w:t xml:space="preserve"> </w:t>
-      </w:r>
-      <w:r>
-        <w:rPr>
-          <w:b/>
-          <w:bCs/>
-        </w:rPr>
-        <w:t xml:space="preserve">revenue decline</w:t>
-      </w:r>
-      <w:r>
-        <w:t xml:space="preserve"> </w:t>
-      </w:r>
-      <w:r>
-        <w:t xml:space="preserve">period-over-period (high severity beyond 20%),</w:t>
-      </w:r>
-      <w:r>
-        <w:t xml:space="preserve"> </w:t>
-      </w:r>
-      <w:r>
-        <w:rPr>
-          <w:b/>
-          <w:bCs/>
-        </w:rPr>
-        <w:t xml:space="preserve">low runway</w:t>
-      </w:r>
-      <w:r>
-        <w:t xml:space="preserve"> </w:t>
-      </w:r>
-      <w:r>
-        <w:t xml:space="preserve">(&lt; 6 months),</w:t>
-      </w:r>
-      <w:r>
-        <w:t xml:space="preserve"> </w:t>
-      </w:r>
-      <w:r>
-        <w:rPr>
-          <w:b/>
-          <w:bCs/>
-        </w:rPr>
-        <w:t xml:space="preserve">mark below cost</w:t>
-      </w:r>
-      <w:r>
-        <w:t xml:space="preserve"> </w:t>
-      </w:r>
-      <w:r>
-        <w:t xml:space="preserve">(impairment %),</w:t>
-      </w:r>
-      <w:r>
-        <w:t xml:space="preserve"> </w:t>
-      </w:r>
-      <w:r>
-        <w:rPr>
-          <w:b/>
-          <w:bCs/>
-        </w:rPr>
-        <w:t xml:space="preserve">reporting gone silent</w:t>
-      </w:r>
-      <w:r>
-        <w:t xml:space="preserve"> </w:t>
-      </w:r>
-      <w:r>
-        <w:t xml:space="preserve">(&gt; 6 months since the last period; "never reported" info) — plus the positive signal,</w:t>
-      </w:r>
-      <w:r>
-        <w:t xml:space="preserve"> </w:t>
-      </w:r>
-      <w:r>
-        <w:rPr>
-          <w:b/>
-          <w:bCs/>
-        </w:rPr>
-        <w:t xml:space="preserve">follow-on candidates</w:t>
-      </w:r>
-      <w:r>
-        <w:t xml:space="preserve"> </w:t>
-      </w:r>
-      <w:r>
-        <w:t xml:space="preserve">(growing revenue with ≥ 12 months runway, feeding the FR-J-12 reserves decision). Severity roll-ups (high / warn / info / positive / all-clear) and per-company signal rows, worst first. Pure derivation, no schema.</w:t>
-      </w:r>
-      <w:r>
-        <w:t xml:space="preserve"> </w:t>
-      </w:r>
-      <w:r>
-        <w:rPr>
-          <w:rStyle w:val="VerbatimChar"/>
-        </w:rPr>
-        <w:t xml:space="preserve">GET /funds/{id}/signals</w:t>
+        <w:t xml:space="preserve">Company tear sheets</w:t>
+      </w:r>
+      <w:r>
+        <w:t xml:space="preserve">: a one-pager document per portfolio company generated in one click from the Portfolio table — investment summary (instrument, invested, ownership, reporting contact),</w:t>
+      </w:r>
+      <w:r>
+        <w:t xml:space="preserve"> </w:t>
+      </w:r>
+      <w:r>
+        <w:rPr>
+          <w:b/>
+          <w:bCs/>
+        </w:rPr>
+        <w:t xml:space="preserve">value &amp; MOIC</w:t>
+      </w:r>
+      <w:r>
+        <w:t xml:space="preserve"> </w:t>
+      </w:r>
+      <w:r>
+        <w:t xml:space="preserve">(cost, fair value, unrealised gain), the</w:t>
+      </w:r>
+      <w:r>
+        <w:t xml:space="preserve"> </w:t>
+      </w:r>
+      <w:r>
+        <w:rPr>
+          <w:b/>
+          <w:bCs/>
+        </w:rPr>
+        <w:t xml:space="preserve">latest valuation</w:t>
+      </w:r>
+      <w:r>
+        <w:t xml:space="preserve"> </w:t>
+      </w:r>
+      <w:r>
+        <w:t xml:space="preserve">(value, methodology, valuer, independence, as-of — or "fund's own mark" when only a mark exists), the</w:t>
+      </w:r>
+      <w:r>
+        <w:t xml:space="preserve"> </w:t>
+      </w:r>
+      <w:r>
+        <w:rPr>
+          <w:b/>
+          <w:bCs/>
+        </w:rPr>
+        <w:t xml:space="preserve">KPI trend</w:t>
+      </w:r>
+      <w:r>
+        <w:t xml:space="preserve"> </w:t>
+      </w:r>
+      <w:r>
+        <w:t xml:space="preserve">(last 4 periods, newest first, with runway) and the company's</w:t>
+      </w:r>
+      <w:r>
+        <w:t xml:space="preserve"> </w:t>
+      </w:r>
+      <w:r>
+        <w:rPr>
+          <w:b/>
+          <w:bCs/>
+        </w:rPr>
+        <w:t xml:space="preserve">active signals</w:t>
+      </w:r>
+      <w:r>
+        <w:t xml:space="preserve"> </w:t>
+      </w:r>
+      <w:r>
+        <w:t xml:space="preserve">from FR-J-20 (or a healthy note) — composed entirely from the monitoring/valuation/signals services, amounts lakh/crore-formatted. Lands in the entity's Documents (PDF-renderable like all documents).</w:t>
+      </w:r>
+      <w:r>
+        <w:t xml:space="preserve"> </w:t>
+      </w:r>
+      <w:r>
+        <w:rPr>
+          <w:rStyle w:val="VerbatimChar"/>
+        </w:rPr>
+        <w:t xml:space="preserve">POST /funds/{id}/portfolio/{iid}/tear-sheet</w:t>
       </w:r>
       <w:r>
         <w:t xml:space="preserve">.</w:t>
@@ -6018,7 +6002,7 @@
         <w:t xml:space="preserve"> </w:t>
       </w:r>
       <w:r>
-        <w:t xml:space="preserve">signal thresholds per fund; notification digests.</w:t>
+        <w:t xml:space="preserve">custom sections/branding; batch generation for the whole portfolio.</w:t>
       </w:r>
     </w:p>
     <w:p>
@@ -6034,7 +6018,7 @@
           <w:b/>
           <w:bCs/>
         </w:rPr>
-        <w:t xml:space="preserve">FR-J-19 (M — added v1.7, Vestberry gap)</w:t>
+        <w:t xml:space="preserve">FR-J-20 (M — added v1.7, Vestberry gap)</w:t>
       </w:r>
       <w:r>
         <w:t xml:space="preserve"> </w:t>
@@ -6050,134 +6034,99 @@
           <w:b/>
           <w:bCs/>
         </w:rPr>
-        <w:t xml:space="preserve">KPI reporting requests (investee self-service)</w:t>
-      </w:r>
-      <w:r>
-        <w:t xml:space="preserve">: the GP asks each portfolio company's</w:t>
-      </w:r>
-      <w:r>
-        <w:t xml:space="preserve"> </w:t>
-      </w:r>
-      <w:r>
-        <w:rPr>
-          <w:b/>
-          <w:bCs/>
-        </w:rPr>
-        <w:t xml:space="preserve">reporting contact</w:t>
-      </w:r>
-      <w:r>
-        <w:t xml:space="preserve"> </w:t>
-      </w:r>
-      <w:r>
-        <w:t xml:space="preserve">(email stored on the investment) for a KPI period; the contact sees the request in</w:t>
-      </w:r>
-      <w:r>
-        <w:t xml:space="preserve"> </w:t>
-      </w:r>
-      <w:r>
-        <w:rPr>
-          <w:b/>
-          <w:bCs/>
-        </w:rPr>
-        <w:t xml:space="preserve">their portal</w:t>
-      </w:r>
-      <w:r>
-        <w:t xml:space="preserve"> </w:t>
-      </w:r>
-      <w:r>
-        <w:t xml:space="preserve">(plus an in-app notification if they have an account) with due date and overdue flag, submits revenue/cash/burn/headcount, and the GP</w:t>
-      </w:r>
-      <w:r>
-        <w:t xml:space="preserve"> </w:t>
-      </w:r>
-      <w:r>
-        <w:rPr>
-          <w:b/>
-          <w:bCs/>
-        </w:rPr>
-        <w:t xml:space="preserve">accepts</w:t>
-      </w:r>
-      <w:r>
-        <w:t xml:space="preserve"> </w:t>
-      </w:r>
-      <w:r>
-        <w:t xml:space="preserve">the submission into</w:t>
-      </w:r>
-      <w:r>
-        <w:t xml:space="preserve"> </w:t>
-      </w:r>
-      <w:r>
-        <w:rPr>
-          <w:rStyle w:val="VerbatimChar"/>
-        </w:rPr>
-        <w:t xml:space="preserve">PortfolioKPI</w:t>
-      </w:r>
-      <w:r>
-        <w:t xml:space="preserve"> </w:t>
-      </w:r>
-      <w:r>
-        <w:t xml:space="preserve">(or</w:t>
-      </w:r>
-      <w:r>
-        <w:t xml:space="preserve"> </w:t>
-      </w:r>
-      <w:r>
-        <w:rPr>
-          <w:b/>
-          <w:bCs/>
-        </w:rPr>
-        <w:t xml:space="preserve">reopens</w:t>
-      </w:r>
-      <w:r>
-        <w:t xml:space="preserve"> </w:t>
-      </w:r>
-      <w:r>
-        <w:t xml:space="preserve">it for resubmission). Request lifecycle pending → submitted → accepted, email-scoped submission, 409 double-submit/accept guards.</w:t>
-      </w:r>
-      <w:r>
-        <w:t xml:space="preserve"> </w:t>
-      </w:r>
-      <w:r>
-        <w:rPr>
-          <w:rStyle w:val="VerbatimChar"/>
-        </w:rPr>
-        <w:t xml:space="preserve">POST /funds/{id}/portfolio/{iid}/kpi-requests</w:t>
-      </w:r>
-      <w:r>
-        <w:t xml:space="preserve">,</w:t>
-      </w:r>
-      <w:r>
-        <w:t xml:space="preserve"> </w:t>
-      </w:r>
-      <w:r>
-        <w:rPr>
-          <w:rStyle w:val="VerbatimChar"/>
-        </w:rPr>
-        <w:t xml:space="preserve">GET /funds/{id}/kpi-requests</w:t>
-      </w:r>
-      <w:r>
-        <w:t xml:space="preserve">,</w:t>
-      </w:r>
-      <w:r>
-        <w:t xml:space="preserve"> </w:t>
-      </w:r>
-      <w:r>
-        <w:rPr>
-          <w:rStyle w:val="VerbatimChar"/>
-        </w:rPr>
-        <w:t xml:space="preserve">POST .../accept|reopen</w:t>
-      </w:r>
-      <w:r>
-        <w:t xml:space="preserve">, portal</w:t>
-      </w:r>
-      <w:r>
-        <w:t xml:space="preserve"> </w:t>
-      </w:r>
-      <w:r>
-        <w:rPr>
-          <w:rStyle w:val="VerbatimChar"/>
-        </w:rPr>
-        <w:t xml:space="preserve">POST /portal/kpi-requests/{id}/submit</w:t>
+        <w:t xml:space="preserve">Portfolio signals</w:t>
+      </w:r>
+      <w:r>
+        <w:t xml:space="preserve">: rules-based early warning derived from the KPI history and marks —</w:t>
+      </w:r>
+      <w:r>
+        <w:t xml:space="preserve"> </w:t>
+      </w:r>
+      <w:r>
+        <w:rPr>
+          <w:b/>
+          <w:bCs/>
+        </w:rPr>
+        <w:t xml:space="preserve">revenue decline</w:t>
+      </w:r>
+      <w:r>
+        <w:t xml:space="preserve"> </w:t>
+      </w:r>
+      <w:r>
+        <w:t xml:space="preserve">period-over-period (high severity beyond 20%),</w:t>
+      </w:r>
+      <w:r>
+        <w:t xml:space="preserve"> </w:t>
+      </w:r>
+      <w:r>
+        <w:rPr>
+          <w:b/>
+          <w:bCs/>
+        </w:rPr>
+        <w:t xml:space="preserve">low runway</w:t>
+      </w:r>
+      <w:r>
+        <w:t xml:space="preserve"> </w:t>
+      </w:r>
+      <w:r>
+        <w:t xml:space="preserve">(&lt; 6 months),</w:t>
+      </w:r>
+      <w:r>
+        <w:t xml:space="preserve"> </w:t>
+      </w:r>
+      <w:r>
+        <w:rPr>
+          <w:b/>
+          <w:bCs/>
+        </w:rPr>
+        <w:t xml:space="preserve">mark below cost</w:t>
+      </w:r>
+      <w:r>
+        <w:t xml:space="preserve"> </w:t>
+      </w:r>
+      <w:r>
+        <w:t xml:space="preserve">(impairment %),</w:t>
+      </w:r>
+      <w:r>
+        <w:t xml:space="preserve"> </w:t>
+      </w:r>
+      <w:r>
+        <w:rPr>
+          <w:b/>
+          <w:bCs/>
+        </w:rPr>
+        <w:t xml:space="preserve">reporting gone silent</w:t>
+      </w:r>
+      <w:r>
+        <w:t xml:space="preserve"> </w:t>
+      </w:r>
+      <w:r>
+        <w:t xml:space="preserve">(&gt; 6 months since the last period; "never reported" info) — plus the positive signal,</w:t>
+      </w:r>
+      <w:r>
+        <w:t xml:space="preserve"> </w:t>
+      </w:r>
+      <w:r>
+        <w:rPr>
+          <w:b/>
+          <w:bCs/>
+        </w:rPr>
+        <w:t xml:space="preserve">follow-on candidates</w:t>
+      </w:r>
+      <w:r>
+        <w:t xml:space="preserve"> </w:t>
+      </w:r>
+      <w:r>
+        <w:t xml:space="preserve">(growing revenue with ≥ 12 months runway, feeding the FR-J-12 reserves decision). Severity roll-ups (high / warn / info / positive / all-clear) and per-company signal rows, worst first. Pure derivation, no schema.</w:t>
+      </w:r>
+      <w:r>
+        <w:t xml:space="preserve"> </w:t>
+      </w:r>
+      <w:r>
+        <w:rPr>
+          <w:rStyle w:val="VerbatimChar"/>
+        </w:rPr>
+        <w:t xml:space="preserve">GET /funds/{id}/signals</w:t>
       </w:r>
       <w:r>
         <w:t xml:space="preserve">.</w:t>
@@ -6196,7 +6145,185 @@
         <w:t xml:space="preserve"> </w:t>
       </w:r>
       <w:r>
-        <w:t xml:space="preserve">recurring request schedules; custom-metric requests (FR-J-21 planned).</w:t>
+        <w:t xml:space="preserve">signal thresholds per fund; notification digests.</w:t>
+      </w:r>
+    </w:p>
+    <w:p>
+      <w:pPr>
+        <w:pStyle w:val="Compact"/>
+        <w:numPr>
+          <w:ilvl w:val="0"/>
+          <w:numId w:val="1013"/>
+        </w:numPr>
+      </w:pPr>
+      <w:r>
+        <w:rPr>
+          <w:b/>
+          <w:bCs/>
+        </w:rPr>
+        <w:t xml:space="preserve">FR-J-19 (M — added v1.7, Vestberry gap)</w:t>
+      </w:r>
+      <w:r>
+        <w:t xml:space="preserve"> </w:t>
+      </w:r>
+      <w:r>
+        <w:t xml:space="preserve">✅</w:t>
+      </w:r>
+      <w:r>
+        <w:t xml:space="preserve"> </w:t>
+      </w:r>
+      <w:r>
+        <w:rPr>
+          <w:b/>
+          <w:bCs/>
+        </w:rPr>
+        <w:t xml:space="preserve">KPI reporting requests (investee self-service)</w:t>
+      </w:r>
+      <w:r>
+        <w:t xml:space="preserve">: the GP asks each portfolio company's</w:t>
+      </w:r>
+      <w:r>
+        <w:t xml:space="preserve"> </w:t>
+      </w:r>
+      <w:r>
+        <w:rPr>
+          <w:b/>
+          <w:bCs/>
+        </w:rPr>
+        <w:t xml:space="preserve">reporting contact</w:t>
+      </w:r>
+      <w:r>
+        <w:t xml:space="preserve"> </w:t>
+      </w:r>
+      <w:r>
+        <w:t xml:space="preserve">(email stored on the investment) for a KPI period; the contact sees the request in</w:t>
+      </w:r>
+      <w:r>
+        <w:t xml:space="preserve"> </w:t>
+      </w:r>
+      <w:r>
+        <w:rPr>
+          <w:b/>
+          <w:bCs/>
+        </w:rPr>
+        <w:t xml:space="preserve">their portal</w:t>
+      </w:r>
+      <w:r>
+        <w:t xml:space="preserve"> </w:t>
+      </w:r>
+      <w:r>
+        <w:t xml:space="preserve">(plus an in-app notification if they have an account) with due date and overdue flag, submits revenue/cash/burn/headcount, and the GP</w:t>
+      </w:r>
+      <w:r>
+        <w:t xml:space="preserve"> </w:t>
+      </w:r>
+      <w:r>
+        <w:rPr>
+          <w:b/>
+          <w:bCs/>
+        </w:rPr>
+        <w:t xml:space="preserve">accepts</w:t>
+      </w:r>
+      <w:r>
+        <w:t xml:space="preserve"> </w:t>
+      </w:r>
+      <w:r>
+        <w:t xml:space="preserve">the submission into</w:t>
+      </w:r>
+      <w:r>
+        <w:t xml:space="preserve"> </w:t>
+      </w:r>
+      <w:r>
+        <w:rPr>
+          <w:rStyle w:val="VerbatimChar"/>
+        </w:rPr>
+        <w:t xml:space="preserve">PortfolioKPI</w:t>
+      </w:r>
+      <w:r>
+        <w:t xml:space="preserve"> </w:t>
+      </w:r>
+      <w:r>
+        <w:t xml:space="preserve">(or</w:t>
+      </w:r>
+      <w:r>
+        <w:t xml:space="preserve"> </w:t>
+      </w:r>
+      <w:r>
+        <w:rPr>
+          <w:b/>
+          <w:bCs/>
+        </w:rPr>
+        <w:t xml:space="preserve">reopens</w:t>
+      </w:r>
+      <w:r>
+        <w:t xml:space="preserve"> </w:t>
+      </w:r>
+      <w:r>
+        <w:t xml:space="preserve">it for resubmission). Request lifecycle pending → submitted → accepted, email-scoped submission, 409 double-submit/accept guards.</w:t>
+      </w:r>
+      <w:r>
+        <w:t xml:space="preserve"> </w:t>
+      </w:r>
+      <w:r>
+        <w:rPr>
+          <w:rStyle w:val="VerbatimChar"/>
+        </w:rPr>
+        <w:t xml:space="preserve">POST /funds/{id}/portfolio/{iid}/kpi-requests</w:t>
+      </w:r>
+      <w:r>
+        <w:t xml:space="preserve">,</w:t>
+      </w:r>
+      <w:r>
+        <w:t xml:space="preserve"> </w:t>
+      </w:r>
+      <w:r>
+        <w:rPr>
+          <w:rStyle w:val="VerbatimChar"/>
+        </w:rPr>
+        <w:t xml:space="preserve">GET /funds/{id}/kpi-requests</w:t>
+      </w:r>
+      <w:r>
+        <w:t xml:space="preserve">,</w:t>
+      </w:r>
+      <w:r>
+        <w:t xml:space="preserve"> </w:t>
+      </w:r>
+      <w:r>
+        <w:rPr>
+          <w:rStyle w:val="VerbatimChar"/>
+        </w:rPr>
+        <w:t xml:space="preserve">POST .../accept|reopen</w:t>
+      </w:r>
+      <w:r>
+        <w:t xml:space="preserve">, portal</w:t>
+      </w:r>
+      <w:r>
+        <w:t xml:space="preserve"> </w:t>
+      </w:r>
+      <w:r>
+        <w:rPr>
+          <w:rStyle w:val="VerbatimChar"/>
+        </w:rPr>
+        <w:t xml:space="preserve">POST /portal/kpi-requests/{id}/submit</w:t>
+      </w:r>
+      <w:r>
+        <w:t xml:space="preserve">.</w:t>
+      </w:r>
+      <w:r>
+        <w:t xml:space="preserve"> </w:t>
+      </w:r>
+      <w:r>
+        <w:rPr>
+          <w:i/>
+          <w:iCs/>
+        </w:rPr>
+        <w:t xml:space="preserve">Remaining:</w:t>
+      </w:r>
+      <w:r>
+        <w:t xml:space="preserve"> </w:t>
+      </w:r>
+      <w:r>
+        <w:t xml:space="preserve">recurring request schedules; custom-metric requests (FR-J-22 planned).</w:t>
       </w:r>
     </w:p>
     <w:p>
@@ -16362,6 +16489,79 @@
       </w:r>
       <w:r>
         <w:t xml:space="preserve">— portfolio intelligence (Vestberry competitive gap analysis, fund side):</w:t>
+      </w:r>
+    </w:p>
+    <w:p>
+      <w:pPr>
+        <w:pStyle w:val="Compact"/>
+        <w:numPr>
+          <w:ilvl w:val="0"/>
+          <w:numId w:val="1030"/>
+        </w:numPr>
+      </w:pPr>
+      <w:r>
+        <w:rPr>
+          <w:b/>
+          <w:bCs/>
+        </w:rPr>
+        <w:t xml:space="preserve">FR-J-21 Company tear sheets</w:t>
+      </w:r>
+      <w:r>
+        <w:t xml:space="preserve"> </w:t>
+      </w:r>
+      <w:r>
+        <w:t xml:space="preserve">✅ —</w:t>
+      </w:r>
+      <w:r>
+        <w:t xml:space="preserve"> </w:t>
+      </w:r>
+      <w:r>
+        <w:rPr>
+          <w:rStyle w:val="VerbatimChar"/>
+        </w:rPr>
+        <w:t xml:space="preserve">tear_sheet</w:t>
+      </w:r>
+      <w:r>
+        <w:t xml:space="preserve"> </w:t>
+      </w:r>
+      <w:r>
+        <w:t xml:space="preserve">document template +</w:t>
+      </w:r>
+      <w:r>
+        <w:t xml:space="preserve"> </w:t>
+      </w:r>
+      <w:r>
+        <w:rPr>
+          <w:rStyle w:val="VerbatimChar"/>
+        </w:rPr>
+        <w:t xml:space="preserve">POST /funds/{id}/portfolio/{iid}/tear-sheet</w:t>
+      </w:r>
+      <w:r>
+        <w:t xml:space="preserve"> </w:t>
+      </w:r>
+      <w:r>
+        <w:t xml:space="preserve">composing investment / value &amp; MOIC / latest valuation / KPI trend (last 4, newest first) / active signals from the existing monitoring, valuation and signals services (amounts via</w:t>
+      </w:r>
+      <w:r>
+        <w:t xml:space="preserve"> </w:t>
+      </w:r>
+      <w:r>
+        <w:rPr>
+          <w:rStyle w:val="VerbatimChar"/>
+        </w:rPr>
+        <w:t xml:space="preserve">_inr</w:t>
+      </w:r>
+      <w:r>
+        <w:t xml:space="preserve">); "Tear sheet" button per row in the Fund Portfolio table. No schema change. 3 tests (</w:t>
+      </w:r>
+      <w:r>
+        <w:rPr>
+          <w:rStyle w:val="VerbatimChar"/>
+        </w:rPr>
+        <w:t xml:space="preserve">test_tear_sheet.py</w:t>
+      </w:r>
+      <w:r>
+        <w:t xml:space="preserve">).</w:t>
       </w:r>
     </w:p>
     <w:p>

</xml_diff>

<commit_message>
Backend: quarterly LP report pack (Vestberry gap #4)
FR-J-22: lp_report template + POST /funds/{id}/lp-report composing fund
snapshot, since-inception performance, period activity (new
period_activity service), SOI and valuation status; the report surfaces
fund-wide in every LP's portal statements. 3 tests. REQUIREMENTS v1.7 +
docx (custom-metric requests renumbered FR-J-23).

Co-Authored-By: Claude Opus 4.8 <noreply@anthropic.com>
</commit_message>
<xml_diff>
--- a/REQUIREMENTS.docx
+++ b/REQUIREMENTS.docx
@@ -5891,7 +5891,7 @@
           <w:b/>
           <w:bCs/>
         </w:rPr>
-        <w:t xml:space="preserve">FR-J-21 (M — added v1.7, Vestberry gap)</w:t>
+        <w:t xml:space="preserve">FR-J-22 (M — added v1.7, Vestberry gap)</w:t>
       </w:r>
       <w:r>
         <w:t xml:space="preserve"> </w:t>
@@ -5907,86 +5907,105 @@
           <w:b/>
           <w:bCs/>
         </w:rPr>
-        <w:t xml:space="preserve">Company tear sheets</w:t>
-      </w:r>
-      <w:r>
-        <w:t xml:space="preserve">: a one-pager document per portfolio company generated in one click from the Portfolio table — investment summary (instrument, invested, ownership, reporting contact),</w:t>
-      </w:r>
-      <w:r>
-        <w:t xml:space="preserve"> </w:t>
-      </w:r>
-      <w:r>
-        <w:rPr>
-          <w:b/>
-          <w:bCs/>
-        </w:rPr>
-        <w:t xml:space="preserve">value &amp; MOIC</w:t>
-      </w:r>
-      <w:r>
-        <w:t xml:space="preserve"> </w:t>
-      </w:r>
-      <w:r>
-        <w:t xml:space="preserve">(cost, fair value, unrealised gain), the</w:t>
-      </w:r>
-      <w:r>
-        <w:t xml:space="preserve"> </w:t>
-      </w:r>
-      <w:r>
-        <w:rPr>
-          <w:b/>
-          <w:bCs/>
-        </w:rPr>
-        <w:t xml:space="preserve">latest valuation</w:t>
-      </w:r>
-      <w:r>
-        <w:t xml:space="preserve"> </w:t>
-      </w:r>
-      <w:r>
-        <w:t xml:space="preserve">(value, methodology, valuer, independence, as-of — or "fund's own mark" when only a mark exists), the</w:t>
-      </w:r>
-      <w:r>
-        <w:t xml:space="preserve"> </w:t>
-      </w:r>
-      <w:r>
-        <w:rPr>
-          <w:b/>
-          <w:bCs/>
-        </w:rPr>
-        <w:t xml:space="preserve">KPI trend</w:t>
-      </w:r>
-      <w:r>
-        <w:t xml:space="preserve"> </w:t>
-      </w:r>
-      <w:r>
-        <w:t xml:space="preserve">(last 4 periods, newest first, with runway) and the company's</w:t>
-      </w:r>
-      <w:r>
-        <w:t xml:space="preserve"> </w:t>
-      </w:r>
-      <w:r>
-        <w:rPr>
-          <w:b/>
-          <w:bCs/>
-        </w:rPr>
-        <w:t xml:space="preserve">active signals</w:t>
-      </w:r>
-      <w:r>
-        <w:t xml:space="preserve"> </w:t>
-      </w:r>
-      <w:r>
-        <w:t xml:space="preserve">from FR-J-20 (or a healthy note) — composed entirely from the monitoring/valuation/signals services, amounts lakh/crore-formatted. Lands in the entity's Documents (PDF-renderable like all documents).</w:t>
-      </w:r>
-      <w:r>
-        <w:t xml:space="preserve"> </w:t>
-      </w:r>
-      <w:r>
-        <w:rPr>
-          <w:rStyle w:val="VerbatimChar"/>
-        </w:rPr>
-        <w:t xml:space="preserve">POST /funds/{id}/portfolio/{iid}/tear-sheet</w:t>
-      </w:r>
-      <w:r>
-        <w:t xml:space="preserve">.</w:t>
+        <w:t xml:space="preserve">Quarterly LP report pack</w:t>
+      </w:r>
+      <w:r>
+        <w:t xml:space="preserve">: a one-click quarterly report document per fund — fund snapshot (committed / drawn / uncalled / distributed), since-inception</w:t>
+      </w:r>
+      <w:r>
+        <w:t xml:space="preserve"> </w:t>
+      </w:r>
+      <w:r>
+        <w:rPr>
+          <w:b/>
+          <w:bCs/>
+        </w:rPr>
+        <w:t xml:space="preserve">performance</w:t>
+      </w:r>
+      <w:r>
+        <w:t xml:space="preserve"> </w:t>
+      </w:r>
+      <w:r>
+        <w:t xml:space="preserve">(NAV, NAV per unit, DPI / RVPI / TVPI / XIRR),</w:t>
+      </w:r>
+      <w:r>
+        <w:t xml:space="preserve"> </w:t>
+      </w:r>
+      <w:r>
+        <w:rPr>
+          <w:b/>
+          <w:bCs/>
+        </w:rPr>
+        <w:t xml:space="preserve">activity this period</w:t>
+      </w:r>
+      <w:r>
+        <w:t xml:space="preserve"> </w:t>
+      </w:r>
+      <w:r>
+        <w:t xml:space="preserve">(capital calls by due date and distributions by date falling in the reporting window, with amounts and carry), the</w:t>
+      </w:r>
+      <w:r>
+        <w:t xml:space="preserve"> </w:t>
+      </w:r>
+      <w:r>
+        <w:rPr>
+          <w:b/>
+          <w:bCs/>
+        </w:rPr>
+        <w:t xml:space="preserve">Schedule of Investments</w:t>
+      </w:r>
+      <w:r>
+        <w:t xml:space="preserve"> </w:t>
+      </w:r>
+      <w:r>
+        <w:t xml:space="preserve">with totals, and</w:t>
+      </w:r>
+      <w:r>
+        <w:t xml:space="preserve"> </w:t>
+      </w:r>
+      <w:r>
+        <w:rPr>
+          <w:b/>
+          <w:bCs/>
+        </w:rPr>
+        <w:t xml:space="preserve">valuation status</w:t>
+      </w:r>
+      <w:r>
+        <w:t xml:space="preserve"> </w:t>
+      </w:r>
+      <w:r>
+        <w:t xml:space="preserve">vs the FR-J-15 policy — composed entirely from the existing capital-accounts / performance / SOI / valuation services, amounts lakh/crore-formatted, unaudited-figures disclaimer. The report</w:t>
+      </w:r>
+      <w:r>
+        <w:t xml:space="preserve"> </w:t>
+      </w:r>
+      <w:r>
+        <w:rPr>
+          <w:b/>
+          <w:bCs/>
+        </w:rPr>
+        <w:t xml:space="preserve">surfaces automatically in every LP's portal</w:t>
+      </w:r>
+      <w:r>
+        <w:t xml:space="preserve"> </w:t>
+      </w:r>
+      <w:r>
+        <w:t xml:space="preserve">statements list (fund-wide, alongside their personal capital-account statements and Form 64C).</w:t>
+      </w:r>
+      <w:r>
+        <w:t xml:space="preserve"> </w:t>
+      </w:r>
+      <w:r>
+        <w:rPr>
+          <w:rStyle w:val="VerbatimChar"/>
+        </w:rPr>
+        <w:t xml:space="preserve">POST /funds/{id}/lp-report</w:t>
+      </w:r>
+      <w:r>
+        <w:t xml:space="preserve"> </w:t>
+      </w:r>
+      <w:r>
+        <w:t xml:space="preserve">(period label + start/end; 400 on inverted period).</w:t>
       </w:r>
       <w:r>
         <w:t xml:space="preserve"> </w:t>
@@ -6002,7 +6021,7 @@
         <w:t xml:space="preserve"> </w:t>
       </w:r>
       <w:r>
-        <w:t xml:space="preserve">custom sections/branding; batch generation for the whole portfolio.</w:t>
+        <w:t xml:space="preserve">per-LP personalised section (their capital account inside the pack); scheduled quarterly runs; PDF branding.</w:t>
       </w:r>
     </w:p>
     <w:p>
@@ -6018,7 +6037,7 @@
           <w:b/>
           <w:bCs/>
         </w:rPr>
-        <w:t xml:space="preserve">FR-J-20 (M — added v1.7, Vestberry gap)</w:t>
+        <w:t xml:space="preserve">FR-J-21 (M — added v1.7, Vestberry gap)</w:t>
       </w:r>
       <w:r>
         <w:t xml:space="preserve"> </w:t>
@@ -6034,99 +6053,83 @@
           <w:b/>
           <w:bCs/>
         </w:rPr>
-        <w:t xml:space="preserve">Portfolio signals</w:t>
-      </w:r>
-      <w:r>
-        <w:t xml:space="preserve">: rules-based early warning derived from the KPI history and marks —</w:t>
-      </w:r>
-      <w:r>
-        <w:t xml:space="preserve"> </w:t>
-      </w:r>
-      <w:r>
-        <w:rPr>
-          <w:b/>
-          <w:bCs/>
-        </w:rPr>
-        <w:t xml:space="preserve">revenue decline</w:t>
-      </w:r>
-      <w:r>
-        <w:t xml:space="preserve"> </w:t>
-      </w:r>
-      <w:r>
-        <w:t xml:space="preserve">period-over-period (high severity beyond 20%),</w:t>
-      </w:r>
-      <w:r>
-        <w:t xml:space="preserve"> </w:t>
-      </w:r>
-      <w:r>
-        <w:rPr>
-          <w:b/>
-          <w:bCs/>
-        </w:rPr>
-        <w:t xml:space="preserve">low runway</w:t>
-      </w:r>
-      <w:r>
-        <w:t xml:space="preserve"> </w:t>
-      </w:r>
-      <w:r>
-        <w:t xml:space="preserve">(&lt; 6 months),</w:t>
-      </w:r>
-      <w:r>
-        <w:t xml:space="preserve"> </w:t>
-      </w:r>
-      <w:r>
-        <w:rPr>
-          <w:b/>
-          <w:bCs/>
-        </w:rPr>
-        <w:t xml:space="preserve">mark below cost</w:t>
-      </w:r>
-      <w:r>
-        <w:t xml:space="preserve"> </w:t>
-      </w:r>
-      <w:r>
-        <w:t xml:space="preserve">(impairment %),</w:t>
-      </w:r>
-      <w:r>
-        <w:t xml:space="preserve"> </w:t>
-      </w:r>
-      <w:r>
-        <w:rPr>
-          <w:b/>
-          <w:bCs/>
-        </w:rPr>
-        <w:t xml:space="preserve">reporting gone silent</w:t>
-      </w:r>
-      <w:r>
-        <w:t xml:space="preserve"> </w:t>
-      </w:r>
-      <w:r>
-        <w:t xml:space="preserve">(&gt; 6 months since the last period; "never reported" info) — plus the positive signal,</w:t>
-      </w:r>
-      <w:r>
-        <w:t xml:space="preserve"> </w:t>
-      </w:r>
-      <w:r>
-        <w:rPr>
-          <w:b/>
-          <w:bCs/>
-        </w:rPr>
-        <w:t xml:space="preserve">follow-on candidates</w:t>
-      </w:r>
-      <w:r>
-        <w:t xml:space="preserve"> </w:t>
-      </w:r>
-      <w:r>
-        <w:t xml:space="preserve">(growing revenue with ≥ 12 months runway, feeding the FR-J-12 reserves decision). Severity roll-ups (high / warn / info / positive / all-clear) and per-company signal rows, worst first. Pure derivation, no schema.</w:t>
-      </w:r>
-      <w:r>
-        <w:t xml:space="preserve"> </w:t>
-      </w:r>
-      <w:r>
-        <w:rPr>
-          <w:rStyle w:val="VerbatimChar"/>
-        </w:rPr>
-        <w:t xml:space="preserve">GET /funds/{id}/signals</w:t>
+        <w:t xml:space="preserve">Company tear sheets</w:t>
+      </w:r>
+      <w:r>
+        <w:t xml:space="preserve">: a one-pager document per portfolio company generated in one click from the Portfolio table — investment summary (instrument, invested, ownership, reporting contact),</w:t>
+      </w:r>
+      <w:r>
+        <w:t xml:space="preserve"> </w:t>
+      </w:r>
+      <w:r>
+        <w:rPr>
+          <w:b/>
+          <w:bCs/>
+        </w:rPr>
+        <w:t xml:space="preserve">value &amp; MOIC</w:t>
+      </w:r>
+      <w:r>
+        <w:t xml:space="preserve"> </w:t>
+      </w:r>
+      <w:r>
+        <w:t xml:space="preserve">(cost, fair value, unrealised gain), the</w:t>
+      </w:r>
+      <w:r>
+        <w:t xml:space="preserve"> </w:t>
+      </w:r>
+      <w:r>
+        <w:rPr>
+          <w:b/>
+          <w:bCs/>
+        </w:rPr>
+        <w:t xml:space="preserve">latest valuation</w:t>
+      </w:r>
+      <w:r>
+        <w:t xml:space="preserve"> </w:t>
+      </w:r>
+      <w:r>
+        <w:t xml:space="preserve">(value, methodology, valuer, independence, as-of — or "fund's own mark" when only a mark exists), the</w:t>
+      </w:r>
+      <w:r>
+        <w:t xml:space="preserve"> </w:t>
+      </w:r>
+      <w:r>
+        <w:rPr>
+          <w:b/>
+          <w:bCs/>
+        </w:rPr>
+        <w:t xml:space="preserve">KPI trend</w:t>
+      </w:r>
+      <w:r>
+        <w:t xml:space="preserve"> </w:t>
+      </w:r>
+      <w:r>
+        <w:t xml:space="preserve">(last 4 periods, newest first, with runway) and the company's</w:t>
+      </w:r>
+      <w:r>
+        <w:t xml:space="preserve"> </w:t>
+      </w:r>
+      <w:r>
+        <w:rPr>
+          <w:b/>
+          <w:bCs/>
+        </w:rPr>
+        <w:t xml:space="preserve">active signals</w:t>
+      </w:r>
+      <w:r>
+        <w:t xml:space="preserve"> </w:t>
+      </w:r>
+      <w:r>
+        <w:t xml:space="preserve">from FR-J-20 (or a healthy note) — composed entirely from the monitoring/valuation/signals services, amounts lakh/crore-formatted. Lands in the entity's Documents (PDF-renderable like all documents).</w:t>
+      </w:r>
+      <w:r>
+        <w:t xml:space="preserve"> </w:t>
+      </w:r>
+      <w:r>
+        <w:rPr>
+          <w:rStyle w:val="VerbatimChar"/>
+        </w:rPr>
+        <w:t xml:space="preserve">POST /funds/{id}/portfolio/{iid}/tear-sheet</w:t>
       </w:r>
       <w:r>
         <w:t xml:space="preserve">.</w:t>
@@ -6145,7 +6148,7 @@
         <w:t xml:space="preserve"> </w:t>
       </w:r>
       <w:r>
-        <w:t xml:space="preserve">signal thresholds per fund; notification digests.</w:t>
+        <w:t xml:space="preserve">custom sections/branding; batch generation for the whole portfolio.</w:t>
       </w:r>
     </w:p>
     <w:p>
@@ -6161,7 +6164,7 @@
           <w:b/>
           <w:bCs/>
         </w:rPr>
-        <w:t xml:space="preserve">FR-J-19 (M — added v1.7, Vestberry gap)</w:t>
+        <w:t xml:space="preserve">FR-J-20 (M — added v1.7, Vestberry gap)</w:t>
       </w:r>
       <w:r>
         <w:t xml:space="preserve"> </w:t>
@@ -6177,134 +6180,99 @@
           <w:b/>
           <w:bCs/>
         </w:rPr>
-        <w:t xml:space="preserve">KPI reporting requests (investee self-service)</w:t>
-      </w:r>
-      <w:r>
-        <w:t xml:space="preserve">: the GP asks each portfolio company's</w:t>
-      </w:r>
-      <w:r>
-        <w:t xml:space="preserve"> </w:t>
-      </w:r>
-      <w:r>
-        <w:rPr>
-          <w:b/>
-          <w:bCs/>
-        </w:rPr>
-        <w:t xml:space="preserve">reporting contact</w:t>
-      </w:r>
-      <w:r>
-        <w:t xml:space="preserve"> </w:t>
-      </w:r>
-      <w:r>
-        <w:t xml:space="preserve">(email stored on the investment) for a KPI period; the contact sees the request in</w:t>
-      </w:r>
-      <w:r>
-        <w:t xml:space="preserve"> </w:t>
-      </w:r>
-      <w:r>
-        <w:rPr>
-          <w:b/>
-          <w:bCs/>
-        </w:rPr>
-        <w:t xml:space="preserve">their portal</w:t>
-      </w:r>
-      <w:r>
-        <w:t xml:space="preserve"> </w:t>
-      </w:r>
-      <w:r>
-        <w:t xml:space="preserve">(plus an in-app notification if they have an account) with due date and overdue flag, submits revenue/cash/burn/headcount, and the GP</w:t>
-      </w:r>
-      <w:r>
-        <w:t xml:space="preserve"> </w:t>
-      </w:r>
-      <w:r>
-        <w:rPr>
-          <w:b/>
-          <w:bCs/>
-        </w:rPr>
-        <w:t xml:space="preserve">accepts</w:t>
-      </w:r>
-      <w:r>
-        <w:t xml:space="preserve"> </w:t>
-      </w:r>
-      <w:r>
-        <w:t xml:space="preserve">the submission into</w:t>
-      </w:r>
-      <w:r>
-        <w:t xml:space="preserve"> </w:t>
-      </w:r>
-      <w:r>
-        <w:rPr>
-          <w:rStyle w:val="VerbatimChar"/>
-        </w:rPr>
-        <w:t xml:space="preserve">PortfolioKPI</w:t>
-      </w:r>
-      <w:r>
-        <w:t xml:space="preserve"> </w:t>
-      </w:r>
-      <w:r>
-        <w:t xml:space="preserve">(or</w:t>
-      </w:r>
-      <w:r>
-        <w:t xml:space="preserve"> </w:t>
-      </w:r>
-      <w:r>
-        <w:rPr>
-          <w:b/>
-          <w:bCs/>
-        </w:rPr>
-        <w:t xml:space="preserve">reopens</w:t>
-      </w:r>
-      <w:r>
-        <w:t xml:space="preserve"> </w:t>
-      </w:r>
-      <w:r>
-        <w:t xml:space="preserve">it for resubmission). Request lifecycle pending → submitted → accepted, email-scoped submission, 409 double-submit/accept guards.</w:t>
-      </w:r>
-      <w:r>
-        <w:t xml:space="preserve"> </w:t>
-      </w:r>
-      <w:r>
-        <w:rPr>
-          <w:rStyle w:val="VerbatimChar"/>
-        </w:rPr>
-        <w:t xml:space="preserve">POST /funds/{id}/portfolio/{iid}/kpi-requests</w:t>
-      </w:r>
-      <w:r>
-        <w:t xml:space="preserve">,</w:t>
-      </w:r>
-      <w:r>
-        <w:t xml:space="preserve"> </w:t>
-      </w:r>
-      <w:r>
-        <w:rPr>
-          <w:rStyle w:val="VerbatimChar"/>
-        </w:rPr>
-        <w:t xml:space="preserve">GET /funds/{id}/kpi-requests</w:t>
-      </w:r>
-      <w:r>
-        <w:t xml:space="preserve">,</w:t>
-      </w:r>
-      <w:r>
-        <w:t xml:space="preserve"> </w:t>
-      </w:r>
-      <w:r>
-        <w:rPr>
-          <w:rStyle w:val="VerbatimChar"/>
-        </w:rPr>
-        <w:t xml:space="preserve">POST .../accept|reopen</w:t>
-      </w:r>
-      <w:r>
-        <w:t xml:space="preserve">, portal</w:t>
-      </w:r>
-      <w:r>
-        <w:t xml:space="preserve"> </w:t>
-      </w:r>
-      <w:r>
-        <w:rPr>
-          <w:rStyle w:val="VerbatimChar"/>
-        </w:rPr>
-        <w:t xml:space="preserve">POST /portal/kpi-requests/{id}/submit</w:t>
+        <w:t xml:space="preserve">Portfolio signals</w:t>
+      </w:r>
+      <w:r>
+        <w:t xml:space="preserve">: rules-based early warning derived from the KPI history and marks —</w:t>
+      </w:r>
+      <w:r>
+        <w:t xml:space="preserve"> </w:t>
+      </w:r>
+      <w:r>
+        <w:rPr>
+          <w:b/>
+          <w:bCs/>
+        </w:rPr>
+        <w:t xml:space="preserve">revenue decline</w:t>
+      </w:r>
+      <w:r>
+        <w:t xml:space="preserve"> </w:t>
+      </w:r>
+      <w:r>
+        <w:t xml:space="preserve">period-over-period (high severity beyond 20%),</w:t>
+      </w:r>
+      <w:r>
+        <w:t xml:space="preserve"> </w:t>
+      </w:r>
+      <w:r>
+        <w:rPr>
+          <w:b/>
+          <w:bCs/>
+        </w:rPr>
+        <w:t xml:space="preserve">low runway</w:t>
+      </w:r>
+      <w:r>
+        <w:t xml:space="preserve"> </w:t>
+      </w:r>
+      <w:r>
+        <w:t xml:space="preserve">(&lt; 6 months),</w:t>
+      </w:r>
+      <w:r>
+        <w:t xml:space="preserve"> </w:t>
+      </w:r>
+      <w:r>
+        <w:rPr>
+          <w:b/>
+          <w:bCs/>
+        </w:rPr>
+        <w:t xml:space="preserve">mark below cost</w:t>
+      </w:r>
+      <w:r>
+        <w:t xml:space="preserve"> </w:t>
+      </w:r>
+      <w:r>
+        <w:t xml:space="preserve">(impairment %),</w:t>
+      </w:r>
+      <w:r>
+        <w:t xml:space="preserve"> </w:t>
+      </w:r>
+      <w:r>
+        <w:rPr>
+          <w:b/>
+          <w:bCs/>
+        </w:rPr>
+        <w:t xml:space="preserve">reporting gone silent</w:t>
+      </w:r>
+      <w:r>
+        <w:t xml:space="preserve"> </w:t>
+      </w:r>
+      <w:r>
+        <w:t xml:space="preserve">(&gt; 6 months since the last period; "never reported" info) — plus the positive signal,</w:t>
+      </w:r>
+      <w:r>
+        <w:t xml:space="preserve"> </w:t>
+      </w:r>
+      <w:r>
+        <w:rPr>
+          <w:b/>
+          <w:bCs/>
+        </w:rPr>
+        <w:t xml:space="preserve">follow-on candidates</w:t>
+      </w:r>
+      <w:r>
+        <w:t xml:space="preserve"> </w:t>
+      </w:r>
+      <w:r>
+        <w:t xml:space="preserve">(growing revenue with ≥ 12 months runway, feeding the FR-J-12 reserves decision). Severity roll-ups (high / warn / info / positive / all-clear) and per-company signal rows, worst first. Pure derivation, no schema.</w:t>
+      </w:r>
+      <w:r>
+        <w:t xml:space="preserve"> </w:t>
+      </w:r>
+      <w:r>
+        <w:rPr>
+          <w:rStyle w:val="VerbatimChar"/>
+        </w:rPr>
+        <w:t xml:space="preserve">GET /funds/{id}/signals</w:t>
       </w:r>
       <w:r>
         <w:t xml:space="preserve">.</w:t>
@@ -6323,7 +6291,185 @@
         <w:t xml:space="preserve"> </w:t>
       </w:r>
       <w:r>
-        <w:t xml:space="preserve">recurring request schedules; custom-metric requests (FR-J-22 planned).</w:t>
+        <w:t xml:space="preserve">signal thresholds per fund; notification digests.</w:t>
+      </w:r>
+    </w:p>
+    <w:p>
+      <w:pPr>
+        <w:pStyle w:val="Compact"/>
+        <w:numPr>
+          <w:ilvl w:val="0"/>
+          <w:numId w:val="1013"/>
+        </w:numPr>
+      </w:pPr>
+      <w:r>
+        <w:rPr>
+          <w:b/>
+          <w:bCs/>
+        </w:rPr>
+        <w:t xml:space="preserve">FR-J-19 (M — added v1.7, Vestberry gap)</w:t>
+      </w:r>
+      <w:r>
+        <w:t xml:space="preserve"> </w:t>
+      </w:r>
+      <w:r>
+        <w:t xml:space="preserve">✅</w:t>
+      </w:r>
+      <w:r>
+        <w:t xml:space="preserve"> </w:t>
+      </w:r>
+      <w:r>
+        <w:rPr>
+          <w:b/>
+          <w:bCs/>
+        </w:rPr>
+        <w:t xml:space="preserve">KPI reporting requests (investee self-service)</w:t>
+      </w:r>
+      <w:r>
+        <w:t xml:space="preserve">: the GP asks each portfolio company's</w:t>
+      </w:r>
+      <w:r>
+        <w:t xml:space="preserve"> </w:t>
+      </w:r>
+      <w:r>
+        <w:rPr>
+          <w:b/>
+          <w:bCs/>
+        </w:rPr>
+        <w:t xml:space="preserve">reporting contact</w:t>
+      </w:r>
+      <w:r>
+        <w:t xml:space="preserve"> </w:t>
+      </w:r>
+      <w:r>
+        <w:t xml:space="preserve">(email stored on the investment) for a KPI period; the contact sees the request in</w:t>
+      </w:r>
+      <w:r>
+        <w:t xml:space="preserve"> </w:t>
+      </w:r>
+      <w:r>
+        <w:rPr>
+          <w:b/>
+          <w:bCs/>
+        </w:rPr>
+        <w:t xml:space="preserve">their portal</w:t>
+      </w:r>
+      <w:r>
+        <w:t xml:space="preserve"> </w:t>
+      </w:r>
+      <w:r>
+        <w:t xml:space="preserve">(plus an in-app notification if they have an account) with due date and overdue flag, submits revenue/cash/burn/headcount, and the GP</w:t>
+      </w:r>
+      <w:r>
+        <w:t xml:space="preserve"> </w:t>
+      </w:r>
+      <w:r>
+        <w:rPr>
+          <w:b/>
+          <w:bCs/>
+        </w:rPr>
+        <w:t xml:space="preserve">accepts</w:t>
+      </w:r>
+      <w:r>
+        <w:t xml:space="preserve"> </w:t>
+      </w:r>
+      <w:r>
+        <w:t xml:space="preserve">the submission into</w:t>
+      </w:r>
+      <w:r>
+        <w:t xml:space="preserve"> </w:t>
+      </w:r>
+      <w:r>
+        <w:rPr>
+          <w:rStyle w:val="VerbatimChar"/>
+        </w:rPr>
+        <w:t xml:space="preserve">PortfolioKPI</w:t>
+      </w:r>
+      <w:r>
+        <w:t xml:space="preserve"> </w:t>
+      </w:r>
+      <w:r>
+        <w:t xml:space="preserve">(or</w:t>
+      </w:r>
+      <w:r>
+        <w:t xml:space="preserve"> </w:t>
+      </w:r>
+      <w:r>
+        <w:rPr>
+          <w:b/>
+          <w:bCs/>
+        </w:rPr>
+        <w:t xml:space="preserve">reopens</w:t>
+      </w:r>
+      <w:r>
+        <w:t xml:space="preserve"> </w:t>
+      </w:r>
+      <w:r>
+        <w:t xml:space="preserve">it for resubmission). Request lifecycle pending → submitted → accepted, email-scoped submission, 409 double-submit/accept guards.</w:t>
+      </w:r>
+      <w:r>
+        <w:t xml:space="preserve"> </w:t>
+      </w:r>
+      <w:r>
+        <w:rPr>
+          <w:rStyle w:val="VerbatimChar"/>
+        </w:rPr>
+        <w:t xml:space="preserve">POST /funds/{id}/portfolio/{iid}/kpi-requests</w:t>
+      </w:r>
+      <w:r>
+        <w:t xml:space="preserve">,</w:t>
+      </w:r>
+      <w:r>
+        <w:t xml:space="preserve"> </w:t>
+      </w:r>
+      <w:r>
+        <w:rPr>
+          <w:rStyle w:val="VerbatimChar"/>
+        </w:rPr>
+        <w:t xml:space="preserve">GET /funds/{id}/kpi-requests</w:t>
+      </w:r>
+      <w:r>
+        <w:t xml:space="preserve">,</w:t>
+      </w:r>
+      <w:r>
+        <w:t xml:space="preserve"> </w:t>
+      </w:r>
+      <w:r>
+        <w:rPr>
+          <w:rStyle w:val="VerbatimChar"/>
+        </w:rPr>
+        <w:t xml:space="preserve">POST .../accept|reopen</w:t>
+      </w:r>
+      <w:r>
+        <w:t xml:space="preserve">, portal</w:t>
+      </w:r>
+      <w:r>
+        <w:t xml:space="preserve"> </w:t>
+      </w:r>
+      <w:r>
+        <w:rPr>
+          <w:rStyle w:val="VerbatimChar"/>
+        </w:rPr>
+        <w:t xml:space="preserve">POST /portal/kpi-requests/{id}/submit</w:t>
+      </w:r>
+      <w:r>
+        <w:t xml:space="preserve">.</w:t>
+      </w:r>
+      <w:r>
+        <w:t xml:space="preserve"> </w:t>
+      </w:r>
+      <w:r>
+        <w:rPr>
+          <w:i/>
+          <w:iCs/>
+        </w:rPr>
+        <w:t xml:space="preserve">Remaining:</w:t>
+      </w:r>
+      <w:r>
+        <w:t xml:space="preserve"> </w:t>
+      </w:r>
+      <w:r>
+        <w:t xml:space="preserve">recurring request schedules; custom-metric requests (FR-J-23 planned).</w:t>
       </w:r>
     </w:p>
     <w:p>
@@ -16489,6 +16635,97 @@
       </w:r>
       <w:r>
         <w:t xml:space="preserve">— portfolio intelligence (Vestberry competitive gap analysis, fund side):</w:t>
+      </w:r>
+    </w:p>
+    <w:p>
+      <w:pPr>
+        <w:pStyle w:val="Compact"/>
+        <w:numPr>
+          <w:ilvl w:val="0"/>
+          <w:numId w:val="1030"/>
+        </w:numPr>
+      </w:pPr>
+      <w:r>
+        <w:rPr>
+          <w:b/>
+          <w:bCs/>
+        </w:rPr>
+        <w:t xml:space="preserve">FR-J-22 Quarterly LP report pack</w:t>
+      </w:r>
+      <w:r>
+        <w:t xml:space="preserve"> </w:t>
+      </w:r>
+      <w:r>
+        <w:t xml:space="preserve">✅ —</w:t>
+      </w:r>
+      <w:r>
+        <w:t xml:space="preserve"> </w:t>
+      </w:r>
+      <w:r>
+        <w:rPr>
+          <w:rStyle w:val="VerbatimChar"/>
+        </w:rPr>
+        <w:t xml:space="preserve">lp_report</w:t>
+      </w:r>
+      <w:r>
+        <w:t xml:space="preserve"> </w:t>
+      </w:r>
+      <w:r>
+        <w:t xml:space="preserve">document template +</w:t>
+      </w:r>
+      <w:r>
+        <w:t xml:space="preserve"> </w:t>
+      </w:r>
+      <w:r>
+        <w:rPr>
+          <w:rStyle w:val="VerbatimChar"/>
+        </w:rPr>
+        <w:t xml:space="preserve">POST /funds/{id}/lp-report</w:t>
+      </w:r>
+      <w:r>
+        <w:t xml:space="preserve"> </w:t>
+      </w:r>
+      <w:r>
+        <w:t xml:space="preserve">(period label + start/end) composing fund snapshot / performance / period activity (new</w:t>
+      </w:r>
+      <w:r>
+        <w:t xml:space="preserve"> </w:t>
+      </w:r>
+      <w:r>
+        <w:rPr>
+          <w:rStyle w:val="VerbatimChar"/>
+        </w:rPr>
+        <w:t xml:space="preserve">services/fund.py::period_activity</w:t>
+      </w:r>
+      <w:r>
+        <w:t xml:space="preserve"> </w:t>
+      </w:r>
+      <w:r>
+        <w:t xml:space="preserve">— calls by due date, distributions by date, created-date fallback) / SOI / valuation status; surfaces fund-wide in every LP's portal statements (portal statements query gains an OR arm on subject_type</w:t>
+      </w:r>
+      <w:r>
+        <w:t xml:space="preserve"> </w:t>
+      </w:r>
+      <w:r>
+        <w:rPr>
+          <w:rStyle w:val="VerbatimChar"/>
+        </w:rPr>
+        <w:t xml:space="preserve">lp_report</w:t>
+      </w:r>
+      <w:r>
+        <w:t xml:space="preserve"> </w:t>
+      </w:r>
+      <w:r>
+        <w:t xml:space="preserve">+ subject_id fund). "Quarterly LP report" button on Capital accounts (defaults to the current quarter, FY-quarter label derived from the end date). No schema change. 3 tests (</w:t>
+      </w:r>
+      <w:r>
+        <w:rPr>
+          <w:rStyle w:val="VerbatimChar"/>
+        </w:rPr>
+        <w:t xml:space="preserve">test_lp_report.py</w:t>
+      </w:r>
+      <w:r>
+        <w:t xml:space="preserve">).</w:t>
       </w:r>
     </w:p>
     <w:p>

</xml_diff>

<commit_message>
Backend: custom KPI definitions + internal benchmarking (Vestberry gaps #5-#6)
FR-J-23: KPIDefinition (per-fund custom metrics, slug keys, 409 dup) +
ESG presets rules-as-data; values stored as JSON on PortfolioKPI,
filtered to defined keys. FR-J-24: portfolio_benchmarks — companies x
core+custom metrics vs portfolio medians, pure derivation. Alembic
b8c9d0e1f2a3. 3 tests. REQUIREMENTS v1.7 + docx.

Co-Authored-By: Claude Opus 4.8 <noreply@anthropic.com>
</commit_message>
<xml_diff>
--- a/REQUIREMENTS.docx
+++ b/REQUIREMENTS.docx
@@ -5891,7 +5891,7 @@
           <w:b/>
           <w:bCs/>
         </w:rPr>
-        <w:t xml:space="preserve">FR-J-22 (M — added v1.7, Vestberry gap)</w:t>
+        <w:t xml:space="preserve">FR-J-24 (M — added v1.7, Vestberry gap)</w:t>
       </w:r>
       <w:r>
         <w:t xml:space="preserve"> </w:t>
@@ -5907,105 +5907,39 @@
           <w:b/>
           <w:bCs/>
         </w:rPr>
-        <w:t xml:space="preserve">Quarterly LP report pack</w:t>
-      </w:r>
-      <w:r>
-        <w:t xml:space="preserve">: a one-click quarterly report document per fund — fund snapshot (committed / drawn / uncalled / distributed), since-inception</w:t>
-      </w:r>
-      <w:r>
-        <w:t xml:space="preserve"> </w:t>
-      </w:r>
-      <w:r>
-        <w:rPr>
-          <w:b/>
-          <w:bCs/>
-        </w:rPr>
-        <w:t xml:space="preserve">performance</w:t>
-      </w:r>
-      <w:r>
-        <w:t xml:space="preserve"> </w:t>
-      </w:r>
-      <w:r>
-        <w:t xml:space="preserve">(NAV, NAV per unit, DPI / RVPI / TVPI / XIRR),</w:t>
-      </w:r>
-      <w:r>
-        <w:t xml:space="preserve"> </w:t>
-      </w:r>
-      <w:r>
-        <w:rPr>
-          <w:b/>
-          <w:bCs/>
-        </w:rPr>
-        <w:t xml:space="preserve">activity this period</w:t>
-      </w:r>
-      <w:r>
-        <w:t xml:space="preserve"> </w:t>
-      </w:r>
-      <w:r>
-        <w:t xml:space="preserve">(capital calls by due date and distributions by date falling in the reporting window, with amounts and carry), the</w:t>
-      </w:r>
-      <w:r>
-        <w:t xml:space="preserve"> </w:t>
-      </w:r>
-      <w:r>
-        <w:rPr>
-          <w:b/>
-          <w:bCs/>
-        </w:rPr>
-        <w:t xml:space="preserve">Schedule of Investments</w:t>
-      </w:r>
-      <w:r>
-        <w:t xml:space="preserve"> </w:t>
-      </w:r>
-      <w:r>
-        <w:t xml:space="preserve">with totals, and</w:t>
-      </w:r>
-      <w:r>
-        <w:t xml:space="preserve"> </w:t>
-      </w:r>
-      <w:r>
-        <w:rPr>
-          <w:b/>
-          <w:bCs/>
-        </w:rPr>
-        <w:t xml:space="preserve">valuation status</w:t>
-      </w:r>
-      <w:r>
-        <w:t xml:space="preserve"> </w:t>
-      </w:r>
-      <w:r>
-        <w:t xml:space="preserve">vs the FR-J-15 policy — composed entirely from the existing capital-accounts / performance / SOI / valuation services, amounts lakh/crore-formatted, unaudited-figures disclaimer. The report</w:t>
-      </w:r>
-      <w:r>
-        <w:t xml:space="preserve"> </w:t>
-      </w:r>
-      <w:r>
-        <w:rPr>
-          <w:b/>
-          <w:bCs/>
-        </w:rPr>
-        <w:t xml:space="preserve">surfaces automatically in every LP's portal</w:t>
-      </w:r>
-      <w:r>
-        <w:t xml:space="preserve"> </w:t>
-      </w:r>
-      <w:r>
-        <w:t xml:space="preserve">statements list (fund-wide, alongside their personal capital-account statements and Form 64C).</w:t>
-      </w:r>
-      <w:r>
-        <w:t xml:space="preserve"> </w:t>
-      </w:r>
-      <w:r>
-        <w:rPr>
-          <w:rStyle w:val="VerbatimChar"/>
-        </w:rPr>
-        <w:t xml:space="preserve">POST /funds/{id}/lp-report</w:t>
-      </w:r>
-      <w:r>
-        <w:t xml:space="preserve"> </w:t>
-      </w:r>
-      <w:r>
-        <w:t xml:space="preserve">(period label + start/end; 400 on inverted period).</w:t>
+        <w:t xml:space="preserve">Internal benchmarking (portfolio medians)</w:t>
+      </w:r>
+      <w:r>
+        <w:t xml:space="preserve">: each portfolio company's latest period side-by-side on the core metrics (revenue, revenue growth %, monthly burn, runway, headcount)</w:t>
+      </w:r>
+      <w:r>
+        <w:t xml:space="preserve"> </w:t>
+      </w:r>
+      <w:r>
+        <w:rPr>
+          <w:b/>
+          <w:bCs/>
+        </w:rPr>
+        <w:t xml:space="preserve">and every custom metric from FR-J-23</w:t>
+      </w:r>
+      <w:r>
+        <w:t xml:space="preserve">, against the</w:t>
+      </w:r>
+      <w:r>
+        <w:t xml:space="preserve"> </w:t>
+      </w:r>
+      <w:r>
+        <w:rPr>
+          <w:b/>
+          <w:bCs/>
+        </w:rPr>
+        <w:t xml:space="preserve">portfolio median</w:t>
+      </w:r>
+      <w:r>
+        <w:t xml:space="preserve"> </w:t>
+      </w:r>
+      <w:r>
+        <w:t xml:space="preserve">per metric, with above/below markers. Answers "is this company normal</w:t>
       </w:r>
       <w:r>
         <w:t xml:space="preserve"> </w:t>
@@ -6015,121 +5949,19 @@
           <w:i/>
           <w:iCs/>
         </w:rPr>
-        <w:t xml:space="preserve">Remaining:</w:t>
-      </w:r>
-      <w:r>
-        <w:t xml:space="preserve"> </w:t>
-      </w:r>
-      <w:r>
-        <w:t xml:space="preserve">per-LP personalised section (their capital account inside the pack); scheduled quarterly runs; PDF branding.</w:t>
-      </w:r>
-    </w:p>
-    <w:p>
-      <w:pPr>
-        <w:pStyle w:val="Compact"/>
-        <w:numPr>
-          <w:ilvl w:val="0"/>
-          <w:numId w:val="1013"/>
-        </w:numPr>
-      </w:pPr>
-      <w:r>
-        <w:rPr>
-          <w:b/>
-          <w:bCs/>
-        </w:rPr>
-        <w:t xml:space="preserve">FR-J-21 (M — added v1.7, Vestberry gap)</w:t>
-      </w:r>
-      <w:r>
-        <w:t xml:space="preserve"> </w:t>
-      </w:r>
-      <w:r>
-        <w:t xml:space="preserve">✅</w:t>
-      </w:r>
-      <w:r>
-        <w:t xml:space="preserve"> </w:t>
-      </w:r>
-      <w:r>
-        <w:rPr>
-          <w:b/>
-          <w:bCs/>
-        </w:rPr>
-        <w:t xml:space="preserve">Company tear sheets</w:t>
-      </w:r>
-      <w:r>
-        <w:t xml:space="preserve">: a one-pager document per portfolio company generated in one click from the Portfolio table — investment summary (instrument, invested, ownership, reporting contact),</w:t>
-      </w:r>
-      <w:r>
-        <w:t xml:space="preserve"> </w:t>
-      </w:r>
-      <w:r>
-        <w:rPr>
-          <w:b/>
-          <w:bCs/>
-        </w:rPr>
-        <w:t xml:space="preserve">value &amp; MOIC</w:t>
-      </w:r>
-      <w:r>
-        <w:t xml:space="preserve"> </w:t>
-      </w:r>
-      <w:r>
-        <w:t xml:space="preserve">(cost, fair value, unrealised gain), the</w:t>
-      </w:r>
-      <w:r>
-        <w:t xml:space="preserve"> </w:t>
-      </w:r>
-      <w:r>
-        <w:rPr>
-          <w:b/>
-          <w:bCs/>
-        </w:rPr>
-        <w:t xml:space="preserve">latest valuation</w:t>
-      </w:r>
-      <w:r>
-        <w:t xml:space="preserve"> </w:t>
-      </w:r>
-      <w:r>
-        <w:t xml:space="preserve">(value, methodology, valuer, independence, as-of — or "fund's own mark" when only a mark exists), the</w:t>
-      </w:r>
-      <w:r>
-        <w:t xml:space="preserve"> </w:t>
-      </w:r>
-      <w:r>
-        <w:rPr>
-          <w:b/>
-          <w:bCs/>
-        </w:rPr>
-        <w:t xml:space="preserve">KPI trend</w:t>
-      </w:r>
-      <w:r>
-        <w:t xml:space="preserve"> </w:t>
-      </w:r>
-      <w:r>
-        <w:t xml:space="preserve">(last 4 periods, newest first, with runway) and the company's</w:t>
-      </w:r>
-      <w:r>
-        <w:t xml:space="preserve"> </w:t>
-      </w:r>
-      <w:r>
-        <w:rPr>
-          <w:b/>
-          <w:bCs/>
-        </w:rPr>
-        <w:t xml:space="preserve">active signals</w:t>
-      </w:r>
-      <w:r>
-        <w:t xml:space="preserve"> </w:t>
-      </w:r>
-      <w:r>
-        <w:t xml:space="preserve">from FR-J-20 (or a healthy note) — composed entirely from the monitoring/valuation/signals services, amounts lakh/crore-formatted. Lands in the entity's Documents (PDF-renderable like all documents).</w:t>
-      </w:r>
-      <w:r>
-        <w:t xml:space="preserve"> </w:t>
-      </w:r>
-      <w:r>
-        <w:rPr>
-          <w:rStyle w:val="VerbatimChar"/>
-        </w:rPr>
-        <w:t xml:space="preserve">POST /funds/{id}/portfolio/{iid}/tear-sheet</w:t>
+        <w:t xml:space="preserve">for this portfolio</w:t>
+      </w:r>
+      <w:r>
+        <w:t xml:space="preserve">" without external comps data (which is why external benchmarks stay out of scope). Pure derivation over the monitoring data, no schema.</w:t>
+      </w:r>
+      <w:r>
+        <w:t xml:space="preserve"> </w:t>
+      </w:r>
+      <w:r>
+        <w:rPr>
+          <w:rStyle w:val="VerbatimChar"/>
+        </w:rPr>
+        <w:t xml:space="preserve">GET /funds/{id}/benchmarks</w:t>
       </w:r>
       <w:r>
         <w:t xml:space="preserve">.</w:t>
@@ -6148,7 +5980,7 @@
         <w:t xml:space="preserve"> </w:t>
       </w:r>
       <w:r>
-        <w:t xml:space="preserve">custom sections/branding; batch generation for the whole portfolio.</w:t>
+        <w:t xml:space="preserve">quartiles; cohort filters (by vintage/sector).</w:t>
       </w:r>
     </w:p>
     <w:p>
@@ -6164,7 +5996,7 @@
           <w:b/>
           <w:bCs/>
         </w:rPr>
-        <w:t xml:space="preserve">FR-J-20 (M — added v1.7, Vestberry gap)</w:t>
+        <w:t xml:space="preserve">FR-J-23 (M — added v1.7, Vestberry gap)</w:t>
       </w:r>
       <w:r>
         <w:t xml:space="preserve"> </w:t>
@@ -6180,102 +6012,53 @@
           <w:b/>
           <w:bCs/>
         </w:rPr>
-        <w:t xml:space="preserve">Portfolio signals</w:t>
-      </w:r>
-      <w:r>
-        <w:t xml:space="preserve">: rules-based early warning derived from the KPI history and marks —</w:t>
-      </w:r>
-      <w:r>
-        <w:t xml:space="preserve"> </w:t>
-      </w:r>
-      <w:r>
-        <w:rPr>
-          <w:b/>
-          <w:bCs/>
-        </w:rPr>
-        <w:t xml:space="preserve">revenue decline</w:t>
-      </w:r>
-      <w:r>
-        <w:t xml:space="preserve"> </w:t>
-      </w:r>
-      <w:r>
-        <w:t xml:space="preserve">period-over-period (high severity beyond 20%),</w:t>
-      </w:r>
-      <w:r>
-        <w:t xml:space="preserve"> </w:t>
-      </w:r>
-      <w:r>
-        <w:rPr>
-          <w:b/>
-          <w:bCs/>
-        </w:rPr>
-        <w:t xml:space="preserve">low runway</w:t>
-      </w:r>
-      <w:r>
-        <w:t xml:space="preserve"> </w:t>
-      </w:r>
-      <w:r>
-        <w:t xml:space="preserve">(&lt; 6 months),</w:t>
-      </w:r>
-      <w:r>
-        <w:t xml:space="preserve"> </w:t>
-      </w:r>
-      <w:r>
-        <w:rPr>
-          <w:b/>
-          <w:bCs/>
-        </w:rPr>
-        <w:t xml:space="preserve">mark below cost</w:t>
-      </w:r>
-      <w:r>
-        <w:t xml:space="preserve"> </w:t>
-      </w:r>
-      <w:r>
-        <w:t xml:space="preserve">(impairment %),</w:t>
-      </w:r>
-      <w:r>
-        <w:t xml:space="preserve"> </w:t>
-      </w:r>
-      <w:r>
-        <w:rPr>
-          <w:b/>
-          <w:bCs/>
-        </w:rPr>
-        <w:t xml:space="preserve">reporting gone silent</w:t>
-      </w:r>
-      <w:r>
-        <w:t xml:space="preserve"> </w:t>
-      </w:r>
-      <w:r>
-        <w:t xml:space="preserve">(&gt; 6 months since the last period; "never reported" info) — plus the positive signal,</w:t>
-      </w:r>
-      <w:r>
-        <w:t xml:space="preserve"> </w:t>
-      </w:r>
-      <w:r>
-        <w:rPr>
-          <w:b/>
-          <w:bCs/>
-        </w:rPr>
-        <w:t xml:space="preserve">follow-on candidates</w:t>
-      </w:r>
-      <w:r>
-        <w:t xml:space="preserve"> </w:t>
-      </w:r>
-      <w:r>
-        <w:t xml:space="preserve">(growing revenue with ≥ 12 months runway, feeding the FR-J-12 reserves decision). Severity roll-ups (high / warn / info / positive / all-clear) and per-company signal rows, worst first. Pure derivation, no schema.</w:t>
-      </w:r>
-      <w:r>
-        <w:t xml:space="preserve"> </w:t>
-      </w:r>
-      <w:r>
-        <w:rPr>
-          <w:rStyle w:val="VerbatimChar"/>
-        </w:rPr>
-        <w:t xml:space="preserve">GET /funds/{id}/signals</w:t>
-      </w:r>
-      <w:r>
-        <w:t xml:space="preserve">.</w:t>
+        <w:t xml:space="preserve">Custom KPI definitions + ESG presets</w:t>
+      </w:r>
+      <w:r>
+        <w:t xml:space="preserve">: a fund defines its own metrics (label + unit ₹/number/%; key auto-slugged from the label) collected alongside the core KPIs — with one-click</w:t>
+      </w:r>
+      <w:r>
+        <w:t xml:space="preserve"> </w:t>
+      </w:r>
+      <w:r>
+        <w:rPr>
+          <w:b/>
+          <w:bCs/>
+        </w:rPr>
+        <w:t xml:space="preserve">ESG presets</w:t>
+      </w:r>
+      <w:r>
+        <w:t xml:space="preserve"> </w:t>
+      </w:r>
+      <w:r>
+        <w:t xml:space="preserve">(female headcount %, independent directors %, GHG emissions, energy use, CSR spend — rules-as-data). Values are captured per period on the KPI report (stored as JSON on the period, filtered to defined keys) and flow into monitoring and FR-J-24 benchmarking. Deleting a definition keeps historical values, they just stop being shown.</w:t>
+      </w:r>
+      <w:r>
+        <w:t xml:space="preserve"> </w:t>
+      </w:r>
+      <w:r>
+        <w:rPr>
+          <w:rStyle w:val="VerbatimChar"/>
+        </w:rPr>
+        <w:t xml:space="preserve">GET/POST /funds/{id}/kpi-definitions</w:t>
+      </w:r>
+      <w:r>
+        <w:t xml:space="preserve">,</w:t>
+      </w:r>
+      <w:r>
+        <w:t xml:space="preserve"> </w:t>
+      </w:r>
+      <w:r>
+        <w:rPr>
+          <w:rStyle w:val="VerbatimChar"/>
+        </w:rPr>
+        <w:t xml:space="preserve">DELETE .../{id}</w:t>
+      </w:r>
+      <w:r>
+        <w:t xml:space="preserve"> </w:t>
+      </w:r>
+      <w:r>
+        <w:t xml:space="preserve">(409 duplicate key).</w:t>
       </w:r>
       <w:r>
         <w:t xml:space="preserve"> </w:t>
@@ -6291,7 +6074,7 @@
         <w:t xml:space="preserve"> </w:t>
       </w:r>
       <w:r>
-        <w:t xml:space="preserve">signal thresholds per fund; notification digests.</w:t>
+        <w:t xml:space="preserve">custom metrics on portal KPI requests (investee self-reporting); per-metric trend charts.</w:t>
       </w:r>
     </w:p>
     <w:p>
@@ -6307,7 +6090,7 @@
           <w:b/>
           <w:bCs/>
         </w:rPr>
-        <w:t xml:space="preserve">FR-J-19 (M — added v1.7, Vestberry gap)</w:t>
+        <w:t xml:space="preserve">FR-J-22 (M — added v1.7, Vestberry gap)</w:t>
       </w:r>
       <w:r>
         <w:t xml:space="preserve"> </w:t>
@@ -6323,137 +6106,105 @@
           <w:b/>
           <w:bCs/>
         </w:rPr>
-        <w:t xml:space="preserve">KPI reporting requests (investee self-service)</w:t>
-      </w:r>
-      <w:r>
-        <w:t xml:space="preserve">: the GP asks each portfolio company's</w:t>
-      </w:r>
-      <w:r>
-        <w:t xml:space="preserve"> </w:t>
-      </w:r>
-      <w:r>
-        <w:rPr>
-          <w:b/>
-          <w:bCs/>
-        </w:rPr>
-        <w:t xml:space="preserve">reporting contact</w:t>
-      </w:r>
-      <w:r>
-        <w:t xml:space="preserve"> </w:t>
-      </w:r>
-      <w:r>
-        <w:t xml:space="preserve">(email stored on the investment) for a KPI period; the contact sees the request in</w:t>
-      </w:r>
-      <w:r>
-        <w:t xml:space="preserve"> </w:t>
-      </w:r>
-      <w:r>
-        <w:rPr>
-          <w:b/>
-          <w:bCs/>
-        </w:rPr>
-        <w:t xml:space="preserve">their portal</w:t>
-      </w:r>
-      <w:r>
-        <w:t xml:space="preserve"> </w:t>
-      </w:r>
-      <w:r>
-        <w:t xml:space="preserve">(plus an in-app notification if they have an account) with due date and overdue flag, submits revenue/cash/burn/headcount, and the GP</w:t>
-      </w:r>
-      <w:r>
-        <w:t xml:space="preserve"> </w:t>
-      </w:r>
-      <w:r>
-        <w:rPr>
-          <w:b/>
-          <w:bCs/>
-        </w:rPr>
-        <w:t xml:space="preserve">accepts</w:t>
-      </w:r>
-      <w:r>
-        <w:t xml:space="preserve"> </w:t>
-      </w:r>
-      <w:r>
-        <w:t xml:space="preserve">the submission into</w:t>
-      </w:r>
-      <w:r>
-        <w:t xml:space="preserve"> </w:t>
-      </w:r>
-      <w:r>
-        <w:rPr>
-          <w:rStyle w:val="VerbatimChar"/>
-        </w:rPr>
-        <w:t xml:space="preserve">PortfolioKPI</w:t>
-      </w:r>
-      <w:r>
-        <w:t xml:space="preserve"> </w:t>
-      </w:r>
-      <w:r>
-        <w:t xml:space="preserve">(or</w:t>
-      </w:r>
-      <w:r>
-        <w:t xml:space="preserve"> </w:t>
-      </w:r>
-      <w:r>
-        <w:rPr>
-          <w:b/>
-          <w:bCs/>
-        </w:rPr>
-        <w:t xml:space="preserve">reopens</w:t>
-      </w:r>
-      <w:r>
-        <w:t xml:space="preserve"> </w:t>
-      </w:r>
-      <w:r>
-        <w:t xml:space="preserve">it for resubmission). Request lifecycle pending → submitted → accepted, email-scoped submission, 409 double-submit/accept guards.</w:t>
-      </w:r>
-      <w:r>
-        <w:t xml:space="preserve"> </w:t>
-      </w:r>
-      <w:r>
-        <w:rPr>
-          <w:rStyle w:val="VerbatimChar"/>
-        </w:rPr>
-        <w:t xml:space="preserve">POST /funds/{id}/portfolio/{iid}/kpi-requests</w:t>
-      </w:r>
-      <w:r>
-        <w:t xml:space="preserve">,</w:t>
-      </w:r>
-      <w:r>
-        <w:t xml:space="preserve"> </w:t>
-      </w:r>
-      <w:r>
-        <w:rPr>
-          <w:rStyle w:val="VerbatimChar"/>
-        </w:rPr>
-        <w:t xml:space="preserve">GET /funds/{id}/kpi-requests</w:t>
-      </w:r>
-      <w:r>
-        <w:t xml:space="preserve">,</w:t>
-      </w:r>
-      <w:r>
-        <w:t xml:space="preserve"> </w:t>
-      </w:r>
-      <w:r>
-        <w:rPr>
-          <w:rStyle w:val="VerbatimChar"/>
-        </w:rPr>
-        <w:t xml:space="preserve">POST .../accept|reopen</w:t>
-      </w:r>
-      <w:r>
-        <w:t xml:space="preserve">, portal</w:t>
-      </w:r>
-      <w:r>
-        <w:t xml:space="preserve"> </w:t>
-      </w:r>
-      <w:r>
-        <w:rPr>
-          <w:rStyle w:val="VerbatimChar"/>
-        </w:rPr>
-        <w:t xml:space="preserve">POST /portal/kpi-requests/{id}/submit</w:t>
-      </w:r>
-      <w:r>
-        <w:t xml:space="preserve">.</w:t>
+        <w:t xml:space="preserve">Quarterly LP report pack</w:t>
+      </w:r>
+      <w:r>
+        <w:t xml:space="preserve">: a one-click quarterly report document per fund — fund snapshot (committed / drawn / uncalled / distributed), since-inception</w:t>
+      </w:r>
+      <w:r>
+        <w:t xml:space="preserve"> </w:t>
+      </w:r>
+      <w:r>
+        <w:rPr>
+          <w:b/>
+          <w:bCs/>
+        </w:rPr>
+        <w:t xml:space="preserve">performance</w:t>
+      </w:r>
+      <w:r>
+        <w:t xml:space="preserve"> </w:t>
+      </w:r>
+      <w:r>
+        <w:t xml:space="preserve">(NAV, NAV per unit, DPI / RVPI / TVPI / XIRR),</w:t>
+      </w:r>
+      <w:r>
+        <w:t xml:space="preserve"> </w:t>
+      </w:r>
+      <w:r>
+        <w:rPr>
+          <w:b/>
+          <w:bCs/>
+        </w:rPr>
+        <w:t xml:space="preserve">activity this period</w:t>
+      </w:r>
+      <w:r>
+        <w:t xml:space="preserve"> </w:t>
+      </w:r>
+      <w:r>
+        <w:t xml:space="preserve">(capital calls by due date and distributions by date falling in the reporting window, with amounts and carry), the</w:t>
+      </w:r>
+      <w:r>
+        <w:t xml:space="preserve"> </w:t>
+      </w:r>
+      <w:r>
+        <w:rPr>
+          <w:b/>
+          <w:bCs/>
+        </w:rPr>
+        <w:t xml:space="preserve">Schedule of Investments</w:t>
+      </w:r>
+      <w:r>
+        <w:t xml:space="preserve"> </w:t>
+      </w:r>
+      <w:r>
+        <w:t xml:space="preserve">with totals, and</w:t>
+      </w:r>
+      <w:r>
+        <w:t xml:space="preserve"> </w:t>
+      </w:r>
+      <w:r>
+        <w:rPr>
+          <w:b/>
+          <w:bCs/>
+        </w:rPr>
+        <w:t xml:space="preserve">valuation status</w:t>
+      </w:r>
+      <w:r>
+        <w:t xml:space="preserve"> </w:t>
+      </w:r>
+      <w:r>
+        <w:t xml:space="preserve">vs the FR-J-15 policy — composed entirely from the existing capital-accounts / performance / SOI / valuation services, amounts lakh/crore-formatted, unaudited-figures disclaimer. The report</w:t>
+      </w:r>
+      <w:r>
+        <w:t xml:space="preserve"> </w:t>
+      </w:r>
+      <w:r>
+        <w:rPr>
+          <w:b/>
+          <w:bCs/>
+        </w:rPr>
+        <w:t xml:space="preserve">surfaces automatically in every LP's portal</w:t>
+      </w:r>
+      <w:r>
+        <w:t xml:space="preserve"> </w:t>
+      </w:r>
+      <w:r>
+        <w:t xml:space="preserve">statements list (fund-wide, alongside their personal capital-account statements and Form 64C).</w:t>
+      </w:r>
+      <w:r>
+        <w:t xml:space="preserve"> </w:t>
+      </w:r>
+      <w:r>
+        <w:rPr>
+          <w:rStyle w:val="VerbatimChar"/>
+        </w:rPr>
+        <w:t xml:space="preserve">POST /funds/{id}/lp-report</w:t>
+      </w:r>
+      <w:r>
+        <w:t xml:space="preserve"> </w:t>
+      </w:r>
+      <w:r>
+        <w:t xml:space="preserve">(period label + start/end; 400 on inverted period).</w:t>
       </w:r>
       <w:r>
         <w:t xml:space="preserve"> </w:t>
@@ -6469,7 +6220,468 @@
         <w:t xml:space="preserve"> </w:t>
       </w:r>
       <w:r>
-        <w:t xml:space="preserve">recurring request schedules; custom-metric requests (FR-J-23 planned).</w:t>
+        <w:t xml:space="preserve">per-LP personalised section (their capital account inside the pack); scheduled quarterly runs; PDF branding.</w:t>
+      </w:r>
+    </w:p>
+    <w:p>
+      <w:pPr>
+        <w:pStyle w:val="Compact"/>
+        <w:numPr>
+          <w:ilvl w:val="0"/>
+          <w:numId w:val="1013"/>
+        </w:numPr>
+      </w:pPr>
+      <w:r>
+        <w:rPr>
+          <w:b/>
+          <w:bCs/>
+        </w:rPr>
+        <w:t xml:space="preserve">FR-J-21 (M — added v1.7, Vestberry gap)</w:t>
+      </w:r>
+      <w:r>
+        <w:t xml:space="preserve"> </w:t>
+      </w:r>
+      <w:r>
+        <w:t xml:space="preserve">✅</w:t>
+      </w:r>
+      <w:r>
+        <w:t xml:space="preserve"> </w:t>
+      </w:r>
+      <w:r>
+        <w:rPr>
+          <w:b/>
+          <w:bCs/>
+        </w:rPr>
+        <w:t xml:space="preserve">Company tear sheets</w:t>
+      </w:r>
+      <w:r>
+        <w:t xml:space="preserve">: a one-pager document per portfolio company generated in one click from the Portfolio table — investment summary (instrument, invested, ownership, reporting contact),</w:t>
+      </w:r>
+      <w:r>
+        <w:t xml:space="preserve"> </w:t>
+      </w:r>
+      <w:r>
+        <w:rPr>
+          <w:b/>
+          <w:bCs/>
+        </w:rPr>
+        <w:t xml:space="preserve">value &amp; MOIC</w:t>
+      </w:r>
+      <w:r>
+        <w:t xml:space="preserve"> </w:t>
+      </w:r>
+      <w:r>
+        <w:t xml:space="preserve">(cost, fair value, unrealised gain), the</w:t>
+      </w:r>
+      <w:r>
+        <w:t xml:space="preserve"> </w:t>
+      </w:r>
+      <w:r>
+        <w:rPr>
+          <w:b/>
+          <w:bCs/>
+        </w:rPr>
+        <w:t xml:space="preserve">latest valuation</w:t>
+      </w:r>
+      <w:r>
+        <w:t xml:space="preserve"> </w:t>
+      </w:r>
+      <w:r>
+        <w:t xml:space="preserve">(value, methodology, valuer, independence, as-of — or "fund's own mark" when only a mark exists), the</w:t>
+      </w:r>
+      <w:r>
+        <w:t xml:space="preserve"> </w:t>
+      </w:r>
+      <w:r>
+        <w:rPr>
+          <w:b/>
+          <w:bCs/>
+        </w:rPr>
+        <w:t xml:space="preserve">KPI trend</w:t>
+      </w:r>
+      <w:r>
+        <w:t xml:space="preserve"> </w:t>
+      </w:r>
+      <w:r>
+        <w:t xml:space="preserve">(last 4 periods, newest first, with runway) and the company's</w:t>
+      </w:r>
+      <w:r>
+        <w:t xml:space="preserve"> </w:t>
+      </w:r>
+      <w:r>
+        <w:rPr>
+          <w:b/>
+          <w:bCs/>
+        </w:rPr>
+        <w:t xml:space="preserve">active signals</w:t>
+      </w:r>
+      <w:r>
+        <w:t xml:space="preserve"> </w:t>
+      </w:r>
+      <w:r>
+        <w:t xml:space="preserve">from FR-J-20 (or a healthy note) — composed entirely from the monitoring/valuation/signals services, amounts lakh/crore-formatted. Lands in the entity's Documents (PDF-renderable like all documents).</w:t>
+      </w:r>
+      <w:r>
+        <w:t xml:space="preserve"> </w:t>
+      </w:r>
+      <w:r>
+        <w:rPr>
+          <w:rStyle w:val="VerbatimChar"/>
+        </w:rPr>
+        <w:t xml:space="preserve">POST /funds/{id}/portfolio/{iid}/tear-sheet</w:t>
+      </w:r>
+      <w:r>
+        <w:t xml:space="preserve">.</w:t>
+      </w:r>
+      <w:r>
+        <w:t xml:space="preserve"> </w:t>
+      </w:r>
+      <w:r>
+        <w:rPr>
+          <w:i/>
+          <w:iCs/>
+        </w:rPr>
+        <w:t xml:space="preserve">Remaining:</w:t>
+      </w:r>
+      <w:r>
+        <w:t xml:space="preserve"> </w:t>
+      </w:r>
+      <w:r>
+        <w:t xml:space="preserve">custom sections/branding; batch generation for the whole portfolio.</w:t>
+      </w:r>
+    </w:p>
+    <w:p>
+      <w:pPr>
+        <w:pStyle w:val="Compact"/>
+        <w:numPr>
+          <w:ilvl w:val="0"/>
+          <w:numId w:val="1013"/>
+        </w:numPr>
+      </w:pPr>
+      <w:r>
+        <w:rPr>
+          <w:b/>
+          <w:bCs/>
+        </w:rPr>
+        <w:t xml:space="preserve">FR-J-20 (M — added v1.7, Vestberry gap)</w:t>
+      </w:r>
+      <w:r>
+        <w:t xml:space="preserve"> </w:t>
+      </w:r>
+      <w:r>
+        <w:t xml:space="preserve">✅</w:t>
+      </w:r>
+      <w:r>
+        <w:t xml:space="preserve"> </w:t>
+      </w:r>
+      <w:r>
+        <w:rPr>
+          <w:b/>
+          <w:bCs/>
+        </w:rPr>
+        <w:t xml:space="preserve">Portfolio signals</w:t>
+      </w:r>
+      <w:r>
+        <w:t xml:space="preserve">: rules-based early warning derived from the KPI history and marks —</w:t>
+      </w:r>
+      <w:r>
+        <w:t xml:space="preserve"> </w:t>
+      </w:r>
+      <w:r>
+        <w:rPr>
+          <w:b/>
+          <w:bCs/>
+        </w:rPr>
+        <w:t xml:space="preserve">revenue decline</w:t>
+      </w:r>
+      <w:r>
+        <w:t xml:space="preserve"> </w:t>
+      </w:r>
+      <w:r>
+        <w:t xml:space="preserve">period-over-period (high severity beyond 20%),</w:t>
+      </w:r>
+      <w:r>
+        <w:t xml:space="preserve"> </w:t>
+      </w:r>
+      <w:r>
+        <w:rPr>
+          <w:b/>
+          <w:bCs/>
+        </w:rPr>
+        <w:t xml:space="preserve">low runway</w:t>
+      </w:r>
+      <w:r>
+        <w:t xml:space="preserve"> </w:t>
+      </w:r>
+      <w:r>
+        <w:t xml:space="preserve">(&lt; 6 months),</w:t>
+      </w:r>
+      <w:r>
+        <w:t xml:space="preserve"> </w:t>
+      </w:r>
+      <w:r>
+        <w:rPr>
+          <w:b/>
+          <w:bCs/>
+        </w:rPr>
+        <w:t xml:space="preserve">mark below cost</w:t>
+      </w:r>
+      <w:r>
+        <w:t xml:space="preserve"> </w:t>
+      </w:r>
+      <w:r>
+        <w:t xml:space="preserve">(impairment %),</w:t>
+      </w:r>
+      <w:r>
+        <w:t xml:space="preserve"> </w:t>
+      </w:r>
+      <w:r>
+        <w:rPr>
+          <w:b/>
+          <w:bCs/>
+        </w:rPr>
+        <w:t xml:space="preserve">reporting gone silent</w:t>
+      </w:r>
+      <w:r>
+        <w:t xml:space="preserve"> </w:t>
+      </w:r>
+      <w:r>
+        <w:t xml:space="preserve">(&gt; 6 months since the last period; "never reported" info) — plus the positive signal,</w:t>
+      </w:r>
+      <w:r>
+        <w:t xml:space="preserve"> </w:t>
+      </w:r>
+      <w:r>
+        <w:rPr>
+          <w:b/>
+          <w:bCs/>
+        </w:rPr>
+        <w:t xml:space="preserve">follow-on candidates</w:t>
+      </w:r>
+      <w:r>
+        <w:t xml:space="preserve"> </w:t>
+      </w:r>
+      <w:r>
+        <w:t xml:space="preserve">(growing revenue with ≥ 12 months runway, feeding the FR-J-12 reserves decision). Severity roll-ups (high / warn / info / positive / all-clear) and per-company signal rows, worst first. Pure derivation, no schema.</w:t>
+      </w:r>
+      <w:r>
+        <w:t xml:space="preserve"> </w:t>
+      </w:r>
+      <w:r>
+        <w:rPr>
+          <w:rStyle w:val="VerbatimChar"/>
+        </w:rPr>
+        <w:t xml:space="preserve">GET /funds/{id}/signals</w:t>
+      </w:r>
+      <w:r>
+        <w:t xml:space="preserve">.</w:t>
+      </w:r>
+      <w:r>
+        <w:t xml:space="preserve"> </w:t>
+      </w:r>
+      <w:r>
+        <w:rPr>
+          <w:i/>
+          <w:iCs/>
+        </w:rPr>
+        <w:t xml:space="preserve">Remaining:</w:t>
+      </w:r>
+      <w:r>
+        <w:t xml:space="preserve"> </w:t>
+      </w:r>
+      <w:r>
+        <w:t xml:space="preserve">signal thresholds per fund; notification digests.</w:t>
+      </w:r>
+    </w:p>
+    <w:p>
+      <w:pPr>
+        <w:pStyle w:val="Compact"/>
+        <w:numPr>
+          <w:ilvl w:val="0"/>
+          <w:numId w:val="1013"/>
+        </w:numPr>
+      </w:pPr>
+      <w:r>
+        <w:rPr>
+          <w:b/>
+          <w:bCs/>
+        </w:rPr>
+        <w:t xml:space="preserve">FR-J-19 (M — added v1.7, Vestberry gap)</w:t>
+      </w:r>
+      <w:r>
+        <w:t xml:space="preserve"> </w:t>
+      </w:r>
+      <w:r>
+        <w:t xml:space="preserve">✅</w:t>
+      </w:r>
+      <w:r>
+        <w:t xml:space="preserve"> </w:t>
+      </w:r>
+      <w:r>
+        <w:rPr>
+          <w:b/>
+          <w:bCs/>
+        </w:rPr>
+        <w:t xml:space="preserve">KPI reporting requests (investee self-service)</w:t>
+      </w:r>
+      <w:r>
+        <w:t xml:space="preserve">: the GP asks each portfolio company's</w:t>
+      </w:r>
+      <w:r>
+        <w:t xml:space="preserve"> </w:t>
+      </w:r>
+      <w:r>
+        <w:rPr>
+          <w:b/>
+          <w:bCs/>
+        </w:rPr>
+        <w:t xml:space="preserve">reporting contact</w:t>
+      </w:r>
+      <w:r>
+        <w:t xml:space="preserve"> </w:t>
+      </w:r>
+      <w:r>
+        <w:t xml:space="preserve">(email stored on the investment) for a KPI period; the contact sees the request in</w:t>
+      </w:r>
+      <w:r>
+        <w:t xml:space="preserve"> </w:t>
+      </w:r>
+      <w:r>
+        <w:rPr>
+          <w:b/>
+          <w:bCs/>
+        </w:rPr>
+        <w:t xml:space="preserve">their portal</w:t>
+      </w:r>
+      <w:r>
+        <w:t xml:space="preserve"> </w:t>
+      </w:r>
+      <w:r>
+        <w:t xml:space="preserve">(plus an in-app notification if they have an account) with due date and overdue flag, submits revenue/cash/burn/headcount, and the GP</w:t>
+      </w:r>
+      <w:r>
+        <w:t xml:space="preserve"> </w:t>
+      </w:r>
+      <w:r>
+        <w:rPr>
+          <w:b/>
+          <w:bCs/>
+        </w:rPr>
+        <w:t xml:space="preserve">accepts</w:t>
+      </w:r>
+      <w:r>
+        <w:t xml:space="preserve"> </w:t>
+      </w:r>
+      <w:r>
+        <w:t xml:space="preserve">the submission into</w:t>
+      </w:r>
+      <w:r>
+        <w:t xml:space="preserve"> </w:t>
+      </w:r>
+      <w:r>
+        <w:rPr>
+          <w:rStyle w:val="VerbatimChar"/>
+        </w:rPr>
+        <w:t xml:space="preserve">PortfolioKPI</w:t>
+      </w:r>
+      <w:r>
+        <w:t xml:space="preserve"> </w:t>
+      </w:r>
+      <w:r>
+        <w:t xml:space="preserve">(or</w:t>
+      </w:r>
+      <w:r>
+        <w:t xml:space="preserve"> </w:t>
+      </w:r>
+      <w:r>
+        <w:rPr>
+          <w:b/>
+          <w:bCs/>
+        </w:rPr>
+        <w:t xml:space="preserve">reopens</w:t>
+      </w:r>
+      <w:r>
+        <w:t xml:space="preserve"> </w:t>
+      </w:r>
+      <w:r>
+        <w:t xml:space="preserve">it for resubmission). Request lifecycle pending → submitted → accepted, email-scoped submission, 409 double-submit/accept guards.</w:t>
+      </w:r>
+      <w:r>
+        <w:t xml:space="preserve"> </w:t>
+      </w:r>
+      <w:r>
+        <w:rPr>
+          <w:rStyle w:val="VerbatimChar"/>
+        </w:rPr>
+        <w:t xml:space="preserve">POST /funds/{id}/portfolio/{iid}/kpi-requests</w:t>
+      </w:r>
+      <w:r>
+        <w:t xml:space="preserve">,</w:t>
+      </w:r>
+      <w:r>
+        <w:t xml:space="preserve"> </w:t>
+      </w:r>
+      <w:r>
+        <w:rPr>
+          <w:rStyle w:val="VerbatimChar"/>
+        </w:rPr>
+        <w:t xml:space="preserve">GET /funds/{id}/kpi-requests</w:t>
+      </w:r>
+      <w:r>
+        <w:t xml:space="preserve">,</w:t>
+      </w:r>
+      <w:r>
+        <w:t xml:space="preserve"> </w:t>
+      </w:r>
+      <w:r>
+        <w:rPr>
+          <w:rStyle w:val="VerbatimChar"/>
+        </w:rPr>
+        <w:t xml:space="preserve">POST .../accept|reopen</w:t>
+      </w:r>
+      <w:r>
+        <w:t xml:space="preserve">, portal</w:t>
+      </w:r>
+      <w:r>
+        <w:t xml:space="preserve"> </w:t>
+      </w:r>
+      <w:r>
+        <w:rPr>
+          <w:rStyle w:val="VerbatimChar"/>
+        </w:rPr>
+        <w:t xml:space="preserve">POST /portal/kpi-requests/{id}/submit</w:t>
+      </w:r>
+      <w:r>
+        <w:t xml:space="preserve">.</w:t>
+      </w:r>
+      <w:r>
+        <w:t xml:space="preserve"> </w:t>
+      </w:r>
+      <w:r>
+        <w:rPr>
+          <w:i/>
+          <w:iCs/>
+        </w:rPr>
+        <w:t xml:space="preserve">Remaining:</w:t>
+      </w:r>
+      <w:r>
+        <w:t xml:space="preserve"> </w:t>
+      </w:r>
+      <w:r>
+        <w:t xml:space="preserve">recurring request schedules; custom-metric requests (see FR-J-23</w:t>
+      </w:r>
+      <w:r>
+        <w:t xml:space="preserve"> </w:t>
+      </w:r>
+      <w:r>
+        <w:rPr>
+          <w:i/>
+          <w:iCs/>
+        </w:rPr>
+        <w:t xml:space="preserve">Remaining</w:t>
+      </w:r>
+      <w:r>
+        <w:t xml:space="preserve">).</w:t>
       </w:r>
     </w:p>
     <w:p>
@@ -13868,6 +14080,64 @@
             </w:pPr>
             <w:r>
               <w:t xml:space="preserve">investee self-reporting; PortfolioInvestment gains contact_email</w:t>
+            </w:r>
+          </w:p>
+        </w:tc>
+      </w:tr>
+      <w:tr>
+        <w:tc>
+          <w:tcPr/>
+          <w:p>
+            <w:pPr>
+              <w:pStyle w:val="Compact"/>
+            </w:pPr>
+            <w:r>
+              <w:rPr>
+                <w:b/>
+                <w:bCs/>
+              </w:rPr>
+              <w:t xml:space="preserve">KPIDefinition</w:t>
+            </w:r>
+            <w:r>
+              <w:t xml:space="preserve"> </w:t>
+            </w:r>
+            <w:r>
+              <w:rPr>
+                <w:i/>
+                <w:iCs/>
+              </w:rPr>
+              <w:t xml:space="preserve">(v1.7)</w:t>
+            </w:r>
+          </w:p>
+        </w:tc>
+        <w:tc>
+          <w:tcPr/>
+          <w:p>
+            <w:pPr>
+              <w:pStyle w:val="Compact"/>
+            </w:pPr>
+            <w:r>
+              <w:t xml:space="preserve">fund_id, key (unique per fund), label, unit (inr/number/pct)</w:t>
+            </w:r>
+          </w:p>
+        </w:tc>
+        <w:tc>
+          <w:tcPr/>
+          <w:p>
+            <w:pPr>
+              <w:pStyle w:val="Compact"/>
+            </w:pPr>
+            <w:r>
+              <w:t xml:space="preserve">fund-defined custom metrics incl. ESG presets; values stored as JSON (</w:t>
+            </w:r>
+            <w:r>
+              <w:rPr>
+                <w:rStyle w:val="VerbatimChar"/>
+              </w:rPr>
+              <w:t xml:space="preserve">custom</w:t>
+            </w:r>
+            <w:r>
+              <w:t xml:space="preserve">) on PortfolioKPI</w:t>
             </w:r>
           </w:p>
         </w:tc>
@@ -16635,6 +16905,224 @@
       </w:r>
       <w:r>
         <w:t xml:space="preserve">— portfolio intelligence (Vestberry competitive gap analysis, fund side):</w:t>
+      </w:r>
+    </w:p>
+    <w:p>
+      <w:pPr>
+        <w:pStyle w:val="Compact"/>
+        <w:numPr>
+          <w:ilvl w:val="0"/>
+          <w:numId w:val="1030"/>
+        </w:numPr>
+      </w:pPr>
+      <w:r>
+        <w:rPr>
+          <w:b/>
+          <w:bCs/>
+        </w:rPr>
+        <w:t xml:space="preserve">FR-J-23 Custom KPI definitions + ESG presets</w:t>
+      </w:r>
+      <w:r>
+        <w:t xml:space="preserve"> </w:t>
+      </w:r>
+      <w:r>
+        <w:t xml:space="preserve">✅ — new</w:t>
+      </w:r>
+      <w:r>
+        <w:t xml:space="preserve"> </w:t>
+      </w:r>
+      <w:r>
+        <w:rPr>
+          <w:rStyle w:val="VerbatimChar"/>
+        </w:rPr>
+        <w:t xml:space="preserve">KPIDefinition</w:t>
+      </w:r>
+      <w:r>
+        <w:t xml:space="preserve"> </w:t>
+      </w:r>
+      <w:r>
+        <w:t xml:space="preserve">+</w:t>
+      </w:r>
+      <w:r>
+        <w:t xml:space="preserve"> </w:t>
+      </w:r>
+      <w:r>
+        <w:rPr>
+          <w:rStyle w:val="VerbatimChar"/>
+        </w:rPr>
+        <w:t xml:space="preserve">portfolio_kpis.custom</w:t>
+      </w:r>
+      <w:r>
+        <w:t xml:space="preserve"> </w:t>
+      </w:r>
+      <w:r>
+        <w:t xml:space="preserve">JSON (Alembic</w:t>
+      </w:r>
+      <w:r>
+        <w:t xml:space="preserve"> </w:t>
+      </w:r>
+      <w:r>
+        <w:rPr>
+          <w:rStyle w:val="VerbatimChar"/>
+        </w:rPr>
+        <w:t xml:space="preserve">b8c9d0e1f2a3</w:t>
+      </w:r>
+      <w:r>
+        <w:t xml:space="preserve">).</w:t>
+      </w:r>
+      <w:r>
+        <w:t xml:space="preserve"> </w:t>
+      </w:r>
+      <w:r>
+        <w:rPr>
+          <w:rStyle w:val="VerbatimChar"/>
+        </w:rPr>
+        <w:t xml:space="preserve">services/fund.py</w:t>
+      </w:r>
+      <w:r>
+        <w:t xml:space="preserve">: ESG_KPI_PRESETS rules-as-data, create (slug key from label, presets pass their key; 409 dup) / list / delete;</w:t>
+      </w:r>
+      <w:r>
+        <w:t xml:space="preserve"> </w:t>
+      </w:r>
+      <w:r>
+        <w:rPr>
+          <w:rStyle w:val="VerbatimChar"/>
+        </w:rPr>
+        <w:t xml:space="preserve">add_kpi</w:t>
+      </w:r>
+      <w:r>
+        <w:t xml:space="preserve"> </w:t>
+      </w:r>
+      <w:r>
+        <w:t xml:space="preserve">filters custom values to defined keys;</w:t>
+      </w:r>
+      <w:r>
+        <w:t xml:space="preserve"> </w:t>
+      </w:r>
+      <w:r>
+        <w:rPr>
+          <w:rStyle w:val="VerbatimChar"/>
+        </w:rPr>
+        <w:t xml:space="preserve">_kpi_view</w:t>
+      </w:r>
+      <w:r>
+        <w:t xml:space="preserve"> </w:t>
+      </w:r>
+      <w:r>
+        <w:t xml:space="preserve">exposes</w:t>
+      </w:r>
+      <w:r>
+        <w:t xml:space="preserve"> </w:t>
+      </w:r>
+      <w:r>
+        <w:rPr>
+          <w:rStyle w:val="VerbatimChar"/>
+        </w:rPr>
+        <w:t xml:space="preserve">custom</w:t>
+      </w:r>
+      <w:r>
+        <w:t xml:space="preserve">. Frontend: "Custom metrics" panel in</w:t>
+      </w:r>
+      <w:r>
+        <w:t xml:space="preserve"> </w:t>
+      </w:r>
+      <w:r>
+        <w:rPr>
+          <w:rStyle w:val="VerbatimChar"/>
+        </w:rPr>
+        <w:t xml:space="preserve">PortfolioMonitoring.tsx</w:t>
+      </w:r>
+      <w:r>
+        <w:t xml:space="preserve"> </w:t>
+      </w:r>
+      <w:r>
+        <w:t xml:space="preserve">(definition chips w/ remove, add form, one-click ESG preset buttons) and per-definition inputs on the Report KPIs form. 3 tests (</w:t>
+      </w:r>
+      <w:r>
+        <w:rPr>
+          <w:rStyle w:val="VerbatimChar"/>
+        </w:rPr>
+        <w:t xml:space="preserve">test_custom_kpis.py</w:t>
+      </w:r>
+      <w:r>
+        <w:t xml:space="preserve">, incl. FR-J-24).</w:t>
+      </w:r>
+    </w:p>
+    <w:p>
+      <w:pPr>
+        <w:pStyle w:val="Compact"/>
+        <w:numPr>
+          <w:ilvl w:val="0"/>
+          <w:numId w:val="1030"/>
+        </w:numPr>
+      </w:pPr>
+      <w:r>
+        <w:rPr>
+          <w:b/>
+          <w:bCs/>
+        </w:rPr>
+        <w:t xml:space="preserve">FR-J-24 Internal benchmarking</w:t>
+      </w:r>
+      <w:r>
+        <w:t xml:space="preserve"> </w:t>
+      </w:r>
+      <w:r>
+        <w:t xml:space="preserve">✅ —</w:t>
+      </w:r>
+      <w:r>
+        <w:t xml:space="preserve"> </w:t>
+      </w:r>
+      <w:r>
+        <w:rPr>
+          <w:rStyle w:val="VerbatimChar"/>
+        </w:rPr>
+        <w:t xml:space="preserve">services/fund.py::portfolio_benchmarks</w:t>
+      </w:r>
+      <w:r>
+        <w:t xml:space="preserve"> </w:t>
+      </w:r>
+      <w:r>
+        <w:t xml:space="preserve">(companies × core+custom metrics from each latest period,</w:t>
+      </w:r>
+      <w:r>
+        <w:t xml:space="preserve"> </w:t>
+      </w:r>
+      <w:r>
+        <w:rPr>
+          <w:rStyle w:val="VerbatimChar"/>
+        </w:rPr>
+        <w:t xml:space="preserve">statistics.median</w:t>
+      </w:r>
+      <w:r>
+        <w:t xml:space="preserve"> </w:t>
+      </w:r>
+      <w:r>
+        <w:t xml:space="preserve">per metric);</w:t>
+      </w:r>
+      <w:r>
+        <w:t xml:space="preserve"> </w:t>
+      </w:r>
+      <w:r>
+        <w:rPr>
+          <w:rStyle w:val="VerbatimChar"/>
+        </w:rPr>
+        <w:t xml:space="preserve">GET /funds/{id}/benchmarks</w:t>
+      </w:r>
+      <w:r>
+        <w:t xml:space="preserve">; benchmark table with ▲/▼-vs-median markers and a median footer row in</w:t>
+      </w:r>
+      <w:r>
+        <w:t xml:space="preserve"> </w:t>
+      </w:r>
+      <w:r>
+        <w:rPr>
+          <w:rStyle w:val="VerbatimChar"/>
+        </w:rPr>
+        <w:t xml:space="preserve">PortfolioMonitoring.tsx</w:t>
+      </w:r>
+      <w:r>
+        <w:t xml:space="preserve">. Pure derivation.</w:t>
       </w:r>
     </w:p>
     <w:p>

</xml_diff>

<commit_message>
Frontend: Vestberry visual batch — fund stat grid + sparklines, risk chips, tinted signals, revenue overlay, benchmark strips, waterfall columns
New components: Sparkline (also on Stat via spark prop), ColumnChart.
Fund header rebuilt as a 10-tile stat grid; monitoring table gains
avatars, 0-10 risk-score chips and stale-reporting tints; signals rows
severity-tinted; all-companies revenue overlay; benchmark min-median-max
range strips; per-distribution waterfall stacked columns. REQUIREMENTS
v1.7 + docx.

Co-Authored-By: Claude Opus 4.8 <noreply@anthropic.com>
</commit_message>
<xml_diff>
--- a/REQUIREMENTS.docx
+++ b/REQUIREMENTS.docx
@@ -16905,6 +16905,252 @@
       </w:r>
       <w:r>
         <w:t xml:space="preserve">— portfolio intelligence (Vestberry competitive gap analysis, fund side):</w:t>
+      </w:r>
+    </w:p>
+    <w:p>
+      <w:pPr>
+        <w:pStyle w:val="Compact"/>
+        <w:numPr>
+          <w:ilvl w:val="0"/>
+          <w:numId w:val="1030"/>
+        </w:numPr>
+      </w:pPr>
+      <w:r>
+        <w:rPr>
+          <w:b/>
+          <w:bCs/>
+        </w:rPr>
+        <w:t xml:space="preserve">Vestberry visual batch (fund side)</w:t>
+      </w:r>
+      <w:r>
+        <w:t xml:space="preserve"> </w:t>
+      </w:r>
+      <w:r>
+        <w:t xml:space="preserve">✅ — from a visual analysis of vestberry.com product screenshots: (1) the fund summary header rebuilt as a</w:t>
+      </w:r>
+      <w:r>
+        <w:t xml:space="preserve"> </w:t>
+      </w:r>
+      <w:r>
+        <w:rPr>
+          <w:b/>
+          <w:bCs/>
+        </w:rPr>
+        <w:t xml:space="preserve">stat-tile grid with sparklines</w:t>
+      </w:r>
+      <w:r>
+        <w:t xml:space="preserve"> </w:t>
+      </w:r>
+      <w:r>
+        <w:t xml:space="preserve">(Committed / Drawn / Uncalled / Distributed / NAV / TVPI / DPI / RVPI / XIRR / NAV-per-unit; trends fed by a new pure-derivation</w:t>
+      </w:r>
+      <w:r>
+        <w:t xml:space="preserve"> </w:t>
+      </w:r>
+      <w:r>
+        <w:rPr>
+          <w:rStyle w:val="VerbatimChar"/>
+        </w:rPr>
+        <w:t xml:space="preserve">GET /funds/{id}/performance-series</w:t>
+      </w:r>
+      <w:r>
+        <w:t xml:space="preserve"> </w:t>
+      </w:r>
+      <w:r>
+        <w:t xml:space="preserve">— NAV/DPI/RVPI/TVPI at each ledger-event date, positions valued at the latest mark or valuation dated on or before each point; 2 tests</w:t>
+      </w:r>
+      <w:r>
+        <w:t xml:space="preserve"> </w:t>
+      </w:r>
+      <w:r>
+        <w:rPr>
+          <w:rStyle w:val="VerbatimChar"/>
+        </w:rPr>
+        <w:t xml:space="preserve">test_performance_series.py</w:t>
+      </w:r>
+      <w:r>
+        <w:t xml:space="preserve">); (2) monitoring table gains a</w:t>
+      </w:r>
+      <w:r>
+        <w:t xml:space="preserve"> </w:t>
+      </w:r>
+      <w:r>
+        <w:rPr>
+          <w:b/>
+          <w:bCs/>
+        </w:rPr>
+        <w:t xml:space="preserve">0–10 risk-score chip</w:t>
+      </w:r>
+      <w:r>
+        <w:t xml:space="preserve"> </w:t>
+      </w:r>
+      <w:r>
+        <w:t xml:space="preserve">(severity-weighted from FR-J-20 signals), company</w:t>
+      </w:r>
+      <w:r>
+        <w:t xml:space="preserve"> </w:t>
+      </w:r>
+      <w:r>
+        <w:rPr>
+          <w:b/>
+          <w:bCs/>
+        </w:rPr>
+        <w:t xml:space="preserve">avatar chips</w:t>
+      </w:r>
+      <w:r>
+        <w:t xml:space="preserve"> </w:t>
+      </w:r>
+      <w:r>
+        <w:t xml:space="preserve">and a</w:t>
+      </w:r>
+      <w:r>
+        <w:t xml:space="preserve"> </w:t>
+      </w:r>
+      <w:r>
+        <w:rPr>
+          <w:b/>
+          <w:bCs/>
+        </w:rPr>
+        <w:t xml:space="preserve">stale-reporting tint</w:t>
+      </w:r>
+      <w:r>
+        <w:t xml:space="preserve"> </w:t>
+      </w:r>
+      <w:r>
+        <w:t xml:space="preserve">on the latest period (&gt; 6 months); (3) signals table rows carry full-row</w:t>
+      </w:r>
+      <w:r>
+        <w:t xml:space="preserve"> </w:t>
+      </w:r>
+      <w:r>
+        <w:rPr>
+          <w:b/>
+          <w:bCs/>
+        </w:rPr>
+        <w:t xml:space="preserve">severity tints</w:t>
+      </w:r>
+      <w:r>
+        <w:t xml:space="preserve"> </w:t>
+      </w:r>
+      <w:r>
+        <w:t xml:space="preserve">(attention-list style); (4)</w:t>
+      </w:r>
+      <w:r>
+        <w:t xml:space="preserve"> </w:t>
+      </w:r>
+      <w:r>
+        <w:rPr>
+          <w:b/>
+          <w:bCs/>
+        </w:rPr>
+        <w:t xml:space="preserve">portfolio revenue overlay</w:t>
+      </w:r>
+      <w:r>
+        <w:t xml:space="preserve"> </w:t>
+      </w:r>
+      <w:r>
+        <w:t xml:space="preserve">— all companies on one multi-series line chart; (5) benchmark</w:t>
+      </w:r>
+      <w:r>
+        <w:t xml:space="preserve"> </w:t>
+      </w:r>
+      <w:r>
+        <w:rPr>
+          <w:b/>
+          <w:bCs/>
+        </w:rPr>
+        <w:t xml:space="preserve">range strips</w:t>
+      </w:r>
+      <w:r>
+        <w:t xml:space="preserve"> </w:t>
+      </w:r>
+      <w:r>
+        <w:t xml:space="preserve">— min–median–max per metric with a marker per company; (6) new</w:t>
+      </w:r>
+      <w:r>
+        <w:t xml:space="preserve"> </w:t>
+      </w:r>
+      <w:r>
+        <w:rPr>
+          <w:rStyle w:val="VerbatimChar"/>
+        </w:rPr>
+        <w:t xml:space="preserve">ColumnChart</w:t>
+      </w:r>
+      <w:r>
+        <w:t xml:space="preserve"> </w:t>
+      </w:r>
+      <w:r>
+        <w:t xml:space="preserve">component —</w:t>
+      </w:r>
+      <w:r>
+        <w:t xml:space="preserve"> </w:t>
+      </w:r>
+      <w:r>
+        <w:rPr>
+          <w:b/>
+          <w:bCs/>
+        </w:rPr>
+        <w:t xml:space="preserve">stacked waterfall columns</w:t>
+      </w:r>
+      <w:r>
+        <w:t xml:space="preserve"> </w:t>
+      </w:r>
+      <w:r>
+        <w:t xml:space="preserve">per distribution (RoC / pref / LP profit / GP carry). New components:</w:t>
+      </w:r>
+      <w:r>
+        <w:t xml:space="preserve"> </w:t>
+      </w:r>
+      <w:r>
+        <w:rPr>
+          <w:rStyle w:val="VerbatimChar"/>
+        </w:rPr>
+        <w:t xml:space="preserve">Sparkline</w:t>
+      </w:r>
+      <w:r>
+        <w:t xml:space="preserve"> </w:t>
+      </w:r>
+      <w:r>
+        <w:t xml:space="preserve">(also available on</w:t>
+      </w:r>
+      <w:r>
+        <w:t xml:space="preserve"> </w:t>
+      </w:r>
+      <w:r>
+        <w:rPr>
+          <w:rStyle w:val="VerbatimChar"/>
+        </w:rPr>
+        <w:t xml:space="preserve">Stat</w:t>
+      </w:r>
+      <w:r>
+        <w:t xml:space="preserve"> </w:t>
+      </w:r>
+      <w:r>
+        <w:t xml:space="preserve">via</w:t>
+      </w:r>
+      <w:r>
+        <w:t xml:space="preserve"> </w:t>
+      </w:r>
+      <w:r>
+        <w:rPr>
+          <w:rStyle w:val="VerbatimChar"/>
+        </w:rPr>
+        <w:t xml:space="preserve">spark</w:t>
+      </w:r>
+      <w:r>
+        <w:t xml:space="preserve">),</w:t>
+      </w:r>
+      <w:r>
+        <w:t xml:space="preserve"> </w:t>
+      </w:r>
+      <w:r>
+        <w:rPr>
+          <w:rStyle w:val="VerbatimChar"/>
+        </w:rPr>
+        <w:t xml:space="preserve">ColumnChart</w:t>
+      </w:r>
+      <w:r>
+        <w:t xml:space="preserve">. Skipped by design: left-rail nav, AI assistant (env-blocked), FX registry (INR-native), report-customisation dropdowns.</w:t>
       </w:r>
     </w:p>
     <w:p>

</xml_diff>

<commit_message>
Backend: deal-CRM intelligence — strength, follow-ups, sources (4Degrees gaps)
FR-J-17 extended: relationship strength (0-100 from touch frequency +
recency) per deal and per contact via activity->contact attribution
(deal_activities.contact_id); deal follow-up reminders
(fund_deals.next_followup_on, PUT /deals/{id}/followup, overdue ->
Tasks hub); deal source (fund_deals.source). Alembic c9d0e1f2a3b4.
3 tests. REQUIREMENTS v1.7 + docx.

Co-Authored-By: Claude Opus 4.8 <noreply@anthropic.com>
</commit_message>
<xml_diff>
--- a/REQUIREMENTS.docx
+++ b/REQUIREMENTS.docx
@@ -6849,7 +6849,7 @@
           <w:b/>
           <w:bCs/>
         </w:rPr>
-        <w:t xml:space="preserve">FR-J-17 (M — added v1.6, Carta fund gap)</w:t>
+        <w:t xml:space="preserve">FR-J-17 (M — added v1.6, Carta fund gap; extended v1.7, 4Degrees gaps)</w:t>
       </w:r>
       <w:r>
         <w:t xml:space="preserve"> </w:t>
@@ -6900,7 +6900,109 @@
         <w:t xml:space="preserve"> </w:t>
       </w:r>
       <w:r>
-        <w:t xml:space="preserve">(note / meeting / call / email, newest-first, append-only). Expandable per-deal panel in the pipeline.</w:t>
+        <w:t xml:space="preserve">(note / meeting / call / email, newest-first, append-only, kind icons), with activities optionally</w:t>
+      </w:r>
+      <w:r>
+        <w:t xml:space="preserve"> </w:t>
+      </w:r>
+      <w:r>
+        <w:rPr>
+          <w:b/>
+          <w:bCs/>
+        </w:rPr>
+        <w:t xml:space="preserve">attributed to a contact</w:t>
+      </w:r>
+      <w:r>
+        <w:t xml:space="preserve">. Derived</w:t>
+      </w:r>
+      <w:r>
+        <w:t xml:space="preserve"> </w:t>
+      </w:r>
+      <w:r>
+        <w:rPr>
+          <w:b/>
+          <w:bCs/>
+        </w:rPr>
+        <w:t xml:space="preserve">relationship strength</w:t>
+      </w:r>
+      <w:r>
+        <w:t xml:space="preserve"> </w:t>
+      </w:r>
+      <w:r>
+        <w:t xml:space="preserve">(0–100, rules-based: touch frequency + recency over 6 months) per deal and per contact, shown as mini pies.</w:t>
+      </w:r>
+      <w:r>
+        <w:t xml:space="preserve"> </w:t>
+      </w:r>
+      <w:r>
+        <w:rPr>
+          <w:b/>
+          <w:bCs/>
+        </w:rPr>
+        <w:t xml:space="preserve">Deal source</w:t>
+      </w:r>
+      <w:r>
+        <w:t xml:space="preserve"> </w:t>
+      </w:r>
+      <w:r>
+        <w:t xml:space="preserve">(who referred it) feeds a top-deal-sources chart;</w:t>
+      </w:r>
+      <w:r>
+        <w:t xml:space="preserve"> </w:t>
+      </w:r>
+      <w:r>
+        <w:rPr>
+          <w:b/>
+          <w:bCs/>
+        </w:rPr>
+        <w:t xml:space="preserve">follow-up reminders</w:t>
+      </w:r>
+      <w:r>
+        <w:t xml:space="preserve"> </w:t>
+      </w:r>
+      <w:r>
+        <w:t xml:space="preserve">(</w:t>
+      </w:r>
+      <w:r>
+        <w:rPr>
+          <w:rStyle w:val="VerbatimChar"/>
+        </w:rPr>
+        <w:t xml:space="preserve">next_followup_on</w:t>
+      </w:r>
+      <w:r>
+        <w:t xml:space="preserve">) flag overdue deals in the pipeline and surface red in the entity Tasks hub. The pipeline renders as a</w:t>
+      </w:r>
+      <w:r>
+        <w:t xml:space="preserve"> </w:t>
+      </w:r>
+      <w:r>
+        <w:rPr>
+          <w:b/>
+          <w:bCs/>
+        </w:rPr>
+        <w:t xml:space="preserve">kanban board</w:t>
+      </w:r>
+      <w:r>
+        <w:t xml:space="preserve"> </w:t>
+      </w:r>
+      <w:r>
+        <w:t xml:space="preserve">(stage columns, cards with sector chip, cheque, contact avatars; Board/Table toggle) with a</w:t>
+      </w:r>
+      <w:r>
+        <w:t xml:space="preserve"> </w:t>
+      </w:r>
+      <w:r>
+        <w:rPr>
+          <w:b/>
+          <w:bCs/>
+        </w:rPr>
+        <w:t xml:space="preserve">pipeline analytics</w:t>
+      </w:r>
+      <w:r>
+        <w:t xml:space="preserve"> </w:t>
+      </w:r>
+      <w:r>
+        <w:t xml:space="preserve">snapshot (deals-by-stage columns w/ counts + value, sector donut, top active deals, top sources).</w:t>
       </w:r>
       <w:r>
         <w:t xml:space="preserve"> </w:t>
@@ -6921,7 +7023,7 @@
         <w:rPr>
           <w:rStyle w:val="VerbatimChar"/>
         </w:rPr>
-        <w:t xml:space="preserve">POST /deals/{id}/contacts</w:t>
+        <w:t xml:space="preserve">POST /deals/{id}/contacts|activities</w:t>
       </w:r>
       <w:r>
         <w:t xml:space="preserve">,</w:t>
@@ -6933,7 +7035,7 @@
         <w:rPr>
           <w:rStyle w:val="VerbatimChar"/>
         </w:rPr>
-        <w:t xml:space="preserve">POST /deals/{id}/activities</w:t>
+        <w:t xml:space="preserve">PUT /deals/{id}/followup</w:t>
       </w:r>
       <w:r>
         <w:t xml:space="preserve">.</w:t>
@@ -6946,13 +7048,13 @@
           <w:i/>
           <w:iCs/>
         </w:rPr>
-        <w:t xml:space="preserve">Remaining:</w:t>
-      </w:r>
-      <w:r>
-        <w:t xml:space="preserve"> </w:t>
-      </w:r>
-      <w:r>
-        <w:t xml:space="preserve">email/calendar sync; relationship-path mapping.</w:t>
+        <w:t xml:space="preserve">Remaining (integration-blocked, by design):</w:t>
+      </w:r>
+      <w:r>
+        <w:t xml:space="preserve"> </w:t>
+      </w:r>
+      <w:r>
+        <w:t xml:space="preserve">email/calendar sync, LinkedIn capture, data enrichment; relationship-path mapping across deals.</w:t>
       </w:r>
     </w:p>
     <w:p>
@@ -16905,6 +17007,190 @@
       </w:r>
       <w:r>
         <w:t xml:space="preserve">— portfolio intelligence (Vestberry competitive gap analysis, fund side):</w:t>
+      </w:r>
+    </w:p>
+    <w:p>
+      <w:pPr>
+        <w:pStyle w:val="Compact"/>
+        <w:numPr>
+          <w:ilvl w:val="0"/>
+          <w:numId w:val="1030"/>
+        </w:numPr>
+      </w:pPr>
+      <w:r>
+        <w:rPr>
+          <w:b/>
+          <w:bCs/>
+        </w:rPr>
+        <w:t xml:space="preserve">4Degrees batch (deal-CRM intelligence, FR-J-17 extended)</w:t>
+      </w:r>
+      <w:r>
+        <w:t xml:space="preserve"> </w:t>
+      </w:r>
+      <w:r>
+        <w:t xml:space="preserve">✅ — from a visual analysis of 4degrees.ai (relationship-intelligence CRM):</w:t>
+      </w:r>
+      <w:r>
+        <w:t xml:space="preserve"> </w:t>
+      </w:r>
+      <w:r>
+        <w:rPr>
+          <w:b/>
+          <w:bCs/>
+        </w:rPr>
+        <w:t xml:space="preserve">kanban deal board</w:t>
+      </w:r>
+      <w:r>
+        <w:t xml:space="preserve"> </w:t>
+      </w:r>
+      <w:r>
+        <w:t xml:space="preserve">(stage columns, cards w/ sector chip, cheque, contact avatars; Board/Table toggle) +</w:t>
+      </w:r>
+      <w:r>
+        <w:t xml:space="preserve"> </w:t>
+      </w:r>
+      <w:r>
+        <w:rPr>
+          <w:b/>
+          <w:bCs/>
+        </w:rPr>
+        <w:t xml:space="preserve">pipeline analytics</w:t>
+      </w:r>
+      <w:r>
+        <w:t xml:space="preserve"> </w:t>
+      </w:r>
+      <w:r>
+        <w:t xml:space="preserve">(deals-by-stage</w:t>
+      </w:r>
+      <w:r>
+        <w:t xml:space="preserve"> </w:t>
+      </w:r>
+      <w:r>
+        <w:rPr>
+          <w:rStyle w:val="VerbatimChar"/>
+        </w:rPr>
+        <w:t xml:space="preserve">ColumnChart</w:t>
+      </w:r>
+      <w:r>
+        <w:t xml:space="preserve">, sector donut, top active deals, top deal sources — client-side over the deals list);</w:t>
+      </w:r>
+      <w:r>
+        <w:t xml:space="preserve"> </w:t>
+      </w:r>
+      <w:r>
+        <w:rPr>
+          <w:b/>
+          <w:bCs/>
+        </w:rPr>
+        <w:t xml:space="preserve">relationship strength</w:t>
+      </w:r>
+      <w:r>
+        <w:t xml:space="preserve"> </w:t>
+      </w:r>
+      <w:r>
+        <w:t xml:space="preserve">0–100 (route-level derivation: 15/touch to 60 + recency 40 fading over 183 days) per deal and per contact w/ conic-gradient mini pies;</w:t>
+      </w:r>
+      <w:r>
+        <w:t xml:space="preserve"> </w:t>
+      </w:r>
+      <w:r>
+        <w:rPr>
+          <w:b/>
+          <w:bCs/>
+        </w:rPr>
+        <w:t xml:space="preserve">activity→contact attribution</w:t>
+      </w:r>
+      <w:r>
+        <w:t xml:space="preserve"> </w:t>
+      </w:r>
+      <w:r>
+        <w:t xml:space="preserve">(</w:t>
+      </w:r>
+      <w:r>
+        <w:rPr>
+          <w:rStyle w:val="VerbatimChar"/>
+        </w:rPr>
+        <w:t xml:space="preserve">deal_activities.contact_id</w:t>
+      </w:r>
+      <w:r>
+        <w:t xml:space="preserve">, validated per deal) and kind icons;</w:t>
+      </w:r>
+      <w:r>
+        <w:t xml:space="preserve"> </w:t>
+      </w:r>
+      <w:r>
+        <w:rPr>
+          <w:b/>
+          <w:bCs/>
+        </w:rPr>
+        <w:t xml:space="preserve">deal source</w:t>
+      </w:r>
+      <w:r>
+        <w:t xml:space="preserve"> </w:t>
+      </w:r>
+      <w:r>
+        <w:t xml:space="preserve">+</w:t>
+      </w:r>
+      <w:r>
+        <w:t xml:space="preserve"> </w:t>
+      </w:r>
+      <w:r>
+        <w:rPr>
+          <w:b/>
+          <w:bCs/>
+        </w:rPr>
+        <w:t xml:space="preserve">follow-up reminders</w:t>
+      </w:r>
+      <w:r>
+        <w:t xml:space="preserve"> </w:t>
+      </w:r>
+      <w:r>
+        <w:t xml:space="preserve">(</w:t>
+      </w:r>
+      <w:r>
+        <w:rPr>
+          <w:rStyle w:val="VerbatimChar"/>
+        </w:rPr>
+        <w:t xml:space="preserve">fund_deals.source</w:t>
+      </w:r>
+      <w:r>
+        <w:t xml:space="preserve">,</w:t>
+      </w:r>
+      <w:r>
+        <w:t xml:space="preserve"> </w:t>
+      </w:r>
+      <w:r>
+        <w:rPr>
+          <w:rStyle w:val="VerbatimChar"/>
+        </w:rPr>
+        <w:t xml:space="preserve">fund_deals.next_followup_on</w:t>
+      </w:r>
+      <w:r>
+        <w:t xml:space="preserve"> </w:t>
+      </w:r>
+      <w:r>
+        <w:t xml:space="preserve">— Alembic</w:t>
+      </w:r>
+      <w:r>
+        <w:t xml:space="preserve"> </w:t>
+      </w:r>
+      <w:r>
+        <w:rPr>
+          <w:rStyle w:val="VerbatimChar"/>
+        </w:rPr>
+        <w:t xml:space="preserve">c9d0e1f2a3b4</w:t>
+      </w:r>
+      <w:r>
+        <w:t xml:space="preserve">; overdue → 🔔 in pipeline + red Tasks-hub entry). 3 tests (</w:t>
+      </w:r>
+      <w:r>
+        <w:rPr>
+          <w:rStyle w:val="VerbatimChar"/>
+        </w:rPr>
+        <w:t xml:space="preserve">test_deal_intelligence.py</w:t>
+      </w:r>
+      <w:r>
+        <w:t xml:space="preserve">). Skipped as integration-blocked: email/calendar capture, LinkedIn extension, data enrichment, Salesforce sync.</w:t>
       </w:r>
     </w:p>
     <w:p>

</xml_diff>

<commit_message>
Backend: LP-prospect CRM, stale deals, network directory, deals import (4Degrees functional gaps)
FR-J-16/17 extended: LPProspectActivity + prospect follow-ups (Alembic
d0e1f2a3b4c5) with strength + red lp_followup tasks; stage_changed_at
stale-deal detection (amber deal_stale tasks, 45-day threshold); firm
network roster deduped by email across deal contacts and LP prospects;
deals CSV import (validate/apply + template). 6 tests.

Co-Authored-By: Claude Opus 4.8 <noreply@anthropic.com>
</commit_message>
<xml_diff>
--- a/REQUIREMENTS.docx
+++ b/REQUIREMENTS.docx
@@ -7210,13 +7210,116 @@
           <w:i/>
           <w:iCs/>
         </w:rPr>
+        <w:t xml:space="preserve">Extended v1.7 (4Degrees gap):</w:t>
+      </w:r>
+      <w:r>
+        <w:t xml:space="preserve"> </w:t>
+      </w:r>
+      <w:r>
+        <w:t xml:space="preserve">per-prospect</w:t>
+      </w:r>
+      <w:r>
+        <w:t xml:space="preserve"> </w:t>
+      </w:r>
+      <w:r>
+        <w:rPr>
+          <w:b/>
+          <w:bCs/>
+        </w:rPr>
+        <w:t xml:space="preserve">CRM depth</w:t>
+      </w:r>
+      <w:r>
+        <w:t xml:space="preserve"> </w:t>
+      </w:r>
+      <w:r>
+        <w:t xml:space="preserve">mirroring the deal pipeline — dated activity timeline (</w:t>
+      </w:r>
+      <w:r>
+        <w:rPr>
+          <w:rStyle w:val="VerbatimChar"/>
+        </w:rPr>
+        <w:t xml:space="preserve">lp_prospect_activities</w:t>
+      </w:r>
+      <w:r>
+        <w:t xml:space="preserve">), derived</w:t>
+      </w:r>
+      <w:r>
+        <w:t xml:space="preserve"> </w:t>
+      </w:r>
+      <w:r>
+        <w:rPr>
+          <w:b/>
+          <w:bCs/>
+        </w:rPr>
+        <w:t xml:space="preserve">relationship strength</w:t>
+      </w:r>
+      <w:r>
+        <w:t xml:space="preserve">, and</w:t>
+      </w:r>
+      <w:r>
+        <w:t xml:space="preserve"> </w:t>
+      </w:r>
+      <w:r>
+        <w:rPr>
+          <w:b/>
+          <w:bCs/>
+        </w:rPr>
+        <w:t xml:space="preserve">follow-up reminders</w:t>
+      </w:r>
+      <w:r>
+        <w:t xml:space="preserve"> </w:t>
+      </w:r>
+      <w:r>
+        <w:t xml:space="preserve">(</w:t>
+      </w:r>
+      <w:r>
+        <w:rPr>
+          <w:rStyle w:val="VerbatimChar"/>
+        </w:rPr>
+        <w:t xml:space="preserve">lp_prospects.next_followup_on</w:t>
+      </w:r>
+      <w:r>
+        <w:t xml:space="preserve">; overdue → 🔔 in the pipeline + red Tasks-hub entry, cleared by converting).</w:t>
+      </w:r>
+      <w:r>
+        <w:t xml:space="preserve"> </w:t>
+      </w:r>
+      <w:r>
+        <w:rPr>
+          <w:rStyle w:val="VerbatimChar"/>
+        </w:rPr>
+        <w:t xml:space="preserve">GET/POST .../prospects/{pid}/crm|activities</w:t>
+      </w:r>
+      <w:r>
+        <w:t xml:space="preserve">,</w:t>
+      </w:r>
+      <w:r>
+        <w:t xml:space="preserve"> </w:t>
+      </w:r>
+      <w:r>
+        <w:rPr>
+          <w:rStyle w:val="VerbatimChar"/>
+        </w:rPr>
+        <w:t xml:space="preserve">PUT .../followup</w:t>
+      </w:r>
+      <w:r>
+        <w:t xml:space="preserve">.</w:t>
+      </w:r>
+      <w:r>
+        <w:t xml:space="preserve"> </w:t>
+      </w:r>
+      <w:r>
+        <w:rPr>
+          <w:i/>
+          <w:iCs/>
+        </w:rPr>
         <w:t xml:space="preserve">Remaining:</w:t>
       </w:r>
       <w:r>
         <w:t xml:space="preserve"> </w:t>
       </w:r>
       <w:r>
-        <w:t xml:space="preserve">per-prospect activity log / documents; email capture.</w:t>
+        <w:t xml:space="preserve">per-prospect documents; email capture.</w:t>
       </w:r>
     </w:p>
     <w:p>
@@ -17007,6 +17110,275 @@
       </w:r>
       <w:r>
         <w:t xml:space="preserve">— portfolio intelligence (Vestberry competitive gap analysis, fund side):</w:t>
+      </w:r>
+    </w:p>
+    <w:p>
+      <w:pPr>
+        <w:pStyle w:val="Compact"/>
+        <w:numPr>
+          <w:ilvl w:val="0"/>
+          <w:numId w:val="1030"/>
+        </w:numPr>
+      </w:pPr>
+      <w:r>
+        <w:rPr>
+          <w:b/>
+          <w:bCs/>
+        </w:rPr>
+        <w:t xml:space="preserve">4Degrees functional batch (relationship intelligence, FR-J-16/17 extended)</w:t>
+      </w:r>
+      <w:r>
+        <w:t xml:space="preserve"> </w:t>
+      </w:r>
+      <w:r>
+        <w:t xml:space="preserve">✅ — (1)</w:t>
+      </w:r>
+      <w:r>
+        <w:t xml:space="preserve"> </w:t>
+      </w:r>
+      <w:r>
+        <w:rPr>
+          <w:b/>
+          <w:bCs/>
+        </w:rPr>
+        <w:t xml:space="preserve">LP-fundraise CRM depth</w:t>
+      </w:r>
+      <w:r>
+        <w:t xml:space="preserve">:</w:t>
+      </w:r>
+      <w:r>
+        <w:t xml:space="preserve"> </w:t>
+      </w:r>
+      <w:r>
+        <w:rPr>
+          <w:rStyle w:val="VerbatimChar"/>
+        </w:rPr>
+        <w:t xml:space="preserve">LPProspectActivity</w:t>
+      </w:r>
+      <w:r>
+        <w:t xml:space="preserve"> </w:t>
+      </w:r>
+      <w:r>
+        <w:t xml:space="preserve">+</w:t>
+      </w:r>
+      <w:r>
+        <w:t xml:space="preserve"> </w:t>
+      </w:r>
+      <w:r>
+        <w:rPr>
+          <w:rStyle w:val="VerbatimChar"/>
+        </w:rPr>
+        <w:t xml:space="preserve">lp_prospects.next_followup_on</w:t>
+      </w:r>
+      <w:r>
+        <w:t xml:space="preserve"> </w:t>
+      </w:r>
+      <w:r>
+        <w:t xml:space="preserve">(Alembic</w:t>
+      </w:r>
+      <w:r>
+        <w:t xml:space="preserve"> </w:t>
+      </w:r>
+      <w:r>
+        <w:rPr>
+          <w:rStyle w:val="VerbatimChar"/>
+        </w:rPr>
+        <w:t xml:space="preserve">d0e1f2a3b4c5</w:t>
+      </w:r>
+      <w:r>
+        <w:t xml:space="preserve">) — per-prospect activity timeline, relationship strength and follow-up reminders in</w:t>
+      </w:r>
+      <w:r>
+        <w:t xml:space="preserve"> </w:t>
+      </w:r>
+      <w:r>
+        <w:rPr>
+          <w:rStyle w:val="VerbatimChar"/>
+        </w:rPr>
+        <w:t xml:space="preserve">FundRaise.tsx</w:t>
+      </w:r>
+      <w:r>
+        <w:t xml:space="preserve">, overdue → 🔔 + red</w:t>
+      </w:r>
+      <w:r>
+        <w:t xml:space="preserve"> </w:t>
+      </w:r>
+      <w:r>
+        <w:rPr>
+          <w:rStyle w:val="VerbatimChar"/>
+        </w:rPr>
+        <w:t xml:space="preserve">lp_followup</w:t>
+      </w:r>
+      <w:r>
+        <w:t xml:space="preserve"> </w:t>
+      </w:r>
+      <w:r>
+        <w:t xml:space="preserve">Tasks-hub entry (cleared by converting); (2)</w:t>
+      </w:r>
+      <w:r>
+        <w:t xml:space="preserve"> </w:t>
+      </w:r>
+      <w:r>
+        <w:rPr>
+          <w:b/>
+          <w:bCs/>
+        </w:rPr>
+        <w:t xml:space="preserve">stale-deal triggers</w:t>
+      </w:r>
+      <w:r>
+        <w:t xml:space="preserve">:</w:t>
+      </w:r>
+      <w:r>
+        <w:t xml:space="preserve"> </w:t>
+      </w:r>
+      <w:r>
+        <w:rPr>
+          <w:rStyle w:val="VerbatimChar"/>
+        </w:rPr>
+        <w:t xml:space="preserve">fund_deals.stage_changed_at</w:t>
+      </w:r>
+      <w:r>
+        <w:t xml:space="preserve"> </w:t>
+      </w:r>
+      <w:r>
+        <w:t xml:space="preserve">(stamped on stage moves, created_at fallback) — "stale Nd" badge on board/table past</w:t>
+      </w:r>
+      <w:r>
+        <w:t xml:space="preserve"> </w:t>
+      </w:r>
+      <w:r>
+        <w:rPr>
+          <w:rStyle w:val="VerbatimChar"/>
+        </w:rPr>
+        <w:t xml:space="preserve">STALE_DEAL_DAYS=45</w:t>
+      </w:r>
+      <w:r>
+        <w:t xml:space="preserve"> </w:t>
+      </w:r>
+      <w:r>
+        <w:t xml:space="preserve">+ amber</w:t>
+      </w:r>
+      <w:r>
+        <w:t xml:space="preserve"> </w:t>
+      </w:r>
+      <w:r>
+        <w:rPr>
+          <w:rStyle w:val="VerbatimChar"/>
+        </w:rPr>
+        <w:t xml:space="preserve">deal_stale</w:t>
+      </w:r>
+      <w:r>
+        <w:t xml:space="preserve"> </w:t>
+      </w:r>
+      <w:r>
+        <w:t xml:space="preserve">Tasks-hub entry; (3)</w:t>
+      </w:r>
+      <w:r>
+        <w:t xml:space="preserve"> </w:t>
+      </w:r>
+      <w:r>
+        <w:rPr>
+          <w:b/>
+          <w:bCs/>
+        </w:rPr>
+        <w:t xml:space="preserve">firm network directory</w:t>
+      </w:r>
+      <w:r>
+        <w:t xml:space="preserve">:</w:t>
+      </w:r>
+      <w:r>
+        <w:t xml:space="preserve"> </w:t>
+      </w:r>
+      <w:r>
+        <w:rPr>
+          <w:rStyle w:val="VerbatimChar"/>
+        </w:rPr>
+        <w:t xml:space="preserve">GET /funds/{id}/network</w:t>
+      </w:r>
+      <w:r>
+        <w:t xml:space="preserve"> </w:t>
+      </w:r>
+      <w:r>
+        <w:t xml:space="preserve">— deal contacts + LP prospects deduped by email into one roster (links, max strength, last touch), searchable "who do we know at X"</w:t>
+      </w:r>
+      <w:r>
+        <w:t xml:space="preserve"> </w:t>
+      </w:r>
+      <w:r>
+        <w:rPr>
+          <w:rStyle w:val="VerbatimChar"/>
+        </w:rPr>
+        <w:t xml:space="preserve">FundNetwork.tsx</w:t>
+      </w:r>
+      <w:r>
+        <w:t xml:space="preserve"> </w:t>
+      </w:r>
+      <w:r>
+        <w:t xml:space="preserve">card on the Deal pipeline sub-tab; (4)</w:t>
+      </w:r>
+      <w:r>
+        <w:t xml:space="preserve"> </w:t>
+      </w:r>
+      <w:r>
+        <w:rPr>
+          <w:b/>
+          <w:bCs/>
+        </w:rPr>
+        <w:t xml:space="preserve">deals CSV import</w:t>
+      </w:r>
+      <w:r>
+        <w:t xml:space="preserve">:</w:t>
+      </w:r>
+      <w:r>
+        <w:t xml:space="preserve"> </w:t>
+      </w:r>
+      <w:r>
+        <w:rPr>
+          <w:rStyle w:val="VerbatimChar"/>
+        </w:rPr>
+        <w:t xml:space="preserve">POST /funds/{id}/deals/import</w:t>
+      </w:r>
+      <w:r>
+        <w:t xml:space="preserve"> </w:t>
+      </w:r>
+      <w:r>
+        <w:t xml:space="preserve">(validate/apply, template endpoint) + import panel on the pipeline.</w:t>
+      </w:r>
+      <w:r>
+        <w:t xml:space="preserve"> </w:t>
+      </w:r>
+      <w:r>
+        <w:rPr>
+          <w:rStyle w:val="VerbatimChar"/>
+        </w:rPr>
+        <w:t xml:space="preserve">StrengthPie</w:t>
+      </w:r>
+      <w:r>
+        <w:t xml:space="preserve"> </w:t>
+      </w:r>
+      <w:r>
+        <w:t xml:space="preserve">extracted to a shared component. 6 tests (</w:t>
+      </w:r>
+      <w:r>
+        <w:rPr>
+          <w:rStyle w:val="VerbatimChar"/>
+        </w:rPr>
+        <w:t xml:space="preserve">test_fundraise_crm.py</w:t>
+      </w:r>
+      <w:r>
+        <w:t xml:space="preserve">,</w:t>
+      </w:r>
+      <w:r>
+        <w:t xml:space="preserve"> </w:t>
+      </w:r>
+      <w:r>
+        <w:rPr>
+          <w:rStyle w:val="VerbatimChar"/>
+        </w:rPr>
+        <w:t xml:space="preserve">test_network_and_import.py</w:t>
+      </w:r>
+      <w:r>
+        <w:t xml:space="preserve">).</w:t>
       </w:r>
     </w:p>
     <w:p>

</xml_diff>

<commit_message>
feat(portal): structured investor updates with drafts, metrics snapshot + engagement (FR-K-2, Visible #1)
investor_updates gains period_label/highlights/lowlights/asks, a JSON metrics
snapshot frozen at publish (FR-K-8 metrics), and a draft->published lifecycle
(PUT edits drafts only, POST /publish, 409 once published). New
investor_update_views: POST /portal/updates/{id}/view (invited investors only)
counts repeat opens per viewer; the admin list returns per-update engagement.
Portal shows published updates only, with the structured sections. Alembic
e1f2a3b4c5d6. 3 tests.

Co-Authored-By: Claude Opus 4.8 <noreply@anthropic.com>
</commit_message>
<xml_diff>
--- a/REQUIREMENTS.docx
+++ b/REQUIREMENTS.docx
@@ -8083,29 +8083,74 @@
           <w:b/>
           <w:bCs/>
         </w:rPr>
-        <w:t xml:space="preserve">FR-K-2 (M)</w:t>
-      </w:r>
-      <w:r>
-        <w:t xml:space="preserve"> </w:t>
-      </w:r>
-      <w:r>
-        <w:t xml:space="preserve">◐ Investor updates: publish + view per entity.</w:t>
-      </w:r>
-      <w:r>
-        <w:t xml:space="preserve"> </w:t>
-      </w:r>
-      <w:r>
-        <w:rPr>
-          <w:i/>
-          <w:iCs/>
-        </w:rPr>
-        <w:t xml:space="preserve">Remaining:</w:t>
-      </w:r>
-      <w:r>
-        <w:t xml:space="preserve"> </w:t>
-      </w:r>
-      <w:r>
-        <w:t xml:space="preserve">acknowledgement tracking.</w:t>
+        <w:t xml:space="preserve">FR-K-2 (M — extended v1.7, Visible gap)</w:t>
+      </w:r>
+      <w:r>
+        <w:t xml:space="preserve"> </w:t>
+      </w:r>
+      <w:r>
+        <w:t xml:space="preserve">✅</w:t>
+      </w:r>
+      <w:r>
+        <w:t xml:space="preserve"> </w:t>
+      </w:r>
+      <w:r>
+        <w:rPr>
+          <w:b/>
+          <w:bCs/>
+        </w:rPr>
+        <w:t xml:space="preserve">Structured investor updates</w:t>
+      </w:r>
+      <w:r>
+        <w:t xml:space="preserve">: Visible-style update composer with period label, highlights / lowlights / asks sections alongside the narrative body; a</w:t>
+      </w:r>
+      <w:r>
+        <w:t xml:space="preserve"> </w:t>
+      </w:r>
+      <w:r>
+        <w:rPr>
+          <w:b/>
+          <w:bCs/>
+        </w:rPr>
+        <w:t xml:space="preserve">live metrics snapshot</w:t>
+      </w:r>
+      <w:r>
+        <w:t xml:space="preserve"> </w:t>
+      </w:r>
+      <w:r>
+        <w:t xml:space="preserve">(FR-K-8 metrics) is frozen onto the update at publish time;</w:t>
+      </w:r>
+      <w:r>
+        <w:t xml:space="preserve"> </w:t>
+      </w:r>
+      <w:r>
+        <w:rPr>
+          <w:b/>
+          <w:bCs/>
+        </w:rPr>
+        <w:t xml:space="preserve">draft → published lifecycle</w:t>
+      </w:r>
+      <w:r>
+        <w:t xml:space="preserve"> </w:t>
+      </w:r>
+      <w:r>
+        <w:t xml:space="preserve">(drafts editable, invisible in the portal, published updates immutable); and</w:t>
+      </w:r>
+      <w:r>
+        <w:t xml:space="preserve"> </w:t>
+      </w:r>
+      <w:r>
+        <w:rPr>
+          <w:b/>
+          <w:bCs/>
+        </w:rPr>
+        <w:t xml:space="preserve">per-viewer engagement tracking</w:t>
+      </w:r>
+      <w:r>
+        <w:t xml:space="preserve"> </w:t>
+      </w:r>
+      <w:r>
+        <w:t xml:space="preserve">— invited investors open updates in their portal ("Read" records a view) and the company sees viewers × open counts per update.</w:t>
       </w:r>
     </w:p>
     <w:p>
@@ -17110,6 +17155,165 @@
       </w:r>
       <w:r>
         <w:t xml:space="preserve">— portfolio intelligence (Vestberry competitive gap analysis, fund side):</w:t>
+      </w:r>
+    </w:p>
+    <w:p>
+      <w:pPr>
+        <w:pStyle w:val="Compact"/>
+        <w:numPr>
+          <w:ilvl w:val="0"/>
+          <w:numId w:val="1030"/>
+        </w:numPr>
+      </w:pPr>
+      <w:r>
+        <w:rPr>
+          <w:b/>
+          <w:bCs/>
+        </w:rPr>
+        <w:t xml:space="preserve">Visible #1 — structured investor updates (FR-K-2 extended, Visible.vc gap analysis, startup side)</w:t>
+      </w:r>
+      <w:r>
+        <w:t xml:space="preserve"> </w:t>
+      </w:r>
+      <w:r>
+        <w:t xml:space="preserve">✅ —</w:t>
+      </w:r>
+      <w:r>
+        <w:t xml:space="preserve"> </w:t>
+      </w:r>
+      <w:r>
+        <w:rPr>
+          <w:rStyle w:val="VerbatimChar"/>
+        </w:rPr>
+        <w:t xml:space="preserve">investor_updates</w:t>
+      </w:r>
+      <w:r>
+        <w:t xml:space="preserve"> </w:t>
+      </w:r>
+      <w:r>
+        <w:t xml:space="preserve">gains period label, highlights/lowlights/asks sections, a frozen</w:t>
+      </w:r>
+      <w:r>
+        <w:t xml:space="preserve"> </w:t>
+      </w:r>
+      <w:r>
+        <w:rPr>
+          <w:b/>
+          <w:bCs/>
+        </w:rPr>
+        <w:t xml:space="preserve">metrics snapshot</w:t>
+      </w:r>
+      <w:r>
+        <w:t xml:space="preserve"> </w:t>
+      </w:r>
+      <w:r>
+        <w:t xml:space="preserve">(the FR-K-8 live metrics, JSON-sanitised) stamped at publish, and a</w:t>
+      </w:r>
+      <w:r>
+        <w:t xml:space="preserve"> </w:t>
+      </w:r>
+      <w:r>
+        <w:rPr>
+          <w:b/>
+          <w:bCs/>
+        </w:rPr>
+        <w:t xml:space="preserve">draft → published lifecycle</w:t>
+      </w:r>
+      <w:r>
+        <w:t xml:space="preserve"> </w:t>
+      </w:r>
+      <w:r>
+        <w:t xml:space="preserve">(</w:t>
+      </w:r>
+      <w:r>
+        <w:rPr>
+          <w:rStyle w:val="VerbatimChar"/>
+        </w:rPr>
+        <w:t xml:space="preserve">PUT /investor-updates/{id}</w:t>
+      </w:r>
+      <w:r>
+        <w:t xml:space="preserve"> </w:t>
+      </w:r>
+      <w:r>
+        <w:t xml:space="preserve">edits drafts only,</w:t>
+      </w:r>
+      <w:r>
+        <w:t xml:space="preserve"> </w:t>
+      </w:r>
+      <w:r>
+        <w:rPr>
+          <w:rStyle w:val="VerbatimChar"/>
+        </w:rPr>
+        <w:t xml:space="preserve">POST /investor-updates/{id}/publish</w:t>
+      </w:r>
+      <w:r>
+        <w:t xml:space="preserve">, 409 on published); new</w:t>
+      </w:r>
+      <w:r>
+        <w:t xml:space="preserve"> </w:t>
+      </w:r>
+      <w:r>
+        <w:rPr>
+          <w:rStyle w:val="VerbatimChar"/>
+        </w:rPr>
+        <w:t xml:space="preserve">investor_update_views</w:t>
+      </w:r>
+      <w:r>
+        <w:t xml:space="preserve"> </w:t>
+      </w:r>
+      <w:r>
+        <w:t xml:space="preserve">—</w:t>
+      </w:r>
+      <w:r>
+        <w:t xml:space="preserve"> </w:t>
+      </w:r>
+      <w:r>
+        <w:rPr>
+          <w:rStyle w:val="VerbatimChar"/>
+        </w:rPr>
+        <w:t xml:space="preserve">POST /portal/updates/{id}/view</w:t>
+      </w:r>
+      <w:r>
+        <w:t xml:space="preserve"> </w:t>
+      </w:r>
+      <w:r>
+        <w:t xml:space="preserve">(invited-investor-scoped) counts repeat opens per viewer, and the admin list returns per-update viewer/open engagement (Alembic</w:t>
+      </w:r>
+      <w:r>
+        <w:t xml:space="preserve"> </w:t>
+      </w:r>
+      <w:r>
+        <w:rPr>
+          <w:rStyle w:val="VerbatimChar"/>
+        </w:rPr>
+        <w:t xml:space="preserve">e1f2a3b4c5d6</w:t>
+      </w:r>
+      <w:r>
+        <w:t xml:space="preserve">). Frontend: structured composer with Publish / Save-draft / edit-draft in</w:t>
+      </w:r>
+      <w:r>
+        <w:t xml:space="preserve"> </w:t>
+      </w:r>
+      <w:r>
+        <w:rPr>
+          <w:rStyle w:val="VerbatimChar"/>
+        </w:rPr>
+        <w:t xml:space="preserve">Investors.tsx</w:t>
+      </w:r>
+      <w:r>
+        <w:t xml:space="preserve"> </w:t>
+      </w:r>
+      <w:r>
+        <w:t xml:space="preserve">+ status chips, section rows, metric chips and 👁 viewers·opens per update; portal updates become expandable "Read" cards (view recorded on open) with sections + metric chips. 3 tests (</w:t>
+      </w:r>
+      <w:r>
+        <w:rPr>
+          <w:rStyle w:val="VerbatimChar"/>
+        </w:rPr>
+        <w:t xml:space="preserve">test_investor_updates.py</w:t>
+      </w:r>
+      <w:r>
+        <w:t xml:space="preserve">).</w:t>
       </w:r>
     </w:p>
     <w:p>

</xml_diff>

<commit_message>
feat(fund): metric alert rules — fund-defined thresholds surfacing as portfolio signals (FR-J-20, Visible #2)
New MetricAlertRule (metric lt/gt threshold, high/warn severity; Alembic
f2a3b4c5d6e7). Rules evaluate on read inside portfolio_signals against each
company's latest period, over a shared metric catalog (metric_options: core
KPIs + custom.<key> definitions, reused by benchmarks). Breaches emit
metric_alert signals with the rule's severity, unit-aware formatting.
GET/POST/DELETE /funds/{id}/alert-rules. 3 tests.

Co-Authored-By: Claude Opus 4.8 <noreply@anthropic.com>
</commit_message>
<xml_diff>
--- a/REQUIREMENTS.docx
+++ b/REQUIREMENTS.docx
@@ -6484,13 +6484,99 @@
           <w:i/>
           <w:iCs/>
         </w:rPr>
+        <w:t xml:space="preserve">(extended v1.7, Visible gap)</w:t>
+      </w:r>
+      <w:r>
+        <w:t xml:space="preserve"> </w:t>
+      </w:r>
+      <w:r>
+        <w:rPr>
+          <w:b/>
+          <w:bCs/>
+        </w:rPr>
+        <w:t xml:space="preserve">Metric alerts</w:t>
+      </w:r>
+      <w:r>
+        <w:t xml:space="preserve"> </w:t>
+      </w:r>
+      <w:r>
+        <w:t xml:space="preserve">— fund-defined thresholds on any tracked metric (core KPIs, growth, runway, or</w:t>
+      </w:r>
+      <w:r>
+        <w:t xml:space="preserve"> </w:t>
+      </w:r>
+      <w:r>
+        <w:rPr>
+          <w:rStyle w:val="VerbatimChar"/>
+        </w:rPr>
+        <w:t xml:space="preserve">custom.&lt;key&gt;</w:t>
+      </w:r>
+      <w:r>
+        <w:t xml:space="preserve"> </w:t>
+      </w:r>
+      <w:r>
+        <w:t xml:space="preserve">definitions): rule = metric + falls-below/rises-above + threshold + severity (high/warn), evaluated on read against each company's latest period; breaches surface as</w:t>
+      </w:r>
+      <w:r>
+        <w:t xml:space="preserve"> </w:t>
+      </w:r>
+      <w:r>
+        <w:rPr>
+          <w:rStyle w:val="VerbatimChar"/>
+        </w:rPr>
+        <w:t xml:space="preserve">metric_alert</w:t>
+      </w:r>
+      <w:r>
+        <w:t xml:space="preserve"> </w:t>
+      </w:r>
+      <w:r>
+        <w:t xml:space="preserve">signals with the rule's severity (unit-aware formatting).</w:t>
+      </w:r>
+      <w:r>
+        <w:t xml:space="preserve"> </w:t>
+      </w:r>
+      <w:r>
+        <w:rPr>
+          <w:rStyle w:val="VerbatimChar"/>
+        </w:rPr>
+        <w:t xml:space="preserve">GET/POST/DELETE /funds/{id}/alert-rules</w:t>
+      </w:r>
+      <w:r>
+        <w:t xml:space="preserve"> </w:t>
+      </w:r>
+      <w:r>
+        <w:t xml:space="preserve">(GET returns the metric catalog shared with benchmarks); "Metric alerts" panel in</w:t>
+      </w:r>
+      <w:r>
+        <w:t xml:space="preserve"> </w:t>
+      </w:r>
+      <w:r>
+        <w:rPr>
+          <w:rStyle w:val="VerbatimChar"/>
+        </w:rPr>
+        <w:t xml:space="preserve">PortfolioMonitoring.tsx</w:t>
+      </w:r>
+      <w:r>
+        <w:t xml:space="preserve"> </w:t>
+      </w:r>
+      <w:r>
+        <w:t xml:space="preserve">(rule chips + add form).</w:t>
+      </w:r>
+      <w:r>
+        <w:t xml:space="preserve"> </w:t>
+      </w:r>
+      <w:r>
+        <w:rPr>
+          <w:i/>
+          <w:iCs/>
+        </w:rPr>
         <w:t xml:space="preserve">Remaining:</w:t>
       </w:r>
       <w:r>
         <w:t xml:space="preserve"> </w:t>
       </w:r>
       <w:r>
-        <w:t xml:space="preserve">signal thresholds per fund; notification digests.</w:t>
+        <w:t xml:space="preserve">notification digests.</w:t>
       </w:r>
     </w:p>
     <w:p>
@@ -17155,6 +17241,145 @@
       </w:r>
       <w:r>
         <w:t xml:space="preserve">— portfolio intelligence (Vestberry competitive gap analysis, fund side):</w:t>
+      </w:r>
+    </w:p>
+    <w:p>
+      <w:pPr>
+        <w:pStyle w:val="Compact"/>
+        <w:numPr>
+          <w:ilvl w:val="0"/>
+          <w:numId w:val="1030"/>
+        </w:numPr>
+      </w:pPr>
+      <w:r>
+        <w:rPr>
+          <w:b/>
+          <w:bCs/>
+        </w:rPr>
+        <w:t xml:space="preserve">Visible #2 — metric alerts (FR-J-20 extended, fund side)</w:t>
+      </w:r>
+      <w:r>
+        <w:t xml:space="preserve"> </w:t>
+      </w:r>
+      <w:r>
+        <w:t xml:space="preserve">✅ — new</w:t>
+      </w:r>
+      <w:r>
+        <w:t xml:space="preserve"> </w:t>
+      </w:r>
+      <w:r>
+        <w:rPr>
+          <w:rStyle w:val="VerbatimChar"/>
+        </w:rPr>
+        <w:t xml:space="preserve">MetricAlertRule</w:t>
+      </w:r>
+      <w:r>
+        <w:t xml:space="preserve"> </w:t>
+      </w:r>
+      <w:r>
+        <w:t xml:space="preserve">{fund, metric, lt/gt comparator, threshold, high/warn severity} (Alembic</w:t>
+      </w:r>
+      <w:r>
+        <w:t xml:space="preserve"> </w:t>
+      </w:r>
+      <w:r>
+        <w:rPr>
+          <w:rStyle w:val="VerbatimChar"/>
+        </w:rPr>
+        <w:t xml:space="preserve">f2a3b4c5d6e7</w:t>
+      </w:r>
+      <w:r>
+        <w:t xml:space="preserve">); evaluated inside</w:t>
+      </w:r>
+      <w:r>
+        <w:t xml:space="preserve"> </w:t>
+      </w:r>
+      <w:r>
+        <w:rPr>
+          <w:rStyle w:val="VerbatimChar"/>
+        </w:rPr>
+        <w:t xml:space="preserve">portfolio_signals</w:t>
+      </w:r>
+      <w:r>
+        <w:t xml:space="preserve"> </w:t>
+      </w:r>
+      <w:r>
+        <w:t xml:space="preserve">against each company's latest period over the shared metric catalog (</w:t>
+      </w:r>
+      <w:r>
+        <w:rPr>
+          <w:rStyle w:val="VerbatimChar"/>
+        </w:rPr>
+        <w:t xml:space="preserve">metric_options</w:t>
+      </w:r>
+      <w:r>
+        <w:t xml:space="preserve"> </w:t>
+      </w:r>
+      <w:r>
+        <w:t xml:space="preserve">— 5 core +</w:t>
+      </w:r>
+      <w:r>
+        <w:t xml:space="preserve"> </w:t>
+      </w:r>
+      <w:r>
+        <w:rPr>
+          <w:rStyle w:val="VerbatimChar"/>
+        </w:rPr>
+        <w:t xml:space="preserve">custom.&lt;key&gt;</w:t>
+      </w:r>
+      <w:r>
+        <w:t xml:space="preserve"> </w:t>
+      </w:r>
+      <w:r>
+        <w:t xml:space="preserve">definitions, now also feeding benchmarks); breaches emit</w:t>
+      </w:r>
+      <w:r>
+        <w:t xml:space="preserve"> </w:t>
+      </w:r>
+      <w:r>
+        <w:rPr>
+          <w:rStyle w:val="VerbatimChar"/>
+        </w:rPr>
+        <w:t xml:space="preserve">metric_alert</w:t>
+      </w:r>
+      <w:r>
+        <w:t xml:space="preserve"> </w:t>
+      </w:r>
+      <w:r>
+        <w:t xml:space="preserve">signals with the rule's severity and unit-aware text.</w:t>
+      </w:r>
+      <w:r>
+        <w:t xml:space="preserve"> </w:t>
+      </w:r>
+      <w:r>
+        <w:rPr>
+          <w:rStyle w:val="VerbatimChar"/>
+        </w:rPr>
+        <w:t xml:space="preserve">GET/POST/DELETE /funds/{id}/alert-rules</w:t>
+      </w:r>
+      <w:r>
+        <w:t xml:space="preserve">; "Metric alerts" panel (rule chips + metric/condition/threshold/severity form) in</w:t>
+      </w:r>
+      <w:r>
+        <w:t xml:space="preserve"> </w:t>
+      </w:r>
+      <w:r>
+        <w:rPr>
+          <w:rStyle w:val="VerbatimChar"/>
+        </w:rPr>
+        <w:t xml:space="preserve">PortfolioMonitoring.tsx</w:t>
+      </w:r>
+      <w:r>
+        <w:t xml:space="preserve">. 3 tests (</w:t>
+      </w:r>
+      <w:r>
+        <w:rPr>
+          <w:rStyle w:val="VerbatimChar"/>
+        </w:rPr>
+        <w:t xml:space="preserve">test_metric_alerts.py</w:t>
+      </w:r>
+      <w:r>
+        <w:t xml:space="preserve">).</w:t>
       </w:r>
     </w:p>
     <w:p>

</xml_diff>

<commit_message>
feat(fund): recurring KPI-request schedules + no-login submission tokens (FR-J-19, Visible #3)
KPIRequestSchedule (one per investment, monthly/quarterly; Alembic
a3b4c5d6e7f8) materialised on read: GET /funds/{id}/kpi-requests creates the
last completed period's request if missing (Indian-FY quarter labels, due =
period end + 14 days, requires a reporting contact). kpi_requests.token
(unique) mints a secret link per request; public GET/POST
/public/kpi-requests/{token}[/submit] let the contact report without an
account (shared submit_request_values with the portal path). 3 tests.

Co-Authored-By: Claude Opus 4.8 <noreply@anthropic.com>
</commit_message>
<xml_diff>
--- a/REQUIREMENTS.docx
+++ b/REQUIREMENTS.docx
@@ -6748,13 +6748,144 @@
           <w:i/>
           <w:iCs/>
         </w:rPr>
+        <w:t xml:space="preserve">(extended v1.7, Visible gap)</w:t>
+      </w:r>
+      <w:r>
+        <w:t xml:space="preserve"> </w:t>
+      </w:r>
+      <w:r>
+        <w:rPr>
+          <w:b/>
+          <w:bCs/>
+        </w:rPr>
+        <w:t xml:space="preserve">Recurring schedules + no-login submission</w:t>
+      </w:r>
+      <w:r>
+        <w:t xml:space="preserve">: a per-company</w:t>
+      </w:r>
+      <w:r>
+        <w:t xml:space="preserve"> </w:t>
+      </w:r>
+      <w:r>
+        <w:rPr>
+          <w:b/>
+          <w:bCs/>
+        </w:rPr>
+        <w:t xml:space="preserve">request cadence</w:t>
+      </w:r>
+      <w:r>
+        <w:t xml:space="preserve"> </w:t>
+      </w:r>
+      <w:r>
+        <w:t xml:space="preserve">(monthly / quarterly) materialised on read — opening the requests list creates the request for the last completed period if missing (idempotent; quarters labelled as Indian-FY quarters, due = period end + 14 days); and every request mints a</w:t>
+      </w:r>
+      <w:r>
+        <w:t xml:space="preserve"> </w:t>
+      </w:r>
+      <w:r>
+        <w:rPr>
+          <w:b/>
+          <w:bCs/>
+        </w:rPr>
+        <w:t xml:space="preserve">secret link token</w:t>
+      </w:r>
+      <w:r>
+        <w:t xml:space="preserve"> </w:t>
+      </w:r>
+      <w:r>
+        <w:t xml:space="preserve">so the contact can submit</w:t>
+      </w:r>
+      <w:r>
+        <w:t xml:space="preserve"> </w:t>
+      </w:r>
+      <w:r>
+        <w:rPr>
+          <w:b/>
+          <w:bCs/>
+        </w:rPr>
+        <w:t xml:space="preserve">without a Paper account</w:t>
+      </w:r>
+      <w:r>
+        <w:t xml:space="preserve"> </w:t>
+      </w:r>
+      <w:r>
+        <w:t xml:space="preserve">via a public page (</w:t>
+      </w:r>
+      <w:r>
+        <w:rPr>
+          <w:rStyle w:val="VerbatimChar"/>
+        </w:rPr>
+        <w:t xml:space="preserve">/submit-kpis/{token}</w:t>
+      </w:r>
+      <w:r>
+        <w:t xml:space="preserve"> </w:t>
+      </w:r>
+      <w:r>
+        <w:t xml:space="preserve">→</w:t>
+      </w:r>
+      <w:r>
+        <w:t xml:space="preserve"> </w:t>
+      </w:r>
+      <w:r>
+        <w:rPr>
+          <w:rStyle w:val="VerbatimChar"/>
+        </w:rPr>
+        <w:t xml:space="preserve">GET/POST /public/kpi-requests/{token}[/submit]</w:t>
+      </w:r>
+      <w:r>
+        <w:t xml:space="preserve">, 404 unknown token, 409 resubmit) — Visible's "frictionless founder experience".</w:t>
+      </w:r>
+      <w:r>
+        <w:t xml:space="preserve"> </w:t>
+      </w:r>
+      <w:r>
+        <w:rPr>
+          <w:rStyle w:val="VerbatimChar"/>
+        </w:rPr>
+        <w:t xml:space="preserve">GET /funds/{id}/kpi-schedules</w:t>
+      </w:r>
+      <w:r>
+        <w:t xml:space="preserve">,</w:t>
+      </w:r>
+      <w:r>
+        <w:t xml:space="preserve"> </w:t>
+      </w:r>
+      <w:r>
+        <w:rPr>
+          <w:rStyle w:val="VerbatimChar"/>
+        </w:rPr>
+        <w:t xml:space="preserve">PUT/DELETE /funds/{id}/portfolio/{iid}/kpi-schedule</w:t>
+      </w:r>
+      <w:r>
+        <w:t xml:space="preserve">; "Make recurring" + schedule chips + per-request "Copy link" in</w:t>
+      </w:r>
+      <w:r>
+        <w:t xml:space="preserve"> </w:t>
+      </w:r>
+      <w:r>
+        <w:rPr>
+          <w:rStyle w:val="VerbatimChar"/>
+        </w:rPr>
+        <w:t xml:space="preserve">PortfolioMonitoring.tsx</w:t>
+      </w:r>
+      <w:r>
+        <w:t xml:space="preserve">.</w:t>
+      </w:r>
+      <w:r>
+        <w:t xml:space="preserve"> </w:t>
+      </w:r>
+      <w:r>
+        <w:rPr>
+          <w:i/>
+          <w:iCs/>
+        </w:rPr>
         <w:t xml:space="preserve">Remaining:</w:t>
       </w:r>
       <w:r>
         <w:t xml:space="preserve"> </w:t>
       </w:r>
       <w:r>
-        <w:t xml:space="preserve">recurring request schedules; custom-metric requests (see FR-J-23</w:t>
+        <w:t xml:space="preserve">custom-metric requests (see FR-J-23</w:t>
       </w:r>
       <w:r>
         <w:t xml:space="preserve"> </w:t>
@@ -17241,6 +17372,169 @@
       </w:r>
       <w:r>
         <w:t xml:space="preserve">— portfolio intelligence (Vestberry competitive gap analysis, fund side):</w:t>
+      </w:r>
+    </w:p>
+    <w:p>
+      <w:pPr>
+        <w:pStyle w:val="Compact"/>
+        <w:numPr>
+          <w:ilvl w:val="0"/>
+          <w:numId w:val="1030"/>
+        </w:numPr>
+      </w:pPr>
+      <w:r>
+        <w:rPr>
+          <w:b/>
+          <w:bCs/>
+        </w:rPr>
+        <w:t xml:space="preserve">Visible #3 — scheduled KPI requests + no-login submission (FR-J-19 extended, fund side)</w:t>
+      </w:r>
+      <w:r>
+        <w:t xml:space="preserve"> </w:t>
+      </w:r>
+      <w:r>
+        <w:t xml:space="preserve">✅ — new</w:t>
+      </w:r>
+      <w:r>
+        <w:t xml:space="preserve"> </w:t>
+      </w:r>
+      <w:r>
+        <w:rPr>
+          <w:rStyle w:val="VerbatimChar"/>
+        </w:rPr>
+        <w:t xml:space="preserve">KPIRequestSchedule</w:t>
+      </w:r>
+      <w:r>
+        <w:t xml:space="preserve"> </w:t>
+      </w:r>
+      <w:r>
+        <w:t xml:space="preserve">(one per investment, monthly/quarterly) +</w:t>
+      </w:r>
+      <w:r>
+        <w:t xml:space="preserve"> </w:t>
+      </w:r>
+      <w:r>
+        <w:rPr>
+          <w:rStyle w:val="VerbatimChar"/>
+        </w:rPr>
+        <w:t xml:space="preserve">kpi_requests.token</w:t>
+      </w:r>
+      <w:r>
+        <w:t xml:space="preserve"> </w:t>
+      </w:r>
+      <w:r>
+        <w:t xml:space="preserve">unique (Alembic</w:t>
+      </w:r>
+      <w:r>
+        <w:t xml:space="preserve"> </w:t>
+      </w:r>
+      <w:r>
+        <w:rPr>
+          <w:rStyle w:val="VerbatimChar"/>
+        </w:rPr>
+        <w:t xml:space="preserve">a3b4c5d6e7f8</w:t>
+      </w:r>
+      <w:r>
+        <w:t xml:space="preserve">).</w:t>
+      </w:r>
+      <w:r>
+        <w:t xml:space="preserve"> </w:t>
+      </w:r>
+      <w:r>
+        <w:rPr>
+          <w:rStyle w:val="VerbatimChar"/>
+        </w:rPr>
+        <w:t xml:space="preserve">ensure_scheduled_requests</w:t>
+      </w:r>
+      <w:r>
+        <w:t xml:space="preserve"> </w:t>
+      </w:r>
+      <w:r>
+        <w:t xml:space="preserve">materialises the last completed period's request on read of the requests list (idempotent by period label; Indian-FY quarter labels; due = period end + 14 days; skips companies without a reporting contact —</w:t>
+      </w:r>
+      <w:r>
+        <w:t xml:space="preserve"> </w:t>
+      </w:r>
+      <w:r>
+        <w:rPr>
+          <w:rStyle w:val="VerbatimChar"/>
+        </w:rPr>
+        <w:t xml:space="preserve">PUT .../kpi-schedule</w:t>
+      </w:r>
+      <w:r>
+        <w:t xml:space="preserve"> </w:t>
+      </w:r>
+      <w:r>
+        <w:t xml:space="preserve">400s until one is set). Every request now carries a secret token: public page</w:t>
+      </w:r>
+      <w:r>
+        <w:t xml:space="preserve"> </w:t>
+      </w:r>
+      <w:r>
+        <w:rPr>
+          <w:rStyle w:val="VerbatimChar"/>
+        </w:rPr>
+        <w:t xml:space="preserve">/submit-kpis/{token}</w:t>
+      </w:r>
+      <w:r>
+        <w:t xml:space="preserve"> </w:t>
+      </w:r>
+      <w:r>
+        <w:t xml:space="preserve">+ unauthenticated</w:t>
+      </w:r>
+      <w:r>
+        <w:t xml:space="preserve"> </w:t>
+      </w:r>
+      <w:r>
+        <w:rPr>
+          <w:rStyle w:val="VerbatimChar"/>
+        </w:rPr>
+        <w:t xml:space="preserve">GET/POST /public/kpi-requests/{token}[/submit]</w:t>
+      </w:r>
+      <w:r>
+        <w:t xml:space="preserve"> </w:t>
+      </w:r>
+      <w:r>
+        <w:t xml:space="preserve">let the contact report without an account (shared</w:t>
+      </w:r>
+      <w:r>
+        <w:t xml:space="preserve"> </w:t>
+      </w:r>
+      <w:r>
+        <w:rPr>
+          <w:rStyle w:val="VerbatimChar"/>
+        </w:rPr>
+        <w:t xml:space="preserve">submit_request_values</w:t>
+      </w:r>
+      <w:r>
+        <w:t xml:space="preserve"> </w:t>
+      </w:r>
+      <w:r>
+        <w:t xml:space="preserve">with the portal path). Frontend: "Make recurring" + schedule chips in the request panel, "Copy link" on pending requests, new</w:t>
+      </w:r>
+      <w:r>
+        <w:t xml:space="preserve"> </w:t>
+      </w:r>
+      <w:r>
+        <w:rPr>
+          <w:rStyle w:val="VerbatimChar"/>
+        </w:rPr>
+        <w:t xml:space="preserve">SubmitKpis.tsx</w:t>
+      </w:r>
+      <w:r>
+        <w:t xml:space="preserve"> </w:t>
+      </w:r>
+      <w:r>
+        <w:t xml:space="preserve">public page. 3 tests (</w:t>
+      </w:r>
+      <w:r>
+        <w:rPr>
+          <w:rStyle w:val="VerbatimChar"/>
+        </w:rPr>
+        <w:t xml:space="preserve">test_kpi_schedules.py</w:t>
+      </w:r>
+      <w:r>
+        <w:t xml:space="preserve">).</w:t>
       </w:r>
     </w:p>
     <w:p>

</xml_diff>

<commit_message>
feat(fund): portfolio segments + plan-variance report (FR-J-24/FR-J-12, Visible #4)
portfolio_investments.sector segment tag (Alembic b4c5d6e7f8a9);
portfolio_benchmarks adds per-sector cohort medians (hidden with a single
cohort). compute_plan gains a variance block: plan vs live ledgers per metric
(committed, deployed-to-date vs even pacing since first investment, avg
cheque, deal count, gross MOIC at FV-over-cost, net TVPI) with signed
variance %. 3 tests.

Co-Authored-By: Claude Opus 4.8 <noreply@anthropic.com>
</commit_message>
<xml_diff>
--- a/REQUIREMENTS.docx
+++ b/REQUIREMENTS.docx
@@ -5974,91 +5974,38 @@
           <w:i/>
           <w:iCs/>
         </w:rPr>
-        <w:t xml:space="preserve">Remaining:</w:t>
-      </w:r>
-      <w:r>
-        <w:t xml:space="preserve"> </w:t>
-      </w:r>
-      <w:r>
-        <w:t xml:space="preserve">quartiles; cohort filters (by vintage/sector).</w:t>
-      </w:r>
-    </w:p>
-    <w:p>
-      <w:pPr>
-        <w:pStyle w:val="Compact"/>
-        <w:numPr>
-          <w:ilvl w:val="0"/>
-          <w:numId w:val="1013"/>
-        </w:numPr>
-      </w:pPr>
-      <w:r>
-        <w:rPr>
-          <w:b/>
-          <w:bCs/>
-        </w:rPr>
-        <w:t xml:space="preserve">FR-J-23 (M — added v1.7, Vestberry gap)</w:t>
-      </w:r>
-      <w:r>
-        <w:t xml:space="preserve"> </w:t>
-      </w:r>
-      <w:r>
-        <w:t xml:space="preserve">✅</w:t>
-      </w:r>
-      <w:r>
-        <w:t xml:space="preserve"> </w:t>
-      </w:r>
-      <w:r>
-        <w:rPr>
-          <w:b/>
-          <w:bCs/>
-        </w:rPr>
-        <w:t xml:space="preserve">Custom KPI definitions + ESG presets</w:t>
-      </w:r>
-      <w:r>
-        <w:t xml:space="preserve">: a fund defines its own metrics (label + unit ₹/number/%; key auto-slugged from the label) collected alongside the core KPIs — with one-click</w:t>
-      </w:r>
-      <w:r>
-        <w:t xml:space="preserve"> </w:t>
-      </w:r>
-      <w:r>
-        <w:rPr>
-          <w:b/>
-          <w:bCs/>
-        </w:rPr>
-        <w:t xml:space="preserve">ESG presets</w:t>
-      </w:r>
-      <w:r>
-        <w:t xml:space="preserve"> </w:t>
-      </w:r>
-      <w:r>
-        <w:t xml:space="preserve">(female headcount %, independent directors %, GHG emissions, energy use, CSR spend — rules-as-data). Values are captured per period on the KPI report (stored as JSON on the period, filtered to defined keys) and flow into monitoring and FR-J-24 benchmarking. Deleting a definition keeps historical values, they just stop being shown.</w:t>
-      </w:r>
-      <w:r>
-        <w:t xml:space="preserve"> </w:t>
-      </w:r>
-      <w:r>
-        <w:rPr>
-          <w:rStyle w:val="VerbatimChar"/>
-        </w:rPr>
-        <w:t xml:space="preserve">GET/POST /funds/{id}/kpi-definitions</w:t>
-      </w:r>
-      <w:r>
-        <w:t xml:space="preserve">,</w:t>
-      </w:r>
-      <w:r>
-        <w:t xml:space="preserve"> </w:t>
-      </w:r>
-      <w:r>
-        <w:rPr>
-          <w:rStyle w:val="VerbatimChar"/>
-        </w:rPr>
-        <w:t xml:space="preserve">DELETE .../{id}</w:t>
-      </w:r>
-      <w:r>
-        <w:t xml:space="preserve"> </w:t>
-      </w:r>
-      <w:r>
-        <w:t xml:space="preserve">(409 duplicate key).</w:t>
+        <w:t xml:space="preserve">(extended v1.7, Visible gap)</w:t>
+      </w:r>
+      <w:r>
+        <w:t xml:space="preserve"> </w:t>
+      </w:r>
+      <w:r>
+        <w:rPr>
+          <w:b/>
+          <w:bCs/>
+        </w:rPr>
+        <w:t xml:space="preserve">Segment comparison</w:t>
+      </w:r>
+      <w:r>
+        <w:t xml:space="preserve"> </w:t>
+      </w:r>
+      <w:r>
+        <w:t xml:space="preserve">— investments carry a free-text</w:t>
+      </w:r>
+      <w:r>
+        <w:t xml:space="preserve"> </w:t>
+      </w:r>
+      <w:r>
+        <w:rPr>
+          <w:rStyle w:val="VerbatimChar"/>
+        </w:rPr>
+        <w:t xml:space="preserve">sector</w:t>
+      </w:r>
+      <w:r>
+        <w:t xml:space="preserve"> </w:t>
+      </w:r>
+      <w:r>
+        <w:t xml:space="preserve">tag; the benchmark payload adds per-segment cohorts (median per metric + company count per sector, untagged grouped as "—", hidden when only one cohort exists); sector chips on the monitoring table and a segment-medians table under the benchmark table.</w:t>
       </w:r>
       <w:r>
         <w:t xml:space="preserve"> </w:t>
@@ -6074,7 +6021,7 @@
         <w:t xml:space="preserve"> </w:t>
       </w:r>
       <w:r>
-        <w:t xml:space="preserve">custom metrics on portal KPI requests (investee self-reporting); per-metric trend charts.</w:t>
+        <w:t xml:space="preserve">quartiles; vintage cohorts.</w:t>
       </w:r>
     </w:p>
     <w:p>
@@ -6090,7 +6037,7 @@
           <w:b/>
           <w:bCs/>
         </w:rPr>
-        <w:t xml:space="preserve">FR-J-22 (M — added v1.7, Vestberry gap)</w:t>
+        <w:t xml:space="preserve">FR-J-23 (M — added v1.7, Vestberry gap)</w:t>
       </w:r>
       <w:r>
         <w:t xml:space="preserve"> </w:t>
@@ -6106,105 +6053,53 @@
           <w:b/>
           <w:bCs/>
         </w:rPr>
-        <w:t xml:space="preserve">Quarterly LP report pack</w:t>
-      </w:r>
-      <w:r>
-        <w:t xml:space="preserve">: a one-click quarterly report document per fund — fund snapshot (committed / drawn / uncalled / distributed), since-inception</w:t>
-      </w:r>
-      <w:r>
-        <w:t xml:space="preserve"> </w:t>
-      </w:r>
-      <w:r>
-        <w:rPr>
-          <w:b/>
-          <w:bCs/>
-        </w:rPr>
-        <w:t xml:space="preserve">performance</w:t>
-      </w:r>
-      <w:r>
-        <w:t xml:space="preserve"> </w:t>
-      </w:r>
-      <w:r>
-        <w:t xml:space="preserve">(NAV, NAV per unit, DPI / RVPI / TVPI / XIRR),</w:t>
-      </w:r>
-      <w:r>
-        <w:t xml:space="preserve"> </w:t>
-      </w:r>
-      <w:r>
-        <w:rPr>
-          <w:b/>
-          <w:bCs/>
-        </w:rPr>
-        <w:t xml:space="preserve">activity this period</w:t>
-      </w:r>
-      <w:r>
-        <w:t xml:space="preserve"> </w:t>
-      </w:r>
-      <w:r>
-        <w:t xml:space="preserve">(capital calls by due date and distributions by date falling in the reporting window, with amounts and carry), the</w:t>
-      </w:r>
-      <w:r>
-        <w:t xml:space="preserve"> </w:t>
-      </w:r>
-      <w:r>
-        <w:rPr>
-          <w:b/>
-          <w:bCs/>
-        </w:rPr>
-        <w:t xml:space="preserve">Schedule of Investments</w:t>
-      </w:r>
-      <w:r>
-        <w:t xml:space="preserve"> </w:t>
-      </w:r>
-      <w:r>
-        <w:t xml:space="preserve">with totals, and</w:t>
-      </w:r>
-      <w:r>
-        <w:t xml:space="preserve"> </w:t>
-      </w:r>
-      <w:r>
-        <w:rPr>
-          <w:b/>
-          <w:bCs/>
-        </w:rPr>
-        <w:t xml:space="preserve">valuation status</w:t>
-      </w:r>
-      <w:r>
-        <w:t xml:space="preserve"> </w:t>
-      </w:r>
-      <w:r>
-        <w:t xml:space="preserve">vs the FR-J-15 policy — composed entirely from the existing capital-accounts / performance / SOI / valuation services, amounts lakh/crore-formatted, unaudited-figures disclaimer. The report</w:t>
-      </w:r>
-      <w:r>
-        <w:t xml:space="preserve"> </w:t>
-      </w:r>
-      <w:r>
-        <w:rPr>
-          <w:b/>
-          <w:bCs/>
-        </w:rPr>
-        <w:t xml:space="preserve">surfaces automatically in every LP's portal</w:t>
-      </w:r>
-      <w:r>
-        <w:t xml:space="preserve"> </w:t>
-      </w:r>
-      <w:r>
-        <w:t xml:space="preserve">statements list (fund-wide, alongside their personal capital-account statements and Form 64C).</w:t>
-      </w:r>
-      <w:r>
-        <w:t xml:space="preserve"> </w:t>
-      </w:r>
-      <w:r>
-        <w:rPr>
-          <w:rStyle w:val="VerbatimChar"/>
-        </w:rPr>
-        <w:t xml:space="preserve">POST /funds/{id}/lp-report</w:t>
-      </w:r>
-      <w:r>
-        <w:t xml:space="preserve"> </w:t>
-      </w:r>
-      <w:r>
-        <w:t xml:space="preserve">(period label + start/end; 400 on inverted period).</w:t>
+        <w:t xml:space="preserve">Custom KPI definitions + ESG presets</w:t>
+      </w:r>
+      <w:r>
+        <w:t xml:space="preserve">: a fund defines its own metrics (label + unit ₹/number/%; key auto-slugged from the label) collected alongside the core KPIs — with one-click</w:t>
+      </w:r>
+      <w:r>
+        <w:t xml:space="preserve"> </w:t>
+      </w:r>
+      <w:r>
+        <w:rPr>
+          <w:b/>
+          <w:bCs/>
+        </w:rPr>
+        <w:t xml:space="preserve">ESG presets</w:t>
+      </w:r>
+      <w:r>
+        <w:t xml:space="preserve"> </w:t>
+      </w:r>
+      <w:r>
+        <w:t xml:space="preserve">(female headcount %, independent directors %, GHG emissions, energy use, CSR spend — rules-as-data). Values are captured per period on the KPI report (stored as JSON on the period, filtered to defined keys) and flow into monitoring and FR-J-24 benchmarking. Deleting a definition keeps historical values, they just stop being shown.</w:t>
+      </w:r>
+      <w:r>
+        <w:t xml:space="preserve"> </w:t>
+      </w:r>
+      <w:r>
+        <w:rPr>
+          <w:rStyle w:val="VerbatimChar"/>
+        </w:rPr>
+        <w:t xml:space="preserve">GET/POST /funds/{id}/kpi-definitions</w:t>
+      </w:r>
+      <w:r>
+        <w:t xml:space="preserve">,</w:t>
+      </w:r>
+      <w:r>
+        <w:t xml:space="preserve"> </w:t>
+      </w:r>
+      <w:r>
+        <w:rPr>
+          <w:rStyle w:val="VerbatimChar"/>
+        </w:rPr>
+        <w:t xml:space="preserve">DELETE .../{id}</w:t>
+      </w:r>
+      <w:r>
+        <w:t xml:space="preserve"> </w:t>
+      </w:r>
+      <w:r>
+        <w:t xml:space="preserve">(409 duplicate key).</w:t>
       </w:r>
       <w:r>
         <w:t xml:space="preserve"> </w:t>
@@ -6220,7 +6115,7 @@
         <w:t xml:space="preserve"> </w:t>
       </w:r>
       <w:r>
-        <w:t xml:space="preserve">per-LP personalised section (their capital account inside the pack); scheduled quarterly runs; PDF branding.</w:t>
+        <w:t xml:space="preserve">custom metrics on portal KPI requests (investee self-reporting); per-metric trend charts.</w:t>
       </w:r>
     </w:p>
     <w:p>
@@ -6236,7 +6131,7 @@
           <w:b/>
           <w:bCs/>
         </w:rPr>
-        <w:t xml:space="preserve">FR-J-21 (M — added v1.7, Vestberry gap)</w:t>
+        <w:t xml:space="preserve">FR-J-22 (M — added v1.7, Vestberry gap)</w:t>
       </w:r>
       <w:r>
         <w:t xml:space="preserve"> </w:t>
@@ -6252,86 +6147,105 @@
           <w:b/>
           <w:bCs/>
         </w:rPr>
-        <w:t xml:space="preserve">Company tear sheets</w:t>
-      </w:r>
-      <w:r>
-        <w:t xml:space="preserve">: a one-pager document per portfolio company generated in one click from the Portfolio table — investment summary (instrument, invested, ownership, reporting contact),</w:t>
-      </w:r>
-      <w:r>
-        <w:t xml:space="preserve"> </w:t>
-      </w:r>
-      <w:r>
-        <w:rPr>
-          <w:b/>
-          <w:bCs/>
-        </w:rPr>
-        <w:t xml:space="preserve">value &amp; MOIC</w:t>
-      </w:r>
-      <w:r>
-        <w:t xml:space="preserve"> </w:t>
-      </w:r>
-      <w:r>
-        <w:t xml:space="preserve">(cost, fair value, unrealised gain), the</w:t>
-      </w:r>
-      <w:r>
-        <w:t xml:space="preserve"> </w:t>
-      </w:r>
-      <w:r>
-        <w:rPr>
-          <w:b/>
-          <w:bCs/>
-        </w:rPr>
-        <w:t xml:space="preserve">latest valuation</w:t>
-      </w:r>
-      <w:r>
-        <w:t xml:space="preserve"> </w:t>
-      </w:r>
-      <w:r>
-        <w:t xml:space="preserve">(value, methodology, valuer, independence, as-of — or "fund's own mark" when only a mark exists), the</w:t>
-      </w:r>
-      <w:r>
-        <w:t xml:space="preserve"> </w:t>
-      </w:r>
-      <w:r>
-        <w:rPr>
-          <w:b/>
-          <w:bCs/>
-        </w:rPr>
-        <w:t xml:space="preserve">KPI trend</w:t>
-      </w:r>
-      <w:r>
-        <w:t xml:space="preserve"> </w:t>
-      </w:r>
-      <w:r>
-        <w:t xml:space="preserve">(last 4 periods, newest first, with runway) and the company's</w:t>
-      </w:r>
-      <w:r>
-        <w:t xml:space="preserve"> </w:t>
-      </w:r>
-      <w:r>
-        <w:rPr>
-          <w:b/>
-          <w:bCs/>
-        </w:rPr>
-        <w:t xml:space="preserve">active signals</w:t>
-      </w:r>
-      <w:r>
-        <w:t xml:space="preserve"> </w:t>
-      </w:r>
-      <w:r>
-        <w:t xml:space="preserve">from FR-J-20 (or a healthy note) — composed entirely from the monitoring/valuation/signals services, amounts lakh/crore-formatted. Lands in the entity's Documents (PDF-renderable like all documents).</w:t>
-      </w:r>
-      <w:r>
-        <w:t xml:space="preserve"> </w:t>
-      </w:r>
-      <w:r>
-        <w:rPr>
-          <w:rStyle w:val="VerbatimChar"/>
-        </w:rPr>
-        <w:t xml:space="preserve">POST /funds/{id}/portfolio/{iid}/tear-sheet</w:t>
-      </w:r>
-      <w:r>
-        <w:t xml:space="preserve">.</w:t>
+        <w:t xml:space="preserve">Quarterly LP report pack</w:t>
+      </w:r>
+      <w:r>
+        <w:t xml:space="preserve">: a one-click quarterly report document per fund — fund snapshot (committed / drawn / uncalled / distributed), since-inception</w:t>
+      </w:r>
+      <w:r>
+        <w:t xml:space="preserve"> </w:t>
+      </w:r>
+      <w:r>
+        <w:rPr>
+          <w:b/>
+          <w:bCs/>
+        </w:rPr>
+        <w:t xml:space="preserve">performance</w:t>
+      </w:r>
+      <w:r>
+        <w:t xml:space="preserve"> </w:t>
+      </w:r>
+      <w:r>
+        <w:t xml:space="preserve">(NAV, NAV per unit, DPI / RVPI / TVPI / XIRR),</w:t>
+      </w:r>
+      <w:r>
+        <w:t xml:space="preserve"> </w:t>
+      </w:r>
+      <w:r>
+        <w:rPr>
+          <w:b/>
+          <w:bCs/>
+        </w:rPr>
+        <w:t xml:space="preserve">activity this period</w:t>
+      </w:r>
+      <w:r>
+        <w:t xml:space="preserve"> </w:t>
+      </w:r>
+      <w:r>
+        <w:t xml:space="preserve">(capital calls by due date and distributions by date falling in the reporting window, with amounts and carry), the</w:t>
+      </w:r>
+      <w:r>
+        <w:t xml:space="preserve"> </w:t>
+      </w:r>
+      <w:r>
+        <w:rPr>
+          <w:b/>
+          <w:bCs/>
+        </w:rPr>
+        <w:t xml:space="preserve">Schedule of Investments</w:t>
+      </w:r>
+      <w:r>
+        <w:t xml:space="preserve"> </w:t>
+      </w:r>
+      <w:r>
+        <w:t xml:space="preserve">with totals, and</w:t>
+      </w:r>
+      <w:r>
+        <w:t xml:space="preserve"> </w:t>
+      </w:r>
+      <w:r>
+        <w:rPr>
+          <w:b/>
+          <w:bCs/>
+        </w:rPr>
+        <w:t xml:space="preserve">valuation status</w:t>
+      </w:r>
+      <w:r>
+        <w:t xml:space="preserve"> </w:t>
+      </w:r>
+      <w:r>
+        <w:t xml:space="preserve">vs the FR-J-15 policy — composed entirely from the existing capital-accounts / performance / SOI / valuation services, amounts lakh/crore-formatted, unaudited-figures disclaimer. The report</w:t>
+      </w:r>
+      <w:r>
+        <w:t xml:space="preserve"> </w:t>
+      </w:r>
+      <w:r>
+        <w:rPr>
+          <w:b/>
+          <w:bCs/>
+        </w:rPr>
+        <w:t xml:space="preserve">surfaces automatically in every LP's portal</w:t>
+      </w:r>
+      <w:r>
+        <w:t xml:space="preserve"> </w:t>
+      </w:r>
+      <w:r>
+        <w:t xml:space="preserve">statements list (fund-wide, alongside their personal capital-account statements and Form 64C).</w:t>
+      </w:r>
+      <w:r>
+        <w:t xml:space="preserve"> </w:t>
+      </w:r>
+      <w:r>
+        <w:rPr>
+          <w:rStyle w:val="VerbatimChar"/>
+        </w:rPr>
+        <w:t xml:space="preserve">POST /funds/{id}/lp-report</w:t>
+      </w:r>
+      <w:r>
+        <w:t xml:space="preserve"> </w:t>
+      </w:r>
+      <w:r>
+        <w:t xml:space="preserve">(period label + start/end; 400 on inverted period).</w:t>
       </w:r>
       <w:r>
         <w:t xml:space="preserve"> </w:t>
@@ -6347,7 +6261,7 @@
         <w:t xml:space="preserve"> </w:t>
       </w:r>
       <w:r>
-        <w:t xml:space="preserve">custom sections/branding; batch generation for the whole portfolio.</w:t>
+        <w:t xml:space="preserve">per-LP personalised section (their capital account inside the pack); scheduled quarterly runs; PDF branding.</w:t>
       </w:r>
     </w:p>
     <w:p>
@@ -6363,7 +6277,7 @@
           <w:b/>
           <w:bCs/>
         </w:rPr>
-        <w:t xml:space="preserve">FR-J-20 (M — added v1.7, Vestberry gap)</w:t>
+        <w:t xml:space="preserve">FR-J-21 (M — added v1.7, Vestberry gap)</w:t>
       </w:r>
       <w:r>
         <w:t xml:space="preserve"> </w:t>
@@ -6379,99 +6293,83 @@
           <w:b/>
           <w:bCs/>
         </w:rPr>
-        <w:t xml:space="preserve">Portfolio signals</w:t>
-      </w:r>
-      <w:r>
-        <w:t xml:space="preserve">: rules-based early warning derived from the KPI history and marks —</w:t>
-      </w:r>
-      <w:r>
-        <w:t xml:space="preserve"> </w:t>
-      </w:r>
-      <w:r>
-        <w:rPr>
-          <w:b/>
-          <w:bCs/>
-        </w:rPr>
-        <w:t xml:space="preserve">revenue decline</w:t>
-      </w:r>
-      <w:r>
-        <w:t xml:space="preserve"> </w:t>
-      </w:r>
-      <w:r>
-        <w:t xml:space="preserve">period-over-period (high severity beyond 20%),</w:t>
-      </w:r>
-      <w:r>
-        <w:t xml:space="preserve"> </w:t>
-      </w:r>
-      <w:r>
-        <w:rPr>
-          <w:b/>
-          <w:bCs/>
-        </w:rPr>
-        <w:t xml:space="preserve">low runway</w:t>
-      </w:r>
-      <w:r>
-        <w:t xml:space="preserve"> </w:t>
-      </w:r>
-      <w:r>
-        <w:t xml:space="preserve">(&lt; 6 months),</w:t>
-      </w:r>
-      <w:r>
-        <w:t xml:space="preserve"> </w:t>
-      </w:r>
-      <w:r>
-        <w:rPr>
-          <w:b/>
-          <w:bCs/>
-        </w:rPr>
-        <w:t xml:space="preserve">mark below cost</w:t>
-      </w:r>
-      <w:r>
-        <w:t xml:space="preserve"> </w:t>
-      </w:r>
-      <w:r>
-        <w:t xml:space="preserve">(impairment %),</w:t>
-      </w:r>
-      <w:r>
-        <w:t xml:space="preserve"> </w:t>
-      </w:r>
-      <w:r>
-        <w:rPr>
-          <w:b/>
-          <w:bCs/>
-        </w:rPr>
-        <w:t xml:space="preserve">reporting gone silent</w:t>
-      </w:r>
-      <w:r>
-        <w:t xml:space="preserve"> </w:t>
-      </w:r>
-      <w:r>
-        <w:t xml:space="preserve">(&gt; 6 months since the last period; "never reported" info) — plus the positive signal,</w:t>
-      </w:r>
-      <w:r>
-        <w:t xml:space="preserve"> </w:t>
-      </w:r>
-      <w:r>
-        <w:rPr>
-          <w:b/>
-          <w:bCs/>
-        </w:rPr>
-        <w:t xml:space="preserve">follow-on candidates</w:t>
-      </w:r>
-      <w:r>
-        <w:t xml:space="preserve"> </w:t>
-      </w:r>
-      <w:r>
-        <w:t xml:space="preserve">(growing revenue with ≥ 12 months runway, feeding the FR-J-12 reserves decision). Severity roll-ups (high / warn / info / positive / all-clear) and per-company signal rows, worst first. Pure derivation, no schema.</w:t>
-      </w:r>
-      <w:r>
-        <w:t xml:space="preserve"> </w:t>
-      </w:r>
-      <w:r>
-        <w:rPr>
-          <w:rStyle w:val="VerbatimChar"/>
-        </w:rPr>
-        <w:t xml:space="preserve">GET /funds/{id}/signals</w:t>
+        <w:t xml:space="preserve">Company tear sheets</w:t>
+      </w:r>
+      <w:r>
+        <w:t xml:space="preserve">: a one-pager document per portfolio company generated in one click from the Portfolio table — investment summary (instrument, invested, ownership, reporting contact),</w:t>
+      </w:r>
+      <w:r>
+        <w:t xml:space="preserve"> </w:t>
+      </w:r>
+      <w:r>
+        <w:rPr>
+          <w:b/>
+          <w:bCs/>
+        </w:rPr>
+        <w:t xml:space="preserve">value &amp; MOIC</w:t>
+      </w:r>
+      <w:r>
+        <w:t xml:space="preserve"> </w:t>
+      </w:r>
+      <w:r>
+        <w:t xml:space="preserve">(cost, fair value, unrealised gain), the</w:t>
+      </w:r>
+      <w:r>
+        <w:t xml:space="preserve"> </w:t>
+      </w:r>
+      <w:r>
+        <w:rPr>
+          <w:b/>
+          <w:bCs/>
+        </w:rPr>
+        <w:t xml:space="preserve">latest valuation</w:t>
+      </w:r>
+      <w:r>
+        <w:t xml:space="preserve"> </w:t>
+      </w:r>
+      <w:r>
+        <w:t xml:space="preserve">(value, methodology, valuer, independence, as-of — or "fund's own mark" when only a mark exists), the</w:t>
+      </w:r>
+      <w:r>
+        <w:t xml:space="preserve"> </w:t>
+      </w:r>
+      <w:r>
+        <w:rPr>
+          <w:b/>
+          <w:bCs/>
+        </w:rPr>
+        <w:t xml:space="preserve">KPI trend</w:t>
+      </w:r>
+      <w:r>
+        <w:t xml:space="preserve"> </w:t>
+      </w:r>
+      <w:r>
+        <w:t xml:space="preserve">(last 4 periods, newest first, with runway) and the company's</w:t>
+      </w:r>
+      <w:r>
+        <w:t xml:space="preserve"> </w:t>
+      </w:r>
+      <w:r>
+        <w:rPr>
+          <w:b/>
+          <w:bCs/>
+        </w:rPr>
+        <w:t xml:space="preserve">active signals</w:t>
+      </w:r>
+      <w:r>
+        <w:t xml:space="preserve"> </w:t>
+      </w:r>
+      <w:r>
+        <w:t xml:space="preserve">from FR-J-20 (or a healthy note) — composed entirely from the monitoring/valuation/signals services, amounts lakh/crore-formatted. Lands in the entity's Documents (PDF-renderable like all documents).</w:t>
+      </w:r>
+      <w:r>
+        <w:t xml:space="preserve"> </w:t>
+      </w:r>
+      <w:r>
+        <w:rPr>
+          <w:rStyle w:val="VerbatimChar"/>
+        </w:rPr>
+        <w:t xml:space="preserve">POST /funds/{id}/portfolio/{iid}/tear-sheet</w:t>
       </w:r>
       <w:r>
         <w:t xml:space="preserve">.</w:t>
@@ -6484,83 +6382,140 @@
           <w:i/>
           <w:iCs/>
         </w:rPr>
-        <w:t xml:space="preserve">(extended v1.7, Visible gap)</w:t>
-      </w:r>
-      <w:r>
-        <w:t xml:space="preserve"> </w:t>
-      </w:r>
-      <w:r>
-        <w:rPr>
-          <w:b/>
-          <w:bCs/>
-        </w:rPr>
-        <w:t xml:space="preserve">Metric alerts</w:t>
-      </w:r>
-      <w:r>
-        <w:t xml:space="preserve"> </w:t>
-      </w:r>
-      <w:r>
-        <w:t xml:space="preserve">— fund-defined thresholds on any tracked metric (core KPIs, growth, runway, or</w:t>
-      </w:r>
-      <w:r>
-        <w:t xml:space="preserve"> </w:t>
-      </w:r>
-      <w:r>
-        <w:rPr>
-          <w:rStyle w:val="VerbatimChar"/>
-        </w:rPr>
-        <w:t xml:space="preserve">custom.&lt;key&gt;</w:t>
-      </w:r>
-      <w:r>
-        <w:t xml:space="preserve"> </w:t>
-      </w:r>
-      <w:r>
-        <w:t xml:space="preserve">definitions): rule = metric + falls-below/rises-above + threshold + severity (high/warn), evaluated on read against each company's latest period; breaches surface as</w:t>
-      </w:r>
-      <w:r>
-        <w:t xml:space="preserve"> </w:t>
-      </w:r>
-      <w:r>
-        <w:rPr>
-          <w:rStyle w:val="VerbatimChar"/>
-        </w:rPr>
-        <w:t xml:space="preserve">metric_alert</w:t>
-      </w:r>
-      <w:r>
-        <w:t xml:space="preserve"> </w:t>
-      </w:r>
-      <w:r>
-        <w:t xml:space="preserve">signals with the rule's severity (unit-aware formatting).</w:t>
-      </w:r>
-      <w:r>
-        <w:t xml:space="preserve"> </w:t>
-      </w:r>
-      <w:r>
-        <w:rPr>
-          <w:rStyle w:val="VerbatimChar"/>
-        </w:rPr>
-        <w:t xml:space="preserve">GET/POST/DELETE /funds/{id}/alert-rules</w:t>
-      </w:r>
-      <w:r>
-        <w:t xml:space="preserve"> </w:t>
-      </w:r>
-      <w:r>
-        <w:t xml:space="preserve">(GET returns the metric catalog shared with benchmarks); "Metric alerts" panel in</w:t>
-      </w:r>
-      <w:r>
-        <w:t xml:space="preserve"> </w:t>
-      </w:r>
-      <w:r>
-        <w:rPr>
-          <w:rStyle w:val="VerbatimChar"/>
-        </w:rPr>
-        <w:t xml:space="preserve">PortfolioMonitoring.tsx</w:t>
-      </w:r>
-      <w:r>
-        <w:t xml:space="preserve"> </w:t>
-      </w:r>
-      <w:r>
-        <w:t xml:space="preserve">(rule chips + add form).</w:t>
+        <w:t xml:space="preserve">Remaining:</w:t>
+      </w:r>
+      <w:r>
+        <w:t xml:space="preserve"> </w:t>
+      </w:r>
+      <w:r>
+        <w:t xml:space="preserve">custom sections/branding; batch generation for the whole portfolio.</w:t>
+      </w:r>
+    </w:p>
+    <w:p>
+      <w:pPr>
+        <w:pStyle w:val="Compact"/>
+        <w:numPr>
+          <w:ilvl w:val="0"/>
+          <w:numId w:val="1013"/>
+        </w:numPr>
+      </w:pPr>
+      <w:r>
+        <w:rPr>
+          <w:b/>
+          <w:bCs/>
+        </w:rPr>
+        <w:t xml:space="preserve">FR-J-20 (M — added v1.7, Vestberry gap)</w:t>
+      </w:r>
+      <w:r>
+        <w:t xml:space="preserve"> </w:t>
+      </w:r>
+      <w:r>
+        <w:t xml:space="preserve">✅</w:t>
+      </w:r>
+      <w:r>
+        <w:t xml:space="preserve"> </w:t>
+      </w:r>
+      <w:r>
+        <w:rPr>
+          <w:b/>
+          <w:bCs/>
+        </w:rPr>
+        <w:t xml:space="preserve">Portfolio signals</w:t>
+      </w:r>
+      <w:r>
+        <w:t xml:space="preserve">: rules-based early warning derived from the KPI history and marks —</w:t>
+      </w:r>
+      <w:r>
+        <w:t xml:space="preserve"> </w:t>
+      </w:r>
+      <w:r>
+        <w:rPr>
+          <w:b/>
+          <w:bCs/>
+        </w:rPr>
+        <w:t xml:space="preserve">revenue decline</w:t>
+      </w:r>
+      <w:r>
+        <w:t xml:space="preserve"> </w:t>
+      </w:r>
+      <w:r>
+        <w:t xml:space="preserve">period-over-period (high severity beyond 20%),</w:t>
+      </w:r>
+      <w:r>
+        <w:t xml:space="preserve"> </w:t>
+      </w:r>
+      <w:r>
+        <w:rPr>
+          <w:b/>
+          <w:bCs/>
+        </w:rPr>
+        <w:t xml:space="preserve">low runway</w:t>
+      </w:r>
+      <w:r>
+        <w:t xml:space="preserve"> </w:t>
+      </w:r>
+      <w:r>
+        <w:t xml:space="preserve">(&lt; 6 months),</w:t>
+      </w:r>
+      <w:r>
+        <w:t xml:space="preserve"> </w:t>
+      </w:r>
+      <w:r>
+        <w:rPr>
+          <w:b/>
+          <w:bCs/>
+        </w:rPr>
+        <w:t xml:space="preserve">mark below cost</w:t>
+      </w:r>
+      <w:r>
+        <w:t xml:space="preserve"> </w:t>
+      </w:r>
+      <w:r>
+        <w:t xml:space="preserve">(impairment %),</w:t>
+      </w:r>
+      <w:r>
+        <w:t xml:space="preserve"> </w:t>
+      </w:r>
+      <w:r>
+        <w:rPr>
+          <w:b/>
+          <w:bCs/>
+        </w:rPr>
+        <w:t xml:space="preserve">reporting gone silent</w:t>
+      </w:r>
+      <w:r>
+        <w:t xml:space="preserve"> </w:t>
+      </w:r>
+      <w:r>
+        <w:t xml:space="preserve">(&gt; 6 months since the last period; "never reported" info) — plus the positive signal,</w:t>
+      </w:r>
+      <w:r>
+        <w:t xml:space="preserve"> </w:t>
+      </w:r>
+      <w:r>
+        <w:rPr>
+          <w:b/>
+          <w:bCs/>
+        </w:rPr>
+        <w:t xml:space="preserve">follow-on candidates</w:t>
+      </w:r>
+      <w:r>
+        <w:t xml:space="preserve"> </w:t>
+      </w:r>
+      <w:r>
+        <w:t xml:space="preserve">(growing revenue with ≥ 12 months runway, feeding the FR-J-12 reserves decision). Severity roll-ups (high / warn / info / positive / all-clear) and per-company signal rows, worst first. Pure derivation, no schema.</w:t>
+      </w:r>
+      <w:r>
+        <w:t xml:space="preserve"> </w:t>
+      </w:r>
+      <w:r>
+        <w:rPr>
+          <w:rStyle w:val="VerbatimChar"/>
+        </w:rPr>
+        <w:t xml:space="preserve">GET /funds/{id}/signals</w:t>
+      </w:r>
+      <w:r>
+        <w:t xml:space="preserve">.</w:t>
       </w:r>
       <w:r>
         <w:t xml:space="preserve"> </w:t>
@@ -6570,175 +6525,83 @@
           <w:i/>
           <w:iCs/>
         </w:rPr>
-        <w:t xml:space="preserve">Remaining:</w:t>
-      </w:r>
-      <w:r>
-        <w:t xml:space="preserve"> </w:t>
-      </w:r>
-      <w:r>
-        <w:t xml:space="preserve">notification digests.</w:t>
-      </w:r>
-    </w:p>
-    <w:p>
-      <w:pPr>
-        <w:pStyle w:val="Compact"/>
-        <w:numPr>
-          <w:ilvl w:val="0"/>
-          <w:numId w:val="1013"/>
-        </w:numPr>
-      </w:pPr>
-      <w:r>
-        <w:rPr>
-          <w:b/>
-          <w:bCs/>
-        </w:rPr>
-        <w:t xml:space="preserve">FR-J-19 (M — added v1.7, Vestberry gap)</w:t>
-      </w:r>
-      <w:r>
-        <w:t xml:space="preserve"> </w:t>
-      </w:r>
-      <w:r>
-        <w:t xml:space="preserve">✅</w:t>
-      </w:r>
-      <w:r>
-        <w:t xml:space="preserve"> </w:t>
-      </w:r>
-      <w:r>
-        <w:rPr>
-          <w:b/>
-          <w:bCs/>
-        </w:rPr>
-        <w:t xml:space="preserve">KPI reporting requests (investee self-service)</w:t>
-      </w:r>
-      <w:r>
-        <w:t xml:space="preserve">: the GP asks each portfolio company's</w:t>
-      </w:r>
-      <w:r>
-        <w:t xml:space="preserve"> </w:t>
-      </w:r>
-      <w:r>
-        <w:rPr>
-          <w:b/>
-          <w:bCs/>
-        </w:rPr>
-        <w:t xml:space="preserve">reporting contact</w:t>
-      </w:r>
-      <w:r>
-        <w:t xml:space="preserve"> </w:t>
-      </w:r>
-      <w:r>
-        <w:t xml:space="preserve">(email stored on the investment) for a KPI period; the contact sees the request in</w:t>
-      </w:r>
-      <w:r>
-        <w:t xml:space="preserve"> </w:t>
-      </w:r>
-      <w:r>
-        <w:rPr>
-          <w:b/>
-          <w:bCs/>
-        </w:rPr>
-        <w:t xml:space="preserve">their portal</w:t>
-      </w:r>
-      <w:r>
-        <w:t xml:space="preserve"> </w:t>
-      </w:r>
-      <w:r>
-        <w:t xml:space="preserve">(plus an in-app notification if they have an account) with due date and overdue flag, submits revenue/cash/burn/headcount, and the GP</w:t>
-      </w:r>
-      <w:r>
-        <w:t xml:space="preserve"> </w:t>
-      </w:r>
-      <w:r>
-        <w:rPr>
-          <w:b/>
-          <w:bCs/>
-        </w:rPr>
-        <w:t xml:space="preserve">accepts</w:t>
-      </w:r>
-      <w:r>
-        <w:t xml:space="preserve"> </w:t>
-      </w:r>
-      <w:r>
-        <w:t xml:space="preserve">the submission into</w:t>
-      </w:r>
-      <w:r>
-        <w:t xml:space="preserve"> </w:t>
-      </w:r>
-      <w:r>
-        <w:rPr>
-          <w:rStyle w:val="VerbatimChar"/>
-        </w:rPr>
-        <w:t xml:space="preserve">PortfolioKPI</w:t>
-      </w:r>
-      <w:r>
-        <w:t xml:space="preserve"> </w:t>
-      </w:r>
-      <w:r>
-        <w:t xml:space="preserve">(or</w:t>
-      </w:r>
-      <w:r>
-        <w:t xml:space="preserve"> </w:t>
-      </w:r>
-      <w:r>
-        <w:rPr>
-          <w:b/>
-          <w:bCs/>
-        </w:rPr>
-        <w:t xml:space="preserve">reopens</w:t>
-      </w:r>
-      <w:r>
-        <w:t xml:space="preserve"> </w:t>
-      </w:r>
-      <w:r>
-        <w:t xml:space="preserve">it for resubmission). Request lifecycle pending → submitted → accepted, email-scoped submission, 409 double-submit/accept guards.</w:t>
-      </w:r>
-      <w:r>
-        <w:t xml:space="preserve"> </w:t>
-      </w:r>
-      <w:r>
-        <w:rPr>
-          <w:rStyle w:val="VerbatimChar"/>
-        </w:rPr>
-        <w:t xml:space="preserve">POST /funds/{id}/portfolio/{iid}/kpi-requests</w:t>
-      </w:r>
-      <w:r>
-        <w:t xml:space="preserve">,</w:t>
-      </w:r>
-      <w:r>
-        <w:t xml:space="preserve"> </w:t>
-      </w:r>
-      <w:r>
-        <w:rPr>
-          <w:rStyle w:val="VerbatimChar"/>
-        </w:rPr>
-        <w:t xml:space="preserve">GET /funds/{id}/kpi-requests</w:t>
-      </w:r>
-      <w:r>
-        <w:t xml:space="preserve">,</w:t>
-      </w:r>
-      <w:r>
-        <w:t xml:space="preserve"> </w:t>
-      </w:r>
-      <w:r>
-        <w:rPr>
-          <w:rStyle w:val="VerbatimChar"/>
-        </w:rPr>
-        <w:t xml:space="preserve">POST .../accept|reopen</w:t>
-      </w:r>
-      <w:r>
-        <w:t xml:space="preserve">, portal</w:t>
-      </w:r>
-      <w:r>
-        <w:t xml:space="preserve"> </w:t>
-      </w:r>
-      <w:r>
-        <w:rPr>
-          <w:rStyle w:val="VerbatimChar"/>
-        </w:rPr>
-        <w:t xml:space="preserve">POST /portal/kpi-requests/{id}/submit</w:t>
-      </w:r>
-      <w:r>
-        <w:t xml:space="preserve">.</w:t>
+        <w:t xml:space="preserve">(extended v1.7, Visible gap)</w:t>
+      </w:r>
+      <w:r>
+        <w:t xml:space="preserve"> </w:t>
+      </w:r>
+      <w:r>
+        <w:rPr>
+          <w:b/>
+          <w:bCs/>
+        </w:rPr>
+        <w:t xml:space="preserve">Metric alerts</w:t>
+      </w:r>
+      <w:r>
+        <w:t xml:space="preserve"> </w:t>
+      </w:r>
+      <w:r>
+        <w:t xml:space="preserve">— fund-defined thresholds on any tracked metric (core KPIs, growth, runway, or</w:t>
+      </w:r>
+      <w:r>
+        <w:t xml:space="preserve"> </w:t>
+      </w:r>
+      <w:r>
+        <w:rPr>
+          <w:rStyle w:val="VerbatimChar"/>
+        </w:rPr>
+        <w:t xml:space="preserve">custom.&lt;key&gt;</w:t>
+      </w:r>
+      <w:r>
+        <w:t xml:space="preserve"> </w:t>
+      </w:r>
+      <w:r>
+        <w:t xml:space="preserve">definitions): rule = metric + falls-below/rises-above + threshold + severity (high/warn), evaluated on read against each company's latest period; breaches surface as</w:t>
+      </w:r>
+      <w:r>
+        <w:t xml:space="preserve"> </w:t>
+      </w:r>
+      <w:r>
+        <w:rPr>
+          <w:rStyle w:val="VerbatimChar"/>
+        </w:rPr>
+        <w:t xml:space="preserve">metric_alert</w:t>
+      </w:r>
+      <w:r>
+        <w:t xml:space="preserve"> </w:t>
+      </w:r>
+      <w:r>
+        <w:t xml:space="preserve">signals with the rule's severity (unit-aware formatting).</w:t>
+      </w:r>
+      <w:r>
+        <w:t xml:space="preserve"> </w:t>
+      </w:r>
+      <w:r>
+        <w:rPr>
+          <w:rStyle w:val="VerbatimChar"/>
+        </w:rPr>
+        <w:t xml:space="preserve">GET/POST/DELETE /funds/{id}/alert-rules</w:t>
+      </w:r>
+      <w:r>
+        <w:t xml:space="preserve"> </w:t>
+      </w:r>
+      <w:r>
+        <w:t xml:space="preserve">(GET returns the metric catalog shared with benchmarks); "Metric alerts" panel in</w:t>
+      </w:r>
+      <w:r>
+        <w:t xml:space="preserve"> </w:t>
+      </w:r>
+      <w:r>
+        <w:rPr>
+          <w:rStyle w:val="VerbatimChar"/>
+        </w:rPr>
+        <w:t xml:space="preserve">PortfolioMonitoring.tsx</w:t>
+      </w:r>
+      <w:r>
+        <w:t xml:space="preserve"> </w:t>
+      </w:r>
+      <w:r>
+        <w:t xml:space="preserve">(rule chips + add form).</w:t>
       </w:r>
       <w:r>
         <w:t xml:space="preserve"> </w:t>
@@ -6748,101 +6611,136 @@
           <w:i/>
           <w:iCs/>
         </w:rPr>
-        <w:t xml:space="preserve">(extended v1.7, Visible gap)</w:t>
-      </w:r>
-      <w:r>
-        <w:t xml:space="preserve"> </w:t>
-      </w:r>
-      <w:r>
-        <w:rPr>
-          <w:b/>
-          <w:bCs/>
-        </w:rPr>
-        <w:t xml:space="preserve">Recurring schedules + no-login submission</w:t>
-      </w:r>
-      <w:r>
-        <w:t xml:space="preserve">: a per-company</w:t>
-      </w:r>
-      <w:r>
-        <w:t xml:space="preserve"> </w:t>
-      </w:r>
-      <w:r>
-        <w:rPr>
-          <w:b/>
-          <w:bCs/>
-        </w:rPr>
-        <w:t xml:space="preserve">request cadence</w:t>
-      </w:r>
-      <w:r>
-        <w:t xml:space="preserve"> </w:t>
-      </w:r>
-      <w:r>
-        <w:t xml:space="preserve">(monthly / quarterly) materialised on read — opening the requests list creates the request for the last completed period if missing (idempotent; quarters labelled as Indian-FY quarters, due = period end + 14 days); and every request mints a</w:t>
-      </w:r>
-      <w:r>
-        <w:t xml:space="preserve"> </w:t>
-      </w:r>
-      <w:r>
-        <w:rPr>
-          <w:b/>
-          <w:bCs/>
-        </w:rPr>
-        <w:t xml:space="preserve">secret link token</w:t>
-      </w:r>
-      <w:r>
-        <w:t xml:space="preserve"> </w:t>
-      </w:r>
-      <w:r>
-        <w:t xml:space="preserve">so the contact can submit</w:t>
-      </w:r>
-      <w:r>
-        <w:t xml:space="preserve"> </w:t>
-      </w:r>
-      <w:r>
-        <w:rPr>
-          <w:b/>
-          <w:bCs/>
-        </w:rPr>
-        <w:t xml:space="preserve">without a Paper account</w:t>
-      </w:r>
-      <w:r>
-        <w:t xml:space="preserve"> </w:t>
-      </w:r>
-      <w:r>
-        <w:t xml:space="preserve">via a public page (</w:t>
-      </w:r>
-      <w:r>
-        <w:rPr>
-          <w:rStyle w:val="VerbatimChar"/>
-        </w:rPr>
-        <w:t xml:space="preserve">/submit-kpis/{token}</w:t>
-      </w:r>
-      <w:r>
-        <w:t xml:space="preserve"> </w:t>
-      </w:r>
-      <w:r>
-        <w:t xml:space="preserve">→</w:t>
-      </w:r>
-      <w:r>
-        <w:t xml:space="preserve"> </w:t>
-      </w:r>
-      <w:r>
-        <w:rPr>
-          <w:rStyle w:val="VerbatimChar"/>
-        </w:rPr>
-        <w:t xml:space="preserve">GET/POST /public/kpi-requests/{token}[/submit]</w:t>
-      </w:r>
-      <w:r>
-        <w:t xml:space="preserve">, 404 unknown token, 409 resubmit) — Visible's "frictionless founder experience".</w:t>
-      </w:r>
-      <w:r>
-        <w:t xml:space="preserve"> </w:t>
-      </w:r>
-      <w:r>
-        <w:rPr>
-          <w:rStyle w:val="VerbatimChar"/>
-        </w:rPr>
-        <w:t xml:space="preserve">GET /funds/{id}/kpi-schedules</w:t>
+        <w:t xml:space="preserve">Remaining:</w:t>
+      </w:r>
+      <w:r>
+        <w:t xml:space="preserve"> </w:t>
+      </w:r>
+      <w:r>
+        <w:t xml:space="preserve">notification digests.</w:t>
+      </w:r>
+    </w:p>
+    <w:p>
+      <w:pPr>
+        <w:pStyle w:val="Compact"/>
+        <w:numPr>
+          <w:ilvl w:val="0"/>
+          <w:numId w:val="1013"/>
+        </w:numPr>
+      </w:pPr>
+      <w:r>
+        <w:rPr>
+          <w:b/>
+          <w:bCs/>
+        </w:rPr>
+        <w:t xml:space="preserve">FR-J-19 (M — added v1.7, Vestberry gap)</w:t>
+      </w:r>
+      <w:r>
+        <w:t xml:space="preserve"> </w:t>
+      </w:r>
+      <w:r>
+        <w:t xml:space="preserve">✅</w:t>
+      </w:r>
+      <w:r>
+        <w:t xml:space="preserve"> </w:t>
+      </w:r>
+      <w:r>
+        <w:rPr>
+          <w:b/>
+          <w:bCs/>
+        </w:rPr>
+        <w:t xml:space="preserve">KPI reporting requests (investee self-service)</w:t>
+      </w:r>
+      <w:r>
+        <w:t xml:space="preserve">: the GP asks each portfolio company's</w:t>
+      </w:r>
+      <w:r>
+        <w:t xml:space="preserve"> </w:t>
+      </w:r>
+      <w:r>
+        <w:rPr>
+          <w:b/>
+          <w:bCs/>
+        </w:rPr>
+        <w:t xml:space="preserve">reporting contact</w:t>
+      </w:r>
+      <w:r>
+        <w:t xml:space="preserve"> </w:t>
+      </w:r>
+      <w:r>
+        <w:t xml:space="preserve">(email stored on the investment) for a KPI period; the contact sees the request in</w:t>
+      </w:r>
+      <w:r>
+        <w:t xml:space="preserve"> </w:t>
+      </w:r>
+      <w:r>
+        <w:rPr>
+          <w:b/>
+          <w:bCs/>
+        </w:rPr>
+        <w:t xml:space="preserve">their portal</w:t>
+      </w:r>
+      <w:r>
+        <w:t xml:space="preserve"> </w:t>
+      </w:r>
+      <w:r>
+        <w:t xml:space="preserve">(plus an in-app notification if they have an account) with due date and overdue flag, submits revenue/cash/burn/headcount, and the GP</w:t>
+      </w:r>
+      <w:r>
+        <w:t xml:space="preserve"> </w:t>
+      </w:r>
+      <w:r>
+        <w:rPr>
+          <w:b/>
+          <w:bCs/>
+        </w:rPr>
+        <w:t xml:space="preserve">accepts</w:t>
+      </w:r>
+      <w:r>
+        <w:t xml:space="preserve"> </w:t>
+      </w:r>
+      <w:r>
+        <w:t xml:space="preserve">the submission into</w:t>
+      </w:r>
+      <w:r>
+        <w:t xml:space="preserve"> </w:t>
+      </w:r>
+      <w:r>
+        <w:rPr>
+          <w:rStyle w:val="VerbatimChar"/>
+        </w:rPr>
+        <w:t xml:space="preserve">PortfolioKPI</w:t>
+      </w:r>
+      <w:r>
+        <w:t xml:space="preserve"> </w:t>
+      </w:r>
+      <w:r>
+        <w:t xml:space="preserve">(or</w:t>
+      </w:r>
+      <w:r>
+        <w:t xml:space="preserve"> </w:t>
+      </w:r>
+      <w:r>
+        <w:rPr>
+          <w:b/>
+          <w:bCs/>
+        </w:rPr>
+        <w:t xml:space="preserve">reopens</w:t>
+      </w:r>
+      <w:r>
+        <w:t xml:space="preserve"> </w:t>
+      </w:r>
+      <w:r>
+        <w:t xml:space="preserve">it for resubmission). Request lifecycle pending → submitted → accepted, email-scoped submission, 409 double-submit/accept guards.</w:t>
+      </w:r>
+      <w:r>
+        <w:t xml:space="preserve"> </w:t>
+      </w:r>
+      <w:r>
+        <w:rPr>
+          <w:rStyle w:val="VerbatimChar"/>
+        </w:rPr>
+        <w:t xml:space="preserve">POST /funds/{id}/portfolio/{iid}/kpi-requests</w:t>
       </w:r>
       <w:r>
         <w:t xml:space="preserve">,</w:t>
@@ -6854,19 +6752,31 @@
         <w:rPr>
           <w:rStyle w:val="VerbatimChar"/>
         </w:rPr>
-        <w:t xml:space="preserve">PUT/DELETE /funds/{id}/portfolio/{iid}/kpi-schedule</w:t>
-      </w:r>
-      <w:r>
-        <w:t xml:space="preserve">; "Make recurring" + schedule chips + per-request "Copy link" in</w:t>
-      </w:r>
-      <w:r>
-        <w:t xml:space="preserve"> </w:t>
-      </w:r>
-      <w:r>
-        <w:rPr>
-          <w:rStyle w:val="VerbatimChar"/>
-        </w:rPr>
-        <w:t xml:space="preserve">PortfolioMonitoring.tsx</w:t>
+        <w:t xml:space="preserve">GET /funds/{id}/kpi-requests</w:t>
+      </w:r>
+      <w:r>
+        <w:t xml:space="preserve">,</w:t>
+      </w:r>
+      <w:r>
+        <w:t xml:space="preserve"> </w:t>
+      </w:r>
+      <w:r>
+        <w:rPr>
+          <w:rStyle w:val="VerbatimChar"/>
+        </w:rPr>
+        <w:t xml:space="preserve">POST .../accept|reopen</w:t>
+      </w:r>
+      <w:r>
+        <w:t xml:space="preserve">, portal</w:t>
+      </w:r>
+      <w:r>
+        <w:t xml:space="preserve"> </w:t>
+      </w:r>
+      <w:r>
+        <w:rPr>
+          <w:rStyle w:val="VerbatimChar"/>
+        </w:rPr>
+        <w:t xml:space="preserve">POST /portal/kpi-requests/{id}/submit</w:t>
       </w:r>
       <w:r>
         <w:t xml:space="preserve">.</w:t>
@@ -6879,13 +6789,128 @@
           <w:i/>
           <w:iCs/>
         </w:rPr>
-        <w:t xml:space="preserve">Remaining:</w:t>
-      </w:r>
-      <w:r>
-        <w:t xml:space="preserve"> </w:t>
-      </w:r>
-      <w:r>
-        <w:t xml:space="preserve">custom-metric requests (see FR-J-23</w:t>
+        <w:t xml:space="preserve">(extended v1.7, Visible gap)</w:t>
+      </w:r>
+      <w:r>
+        <w:t xml:space="preserve"> </w:t>
+      </w:r>
+      <w:r>
+        <w:rPr>
+          <w:b/>
+          <w:bCs/>
+        </w:rPr>
+        <w:t xml:space="preserve">Recurring schedules + no-login submission</w:t>
+      </w:r>
+      <w:r>
+        <w:t xml:space="preserve">: a per-company</w:t>
+      </w:r>
+      <w:r>
+        <w:t xml:space="preserve"> </w:t>
+      </w:r>
+      <w:r>
+        <w:rPr>
+          <w:b/>
+          <w:bCs/>
+        </w:rPr>
+        <w:t xml:space="preserve">request cadence</w:t>
+      </w:r>
+      <w:r>
+        <w:t xml:space="preserve"> </w:t>
+      </w:r>
+      <w:r>
+        <w:t xml:space="preserve">(monthly / quarterly) materialised on read — opening the requests list creates the request for the last completed period if missing (idempotent; quarters labelled as Indian-FY quarters, due = period end + 14 days); and every request mints a</w:t>
+      </w:r>
+      <w:r>
+        <w:t xml:space="preserve"> </w:t>
+      </w:r>
+      <w:r>
+        <w:rPr>
+          <w:b/>
+          <w:bCs/>
+        </w:rPr>
+        <w:t xml:space="preserve">secret link token</w:t>
+      </w:r>
+      <w:r>
+        <w:t xml:space="preserve"> </w:t>
+      </w:r>
+      <w:r>
+        <w:t xml:space="preserve">so the contact can submit</w:t>
+      </w:r>
+      <w:r>
+        <w:t xml:space="preserve"> </w:t>
+      </w:r>
+      <w:r>
+        <w:rPr>
+          <w:b/>
+          <w:bCs/>
+        </w:rPr>
+        <w:t xml:space="preserve">without a Paper account</w:t>
+      </w:r>
+      <w:r>
+        <w:t xml:space="preserve"> </w:t>
+      </w:r>
+      <w:r>
+        <w:t xml:space="preserve">via a public page (</w:t>
+      </w:r>
+      <w:r>
+        <w:rPr>
+          <w:rStyle w:val="VerbatimChar"/>
+        </w:rPr>
+        <w:t xml:space="preserve">/submit-kpis/{token}</w:t>
+      </w:r>
+      <w:r>
+        <w:t xml:space="preserve"> </w:t>
+      </w:r>
+      <w:r>
+        <w:t xml:space="preserve">→</w:t>
+      </w:r>
+      <w:r>
+        <w:t xml:space="preserve"> </w:t>
+      </w:r>
+      <w:r>
+        <w:rPr>
+          <w:rStyle w:val="VerbatimChar"/>
+        </w:rPr>
+        <w:t xml:space="preserve">GET/POST /public/kpi-requests/{token}[/submit]</w:t>
+      </w:r>
+      <w:r>
+        <w:t xml:space="preserve">, 404 unknown token, 409 resubmit) — Visible's "frictionless founder experience".</w:t>
+      </w:r>
+      <w:r>
+        <w:t xml:space="preserve"> </w:t>
+      </w:r>
+      <w:r>
+        <w:rPr>
+          <w:rStyle w:val="VerbatimChar"/>
+        </w:rPr>
+        <w:t xml:space="preserve">GET /funds/{id}/kpi-schedules</w:t>
+      </w:r>
+      <w:r>
+        <w:t xml:space="preserve">,</w:t>
+      </w:r>
+      <w:r>
+        <w:t xml:space="preserve"> </w:t>
+      </w:r>
+      <w:r>
+        <w:rPr>
+          <w:rStyle w:val="VerbatimChar"/>
+        </w:rPr>
+        <w:t xml:space="preserve">PUT/DELETE /funds/{id}/portfolio/{iid}/kpi-schedule</w:t>
+      </w:r>
+      <w:r>
+        <w:t xml:space="preserve">; "Make recurring" + schedule chips + per-request "Copy link" in</w:t>
+      </w:r>
+      <w:r>
+        <w:t xml:space="preserve"> </w:t>
+      </w:r>
+      <w:r>
+        <w:rPr>
+          <w:rStyle w:val="VerbatimChar"/>
+        </w:rPr>
+        <w:t xml:space="preserve">PortfolioMonitoring.tsx</w:t>
+      </w:r>
+      <w:r>
+        <w:t xml:space="preserve">.</w:t>
       </w:r>
       <w:r>
         <w:t xml:space="preserve"> </w:t>
@@ -6895,146 +6920,13 @@
           <w:i/>
           <w:iCs/>
         </w:rPr>
-        <w:t xml:space="preserve">Remaining</w:t>
-      </w:r>
-      <w:r>
-        <w:t xml:space="preserve">).</w:t>
-      </w:r>
-    </w:p>
-    <w:p>
-      <w:pPr>
-        <w:pStyle w:val="Compact"/>
-        <w:numPr>
-          <w:ilvl w:val="0"/>
-          <w:numId w:val="1013"/>
-        </w:numPr>
-      </w:pPr>
-      <w:r>
-        <w:rPr>
-          <w:b/>
-          <w:bCs/>
-        </w:rPr>
-        <w:t xml:space="preserve">FR-J-18 (M — added v1.6, Carta fund gap)</w:t>
-      </w:r>
-      <w:r>
-        <w:t xml:space="preserve"> </w:t>
-      </w:r>
-      <w:r>
-        <w:t xml:space="preserve">✅</w:t>
-      </w:r>
-      <w:r>
-        <w:t xml:space="preserve"> </w:t>
-      </w:r>
-      <w:r>
-        <w:rPr>
-          <w:b/>
-          <w:bCs/>
-        </w:rPr>
-        <w:t xml:space="preserve">LP self-service — consolidated view + online capital-call notices</w:t>
-      </w:r>
-      <w:r>
-        <w:t xml:space="preserve">: the portal shows a</w:t>
-      </w:r>
-      <w:r>
-        <w:t xml:space="preserve"> </w:t>
-      </w:r>
-      <w:r>
-        <w:rPr>
-          <w:b/>
-          <w:bCs/>
-        </w:rPr>
-        <w:t xml:space="preserve">consolidated LP position across every fund</w:t>
-      </w:r>
-      <w:r>
-        <w:t xml:space="preserve"> </w:t>
-      </w:r>
-      <w:r>
-        <w:t xml:space="preserve">(committed / drawn / uncalled / distributed /</w:t>
-      </w:r>
-      <w:r>
-        <w:t xml:space="preserve"> </w:t>
-      </w:r>
-      <w:r>
-        <w:rPr>
-          <w:b/>
-          <w:bCs/>
-        </w:rPr>
-        <w:t xml:space="preserve">NAV of the LP's units</w:t>
-      </w:r>
-      <w:r>
-        <w:t xml:space="preserve"> </w:t>
-      </w:r>
-      <w:r>
-        <w:t xml:space="preserve">via the unitised model / pending-call count) and, per fund, the LP's</w:t>
-      </w:r>
-      <w:r>
-        <w:t xml:space="preserve"> </w:t>
-      </w:r>
-      <w:r>
-        <w:rPr>
-          <w:b/>
-          <w:bCs/>
-        </w:rPr>
-        <w:t xml:space="preserve">capital-call notices</w:t>
-      </w:r>
-      <w:r>
-        <w:t xml:space="preserve"> </w:t>
-      </w:r>
-      <w:r>
-        <w:t xml:space="preserve">(call no., purpose, due date, amount, paid / pending /</w:t>
-      </w:r>
-      <w:r>
-        <w:t xml:space="preserve"> </w:t>
-      </w:r>
-      <w:r>
-        <w:rPr>
-          <w:b/>
-          <w:bCs/>
-        </w:rPr>
-        <w:t xml:space="preserve">overdue</w:t>
-      </w:r>
-      <w:r>
-        <w:t xml:space="preserve"> </w:t>
-      </w:r>
-      <w:r>
-        <w:t xml:space="preserve">status) which the LP can</w:t>
-      </w:r>
-      <w:r>
-        <w:t xml:space="preserve"> </w:t>
-      </w:r>
-      <w:r>
-        <w:rPr>
-          <w:b/>
-          <w:bCs/>
-        </w:rPr>
-        <w:t xml:space="preserve">acknowledge</w:t>
-      </w:r>
-      <w:r>
-        <w:t xml:space="preserve"> </w:t>
-      </w:r>
-      <w:r>
-        <w:t xml:space="preserve">online (idempotent, email-scoped); the GP sees acknowledgement status per notice in the Fund workspace (</w:t>
-      </w:r>
-      <w:r>
-        <w:rPr>
-          <w:rStyle w:val="VerbatimChar"/>
-        </w:rPr>
-        <w:t xml:space="preserve">drawdown_notices.acknowledged_at</w:t>
-      </w:r>
-      <w:r>
-        <w:t xml:space="preserve">).</w:t>
-      </w:r>
-      <w:r>
-        <w:t xml:space="preserve"> </w:t>
-      </w:r>
-      <w:r>
-        <w:rPr>
-          <w:rStyle w:val="VerbatimChar"/>
-        </w:rPr>
-        <w:t xml:space="preserve">POST /portal/notices/{id}/ack</w:t>
-      </w:r>
-      <w:r>
-        <w:t xml:space="preserve">.</w:t>
+        <w:t xml:space="preserve">Remaining:</w:t>
+      </w:r>
+      <w:r>
+        <w:t xml:space="preserve"> </w:t>
+      </w:r>
+      <w:r>
+        <w:t xml:space="preserve">custom-metric requests (see FR-J-23</w:t>
       </w:r>
       <w:r>
         <w:t xml:space="preserve"> </w:t>
@@ -7044,13 +6936,10 @@
           <w:i/>
           <w:iCs/>
         </w:rPr>
-        <w:t xml:space="preserve">Explicitly out of scope (integration-blocked):</w:t>
-      </w:r>
-      <w:r>
-        <w:t xml:space="preserve"> </w:t>
-      </w:r>
-      <w:r>
-        <w:t xml:space="preserve">money movement — collecting drawdowns / paying distributions via NACH/UPI needs live payment rails.</w:t>
+        <w:t xml:space="preserve">Remaining</w:t>
+      </w:r>
+      <w:r>
+        <w:t xml:space="preserve">).</w:t>
       </w:r>
     </w:p>
     <w:p>
@@ -7066,7 +6955,7 @@
           <w:b/>
           <w:bCs/>
         </w:rPr>
-        <w:t xml:space="preserve">FR-J-17 (M — added v1.6, Carta fund gap; extended v1.7, 4Degrees gaps)</w:t>
+        <w:t xml:space="preserve">FR-J-18 (M — added v1.6, Carta fund gap)</w:t>
       </w:r>
       <w:r>
         <w:t xml:space="preserve"> </w:t>
@@ -7082,177 +6971,108 @@
           <w:b/>
           <w:bCs/>
         </w:rPr>
-        <w:t xml:space="preserve">Deal-CRM depth</w:t>
-      </w:r>
-      <w:r>
-        <w:t xml:space="preserve">: relationship intelligence on the deal pipeline — per-deal</w:t>
-      </w:r>
-      <w:r>
-        <w:t xml:space="preserve"> </w:t>
-      </w:r>
-      <w:r>
-        <w:rPr>
-          <w:b/>
-          <w:bCs/>
-        </w:rPr>
-        <w:t xml:space="preserve">contacts</w:t>
-      </w:r>
-      <w:r>
-        <w:t xml:space="preserve"> </w:t>
-      </w:r>
-      <w:r>
-        <w:t xml:space="preserve">(name, role, email) and a dated</w:t>
-      </w:r>
-      <w:r>
-        <w:t xml:space="preserve"> </w:t>
-      </w:r>
-      <w:r>
-        <w:rPr>
-          <w:b/>
-          <w:bCs/>
-        </w:rPr>
-        <w:t xml:space="preserve">activity timeline</w:t>
-      </w:r>
-      <w:r>
-        <w:t xml:space="preserve"> </w:t>
-      </w:r>
-      <w:r>
-        <w:t xml:space="preserve">(note / meeting / call / email, newest-first, append-only, kind icons), with activities optionally</w:t>
-      </w:r>
-      <w:r>
-        <w:t xml:space="preserve"> </w:t>
-      </w:r>
-      <w:r>
-        <w:rPr>
-          <w:b/>
-          <w:bCs/>
-        </w:rPr>
-        <w:t xml:space="preserve">attributed to a contact</w:t>
-      </w:r>
-      <w:r>
-        <w:t xml:space="preserve">. Derived</w:t>
-      </w:r>
-      <w:r>
-        <w:t xml:space="preserve"> </w:t>
-      </w:r>
-      <w:r>
-        <w:rPr>
-          <w:b/>
-          <w:bCs/>
-        </w:rPr>
-        <w:t xml:space="preserve">relationship strength</w:t>
-      </w:r>
-      <w:r>
-        <w:t xml:space="preserve"> </w:t>
-      </w:r>
-      <w:r>
-        <w:t xml:space="preserve">(0–100, rules-based: touch frequency + recency over 6 months) per deal and per contact, shown as mini pies.</w:t>
-      </w:r>
-      <w:r>
-        <w:t xml:space="preserve"> </w:t>
-      </w:r>
-      <w:r>
-        <w:rPr>
-          <w:b/>
-          <w:bCs/>
-        </w:rPr>
-        <w:t xml:space="preserve">Deal source</w:t>
-      </w:r>
-      <w:r>
-        <w:t xml:space="preserve"> </w:t>
-      </w:r>
-      <w:r>
-        <w:t xml:space="preserve">(who referred it) feeds a top-deal-sources chart;</w:t>
-      </w:r>
-      <w:r>
-        <w:t xml:space="preserve"> </w:t>
-      </w:r>
-      <w:r>
-        <w:rPr>
-          <w:b/>
-          <w:bCs/>
-        </w:rPr>
-        <w:t xml:space="preserve">follow-up reminders</w:t>
-      </w:r>
-      <w:r>
-        <w:t xml:space="preserve"> </w:t>
-      </w:r>
-      <w:r>
-        <w:t xml:space="preserve">(</w:t>
-      </w:r>
-      <w:r>
-        <w:rPr>
-          <w:rStyle w:val="VerbatimChar"/>
-        </w:rPr>
-        <w:t xml:space="preserve">next_followup_on</w:t>
-      </w:r>
-      <w:r>
-        <w:t xml:space="preserve">) flag overdue deals in the pipeline and surface red in the entity Tasks hub. The pipeline renders as a</w:t>
-      </w:r>
-      <w:r>
-        <w:t xml:space="preserve"> </w:t>
-      </w:r>
-      <w:r>
-        <w:rPr>
-          <w:b/>
-          <w:bCs/>
-        </w:rPr>
-        <w:t xml:space="preserve">kanban board</w:t>
-      </w:r>
-      <w:r>
-        <w:t xml:space="preserve"> </w:t>
-      </w:r>
-      <w:r>
-        <w:t xml:space="preserve">(stage columns, cards with sector chip, cheque, contact avatars; Board/Table toggle) with a</w:t>
-      </w:r>
-      <w:r>
-        <w:t xml:space="preserve"> </w:t>
-      </w:r>
-      <w:r>
-        <w:rPr>
-          <w:b/>
-          <w:bCs/>
-        </w:rPr>
-        <w:t xml:space="preserve">pipeline analytics</w:t>
-      </w:r>
-      <w:r>
-        <w:t xml:space="preserve"> </w:t>
-      </w:r>
-      <w:r>
-        <w:t xml:space="preserve">snapshot (deals-by-stage columns w/ counts + value, sector donut, top active deals, top sources).</w:t>
-      </w:r>
-      <w:r>
-        <w:t xml:space="preserve"> </w:t>
-      </w:r>
-      <w:r>
-        <w:rPr>
-          <w:rStyle w:val="VerbatimChar"/>
-        </w:rPr>
-        <w:t xml:space="preserve">GET /deals/{id}/crm</w:t>
-      </w:r>
-      <w:r>
-        <w:t xml:space="preserve">,</w:t>
-      </w:r>
-      <w:r>
-        <w:t xml:space="preserve"> </w:t>
-      </w:r>
-      <w:r>
-        <w:rPr>
-          <w:rStyle w:val="VerbatimChar"/>
-        </w:rPr>
-        <w:t xml:space="preserve">POST /deals/{id}/contacts|activities</w:t>
-      </w:r>
-      <w:r>
-        <w:t xml:space="preserve">,</w:t>
-      </w:r>
-      <w:r>
-        <w:t xml:space="preserve"> </w:t>
-      </w:r>
-      <w:r>
-        <w:rPr>
-          <w:rStyle w:val="VerbatimChar"/>
-        </w:rPr>
-        <w:t xml:space="preserve">PUT /deals/{id}/followup</w:t>
+        <w:t xml:space="preserve">LP self-service — consolidated view + online capital-call notices</w:t>
+      </w:r>
+      <w:r>
+        <w:t xml:space="preserve">: the portal shows a</w:t>
+      </w:r>
+      <w:r>
+        <w:t xml:space="preserve"> </w:t>
+      </w:r>
+      <w:r>
+        <w:rPr>
+          <w:b/>
+          <w:bCs/>
+        </w:rPr>
+        <w:t xml:space="preserve">consolidated LP position across every fund</w:t>
+      </w:r>
+      <w:r>
+        <w:t xml:space="preserve"> </w:t>
+      </w:r>
+      <w:r>
+        <w:t xml:space="preserve">(committed / drawn / uncalled / distributed /</w:t>
+      </w:r>
+      <w:r>
+        <w:t xml:space="preserve"> </w:t>
+      </w:r>
+      <w:r>
+        <w:rPr>
+          <w:b/>
+          <w:bCs/>
+        </w:rPr>
+        <w:t xml:space="preserve">NAV of the LP's units</w:t>
+      </w:r>
+      <w:r>
+        <w:t xml:space="preserve"> </w:t>
+      </w:r>
+      <w:r>
+        <w:t xml:space="preserve">via the unitised model / pending-call count) and, per fund, the LP's</w:t>
+      </w:r>
+      <w:r>
+        <w:t xml:space="preserve"> </w:t>
+      </w:r>
+      <w:r>
+        <w:rPr>
+          <w:b/>
+          <w:bCs/>
+        </w:rPr>
+        <w:t xml:space="preserve">capital-call notices</w:t>
+      </w:r>
+      <w:r>
+        <w:t xml:space="preserve"> </w:t>
+      </w:r>
+      <w:r>
+        <w:t xml:space="preserve">(call no., purpose, due date, amount, paid / pending /</w:t>
+      </w:r>
+      <w:r>
+        <w:t xml:space="preserve"> </w:t>
+      </w:r>
+      <w:r>
+        <w:rPr>
+          <w:b/>
+          <w:bCs/>
+        </w:rPr>
+        <w:t xml:space="preserve">overdue</w:t>
+      </w:r>
+      <w:r>
+        <w:t xml:space="preserve"> </w:t>
+      </w:r>
+      <w:r>
+        <w:t xml:space="preserve">status) which the LP can</w:t>
+      </w:r>
+      <w:r>
+        <w:t xml:space="preserve"> </w:t>
+      </w:r>
+      <w:r>
+        <w:rPr>
+          <w:b/>
+          <w:bCs/>
+        </w:rPr>
+        <w:t xml:space="preserve">acknowledge</w:t>
+      </w:r>
+      <w:r>
+        <w:t xml:space="preserve"> </w:t>
+      </w:r>
+      <w:r>
+        <w:t xml:space="preserve">online (idempotent, email-scoped); the GP sees acknowledgement status per notice in the Fund workspace (</w:t>
+      </w:r>
+      <w:r>
+        <w:rPr>
+          <w:rStyle w:val="VerbatimChar"/>
+        </w:rPr>
+        <w:t xml:space="preserve">drawdown_notices.acknowledged_at</w:t>
+      </w:r>
+      <w:r>
+        <w:t xml:space="preserve">).</w:t>
+      </w:r>
+      <w:r>
+        <w:t xml:space="preserve"> </w:t>
+      </w:r>
+      <w:r>
+        <w:rPr>
+          <w:rStyle w:val="VerbatimChar"/>
+        </w:rPr>
+        <w:t xml:space="preserve">POST /portal/notices/{id}/ack</w:t>
       </w:r>
       <w:r>
         <w:t xml:space="preserve">.</w:t>
@@ -7265,13 +7085,13 @@
           <w:i/>
           <w:iCs/>
         </w:rPr>
-        <w:t xml:space="preserve">Remaining (integration-blocked, by design):</w:t>
-      </w:r>
-      <w:r>
-        <w:t xml:space="preserve"> </w:t>
-      </w:r>
-      <w:r>
-        <w:t xml:space="preserve">email/calendar sync, LinkedIn capture, data enrichment; relationship-path mapping across deals.</w:t>
+        <w:t xml:space="preserve">Explicitly out of scope (integration-blocked):</w:t>
+      </w:r>
+      <w:r>
+        <w:t xml:space="preserve"> </w:t>
+      </w:r>
+      <w:r>
+        <w:t xml:space="preserve">money movement — collecting drawdowns / paying distributions via NACH/UPI needs live payment rails.</w:t>
       </w:r>
     </w:p>
     <w:p>
@@ -7287,7 +7107,7 @@
           <w:b/>
           <w:bCs/>
         </w:rPr>
-        <w:t xml:space="preserve">FR-J-16 (M — added v1.6, Carta fund gap)</w:t>
+        <w:t xml:space="preserve">FR-J-17 (M — added v1.6, Carta fund gap; extended v1.7, 4Degrees gaps)</w:t>
       </w:r>
       <w:r>
         <w:t xml:space="preserve"> </w:t>
@@ -7303,10 +7123,180 @@
           <w:b/>
           <w:bCs/>
         </w:rPr>
-        <w:t xml:space="preserve">LP-fundraising CRM</w:t>
-      </w:r>
-      <w:r>
-        <w:t xml:space="preserve">: the GP-side pipeline for raising the fund</w:t>
+        <w:t xml:space="preserve">Deal-CRM depth</w:t>
+      </w:r>
+      <w:r>
+        <w:t xml:space="preserve">: relationship intelligence on the deal pipeline — per-deal</w:t>
+      </w:r>
+      <w:r>
+        <w:t xml:space="preserve"> </w:t>
+      </w:r>
+      <w:r>
+        <w:rPr>
+          <w:b/>
+          <w:bCs/>
+        </w:rPr>
+        <w:t xml:space="preserve">contacts</w:t>
+      </w:r>
+      <w:r>
+        <w:t xml:space="preserve"> </w:t>
+      </w:r>
+      <w:r>
+        <w:t xml:space="preserve">(name, role, email) and a dated</w:t>
+      </w:r>
+      <w:r>
+        <w:t xml:space="preserve"> </w:t>
+      </w:r>
+      <w:r>
+        <w:rPr>
+          <w:b/>
+          <w:bCs/>
+        </w:rPr>
+        <w:t xml:space="preserve">activity timeline</w:t>
+      </w:r>
+      <w:r>
+        <w:t xml:space="preserve"> </w:t>
+      </w:r>
+      <w:r>
+        <w:t xml:space="preserve">(note / meeting / call / email, newest-first, append-only, kind icons), with activities optionally</w:t>
+      </w:r>
+      <w:r>
+        <w:t xml:space="preserve"> </w:t>
+      </w:r>
+      <w:r>
+        <w:rPr>
+          <w:b/>
+          <w:bCs/>
+        </w:rPr>
+        <w:t xml:space="preserve">attributed to a contact</w:t>
+      </w:r>
+      <w:r>
+        <w:t xml:space="preserve">. Derived</w:t>
+      </w:r>
+      <w:r>
+        <w:t xml:space="preserve"> </w:t>
+      </w:r>
+      <w:r>
+        <w:rPr>
+          <w:b/>
+          <w:bCs/>
+        </w:rPr>
+        <w:t xml:space="preserve">relationship strength</w:t>
+      </w:r>
+      <w:r>
+        <w:t xml:space="preserve"> </w:t>
+      </w:r>
+      <w:r>
+        <w:t xml:space="preserve">(0–100, rules-based: touch frequency + recency over 6 months) per deal and per contact, shown as mini pies.</w:t>
+      </w:r>
+      <w:r>
+        <w:t xml:space="preserve"> </w:t>
+      </w:r>
+      <w:r>
+        <w:rPr>
+          <w:b/>
+          <w:bCs/>
+        </w:rPr>
+        <w:t xml:space="preserve">Deal source</w:t>
+      </w:r>
+      <w:r>
+        <w:t xml:space="preserve"> </w:t>
+      </w:r>
+      <w:r>
+        <w:t xml:space="preserve">(who referred it) feeds a top-deal-sources chart;</w:t>
+      </w:r>
+      <w:r>
+        <w:t xml:space="preserve"> </w:t>
+      </w:r>
+      <w:r>
+        <w:rPr>
+          <w:b/>
+          <w:bCs/>
+        </w:rPr>
+        <w:t xml:space="preserve">follow-up reminders</w:t>
+      </w:r>
+      <w:r>
+        <w:t xml:space="preserve"> </w:t>
+      </w:r>
+      <w:r>
+        <w:t xml:space="preserve">(</w:t>
+      </w:r>
+      <w:r>
+        <w:rPr>
+          <w:rStyle w:val="VerbatimChar"/>
+        </w:rPr>
+        <w:t xml:space="preserve">next_followup_on</w:t>
+      </w:r>
+      <w:r>
+        <w:t xml:space="preserve">) flag overdue deals in the pipeline and surface red in the entity Tasks hub. The pipeline renders as a</w:t>
+      </w:r>
+      <w:r>
+        <w:t xml:space="preserve"> </w:t>
+      </w:r>
+      <w:r>
+        <w:rPr>
+          <w:b/>
+          <w:bCs/>
+        </w:rPr>
+        <w:t xml:space="preserve">kanban board</w:t>
+      </w:r>
+      <w:r>
+        <w:t xml:space="preserve"> </w:t>
+      </w:r>
+      <w:r>
+        <w:t xml:space="preserve">(stage columns, cards with sector chip, cheque, contact avatars; Board/Table toggle) with a</w:t>
+      </w:r>
+      <w:r>
+        <w:t xml:space="preserve"> </w:t>
+      </w:r>
+      <w:r>
+        <w:rPr>
+          <w:b/>
+          <w:bCs/>
+        </w:rPr>
+        <w:t xml:space="preserve">pipeline analytics</w:t>
+      </w:r>
+      <w:r>
+        <w:t xml:space="preserve"> </w:t>
+      </w:r>
+      <w:r>
+        <w:t xml:space="preserve">snapshot (deals-by-stage columns w/ counts + value, sector donut, top active deals, top sources).</w:t>
+      </w:r>
+      <w:r>
+        <w:t xml:space="preserve"> </w:t>
+      </w:r>
+      <w:r>
+        <w:rPr>
+          <w:rStyle w:val="VerbatimChar"/>
+        </w:rPr>
+        <w:t xml:space="preserve">GET /deals/{id}/crm</w:t>
+      </w:r>
+      <w:r>
+        <w:t xml:space="preserve">,</w:t>
+      </w:r>
+      <w:r>
+        <w:t xml:space="preserve"> </w:t>
+      </w:r>
+      <w:r>
+        <w:rPr>
+          <w:rStyle w:val="VerbatimChar"/>
+        </w:rPr>
+        <w:t xml:space="preserve">POST /deals/{id}/contacts|activities</w:t>
+      </w:r>
+      <w:r>
+        <w:t xml:space="preserve">,</w:t>
+      </w:r>
+      <w:r>
+        <w:t xml:space="preserve"> </w:t>
+      </w:r>
+      <w:r>
+        <w:rPr>
+          <w:rStyle w:val="VerbatimChar"/>
+        </w:rPr>
+        <w:t xml:space="preserve">PUT /deals/{id}/followup</w:t>
+      </w:r>
+      <w:r>
+        <w:t xml:space="preserve">.</w:t>
       </w:r>
       <w:r>
         <w:t xml:space="preserve"> </w:t>
@@ -7316,108 +7306,48 @@
           <w:i/>
           <w:iCs/>
         </w:rPr>
-        <w:t xml:space="preserve">from</w:t>
-      </w:r>
-      <w:r>
-        <w:t xml:space="preserve"> </w:t>
-      </w:r>
-      <w:r>
-        <w:t xml:space="preserve">prospective LPs (distinct from the deal pipeline, which deploys capital). Prospects carry firm, kind (institutional / family office / HNI / fund-of-funds), target cheque and a stage (prospect → contacted → meeting → diligence → soft-circled → committed / passed);</w:t>
-      </w:r>
-      <w:r>
-        <w:t xml:space="preserve"> </w:t>
-      </w:r>
-      <w:r>
-        <w:rPr>
-          <w:b/>
-          <w:bCs/>
-        </w:rPr>
-        <w:t xml:space="preserve">converting</w:t>
-      </w:r>
-      <w:r>
-        <w:t xml:space="preserve"> </w:t>
-      </w:r>
-      <w:r>
-        <w:t xml:space="preserve">a won prospect creates an</w:t>
-      </w:r>
-      <w:r>
-        <w:t xml:space="preserve"> </w:t>
-      </w:r>
-      <w:r>
-        <w:rPr>
-          <w:rStyle w:val="VerbatimChar"/>
-        </w:rPr>
-        <w:t xml:space="preserve">LP</w:t>
-      </w:r>
-      <w:r>
-        <w:t xml:space="preserve"> </w:t>
-      </w:r>
-      <w:r>
-        <w:t xml:space="preserve">with their commitment (idempotent-guarded). A fundraise summary shows committed (actual LP capital) vs</w:t>
-      </w:r>
-      <w:r>
-        <w:t xml:space="preserve"> </w:t>
-      </w:r>
-      <w:r>
-        <w:rPr>
-          <w:b/>
-          <w:bCs/>
-        </w:rPr>
-        <w:t xml:space="preserve">target corpus</w:t>
-      </w:r>
-      <w:r>
-        <w:t xml:space="preserve"> </w:t>
-      </w:r>
-      <w:r>
-        <w:t xml:space="preserve">with progress, soft-circled and active-pipeline totals, and a per-stage breakdown.</w:t>
-      </w:r>
-      <w:r>
-        <w:t xml:space="preserve"> </w:t>
-      </w:r>
-      <w:r>
-        <w:rPr>
-          <w:rStyle w:val="VerbatimChar"/>
-        </w:rPr>
-        <w:t xml:space="preserve">GET /funds/{id}/fundraise</w:t>
-      </w:r>
-      <w:r>
-        <w:t xml:space="preserve">,</w:t>
-      </w:r>
-      <w:r>
-        <w:t xml:space="preserve"> </w:t>
-      </w:r>
-      <w:r>
-        <w:rPr>
-          <w:rStyle w:val="VerbatimChar"/>
-        </w:rPr>
-        <w:t xml:space="preserve">POST /funds/{id}/prospects</w:t>
-      </w:r>
-      <w:r>
-        <w:t xml:space="preserve">,</w:t>
-      </w:r>
-      <w:r>
-        <w:t xml:space="preserve"> </w:t>
-      </w:r>
-      <w:r>
-        <w:rPr>
-          <w:rStyle w:val="VerbatimChar"/>
-        </w:rPr>
-        <w:t xml:space="preserve">POST /funds/{id}/prospects/{pid}/stage</w:t>
-      </w:r>
-      <w:r>
-        <w:t xml:space="preserve">,</w:t>
-      </w:r>
-      <w:r>
-        <w:t xml:space="preserve"> </w:t>
-      </w:r>
-      <w:r>
-        <w:rPr>
-          <w:rStyle w:val="VerbatimChar"/>
-        </w:rPr>
-        <w:t xml:space="preserve">POST /funds/{id}/prospects/{pid}/convert</w:t>
-      </w:r>
-      <w:r>
-        <w:t xml:space="preserve">.</w:t>
+        <w:t xml:space="preserve">Remaining (integration-blocked, by design):</w:t>
+      </w:r>
+      <w:r>
+        <w:t xml:space="preserve"> </w:t>
+      </w:r>
+      <w:r>
+        <w:t xml:space="preserve">email/calendar sync, LinkedIn capture, data enrichment; relationship-path mapping across deals.</w:t>
+      </w:r>
+    </w:p>
+    <w:p>
+      <w:pPr>
+        <w:pStyle w:val="Compact"/>
+        <w:numPr>
+          <w:ilvl w:val="0"/>
+          <w:numId w:val="1013"/>
+        </w:numPr>
+      </w:pPr>
+      <w:r>
+        <w:rPr>
+          <w:b/>
+          <w:bCs/>
+        </w:rPr>
+        <w:t xml:space="preserve">FR-J-16 (M — added v1.6, Carta fund gap)</w:t>
+      </w:r>
+      <w:r>
+        <w:t xml:space="preserve"> </w:t>
+      </w:r>
+      <w:r>
+        <w:t xml:space="preserve">✅</w:t>
+      </w:r>
+      <w:r>
+        <w:t xml:space="preserve"> </w:t>
+      </w:r>
+      <w:r>
+        <w:rPr>
+          <w:b/>
+          <w:bCs/>
+        </w:rPr>
+        <w:t xml:space="preserve">LP-fundraising CRM</w:t>
+      </w:r>
+      <w:r>
+        <w:t xml:space="preserve">: the GP-side pipeline for raising the fund</w:t>
       </w:r>
       <w:r>
         <w:t xml:space="preserve"> </w:t>
@@ -7427,85 +7357,69 @@
           <w:i/>
           <w:iCs/>
         </w:rPr>
-        <w:t xml:space="preserve">Extended v1.7 (4Degrees gap):</w:t>
-      </w:r>
-      <w:r>
-        <w:t xml:space="preserve"> </w:t>
-      </w:r>
-      <w:r>
-        <w:t xml:space="preserve">per-prospect</w:t>
-      </w:r>
-      <w:r>
-        <w:t xml:space="preserve"> </w:t>
-      </w:r>
-      <w:r>
-        <w:rPr>
-          <w:b/>
-          <w:bCs/>
-        </w:rPr>
-        <w:t xml:space="preserve">CRM depth</w:t>
-      </w:r>
-      <w:r>
-        <w:t xml:space="preserve"> </w:t>
-      </w:r>
-      <w:r>
-        <w:t xml:space="preserve">mirroring the deal pipeline — dated activity timeline (</w:t>
-      </w:r>
-      <w:r>
-        <w:rPr>
-          <w:rStyle w:val="VerbatimChar"/>
-        </w:rPr>
-        <w:t xml:space="preserve">lp_prospect_activities</w:t>
-      </w:r>
-      <w:r>
-        <w:t xml:space="preserve">), derived</w:t>
-      </w:r>
-      <w:r>
-        <w:t xml:space="preserve"> </w:t>
-      </w:r>
-      <w:r>
-        <w:rPr>
-          <w:b/>
-          <w:bCs/>
-        </w:rPr>
-        <w:t xml:space="preserve">relationship strength</w:t>
-      </w:r>
-      <w:r>
-        <w:t xml:space="preserve">, and</w:t>
-      </w:r>
-      <w:r>
-        <w:t xml:space="preserve"> </w:t>
-      </w:r>
-      <w:r>
-        <w:rPr>
-          <w:b/>
-          <w:bCs/>
-        </w:rPr>
-        <w:t xml:space="preserve">follow-up reminders</w:t>
-      </w:r>
-      <w:r>
-        <w:t xml:space="preserve"> </w:t>
-      </w:r>
-      <w:r>
-        <w:t xml:space="preserve">(</w:t>
-      </w:r>
-      <w:r>
-        <w:rPr>
-          <w:rStyle w:val="VerbatimChar"/>
-        </w:rPr>
-        <w:t xml:space="preserve">lp_prospects.next_followup_on</w:t>
-      </w:r>
-      <w:r>
-        <w:t xml:space="preserve">; overdue → 🔔 in the pipeline + red Tasks-hub entry, cleared by converting).</w:t>
-      </w:r>
-      <w:r>
-        <w:t xml:space="preserve"> </w:t>
-      </w:r>
-      <w:r>
-        <w:rPr>
-          <w:rStyle w:val="VerbatimChar"/>
-        </w:rPr>
-        <w:t xml:space="preserve">GET/POST .../prospects/{pid}/crm|activities</w:t>
+        <w:t xml:space="preserve">from</w:t>
+      </w:r>
+      <w:r>
+        <w:t xml:space="preserve"> </w:t>
+      </w:r>
+      <w:r>
+        <w:t xml:space="preserve">prospective LPs (distinct from the deal pipeline, which deploys capital). Prospects carry firm, kind (institutional / family office / HNI / fund-of-funds), target cheque and a stage (prospect → contacted → meeting → diligence → soft-circled → committed / passed);</w:t>
+      </w:r>
+      <w:r>
+        <w:t xml:space="preserve"> </w:t>
+      </w:r>
+      <w:r>
+        <w:rPr>
+          <w:b/>
+          <w:bCs/>
+        </w:rPr>
+        <w:t xml:space="preserve">converting</w:t>
+      </w:r>
+      <w:r>
+        <w:t xml:space="preserve"> </w:t>
+      </w:r>
+      <w:r>
+        <w:t xml:space="preserve">a won prospect creates an</w:t>
+      </w:r>
+      <w:r>
+        <w:t xml:space="preserve"> </w:t>
+      </w:r>
+      <w:r>
+        <w:rPr>
+          <w:rStyle w:val="VerbatimChar"/>
+        </w:rPr>
+        <w:t xml:space="preserve">LP</w:t>
+      </w:r>
+      <w:r>
+        <w:t xml:space="preserve"> </w:t>
+      </w:r>
+      <w:r>
+        <w:t xml:space="preserve">with their commitment (idempotent-guarded). A fundraise summary shows committed (actual LP capital) vs</w:t>
+      </w:r>
+      <w:r>
+        <w:t xml:space="preserve"> </w:t>
+      </w:r>
+      <w:r>
+        <w:rPr>
+          <w:b/>
+          <w:bCs/>
+        </w:rPr>
+        <w:t xml:space="preserve">target corpus</w:t>
+      </w:r>
+      <w:r>
+        <w:t xml:space="preserve"> </w:t>
+      </w:r>
+      <w:r>
+        <w:t xml:space="preserve">with progress, soft-circled and active-pipeline totals, and a per-stage breakdown.</w:t>
+      </w:r>
+      <w:r>
+        <w:t xml:space="preserve"> </w:t>
+      </w:r>
+      <w:r>
+        <w:rPr>
+          <w:rStyle w:val="VerbatimChar"/>
+        </w:rPr>
+        <w:t xml:space="preserve">GET /funds/{id}/fundraise</w:t>
       </w:r>
       <w:r>
         <w:t xml:space="preserve">,</w:t>
@@ -7517,7 +7431,31 @@
         <w:rPr>
           <w:rStyle w:val="VerbatimChar"/>
         </w:rPr>
-        <w:t xml:space="preserve">PUT .../followup</w:t>
+        <w:t xml:space="preserve">POST /funds/{id}/prospects</w:t>
+      </w:r>
+      <w:r>
+        <w:t xml:space="preserve">,</w:t>
+      </w:r>
+      <w:r>
+        <w:t xml:space="preserve"> </w:t>
+      </w:r>
+      <w:r>
+        <w:rPr>
+          <w:rStyle w:val="VerbatimChar"/>
+        </w:rPr>
+        <w:t xml:space="preserve">POST /funds/{id}/prospects/{pid}/stage</w:t>
+      </w:r>
+      <w:r>
+        <w:t xml:space="preserve">,</w:t>
+      </w:r>
+      <w:r>
+        <w:t xml:space="preserve"> </w:t>
+      </w:r>
+      <w:r>
+        <w:rPr>
+          <w:rStyle w:val="VerbatimChar"/>
+        </w:rPr>
+        <w:t xml:space="preserve">POST /funds/{id}/prospects/{pid}/convert</w:t>
       </w:r>
       <w:r>
         <w:t xml:space="preserve">.</w:t>
@@ -7530,120 +7468,85 @@
           <w:i/>
           <w:iCs/>
         </w:rPr>
-        <w:t xml:space="preserve">Remaining:</w:t>
-      </w:r>
-      <w:r>
-        <w:t xml:space="preserve"> </w:t>
-      </w:r>
-      <w:r>
-        <w:t xml:space="preserve">per-prospect documents; email capture.</w:t>
-      </w:r>
-    </w:p>
-    <w:p>
-      <w:pPr>
-        <w:pStyle w:val="Compact"/>
-        <w:numPr>
-          <w:ilvl w:val="0"/>
-          <w:numId w:val="1013"/>
-        </w:numPr>
-      </w:pPr>
-      <w:r>
-        <w:rPr>
-          <w:b/>
-          <w:bCs/>
-        </w:rPr>
-        <w:t xml:space="preserve">FR-J-15 (M — added v1.6, Carta fund gap)</w:t>
-      </w:r>
-      <w:r>
-        <w:t xml:space="preserve"> </w:t>
-      </w:r>
-      <w:r>
-        <w:t xml:space="preserve">✅</w:t>
-      </w:r>
-      <w:r>
-        <w:t xml:space="preserve"> </w:t>
-      </w:r>
-      <w:r>
-        <w:rPr>
-          <w:b/>
-          <w:bCs/>
-        </w:rPr>
-        <w:t xml:space="preserve">SEBI-compliant independent portfolio valuation</w:t>
-      </w:r>
-      <w:r>
-        <w:t xml:space="preserve">: a fund</w:t>
-      </w:r>
-      <w:r>
-        <w:t xml:space="preserve"> </w:t>
-      </w:r>
-      <w:r>
-        <w:rPr>
-          <w:b/>
-          <w:bCs/>
-        </w:rPr>
-        <w:t xml:space="preserve">valuation policy</w:t>
-      </w:r>
-      <w:r>
-        <w:t xml:space="preserve"> </w:t>
-      </w:r>
-      <w:r>
-        <w:t xml:space="preserve">(appointed independent valuer + revaluation frequency in months) and per-holding</w:t>
-      </w:r>
-      <w:r>
-        <w:t xml:space="preserve"> </w:t>
-      </w:r>
-      <w:r>
-        <w:rPr>
-          <w:b/>
-          <w:bCs/>
-        </w:rPr>
-        <w:t xml:space="preserve">valuation records</w:t>
-      </w:r>
-      <w:r>
-        <w:t xml:space="preserve"> </w:t>
-      </w:r>
-      <w:r>
-        <w:t xml:space="preserve">(fair value, as-of, methodology — IPEV market/recent-txn, DCF, NAV, cost — valuer, independence flag, note; append-only history, latest by as-of becomes the holding's mark so NAV/SoI/performance stay in sync). A valuation dashboard flags holdings</w:t>
-      </w:r>
-      <w:r>
-        <w:t xml:space="preserve"> </w:t>
-      </w:r>
-      <w:r>
-        <w:rPr>
-          <w:b/>
-          <w:bCs/>
-        </w:rPr>
-        <w:t xml:space="preserve">stale</w:t>
-      </w:r>
-      <w:r>
-        <w:t xml:space="preserve"> </w:t>
-      </w:r>
-      <w:r>
-        <w:t xml:space="preserve">against the policy frequency, rolls up valued/independent/stale counts, and generates a</w:t>
-      </w:r>
-      <w:r>
-        <w:t xml:space="preserve"> </w:t>
-      </w:r>
-      <w:r>
-        <w:rPr>
-          <w:rStyle w:val="VerbatimChar"/>
-        </w:rPr>
-        <w:t xml:space="preserve">fund_valuation</w:t>
-      </w:r>
-      <w:r>
-        <w:t xml:space="preserve"> </w:t>
-      </w:r>
-      <w:r>
-        <w:t xml:space="preserve">report document.</w:t>
-      </w:r>
-      <w:r>
-        <w:t xml:space="preserve"> </w:t>
-      </w:r>
-      <w:r>
-        <w:rPr>
-          <w:rStyle w:val="VerbatimChar"/>
-        </w:rPr>
-        <w:t xml:space="preserve">PUT /funds/{id}/valuation-policy</w:t>
+        <w:t xml:space="preserve">Extended v1.7 (4Degrees gap):</w:t>
+      </w:r>
+      <w:r>
+        <w:t xml:space="preserve"> </w:t>
+      </w:r>
+      <w:r>
+        <w:t xml:space="preserve">per-prospect</w:t>
+      </w:r>
+      <w:r>
+        <w:t xml:space="preserve"> </w:t>
+      </w:r>
+      <w:r>
+        <w:rPr>
+          <w:b/>
+          <w:bCs/>
+        </w:rPr>
+        <w:t xml:space="preserve">CRM depth</w:t>
+      </w:r>
+      <w:r>
+        <w:t xml:space="preserve"> </w:t>
+      </w:r>
+      <w:r>
+        <w:t xml:space="preserve">mirroring the deal pipeline — dated activity timeline (</w:t>
+      </w:r>
+      <w:r>
+        <w:rPr>
+          <w:rStyle w:val="VerbatimChar"/>
+        </w:rPr>
+        <w:t xml:space="preserve">lp_prospect_activities</w:t>
+      </w:r>
+      <w:r>
+        <w:t xml:space="preserve">), derived</w:t>
+      </w:r>
+      <w:r>
+        <w:t xml:space="preserve"> </w:t>
+      </w:r>
+      <w:r>
+        <w:rPr>
+          <w:b/>
+          <w:bCs/>
+        </w:rPr>
+        <w:t xml:space="preserve">relationship strength</w:t>
+      </w:r>
+      <w:r>
+        <w:t xml:space="preserve">, and</w:t>
+      </w:r>
+      <w:r>
+        <w:t xml:space="preserve"> </w:t>
+      </w:r>
+      <w:r>
+        <w:rPr>
+          <w:b/>
+          <w:bCs/>
+        </w:rPr>
+        <w:t xml:space="preserve">follow-up reminders</w:t>
+      </w:r>
+      <w:r>
+        <w:t xml:space="preserve"> </w:t>
+      </w:r>
+      <w:r>
+        <w:t xml:space="preserve">(</w:t>
+      </w:r>
+      <w:r>
+        <w:rPr>
+          <w:rStyle w:val="VerbatimChar"/>
+        </w:rPr>
+        <w:t xml:space="preserve">lp_prospects.next_followup_on</w:t>
+      </w:r>
+      <w:r>
+        <w:t xml:space="preserve">; overdue → 🔔 in the pipeline + red Tasks-hub entry, cleared by converting).</w:t>
+      </w:r>
+      <w:r>
+        <w:t xml:space="preserve"> </w:t>
+      </w:r>
+      <w:r>
+        <w:rPr>
+          <w:rStyle w:val="VerbatimChar"/>
+        </w:rPr>
+        <w:t xml:space="preserve">GET/POST .../prospects/{pid}/crm|activities</w:t>
       </w:r>
       <w:r>
         <w:t xml:space="preserve">,</w:t>
@@ -7655,34 +7558,10 @@
         <w:rPr>
           <w:rStyle w:val="VerbatimChar"/>
         </w:rPr>
-        <w:t xml:space="preserve">POST/GET /funds/{id}/portfolio/{iid}/valuations</w:t>
-      </w:r>
-      <w:r>
-        <w:t xml:space="preserve">,</w:t>
-      </w:r>
-      <w:r>
-        <w:t xml:space="preserve"> </w:t>
-      </w:r>
-      <w:r>
-        <w:rPr>
-          <w:rStyle w:val="VerbatimChar"/>
-        </w:rPr>
-        <w:t xml:space="preserve">GET /funds/{id}/valuations</w:t>
-      </w:r>
-      <w:r>
-        <w:t xml:space="preserve">,</w:t>
-      </w:r>
-      <w:r>
-        <w:t xml:space="preserve"> </w:t>
-      </w:r>
-      <w:r>
-        <w:rPr>
-          <w:rStyle w:val="VerbatimChar"/>
-        </w:rPr>
-        <w:t xml:space="preserve">POST /funds/{id}/valuations/report</w:t>
-      </w:r>
-      <w:r>
-        <w:t xml:space="preserve">. An India-native differentiator (SEBI AIF independent-valuation duty that global tools don't localise).</w:t>
+        <w:t xml:space="preserve">PUT .../followup</w:t>
+      </w:r>
+      <w:r>
+        <w:t xml:space="preserve">.</w:t>
       </w:r>
       <w:r>
         <w:t xml:space="preserve"> </w:t>
@@ -7698,7 +7577,7 @@
         <w:t xml:space="preserve"> </w:t>
       </w:r>
       <w:r>
-        <w:t xml:space="preserve">valuer e-sign/attestation; multi-valuer reconciliation.</w:t>
+        <w:t xml:space="preserve">per-prospect documents; email capture.</w:t>
       </w:r>
     </w:p>
     <w:p>
@@ -7714,7 +7593,7 @@
           <w:b/>
           <w:bCs/>
         </w:rPr>
-        <w:t xml:space="preserve">FR-J-14 (M — added v1.5, Carta fund gap)</w:t>
+        <w:t xml:space="preserve">FR-J-15 (M — added v1.6, Carta fund gap)</w:t>
       </w:r>
       <w:r>
         <w:t xml:space="preserve"> </w:t>
@@ -7730,23 +7609,82 @@
           <w:b/>
           <w:bCs/>
         </w:rPr>
-        <w:t xml:space="preserve">Fund financial statements</w:t>
-      </w:r>
-      <w:r>
-        <w:t xml:space="preserve"> </w:t>
-      </w:r>
-      <w:r>
-        <w:t xml:space="preserve">(no GL export): since-inception</w:t>
-      </w:r>
-      <w:r>
-        <w:t xml:space="preserve"> </w:t>
-      </w:r>
-      <w:r>
-        <w:rPr>
-          <w:b/>
-          <w:bCs/>
-        </w:rPr>
-        <w:t xml:space="preserve">statement of operations</w:t>
+        <w:t xml:space="preserve">SEBI-compliant independent portfolio valuation</w:t>
+      </w:r>
+      <w:r>
+        <w:t xml:space="preserve">: a fund</w:t>
+      </w:r>
+      <w:r>
+        <w:t xml:space="preserve"> </w:t>
+      </w:r>
+      <w:r>
+        <w:rPr>
+          <w:b/>
+          <w:bCs/>
+        </w:rPr>
+        <w:t xml:space="preserve">valuation policy</w:t>
+      </w:r>
+      <w:r>
+        <w:t xml:space="preserve"> </w:t>
+      </w:r>
+      <w:r>
+        <w:t xml:space="preserve">(appointed independent valuer + revaluation frequency in months) and per-holding</w:t>
+      </w:r>
+      <w:r>
+        <w:t xml:space="preserve"> </w:t>
+      </w:r>
+      <w:r>
+        <w:rPr>
+          <w:b/>
+          <w:bCs/>
+        </w:rPr>
+        <w:t xml:space="preserve">valuation records</w:t>
+      </w:r>
+      <w:r>
+        <w:t xml:space="preserve"> </w:t>
+      </w:r>
+      <w:r>
+        <w:t xml:space="preserve">(fair value, as-of, methodology — IPEV market/recent-txn, DCF, NAV, cost — valuer, independence flag, note; append-only history, latest by as-of becomes the holding's mark so NAV/SoI/performance stay in sync). A valuation dashboard flags holdings</w:t>
+      </w:r>
+      <w:r>
+        <w:t xml:space="preserve"> </w:t>
+      </w:r>
+      <w:r>
+        <w:rPr>
+          <w:b/>
+          <w:bCs/>
+        </w:rPr>
+        <w:t xml:space="preserve">stale</w:t>
+      </w:r>
+      <w:r>
+        <w:t xml:space="preserve"> </w:t>
+      </w:r>
+      <w:r>
+        <w:t xml:space="preserve">against the policy frequency, rolls up valued/independent/stale counts, and generates a</w:t>
+      </w:r>
+      <w:r>
+        <w:t xml:space="preserve"> </w:t>
+      </w:r>
+      <w:r>
+        <w:rPr>
+          <w:rStyle w:val="VerbatimChar"/>
+        </w:rPr>
+        <w:t xml:space="preserve">fund_valuation</w:t>
+      </w:r>
+      <w:r>
+        <w:t xml:space="preserve"> </w:t>
+      </w:r>
+      <w:r>
+        <w:t xml:space="preserve">report document.</w:t>
+      </w:r>
+      <w:r>
+        <w:t xml:space="preserve"> </w:t>
+      </w:r>
+      <w:r>
+        <w:rPr>
+          <w:rStyle w:val="VerbatimChar"/>
+        </w:rPr>
+        <w:t xml:space="preserve">PUT /funds/{id}/valuation-policy</w:t>
       </w:r>
       <w:r>
         <w:t xml:space="preserve">,</w:t>
@@ -7756,10 +7694,9 @@
       </w:r>
       <w:r>
         <w:rPr>
-          <w:b/>
-          <w:bCs/>
-        </w:rPr>
-        <w:t xml:space="preserve">cash flows</w:t>
+          <w:rStyle w:val="VerbatimChar"/>
+        </w:rPr>
+        <w:t xml:space="preserve">POST/GET /funds/{id}/portfolio/{iid}/valuations</w:t>
       </w:r>
       <w:r>
         <w:t xml:space="preserve">,</w:t>
@@ -7769,84 +7706,9 @@
       </w:r>
       <w:r>
         <w:rPr>
-          <w:b/>
-          <w:bCs/>
-        </w:rPr>
-        <w:t xml:space="preserve">assets &amp; liabilities</w:t>
-      </w:r>
-      <w:r>
-        <w:t xml:space="preserve"> </w:t>
-      </w:r>
-      <w:r>
-        <w:t xml:space="preserve">and a</w:t>
-      </w:r>
-      <w:r>
-        <w:t xml:space="preserve"> </w:t>
-      </w:r>
-      <w:r>
-        <w:rPr>
-          <w:b/>
-          <w:bCs/>
-        </w:rPr>
-        <w:t xml:space="preserve">partners'-capital roll-forward</w:t>
-      </w:r>
-      <w:r>
-        <w:t xml:space="preserve">, derived from the drawdown/distribution/fee ledgers and portfolio marks — designed so</w:t>
-      </w:r>
-      <w:r>
-        <w:t xml:space="preserve"> </w:t>
-      </w:r>
-      <w:r>
-        <w:rPr>
-          <w:b/>
-          <w:bCs/>
-        </w:rPr>
-        <w:t xml:space="preserve">net assets ties to ending partners' capital</w:t>
-      </w:r>
-      <w:r>
-        <w:t xml:space="preserve"> </w:t>
-      </w:r>
-      <w:r>
-        <w:t xml:space="preserve">by construction (a</w:t>
-      </w:r>
-      <w:r>
-        <w:t xml:space="preserve"> </w:t>
-      </w:r>
-      <w:r>
-        <w:rPr>
-          <w:rStyle w:val="VerbatimChar"/>
-        </w:rPr>
-        <w:t xml:space="preserve">balances</w:t>
-      </w:r>
-      <w:r>
-        <w:t xml:space="preserve"> </w:t>
-      </w:r>
-      <w:r>
-        <w:t xml:space="preserve">check is surfaced). Also generates a</w:t>
-      </w:r>
-      <w:r>
-        <w:t xml:space="preserve"> </w:t>
-      </w:r>
-      <w:r>
-        <w:rPr>
-          <w:rStyle w:val="VerbatimChar"/>
-        </w:rPr>
-        <w:t xml:space="preserve">fund_financials</w:t>
-      </w:r>
-      <w:r>
-        <w:t xml:space="preserve"> </w:t>
-      </w:r>
-      <w:r>
-        <w:t xml:space="preserve">statement document.</w:t>
-      </w:r>
-      <w:r>
-        <w:t xml:space="preserve"> </w:t>
-      </w:r>
-      <w:r>
-        <w:rPr>
-          <w:rStyle w:val="VerbatimChar"/>
-        </w:rPr>
-        <w:t xml:space="preserve">GET /funds/{id}/financials</w:t>
+          <w:rStyle w:val="VerbatimChar"/>
+        </w:rPr>
+        <w:t xml:space="preserve">GET /funds/{id}/valuations</w:t>
       </w:r>
       <w:r>
         <w:t xml:space="preserve">,</w:t>
@@ -7858,10 +7720,10 @@
         <w:rPr>
           <w:rStyle w:val="VerbatimChar"/>
         </w:rPr>
-        <w:t xml:space="preserve">POST /funds/{id}/financials/report</w:t>
-      </w:r>
-      <w:r>
-        <w:t xml:space="preserve">. Documented simplifications: cash is a derived plug (no bank ledger), realised gains aren't split from marks, no accrued liabilities; a management view, not audited GAAP.</w:t>
+        <w:t xml:space="preserve">POST /funds/{id}/valuations/report</w:t>
+      </w:r>
+      <w:r>
+        <w:t xml:space="preserve">. An India-native differentiator (SEBI AIF independent-valuation duty that global tools don't localise).</w:t>
       </w:r>
       <w:r>
         <w:t xml:space="preserve"> </w:t>
@@ -7871,13 +7733,13 @@
           <w:i/>
           <w:iCs/>
         </w:rPr>
-        <w:t xml:space="preserve">Explicitly out of scope for now (per product decision):</w:t>
-      </w:r>
-      <w:r>
-        <w:t xml:space="preserve"> </w:t>
-      </w:r>
-      <w:r>
-        <w:t xml:space="preserve">GL export (Tally/Zoho). No schema change (pure projection).</w:t>
+        <w:t xml:space="preserve">Remaining:</w:t>
+      </w:r>
+      <w:r>
+        <w:t xml:space="preserve"> </w:t>
+      </w:r>
+      <w:r>
+        <w:t xml:space="preserve">valuer e-sign/attestation; multi-valuer reconciliation.</w:t>
       </w:r>
     </w:p>
     <w:p>
@@ -7893,7 +7755,7 @@
           <w:b/>
           <w:bCs/>
         </w:rPr>
-        <w:t xml:space="preserve">FR-J-13 (M — added v1.5, Carta fund gap)</w:t>
+        <w:t xml:space="preserve">FR-J-14 (M — added v1.5, Carta fund gap)</w:t>
       </w:r>
       <w:r>
         <w:t xml:space="preserve"> </w:t>
@@ -7909,77 +7771,23 @@
           <w:b/>
           <w:bCs/>
         </w:rPr>
-        <w:t xml:space="preserve">Portfolio-company monitoring</w:t>
-      </w:r>
-      <w:r>
-        <w:t xml:space="preserve">: per-portfolio-company operating KPIs reported per period (revenue, cash, monthly burn, headcount, note; append-only, latest-by-as-of drives the dashboard) with derived</w:t>
-      </w:r>
-      <w:r>
-        <w:t xml:space="preserve"> </w:t>
-      </w:r>
-      <w:r>
-        <w:rPr>
-          <w:b/>
-          <w:bCs/>
-        </w:rPr>
-        <w:t xml:space="preserve">runway</w:t>
-      </w:r>
-      <w:r>
-        <w:t xml:space="preserve"> </w:t>
-      </w:r>
-      <w:r>
-        <w:t xml:space="preserve">(cash ÷ burn), period-over-period</w:t>
-      </w:r>
-      <w:r>
-        <w:t xml:space="preserve"> </w:t>
-      </w:r>
-      <w:r>
-        <w:rPr>
-          <w:b/>
-          <w:bCs/>
-        </w:rPr>
-        <w:t xml:space="preserve">revenue growth</w:t>
-      </w:r>
-      <w:r>
-        <w:t xml:space="preserve">, and a</w:t>
-      </w:r>
-      <w:r>
-        <w:t xml:space="preserve"> </w:t>
-      </w:r>
-      <w:r>
-        <w:rPr>
-          <w:b/>
-          <w:bCs/>
-        </w:rPr>
-        <w:t xml:space="preserve">low-runway flag</w:t>
-      </w:r>
-      <w:r>
-        <w:t xml:space="preserve"> </w:t>
-      </w:r>
-      <w:r>
-        <w:t xml:space="preserve">(&lt; 6 months); a fund-level health roll-up (companies reporting, summed latest revenue &amp; cash, count low on runway) and a per-company revenue</w:t>
-      </w:r>
-      <w:r>
-        <w:t xml:space="preserve"> </w:t>
-      </w:r>
-      <w:r>
-        <w:rPr>
-          <w:b/>
-          <w:bCs/>
-        </w:rPr>
-        <w:t xml:space="preserve">trend chart</w:t>
-      </w:r>
-      <w:r>
-        <w:t xml:space="preserve">.</w:t>
-      </w:r>
-      <w:r>
-        <w:t xml:space="preserve"> </w:t>
-      </w:r>
-      <w:r>
-        <w:rPr>
-          <w:rStyle w:val="VerbatimChar"/>
-        </w:rPr>
-        <w:t xml:space="preserve">POST/GET /funds/{id}/portfolio/{iid}/kpis</w:t>
+        <w:t xml:space="preserve">Fund financial statements</w:t>
+      </w:r>
+      <w:r>
+        <w:t xml:space="preserve"> </w:t>
+      </w:r>
+      <w:r>
+        <w:t xml:space="preserve">(no GL export): since-inception</w:t>
+      </w:r>
+      <w:r>
+        <w:t xml:space="preserve"> </w:t>
+      </w:r>
+      <w:r>
+        <w:rPr>
+          <w:b/>
+          <w:bCs/>
+        </w:rPr>
+        <w:t xml:space="preserve">statement of operations</w:t>
       </w:r>
       <w:r>
         <w:t xml:space="preserve">,</w:t>
@@ -7989,12 +7797,112 @@
       </w:r>
       <w:r>
         <w:rPr>
-          <w:rStyle w:val="VerbatimChar"/>
-        </w:rPr>
-        <w:t xml:space="preserve">GET /funds/{id}/portfolio-monitoring</w:t>
-      </w:r>
-      <w:r>
-        <w:t xml:space="preserve">.</w:t>
+          <w:b/>
+          <w:bCs/>
+        </w:rPr>
+        <w:t xml:space="preserve">cash flows</w:t>
+      </w:r>
+      <w:r>
+        <w:t xml:space="preserve">,</w:t>
+      </w:r>
+      <w:r>
+        <w:t xml:space="preserve"> </w:t>
+      </w:r>
+      <w:r>
+        <w:rPr>
+          <w:b/>
+          <w:bCs/>
+        </w:rPr>
+        <w:t xml:space="preserve">assets &amp; liabilities</w:t>
+      </w:r>
+      <w:r>
+        <w:t xml:space="preserve"> </w:t>
+      </w:r>
+      <w:r>
+        <w:t xml:space="preserve">and a</w:t>
+      </w:r>
+      <w:r>
+        <w:t xml:space="preserve"> </w:t>
+      </w:r>
+      <w:r>
+        <w:rPr>
+          <w:b/>
+          <w:bCs/>
+        </w:rPr>
+        <w:t xml:space="preserve">partners'-capital roll-forward</w:t>
+      </w:r>
+      <w:r>
+        <w:t xml:space="preserve">, derived from the drawdown/distribution/fee ledgers and portfolio marks — designed so</w:t>
+      </w:r>
+      <w:r>
+        <w:t xml:space="preserve"> </w:t>
+      </w:r>
+      <w:r>
+        <w:rPr>
+          <w:b/>
+          <w:bCs/>
+        </w:rPr>
+        <w:t xml:space="preserve">net assets ties to ending partners' capital</w:t>
+      </w:r>
+      <w:r>
+        <w:t xml:space="preserve"> </w:t>
+      </w:r>
+      <w:r>
+        <w:t xml:space="preserve">by construction (a</w:t>
+      </w:r>
+      <w:r>
+        <w:t xml:space="preserve"> </w:t>
+      </w:r>
+      <w:r>
+        <w:rPr>
+          <w:rStyle w:val="VerbatimChar"/>
+        </w:rPr>
+        <w:t xml:space="preserve">balances</w:t>
+      </w:r>
+      <w:r>
+        <w:t xml:space="preserve"> </w:t>
+      </w:r>
+      <w:r>
+        <w:t xml:space="preserve">check is surfaced). Also generates a</w:t>
+      </w:r>
+      <w:r>
+        <w:t xml:space="preserve"> </w:t>
+      </w:r>
+      <w:r>
+        <w:rPr>
+          <w:rStyle w:val="VerbatimChar"/>
+        </w:rPr>
+        <w:t xml:space="preserve">fund_financials</w:t>
+      </w:r>
+      <w:r>
+        <w:t xml:space="preserve"> </w:t>
+      </w:r>
+      <w:r>
+        <w:t xml:space="preserve">statement document.</w:t>
+      </w:r>
+      <w:r>
+        <w:t xml:space="preserve"> </w:t>
+      </w:r>
+      <w:r>
+        <w:rPr>
+          <w:rStyle w:val="VerbatimChar"/>
+        </w:rPr>
+        <w:t xml:space="preserve">GET /funds/{id}/financials</w:t>
+      </w:r>
+      <w:r>
+        <w:t xml:space="preserve">,</w:t>
+      </w:r>
+      <w:r>
+        <w:t xml:space="preserve"> </w:t>
+      </w:r>
+      <w:r>
+        <w:rPr>
+          <w:rStyle w:val="VerbatimChar"/>
+        </w:rPr>
+        <w:t xml:space="preserve">POST /funds/{id}/financials/report</w:t>
+      </w:r>
+      <w:r>
+        <w:t xml:space="preserve">. Documented simplifications: cash is a derived plug (no bank ledger), realised gains aren't split from marks, no accrued liabilities; a management view, not audited GAAP.</w:t>
       </w:r>
       <w:r>
         <w:t xml:space="preserve"> </w:t>
@@ -8004,6 +7912,139 @@
           <w:i/>
           <w:iCs/>
         </w:rPr>
+        <w:t xml:space="preserve">Explicitly out of scope for now (per product decision):</w:t>
+      </w:r>
+      <w:r>
+        <w:t xml:space="preserve"> </w:t>
+      </w:r>
+      <w:r>
+        <w:t xml:space="preserve">GL export (Tally/Zoho). No schema change (pure projection).</w:t>
+      </w:r>
+    </w:p>
+    <w:p>
+      <w:pPr>
+        <w:pStyle w:val="Compact"/>
+        <w:numPr>
+          <w:ilvl w:val="0"/>
+          <w:numId w:val="1013"/>
+        </w:numPr>
+      </w:pPr>
+      <w:r>
+        <w:rPr>
+          <w:b/>
+          <w:bCs/>
+        </w:rPr>
+        <w:t xml:space="preserve">FR-J-13 (M — added v1.5, Carta fund gap)</w:t>
+      </w:r>
+      <w:r>
+        <w:t xml:space="preserve"> </w:t>
+      </w:r>
+      <w:r>
+        <w:t xml:space="preserve">✅</w:t>
+      </w:r>
+      <w:r>
+        <w:t xml:space="preserve"> </w:t>
+      </w:r>
+      <w:r>
+        <w:rPr>
+          <w:b/>
+          <w:bCs/>
+        </w:rPr>
+        <w:t xml:space="preserve">Portfolio-company monitoring</w:t>
+      </w:r>
+      <w:r>
+        <w:t xml:space="preserve">: per-portfolio-company operating KPIs reported per period (revenue, cash, monthly burn, headcount, note; append-only, latest-by-as-of drives the dashboard) with derived</w:t>
+      </w:r>
+      <w:r>
+        <w:t xml:space="preserve"> </w:t>
+      </w:r>
+      <w:r>
+        <w:rPr>
+          <w:b/>
+          <w:bCs/>
+        </w:rPr>
+        <w:t xml:space="preserve">runway</w:t>
+      </w:r>
+      <w:r>
+        <w:t xml:space="preserve"> </w:t>
+      </w:r>
+      <w:r>
+        <w:t xml:space="preserve">(cash ÷ burn), period-over-period</w:t>
+      </w:r>
+      <w:r>
+        <w:t xml:space="preserve"> </w:t>
+      </w:r>
+      <w:r>
+        <w:rPr>
+          <w:b/>
+          <w:bCs/>
+        </w:rPr>
+        <w:t xml:space="preserve">revenue growth</w:t>
+      </w:r>
+      <w:r>
+        <w:t xml:space="preserve">, and a</w:t>
+      </w:r>
+      <w:r>
+        <w:t xml:space="preserve"> </w:t>
+      </w:r>
+      <w:r>
+        <w:rPr>
+          <w:b/>
+          <w:bCs/>
+        </w:rPr>
+        <w:t xml:space="preserve">low-runway flag</w:t>
+      </w:r>
+      <w:r>
+        <w:t xml:space="preserve"> </w:t>
+      </w:r>
+      <w:r>
+        <w:t xml:space="preserve">(&lt; 6 months); a fund-level health roll-up (companies reporting, summed latest revenue &amp; cash, count low on runway) and a per-company revenue</w:t>
+      </w:r>
+      <w:r>
+        <w:t xml:space="preserve"> </w:t>
+      </w:r>
+      <w:r>
+        <w:rPr>
+          <w:b/>
+          <w:bCs/>
+        </w:rPr>
+        <w:t xml:space="preserve">trend chart</w:t>
+      </w:r>
+      <w:r>
+        <w:t xml:space="preserve">.</w:t>
+      </w:r>
+      <w:r>
+        <w:t xml:space="preserve"> </w:t>
+      </w:r>
+      <w:r>
+        <w:rPr>
+          <w:rStyle w:val="VerbatimChar"/>
+        </w:rPr>
+        <w:t xml:space="preserve">POST/GET /funds/{id}/portfolio/{iid}/kpis</w:t>
+      </w:r>
+      <w:r>
+        <w:t xml:space="preserve">,</w:t>
+      </w:r>
+      <w:r>
+        <w:t xml:space="preserve"> </w:t>
+      </w:r>
+      <w:r>
+        <w:rPr>
+          <w:rStyle w:val="VerbatimChar"/>
+        </w:rPr>
+        <w:t xml:space="preserve">GET /funds/{id}/portfolio-monitoring</w:t>
+      </w:r>
+      <w:r>
+        <w:t xml:space="preserve">.</w:t>
+      </w:r>
+      <w:r>
+        <w:t xml:space="preserve"> </w:t>
+      </w:r>
+      <w:r>
+        <w:rPr>
+          <w:i/>
+          <w:iCs/>
+        </w:rPr>
         <w:t xml:space="preserve">Remaining:</w:t>
       </w:r>
       <w:r>
@@ -8119,6 +8160,56 @@
           <w:rStyle w:val="VerbatimChar"/>
         </w:rPr>
         <w:t xml:space="preserve">GET/PUT /funds/{id}/plan</w:t>
+      </w:r>
+      <w:r>
+        <w:t xml:space="preserve">.</w:t>
+      </w:r>
+      <w:r>
+        <w:t xml:space="preserve"> </w:t>
+      </w:r>
+      <w:r>
+        <w:rPr>
+          <w:i/>
+          <w:iCs/>
+        </w:rPr>
+        <w:t xml:space="preserve">(extended v1.7, Visible gap)</w:t>
+      </w:r>
+      <w:r>
+        <w:t xml:space="preserve"> </w:t>
+      </w:r>
+      <w:r>
+        <w:rPr>
+          <w:b/>
+          <w:bCs/>
+        </w:rPr>
+        <w:t xml:space="preserve">Variance report</w:t>
+      </w:r>
+      <w:r>
+        <w:t xml:space="preserve"> </w:t>
+      </w:r>
+      <w:r>
+        <w:t xml:space="preserve">— the plan payload adds a row-per-metric plan-vs-actual table with a signed variance %: committed capital, capital deployed to date (planned = even pacing × fund years elapsed since the first</w:t>
+      </w:r>
+      <w:r>
+        <w:t xml:space="preserve"> </w:t>
+      </w:r>
+      <w:r>
+        <w:rPr>
+          <w:rStyle w:val="VerbatimChar"/>
+        </w:rPr>
+        <w:t xml:space="preserve">invested_on</w:t>
+      </w:r>
+      <w:r>
+        <w:t xml:space="preserve">), average initial cheque, portfolio companies, gross MOIC (actual = fair value over cost, unmarked positions at cost) and net TVPI (actual from fund performance; blank until capital is paid in). Rendered under Plan-vs-actual in</w:t>
+      </w:r>
+      <w:r>
+        <w:t xml:space="preserve"> </w:t>
+      </w:r>
+      <w:r>
+        <w:rPr>
+          <w:rStyle w:val="VerbatimChar"/>
+        </w:rPr>
+        <w:t xml:space="preserve">FundForecast.tsx</w:t>
       </w:r>
       <w:r>
         <w:t xml:space="preserve">.</w:t>
@@ -17372,6 +17463,138 @@
       </w:r>
       <w:r>
         <w:t xml:space="preserve">— portfolio intelligence (Vestberry competitive gap analysis, fund side):</w:t>
+      </w:r>
+    </w:p>
+    <w:p>
+      <w:pPr>
+        <w:pStyle w:val="Compact"/>
+        <w:numPr>
+          <w:ilvl w:val="0"/>
+          <w:numId w:val="1030"/>
+        </w:numPr>
+      </w:pPr>
+      <w:r>
+        <w:rPr>
+          <w:b/>
+          <w:bCs/>
+        </w:rPr>
+        <w:t xml:space="preserve">Visible #4 — portfolio segments + variance report (FR-J-24 / FR-J-12 extended, fund side)</w:t>
+      </w:r>
+      <w:r>
+        <w:t xml:space="preserve"> </w:t>
+      </w:r>
+      <w:r>
+        <w:t xml:space="preserve">✅ —</w:t>
+      </w:r>
+      <w:r>
+        <w:t xml:space="preserve"> </w:t>
+      </w:r>
+      <w:r>
+        <w:rPr>
+          <w:rStyle w:val="VerbatimChar"/>
+        </w:rPr>
+        <w:t xml:space="preserve">portfolio_investments.sector</w:t>
+      </w:r>
+      <w:r>
+        <w:t xml:space="preserve"> </w:t>
+      </w:r>
+      <w:r>
+        <w:t xml:space="preserve">free-text segment tag (Alembic</w:t>
+      </w:r>
+      <w:r>
+        <w:t xml:space="preserve"> </w:t>
+      </w:r>
+      <w:r>
+        <w:rPr>
+          <w:rStyle w:val="VerbatimChar"/>
+        </w:rPr>
+        <w:t xml:space="preserve">b4c5d6e7f8a9</w:t>
+      </w:r>
+      <w:r>
+        <w:t xml:space="preserve">; add-investment form input, chips on the monitoring table):</w:t>
+      </w:r>
+      <w:r>
+        <w:t xml:space="preserve"> </w:t>
+      </w:r>
+      <w:r>
+        <w:rPr>
+          <w:rStyle w:val="VerbatimChar"/>
+        </w:rPr>
+        <w:t xml:space="preserve">portfolio_benchmarks</w:t>
+      </w:r>
+      <w:r>
+        <w:t xml:space="preserve"> </w:t>
+      </w:r>
+      <w:r>
+        <w:t xml:space="preserve">adds per-sector</w:t>
+      </w:r>
+      <w:r>
+        <w:t xml:space="preserve"> </w:t>
+      </w:r>
+      <w:r>
+        <w:rPr>
+          <w:b/>
+          <w:bCs/>
+        </w:rPr>
+        <w:t xml:space="preserve">cohort medians</w:t>
+      </w:r>
+      <w:r>
+        <w:t xml:space="preserve"> </w:t>
+      </w:r>
+      <w:r>
+        <w:t xml:space="preserve">(company count + median per metric, hidden with a single cohort) rendered as a segment-comparison table; and</w:t>
+      </w:r>
+      <w:r>
+        <w:t xml:space="preserve"> </w:t>
+      </w:r>
+      <w:r>
+        <w:rPr>
+          <w:rStyle w:val="VerbatimChar"/>
+        </w:rPr>
+        <w:t xml:space="preserve">compute_plan</w:t>
+      </w:r>
+      <w:r>
+        <w:t xml:space="preserve"> </w:t>
+      </w:r>
+      <w:r>
+        <w:t xml:space="preserve">gains a</w:t>
+      </w:r>
+      <w:r>
+        <w:t xml:space="preserve"> </w:t>
+      </w:r>
+      <w:r>
+        <w:rPr>
+          <w:b/>
+          <w:bCs/>
+        </w:rPr>
+        <w:t xml:space="preserve">variance</w:t>
+      </w:r>
+      <w:r>
+        <w:t xml:space="preserve"> </w:t>
+      </w:r>
+      <w:r>
+        <w:t xml:space="preserve">block — plan vs live ledgers per metric (committed, deployed-to-date vs even pacing since first investment, avg cheque, deal count, gross MOIC at fair-value-over-cost, net TVPI) with signed variance %, rendered as a table in</w:t>
+      </w:r>
+      <w:r>
+        <w:t xml:space="preserve"> </w:t>
+      </w:r>
+      <w:r>
+        <w:rPr>
+          <w:rStyle w:val="VerbatimChar"/>
+        </w:rPr>
+        <w:t xml:space="preserve">FundForecast.tsx</w:t>
+      </w:r>
+      <w:r>
+        <w:t xml:space="preserve">. 3 tests (</w:t>
+      </w:r>
+      <w:r>
+        <w:rPr>
+          <w:rStyle w:val="VerbatimChar"/>
+        </w:rPr>
+        <w:t xml:space="preserve">test_segments_variance.py</w:t>
+      </w:r>
+      <w:r>
+        <w:t xml:space="preserve">).</w:t>
       </w:r>
     </w:p>
     <w:p>

</xml_diff>

<commit_message>
feat(fund): DDQ answer bank + generated DDQ responses document (FR-J-25, Visible #5)
New DDQEntry (per-fund Q&A, category-grouped, 409 duplicate question;
Alembic c5d6e7f8a9b0) with 10 standard-question presets (rules-as-data) and a
ddq document template rendering category sections (unanswered marked
'response pending'). GET/POST /funds/{id}/ddq, PUT/DELETE .../{entry_id},
POST /funds/{id}/ddq/report. 3 tests.

Co-Authored-By: Claude Opus 4.8 <noreply@anthropic.com>
</commit_message>
<xml_diff>
--- a/REQUIREMENTS.docx
+++ b/REQUIREMENTS.docx
@@ -5891,6 +5891,125 @@
           <w:b/>
           <w:bCs/>
         </w:rPr>
+        <w:t xml:space="preserve">FR-J-25 (M — added v1.7, Visible gap)</w:t>
+      </w:r>
+      <w:r>
+        <w:t xml:space="preserve"> </w:t>
+      </w:r>
+      <w:r>
+        <w:t xml:space="preserve">✅</w:t>
+      </w:r>
+      <w:r>
+        <w:t xml:space="preserve"> </w:t>
+      </w:r>
+      <w:r>
+        <w:rPr>
+          <w:b/>
+          <w:bCs/>
+        </w:rPr>
+        <w:t xml:space="preserve">DDQ answer bank</w:t>
+      </w:r>
+      <w:r>
+        <w:t xml:space="preserve">: a per-fund due-diligence Q&amp;A repository — LP questionnaire questions answered once and reused, organised by category, seeded from</w:t>
+      </w:r>
+      <w:r>
+        <w:t xml:space="preserve"> </w:t>
+      </w:r>
+      <w:r>
+        <w:rPr>
+          <w:b/>
+          <w:bCs/>
+        </w:rPr>
+        <w:t xml:space="preserve">standard-question presets</w:t>
+      </w:r>
+      <w:r>
+        <w:t xml:space="preserve"> </w:t>
+      </w:r>
+      <w:r>
+        <w:t xml:space="preserve">(firm, fund terms, track record, SEBI compliance, valuation policy, conflicts, service providers, ESG), duplicate questions rejected, and exportable as a</w:t>
+      </w:r>
+      <w:r>
+        <w:t xml:space="preserve"> </w:t>
+      </w:r>
+      <w:r>
+        <w:rPr>
+          <w:b/>
+          <w:bCs/>
+        </w:rPr>
+        <w:t xml:space="preserve">DDQ Responses document</w:t>
+      </w:r>
+      <w:r>
+        <w:t xml:space="preserve"> </w:t>
+      </w:r>
+      <w:r>
+        <w:t xml:space="preserve">with category sections (unanswered questions marked "response pending").</w:t>
+      </w:r>
+      <w:r>
+        <w:t xml:space="preserve"> </w:t>
+      </w:r>
+      <w:r>
+        <w:rPr>
+          <w:rStyle w:val="VerbatimChar"/>
+        </w:rPr>
+        <w:t xml:space="preserve">GET/POST /funds/{id}/ddq</w:t>
+      </w:r>
+      <w:r>
+        <w:t xml:space="preserve">,</w:t>
+      </w:r>
+      <w:r>
+        <w:t xml:space="preserve"> </w:t>
+      </w:r>
+      <w:r>
+        <w:rPr>
+          <w:rStyle w:val="VerbatimChar"/>
+        </w:rPr>
+        <w:t xml:space="preserve">PUT/DELETE .../{entry_id}</w:t>
+      </w:r>
+      <w:r>
+        <w:t xml:space="preserve">,</w:t>
+      </w:r>
+      <w:r>
+        <w:t xml:space="preserve"> </w:t>
+      </w:r>
+      <w:r>
+        <w:rPr>
+          <w:rStyle w:val="VerbatimChar"/>
+        </w:rPr>
+        <w:t xml:space="preserve">POST /funds/{id}/ddq/report</w:t>
+      </w:r>
+      <w:r>
+        <w:t xml:space="preserve">.</w:t>
+      </w:r>
+      <w:r>
+        <w:t xml:space="preserve"> </w:t>
+      </w:r>
+      <w:r>
+        <w:rPr>
+          <w:i/>
+          <w:iCs/>
+        </w:rPr>
+        <w:t xml:space="preserve">Remaining:</w:t>
+      </w:r>
+      <w:r>
+        <w:t xml:space="preserve"> </w:t>
+      </w:r>
+      <w:r>
+        <w:t xml:space="preserve">per-LP questionnaire instances; mapping an incoming LP DDQ onto bank answers.</w:t>
+      </w:r>
+    </w:p>
+    <w:p>
+      <w:pPr>
+        <w:pStyle w:val="Compact"/>
+        <w:numPr>
+          <w:ilvl w:val="0"/>
+          <w:numId w:val="1013"/>
+        </w:numPr>
+      </w:pPr>
+      <w:r>
+        <w:rPr>
+          <w:b/>
+          <w:bCs/>
+        </w:rPr>
         <w:t xml:space="preserve">FR-J-24 (M — added v1.7, Vestberry gap)</w:t>
       </w:r>
       <w:r>
@@ -17463,6 +17582,175 @@
       </w:r>
       <w:r>
         <w:t xml:space="preserve">— portfolio intelligence (Vestberry competitive gap analysis, fund side):</w:t>
+      </w:r>
+    </w:p>
+    <w:p>
+      <w:pPr>
+        <w:pStyle w:val="Compact"/>
+        <w:numPr>
+          <w:ilvl w:val="0"/>
+          <w:numId w:val="1030"/>
+        </w:numPr>
+      </w:pPr>
+      <w:r>
+        <w:rPr>
+          <w:b/>
+          <w:bCs/>
+        </w:rPr>
+        <w:t xml:space="preserve">FR-J-25 (M — added v1.7, Visible gap) — Visible #5 — DDQ answer bank (fund side)</w:t>
+      </w:r>
+      <w:r>
+        <w:t xml:space="preserve"> </w:t>
+      </w:r>
+      <w:r>
+        <w:t xml:space="preserve">✅ — new</w:t>
+      </w:r>
+      <w:r>
+        <w:t xml:space="preserve"> </w:t>
+      </w:r>
+      <w:r>
+        <w:rPr>
+          <w:rStyle w:val="VerbatimChar"/>
+        </w:rPr>
+        <w:t xml:space="preserve">DDQEntry</w:t>
+      </w:r>
+      <w:r>
+        <w:t xml:space="preserve"> </w:t>
+      </w:r>
+      <w:r>
+        <w:t xml:space="preserve">{fund, category, question (409 duplicate per fund), answer} (Alembic</w:t>
+      </w:r>
+      <w:r>
+        <w:t xml:space="preserve"> </w:t>
+      </w:r>
+      <w:r>
+        <w:rPr>
+          <w:rStyle w:val="VerbatimChar"/>
+        </w:rPr>
+        <w:t xml:space="preserve">c5d6e7f8a9b0</w:t>
+      </w:r>
+      <w:r>
+        <w:t xml:space="preserve">): a per-fund due-diligence Q&amp;A repository — answer LP questionnaire questions once, reuse everywhere — with</w:t>
+      </w:r>
+      <w:r>
+        <w:t xml:space="preserve"> </w:t>
+      </w:r>
+      <w:r>
+        <w:rPr>
+          <w:b/>
+          <w:bCs/>
+        </w:rPr>
+        <w:t xml:space="preserve">10 standard-question presets</w:t>
+      </w:r>
+      <w:r>
+        <w:t xml:space="preserve"> </w:t>
+      </w:r>
+      <w:r>
+        <w:t xml:space="preserve">(rules-as-data: firm, fund terms, track record, SEBI compliance, valuation policy, conflicts, service providers, ESG) and a generated</w:t>
+      </w:r>
+      <w:r>
+        <w:t xml:space="preserve"> </w:t>
+      </w:r>
+      <w:r>
+        <w:rPr>
+          <w:b/>
+          <w:bCs/>
+        </w:rPr>
+        <w:t xml:space="preserve">DDQ Responses document</w:t>
+      </w:r>
+      <w:r>
+        <w:t xml:space="preserve"> </w:t>
+      </w:r>
+      <w:r>
+        <w:t xml:space="preserve">(</w:t>
+      </w:r>
+      <w:r>
+        <w:rPr>
+          <w:rStyle w:val="VerbatimChar"/>
+        </w:rPr>
+        <w:t xml:space="preserve">ddq</w:t>
+      </w:r>
+      <w:r>
+        <w:t xml:space="preserve"> </w:t>
+      </w:r>
+      <w:r>
+        <w:t xml:space="preserve">template, category sections, unanswered marked "response pending").</w:t>
+      </w:r>
+      <w:r>
+        <w:t xml:space="preserve"> </w:t>
+      </w:r>
+      <w:r>
+        <w:rPr>
+          <w:rStyle w:val="VerbatimChar"/>
+        </w:rPr>
+        <w:t xml:space="preserve">GET/POST /funds/{id}/ddq</w:t>
+      </w:r>
+      <w:r>
+        <w:t xml:space="preserve">,</w:t>
+      </w:r>
+      <w:r>
+        <w:t xml:space="preserve"> </w:t>
+      </w:r>
+      <w:r>
+        <w:rPr>
+          <w:rStyle w:val="VerbatimChar"/>
+        </w:rPr>
+        <w:t xml:space="preserve">PUT/DELETE .../{entry_id}</w:t>
+      </w:r>
+      <w:r>
+        <w:t xml:space="preserve">,</w:t>
+      </w:r>
+      <w:r>
+        <w:t xml:space="preserve"> </w:t>
+      </w:r>
+      <w:r>
+        <w:rPr>
+          <w:rStyle w:val="VerbatimChar"/>
+        </w:rPr>
+        <w:t xml:space="preserve">POST /funds/{id}/ddq/report</w:t>
+      </w:r>
+      <w:r>
+        <w:t xml:space="preserve">.</w:t>
+      </w:r>
+      <w:r>
+        <w:t xml:space="preserve"> </w:t>
+      </w:r>
+      <w:r>
+        <w:rPr>
+          <w:rStyle w:val="VerbatimChar"/>
+        </w:rPr>
+        <w:t xml:space="preserve">FundDDQ.tsx</w:t>
+      </w:r>
+      <w:r>
+        <w:t xml:space="preserve"> </w:t>
+      </w:r>
+      <w:r>
+        <w:t xml:space="preserve">card on the LP-fundraise sub-tab (grouped Q&amp;A, answered counter, inline answer editor, preset buttons). 3 tests (</w:t>
+      </w:r>
+      <w:r>
+        <w:rPr>
+          <w:rStyle w:val="VerbatimChar"/>
+        </w:rPr>
+        <w:t xml:space="preserve">test_ddq.py</w:t>
+      </w:r>
+      <w:r>
+        <w:t xml:space="preserve">).</w:t>
+      </w:r>
+      <w:r>
+        <w:t xml:space="preserve"> </w:t>
+      </w:r>
+      <w:r>
+        <w:rPr>
+          <w:i/>
+          <w:iCs/>
+        </w:rPr>
+        <w:t xml:space="preserve">Remaining:</w:t>
+      </w:r>
+      <w:r>
+        <w:t xml:space="preserve"> </w:t>
+      </w:r>
+      <w:r>
+        <w:t xml:space="preserve">per-LP questionnaire instances; import an LP's DDQ and map questions to bank answers.</w:t>
       </w:r>
     </w:p>
     <w:p>

</xml_diff>

<commit_message>
feat(fund): benchmark distribution stats — quartiles per metric (FR-J-24, Visible visual batch)
portfolio_benchmarks adds per-metric stats {min, q1, median, q3, max, total,
reporters} via statistics.quantiles (inclusive method, stays within the data
range; single reporter collapses to the value itself).

Co-Authored-By: Claude Opus 4.8 <noreply@anthropic.com>
</commit_message>
<xml_diff>
--- a/REQUIREMENTS.docx
+++ b/REQUIREMENTS.docx
@@ -6131,16 +6131,42 @@
       </w:r>
       <w:r>
         <w:rPr>
+          <w:b/>
+          <w:bCs/>
+        </w:rPr>
+        <w:t xml:space="preserve">Quartiles</w:t>
+      </w:r>
+      <w:r>
+        <w:t xml:space="preserve"> </w:t>
+      </w:r>
+      <w:r>
+        <w:rPr>
           <w:i/>
           <w:iCs/>
         </w:rPr>
+        <w:t xml:space="preserve">(v1.7 visual batch)</w:t>
+      </w:r>
+      <w:r>
+        <w:t xml:space="preserve"> </w:t>
+      </w:r>
+      <w:r>
+        <w:t xml:space="preserve">— per-metric distribution stats (min / Q1 / median / Q3 / max / total / reporters) as Q1/Q3 ticks on the range strips and a Distribution table.</w:t>
+      </w:r>
+      <w:r>
+        <w:t xml:space="preserve"> </w:t>
+      </w:r>
+      <w:r>
+        <w:rPr>
+          <w:i/>
+          <w:iCs/>
+        </w:rPr>
         <w:t xml:space="preserve">Remaining:</w:t>
       </w:r>
       <w:r>
         <w:t xml:space="preserve"> </w:t>
       </w:r>
       <w:r>
-        <w:t xml:space="preserve">quartiles; vintage cohorts.</w:t>
+        <w:t xml:space="preserve">vintage cohorts.</w:t>
       </w:r>
     </w:p>
     <w:p>
@@ -17582,6 +17608,222 @@
       </w:r>
       <w:r>
         <w:t xml:space="preserve">— portfolio intelligence (Vestberry competitive gap analysis, fund side):</w:t>
+      </w:r>
+    </w:p>
+    <w:p>
+      <w:pPr>
+        <w:pStyle w:val="Compact"/>
+        <w:numPr>
+          <w:ilvl w:val="0"/>
+          <w:numId w:val="1030"/>
+        </w:numPr>
+      </w:pPr>
+      <w:r>
+        <w:rPr>
+          <w:b/>
+          <w:bCs/>
+        </w:rPr>
+        <w:t xml:space="preserve">Visible visual batch (fund + startup side)</w:t>
+      </w:r>
+      <w:r>
+        <w:t xml:space="preserve"> </w:t>
+      </w:r>
+      <w:r>
+        <w:t xml:space="preserve">✅ — from a visual analysis of visible.vc product screenshots: (1)</w:t>
+      </w:r>
+      <w:r>
+        <w:t xml:space="preserve"> </w:t>
+      </w:r>
+      <w:r>
+        <w:rPr>
+          <w:b/>
+          <w:bCs/>
+        </w:rPr>
+        <w:t xml:space="preserve">dual delta pills on stat tiles</w:t>
+      </w:r>
+      <w:r>
+        <w:t xml:space="preserve"> </w:t>
+      </w:r>
+      <w:r>
+        <w:t xml:space="preserve">(</w:t>
+      </w:r>
+      <w:r>
+        <w:rPr>
+          <w:rStyle w:val="VerbatimChar"/>
+        </w:rPr>
+        <w:t xml:space="preserve">Stat</w:t>
+      </w:r>
+      <w:r>
+        <w:t xml:space="preserve"> </w:t>
+      </w:r>
+      <w:r>
+        <w:t xml:space="preserve">gains</w:t>
+      </w:r>
+      <w:r>
+        <w:t xml:space="preserve"> </w:t>
+      </w:r>
+      <w:r>
+        <w:rPr>
+          <w:rStyle w:val="VerbatimChar"/>
+        </w:rPr>
+        <w:t xml:space="preserve">deltas</w:t>
+      </w:r>
+      <w:r>
+        <w:t xml:space="preserve">) — fund header NAV/TVPI/DPI/RVPI show ▲/▼ vs-last-quarter / vs-last-year from the performance series (since-inception fallback for young funds), and monitoring's revenue total shows vs-prior-period; (2)</w:t>
+      </w:r>
+      <w:r>
+        <w:t xml:space="preserve"> </w:t>
+      </w:r>
+      <w:r>
+        <w:rPr>
+          <w:b/>
+          <w:bCs/>
+        </w:rPr>
+        <w:t xml:space="preserve">benchmark quartiles</w:t>
+      </w:r>
+      <w:r>
+        <w:t xml:space="preserve"> </w:t>
+      </w:r>
+      <w:r>
+        <w:t xml:space="preserve">(clears FR-J-24</w:t>
+      </w:r>
+      <w:r>
+        <w:t xml:space="preserve"> </w:t>
+      </w:r>
+      <w:r>
+        <w:rPr>
+          <w:i/>
+          <w:iCs/>
+        </w:rPr>
+        <w:t xml:space="preserve">Remaining: quartiles</w:t>
+      </w:r>
+      <w:r>
+        <w:t xml:space="preserve">) —</w:t>
+      </w:r>
+      <w:r>
+        <w:t xml:space="preserve"> </w:t>
+      </w:r>
+      <w:r>
+        <w:rPr>
+          <w:rStyle w:val="VerbatimChar"/>
+        </w:rPr>
+        <w:t xml:space="preserve">portfolio_benchmarks</w:t>
+      </w:r>
+      <w:r>
+        <w:t xml:space="preserve"> </w:t>
+      </w:r>
+      <w:r>
+        <w:t xml:space="preserve">adds per-metric</w:t>
+      </w:r>
+      <w:r>
+        <w:t xml:space="preserve"> </w:t>
+      </w:r>
+      <w:r>
+        <w:rPr>
+          <w:rStyle w:val="VerbatimChar"/>
+        </w:rPr>
+        <w:t xml:space="preserve">stats</w:t>
+      </w:r>
+      <w:r>
+        <w:t xml:space="preserve"> </w:t>
+      </w:r>
+      <w:r>
+        <w:t xml:space="preserve">(min/Q1/median/Q3/max/total/reporters,</w:t>
+      </w:r>
+      <w:r>
+        <w:t xml:space="preserve"> </w:t>
+      </w:r>
+      <w:r>
+        <w:rPr>
+          <w:rStyle w:val="VerbatimChar"/>
+        </w:rPr>
+        <w:t xml:space="preserve">statistics.quantiles</w:t>
+      </w:r>
+      <w:r>
+        <w:t xml:space="preserve"> </w:t>
+      </w:r>
+      <w:r>
+        <w:t xml:space="preserve">inclusive), rendered as dotted Q1/Q3 ticks on the range strips + a Distribution table; (3)</w:t>
+      </w:r>
+      <w:r>
+        <w:t xml:space="preserve"> </w:t>
+      </w:r>
+      <w:r>
+        <w:rPr>
+          <w:b/>
+          <w:bCs/>
+        </w:rPr>
+        <w:t xml:space="preserve">on-screen tear sheet</w:t>
+      </w:r>
+      <w:r>
+        <w:t xml:space="preserve"> </w:t>
+      </w:r>
+      <w:r>
+        <w:t xml:space="preserve">—</w:t>
+      </w:r>
+      <w:r>
+        <w:t xml:space="preserve"> </w:t>
+      </w:r>
+      <w:r>
+        <w:rPr>
+          <w:rStyle w:val="VerbatimChar"/>
+        </w:rPr>
+        <w:t xml:space="preserve">TearSheet.tsx</w:t>
+      </w:r>
+      <w:r>
+        <w:t xml:space="preserve"> </w:t>
+      </w:r>
+      <w:r>
+        <w:t xml:space="preserve">panel per portfolio row (Avatar header band, invested/FV/MOIC/ownership/%-of-NAV/runway tiles, revenue &amp; growth combo chart, latest-period line incl. custom metrics, active signals; document generator kept); (4) new</w:t>
+      </w:r>
+      <w:r>
+        <w:t xml:space="preserve"> </w:t>
+      </w:r>
+      <w:r>
+        <w:rPr>
+          <w:rStyle w:val="VerbatimChar"/>
+          <w:b/>
+          <w:bCs/>
+        </w:rPr>
+        <w:t xml:space="preserve">ComboChart</w:t>
+      </w:r>
+      <w:r>
+        <w:t xml:space="preserve"> </w:t>
+      </w:r>
+      <w:r>
+        <w:t xml:space="preserve">component (bars + right-axis % line, dependency-free SVG); (5)</w:t>
+      </w:r>
+      <w:r>
+        <w:t xml:space="preserve"> </w:t>
+      </w:r>
+      <w:r>
+        <w:rPr>
+          <w:b/>
+          <w:bCs/>
+        </w:rPr>
+        <w:t xml:space="preserve">stage summary rails + stage-tinted dots</w:t>
+      </w:r>
+      <w:r>
+        <w:t xml:space="preserve"> </w:t>
+      </w:r>
+      <w:r>
+        <w:t xml:space="preserve">on the LP-fundraise pipeline (per-stage target + count chips) and the startup investor funnel (per-stage value + count from the pipeline summary); (6)</w:t>
+      </w:r>
+      <w:r>
+        <w:t xml:space="preserve"> </w:t>
+      </w:r>
+      <w:r>
+        <w:rPr>
+          <w:b/>
+          <w:bCs/>
+        </w:rPr>
+        <w:t xml:space="preserve">update live preview</w:t>
+      </w:r>
+      <w:r>
+        <w:t xml:space="preserve"> </w:t>
+      </w:r>
+      <w:r>
+        <w:t xml:space="preserve">— the FR-K-2 composer renders the update as investors will see it (sections + metric chips, "frozen at publish" note). Backend change is (2) only.</w:t>
       </w:r>
     </w:p>
     <w:p>

</xml_diff>

<commit_message>
feat(fund): structured LP-report data for the web report view (FR-J-22/18, Rundit visual batch)
lp_report_data composes the quarterly report as JSON (snapshot, performance,
period activity, per-holding blocks with FV-growth % and holding years,
valuation status); default_report_period picks the last completed quarter.
GET /funds/{id}/lp-report/preview (GP) + LP-scoped GET
/portal/funds/{id}/lp-report (email-matched, 404 for non-LPs). Benchmark
stats gain avg for the pinned AVERAGE row. 1 test.

Co-Authored-By: Claude Opus 4.8 <noreply@anthropic.com>
</commit_message>
<xml_diff>
--- a/REQUIREMENTS.docx
+++ b/REQUIREMENTS.docx
@@ -17608,6 +17608,198 @@
       </w:r>
       <w:r>
         <w:t xml:space="preserve">— portfolio intelligence (Vestberry competitive gap analysis, fund side):</w:t>
+      </w:r>
+    </w:p>
+    <w:p>
+      <w:pPr>
+        <w:pStyle w:val="Compact"/>
+        <w:numPr>
+          <w:ilvl w:val="0"/>
+          <w:numId w:val="1030"/>
+        </w:numPr>
+      </w:pPr>
+      <w:r>
+        <w:rPr>
+          <w:b/>
+          <w:bCs/>
+        </w:rPr>
+        <w:t xml:space="preserve">Rundit visual batch (fund + startup side)</w:t>
+      </w:r>
+      <w:r>
+        <w:t xml:space="preserve"> </w:t>
+      </w:r>
+      <w:r>
+        <w:t xml:space="preserve">✅ — from a visual analysis of rundit.com product screenshots: (1)</w:t>
+      </w:r>
+      <w:r>
+        <w:t xml:space="preserve"> </w:t>
+      </w:r>
+      <w:r>
+        <w:rPr>
+          <w:b/>
+          <w:bCs/>
+        </w:rPr>
+        <w:t xml:space="preserve">web-native LP report view</w:t>
+      </w:r>
+      <w:r>
+        <w:t xml:space="preserve"> </w:t>
+      </w:r>
+      <w:r>
+        <w:t xml:space="preserve">(extends FR-J-22/FR-J-18) — the quarterly report as a magazine-style page (serif hero figures with growth arrows, activity list, per-company blocks with ownership / invested / fair value / MOIC / holding years and a</w:t>
+      </w:r>
+      <w:r>
+        <w:t xml:space="preserve"> </w:t>
+      </w:r>
+      <w:r>
+        <w:rPr>
+          <w:b/>
+          <w:bCs/>
+        </w:rPr>
+        <w:t xml:space="preserve">FV-growth pill</w:t>
+      </w:r>
+      <w:r>
+        <w:t xml:space="preserve">, valuation status) via new</w:t>
+      </w:r>
+      <w:r>
+        <w:t xml:space="preserve"> </w:t>
+      </w:r>
+      <w:r>
+        <w:rPr>
+          <w:rStyle w:val="VerbatimChar"/>
+        </w:rPr>
+        <w:t xml:space="preserve">lp_report_data</w:t>
+      </w:r>
+      <w:r>
+        <w:t xml:space="preserve"> </w:t>
+      </w:r>
+      <w:r>
+        <w:t xml:space="preserve">+</w:t>
+      </w:r>
+      <w:r>
+        <w:t xml:space="preserve"> </w:t>
+      </w:r>
+      <w:r>
+        <w:rPr>
+          <w:rStyle w:val="VerbatimChar"/>
+        </w:rPr>
+        <w:t xml:space="preserve">GET /funds/{id}/lp-report/preview</w:t>
+      </w:r>
+      <w:r>
+        <w:t xml:space="preserve"> </w:t>
+      </w:r>
+      <w:r>
+        <w:t xml:space="preserve">(GP, defaults to the last completed quarter) and LP-scoped</w:t>
+      </w:r>
+      <w:r>
+        <w:t xml:space="preserve"> </w:t>
+      </w:r>
+      <w:r>
+        <w:rPr>
+          <w:rStyle w:val="VerbatimChar"/>
+        </w:rPr>
+        <w:t xml:space="preserve">GET /portal/funds/{id}/lp-report</w:t>
+      </w:r>
+      <w:r>
+        <w:t xml:space="preserve">; "Report view" toggle beside the report generator and a "Quarterly report" button on every portal fund card (shared</w:t>
+      </w:r>
+      <w:r>
+        <w:t xml:space="preserve"> </w:t>
+      </w:r>
+      <w:r>
+        <w:rPr>
+          <w:rStyle w:val="VerbatimChar"/>
+        </w:rPr>
+        <w:t xml:space="preserve">LpReportView</w:t>
+      </w:r>
+      <w:r>
+        <w:t xml:space="preserve"> </w:t>
+      </w:r>
+      <w:r>
+        <w:t xml:space="preserve">component; the document export stays); (2)</w:t>
+      </w:r>
+      <w:r>
+        <w:t xml:space="preserve"> </w:t>
+      </w:r>
+      <w:r>
+        <w:rPr>
+          <w:b/>
+          <w:bCs/>
+        </w:rPr>
+        <w:t xml:space="preserve">pinned summary rows</w:t>
+      </w:r>
+      <w:r>
+        <w:t xml:space="preserve"> </w:t>
+      </w:r>
+      <w:r>
+        <w:t xml:space="preserve">— TOTAL / AVERAGE / MEDIAN rows atop the benchmark matrix (</w:t>
+      </w:r>
+      <w:r>
+        <w:rPr>
+          <w:rStyle w:val="VerbatimChar"/>
+        </w:rPr>
+        <w:t xml:space="preserve">stats</w:t>
+      </w:r>
+      <w:r>
+        <w:t xml:space="preserve"> </w:t>
+      </w:r>
+      <w:r>
+        <w:t xml:space="preserve">gains</w:t>
+      </w:r>
+      <w:r>
+        <w:t xml:space="preserve"> </w:t>
+      </w:r>
+      <w:r>
+        <w:rPr>
+          <w:rStyle w:val="VerbatimChar"/>
+        </w:rPr>
+        <w:t xml:space="preserve">avg</w:t>
+      </w:r>
+      <w:r>
+        <w:t xml:space="preserve">); (3)</w:t>
+      </w:r>
+      <w:r>
+        <w:t xml:space="preserve"> </w:t>
+      </w:r>
+      <w:r>
+        <w:rPr>
+          <w:b/>
+          <w:bCs/>
+        </w:rPr>
+        <w:t xml:space="preserve">reporting-status roster</w:t>
+      </w:r>
+      <w:r>
+        <w:t xml:space="preserve"> </w:t>
+      </w:r>
+      <w:r>
+        <w:t xml:space="preserve">— per-company chips in Monitoring (✓ latest period / requested / submitted / overdue / never reported); (4)</w:t>
+      </w:r>
+      <w:r>
+        <w:t xml:space="preserve"> </w:t>
+      </w:r>
+      <w:r>
+        <w:rPr>
+          <w:b/>
+          <w:bCs/>
+        </w:rPr>
+        <w:t xml:space="preserve">update engagement roll-up</w:t>
+      </w:r>
+      <w:r>
+        <w:t xml:space="preserve"> </w:t>
+      </w:r>
+      <w:r>
+        <w:t xml:space="preserve">— an ALL-UPDATES + per-update table (recipients × opened × opening rate) over the FR-K-2 view tracking. 1 test (preview + portal scoping in</w:t>
+      </w:r>
+      <w:r>
+        <w:t xml:space="preserve"> </w:t>
+      </w:r>
+      <w:r>
+        <w:rPr>
+          <w:rStyle w:val="VerbatimChar"/>
+        </w:rPr>
+        <w:t xml:space="preserve">test_lp_report.py</w:t>
+      </w:r>
+      <w:r>
+        <w:t xml:space="preserve">).</w:t>
       </w:r>
     </w:p>
     <w:p>

</xml_diff>

<commit_message>
feat(fund): Rundit functional batch — follow-on rounds, expense ledger, company notes, CSV exports, update audiences
InvestmentRound (per-round history; parent amount stays the running total so
SOI/NAV/financials are unchanged), FundExpense (reduces net operations and
derived cash in the financial statements, which still tie out), CompanyNote
(internal team comments with author attribution), CSV export endpoints for
holdings / capital accounts / KPI history, and investor_updates.audience
(optional email list scoping portal visibility and view recording; portal
_updates now filters by viewer). Alembic d6e7f8a9b0c1. 5 tests.

Co-Authored-By: Claude Opus 4.8 <noreply@anthropic.com>
</commit_message>
<xml_diff>
--- a/REQUIREMENTS.docx
+++ b/REQUIREMENTS.docx
@@ -17608,6 +17608,198 @@
       </w:r>
       <w:r>
         <w:t xml:space="preserve">— portfolio intelligence (Vestberry competitive gap analysis, fund side):</w:t>
+      </w:r>
+    </w:p>
+    <w:p>
+      <w:pPr>
+        <w:pStyle w:val="Compact"/>
+        <w:numPr>
+          <w:ilvl w:val="0"/>
+          <w:numId w:val="1030"/>
+        </w:numPr>
+      </w:pPr>
+      <w:r>
+        <w:rPr>
+          <w:b/>
+          <w:bCs/>
+        </w:rPr>
+        <w:t xml:space="preserve">Rundit functional batch (fund + startup side)</w:t>
+      </w:r>
+      <w:r>
+        <w:t xml:space="preserve"> </w:t>
+      </w:r>
+      <w:r>
+        <w:t xml:space="preserve">✅ — (1)</w:t>
+      </w:r>
+      <w:r>
+        <w:t xml:space="preserve"> </w:t>
+      </w:r>
+      <w:r>
+        <w:rPr>
+          <w:b/>
+          <w:bCs/>
+        </w:rPr>
+        <w:t xml:space="preserve">follow-on investment rounds</w:t>
+      </w:r>
+      <w:r>
+        <w:t xml:space="preserve">: new</w:t>
+      </w:r>
+      <w:r>
+        <w:t xml:space="preserve"> </w:t>
+      </w:r>
+      <w:r>
+        <w:rPr>
+          <w:rStyle w:val="VerbatimChar"/>
+        </w:rPr>
+        <w:t xml:space="preserve">InvestmentRound</w:t>
+      </w:r>
+      <w:r>
+        <w:t xml:space="preserve"> </w:t>
+      </w:r>
+      <w:r>
+        <w:t xml:space="preserve">— per-round history (label, instrument, amount, date, note) under each portfolio company; the parent investment's amount stays the running total cost so SOI / NAV / financials are untouched (</w:t>
+      </w:r>
+      <w:r>
+        <w:rPr>
+          <w:rStyle w:val="VerbatimChar"/>
+        </w:rPr>
+        <w:t xml:space="preserve">GET/POST /funds/{id}/portfolio/{iid}/rounds</w:t>
+      </w:r>
+      <w:r>
+        <w:t xml:space="preserve">; "Investment history" + add-follow-on in the tear-sheet panel); (2)</w:t>
+      </w:r>
+      <w:r>
+        <w:t xml:space="preserve"> </w:t>
+      </w:r>
+      <w:r>
+        <w:rPr>
+          <w:b/>
+          <w:bCs/>
+        </w:rPr>
+        <w:t xml:space="preserve">fund expense ledger</w:t>
+      </w:r>
+      <w:r>
+        <w:t xml:space="preserve">: new</w:t>
+      </w:r>
+      <w:r>
+        <w:t xml:space="preserve"> </w:t>
+      </w:r>
+      <w:r>
+        <w:rPr>
+          <w:rStyle w:val="VerbatimChar"/>
+        </w:rPr>
+        <w:t xml:space="preserve">FundExpense</w:t>
+      </w:r>
+      <w:r>
+        <w:t xml:space="preserve"> </w:t>
+      </w:r>
+      <w:r>
+        <w:t xml:space="preserve">(date, category legal/audit/administration/diligence/other, amount, note) — actual expenses now reduce net-operations and derived cash in the FR-J-14 financial statements, which still tie out ("Expense ledger" section under Financial statements); (3)</w:t>
+      </w:r>
+      <w:r>
+        <w:t xml:space="preserve"> </w:t>
+      </w:r>
+      <w:r>
+        <w:rPr>
+          <w:b/>
+          <w:bCs/>
+        </w:rPr>
+        <w:t xml:space="preserve">team notes on portfolio companies</w:t>
+      </w:r>
+      <w:r>
+        <w:t xml:space="preserve">: new</w:t>
+      </w:r>
+      <w:r>
+        <w:t xml:space="preserve"> </w:t>
+      </w:r>
+      <w:r>
+        <w:rPr>
+          <w:rStyle w:val="VerbatimChar"/>
+        </w:rPr>
+        <w:t xml:space="preserve">CompanyNote</w:t>
+      </w:r>
+      <w:r>
+        <w:t xml:space="preserve"> </w:t>
+      </w:r>
+      <w:r>
+        <w:t xml:space="preserve">— internal comments with author attribution, never shown to LPs or the company ("Team notes" in the tear-sheet panel); (4)</w:t>
+      </w:r>
+      <w:r>
+        <w:t xml:space="preserve"> </w:t>
+      </w:r>
+      <w:r>
+        <w:rPr>
+          <w:b/>
+          <w:bCs/>
+        </w:rPr>
+        <w:t xml:space="preserve">CSV exports</w:t>
+      </w:r>
+      <w:r>
+        <w:t xml:space="preserve">:</w:t>
+      </w:r>
+      <w:r>
+        <w:t xml:space="preserve"> </w:t>
+      </w:r>
+      <w:r>
+        <w:rPr>
+          <w:rStyle w:val="VerbatimChar"/>
+        </w:rPr>
+        <w:t xml:space="preserve">GET /funds/{id}/export/holdings|capital-accounts|kpis</w:t>
+      </w:r>
+      <w:r>
+        <w:t xml:space="preserve"> </w:t>
+      </w:r>
+      <w:r>
+        <w:t xml:space="preserve">(Content-Disposition downloads; Export buttons on SOI, Capital accounts and Monitoring); (5)</w:t>
+      </w:r>
+      <w:r>
+        <w:t xml:space="preserve"> </w:t>
+      </w:r>
+      <w:r>
+        <w:rPr>
+          <w:b/>
+          <w:bCs/>
+        </w:rPr>
+        <w:t xml:space="preserve">investor-update audiences (FR-K-2 extended)</w:t>
+      </w:r>
+      <w:r>
+        <w:t xml:space="preserve">:</w:t>
+      </w:r>
+      <w:r>
+        <w:t xml:space="preserve"> </w:t>
+      </w:r>
+      <w:r>
+        <w:rPr>
+          <w:rStyle w:val="VerbatimChar"/>
+        </w:rPr>
+        <w:t xml:space="preserve">investor_updates.audience</w:t>
+      </w:r>
+      <w:r>
+        <w:t xml:space="preserve"> </w:t>
+      </w:r>
+      <w:r>
+        <w:t xml:space="preserve">optional email list — restricted updates are invisible to (and unviewable by) investors outside the list; audience multi-select in the composer, "→ N investors" chip, engagement recipients honour the audience. Alembic</w:t>
+      </w:r>
+      <w:r>
+        <w:t xml:space="preserve"> </w:t>
+      </w:r>
+      <w:r>
+        <w:rPr>
+          <w:rStyle w:val="VerbatimChar"/>
+        </w:rPr>
+        <w:t xml:space="preserve">d6e7f8a9b0c1</w:t>
+      </w:r>
+      <w:r>
+        <w:t xml:space="preserve">. 5 tests (</w:t>
+      </w:r>
+      <w:r>
+        <w:rPr>
+          <w:rStyle w:val="VerbatimChar"/>
+        </w:rPr>
+        <w:t xml:space="preserve">test_rundit_functional.py</w:t>
+      </w:r>
+      <w:r>
+        <w:t xml:space="preserve">).</w:t>
       </w:r>
     </w:p>
     <w:p>

</xml_diff>

<commit_message>
QA pass: fix orphaned custom-metric alert rules + LP/SPV update-view recording
Correctness review of the Visible + Rundit batches. The four flagged suspect
areas (report-period arithmetic, follow-on running-total vs delta, expense
sign in fund_financials, benchmark quartiles) all verified correct. Fixes:

- delete_kpi_definition now cascade-deletes MetricAlertRule rows on
  custom.<key>, so a deleted custom metric can't leave a silent no-op rule
  in the catalog (metric no longer resolvable in portfolio_signals).
- POST /portal/updates/{id}/view now records engagement for fund LPs and
  SPV co-investors who see an update via fund/SPV membership; previously
  they 404'd for lack of a company-level InvestorAccess row. New
  can_view_update helper mirrors the three portal surfacing paths.

2 tests added. No schema change.

Co-Authored-By: Claude Opus 4.8 <noreply@anthropic.com>
</commit_message>
<xml_diff>
--- a/REQUIREMENTS.docx
+++ b/REQUIREMENTS.docx
@@ -17608,6 +17608,166 @@
       </w:r>
       <w:r>
         <w:t xml:space="preserve">— portfolio intelligence (Vestberry competitive gap analysis, fund side):</w:t>
+      </w:r>
+    </w:p>
+    <w:p>
+      <w:pPr>
+        <w:pStyle w:val="Compact"/>
+        <w:numPr>
+          <w:ilvl w:val="0"/>
+          <w:numId w:val="1030"/>
+        </w:numPr>
+      </w:pPr>
+      <w:r>
+        <w:rPr>
+          <w:b/>
+          <w:bCs/>
+        </w:rPr>
+        <w:t xml:space="preserve">QA / polish pass (Visible + Rundit batches)</w:t>
+      </w:r>
+      <w:r>
+        <w:t xml:space="preserve"> </w:t>
+      </w:r>
+      <w:r>
+        <w:t xml:space="preserve">✅ — two-agent correctness review of the recent build-out; the four flagged suspect areas (report-period month arithmetic, follow-on running-total vs delta, expense-sign in</w:t>
+      </w:r>
+      <w:r>
+        <w:t xml:space="preserve"> </w:t>
+      </w:r>
+      <w:r>
+        <w:rPr>
+          <w:rStyle w:val="VerbatimChar"/>
+        </w:rPr>
+        <w:t xml:space="preserve">fund_financials</w:t>
+      </w:r>
+      <w:r>
+        <w:t xml:space="preserve">, benchmark quartile math) all verified correct. Fixes: (1)</w:t>
+      </w:r>
+      <w:r>
+        <w:t xml:space="preserve"> </w:t>
+      </w:r>
+      <w:r>
+        <w:rPr>
+          <w:rStyle w:val="VerbatimChar"/>
+        </w:rPr>
+        <w:t xml:space="preserve">delete_kpi_definition</w:t>
+      </w:r>
+      <w:r>
+        <w:t xml:space="preserve"> </w:t>
+      </w:r>
+      <w:r>
+        <w:t xml:space="preserve">now cascade-deletes any</w:t>
+      </w:r>
+      <w:r>
+        <w:t xml:space="preserve"> </w:t>
+      </w:r>
+      <w:r>
+        <w:rPr>
+          <w:rStyle w:val="VerbatimChar"/>
+        </w:rPr>
+        <w:t xml:space="preserve">MetricAlertRule</w:t>
+      </w:r>
+      <w:r>
+        <w:t xml:space="preserve"> </w:t>
+      </w:r>
+      <w:r>
+        <w:t xml:space="preserve">on</w:t>
+      </w:r>
+      <w:r>
+        <w:t xml:space="preserve"> </w:t>
+      </w:r>
+      <w:r>
+        <w:rPr>
+          <w:rStyle w:val="VerbatimChar"/>
+        </w:rPr>
+        <w:t xml:space="preserve">custom.&lt;key&gt;</w:t>
+      </w:r>
+      <w:r>
+        <w:t xml:space="preserve"> </w:t>
+      </w:r>
+      <w:r>
+        <w:t xml:space="preserve">so a deleted custom metric can't leave a silent no-op rule in the catalog; (2)</w:t>
+      </w:r>
+      <w:r>
+        <w:t xml:space="preserve"> </w:t>
+      </w:r>
+      <w:r>
+        <w:rPr>
+          <w:rStyle w:val="VerbatimChar"/>
+        </w:rPr>
+        <w:t xml:space="preserve">POST /portal/updates/{id}/view</w:t>
+      </w:r>
+      <w:r>
+        <w:t xml:space="preserve"> </w:t>
+      </w:r>
+      <w:r>
+        <w:t xml:space="preserve">engagement recording now works for fund LPs and SPV co-investors who see an update via fund/SPV membership (previously 404'd for lack of a company-level</w:t>
+      </w:r>
+      <w:r>
+        <w:t xml:space="preserve"> </w:t>
+      </w:r>
+      <w:r>
+        <w:rPr>
+          <w:rStyle w:val="VerbatimChar"/>
+        </w:rPr>
+        <w:t xml:space="preserve">InvestorAccess</w:t>
+      </w:r>
+      <w:r>
+        <w:t xml:space="preserve"> </w:t>
+      </w:r>
+      <w:r>
+        <w:t xml:space="preserve">row) — new</w:t>
+      </w:r>
+      <w:r>
+        <w:t xml:space="preserve"> </w:t>
+      </w:r>
+      <w:r>
+        <w:rPr>
+          <w:rStyle w:val="VerbatimChar"/>
+        </w:rPr>
+        <w:t xml:space="preserve">can_view_update</w:t>
+      </w:r>
+      <w:r>
+        <w:t xml:space="preserve"> </w:t>
+      </w:r>
+      <w:r>
+        <w:t xml:space="preserve">visibility helper mirrors the three portal surfacing paths; (3) frontend: duplicate React keys on the update-engagement table (keyed on</w:t>
+      </w:r>
+      <w:r>
+        <w:t xml:space="preserve"> </w:t>
+      </w:r>
+      <w:r>
+        <w:rPr>
+          <w:rStyle w:val="VerbatimChar"/>
+        </w:rPr>
+        <w:t xml:space="preserve">id</w:t>
+      </w:r>
+      <w:r>
+        <w:t xml:space="preserve">), numeric-input guards on the capital-call / distribution / add-investment buttons, and</w:t>
+      </w:r>
+      <w:r>
+        <w:t xml:space="preserve"> </w:t>
+      </w:r>
+      <w:r>
+        <w:rPr>
+          <w:rStyle w:val="VerbatimChar"/>
+        </w:rPr>
+        <w:t xml:space="preserve">window.alert</w:t>
+      </w:r>
+      <w:r>
+        <w:t xml:space="preserve"> </w:t>
+      </w:r>
+      <w:r>
+        <w:t xml:space="preserve">→ toast on report generation. 2 tests added (</w:t>
+      </w:r>
+      <w:r>
+        <w:rPr>
+          <w:rStyle w:val="VerbatimChar"/>
+        </w:rPr>
+        <w:t xml:space="preserve">test_rundit_functional.py</w:t>
+      </w:r>
+      <w:r>
+        <w:t xml:space="preserve">). No schema change.</w:t>
       </w:r>
     </w:p>
     <w:p>

</xml_diff>

<commit_message>
Enrich entity dashboard fund block for the fund-first dashboard
Adds SEBI category + carry/hurdle/mgmt-fee terms, uncalled/distributed,
NAV/TVPI/DPI (via fund_performance) and portfolio-company count to the
`fund` block of entity_dashboard, so the fund workspace can land on a
fund summary instead of the startup cap-table dashboard.

Co-Authored-By: Claude Opus 4.8 <noreply@anthropic.com>
</commit_message>
<xml_diff>
--- a/REQUIREMENTS.docx
+++ b/REQUIREMENTS.docx
@@ -17608,6 +17608,208 @@
       </w:r>
       <w:r>
         <w:t xml:space="preserve">— simplicity pass (feature packs + navigation de-duplication, startup side):</w:t>
+      </w:r>
+    </w:p>
+    <w:p>
+      <w:pPr>
+        <w:pStyle w:val="Compact"/>
+        <w:numPr>
+          <w:ilvl w:val="0"/>
+          <w:numId w:val="1030"/>
+        </w:numPr>
+      </w:pPr>
+      <w:r>
+        <w:rPr>
+          <w:b/>
+          <w:bCs/>
+        </w:rPr>
+        <w:t xml:space="preserve">Fund-first workspace (fund side)</w:t>
+      </w:r>
+      <w:r>
+        <w:t xml:space="preserve"> </w:t>
+      </w:r>
+      <w:r>
+        <w:t xml:space="preserve">✅ — a fund entity no longer wears the startup workspace. (1)</w:t>
+      </w:r>
+      <w:r>
+        <w:t xml:space="preserve"> </w:t>
+      </w:r>
+      <w:r>
+        <w:rPr>
+          <w:b/>
+          <w:bCs/>
+        </w:rPr>
+        <w:t xml:space="preserve">Fund dashboard</w:t>
+      </w:r>
+      <w:r>
+        <w:t xml:space="preserve">:</w:t>
+      </w:r>
+      <w:r>
+        <w:t xml:space="preserve"> </w:t>
+      </w:r>
+      <w:r>
+        <w:rPr>
+          <w:rStyle w:val="VerbatimChar"/>
+        </w:rPr>
+        <w:t xml:space="preserve">FundDashboard</w:t>
+      </w:r>
+      <w:r>
+        <w:t xml:space="preserve"> </w:t>
+      </w:r>
+      <w:r>
+        <w:t xml:space="preserve">replaces the cap-table dashboard for</w:t>
+      </w:r>
+      <w:r>
+        <w:t xml:space="preserve"> </w:t>
+      </w:r>
+      <w:r>
+        <w:rPr>
+          <w:rStyle w:val="VerbatimChar"/>
+        </w:rPr>
+        <w:t xml:space="preserve">type == fund</w:t>
+      </w:r>
+      <w:r>
+        <w:t xml:space="preserve"> </w:t>
+      </w:r>
+      <w:r>
+        <w:t xml:space="preserve">— SEBI category + carry/hurdle/fee, committed/drawn/uncalled/distributed, NAV/TVPI/DPI, LP + portfolio-company counts, an overdue-compliance nudge and "Manage the fund" quick links (the</w:t>
+      </w:r>
+      <w:r>
+        <w:t xml:space="preserve"> </w:t>
+      </w:r>
+      <w:r>
+        <w:rPr>
+          <w:rStyle w:val="VerbatimChar"/>
+        </w:rPr>
+        <w:t xml:space="preserve">entity_dashboard</w:t>
+      </w:r>
+      <w:r>
+        <w:t xml:space="preserve"> </w:t>
+      </w:r>
+      <w:r>
+        <w:t xml:space="preserve">fund block was enriched with performance, terms, uncalled/distributed and portfolio count). No more "Shares issued 0 / Grant options / price ESOP grants" prompts for a fund. (2)</w:t>
+      </w:r>
+      <w:r>
+        <w:t xml:space="preserve"> </w:t>
+      </w:r>
+      <w:r>
+        <w:rPr>
+          <w:b/>
+          <w:bCs/>
+        </w:rPr>
+        <w:t xml:space="preserve">Promoted fund tabs</w:t>
+      </w:r>
+      <w:r>
+        <w:t xml:space="preserve">: the six Fund sub-tabs are now primary workspace tabs (Capital &amp; LPs · LP fundraise · Portfolio · Monitoring · Deal pipeline · Plan &amp; forecast · Financials) under a "Fund" group, instead of nesting inside one tab of the company nav (</w:t>
+      </w:r>
+      <w:r>
+        <w:rPr>
+          <w:rStyle w:val="VerbatimChar"/>
+        </w:rPr>
+        <w:t xml:space="preserve">Fund</w:t>
+      </w:r>
+      <w:r>
+        <w:t xml:space="preserve"> </w:t>
+      </w:r>
+      <w:r>
+        <w:t xml:space="preserve">gains</w:t>
+      </w:r>
+      <w:r>
+        <w:t xml:space="preserve"> </w:t>
+      </w:r>
+      <w:r>
+        <w:rPr>
+          <w:rStyle w:val="VerbatimChar"/>
+        </w:rPr>
+        <w:t xml:space="preserve">hideSubtabs</w:t>
+      </w:r>
+      <w:r>
+        <w:t xml:space="preserve">; new tab scope</w:t>
+      </w:r>
+      <w:r>
+        <w:t xml:space="preserve"> </w:t>
+      </w:r>
+      <w:r>
+        <w:rPr>
+          <w:rStyle w:val="VerbatimChar"/>
+        </w:rPr>
+        <w:t xml:space="preserve">fundonly</w:t>
+      </w:r>
+      <w:r>
+        <w:t xml:space="preserve">). (3)</w:t>
+      </w:r>
+      <w:r>
+        <w:t xml:space="preserve"> </w:t>
+      </w:r>
+      <w:r>
+        <w:rPr>
+          <w:b/>
+          <w:bCs/>
+        </w:rPr>
+        <w:t xml:space="preserve">Trimmed nav</w:t>
+      </w:r>
+      <w:r>
+        <w:t xml:space="preserve">: Cap Table and Valuations are now company-scoped, so the Ownership group disappears for funds. (4)</w:t>
+      </w:r>
+      <w:r>
+        <w:t xml:space="preserve"> </w:t>
+      </w:r>
+      <w:r>
+        <w:rPr>
+          <w:b/>
+          <w:bCs/>
+        </w:rPr>
+        <w:t xml:space="preserve">Portfolio split</w:t>
+      </w:r>
+      <w:r>
+        <w:t xml:space="preserve">: the ~10-section Portfolio page splits into</w:t>
+      </w:r>
+      <w:r>
+        <w:t xml:space="preserve"> </w:t>
+      </w:r>
+      <w:r>
+        <w:rPr>
+          <w:b/>
+          <w:bCs/>
+        </w:rPr>
+        <w:t xml:space="preserve">Portfolio</w:t>
+      </w:r>
+      <w:r>
+        <w:t xml:space="preserve"> </w:t>
+      </w:r>
+      <w:r>
+        <w:t xml:space="preserve">(signals, holdings, Schedule of Investments, independent valuation) and</w:t>
+      </w:r>
+      <w:r>
+        <w:t xml:space="preserve"> </w:t>
+      </w:r>
+      <w:r>
+        <w:rPr>
+          <w:b/>
+          <w:bCs/>
+        </w:rPr>
+        <w:t xml:space="preserve">Monitoring</w:t>
+      </w:r>
+      <w:r>
+        <w:t xml:space="preserve"> </w:t>
+      </w:r>
+      <w:r>
+        <w:t xml:space="preserve">(KPIs, benchmarks, alerts, KPI scheduling, DDQ). Legacy</w:t>
+      </w:r>
+      <w:r>
+        <w:t xml:space="preserve"> </w:t>
+      </w:r>
+      <w:r>
+        <w:rPr>
+          <w:rStyle w:val="VerbatimChar"/>
+        </w:rPr>
+        <w:t xml:space="preserve">?tab=fund[&amp;sub=]</w:t>
+      </w:r>
+      <w:r>
+        <w:t xml:space="preserve"> </w:t>
+      </w:r>
+      <w:r>
+        <w:t xml:space="preserve">deep links redirect to the promoted tabs. No schema change.</w:t>
       </w:r>
     </w:p>
     <w:p>

</xml_diff>

<commit_message>
Fund↔startup seam: link holdings to companies, pull their financials
Reduces double-entry between the fund and startup modules.

- PortfolioInvestment.company_entity_id (Alembic f8a9b0c1d2e3) links a
  holding to the portfolio company's own Paper entity.
- add_investment accepts company_entity_id, verifies the GP is a member of
  that company's workspace (company-types only) and syncs the name from it.
- GET /funds/{id}/linkable-companies lists companies across the GP's
  workspaces.
- POST /funds/{id}/portfolio/{iid}/pull-financials ingests the linked
  company's latest self-reported revenue/cash/burn (from its Finance
  module) as a portfolio-KPI period — no separate KPI-request round-trip —
  flowing into the existing monitoring/signals/benchmarks. Access-guarded;
  400 if unlinked or no snapshots.

3 tests (test_portfolio_link.py). 348 pass.

Co-Authored-By: Claude Opus 4.8 <noreply@anthropic.com>
</commit_message>
<xml_diff>
--- a/REQUIREMENTS.docx
+++ b/REQUIREMENTS.docx
@@ -17608,6 +17608,140 @@
       </w:r>
       <w:r>
         <w:t xml:space="preserve">— simplicity pass (feature packs + navigation de-duplication, startup side):</w:t>
+      </w:r>
+    </w:p>
+    <w:p>
+      <w:pPr>
+        <w:pStyle w:val="Compact"/>
+        <w:numPr>
+          <w:ilvl w:val="0"/>
+          <w:numId w:val="1030"/>
+        </w:numPr>
+      </w:pPr>
+      <w:r>
+        <w:rPr>
+          <w:b/>
+          <w:bCs/>
+        </w:rPr>
+        <w:t xml:space="preserve">Fund ↔ startup data flow (less friction)</w:t>
+      </w:r>
+      <w:r>
+        <w:t xml:space="preserve"> </w:t>
+      </w:r>
+      <w:r>
+        <w:t xml:space="preserve">✅ — (1) a fund's</w:t>
+      </w:r>
+      <w:r>
+        <w:t xml:space="preserve"> </w:t>
+      </w:r>
+      <w:r>
+        <w:rPr>
+          <w:b/>
+          <w:bCs/>
+        </w:rPr>
+        <w:t xml:space="preserve">"Investors" tab is relabelled "LP updates" and moved under the Fund group</w:t>
+      </w:r>
+      <w:r>
+        <w:t xml:space="preserve"> </w:t>
+      </w:r>
+      <w:r>
+        <w:t xml:space="preserve">for fund entities (it's the LP-update channel, not startup investor relations). (2) A portfolio holding can now be</w:t>
+      </w:r>
+      <w:r>
+        <w:t xml:space="preserve"> </w:t>
+      </w:r>
+      <w:r>
+        <w:rPr>
+          <w:b/>
+          <w:bCs/>
+        </w:rPr>
+        <w:t xml:space="preserve">linked to the portfolio company's own Paper entity</w:t>
+      </w:r>
+      <w:r>
+        <w:t xml:space="preserve"> </w:t>
+      </w:r>
+      <w:r>
+        <w:t xml:space="preserve">(</w:t>
+      </w:r>
+      <w:r>
+        <w:rPr>
+          <w:rStyle w:val="VerbatimChar"/>
+        </w:rPr>
+        <w:t xml:space="preserve">portfolio_investments.company_entity_id</w:t>
+      </w:r>
+      <w:r>
+        <w:t xml:space="preserve">, Alembic</w:t>
+      </w:r>
+      <w:r>
+        <w:t xml:space="preserve"> </w:t>
+      </w:r>
+      <w:r>
+        <w:rPr>
+          <w:rStyle w:val="VerbatimChar"/>
+        </w:rPr>
+        <w:t xml:space="preserve">f8a9b0c1d2e3</w:t>
+      </w:r>
+      <w:r>
+        <w:t xml:space="preserve">): the add-investment form offers a picker of companies the GP has access to (</w:t>
+      </w:r>
+      <w:r>
+        <w:rPr>
+          <w:rStyle w:val="VerbatimChar"/>
+        </w:rPr>
+        <w:t xml:space="preserve">GET /funds/{id}/linkable-companies</w:t>
+      </w:r>
+      <w:r>
+        <w:t xml:space="preserve">); linking syncs the company name and adds a</w:t>
+      </w:r>
+      <w:r>
+        <w:t xml:space="preserve"> </w:t>
+      </w:r>
+      <w:r>
+        <w:rPr>
+          <w:b/>
+          <w:bCs/>
+        </w:rPr>
+        <w:t xml:space="preserve">↗ open-workspace</w:t>
+      </w:r>
+      <w:r>
+        <w:t xml:space="preserve"> </w:t>
+      </w:r>
+      <w:r>
+        <w:t xml:space="preserve">jump. (3)</w:t>
+      </w:r>
+      <w:r>
+        <w:t xml:space="preserve"> </w:t>
+      </w:r>
+      <w:r>
+        <w:rPr>
+          <w:b/>
+          <w:bCs/>
+        </w:rPr>
+        <w:t xml:space="preserve">One-click "Pull financials"</w:t>
+      </w:r>
+      <w:r>
+        <w:t xml:space="preserve"> </w:t>
+      </w:r>
+      <w:r>
+        <w:t xml:space="preserve">(</w:t>
+      </w:r>
+      <w:r>
+        <w:rPr>
+          <w:rStyle w:val="VerbatimChar"/>
+        </w:rPr>
+        <w:t xml:space="preserve">POST /funds/{id}/portfolio/{iid}/pull-financials</w:t>
+      </w:r>
+      <w:r>
+        <w:t xml:space="preserve">) ingests the linked company's latest self-reported revenue / cash / burn (from its Finance module) as a portfolio-KPI period — no separate KPI-request round-trip — flowing straight into the fund's Monitoring, signals and benchmarks. Access is guarded: a fund can only link to / pull from companies whose workspace the GP is a member of. 3 tests (</w:t>
+      </w:r>
+      <w:r>
+        <w:rPr>
+          <w:rStyle w:val="VerbatimChar"/>
+        </w:rPr>
+        <w:t xml:space="preserve">test_portfolio_link.py</w:t>
+      </w:r>
+      <w:r>
+        <w:t xml:space="preserve">).</w:t>
       </w:r>
     </w:p>
     <w:p>

</xml_diff>

<commit_message>
Group fund tabs by job: Fund management / Portfolio / Monitoring
The flat 8-tab Fund group splits into three groups that match how a GP
works:

- Fund management — the vehicle + LP relations: Capital & LPs,
  LP fundraise, Plan & forecast, Financials, LP updates.
- Portfolio — sourcing and holdings: Deal pipeline, Holdings (the old
  Portfolio tab, renamed).
- Monitoring — portfolio-company performance: KPIs, benchmarks, alerts.

Frontend-only regrouping (TAB_DEFS/GROUPS); company navigation unchanged;
command palette label follows the rename.

Co-Authored-By: Claude Opus 4.8 <noreply@anthropic.com>
</commit_message>
<xml_diff>
--- a/REQUIREMENTS.docx
+++ b/REQUIREMENTS.docx
@@ -17608,6 +17608,91 @@
       </w:r>
       <w:r>
         <w:t xml:space="preserve">— simplicity pass (feature packs + navigation de-duplication, startup side):</w:t>
+      </w:r>
+    </w:p>
+    <w:p>
+      <w:pPr>
+        <w:pStyle w:val="Compact"/>
+        <w:numPr>
+          <w:ilvl w:val="0"/>
+          <w:numId w:val="1030"/>
+        </w:numPr>
+      </w:pPr>
+      <w:r>
+        <w:rPr>
+          <w:b/>
+          <w:bCs/>
+        </w:rPr>
+        <w:t xml:space="preserve">Fund nav grouped by job</w:t>
+      </w:r>
+      <w:r>
+        <w:t xml:space="preserve"> </w:t>
+      </w:r>
+      <w:r>
+        <w:t xml:space="preserve">✅ — the flat 8-tab "Fund" group splits into three:</w:t>
+      </w:r>
+      <w:r>
+        <w:t xml:space="preserve"> </w:t>
+      </w:r>
+      <w:r>
+        <w:rPr>
+          <w:b/>
+          <w:bCs/>
+        </w:rPr>
+        <w:t xml:space="preserve">Fund management</w:t>
+      </w:r>
+      <w:r>
+        <w:t xml:space="preserve"> </w:t>
+      </w:r>
+      <w:r>
+        <w:t xml:space="preserve">(Capital &amp; LPs · LP fundraise · Plan &amp; forecast · Financials · LP updates),</w:t>
+      </w:r>
+      <w:r>
+        <w:t xml:space="preserve"> </w:t>
+      </w:r>
+      <w:r>
+        <w:rPr>
+          <w:b/>
+          <w:bCs/>
+        </w:rPr>
+        <w:t xml:space="preserve">Portfolio</w:t>
+      </w:r>
+      <w:r>
+        <w:t xml:space="preserve"> </w:t>
+      </w:r>
+      <w:r>
+        <w:t xml:space="preserve">(Deal pipeline · Holdings — the old Portfolio tab renamed), and</w:t>
+      </w:r>
+      <w:r>
+        <w:t xml:space="preserve"> </w:t>
+      </w:r>
+      <w:r>
+        <w:rPr>
+          <w:b/>
+          <w:bCs/>
+        </w:rPr>
+        <w:t xml:space="preserve">Monitoring</w:t>
+      </w:r>
+      <w:r>
+        <w:t xml:space="preserve"> </w:t>
+      </w:r>
+      <w:r>
+        <w:t xml:space="preserve">(portfolio-company KPIs/benchmarks/alerts). Frontend-only regrouping in</w:t>
+      </w:r>
+      <w:r>
+        <w:t xml:space="preserve"> </w:t>
+      </w:r>
+      <w:r>
+        <w:rPr>
+          <w:rStyle w:val="VerbatimChar"/>
+        </w:rPr>
+        <w:t xml:space="preserve">EntityDetail</w:t>
+      </w:r>
+      <w:r>
+        <w:t xml:space="preserve"> </w:t>
+      </w:r>
+      <w:r>
+        <w:t xml:space="preserve">TAB_DEFS/GROUPS; company navigation unchanged.</w:t>
       </w:r>
     </w:p>
     <w:p>

</xml_diff>

<commit_message>
Security pass: fix tenant-blind teardown + CSV injection + pack gate
- HIGH: the teardown FK-closure treated the cross-tenant link FKs
  portfolio_investments.company_entity_id and spvs.portco_entity_id as
  ownership edges, so tearing down a company could delete another tenant's
  fund/SPV records (and the preview counted them). The closure now skips
  those link edges (_LINK_FKS) and nulls them (_nullify_links) before
  deleting, so the referencing tenant keeps its record, unlinked.
- CSV exports neutralise spreadsheet formula injection (= + - @ prefixing);
  real vector was a linked company's name flowing into holdings/KPI CSVs.
- PUT /entities/{id}/pack is owner/admin-only (commercial tier), not any
  member.
- The empty-only DELETE /tenants/{id} also clears draft incorporations so
  it can't orphan / FK-fail.

2 tests (cross-tenant teardown safety, CSV injection). 350 pass.

Co-Authored-By: Claude Opus 4.8 <noreply@anthropic.com>
</commit_message>
<xml_diff>
--- a/REQUIREMENTS.docx
+++ b/REQUIREMENTS.docx
@@ -17608,6 +17608,263 @@
       </w:r>
       <w:r>
         <w:t xml:space="preserve">— simplicity pass (feature packs + navigation de-duplication, startup side):</w:t>
+      </w:r>
+    </w:p>
+    <w:p>
+      <w:pPr>
+        <w:pStyle w:val="Compact"/>
+        <w:numPr>
+          <w:ilvl w:val="0"/>
+          <w:numId w:val="1030"/>
+        </w:numPr>
+      </w:pPr>
+      <w:r>
+        <w:rPr>
+          <w:b/>
+          <w:bCs/>
+        </w:rPr>
+        <w:t xml:space="preserve">Security + dead-code pass</w:t>
+      </w:r>
+      <w:r>
+        <w:t xml:space="preserve"> </w:t>
+      </w:r>
+      <w:r>
+        <w:t xml:space="preserve">✅ — two-agent review of the session's changes.</w:t>
+      </w:r>
+      <w:r>
+        <w:t xml:space="preserve"> </w:t>
+      </w:r>
+      <w:r>
+        <w:rPr>
+          <w:b/>
+          <w:bCs/>
+        </w:rPr>
+        <w:t xml:space="preserve">HIGH fixed:</w:t>
+      </w:r>
+      <w:r>
+        <w:t xml:space="preserve"> </w:t>
+      </w:r>
+      <w:r>
+        <w:t xml:space="preserve">the teardown FK-closure was tenant-blind — because</w:t>
+      </w:r>
+      <w:r>
+        <w:t xml:space="preserve"> </w:t>
+      </w:r>
+      <w:r>
+        <w:rPr>
+          <w:rStyle w:val="VerbatimChar"/>
+        </w:rPr>
+        <w:t xml:space="preserve">portfolio_investments.company_entity_id</w:t>
+      </w:r>
+      <w:r>
+        <w:t xml:space="preserve"> </w:t>
+      </w:r>
+      <w:r>
+        <w:t xml:space="preserve">and</w:t>
+      </w:r>
+      <w:r>
+        <w:t xml:space="preserve"> </w:t>
+      </w:r>
+      <w:r>
+        <w:rPr>
+          <w:rStyle w:val="VerbatimChar"/>
+        </w:rPr>
+        <w:t xml:space="preserve">spvs.portco_entity_id</w:t>
+      </w:r>
+      <w:r>
+        <w:t xml:space="preserve"> </w:t>
+      </w:r>
+      <w:r>
+        <w:t xml:space="preserve">are</w:t>
+      </w:r>
+      <w:r>
+        <w:t xml:space="preserve"> </w:t>
+      </w:r>
+      <w:r>
+        <w:rPr>
+          <w:i/>
+          <w:iCs/>
+        </w:rPr>
+        <w:t xml:space="preserve">cross-tenant</w:t>
+      </w:r>
+      <w:r>
+        <w:t xml:space="preserve"> </w:t>
+      </w:r>
+      <w:r>
+        <w:t xml:space="preserve">link FKs, tearing down a company could delete another tenant's fund/SPV records. The closure now excludes those link edges (</w:t>
+      </w:r>
+      <w:r>
+        <w:rPr>
+          <w:rStyle w:val="VerbatimChar"/>
+        </w:rPr>
+        <w:t xml:space="preserve">_LINK_FKS</w:t>
+      </w:r>
+      <w:r>
+        <w:t xml:space="preserve">) and nulls them (</w:t>
+      </w:r>
+      <w:r>
+        <w:rPr>
+          <w:rStyle w:val="VerbatimChar"/>
+        </w:rPr>
+        <w:t xml:space="preserve">_nullify_links</w:t>
+      </w:r>
+      <w:r>
+        <w:t xml:space="preserve">) instead, so the other tenant keeps its record; the preview no longer counts foreign rows.</w:t>
+      </w:r>
+      <w:r>
+        <w:t xml:space="preserve"> </w:t>
+      </w:r>
+      <w:r>
+        <w:rPr>
+          <w:b/>
+          <w:bCs/>
+        </w:rPr>
+        <w:t xml:space="preserve">Also:</w:t>
+      </w:r>
+      <w:r>
+        <w:t xml:space="preserve"> </w:t>
+      </w:r>
+      <w:r>
+        <w:t xml:space="preserve">CSV exports neutralise spreadsheet formula injection (</w:t>
+      </w:r>
+      <w:r>
+        <w:rPr>
+          <w:rStyle w:val="VerbatimChar"/>
+        </w:rPr>
+        <w:t xml:space="preserve">=</w:t>
+      </w:r>
+      <w:r>
+        <w:t xml:space="preserve">/</w:t>
+      </w:r>
+      <w:r>
+        <w:rPr>
+          <w:rStyle w:val="VerbatimChar"/>
+        </w:rPr>
+        <w:t xml:space="preserve">+</w:t>
+      </w:r>
+      <w:r>
+        <w:t xml:space="preserve">/</w:t>
+      </w:r>
+      <w:r>
+        <w:rPr>
+          <w:rStyle w:val="VerbatimChar"/>
+        </w:rPr>
+        <w:t xml:space="preserve">-</w:t>
+      </w:r>
+      <w:r>
+        <w:t xml:space="preserve">/</w:t>
+      </w:r>
+      <w:r>
+        <w:rPr>
+          <w:rStyle w:val="VerbatimChar"/>
+        </w:rPr>
+        <w:t xml:space="preserve">@</w:t>
+      </w:r>
+      <w:r>
+        <w:t xml:space="preserve"> </w:t>
+      </w:r>
+      <w:r>
+        <w:t xml:space="preserve">prefixing, with a real vector via linked company names);</w:t>
+      </w:r>
+      <w:r>
+        <w:t xml:space="preserve"> </w:t>
+      </w:r>
+      <w:r>
+        <w:rPr>
+          <w:rStyle w:val="VerbatimChar"/>
+        </w:rPr>
+        <w:t xml:space="preserve">PUT /entities/{id}/pack</w:t>
+      </w:r>
+      <w:r>
+        <w:t xml:space="preserve"> </w:t>
+      </w:r>
+      <w:r>
+        <w:t xml:space="preserve">is now owner/admin-only (it's the commercial tier); the empty-only</w:t>
+      </w:r>
+      <w:r>
+        <w:t xml:space="preserve"> </w:t>
+      </w:r>
+      <w:r>
+        <w:rPr>
+          <w:rStyle w:val="VerbatimChar"/>
+        </w:rPr>
+        <w:t xml:space="preserve">DELETE /tenants/{id}</w:t>
+      </w:r>
+      <w:r>
+        <w:t xml:space="preserve"> </w:t>
+      </w:r>
+      <w:r>
+        <w:t xml:space="preserve">also clears draft incorporations.</w:t>
+      </w:r>
+      <w:r>
+        <w:t xml:space="preserve"> </w:t>
+      </w:r>
+      <w:r>
+        <w:rPr>
+          <w:b/>
+          <w:bCs/>
+        </w:rPr>
+        <w:t xml:space="preserve">Dead code removed</w:t>
+      </w:r>
+      <w:r>
+        <w:t xml:space="preserve"> </w:t>
+      </w:r>
+      <w:r>
+        <w:t xml:space="preserve">(fallout from this session's deletions): orphaned Workflow API-client types/methods and</w:t>
+      </w:r>
+      <w:r>
+        <w:t xml:space="preserve"> </w:t>
+      </w:r>
+      <w:r>
+        <w:rPr>
+          <w:rStyle w:val="VerbatimChar"/>
+        </w:rPr>
+        <w:t xml:space="preserve">deleteTenant</w:t>
+      </w:r>
+      <w:r>
+        <w:t xml:space="preserve"> </w:t>
+      </w:r>
+      <w:r>
+        <w:t xml:space="preserve">in</w:t>
+      </w:r>
+      <w:r>
+        <w:t xml:space="preserve"> </w:t>
+      </w:r>
+      <w:r>
+        <w:rPr>
+          <w:rStyle w:val="VerbatimChar"/>
+        </w:rPr>
+        <w:t xml:space="preserve">api.ts</w:t>
+      </w:r>
+      <w:r>
+        <w:t xml:space="preserve">;</w:t>
+      </w:r>
+      <w:r>
+        <w:t xml:space="preserve"> </w:t>
+      </w:r>
+      <w:r>
+        <w:rPr>
+          <w:rStyle w:val="VerbatimChar"/>
+        </w:rPr>
+        <w:t xml:space="preserve">Fund</w:t>
+      </w:r>
+      <w:r>
+        <w:t xml:space="preserve">'s now-always-hidden internal sub-tab row +</w:t>
+      </w:r>
+      <w:r>
+        <w:t xml:space="preserve"> </w:t>
+      </w:r>
+      <w:r>
+        <w:rPr>
+          <w:rStyle w:val="VerbatimChar"/>
+        </w:rPr>
+        <w:t xml:space="preserve">hideSubtabs</w:t>
+      </w:r>
+      <w:r>
+        <w:t xml:space="preserve"> </w:t>
+      </w:r>
+      <w:r>
+        <w:t xml:space="preserve">prop (parent nav drives sub-tabs). 2 tests added (cross-tenant teardown safety, CSV injection); 350 pass.</w:t>
       </w:r>
     </w:p>
     <w:p>

</xml_diff>